<commit_message>
Start New Project button in teal (distinct from the purple PixInsight button); manual 0.9.9 with 'Starting your next target'
Co-Authored-By: Claude Opus 5.5 <noreply@anthropic.com>
Claude-Session: https://claude.ai/code/session_01FKvd69QsnCvM2zbzYnPwmF
</commit_message>
<xml_diff>
--- a/docs/SubZeroAstro_User_Manual.docx
+++ b/docs/SubZeroAstro_User_Manual.docx
@@ -121,7 +121,7 @@
           <w:sz w:val="22"/>
           <w:szCs w:val="22"/>
         </w:rPr>
-        <w:t xml:space="preserve">Version 0.9.8 beta  ·  Windows and Mac (Apple silicon)</w:t>
+        <w:t xml:space="preserve">Version 0.9.9 beta  ·  Windows and Mac (Apple silicon)</w:t>
       </w:r>
     </w:p>
     <w:p>
@@ -1142,6 +1142,24 @@
             <w:bCs w:val="false"/>
           </w:rPr>
           <w:t xml:space="preserve">9.6   Saving and sharing</w:t>
+        </w:r>
+      </w:hyperlink>
+    </w:p>
+    <w:p>
+      <w:pPr>
+        <w:tabs>
+          <w:tab w:val="right" w:pos="9360" w:leader="dot"/>
+        </w:tabs>
+        <w:spacing w:after="20" w:before="0"/>
+        <w:ind w:left="480"/>
+      </w:pPr>
+      <w:hyperlink w:history="1" w:anchor="s_9_7">
+        <w:r>
+          <w:rPr>
+            <w:b w:val="false"/>
+            <w:bCs w:val="false"/>
+          </w:rPr>
+          <w:t xml:space="preserve">9.7   Starting your next target</w:t>
         </w:r>
       </w:hyperlink>
     </w:p>
@@ -11366,6 +11384,85 @@
     </w:p>
     <w:p>
       <w:pPr>
+        <w:pStyle w:val="Heading2"/>
+      </w:pPr>
+      <w:bookmarkStart w:name="s_9_7" w:id="1"/>
+      <w:r>
+        <w:t xml:space="preserve">9.7   Starting your next target</w:t>
+      </w:r>
+      <w:bookmarkEnd w:id="1"/>
+    </w:p>
+    <w:p>
+      <w:pPr>
+        <w:spacing w:after="120"/>
+      </w:pPr>
+      <w:r>
+        <w:t xml:space="preserve">When a picture is finished, click the teal </w:t>
+      </w:r>
+      <w:r>
+        <w:rPr>
+          <w:b/>
+          <w:bCs/>
+        </w:rPr>
+        <w:t xml:space="preserve">↺ End this Project and Start New Project</w:t>
+      </w:r>
+      <w:r>
+        <w:t xml:space="preserve"> button at the top right of Finishing Touches. SubZeroAstro asks first - and if you have not saved the picture yet, offers </w:t>
+      </w:r>
+      <w:r>
+        <w:rPr>
+          <w:b/>
+          <w:bCs/>
+        </w:rPr>
+        <w:t xml:space="preserve">Save the Picture First…</w:t>
+      </w:r>
+      <w:r>
+        <w:t xml:space="preserve">. Then every page and image closes, the helper programs are checked again, and you are back on </w:t>
+      </w:r>
+      <w:r>
+        <w:rPr>
+          <w:b/>
+          <w:bCs/>
+        </w:rPr>
+        <w:t xml:space="preserve">page 1 (Quality and Cull)</w:t>
+      </w:r>
+      <w:r>
+        <w:t xml:space="preserve"> with the </w:t>
+      </w:r>
+      <w:r>
+        <w:rPr>
+          <w:b/>
+          <w:bCs/>
+        </w:rPr>
+        <w:t xml:space="preserve">Load Data</w:t>
+      </w:r>
+      <w:r>
+        <w:t xml:space="preserve"> window open, ready for the next target's light frames: cull, stack, process and finish, from the beginning.</w:t>
+      </w:r>
+    </w:p>
+    <w:p>
+      <w:pPr>
+        <w:pBdr>
+          <w:left w:val="single" w:color="2F6FD6" w:sz="18" w:space="8"/>
+        </w:pBdr>
+        <w:shd w:fill="EAF1FB" w:color="auto" w:val="clear"/>
+        <w:spacing w:after="160" w:before="120"/>
+        <w:ind w:left="200" w:right="200"/>
+      </w:pPr>
+      <w:r>
+        <w:rPr>
+          <w:b/>
+          <w:bCs/>
+          <w:color w:val="2F6FD6"/>
+        </w:rPr>
+        <w:t xml:space="preserve">Your work is safe:  </w:t>
+      </w:r>
+      <w:r>
+        <w:t xml:space="preserve">Nothing on your disk is deleted. Your masters, finished pictures and every Finishing Touches step stay where they are: open the same masters on Finishing Touches later and the project carries on where you stopped.</w:t>
+      </w:r>
+    </w:p>
+    <w:p>
+      <w:pPr>
         <w:pStyle w:val="Heading1"/>
         <w:pageBreakBefore/>
       </w:pPr>
@@ -16455,6 +16552,38 @@
     </w:p>
     <w:p>
       <w:pPr>
+        <w:tabs>
+          <w:tab w:val="right" w:pos="4200" w:leader="dot"/>
+        </w:tabs>
+        <w:spacing w:after="10"/>
+      </w:pPr>
+      <w:r>
+        <w:rPr>
+          <w:sz w:val="19"/>
+          <w:szCs w:val="19"/>
+        </w:rPr>
+        <w:t xml:space="preserve">End this Project and Start New Project</w:t>
+      </w:r>
+      <w:r>
+        <w:rPr>
+          <w:sz w:val="19"/>
+          <w:szCs w:val="19"/>
+        </w:rPr>
+        <w:tab/>
+      </w:r>
+      <w:hyperlink w:history="1" w:anchor="s_9_7">
+        <w:r>
+          <w:rPr>
+            <w:rStyle w:val="Hyperlink"/>
+            <w:sz w:val="19"/>
+            <w:szCs w:val="19"/>
+          </w:rPr>
+          <w:t xml:space="preserve">9.7</w:t>
+        </w:r>
+      </w:hyperlink>
+    </w:p>
+    <w:p>
+      <w:pPr>
         <w:keepNext/>
         <w:spacing w:after="40" w:before="160"/>
       </w:pPr>
@@ -18326,6 +18455,70 @@
             <w:szCs w:val="19"/>
           </w:rPr>
           <w:t xml:space="preserve">6.1</w:t>
+        </w:r>
+      </w:hyperlink>
+    </w:p>
+    <w:p>
+      <w:pPr>
+        <w:tabs>
+          <w:tab w:val="right" w:pos="4200" w:leader="dot"/>
+        </w:tabs>
+        <w:spacing w:after="10"/>
+      </w:pPr>
+      <w:r>
+        <w:rPr>
+          <w:sz w:val="19"/>
+          <w:szCs w:val="19"/>
+        </w:rPr>
+        <w:t xml:space="preserve">New project</w:t>
+      </w:r>
+      <w:r>
+        <w:rPr>
+          <w:sz w:val="19"/>
+          <w:szCs w:val="19"/>
+        </w:rPr>
+        <w:tab/>
+      </w:r>
+      <w:hyperlink w:history="1" w:anchor="s_9_7">
+        <w:r>
+          <w:rPr>
+            <w:rStyle w:val="Hyperlink"/>
+            <w:sz w:val="19"/>
+            <w:szCs w:val="19"/>
+          </w:rPr>
+          <w:t xml:space="preserve">9.7</w:t>
+        </w:r>
+      </w:hyperlink>
+    </w:p>
+    <w:p>
+      <w:pPr>
+        <w:tabs>
+          <w:tab w:val="right" w:pos="4200" w:leader="dot"/>
+        </w:tabs>
+        <w:spacing w:after="10"/>
+      </w:pPr>
+      <w:r>
+        <w:rPr>
+          <w:sz w:val="19"/>
+          <w:szCs w:val="19"/>
+        </w:rPr>
+        <w:t xml:space="preserve">Next target</w:t>
+      </w:r>
+      <w:r>
+        <w:rPr>
+          <w:sz w:val="19"/>
+          <w:szCs w:val="19"/>
+        </w:rPr>
+        <w:tab/>
+      </w:r>
+      <w:hyperlink w:history="1" w:anchor="s_9_7">
+        <w:r>
+          <w:rPr>
+            <w:rStyle w:val="Hyperlink"/>
+            <w:sz w:val="19"/>
+            <w:szCs w:val="19"/>
+          </w:rPr>
+          <w:t xml:space="preserve">9.7</w:t>
         </w:r>
       </w:hyperlink>
     </w:p>

</xml_diff>

<commit_message>
Folder picker: wider sidebar; manual 0.9.12 (several folders at once, Include subfolders on by default)
Co-Authored-By: Claude Opus 5.5 <noreply@anthropic.com>
Claude-Session: https://claude.ai/code/session_01FKvd69QsnCvM2zbzYnPwmF
</commit_message>
<xml_diff>
--- a/docs/SubZeroAstro_User_Manual.docx
+++ b/docs/SubZeroAstro_User_Manual.docx
@@ -121,7 +121,7 @@
           <w:sz w:val="22"/>
           <w:szCs w:val="22"/>
         </w:rPr>
-        <w:t xml:space="preserve">Version 0.9.11 beta  ·  Windows and Mac (Apple silicon)</w:t>
+        <w:t xml:space="preserve">Version 0.9.12 beta  ·  Windows and Mac (Apple silicon)</w:t>
       </w:r>
     </w:p>
     <w:p>
@@ -6288,8 +6288,88 @@
         <w:t xml:space="preserve">Load Data</w:t>
       </w:r>
       <w:r>
-        <w:t xml:space="preserve"> (Ctrl+O). Add one or more folders (several nights, several drives) or individual files. Tick </w:t>
-      </w:r>
+        <w:t xml:space="preserve"> (Ctrl+O), then </w:t>
+      </w:r>
+      <w:r>
+        <w:rPr>
+          <w:b/>
+          <w:bCs/>
+        </w:rPr>
+        <w:t xml:space="preserve">Add Folders…</w:t>
+      </w:r>
+      <w:r>
+        <w:t xml:space="preserve">. You can pick </w:t>
+      </w:r>
+      <w:r>
+        <w:rPr>
+          <w:b/>
+          <w:bCs/>
+        </w:rPr>
+        <w:t xml:space="preserve">several folders at once</w:t>
+      </w:r>
+      <w:r>
+        <w:t xml:space="preserve">: click one, then </w:t>
+      </w:r>
+      <w:r>
+        <w:rPr>
+          <w:b/>
+          <w:bCs/>
+        </w:rPr>
+        <w:t xml:space="preserve">Shift</w:t>
+      </w:r>
+      <w:r>
+        <w:t xml:space="preserve">-click to add a range, or </w:t>
+      </w:r>
+      <w:r>
+        <w:rPr>
+          <w:b/>
+          <w:bCs/>
+        </w:rPr>
+        <w:t xml:space="preserve">Ctrl</w:t>
+      </w:r>
+      <w:r>
+        <w:t xml:space="preserve">-click (</w:t>
+      </w:r>
+      <w:r>
+        <w:rPr>
+          <w:b/>
+          <w:bCs/>
+        </w:rPr>
+        <w:t xml:space="preserve">Cmd</w:t>
+      </w:r>
+      <w:r>
+        <w:t xml:space="preserve">-click on a Mac) to add others one by one. Click </w:t>
+      </w:r>
+      <w:r>
+        <w:rPr>
+          <w:b/>
+          <w:bCs/>
+        </w:rPr>
+        <w:t xml:space="preserve">Add Folders…</w:t>
+      </w:r>
+      <w:r>
+        <w:t xml:space="preserve"> again for folders in other places (other nights, other drives), or </w:t>
+      </w:r>
+      <w:r>
+        <w:rPr>
+          <w:b/>
+          <w:bCs/>
+        </w:rPr>
+        <w:t xml:space="preserve">Add Files…</w:t>
+      </w:r>
+      <w:r>
+        <w:t xml:space="preserve"> for individual files.</w:t>
+      </w:r>
+    </w:p>
+    <w:p>
+      <w:pPr>
+        <w:pStyle w:val="ListParagraph"/>
+        <w:numPr>
+          <w:ilvl w:val="0"/>
+          <w:numId w:val="6"/>
+        </w:numPr>
+        <w:spacing w:after="60"/>
+      </w:pPr>
       <w:r>
         <w:rPr>
           <w:b/>
@@ -6298,7 +6378,7 @@
         <w:t xml:space="preserve">Include subfolders</w:t>
       </w:r>
       <w:r>
-        <w:t xml:space="preserve"> if your nights are in subfolders.</w:t>
+        <w:t xml:space="preserve"> is ticked by default, so nights kept in subfolders are found too (FLAT, DARK, BIAS, CALIB and OFFSET folders are skipped). Untick it to load only the files directly in each folder; your choice is remembered.</w:t>
       </w:r>
     </w:p>
     <w:p>
@@ -14911,7 +14991,7 @@
           <w:sz w:val="19"/>
           <w:szCs w:val="19"/>
         </w:rPr>
-        <w:t xml:space="preserve">Add Hydrogen Glow</w:t>
+        <w:t xml:space="preserve">Add Folders</w:t>
       </w:r>
       <w:r>
         <w:rPr>
@@ -14920,14 +15000,14 @@
         </w:rPr>
         <w:tab/>
       </w:r>
-      <w:hyperlink w:history="1" w:anchor="s_9_3">
+      <w:hyperlink w:history="1" w:anchor="s_6_1">
         <w:r>
           <w:rPr>
             <w:rStyle w:val="Hyperlink"/>
             <w:sz w:val="19"/>
             <w:szCs w:val="19"/>
           </w:rPr>
-          <w:t xml:space="preserve">9.3</w:t>
+          <w:t xml:space="preserve">6.1</w:t>
         </w:r>
       </w:hyperlink>
     </w:p>
@@ -14943,7 +15023,7 @@
           <w:sz w:val="19"/>
           <w:szCs w:val="19"/>
         </w:rPr>
-        <w:t xml:space="preserve">Add Masters</w:t>
+        <w:t xml:space="preserve">Add Hydrogen Glow</w:t>
       </w:r>
       <w:r>
         <w:rPr>
@@ -14952,14 +15032,14 @@
         </w:rPr>
         <w:tab/>
       </w:r>
-      <w:hyperlink w:history="1" w:anchor="s_8_1">
+      <w:hyperlink w:history="1" w:anchor="s_9_3">
         <w:r>
           <w:rPr>
             <w:rStyle w:val="Hyperlink"/>
             <w:sz w:val="19"/>
             <w:szCs w:val="19"/>
           </w:rPr>
-          <w:t xml:space="preserve">8.1</w:t>
+          <w:t xml:space="preserve">9.3</w:t>
         </w:r>
       </w:hyperlink>
     </w:p>
@@ -14975,7 +15055,7 @@
           <w:sz w:val="19"/>
           <w:szCs w:val="19"/>
         </w:rPr>
-        <w:t xml:space="preserve">Aggressive</w:t>
+        <w:t xml:space="preserve">Add Masters</w:t>
       </w:r>
       <w:r>
         <w:rPr>
@@ -14984,14 +15064,14 @@
         </w:rPr>
         <w:tab/>
       </w:r>
-      <w:hyperlink w:history="1" w:anchor="s_6_3">
+      <w:hyperlink w:history="1" w:anchor="s_8_1">
         <w:r>
           <w:rPr>
             <w:rStyle w:val="Hyperlink"/>
             <w:sz w:val="19"/>
             <w:szCs w:val="19"/>
           </w:rPr>
-          <w:t xml:space="preserve">6.3</w:t>
+          <w:t xml:space="preserve">8.1</w:t>
         </w:r>
       </w:hyperlink>
     </w:p>
@@ -15007,7 +15087,7 @@
           <w:sz w:val="19"/>
           <w:szCs w:val="19"/>
         </w:rPr>
-        <w:t xml:space="preserve">Alt-az</w:t>
+        <w:t xml:space="preserve">Aggressive</w:t>
       </w:r>
       <w:r>
         <w:rPr>
@@ -15016,14 +15096,14 @@
         </w:rPr>
         <w:tab/>
       </w:r>
-      <w:hyperlink w:history="1" w:anchor="s_10_5">
+      <w:hyperlink w:history="1" w:anchor="s_6_3">
         <w:r>
           <w:rPr>
             <w:rStyle w:val="Hyperlink"/>
             <w:sz w:val="19"/>
             <w:szCs w:val="19"/>
           </w:rPr>
-          <w:t xml:space="preserve">10.5</w:t>
+          <w:t xml:space="preserve">6.3</w:t>
         </w:r>
       </w:hyperlink>
     </w:p>
@@ -15039,7 +15119,7 @@
           <w:sz w:val="19"/>
           <w:szCs w:val="19"/>
         </w:rPr>
-        <w:t xml:space="preserve">Apply</w:t>
+        <w:t xml:space="preserve">Alt-az</w:t>
       </w:r>
       <w:r>
         <w:rPr>
@@ -15048,14 +15128,14 @@
         </w:rPr>
         <w:tab/>
       </w:r>
-      <w:hyperlink w:history="1" w:anchor="s_9_1">
+      <w:hyperlink w:history="1" w:anchor="s_10_5">
         <w:r>
           <w:rPr>
             <w:rStyle w:val="Hyperlink"/>
             <w:sz w:val="19"/>
             <w:szCs w:val="19"/>
           </w:rPr>
-          <w:t xml:space="preserve">9.1</w:t>
+          <w:t xml:space="preserve">10.5</w:t>
         </w:r>
       </w:hyperlink>
     </w:p>
@@ -15071,7 +15151,7 @@
           <w:sz w:val="19"/>
           <w:szCs w:val="19"/>
         </w:rPr>
-        <w:t xml:space="preserve">Askar D1</w:t>
+        <w:t xml:space="preserve">Apply</w:t>
       </w:r>
       <w:r>
         <w:rPr>
@@ -15080,14 +15160,14 @@
         </w:rPr>
         <w:tab/>
       </w:r>
-      <w:hyperlink w:history="1" w:anchor="s_10_2">
+      <w:hyperlink w:history="1" w:anchor="s_9_1">
         <w:r>
           <w:rPr>
             <w:rStyle w:val="Hyperlink"/>
             <w:sz w:val="19"/>
             <w:szCs w:val="19"/>
           </w:rPr>
-          <w:t xml:space="preserve">10.2</w:t>
+          <w:t xml:space="preserve">9.1</w:t>
         </w:r>
       </w:hyperlink>
     </w:p>
@@ -15103,7 +15183,7 @@
           <w:sz w:val="19"/>
           <w:szCs w:val="19"/>
         </w:rPr>
-        <w:t xml:space="preserve">Askar D2</w:t>
+        <w:t xml:space="preserve">Askar D1</w:t>
       </w:r>
       <w:r>
         <w:rPr>
@@ -15135,7 +15215,7 @@
           <w:sz w:val="19"/>
           <w:szCs w:val="19"/>
         </w:rPr>
-        <w:t xml:space="preserve">ASTAP</w:t>
+        <w:t xml:space="preserve">Askar D2</w:t>
       </w:r>
       <w:r>
         <w:rPr>
@@ -15144,59 +15224,59 @@
         </w:rPr>
         <w:tab/>
       </w:r>
-      <w:hyperlink w:history="1" w:anchor="s_2_2">
+      <w:hyperlink w:history="1" w:anchor="s_10_2">
         <w:r>
           <w:rPr>
             <w:rStyle w:val="Hyperlink"/>
             <w:sz w:val="19"/>
             <w:szCs w:val="19"/>
           </w:rPr>
-          <w:t xml:space="preserve">2.2</w:t>
-        </w:r>
-      </w:hyperlink>
-      <w:r>
-        <w:t xml:space="preserve">, </w:t>
-      </w:r>
-      <w:hyperlink w:history="1" w:anchor="s_4_1">
+          <w:t xml:space="preserve">10.2</w:t>
+        </w:r>
+      </w:hyperlink>
+    </w:p>
+    <w:p>
+      <w:pPr>
+        <w:tabs>
+          <w:tab w:val="right" w:pos="4200" w:leader="dot"/>
+        </w:tabs>
+        <w:spacing w:after="10"/>
+      </w:pPr>
+      <w:r>
+        <w:rPr>
+          <w:sz w:val="19"/>
+          <w:szCs w:val="19"/>
+        </w:rPr>
+        <w:t xml:space="preserve">ASTAP</w:t>
+      </w:r>
+      <w:r>
+        <w:rPr>
+          <w:sz w:val="19"/>
+          <w:szCs w:val="19"/>
+        </w:rPr>
+        <w:tab/>
+      </w:r>
+      <w:hyperlink w:history="1" w:anchor="s_2_2">
         <w:r>
           <w:rPr>
             <w:rStyle w:val="Hyperlink"/>
             <w:sz w:val="19"/>
             <w:szCs w:val="19"/>
           </w:rPr>
-          <w:t xml:space="preserve">4.1</w:t>
-        </w:r>
-      </w:hyperlink>
-    </w:p>
-    <w:p>
-      <w:pPr>
-        <w:tabs>
-          <w:tab w:val="right" w:pos="4200" w:leader="dot"/>
-        </w:tabs>
-        <w:spacing w:after="10"/>
-      </w:pPr>
-      <w:r>
-        <w:rPr>
-          <w:sz w:val="19"/>
-          <w:szCs w:val="19"/>
-        </w:rPr>
-        <w:t xml:space="preserve">AstroBin</w:t>
-      </w:r>
-      <w:r>
-        <w:rPr>
-          <w:sz w:val="19"/>
-          <w:szCs w:val="19"/>
-        </w:rPr>
-        <w:tab/>
-      </w:r>
-      <w:hyperlink w:history="1" w:anchor="s_9_6">
+          <w:t xml:space="preserve">2.2</w:t>
+        </w:r>
+      </w:hyperlink>
+      <w:r>
+        <w:t xml:space="preserve">, </w:t>
+      </w:r>
+      <w:hyperlink w:history="1" w:anchor="s_4_1">
         <w:r>
           <w:rPr>
             <w:rStyle w:val="Hyperlink"/>
             <w:sz w:val="19"/>
             <w:szCs w:val="19"/>
           </w:rPr>
-          <w:t xml:space="preserve">9.6</w:t>
+          <w:t xml:space="preserve">4.1</w:t>
         </w:r>
       </w:hyperlink>
     </w:p>
@@ -15212,7 +15292,7 @@
           <w:sz w:val="19"/>
           <w:szCs w:val="19"/>
         </w:rPr>
-        <w:t xml:space="preserve">Auto-crop</w:t>
+        <w:t xml:space="preserve">AstroBin</w:t>
       </w:r>
       <w:r>
         <w:rPr>
@@ -15221,14 +15301,14 @@
         </w:rPr>
         <w:tab/>
       </w:r>
-      <w:hyperlink w:history="1" w:anchor="s_8_2">
+      <w:hyperlink w:history="1" w:anchor="s_9_6">
         <w:r>
           <w:rPr>
             <w:rStyle w:val="Hyperlink"/>
             <w:sz w:val="19"/>
             <w:szCs w:val="19"/>
           </w:rPr>
-          <w:t xml:space="preserve">8.2</w:t>
+          <w:t xml:space="preserve">9.6</w:t>
         </w:r>
       </w:hyperlink>
     </w:p>
@@ -15244,7 +15324,7 @@
           <w:sz w:val="19"/>
           <w:szCs w:val="19"/>
         </w:rPr>
-        <w:t xml:space="preserve">Auto-cull</w:t>
+        <w:t xml:space="preserve">Auto-crop</w:t>
       </w:r>
       <w:r>
         <w:rPr>
@@ -15253,14 +15333,14 @@
         </w:rPr>
         <w:tab/>
       </w:r>
-      <w:hyperlink w:history="1" w:anchor="s_6_3">
+      <w:hyperlink w:history="1" w:anchor="s_8_2">
         <w:r>
           <w:rPr>
             <w:rStyle w:val="Hyperlink"/>
             <w:sz w:val="19"/>
             <w:szCs w:val="19"/>
           </w:rPr>
-          <w:t xml:space="preserve">6.3</w:t>
+          <w:t xml:space="preserve">8.2</w:t>
         </w:r>
       </w:hyperlink>
     </w:p>
@@ -15276,7 +15356,7 @@
           <w:sz w:val="19"/>
           <w:szCs w:val="19"/>
         </w:rPr>
-        <w:t xml:space="preserve">Auto-Flag</w:t>
+        <w:t xml:space="preserve">Auto-cull</w:t>
       </w:r>
       <w:r>
         <w:rPr>
@@ -15298,6 +15378,38 @@
     </w:p>
     <w:p>
       <w:pPr>
+        <w:tabs>
+          <w:tab w:val="right" w:pos="4200" w:leader="dot"/>
+        </w:tabs>
+        <w:spacing w:after="10"/>
+      </w:pPr>
+      <w:r>
+        <w:rPr>
+          <w:sz w:val="19"/>
+          <w:szCs w:val="19"/>
+        </w:rPr>
+        <w:t xml:space="preserve">Auto-Flag</w:t>
+      </w:r>
+      <w:r>
+        <w:rPr>
+          <w:sz w:val="19"/>
+          <w:szCs w:val="19"/>
+        </w:rPr>
+        <w:tab/>
+      </w:r>
+      <w:hyperlink w:history="1" w:anchor="s_6_3">
+        <w:r>
+          <w:rPr>
+            <w:rStyle w:val="Hyperlink"/>
+            <w:sz w:val="19"/>
+            <w:szCs w:val="19"/>
+          </w:rPr>
+          <w:t xml:space="preserve">6.3</w:t>
+        </w:r>
+      </w:hyperlink>
+    </w:p>
+    <w:p>
+      <w:pPr>
         <w:keepNext/>
         <w:spacing w:after="40" w:before="160"/>
       </w:pPr>
@@ -20194,6 +20306,38 @@
             <w:szCs w:val="19"/>
           </w:rPr>
           <w:t xml:space="preserve">13.2</w:t>
+        </w:r>
+      </w:hyperlink>
+    </w:p>
+    <w:p>
+      <w:pPr>
+        <w:tabs>
+          <w:tab w:val="right" w:pos="4200" w:leader="dot"/>
+        </w:tabs>
+        <w:spacing w:after="10"/>
+      </w:pPr>
+      <w:r>
+        <w:rPr>
+          <w:sz w:val="19"/>
+          <w:szCs w:val="19"/>
+        </w:rPr>
+        <w:t xml:space="preserve">Several folders at once</w:t>
+      </w:r>
+      <w:r>
+        <w:rPr>
+          <w:sz w:val="19"/>
+          <w:szCs w:val="19"/>
+        </w:rPr>
+        <w:tab/>
+      </w:r>
+      <w:hyperlink w:history="1" w:anchor="s_6_1">
+        <w:r>
+          <w:rPr>
+            <w:rStyle w:val="Hyperlink"/>
+            <w:sz w:val="19"/>
+            <w:szCs w:val="19"/>
+          </w:rPr>
+          <w:t xml:space="preserve">6.1</w:t>
         </w:r>
       </w:hyperlink>
     </w:p>

</xml_diff>

<commit_message>
User manual 0.9.14 (Dust donuts)
Co-Authored-By: Claude Opus 5.5 <noreply@anthropic.com>
Claude-Session: https://claude.ai/code/session_01FKvd69QsnCvM2zbzYnPwmF
</commit_message>
<xml_diff>
--- a/docs/SubZeroAstro_User_Manual.docx
+++ b/docs/SubZeroAstro_User_Manual.docx
@@ -121,7 +121,7 @@
           <w:sz w:val="22"/>
           <w:szCs w:val="22"/>
         </w:rPr>
-        <w:t xml:space="preserve">Version 0.9.13 beta  ·  Windows and Mac (Apple silicon)</w:t>
+        <w:t xml:space="preserve">Version 0.9.14 beta  ·  Windows and Mac (Apple silicon)</w:t>
       </w:r>
     </w:p>
     <w:p>
@@ -1105,7 +1105,7 @@
             <w:b w:val="false"/>
             <w:bCs w:val="false"/>
           </w:rPr>
-          <w:t xml:space="preserve">9.4   Stars: take out, brighten, colour, put back</w:t>
+          <w:t xml:space="preserve">9.4   Dust donuts</w:t>
         </w:r>
       </w:hyperlink>
     </w:p>
@@ -1123,7 +1123,7 @@
             <w:b w:val="false"/>
             <w:bCs w:val="false"/>
           </w:rPr>
-          <w:t xml:space="preserve">9.5   Darker sky, Final Crop, Spot Fix and your signature</w:t>
+          <w:t xml:space="preserve">9.5   Stars: take out, brighten, colour, put back</w:t>
         </w:r>
       </w:hyperlink>
     </w:p>
@@ -1141,7 +1141,7 @@
             <w:b w:val="false"/>
             <w:bCs w:val="false"/>
           </w:rPr>
-          <w:t xml:space="preserve">9.6   Saving and sharing</w:t>
+          <w:t xml:space="preserve">9.6   Darker sky, Final Crop, Spot Fix and your signature</w:t>
         </w:r>
       </w:hyperlink>
     </w:p>
@@ -1159,7 +1159,25 @@
             <w:b w:val="false"/>
             <w:bCs w:val="false"/>
           </w:rPr>
-          <w:t xml:space="preserve">9.7   Starting your next target</w:t>
+          <w:t xml:space="preserve">9.7   Saving and sharing</w:t>
+        </w:r>
+      </w:hyperlink>
+    </w:p>
+    <w:p>
+      <w:pPr>
+        <w:tabs>
+          <w:tab w:val="right" w:pos="9360" w:leader="dot"/>
+        </w:tabs>
+        <w:spacing w:after="20" w:before="0"/>
+        <w:ind w:left="480"/>
+      </w:pPr>
+      <w:hyperlink w:history="1" w:anchor="s_9_8">
+        <w:r>
+          <w:rPr>
+            <w:b w:val="false"/>
+            <w:bCs w:val="false"/>
+          </w:rPr>
+          <w:t xml:space="preserve">9.8   Starting your next target</w:t>
         </w:r>
       </w:hyperlink>
     </w:p>
@@ -10156,7 +10174,7 @@
           </w:tcPr>
           <w:p>
             <w:r>
-              <w:t xml:space="preserve">Take Stars Out</w:t>
+              <w:t xml:space="preserve">Fix Dust Donuts ◇</w:t>
             </w:r>
           </w:p>
         </w:tc>
@@ -10178,7 +10196,7 @@
           </w:tcPr>
           <w:p>
             <w:r>
-              <w:t xml:space="preserve">Hides the stars so the nebula can be brightened strongly (instant if page 3 already separated them)</w:t>
+              <w:t xml:space="preserve">Finds the round shadows of dust and divides them out with a synthetic flat - the detail underneath comes back</w:t>
             </w:r>
           </w:p>
         </w:tc>
@@ -10200,7 +10218,7 @@
           </w:tcPr>
           <w:p>
             <w:r>
-              <w:t xml:space="preserve">StarXTerminator</w:t>
+              <w:t xml:space="preserve">A new flat, or DBE with division</w:t>
             </w:r>
           </w:p>
         </w:tc>
@@ -10227,7 +10245,7 @@
           </w:tcPr>
           <w:p>
             <w:r>
-              <w:t xml:space="preserve">Brighten the Image</w:t>
+              <w:t xml:space="preserve">Take Stars Out</w:t>
             </w:r>
           </w:p>
         </w:tc>
@@ -10249,7 +10267,7 @@
           </w:tcPr>
           <w:p>
             <w:r>
-              <w:t xml:space="preserve">The stretch - five strengths, three methods</w:t>
+              <w:t xml:space="preserve">Hides the stars so the nebula can be brightened strongly (instant if page 3 already separated them)</w:t>
             </w:r>
           </w:p>
         </w:tc>
@@ -10271,7 +10289,7 @@
           </w:tcPr>
           <w:p>
             <w:r>
-              <w:t xml:space="preserve">STF / HistogramTransformation / GHS</w:t>
+              <w:t xml:space="preserve">StarXTerminator</w:t>
             </w:r>
           </w:p>
         </w:tc>
@@ -10298,7 +10316,7 @@
           </w:tcPr>
           <w:p>
             <w:r>
-              <w:t xml:space="preserve">Tame Bright Core ◇</w:t>
+              <w:t xml:space="preserve">Brighten the Image</w:t>
             </w:r>
           </w:p>
         </w:tc>
@@ -10320,7 +10338,7 @@
           </w:tcPr>
           <w:p>
             <w:r>
-              <w:t xml:space="preserve">Recovers detail in a burnt-out galaxy core or bright nebula</w:t>
+              <w:t xml:space="preserve">The stretch - five strengths, three methods</w:t>
             </w:r>
           </w:p>
         </w:tc>
@@ -10342,7 +10360,7 @@
           </w:tcPr>
           <w:p>
             <w:r>
-              <w:t xml:space="preserve">HDRMultiscaleTransform with a mask</w:t>
+              <w:t xml:space="preserve">STF / HistogramTransformation / GHS</w:t>
             </w:r>
           </w:p>
         </w:tc>
@@ -10369,7 +10387,7 @@
           </w:tcPr>
           <w:p>
             <w:r>
-              <w:t xml:space="preserve">Adjust Brightness &amp; Contrast</w:t>
+              <w:t xml:space="preserve">Tame Bright Core ◇</w:t>
             </w:r>
           </w:p>
         </w:tc>
@@ -10391,7 +10409,7 @@
           </w:tcPr>
           <w:p>
             <w:r>
-              <w:t xml:space="preserve">Curves presets, sliders and a curve you can drag</w:t>
+              <w:t xml:space="preserve">Recovers detail in a burnt-out galaxy core or bright nebula</w:t>
             </w:r>
           </w:p>
         </w:tc>
@@ -10413,7 +10431,7 @@
           </w:tcPr>
           <w:p>
             <w:r>
-              <w:t xml:space="preserve">CurvesTransformation</w:t>
+              <w:t xml:space="preserve">HDRMultiscaleTransform with a mask</w:t>
             </w:r>
           </w:p>
         </w:tc>
@@ -10440,7 +10458,7 @@
           </w:tcPr>
           <w:p>
             <w:r>
-              <w:t xml:space="preserve">Colour Intensity</w:t>
+              <w:t xml:space="preserve">Adjust Brightness &amp; Contrast</w:t>
             </w:r>
           </w:p>
         </w:tc>
@@ -10462,7 +10480,7 @@
           </w:tcPr>
           <w:p>
             <w:r>
-              <w:t xml:space="preserve">Richer or calmer colour; dark sky protected</w:t>
+              <w:t xml:space="preserve">Curves presets, sliders and a curve you can drag</w:t>
             </w:r>
           </w:p>
         </w:tc>
@@ -10484,7 +10502,7 @@
           </w:tcPr>
           <w:p>
             <w:r>
-              <w:t xml:space="preserve">Saturation curve</w:t>
+              <w:t xml:space="preserve">CurvesTransformation</w:t>
             </w:r>
           </w:p>
         </w:tc>
@@ -10511,7 +10529,7 @@
           </w:tcPr>
           <w:p>
             <w:r>
-              <w:t xml:space="preserve">Bring Out Hidden Structure ◇</w:t>
+              <w:t xml:space="preserve">Colour Intensity</w:t>
             </w:r>
           </w:p>
         </w:tc>
@@ -10533,7 +10551,7 @@
           </w:tcPr>
           <w:p>
             <w:r>
-              <w:t xml:space="preserve">Local contrast for dust lanes and cores</w:t>
+              <w:t xml:space="preserve">Richer or calmer colour; dark sky protected</w:t>
             </w:r>
           </w:p>
         </w:tc>
@@ -10555,7 +10573,7 @@
           </w:tcPr>
           <w:p>
             <w:r>
-              <w:t xml:space="preserve">LocalHistogramEqualization</w:t>
+              <w:t xml:space="preserve">Saturation curve</w:t>
             </w:r>
           </w:p>
         </w:tc>
@@ -10582,7 +10600,7 @@
           </w:tcPr>
           <w:p>
             <w:r>
-              <w:t xml:space="preserve">Brighten Stars Separately</w:t>
+              <w:t xml:space="preserve">Bring Out Hidden Structure ◇</w:t>
             </w:r>
           </w:p>
         </w:tc>
@@ -10604,7 +10622,7 @@
           </w:tcPr>
           <w:p>
             <w:r>
-              <w:t xml:space="preserve">Gentle star stretch - small, colourful stars</w:t>
+              <w:t xml:space="preserve">Local contrast for dust lanes and cores</w:t>
             </w:r>
           </w:p>
         </w:tc>
@@ -10626,7 +10644,7 @@
           </w:tcPr>
           <w:p>
             <w:r>
-              <w:t xml:space="preserve">Star stretch</w:t>
+              <w:t xml:space="preserve">LocalHistogramEqualization</w:t>
             </w:r>
           </w:p>
         </w:tc>
@@ -10653,7 +10671,7 @@
           </w:tcPr>
           <w:p>
             <w:r>
-              <w:t xml:space="preserve">Shrink Stars</w:t>
+              <w:t xml:space="preserve">Brighten Stars Separately</w:t>
             </w:r>
           </w:p>
         </w:tc>
@@ -10675,7 +10693,7 @@
           </w:tcPr>
           <w:p>
             <w:r>
-              <w:t xml:space="preserve">Makes stars smaller</w:t>
+              <w:t xml:space="preserve">Gentle star stretch - small, colourful stars</w:t>
             </w:r>
           </w:p>
         </w:tc>
@@ -10697,7 +10715,7 @@
           </w:tcPr>
           <w:p>
             <w:r>
-              <w:t xml:space="preserve">Star reduction / MorphologicalTransformation</w:t>
+              <w:t xml:space="preserve">Star stretch</w:t>
             </w:r>
           </w:p>
         </w:tc>
@@ -10724,7 +10742,7 @@
           </w:tcPr>
           <w:p>
             <w:r>
-              <w:t xml:space="preserve">Star Colours</w:t>
+              <w:t xml:space="preserve">Shrink Stars</w:t>
             </w:r>
           </w:p>
         </w:tc>
@@ -10746,7 +10764,7 @@
           </w:tcPr>
           <w:p>
             <w:r>
-              <w:t xml:space="preserve">Natural star colours (estimated from your data) or clean white stars - recommended for narrowband</w:t>
+              <w:t xml:space="preserve">Makes stars smaller</w:t>
             </w:r>
           </w:p>
         </w:tc>
@@ -10768,7 +10786,7 @@
           </w:tcPr>
           <w:p>
             <w:r>
-              <w:t xml:space="preserve">Star colour correction</w:t>
+              <w:t xml:space="preserve">Star reduction / MorphologicalTransformation</w:t>
             </w:r>
           </w:p>
         </w:tc>
@@ -10795,7 +10813,7 @@
           </w:tcPr>
           <w:p>
             <w:r>
-              <w:t xml:space="preserve">Put Stars Back</w:t>
+              <w:t xml:space="preserve">Star Colours</w:t>
             </w:r>
           </w:p>
         </w:tc>
@@ -10817,7 +10835,7 @@
           </w:tcPr>
           <w:p>
             <w:r>
-              <w:t xml:space="preserve">Blends the stars back at the strength you pick</w:t>
+              <w:t xml:space="preserve">Natural star colours (estimated from your data) or clean white stars - recommended for narrowband</w:t>
             </w:r>
           </w:p>
         </w:tc>
@@ -10839,7 +10857,7 @@
           </w:tcPr>
           <w:p>
             <w:r>
-              <w:t xml:space="preserve">PixelMath screen blend</w:t>
+              <w:t xml:space="preserve">Star colour correction</w:t>
             </w:r>
           </w:p>
         </w:tc>
@@ -10866,7 +10884,7 @@
           </w:tcPr>
           <w:p>
             <w:r>
-              <w:t xml:space="preserve">Darken the Sky Background ◇</w:t>
+              <w:t xml:space="preserve">Put Stars Back</w:t>
             </w:r>
           </w:p>
         </w:tc>
@@ -10888,7 +10906,7 @@
           </w:tcPr>
           <w:p>
             <w:r>
-              <w:t xml:space="preserve">Darker (or lighter) sky without dimming the nebula, faint dust or stars; also evens out a brighter corner or side</w:t>
+              <w:t xml:space="preserve">Blends the stars back at the strength you pick</w:t>
             </w:r>
           </w:p>
         </w:tc>
@@ -10910,7 +10928,7 @@
           </w:tcPr>
           <w:p>
             <w:r>
-              <w:t xml:space="preserve">ABE/DBE model + PixelMath</w:t>
+              <w:t xml:space="preserve">PixelMath screen blend</w:t>
             </w:r>
           </w:p>
         </w:tc>
@@ -10937,7 +10955,7 @@
           </w:tcPr>
           <w:p>
             <w:r>
-              <w:t xml:space="preserve">Final Noise Reduction ◇</w:t>
+              <w:t xml:space="preserve">Darken the Sky Background ◇</w:t>
             </w:r>
           </w:p>
         </w:tc>
@@ -10959,7 +10977,7 @@
           </w:tcPr>
           <w:p>
             <w:r>
-              <w:t xml:space="preserve">A last, light NoiseXTerminator pass on the finished picture (needs the RC-Astro CLI)</w:t>
+              <w:t xml:space="preserve">Darker (or lighter) sky without dimming the nebula, faint dust or stars; also evens out a brighter corner or side</w:t>
             </w:r>
           </w:p>
         </w:tc>
@@ -10981,7 +10999,7 @@
           </w:tcPr>
           <w:p>
             <w:r>
-              <w:t xml:space="preserve">NoiseXTerminator</w:t>
+              <w:t xml:space="preserve">ABE/DBE model + PixelMath</w:t>
             </w:r>
           </w:p>
         </w:tc>
@@ -11008,7 +11026,7 @@
           </w:tcPr>
           <w:p>
             <w:r>
-              <w:t xml:space="preserve">Final Crop ◇</w:t>
+              <w:t xml:space="preserve">Final Noise Reduction ◇</w:t>
             </w:r>
           </w:p>
         </w:tc>
@@ -11030,7 +11048,7 @@
           </w:tcPr>
           <w:p>
             <w:r>
-              <w:t xml:space="preserve">A last clean-up crop; finds ragged or off-colour edges for you</w:t>
+              <w:t xml:space="preserve">A last, light NoiseXTerminator pass on the finished picture (needs the RC-Astro CLI)</w:t>
             </w:r>
           </w:p>
         </w:tc>
@@ -11052,7 +11070,7 @@
           </w:tcPr>
           <w:p>
             <w:r>
-              <w:t xml:space="preserve">DynamicCrop</w:t>
+              <w:t xml:space="preserve">NoiseXTerminator</w:t>
             </w:r>
           </w:p>
         </w:tc>
@@ -11079,7 +11097,7 @@
           </w:tcPr>
           <w:p>
             <w:r>
-              <w:t xml:space="preserve">Spot Fix ◇</w:t>
+              <w:t xml:space="preserve">Final Crop ◇</w:t>
             </w:r>
           </w:p>
         </w:tc>
@@ -11101,7 +11119,7 @@
           </w:tcPr>
           <w:p>
             <w:r>
-              <w:t xml:space="preserve">Click dust donuts, satellite remnants or hot pixels to patch them</w:t>
+              <w:t xml:space="preserve">A last clean-up crop; finds ragged or off-colour edges for you</w:t>
             </w:r>
           </w:p>
         </w:tc>
@@ -11123,7 +11141,7 @@
           </w:tcPr>
           <w:p>
             <w:r>
-              <w:t xml:space="preserve">CloneStamp</w:t>
+              <w:t xml:space="preserve">DynamicCrop</w:t>
             </w:r>
           </w:p>
         </w:tc>
@@ -11150,6 +11168,77 @@
           </w:tcPr>
           <w:p>
             <w:r>
+              <w:t xml:space="preserve">Spot Fix ◇</w:t>
+            </w:r>
+          </w:p>
+        </w:tc>
+        <w:tc>
+          <w:tcPr>
+            <w:tcW w:type="dxa" w:w="4460"/>
+            <w:tcBorders>
+              <w:top w:val="single" w:color="BFBFBF" w:sz="4"/>
+              <w:left w:val="single" w:color="BFBFBF" w:sz="4"/>
+              <w:bottom w:val="single" w:color="BFBFBF" w:sz="4"/>
+              <w:right w:val="single" w:color="BFBFBF" w:sz="4"/>
+            </w:tcBorders>
+            <w:tcMar>
+              <w:top w:type="dxa" w:w="60"/>
+              <w:left w:type="dxa" w:w="100"/>
+              <w:bottom w:type="dxa" w:w="60"/>
+              <w:right w:type="dxa" w:w="100"/>
+            </w:tcMar>
+          </w:tcPr>
+          <w:p>
+            <w:r>
+              <w:t xml:space="preserve">Click dust donuts, satellite remnants or hot pixels to patch them</w:t>
+            </w:r>
+          </w:p>
+        </w:tc>
+        <w:tc>
+          <w:tcPr>
+            <w:tcW w:type="dxa" w:w="2400"/>
+            <w:tcBorders>
+              <w:top w:val="single" w:color="BFBFBF" w:sz="4"/>
+              <w:left w:val="single" w:color="BFBFBF" w:sz="4"/>
+              <w:bottom w:val="single" w:color="BFBFBF" w:sz="4"/>
+              <w:right w:val="single" w:color="BFBFBF" w:sz="4"/>
+            </w:tcBorders>
+            <w:tcMar>
+              <w:top w:type="dxa" w:w="60"/>
+              <w:left w:type="dxa" w:w="100"/>
+              <w:bottom w:type="dxa" w:w="60"/>
+              <w:right w:type="dxa" w:w="100"/>
+            </w:tcMar>
+          </w:tcPr>
+          <w:p>
+            <w:r>
+              <w:t xml:space="preserve">CloneStamp</w:t>
+            </w:r>
+          </w:p>
+        </w:tc>
+      </w:tr>
+      <w:tr>
+        <w:trPr>
+          <w:cantSplit/>
+        </w:trPr>
+        <w:tc>
+          <w:tcPr>
+            <w:tcW w:type="dxa" w:w="2500"/>
+            <w:tcBorders>
+              <w:top w:val="single" w:color="BFBFBF" w:sz="4"/>
+              <w:left w:val="single" w:color="BFBFBF" w:sz="4"/>
+              <w:bottom w:val="single" w:color="BFBFBF" w:sz="4"/>
+              <w:right w:val="single" w:color="BFBFBF" w:sz="4"/>
+            </w:tcBorders>
+            <w:tcMar>
+              <w:top w:type="dxa" w:w="60"/>
+              <w:left w:type="dxa" w:w="100"/>
+              <w:bottom w:type="dxa" w:w="60"/>
+              <w:right w:type="dxa" w:w="100"/>
+            </w:tcMar>
+          </w:tcPr>
+          <w:p>
+            <w:r>
               <w:t xml:space="preserve">Sign Your Picture ◇</w:t>
             </w:r>
           </w:p>
@@ -11229,7 +11318,7 @@
       </w:pPr>
       <w:bookmarkStart w:name="s_9_4" w:id="1"/>
       <w:r>
-        <w:t xml:space="preserve">9.4   Stars: take out, brighten, colour, put back</w:t>
+        <w:t xml:space="preserve">9.4   Dust donuts</w:t>
       </w:r>
       <w:bookmarkEnd w:id="1"/>
     </w:p>
@@ -11238,6 +11327,143 @@
         <w:spacing w:after="120"/>
       </w:pPr>
       <w:r>
+        <w:t xml:space="preserve">Dust on a filter or on the camera window casts round shadows - </w:t>
+      </w:r>
+      <w:r>
+        <w:rPr>
+          <w:b/>
+          <w:bCs/>
+        </w:rPr>
+        <w:t xml:space="preserve">dust donuts</w:t>
+      </w:r>
+      <w:r>
+        <w:t xml:space="preserve"> (rings with a reflector, discs with a refractor). A good flat removes them; when the flat is missing or no longer matches, </w:t>
+      </w:r>
+      <w:r>
+        <w:rPr>
+          <w:b/>
+          <w:bCs/>
+        </w:rPr>
+        <w:t xml:space="preserve">Fix Dust Donuts</w:t>
+      </w:r>
+      <w:r>
+        <w:t xml:space="preserve"> helps. A dust shadow does not wipe anything out: it lets through the same fraction of light everywhere inside it, nebula included. So SubZeroAstro measures each donut's shadow ring by ring - in 16 directions against the sky just outside it, levelled for any gradient - builds a </w:t>
+      </w:r>
+      <w:r>
+        <w:rPr>
+          <w:b/>
+          <w:bCs/>
+        </w:rPr>
+        <w:t xml:space="preserve">synthetic flat</w:t>
+      </w:r>
+      <w:r>
+        <w:t xml:space="preserve"> just for that donut and divides it out, the way a uniformity (flood-field) correction works. The detail underneath comes back instead of being painted over.</w:t>
+      </w:r>
+    </w:p>
+    <w:p>
+      <w:pPr>
+        <w:pStyle w:val="ListParagraph"/>
+        <w:numPr>
+          <w:ilvl w:val="0"/>
+          <w:numId w:val="2"/>
+        </w:numPr>
+        <w:spacing w:after="60"/>
+      </w:pPr>
+      <w:r>
+        <w:t xml:space="preserve">Open </w:t>
+      </w:r>
+      <w:r>
+        <w:rPr>
+          <w:b/>
+          <w:bCs/>
+        </w:rPr>
+        <w:t xml:space="preserve">Fix Dust Donuts</w:t>
+      </w:r>
+      <w:r>
+        <w:t xml:space="preserve"> while the picture is still unstretched (it comes before </w:t>
+      </w:r>
+      <w:r>
+        <w:rPr>
+          <w:i/>
+          <w:iCs/>
+        </w:rPr>
+        <w:t xml:space="preserve">Take Stars Out</w:t>
+      </w:r>
+      <w:r>
+        <w:t xml:space="preserve">). The donuts it finds in the sky are already circled in yellow.</w:t>
+      </w:r>
+    </w:p>
+    <w:p>
+      <w:pPr>
+        <w:pStyle w:val="ListParagraph"/>
+        <w:numPr>
+          <w:ilvl w:val="0"/>
+          <w:numId w:val="2"/>
+        </w:numPr>
+        <w:spacing w:after="60"/>
+      </w:pPr>
+      <w:r>
+        <w:t xml:space="preserve">Donuts on bright nebulosity are not searched automatically (a gap between filaments could look like one) - </w:t>
+      </w:r>
+      <w:r>
+        <w:rPr>
+          <w:b/>
+          <w:bCs/>
+        </w:rPr>
+        <w:t xml:space="preserve">click</w:t>
+      </w:r>
+      <w:r>
+        <w:t xml:space="preserve"> those yourself. The mouse wheel sets the circle size (just cover the donut); right-click removes the last circle. Clicks need not be exact: each circle is centred on its donut automatically.</w:t>
+      </w:r>
+    </w:p>
+    <w:p>
+      <w:pPr>
+        <w:pStyle w:val="ListParagraph"/>
+        <w:numPr>
+          <w:ilvl w:val="0"/>
+          <w:numId w:val="2"/>
+        </w:numPr>
+        <w:spacing w:after="60"/>
+      </w:pPr>
+      <w:r>
+        <w:t xml:space="preserve">Check the preview, then </w:t>
+      </w:r>
+      <w:r>
+        <w:rPr>
+          <w:b/>
+          <w:bCs/>
+        </w:rPr>
+        <w:t xml:space="preserve">Apply</w:t>
+      </w:r>
+      <w:r>
+        <w:t xml:space="preserve">. For small specks (hot pixels, satellite remnants) use </w:t>
+      </w:r>
+      <w:r>
+        <w:rPr>
+          <w:b/>
+          <w:bCs/>
+        </w:rPr>
+        <w:t xml:space="preserve">Spot Fix</w:t>
+      </w:r>
+      <w:r>
+        <w:t xml:space="preserve"> instead.</w:t>
+      </w:r>
+    </w:p>
+    <w:p>
+      <w:pPr>
+        <w:pStyle w:val="Heading2"/>
+      </w:pPr>
+      <w:bookmarkStart w:name="s_9_5" w:id="1"/>
+      <w:r>
+        <w:t xml:space="preserve">9.5   Stars: take out, brighten, colour, put back</w:t>
+      </w:r>
+      <w:bookmarkEnd w:id="1"/>
+    </w:p>
+    <w:p>
+      <w:pPr>
+        <w:spacing w:after="120"/>
+      </w:pPr>
+      <w:r>
         <w:t xml:space="preserve">Stars and nebula look best when processed separately. </w:t>
       </w:r>
       <w:r>
@@ -11305,9 +11531,9 @@
       <w:pPr>
         <w:pStyle w:val="Heading2"/>
       </w:pPr>
-      <w:bookmarkStart w:name="s_9_5" w:id="1"/>
-      <w:r>
-        <w:t xml:space="preserve">9.5   Darker sky, Final Crop, Spot Fix and your signature</w:t>
+      <w:bookmarkStart w:name="s_9_6" w:id="1"/>
+      <w:r>
+        <w:t xml:space="preserve">9.6   Darker sky, Final Crop, Spot Fix and your signature</w:t>
       </w:r>
       <w:bookmarkEnd w:id="1"/>
     </w:p>
@@ -11658,9 +11884,9 @@
       <w:pPr>
         <w:pStyle w:val="Heading2"/>
       </w:pPr>
-      <w:bookmarkStart w:name="s_9_6" w:id="1"/>
-      <w:r>
-        <w:t xml:space="preserve">9.6   Saving and sharing</w:t>
+      <w:bookmarkStart w:name="s_9_7" w:id="1"/>
+      <w:r>
+        <w:t xml:space="preserve">9.7   Saving and sharing</w:t>
       </w:r>
       <w:bookmarkEnd w:id="1"/>
     </w:p>
@@ -11778,9 +12004,9 @@
       <w:pPr>
         <w:pStyle w:val="Heading2"/>
       </w:pPr>
-      <w:bookmarkStart w:name="s_9_7" w:id="1"/>
-      <w:r>
-        <w:t xml:space="preserve">9.7   Starting your next target</w:t>
+      <w:bookmarkStart w:name="s_9_8" w:id="1"/>
+      <w:r>
+        <w:t xml:space="preserve">9.8   Starting your next target</w:t>
       </w:r>
       <w:bookmarkEnd w:id="1"/>
     </w:p>
@@ -15593,14 +15819,14 @@
         </w:rPr>
         <w:tab/>
       </w:r>
-      <w:hyperlink w:history="1" w:anchor="s_9_6">
+      <w:hyperlink w:history="1" w:anchor="s_9_7">
         <w:r>
           <w:rPr>
             <w:rStyle w:val="Hyperlink"/>
             <w:sz w:val="19"/>
             <w:szCs w:val="19"/>
           </w:rPr>
-          <w:t xml:space="preserve">9.6</w:t>
+          <w:t xml:space="preserve">9.7</w:t>
         </w:r>
       </w:hyperlink>
     </w:p>
@@ -16723,14 +16949,14 @@
       <w:r>
         <w:t xml:space="preserve">, </w:t>
       </w:r>
-      <w:hyperlink w:history="1" w:anchor="s_9_5">
+      <w:hyperlink w:history="1" w:anchor="s_9_6">
         <w:r>
           <w:rPr>
             <w:rStyle w:val="Hyperlink"/>
             <w:sz w:val="19"/>
             <w:szCs w:val="19"/>
           </w:rPr>
-          <w:t xml:space="preserve">9.5</w:t>
+          <w:t xml:space="preserve">9.6</w:t>
         </w:r>
       </w:hyperlink>
     </w:p>
@@ -16938,7 +17164,7 @@
           <w:sz w:val="19"/>
           <w:szCs w:val="19"/>
         </w:rPr>
-        <w:t xml:space="preserve">DWARF</w:t>
+        <w:t xml:space="preserve">Dust donuts</w:t>
       </w:r>
       <w:r>
         <w:rPr>
@@ -16947,13 +17173,77 @@
         </w:rPr>
         <w:tab/>
       </w:r>
-      <w:hyperlink w:history="1" w:anchor="s_10_5">
+      <w:hyperlink w:history="1" w:anchor="s_9_4">
         <w:r>
           <w:rPr>
             <w:rStyle w:val="Hyperlink"/>
             <w:sz w:val="19"/>
             <w:szCs w:val="19"/>
           </w:rPr>
+          <w:t xml:space="preserve">9.4</w:t>
+        </w:r>
+      </w:hyperlink>
+    </w:p>
+    <w:p>
+      <w:pPr>
+        <w:tabs>
+          <w:tab w:val="right" w:pos="4200" w:leader="dot"/>
+        </w:tabs>
+        <w:spacing w:after="10"/>
+      </w:pPr>
+      <w:r>
+        <w:rPr>
+          <w:sz w:val="19"/>
+          <w:szCs w:val="19"/>
+        </w:rPr>
+        <w:t xml:space="preserve">Dust motes</w:t>
+      </w:r>
+      <w:r>
+        <w:rPr>
+          <w:sz w:val="19"/>
+          <w:szCs w:val="19"/>
+        </w:rPr>
+        <w:tab/>
+      </w:r>
+      <w:hyperlink w:history="1" w:anchor="s_9_4">
+        <w:r>
+          <w:rPr>
+            <w:rStyle w:val="Hyperlink"/>
+            <w:sz w:val="19"/>
+            <w:szCs w:val="19"/>
+          </w:rPr>
+          <w:t xml:space="preserve">9.4</w:t>
+        </w:r>
+      </w:hyperlink>
+    </w:p>
+    <w:p>
+      <w:pPr>
+        <w:tabs>
+          <w:tab w:val="right" w:pos="4200" w:leader="dot"/>
+        </w:tabs>
+        <w:spacing w:after="10"/>
+      </w:pPr>
+      <w:r>
+        <w:rPr>
+          <w:sz w:val="19"/>
+          <w:szCs w:val="19"/>
+        </w:rPr>
+        <w:t xml:space="preserve">DWARF</w:t>
+      </w:r>
+      <w:r>
+        <w:rPr>
+          <w:sz w:val="19"/>
+          <w:szCs w:val="19"/>
+        </w:rPr>
+        <w:tab/>
+      </w:r>
+      <w:hyperlink w:history="1" w:anchor="s_10_5">
+        <w:r>
+          <w:rPr>
+            <w:rStyle w:val="Hyperlink"/>
+            <w:sz w:val="19"/>
+            <w:szCs w:val="19"/>
+          </w:rPr>
           <w:t xml:space="preserve">10.5</w:t>
         </w:r>
       </w:hyperlink>
@@ -17040,14 +17330,14 @@
         </w:rPr>
         <w:tab/>
       </w:r>
-      <w:hyperlink w:history="1" w:anchor="s_9_7">
+      <w:hyperlink w:history="1" w:anchor="s_9_8">
         <w:r>
           <w:rPr>
             <w:rStyle w:val="Hyperlink"/>
             <w:sz w:val="19"/>
             <w:szCs w:val="19"/>
           </w:rPr>
-          <w:t xml:space="preserve">9.7</w:t>
+          <w:t xml:space="preserve">9.8</w:t>
         </w:r>
       </w:hyperlink>
     </w:p>
@@ -17229,14 +17519,14 @@
       <w:r>
         <w:t xml:space="preserve">, </w:t>
       </w:r>
-      <w:hyperlink w:history="1" w:anchor="s_9_5">
+      <w:hyperlink w:history="1" w:anchor="s_9_6">
         <w:r>
           <w:rPr>
             <w:rStyle w:val="Hyperlink"/>
             <w:sz w:val="19"/>
             <w:szCs w:val="19"/>
           </w:rPr>
-          <w:t xml:space="preserve">9.5</w:t>
+          <w:t xml:space="preserve">9.6</w:t>
         </w:r>
       </w:hyperlink>
     </w:p>
@@ -17412,7 +17702,7 @@
           <w:sz w:val="19"/>
           <w:szCs w:val="19"/>
         </w:rPr>
-        <w:t xml:space="preserve">Flag</w:t>
+        <w:t xml:space="preserve">Fix Dust Donuts</w:t>
       </w:r>
       <w:r>
         <w:rPr>
@@ -17421,46 +17711,27 @@
         </w:rPr>
         <w:tab/>
       </w:r>
-      <w:hyperlink w:history="1" w:anchor="s_6_3">
+      <w:hyperlink w:history="1" w:anchor="s_9_3">
         <w:r>
           <w:rPr>
             <w:rStyle w:val="Hyperlink"/>
             <w:sz w:val="19"/>
             <w:szCs w:val="19"/>
           </w:rPr>
-          <w:t xml:space="preserve">6.3</w:t>
-        </w:r>
-      </w:hyperlink>
-    </w:p>
-    <w:p>
-      <w:pPr>
-        <w:tabs>
-          <w:tab w:val="right" w:pos="4200" w:leader="dot"/>
-        </w:tabs>
-        <w:spacing w:after="10"/>
-      </w:pPr>
-      <w:r>
-        <w:rPr>
-          <w:sz w:val="19"/>
-          <w:szCs w:val="19"/>
-        </w:rPr>
-        <w:t xml:space="preserve">Flat warnings</w:t>
-      </w:r>
-      <w:r>
-        <w:rPr>
-          <w:sz w:val="19"/>
-          <w:szCs w:val="19"/>
-        </w:rPr>
-        <w:tab/>
-      </w:r>
-      <w:hyperlink w:history="1" w:anchor="s_7_2">
+          <w:t xml:space="preserve">9.3</w:t>
+        </w:r>
+      </w:hyperlink>
+      <w:r>
+        <w:t xml:space="preserve">, </w:t>
+      </w:r>
+      <w:hyperlink w:history="1" w:anchor="s_9_4">
         <w:r>
           <w:rPr>
             <w:rStyle w:val="Hyperlink"/>
             <w:sz w:val="19"/>
             <w:szCs w:val="19"/>
           </w:rPr>
-          <w:t xml:space="preserve">7.2</w:t>
+          <w:t xml:space="preserve">9.4</w:t>
         </w:r>
       </w:hyperlink>
     </w:p>
@@ -17476,7 +17747,7 @@
           <w:sz w:val="19"/>
           <w:szCs w:val="19"/>
         </w:rPr>
-        <w:t xml:space="preserve">Flats</w:t>
+        <w:t xml:space="preserve">Flag</w:t>
       </w:r>
       <w:r>
         <w:rPr>
@@ -17485,14 +17756,14 @@
         </w:rPr>
         <w:tab/>
       </w:r>
-      <w:hyperlink w:history="1" w:anchor="s_4_3">
+      <w:hyperlink w:history="1" w:anchor="s_6_3">
         <w:r>
           <w:rPr>
             <w:rStyle w:val="Hyperlink"/>
             <w:sz w:val="19"/>
             <w:szCs w:val="19"/>
           </w:rPr>
-          <w:t xml:space="preserve">4.3</w:t>
+          <w:t xml:space="preserve">6.3</w:t>
         </w:r>
       </w:hyperlink>
     </w:p>
@@ -17508,7 +17779,7 @@
           <w:sz w:val="19"/>
           <w:szCs w:val="19"/>
         </w:rPr>
-        <w:t xml:space="preserve">Folder organisation</w:t>
+        <w:t xml:space="preserve">Flat warnings</w:t>
       </w:r>
       <w:r>
         <w:rPr>
@@ -17517,14 +17788,14 @@
         </w:rPr>
         <w:tab/>
       </w:r>
-      <w:hyperlink w:history="1" w:anchor="s_2_3">
+      <w:hyperlink w:history="1" w:anchor="s_7_2">
         <w:r>
           <w:rPr>
             <w:rStyle w:val="Hyperlink"/>
             <w:sz w:val="19"/>
             <w:szCs w:val="19"/>
           </w:rPr>
-          <w:t xml:space="preserve">2.3</w:t>
+          <w:t xml:space="preserve">7.2</w:t>
         </w:r>
       </w:hyperlink>
     </w:p>
@@ -17540,7 +17811,7 @@
           <w:sz w:val="19"/>
           <w:szCs w:val="19"/>
         </w:rPr>
-        <w:t xml:space="preserve">Four pages</w:t>
+        <w:t xml:space="preserve">Flats</w:t>
       </w:r>
       <w:r>
         <w:rPr>
@@ -17549,14 +17820,14 @@
         </w:rPr>
         <w:tab/>
       </w:r>
-      <w:hyperlink w:history="1" w:anchor="s_1_1">
+      <w:hyperlink w:history="1" w:anchor="s_4_3">
         <w:r>
           <w:rPr>
             <w:rStyle w:val="Hyperlink"/>
             <w:sz w:val="19"/>
             <w:szCs w:val="19"/>
           </w:rPr>
-          <w:t xml:space="preserve">1.1</w:t>
+          <w:t xml:space="preserve">4.3</w:t>
         </w:r>
       </w:hyperlink>
     </w:p>
@@ -17572,7 +17843,7 @@
           <w:sz w:val="19"/>
           <w:szCs w:val="19"/>
         </w:rPr>
-        <w:t xml:space="preserve">FWHM</w:t>
+        <w:t xml:space="preserve">Folder organisation</w:t>
       </w:r>
       <w:r>
         <w:rPr>
@@ -17581,26 +17852,90 @@
         </w:rPr>
         <w:tab/>
       </w:r>
-      <w:hyperlink w:history="1" w:anchor="s_1_3">
+      <w:hyperlink w:history="1" w:anchor="s_2_3">
         <w:r>
           <w:rPr>
             <w:rStyle w:val="Hyperlink"/>
             <w:sz w:val="19"/>
             <w:szCs w:val="19"/>
           </w:rPr>
-          <w:t xml:space="preserve">1.3</w:t>
-        </w:r>
-      </w:hyperlink>
-      <w:r>
-        <w:t xml:space="preserve">, </w:t>
-      </w:r>
-      <w:hyperlink w:history="1" w:anchor="s_6_2">
+          <w:t xml:space="preserve">2.3</w:t>
+        </w:r>
+      </w:hyperlink>
+    </w:p>
+    <w:p>
+      <w:pPr>
+        <w:tabs>
+          <w:tab w:val="right" w:pos="4200" w:leader="dot"/>
+        </w:tabs>
+        <w:spacing w:after="10"/>
+      </w:pPr>
+      <w:r>
+        <w:rPr>
+          <w:sz w:val="19"/>
+          <w:szCs w:val="19"/>
+        </w:rPr>
+        <w:t xml:space="preserve">Four pages</w:t>
+      </w:r>
+      <w:r>
+        <w:rPr>
+          <w:sz w:val="19"/>
+          <w:szCs w:val="19"/>
+        </w:rPr>
+        <w:tab/>
+      </w:r>
+      <w:hyperlink w:history="1" w:anchor="s_1_1">
         <w:r>
           <w:rPr>
             <w:rStyle w:val="Hyperlink"/>
             <w:sz w:val="19"/>
             <w:szCs w:val="19"/>
           </w:rPr>
+          <w:t xml:space="preserve">1.1</w:t>
+        </w:r>
+      </w:hyperlink>
+    </w:p>
+    <w:p>
+      <w:pPr>
+        <w:tabs>
+          <w:tab w:val="right" w:pos="4200" w:leader="dot"/>
+        </w:tabs>
+        <w:spacing w:after="10"/>
+      </w:pPr>
+      <w:r>
+        <w:rPr>
+          <w:sz w:val="19"/>
+          <w:szCs w:val="19"/>
+        </w:rPr>
+        <w:t xml:space="preserve">FWHM</w:t>
+      </w:r>
+      <w:r>
+        <w:rPr>
+          <w:sz w:val="19"/>
+          <w:szCs w:val="19"/>
+        </w:rPr>
+        <w:tab/>
+      </w:r>
+      <w:hyperlink w:history="1" w:anchor="s_1_3">
+        <w:r>
+          <w:rPr>
+            <w:rStyle w:val="Hyperlink"/>
+            <w:sz w:val="19"/>
+            <w:szCs w:val="19"/>
+          </w:rPr>
+          <w:t xml:space="preserve">1.3</w:t>
+        </w:r>
+      </w:hyperlink>
+      <w:r>
+        <w:t xml:space="preserve">, </w:t>
+      </w:r>
+      <w:hyperlink w:history="1" w:anchor="s_6_2">
+        <w:r>
+          <w:rPr>
+            <w:rStyle w:val="Hyperlink"/>
+            <w:sz w:val="19"/>
+            <w:szCs w:val="19"/>
+          </w:rPr>
           <w:t xml:space="preserve">6.2</w:t>
         </w:r>
       </w:hyperlink>
@@ -17892,14 +18227,14 @@
         </w:rPr>
         <w:tab/>
       </w:r>
-      <w:hyperlink w:history="1" w:anchor="s_9_5">
+      <w:hyperlink w:history="1" w:anchor="s_9_6">
         <w:r>
           <w:rPr>
             <w:rStyle w:val="Hyperlink"/>
             <w:sz w:val="19"/>
             <w:szCs w:val="19"/>
           </w:rPr>
-          <w:t xml:space="preserve">9.5</w:t>
+          <w:t xml:space="preserve">9.6</w:t>
         </w:r>
       </w:hyperlink>
     </w:p>
@@ -19012,14 +19347,14 @@
         </w:rPr>
         <w:tab/>
       </w:r>
-      <w:hyperlink w:history="1" w:anchor="s_9_7">
+      <w:hyperlink w:history="1" w:anchor="s_9_8">
         <w:r>
           <w:rPr>
             <w:rStyle w:val="Hyperlink"/>
             <w:sz w:val="19"/>
             <w:szCs w:val="19"/>
           </w:rPr>
-          <w:t xml:space="preserve">9.7</w:t>
+          <w:t xml:space="preserve">9.8</w:t>
         </w:r>
       </w:hyperlink>
     </w:p>
@@ -19044,14 +19379,14 @@
         </w:rPr>
         <w:tab/>
       </w:r>
-      <w:hyperlink w:history="1" w:anchor="s_9_7">
+      <w:hyperlink w:history="1" w:anchor="s_9_8">
         <w:r>
           <w:rPr>
             <w:rStyle w:val="Hyperlink"/>
             <w:sz w:val="19"/>
             <w:szCs w:val="19"/>
           </w:rPr>
-          <w:t xml:space="preserve">9.7</w:t>
+          <w:t xml:space="preserve">9.8</w:t>
         </w:r>
       </w:hyperlink>
     </w:p>
@@ -19201,14 +19536,14 @@
         </w:rPr>
         <w:tab/>
       </w:r>
-      <w:hyperlink w:history="1" w:anchor="s_9_6">
+      <w:hyperlink w:history="1" w:anchor="s_9_7">
         <w:r>
           <w:rPr>
             <w:rStyle w:val="Hyperlink"/>
             <w:sz w:val="19"/>
             <w:szCs w:val="19"/>
           </w:rPr>
-          <w:t xml:space="preserve">9.6</w:t>
+          <w:t xml:space="preserve">9.7</w:t>
         </w:r>
       </w:hyperlink>
     </w:p>
@@ -20315,14 +20650,14 @@
         </w:rPr>
         <w:tab/>
       </w:r>
-      <w:hyperlink w:history="1" w:anchor="s_9_6">
+      <w:hyperlink w:history="1" w:anchor="s_9_7">
         <w:r>
           <w:rPr>
             <w:rStyle w:val="Hyperlink"/>
             <w:sz w:val="19"/>
             <w:szCs w:val="19"/>
           </w:rPr>
-          <w:t xml:space="preserve">9.6</w:t>
+          <w:t xml:space="preserve">9.7</w:t>
         </w:r>
       </w:hyperlink>
     </w:p>
@@ -20347,14 +20682,14 @@
         </w:rPr>
         <w:tab/>
       </w:r>
-      <w:hyperlink w:history="1" w:anchor="s_9_6">
+      <w:hyperlink w:history="1" w:anchor="s_9_7">
         <w:r>
           <w:rPr>
             <w:rStyle w:val="Hyperlink"/>
             <w:sz w:val="19"/>
             <w:szCs w:val="19"/>
           </w:rPr>
-          <w:t xml:space="preserve">9.6</w:t>
+          <w:t xml:space="preserve">9.7</w:t>
         </w:r>
       </w:hyperlink>
     </w:p>
@@ -20763,14 +21098,14 @@
         </w:rPr>
         <w:tab/>
       </w:r>
-      <w:hyperlink w:history="1" w:anchor="s_9_6">
+      <w:hyperlink w:history="1" w:anchor="s_9_7">
         <w:r>
           <w:rPr>
             <w:rStyle w:val="Hyperlink"/>
             <w:sz w:val="19"/>
             <w:szCs w:val="19"/>
           </w:rPr>
-          <w:t xml:space="preserve">9.6</w:t>
+          <w:t xml:space="preserve">9.7</w:t>
         </w:r>
       </w:hyperlink>
     </w:p>
@@ -20904,14 +21239,14 @@
       <w:r>
         <w:t xml:space="preserve">, </w:t>
       </w:r>
-      <w:hyperlink w:history="1" w:anchor="s_9_5">
+      <w:hyperlink w:history="1" w:anchor="s_9_6">
         <w:r>
           <w:rPr>
             <w:rStyle w:val="Hyperlink"/>
             <w:sz w:val="19"/>
             <w:szCs w:val="19"/>
           </w:rPr>
-          <w:t xml:space="preserve">9.5</w:t>
+          <w:t xml:space="preserve">9.6</w:t>
         </w:r>
       </w:hyperlink>
     </w:p>
@@ -20936,14 +21271,14 @@
         </w:rPr>
         <w:tab/>
       </w:r>
-      <w:hyperlink w:history="1" w:anchor="s_9_5">
+      <w:hyperlink w:history="1" w:anchor="s_9_6">
         <w:r>
           <w:rPr>
             <w:rStyle w:val="Hyperlink"/>
             <w:sz w:val="19"/>
             <w:szCs w:val="19"/>
           </w:rPr>
-          <w:t xml:space="preserve">9.5</w:t>
+          <w:t xml:space="preserve">9.6</w:t>
         </w:r>
       </w:hyperlink>
     </w:p>
@@ -21122,14 +21457,14 @@
       <w:r>
         <w:t xml:space="preserve">, </w:t>
       </w:r>
-      <w:hyperlink w:history="1" w:anchor="s_9_5">
+      <w:hyperlink w:history="1" w:anchor="s_9_6">
         <w:r>
           <w:rPr>
             <w:rStyle w:val="Hyperlink"/>
             <w:sz w:val="19"/>
             <w:szCs w:val="19"/>
           </w:rPr>
-          <w:t xml:space="preserve">9.5</w:t>
+          <w:t xml:space="preserve">9.6</w:t>
         </w:r>
       </w:hyperlink>
     </w:p>
@@ -21282,14 +21617,14 @@
         </w:rPr>
         <w:tab/>
       </w:r>
-      <w:hyperlink w:history="1" w:anchor="s_9_4">
+      <w:hyperlink w:history="1" w:anchor="s_9_5">
         <w:r>
           <w:rPr>
             <w:rStyle w:val="Hyperlink"/>
             <w:sz w:val="19"/>
             <w:szCs w:val="19"/>
           </w:rPr>
-          <w:t xml:space="preserve">9.4</w:t>
+          <w:t xml:space="preserve">9.5</w:t>
         </w:r>
       </w:hyperlink>
     </w:p>
@@ -21314,14 +21649,14 @@
         </w:rPr>
         <w:tab/>
       </w:r>
-      <w:hyperlink w:history="1" w:anchor="s_9_4">
+      <w:hyperlink w:history="1" w:anchor="s_9_5">
         <w:r>
           <w:rPr>
             <w:rStyle w:val="Hyperlink"/>
             <w:sz w:val="19"/>
             <w:szCs w:val="19"/>
           </w:rPr>
-          <w:t xml:space="preserve">9.4</w:t>
+          <w:t xml:space="preserve">9.5</w:t>
         </w:r>
       </w:hyperlink>
     </w:p>
@@ -21591,6 +21926,38 @@
             <w:szCs w:val="19"/>
           </w:rPr>
           <w:t xml:space="preserve">11.2</w:t>
+        </w:r>
+      </w:hyperlink>
+    </w:p>
+    <w:p>
+      <w:pPr>
+        <w:tabs>
+          <w:tab w:val="right" w:pos="4200" w:leader="dot"/>
+        </w:tabs>
+        <w:spacing w:after="10"/>
+      </w:pPr>
+      <w:r>
+        <w:rPr>
+          <w:sz w:val="19"/>
+          <w:szCs w:val="19"/>
+        </w:rPr>
+        <w:t xml:space="preserve">Synthetic flat</w:t>
+      </w:r>
+      <w:r>
+        <w:rPr>
+          <w:sz w:val="19"/>
+          <w:szCs w:val="19"/>
+        </w:rPr>
+        <w:tab/>
+      </w:r>
+      <w:hyperlink w:history="1" w:anchor="s_9_4">
+        <w:r>
+          <w:rPr>
+            <w:rStyle w:val="Hyperlink"/>
+            <w:sz w:val="19"/>
+            <w:szCs w:val="19"/>
+          </w:rPr>
+          <w:t xml:space="preserve">9.4</w:t>
         </w:r>
       </w:hyperlink>
     </w:p>

</xml_diff>

<commit_message>
User manual 0.9.15 (sky flats)
Co-Authored-By: Claude Opus 5.5 <noreply@anthropic.com>
Claude-Session: https://claude.ai/code/session_01FKvd69QsnCvM2zbzYnPwmF
</commit_message>
<xml_diff>
--- a/docs/SubZeroAstro_User_Manual.docx
+++ b/docs/SubZeroAstro_User_Manual.docx
@@ -121,7 +121,7 @@
           <w:sz w:val="22"/>
           <w:szCs w:val="22"/>
         </w:rPr>
-        <w:t xml:space="preserve">Version 0.9.14 beta  ·  Windows and Mac (Apple silicon)</w:t>
+        <w:t xml:space="preserve">Version 0.9.15 beta  ·  Windows and Mac (Apple silicon)</w:t>
       </w:r>
     </w:p>
     <w:p>
@@ -7886,6 +7886,72 @@
     </w:p>
     <w:p>
       <w:pPr>
+        <w:spacing w:after="120"/>
+      </w:pPr>
+      <w:r>
+        <w:rPr>
+          <w:b/>
+          <w:bCs/>
+        </w:rPr>
+        <w:t xml:space="preserve">No flats at all? A sky flat.</w:t>
+      </w:r>
+      <w:r>
+        <w:t xml:space="preserve"> When a filter has no flats, SubZeroAstro can make one from your </w:t>
+      </w:r>
+      <w:r>
+        <w:rPr>
+          <w:b/>
+          <w:bCs/>
+        </w:rPr>
+        <w:t xml:space="preserve">light frames</w:t>
+      </w:r>
+      <w:r>
+        <w:t xml:space="preserve"> (option </w:t>
+      </w:r>
+      <w:r>
+        <w:rPr>
+          <w:i/>
+          <w:iCs/>
+        </w:rPr>
+        <w:t xml:space="preserve">Sky flats when flats are missing</w:t>
+      </w:r>
+      <w:r>
+        <w:t xml:space="preserve">, on by default; at least 12 frames). It uses every light with that filter, camera and rig - from all your targets and nights, because the stars land somewhere different in each. Each frame is scaled to the same brightness, its stars are hidden, and its own light-pollution tilt is taken out (that tilt changes from frame to frame, while the vignetting stays put). Of every pixel's values only the lower half is used - a nebula can only add light - and what remains is what your optics and dust do to an even sky: a flat. The Flats cell then shows ⚠ </w:t>
+      </w:r>
+      <w:r>
+        <w:rPr>
+          <w:i/>
+          <w:iCs/>
+        </w:rPr>
+        <w:t xml:space="preserve">Sky flat (made from N light frames)</w:t>
+      </w:r>
+      <w:r>
+        <w:t xml:space="preserve">. Sky flats are never saved to your library.</w:t>
+      </w:r>
+    </w:p>
+    <w:p>
+      <w:pPr>
+        <w:pBdr>
+          <w:left w:val="single" w:color="2F6FD6" w:sz="18" w:space="8"/>
+        </w:pBdr>
+        <w:shd w:fill="EAF1FB" w:color="auto" w:val="clear"/>
+        <w:spacing w:after="160" w:before="120"/>
+        <w:ind w:left="200" w:right="200"/>
+      </w:pPr>
+      <w:r>
+        <w:rPr>
+          <w:b/>
+          <w:bCs/>
+          <w:color w:val="2F6FD6"/>
+        </w:rPr>
+        <w:t xml:space="preserve">Sky flats:  </w:t>
+      </w:r>
+      <w:r>
+        <w:t xml:space="preserve">A sky flat is best from several targets. From a single target whose nebula fills most of the picture, part of the nebula could be mistaken for vignetting - the Flats note warns you. Real flats are still the best: take some when you can.</w:t>
+      </w:r>
+    </w:p>
+    <w:p>
+      <w:pPr>
         <w:pBdr>
           <w:left w:val="single" w:color="D98B00" w:sz="18" w:space="8"/>
         </w:pBdr>
@@ -19402,7 +19468,7 @@
           <w:sz w:val="19"/>
           <w:szCs w:val="19"/>
         </w:rPr>
-        <w:t xml:space="preserve">NoiseXTerminator</w:t>
+        <w:t xml:space="preserve">No flats</w:t>
       </w:r>
       <w:r>
         <w:rPr>
@@ -19411,26 +19477,58 @@
         </w:rPr>
         <w:tab/>
       </w:r>
-      <w:hyperlink w:history="1" w:anchor="s_2_2">
+      <w:hyperlink w:history="1" w:anchor="s_7_2">
         <w:r>
           <w:rPr>
             <w:rStyle w:val="Hyperlink"/>
             <w:sz w:val="19"/>
             <w:szCs w:val="19"/>
           </w:rPr>
-          <w:t xml:space="preserve">2.2</w:t>
-        </w:r>
-      </w:hyperlink>
-      <w:r>
-        <w:t xml:space="preserve">, </w:t>
-      </w:r>
-      <w:hyperlink w:history="1" w:anchor="s_8_5">
+          <w:t xml:space="preserve">7.2</w:t>
+        </w:r>
+      </w:hyperlink>
+    </w:p>
+    <w:p>
+      <w:pPr>
+        <w:tabs>
+          <w:tab w:val="right" w:pos="4200" w:leader="dot"/>
+        </w:tabs>
+        <w:spacing w:after="10"/>
+      </w:pPr>
+      <w:r>
+        <w:rPr>
+          <w:sz w:val="19"/>
+          <w:szCs w:val="19"/>
+        </w:rPr>
+        <w:t xml:space="preserve">NoiseXTerminator</w:t>
+      </w:r>
+      <w:r>
+        <w:rPr>
+          <w:sz w:val="19"/>
+          <w:szCs w:val="19"/>
+        </w:rPr>
+        <w:tab/>
+      </w:r>
+      <w:hyperlink w:history="1" w:anchor="s_2_2">
         <w:r>
           <w:rPr>
             <w:rStyle w:val="Hyperlink"/>
             <w:sz w:val="19"/>
             <w:szCs w:val="19"/>
           </w:rPr>
+          <w:t xml:space="preserve">2.2</w:t>
+        </w:r>
+      </w:hyperlink>
+      <w:r>
+        <w:t xml:space="preserve">, </w:t>
+      </w:r>
+      <w:hyperlink w:history="1" w:anchor="s_8_5">
+        <w:r>
+          <w:rPr>
+            <w:rStyle w:val="Hyperlink"/>
+            <w:sz w:val="19"/>
+            <w:szCs w:val="19"/>
+          </w:rPr>
           <w:t xml:space="preserve">8.5</w:t>
         </w:r>
       </w:hyperlink>
@@ -21311,6 +21409,38 @@
             <w:szCs w:val="19"/>
           </w:rPr>
           <w:t xml:space="preserve">9.1</w:t>
+        </w:r>
+      </w:hyperlink>
+    </w:p>
+    <w:p>
+      <w:pPr>
+        <w:tabs>
+          <w:tab w:val="right" w:pos="4200" w:leader="dot"/>
+        </w:tabs>
+        <w:spacing w:after="10"/>
+      </w:pPr>
+      <w:r>
+        <w:rPr>
+          <w:sz w:val="19"/>
+          <w:szCs w:val="19"/>
+        </w:rPr>
+        <w:t xml:space="preserve">Sky flat</w:t>
+      </w:r>
+      <w:r>
+        <w:rPr>
+          <w:sz w:val="19"/>
+          <w:szCs w:val="19"/>
+        </w:rPr>
+        <w:tab/>
+      </w:r>
+      <w:hyperlink w:history="1" w:anchor="s_7_2">
+        <w:r>
+          <w:rPr>
+            <w:rStyle w:val="Hyperlink"/>
+            <w:sz w:val="19"/>
+            <w:szCs w:val="19"/>
+          </w:rPr>
+          <w:t xml:space="preserve">7.2</w:t>
         </w:r>
       </w:hyperlink>
     </w:p>

</xml_diff>

<commit_message>
User manual 0.9.16 (Mote Buster)
Co-Authored-By: Claude Opus 5.5 <noreply@anthropic.com>
Claude-Session: https://claude.ai/code/session_01FKvd69QsnCvM2zbzYnPwmF
</commit_message>
<xml_diff>
--- a/docs/SubZeroAstro_User_Manual.docx
+++ b/docs/SubZeroAstro_User_Manual.docx
@@ -121,7 +121,7 @@
           <w:sz w:val="22"/>
           <w:szCs w:val="22"/>
         </w:rPr>
-        <w:t xml:space="preserve">Version 0.9.15 beta  ·  Windows and Mac (Apple silicon)</w:t>
+        <w:t xml:space="preserve">Version 0.9.16 beta  ·  Windows and Mac (Apple silicon)</w:t>
       </w:r>
     </w:p>
     <w:p>
@@ -1105,7 +1105,7 @@
             <w:b w:val="false"/>
             <w:bCs w:val="false"/>
           </w:rPr>
-          <w:t xml:space="preserve">9.4   Dust donuts</w:t>
+          <w:t xml:space="preserve">9.4   Mote Buster: dust donuts</w:t>
         </w:r>
       </w:hyperlink>
     </w:p>
@@ -10240,7 +10240,7 @@
           </w:tcPr>
           <w:p>
             <w:r>
-              <w:t xml:space="preserve">Fix Dust Donuts ◇</w:t>
+              <w:t xml:space="preserve">Mote Buster ◇</w:t>
             </w:r>
           </w:p>
         </w:tc>
@@ -10262,7 +10262,7 @@
           </w:tcPr>
           <w:p>
             <w:r>
-              <w:t xml:space="preserve">Finds the round shadows of dust and divides them out with a synthetic flat - the detail underneath comes back</w:t>
+              <w:t xml:space="preserve">Fix Dust Donuts: finds the round shadows of dust and divides them out with a synthetic flat - the detail underneath comes back</w:t>
             </w:r>
           </w:p>
         </w:tc>
@@ -11384,7 +11384,7 @@
       </w:pPr>
       <w:bookmarkStart w:name="s_9_4" w:id="1"/>
       <w:r>
-        <w:t xml:space="preserve">9.4   Dust donuts</w:t>
+        <w:t xml:space="preserve">9.4   Mote Buster: dust donuts</w:t>
       </w:r>
       <w:bookmarkEnd w:id="1"/>
     </w:p>
@@ -11410,7 +11410,7 @@
           <w:b/>
           <w:bCs/>
         </w:rPr>
-        <w:t xml:space="preserve">Fix Dust Donuts</w:t>
+        <w:t xml:space="preserve">Mote Buster – Fix Dust Donuts</w:t>
       </w:r>
       <w:r>
         <w:t xml:space="preserve"> helps. A dust shadow does not wipe anything out: it lets through the same fraction of light everywhere inside it, nebula included. So SubZeroAstro measures each donut's shadow ring by ring - in 16 directions against the sky just outside it, levelled for any gradient - builds a </w:t>
@@ -11443,7 +11443,7 @@
           <w:b/>
           <w:bCs/>
         </w:rPr>
-        <w:t xml:space="preserve">Fix Dust Donuts</w:t>
+        <w:t xml:space="preserve">Mote Buster</w:t>
       </w:r>
       <w:r>
         <w:t xml:space="preserve"> while the picture is still unstretched (it comes before </w:t>
@@ -19277,6 +19277,51 @@
             <w:szCs w:val="19"/>
           </w:rPr>
           <w:t xml:space="preserve">1.3</w:t>
+        </w:r>
+      </w:hyperlink>
+    </w:p>
+    <w:p>
+      <w:pPr>
+        <w:tabs>
+          <w:tab w:val="right" w:pos="4200" w:leader="dot"/>
+        </w:tabs>
+        <w:spacing w:after="10"/>
+      </w:pPr>
+      <w:r>
+        <w:rPr>
+          <w:sz w:val="19"/>
+          <w:szCs w:val="19"/>
+        </w:rPr>
+        <w:t xml:space="preserve">Mote Buster</w:t>
+      </w:r>
+      <w:r>
+        <w:rPr>
+          <w:sz w:val="19"/>
+          <w:szCs w:val="19"/>
+        </w:rPr>
+        <w:tab/>
+      </w:r>
+      <w:hyperlink w:history="1" w:anchor="s_9_3">
+        <w:r>
+          <w:rPr>
+            <w:rStyle w:val="Hyperlink"/>
+            <w:sz w:val="19"/>
+            <w:szCs w:val="19"/>
+          </w:rPr>
+          <w:t xml:space="preserve">9.3</w:t>
+        </w:r>
+      </w:hyperlink>
+      <w:r>
+        <w:t xml:space="preserve">, </w:t>
+      </w:r>
+      <w:hyperlink w:history="1" w:anchor="s_9_4">
+        <w:r>
+          <w:rPr>
+            <w:rStyle w:val="Hyperlink"/>
+            <w:sz w:val="19"/>
+            <w:szCs w:val="19"/>
+          </w:rPr>
+          <w:t xml:space="preserve">9.4</w:t>
         </w:r>
       </w:hyperlink>
     </w:p>

</xml_diff>

<commit_message>
User manual 0.9.17 (SkyFlats (Mote Buster))
Co-Authored-By: Claude Opus 5.5 <noreply@anthropic.com>
Claude-Session: https://claude.ai/code/session_01FKvd69QsnCvM2zbzYnPwmF
</commit_message>
<xml_diff>
--- a/docs/SubZeroAstro_User_Manual.docx
+++ b/docs/SubZeroAstro_User_Manual.docx
@@ -121,7 +121,7 @@
           <w:sz w:val="22"/>
           <w:szCs w:val="22"/>
         </w:rPr>
-        <w:t xml:space="preserve">Version 0.9.16 beta  ·  Windows and Mac (Apple silicon)</w:t>
+        <w:t xml:space="preserve">Version 0.9.17 beta  ·  Windows and Mac (Apple silicon)</w:t>
       </w:r>
     </w:p>
     <w:p>
@@ -7893,10 +7893,10 @@
           <w:b/>
           <w:bCs/>
         </w:rPr>
-        <w:t xml:space="preserve">No flats at all? A sky flat.</w:t>
-      </w:r>
-      <w:r>
-        <w:t xml:space="preserve"> When a filter has no flats, SubZeroAstro can make one from your </w:t>
+        <w:t xml:space="preserve">No flats at all? SkyFlats (Mote Buster).</w:t>
+      </w:r>
+      <w:r>
+        <w:t xml:space="preserve"> When a filter has no flats, SubZeroAstro can make a flat from your </w:t>
       </w:r>
       <w:r>
         <w:rPr>
@@ -7913,7 +7913,7 @@
           <w:i/>
           <w:iCs/>
         </w:rPr>
-        <w:t xml:space="preserve">Sky flats when flats are missing</w:t>
+        <w:t xml:space="preserve">SkyFlats (Mote Buster) when flats are missing</w:t>
       </w:r>
       <w:r>
         <w:t xml:space="preserve">, on by default; at least 12 frames). It uses every light with that filter, camera and rig - from all your targets and nights, because the stars land somewhere different in each. Each frame is scaled to the same brightness, its stars are hidden, and its own light-pollution tilt is taken out (that tilt changes from frame to frame, while the vignetting stays put). Of every pixel's values only the lower half is used - a nebula can only add light - and what remains is what your optics and dust do to an even sky: a flat. The Flats cell then shows ⚠ </w:t>
@@ -7923,10 +7923,20 @@
           <w:i/>
           <w:iCs/>
         </w:rPr>
-        <w:t xml:space="preserve">Sky flat (made from N light frames)</w:t>
-      </w:r>
-      <w:r>
-        <w:t xml:space="preserve">. Sky flats are never saved to your library.</w:t>
+        <w:t xml:space="preserve">SkyFlat (Mote Buster) (made from N light frames)</w:t>
+      </w:r>
+      <w:r>
+        <w:t xml:space="preserve">. SkyFlats are never saved to your library. (For donuts that remain, </w:t>
+      </w:r>
+      <w:r>
+        <w:rPr>
+          <w:i/>
+          <w:iCs/>
+        </w:rPr>
+        <w:t xml:space="preserve">Mote Buster – Fix Dust Donuts</w:t>
+      </w:r>
+      <w:r>
+        <w:t xml:space="preserve"> on Finishing Touches works on one picture.)</w:t>
       </w:r>
     </w:p>
     <w:p>
@@ -7944,10 +7954,10 @@
           <w:bCs/>
           <w:color w:val="2F6FD6"/>
         </w:rPr>
-        <w:t xml:space="preserve">Sky flats:  </w:t>
-      </w:r>
-      <w:r>
-        <w:t xml:space="preserve">A sky flat is best from several targets. From a single target whose nebula fills most of the picture, part of the nebula could be mistaken for vignetting - the Flats note warns you. Real flats are still the best: take some when you can.</w:t>
+        <w:t xml:space="preserve">SkyFlats:  </w:t>
+      </w:r>
+      <w:r>
+        <w:t xml:space="preserve">A SkyFlat is best from several targets. From a single target whose nebula fills most of the picture, part of the nebula could be mistaken for vignetting - the Flats note warns you. Real flats are still the best: take some when you can.</w:t>
       </w:r>
     </w:p>
     <w:p>
@@ -21470,6 +21480,38 @@
           <w:szCs w:val="19"/>
         </w:rPr>
         <w:t xml:space="preserve">Sky flat</w:t>
+      </w:r>
+      <w:r>
+        <w:rPr>
+          <w:sz w:val="19"/>
+          <w:szCs w:val="19"/>
+        </w:rPr>
+        <w:tab/>
+      </w:r>
+      <w:hyperlink w:history="1" w:anchor="s_7_2">
+        <w:r>
+          <w:rPr>
+            <w:rStyle w:val="Hyperlink"/>
+            <w:sz w:val="19"/>
+            <w:szCs w:val="19"/>
+          </w:rPr>
+          <w:t xml:space="preserve">7.2</w:t>
+        </w:r>
+      </w:hyperlink>
+    </w:p>
+    <w:p>
+      <w:pPr>
+        <w:tabs>
+          <w:tab w:val="right" w:pos="4200" w:leader="dot"/>
+        </w:tabs>
+        <w:spacing w:after="10"/>
+      </w:pPr>
+      <w:r>
+        <w:rPr>
+          <w:sz w:val="19"/>
+          <w:szCs w:val="19"/>
+        </w:rPr>
+        <w:t xml:space="preserve">SkyFlats (Mote Buster)</w:t>
       </w:r>
       <w:r>
         <w:rPr>

</xml_diff>

<commit_message>
User manual 0.9.18 (pick up where you left off)
Co-Authored-By: Claude Opus 5.5 <noreply@anthropic.com>
Claude-Session: https://claude.ai/code/session_01FKvd69QsnCvM2zbzYnPwmF
</commit_message>
<xml_diff>
--- a/docs/SubZeroAstro_User_Manual.docx
+++ b/docs/SubZeroAstro_User_Manual.docx
@@ -121,7 +121,7 @@
           <w:sz w:val="22"/>
           <w:szCs w:val="22"/>
         </w:rPr>
-        <w:t xml:space="preserve">Version 0.9.17 beta  ·  Windows and Mac (Apple silicon)</w:t>
+        <w:t xml:space="preserve">Version 0.9.18 beta  ·  Windows and Mac (Apple silicon)</w:t>
       </w:r>
     </w:p>
     <w:p>
@@ -6041,7 +6041,7 @@
         <w:t xml:space="preserve">Page 1</w:t>
       </w:r>
       <w:r>
-        <w:t xml:space="preserve">: your folders and flags are saved as you go. After a crash SubZeroAstro offers to reopen the session. </w:t>
+        <w:t xml:space="preserve">: your folders and flags are saved as you go. </w:t>
       </w:r>
       <w:r>
         <w:rPr>
@@ -6052,6 +6052,56 @@
       </w:r>
       <w:r>
         <w:t xml:space="preserve"> undoes rejects, flags and auto-cull.</w:t>
+      </w:r>
+    </w:p>
+    <w:p>
+      <w:pPr>
+        <w:pStyle w:val="ListParagraph"/>
+        <w:numPr>
+          <w:ilvl w:val="0"/>
+          <w:numId w:val="2"/>
+        </w:numPr>
+        <w:spacing w:after="60"/>
+      </w:pPr>
+      <w:r>
+        <w:rPr>
+          <w:b/>
+          <w:bCs/>
+        </w:rPr>
+        <w:t xml:space="preserve">Pick up where you left off</w:t>
+      </w:r>
+      <w:r>
+        <w:t xml:space="preserve">: when you start SubZeroAstro again - after quitting normally or after a crash - it offers </w:t>
+      </w:r>
+      <w:r>
+        <w:rPr>
+          <w:b/>
+          <w:bCs/>
+        </w:rPr>
+        <w:t xml:space="preserve">Pick Up Where I Left Off</w:t>
+      </w:r>
+      <w:r>
+        <w:t xml:space="preserve">: your frames and flags come back and it goes straight to the page you were on (Calibrate and Stack, Image Processing with the same masters, or Finishing Touches, where your steps resume). </w:t>
+      </w:r>
+      <w:r>
+        <w:rPr>
+          <w:b/>
+          <w:bCs/>
+        </w:rPr>
+        <w:t xml:space="preserve">Start Fresh</w:t>
+      </w:r>
+      <w:r>
+        <w:t xml:space="preserve"> begins a new project; after </w:t>
+      </w:r>
+      <w:r>
+        <w:rPr>
+          <w:i/>
+          <w:iCs/>
+        </w:rPr>
+        <w:t xml:space="preserve">End this Project and Start New Project</w:t>
+      </w:r>
+      <w:r>
+        <w:t xml:space="preserve"> nothing is offered.</w:t>
       </w:r>
     </w:p>
     <w:p>

</xml_diff>

<commit_message>
User manual 0.9.19 (Zip My Logs)
Co-Authored-By: Claude Opus 5.5 <noreply@anthropic.com>
Claude-Session: https://claude.ai/code/session_01FKvd69QsnCvM2zbzYnPwmF
</commit_message>
<xml_diff>
--- a/docs/SubZeroAstro_User_Manual.docx
+++ b/docs/SubZeroAstro_User_Manual.docx
@@ -121,7 +121,7 @@
           <w:sz w:val="22"/>
           <w:szCs w:val="22"/>
         </w:rPr>
-        <w:t xml:space="preserve">Version 0.9.18 beta  ·  Windows and Mac (Apple silicon)</w:t>
+        <w:t xml:space="preserve">Version 0.9.19 beta  ·  Windows and Mac (Apple silicon)</w:t>
       </w:r>
     </w:p>
     <w:p>
@@ -1391,7 +1391,7 @@
           <w:b/>
           <w:bCs/>
         </w:rPr>
-        <w:t xml:space="preserve">31</w:t>
+        <w:t xml:space="preserve">32</w:t>
       </w:r>
     </w:p>
     <w:p>
@@ -1456,7 +1456,7 @@
           <w:b/>
           <w:bCs/>
         </w:rPr>
-        <w:t xml:space="preserve">32</w:t>
+        <w:t xml:space="preserve">33</w:t>
       </w:r>
     </w:p>
     <w:p>
@@ -1521,7 +1521,7 @@
           <w:b/>
           <w:bCs/>
         </w:rPr>
-        <w:t xml:space="preserve">33</w:t>
+        <w:t xml:space="preserve">34</w:t>
       </w:r>
     </w:p>
     <w:p>
@@ -1586,7 +1586,7 @@
           <w:b/>
           <w:bCs/>
         </w:rPr>
-        <w:t xml:space="preserve">34</w:t>
+        <w:t xml:space="preserve">35</w:t>
       </w:r>
     </w:p>
     <w:p>
@@ -13486,6 +13486,31 @@
         <w:spacing w:after="120"/>
       </w:pPr>
       <w:r>
+        <w:rPr>
+          <w:b/>
+          <w:bCs/>
+        </w:rPr>
+        <w:t xml:space="preserve">Zip My Logs</w:t>
+      </w:r>
+      <w:r>
+        <w:t xml:space="preserve">: the button at the top left of every page (also </w:t>
+      </w:r>
+      <w:r>
+        <w:rPr>
+          <w:b/>
+          <w:bCs/>
+        </w:rPr>
+        <w:t xml:space="preserve">Help › Zip My Logs</w:t>
+      </w:r>
+      <w:r>
+        <w:t xml:space="preserve">) puts the log of every open page, the stack logs of your masters, page 3's processing report and a short note about your computer (SubZeroAstro version, system, screen, which helper programs were found) into one zip on your Desktop and shows it - text only, no pictures. Attach that zip to your message: it is the quickest way to get help.</w:t>
+      </w:r>
+    </w:p>
+    <w:p>
+      <w:pPr>
+        <w:spacing w:after="120"/>
+      </w:pPr>
+      <w:r>
         <w:t xml:space="preserve">Note the version (in small print under the name at the top of every page, or </w:t>
       </w:r>
       <w:r>
@@ -19112,7 +19137,7 @@
           <w:sz w:val="19"/>
           <w:szCs w:val="19"/>
         </w:rPr>
-        <w:t xml:space="preserve">LRGB recipe</w:t>
+        <w:t xml:space="preserve">Logs</w:t>
       </w:r>
       <w:r>
         <w:rPr>
@@ -19121,13 +19146,45 @@
         </w:rPr>
         <w:tab/>
       </w:r>
-      <w:hyperlink w:history="1" w:anchor="s_10_3">
+      <w:hyperlink w:history="1" w:anchor="s_11_2">
         <w:r>
           <w:rPr>
             <w:rStyle w:val="Hyperlink"/>
             <w:sz w:val="19"/>
             <w:szCs w:val="19"/>
           </w:rPr>
+          <w:t xml:space="preserve">11.2</w:t>
+        </w:r>
+      </w:hyperlink>
+    </w:p>
+    <w:p>
+      <w:pPr>
+        <w:tabs>
+          <w:tab w:val="right" w:pos="4200" w:leader="dot"/>
+        </w:tabs>
+        <w:spacing w:after="10"/>
+      </w:pPr>
+      <w:r>
+        <w:rPr>
+          <w:sz w:val="19"/>
+          <w:szCs w:val="19"/>
+        </w:rPr>
+        <w:t xml:space="preserve">LRGB recipe</w:t>
+      </w:r>
+      <w:r>
+        <w:rPr>
+          <w:sz w:val="19"/>
+          <w:szCs w:val="19"/>
+        </w:rPr>
+        <w:tab/>
+      </w:r>
+      <w:hyperlink w:history="1" w:anchor="s_10_3">
+        <w:r>
+          <w:rPr>
+            <w:rStyle w:val="Hyperlink"/>
+            <w:sz w:val="19"/>
+            <w:szCs w:val="19"/>
+          </w:rPr>
           <w:t xml:space="preserve">10.3</w:t>
         </w:r>
       </w:hyperlink>
@@ -22862,6 +22919,54 @@
             <w:szCs w:val="19"/>
           </w:rPr>
           <w:t xml:space="preserve">2.3</w:t>
+        </w:r>
+      </w:hyperlink>
+    </w:p>
+    <w:p>
+      <w:pPr>
+        <w:keepNext/>
+        <w:spacing w:after="40" w:before="160"/>
+      </w:pPr>
+      <w:r>
+        <w:rPr>
+          <w:b/>
+          <w:bCs/>
+          <w:color w:val="2F6FD6"/>
+          <w:sz w:val="24"/>
+          <w:szCs w:val="24"/>
+        </w:rPr>
+        <w:t xml:space="preserve">Z</w:t>
+      </w:r>
+    </w:p>
+    <w:p>
+      <w:pPr>
+        <w:tabs>
+          <w:tab w:val="right" w:pos="4200" w:leader="dot"/>
+        </w:tabs>
+        <w:spacing w:after="10"/>
+      </w:pPr>
+      <w:r>
+        <w:rPr>
+          <w:sz w:val="19"/>
+          <w:szCs w:val="19"/>
+        </w:rPr>
+        <w:t xml:space="preserve">Zip My Logs</w:t>
+      </w:r>
+      <w:r>
+        <w:rPr>
+          <w:sz w:val="19"/>
+          <w:szCs w:val="19"/>
+        </w:rPr>
+        <w:tab/>
+      </w:r>
+      <w:hyperlink w:history="1" w:anchor="s_11_2">
+        <w:r>
+          <w:rPr>
+            <w:rStyle w:val="Hyperlink"/>
+            <w:sz w:val="19"/>
+            <w:szCs w:val="19"/>
+          </w:rPr>
+          <w:t xml:space="preserve">11.2</w:t>
         </w:r>
       </w:hyperlink>
     </w:p>

</xml_diff>

<commit_message>
User manual 0.9.20 (calibration check)
Co-Authored-By: Claude Opus 5.5 <noreply@anthropic.com>
Claude-Session: https://claude.ai/code/session_01FKvd69QsnCvM2zbzYnPwmF
</commit_message>
<xml_diff>
--- a/docs/SubZeroAstro_User_Manual.docx
+++ b/docs/SubZeroAstro_User_Manual.docx
@@ -121,7 +121,7 @@
           <w:sz w:val="22"/>
           <w:szCs w:val="22"/>
         </w:rPr>
-        <w:t xml:space="preserve">Version 0.9.19 beta  ·  Windows and Mac (Apple silicon)</w:t>
+        <w:t xml:space="preserve">Version 0.9.20 beta  ·  Windows and Mac (Apple silicon)</w:t>
       </w:r>
     </w:p>
     <w:p>
@@ -8012,6 +8012,71 @@
     </w:p>
     <w:p>
       <w:pPr>
+        <w:spacing w:after="120"/>
+      </w:pPr>
+      <w:r>
+        <w:rPr>
+          <w:b/>
+          <w:bCs/>
+        </w:rPr>
+        <w:t xml:space="preserve">Calibration check.</w:t>
+      </w:r>
+      <w:r>
+        <w:t xml:space="preserve"> Every stack checks its dark (or bias) against the lights and writes a </w:t>
+      </w:r>
+      <w:r>
+        <w:rPr>
+          <w:i/>
+          <w:iCs/>
+        </w:rPr>
+        <w:t xml:space="preserve">Calibration check</w:t>
+      </w:r>
+      <w:r>
+        <w:t xml:space="preserve"> line in the log: light background - dark = sky left. If a master does not fit - </w:t>
+      </w:r>
+      <w:r>
+        <w:rPr>
+          <w:b/>
+          <w:bCs/>
+        </w:rPr>
+        <w:t xml:space="preserve">brighter than the lights</w:t>
+      </w:r>
+      <w:r>
+        <w:t xml:space="preserve">, </w:t>
+      </w:r>
+      <w:r>
+        <w:rPr>
+          <w:b/>
+          <w:bCs/>
+        </w:rPr>
+        <w:t xml:space="preserve">uneven like a picture</w:t>
+      </w:r>
+      <w:r>
+        <w:t xml:space="preserve"> (light leaked in while the darks were taken: lens cap, filter wheel, focuser or room light) or </w:t>
+      </w:r>
+      <w:r>
+        <w:rPr>
+          <w:b/>
+          <w:bCs/>
+        </w:rPr>
+        <w:t xml:space="preserve">practically zero</w:t>
+      </w:r>
+      <w:r>
+        <w:t xml:space="preserve"> (saved on another scale) - a window says so when stacking finishes. Such a frame makes bright bands, borders or blotches that no later step can fix: remove it from the </w:t>
+      </w:r>
+      <w:r>
+        <w:rPr>
+          <w:i/>
+          <w:iCs/>
+        </w:rPr>
+        <w:t xml:space="preserve">Calibration frames</w:t>
+      </w:r>
+      <w:r>
+        <w:t xml:space="preserve"> list, or take new ones (scope fully covered, same gain, offset, temperature and exposure as the lights).</w:t>
+      </w:r>
+    </w:p>
+    <w:p>
+      <w:pPr>
         <w:pBdr>
           <w:left w:val="single" w:color="D98B00" w:sz="18" w:space="8"/>
         </w:pBdr>
@@ -16582,7 +16647,7 @@
           <w:sz w:val="19"/>
           <w:szCs w:val="19"/>
         </w:rPr>
-        <w:t xml:space="preserve">Calibration library</w:t>
+        <w:t xml:space="preserve">Calibration check</w:t>
       </w:r>
       <w:r>
         <w:rPr>
@@ -16591,14 +16656,14 @@
         </w:rPr>
         <w:tab/>
       </w:r>
-      <w:hyperlink w:history="1" w:anchor="s_4_3">
+      <w:hyperlink w:history="1" w:anchor="s_7_2">
         <w:r>
           <w:rPr>
             <w:rStyle w:val="Hyperlink"/>
             <w:sz w:val="19"/>
             <w:szCs w:val="19"/>
           </w:rPr>
-          <w:t xml:space="preserve">4.3</w:t>
+          <w:t xml:space="preserve">7.2</w:t>
         </w:r>
       </w:hyperlink>
     </w:p>
@@ -16614,7 +16679,7 @@
           <w:sz w:val="19"/>
           <w:szCs w:val="19"/>
         </w:rPr>
-        <w:t xml:space="preserve">Calibration masters folder</w:t>
+        <w:t xml:space="preserve">Calibration library</w:t>
       </w:r>
       <w:r>
         <w:rPr>
@@ -16623,14 +16688,14 @@
         </w:rPr>
         <w:tab/>
       </w:r>
-      <w:hyperlink w:history="1" w:anchor="s_4_2">
+      <w:hyperlink w:history="1" w:anchor="s_4_3">
         <w:r>
           <w:rPr>
             <w:rStyle w:val="Hyperlink"/>
             <w:sz w:val="19"/>
             <w:szCs w:val="19"/>
           </w:rPr>
-          <w:t xml:space="preserve">4.2</w:t>
+          <w:t xml:space="preserve">4.3</w:t>
         </w:r>
       </w:hyperlink>
     </w:p>
@@ -16646,7 +16711,7 @@
           <w:sz w:val="19"/>
           <w:szCs w:val="19"/>
         </w:rPr>
-        <w:t xml:space="preserve">Cancel</w:t>
+        <w:t xml:space="preserve">Calibration masters folder</w:t>
       </w:r>
       <w:r>
         <w:rPr>
@@ -16655,14 +16720,14 @@
         </w:rPr>
         <w:tab/>
       </w:r>
-      <w:hyperlink w:history="1" w:anchor="s_9_1">
+      <w:hyperlink w:history="1" w:anchor="s_4_2">
         <w:r>
           <w:rPr>
             <w:rStyle w:val="Hyperlink"/>
             <w:sz w:val="19"/>
             <w:szCs w:val="19"/>
           </w:rPr>
-          <w:t xml:space="preserve">9.1</w:t>
+          <w:t xml:space="preserve">4.2</w:t>
         </w:r>
       </w:hyperlink>
     </w:p>
@@ -16678,7 +16743,7 @@
           <w:sz w:val="19"/>
           <w:szCs w:val="19"/>
         </w:rPr>
-        <w:t xml:space="preserve">Check &amp; Stack</w:t>
+        <w:t xml:space="preserve">Cancel</w:t>
       </w:r>
       <w:r>
         <w:rPr>
@@ -16687,14 +16752,14 @@
         </w:rPr>
         <w:tab/>
       </w:r>
-      <w:hyperlink w:history="1" w:anchor="s_7_4">
+      <w:hyperlink w:history="1" w:anchor="s_9_1">
         <w:r>
           <w:rPr>
             <w:rStyle w:val="Hyperlink"/>
             <w:sz w:val="19"/>
             <w:szCs w:val="19"/>
           </w:rPr>
-          <w:t xml:space="preserve">7.4</w:t>
+          <w:t xml:space="preserve">9.1</w:t>
         </w:r>
       </w:hyperlink>
     </w:p>
@@ -16710,7 +16775,7 @@
           <w:sz w:val="19"/>
           <w:szCs w:val="19"/>
         </w:rPr>
-        <w:t xml:space="preserve">Choose a Colour Palette</w:t>
+        <w:t xml:space="preserve">Check &amp; Stack</w:t>
       </w:r>
       <w:r>
         <w:rPr>
@@ -16719,14 +16784,14 @@
         </w:rPr>
         <w:tab/>
       </w:r>
-      <w:hyperlink w:history="1" w:anchor="s_9_3">
+      <w:hyperlink w:history="1" w:anchor="s_7_4">
         <w:r>
           <w:rPr>
             <w:rStyle w:val="Hyperlink"/>
             <w:sz w:val="19"/>
             <w:szCs w:val="19"/>
           </w:rPr>
-          <w:t xml:space="preserve">9.3</w:t>
+          <w:t xml:space="preserve">7.4</w:t>
         </w:r>
       </w:hyperlink>
     </w:p>
@@ -16742,7 +16807,7 @@
           <w:sz w:val="19"/>
           <w:szCs w:val="19"/>
         </w:rPr>
-        <w:t xml:space="preserve">Colour cameras</w:t>
+        <w:t xml:space="preserve">Choose a Colour Palette</w:t>
       </w:r>
       <w:r>
         <w:rPr>
@@ -16751,14 +16816,14 @@
         </w:rPr>
         <w:tab/>
       </w:r>
-      <w:hyperlink w:history="1" w:anchor="s_7_3">
+      <w:hyperlink w:history="1" w:anchor="s_9_3">
         <w:r>
           <w:rPr>
             <w:rStyle w:val="Hyperlink"/>
             <w:sz w:val="19"/>
             <w:szCs w:val="19"/>
           </w:rPr>
-          <w:t xml:space="preserve">7.3</w:t>
+          <w:t xml:space="preserve">9.3</w:t>
         </w:r>
       </w:hyperlink>
     </w:p>
@@ -16774,7 +16839,7 @@
           <w:sz w:val="19"/>
           <w:szCs w:val="19"/>
         </w:rPr>
-        <w:t xml:space="preserve">Combine Colour Channels</w:t>
+        <w:t xml:space="preserve">Colour cameras</w:t>
       </w:r>
       <w:r>
         <w:rPr>
@@ -16783,14 +16848,14 @@
         </w:rPr>
         <w:tab/>
       </w:r>
-      <w:hyperlink w:history="1" w:anchor="s_9_3">
+      <w:hyperlink w:history="1" w:anchor="s_7_3">
         <w:r>
           <w:rPr>
             <w:rStyle w:val="Hyperlink"/>
             <w:sz w:val="19"/>
             <w:szCs w:val="19"/>
           </w:rPr>
-          <w:t xml:space="preserve">9.3</w:t>
+          <w:t xml:space="preserve">7.3</w:t>
         </w:r>
       </w:hyperlink>
     </w:p>
@@ -16806,7 +16871,7 @@
           <w:sz w:val="19"/>
           <w:szCs w:val="19"/>
         </w:rPr>
-        <w:t xml:space="preserve">Continue button</w:t>
+        <w:t xml:space="preserve">Combine Colour Channels</w:t>
       </w:r>
       <w:r>
         <w:rPr>
@@ -16815,14 +16880,14 @@
         </w:rPr>
         <w:tab/>
       </w:r>
-      <w:hyperlink w:history="1" w:anchor="s_5_1">
+      <w:hyperlink w:history="1" w:anchor="s_9_3">
         <w:r>
           <w:rPr>
             <w:rStyle w:val="Hyperlink"/>
             <w:sz w:val="19"/>
             <w:szCs w:val="19"/>
           </w:rPr>
-          <w:t xml:space="preserve">5.1</w:t>
+          <w:t xml:space="preserve">9.3</w:t>
         </w:r>
       </w:hyperlink>
     </w:p>
@@ -16838,7 +16903,7 @@
           <w:sz w:val="19"/>
           <w:szCs w:val="19"/>
         </w:rPr>
-        <w:t xml:space="preserve">Continue to Calibrate and Stack</w:t>
+        <w:t xml:space="preserve">Continue button</w:t>
       </w:r>
       <w:r>
         <w:rPr>
@@ -16847,14 +16912,14 @@
         </w:rPr>
         <w:tab/>
       </w:r>
-      <w:hyperlink w:history="1" w:anchor="s_6_5">
+      <w:hyperlink w:history="1" w:anchor="s_5_1">
         <w:r>
           <w:rPr>
             <w:rStyle w:val="Hyperlink"/>
             <w:sz w:val="19"/>
             <w:szCs w:val="19"/>
           </w:rPr>
-          <w:t xml:space="preserve">6.5</w:t>
+          <w:t xml:space="preserve">5.1</w:t>
         </w:r>
       </w:hyperlink>
     </w:p>
@@ -16870,7 +16935,7 @@
           <w:sz w:val="19"/>
           <w:szCs w:val="19"/>
         </w:rPr>
-        <w:t xml:space="preserve">Continue With the Rest</w:t>
+        <w:t xml:space="preserve">Continue to Calibrate and Stack</w:t>
       </w:r>
       <w:r>
         <w:rPr>
@@ -16879,14 +16944,14 @@
         </w:rPr>
         <w:tab/>
       </w:r>
-      <w:hyperlink w:history="1" w:anchor="s_7_4">
+      <w:hyperlink w:history="1" w:anchor="s_6_5">
         <w:r>
           <w:rPr>
             <w:rStyle w:val="Hyperlink"/>
             <w:sz w:val="19"/>
             <w:szCs w:val="19"/>
           </w:rPr>
-          <w:t xml:space="preserve">7.4</w:t>
+          <w:t xml:space="preserve">6.5</w:t>
         </w:r>
       </w:hyperlink>
     </w:p>
@@ -16902,7 +16967,7 @@
           <w:sz w:val="19"/>
           <w:szCs w:val="19"/>
         </w:rPr>
-        <w:t xml:space="preserve">Crash recovery</w:t>
+        <w:t xml:space="preserve">Continue With the Rest</w:t>
       </w:r>
       <w:r>
         <w:rPr>
@@ -16911,14 +16976,14 @@
         </w:rPr>
         <w:tab/>
       </w:r>
-      <w:hyperlink w:history="1" w:anchor="s_5_3">
+      <w:hyperlink w:history="1" w:anchor="s_7_4">
         <w:r>
           <w:rPr>
             <w:rStyle w:val="Hyperlink"/>
             <w:sz w:val="19"/>
             <w:szCs w:val="19"/>
           </w:rPr>
-          <w:t xml:space="preserve">5.3</w:t>
+          <w:t xml:space="preserve">7.4</w:t>
         </w:r>
       </w:hyperlink>
     </w:p>
@@ -16934,7 +16999,7 @@
           <w:sz w:val="19"/>
           <w:szCs w:val="19"/>
         </w:rPr>
-        <w:t xml:space="preserve">Credits</w:t>
+        <w:t xml:space="preserve">Crash recovery</w:t>
       </w:r>
       <w:r>
         <w:rPr>
@@ -16943,14 +17008,14 @@
         </w:rPr>
         <w:tab/>
       </w:r>
-      <w:hyperlink w:history="1" w:anchor="s_14_2">
+      <w:hyperlink w:history="1" w:anchor="s_5_3">
         <w:r>
           <w:rPr>
             <w:rStyle w:val="Hyperlink"/>
             <w:sz w:val="19"/>
             <w:szCs w:val="19"/>
           </w:rPr>
-          <w:t xml:space="preserve">14.2</w:t>
+          <w:t xml:space="preserve">5.3</w:t>
         </w:r>
       </w:hyperlink>
     </w:p>
@@ -16966,7 +17031,7 @@
           <w:sz w:val="19"/>
           <w:szCs w:val="19"/>
         </w:rPr>
-        <w:t xml:space="preserve">Crop</w:t>
+        <w:t xml:space="preserve">Credits</w:t>
       </w:r>
       <w:r>
         <w:rPr>
@@ -16975,14 +17040,14 @@
         </w:rPr>
         <w:tab/>
       </w:r>
-      <w:hyperlink w:history="1" w:anchor="s_8_2">
+      <w:hyperlink w:history="1" w:anchor="s_14_2">
         <w:r>
           <w:rPr>
             <w:rStyle w:val="Hyperlink"/>
             <w:sz w:val="19"/>
             <w:szCs w:val="19"/>
           </w:rPr>
-          <w:t xml:space="preserve">8.2</w:t>
+          <w:t xml:space="preserve">14.2</w:t>
         </w:r>
       </w:hyperlink>
     </w:p>
@@ -16998,7 +17063,7 @@
           <w:sz w:val="19"/>
           <w:szCs w:val="19"/>
         </w:rPr>
-        <w:t xml:space="preserve">Curves</w:t>
+        <w:t xml:space="preserve">Crop</w:t>
       </w:r>
       <w:r>
         <w:rPr>
@@ -17007,13 +17072,45 @@
         </w:rPr>
         <w:tab/>
       </w:r>
-      <w:hyperlink w:history="1" w:anchor="s_9_3">
+      <w:hyperlink w:history="1" w:anchor="s_8_2">
         <w:r>
           <w:rPr>
             <w:rStyle w:val="Hyperlink"/>
             <w:sz w:val="19"/>
             <w:szCs w:val="19"/>
           </w:rPr>
+          <w:t xml:space="preserve">8.2</w:t>
+        </w:r>
+      </w:hyperlink>
+    </w:p>
+    <w:p>
+      <w:pPr>
+        <w:tabs>
+          <w:tab w:val="right" w:pos="4200" w:leader="dot"/>
+        </w:tabs>
+        <w:spacing w:after="10"/>
+      </w:pPr>
+      <w:r>
+        <w:rPr>
+          <w:sz w:val="19"/>
+          <w:szCs w:val="19"/>
+        </w:rPr>
+        <w:t xml:space="preserve">Curves</w:t>
+      </w:r>
+      <w:r>
+        <w:rPr>
+          <w:sz w:val="19"/>
+          <w:szCs w:val="19"/>
+        </w:rPr>
+        <w:tab/>
+      </w:r>
+      <w:hyperlink w:history="1" w:anchor="s_9_3">
+        <w:r>
+          <w:rPr>
+            <w:rStyle w:val="Hyperlink"/>
+            <w:sz w:val="19"/>
+            <w:szCs w:val="19"/>
+          </w:rPr>
           <w:t xml:space="preserve">9.3</w:t>
         </w:r>
       </w:hyperlink>
@@ -18962,6 +19059,38 @@
             <w:szCs w:val="19"/>
           </w:rPr>
           <w:t xml:space="preserve">7.1</w:t>
+        </w:r>
+      </w:hyperlink>
+    </w:p>
+    <w:p>
+      <w:pPr>
+        <w:tabs>
+          <w:tab w:val="right" w:pos="4200" w:leader="dot"/>
+        </w:tabs>
+        <w:spacing w:after="10"/>
+      </w:pPr>
+      <w:r>
+        <w:rPr>
+          <w:sz w:val="19"/>
+          <w:szCs w:val="19"/>
+        </w:rPr>
+        <w:t xml:space="preserve">Light leak</w:t>
+      </w:r>
+      <w:r>
+        <w:rPr>
+          <w:sz w:val="19"/>
+          <w:szCs w:val="19"/>
+        </w:rPr>
+        <w:tab/>
+      </w:r>
+      <w:hyperlink w:history="1" w:anchor="s_7_2">
+        <w:r>
+          <w:rPr>
+            <w:rStyle w:val="Hyperlink"/>
+            <w:sz w:val="19"/>
+            <w:szCs w:val="19"/>
+          </w:rPr>
+          <w:t xml:space="preserve">7.2</w:t>
         </w:r>
       </w:hyperlink>
     </w:p>

</xml_diff>

<commit_message>
User manual 0.9.21 (RGB+Ha galaxies)
Co-Authored-By: Claude Opus 5.5 <noreply@anthropic.com>
Claude-Session: https://claude.ai/code/session_01FKvd69QsnCvM2zbzYnPwmF
</commit_message>
<xml_diff>
--- a/docs/SubZeroAstro_User_Manual.docx
+++ b/docs/SubZeroAstro_User_Manual.docx
@@ -121,7 +121,7 @@
           <w:sz w:val="22"/>
           <w:szCs w:val="22"/>
         </w:rPr>
-        <w:t xml:space="preserve">Version 0.9.20 beta  ·  Windows and Mac (Apple silicon)</w:t>
+        <w:t xml:space="preserve">Version 0.9.21 beta  ·  Windows and Mac (Apple silicon)</w:t>
       </w:r>
     </w:p>
     <w:p>
@@ -10032,7 +10032,7 @@
           </w:tcPr>
           <w:p>
             <w:r>
-              <w:t xml:space="preserve">Adds Ha to the red of an RGB set, without its stars</w:t>
+              <w:t xml:space="preserve">Adds Ha to the red of an RGB set, without its stars. For a galaxy (M31, M33, M101, NGC 891…) it adds only the compact HII regions - the red knots along the arms</w:t>
             </w:r>
           </w:p>
         </w:tc>
@@ -10054,7 +10054,7 @@
           </w:tcPr>
           <w:p>
             <w:r>
-              <w:t xml:space="preserve">Continuum subtraction + PixelMath</w:t>
+              <w:t xml:space="preserve">Continuum subtraction + PixelMath / NBRGBCombination</w:t>
             </w:r>
           </w:p>
         </w:tc>
@@ -12402,6 +12402,81 @@
         <w:spacing w:after="120"/>
       </w:pPr>
       <w:r>
+        <w:rPr>
+          <w:b/>
+          <w:bCs/>
+        </w:rPr>
+        <w:t xml:space="preserve">RGB (or LRGB) + Ha of a galaxy</w:t>
+      </w:r>
+      <w:r>
+        <w:t xml:space="preserve">: SubZeroAstro recognises galaxies by name (M31, M33, M51, M81, M101, NGC 891, IC 342… or names like </w:t>
+      </w:r>
+      <w:r>
+        <w:rPr>
+          <w:i/>
+          <w:iCs/>
+        </w:rPr>
+        <w:t xml:space="preserve">Andromeda</w:t>
+      </w:r>
+      <w:r>
+        <w:t xml:space="preserve"> or </w:t>
+      </w:r>
+      <w:r>
+        <w:rPr>
+          <w:i/>
+          <w:iCs/>
+        </w:rPr>
+        <w:t xml:space="preserve">Pinwheel</w:t>
+      </w:r>
+      <w:r>
+        <w:t xml:space="preserve">). </w:t>
+      </w:r>
+      <w:r>
+        <w:rPr>
+          <w:b/>
+          <w:bCs/>
+        </w:rPr>
+        <w:t xml:space="preserve">Add Hydrogen Glow</w:t>
+      </w:r>
+      <w:r>
+        <w:t xml:space="preserve"> then recommends </w:t>
+      </w:r>
+      <w:r>
+        <w:rPr>
+          <w:b/>
+          <w:bCs/>
+        </w:rPr>
+        <w:t xml:space="preserve">HII regions</w:t>
+      </w:r>
+      <w:r>
+        <w:t xml:space="preserve">: the starlight - and the galaxy's own smooth light - is subtracted from the Ha, and only the compact hydrogen knots that clearly stand out are added to red. They stand out crisply against the blue arms without tinting the whole galaxy pink. Tick </w:t>
+      </w:r>
+      <w:r>
+        <w:rPr>
+          <w:b/>
+          <w:bCs/>
+        </w:rPr>
+        <w:t xml:space="preserve">Show the hydrogen regions</w:t>
+      </w:r>
+      <w:r>
+        <w:t xml:space="preserve"> to see exactly what is added; </w:t>
+      </w:r>
+      <w:r>
+        <w:rPr>
+          <w:i/>
+          <w:iCs/>
+        </w:rPr>
+        <w:t xml:space="preserve">All hydrogen glow</w:t>
+      </w:r>
+      <w:r>
+        <w:t xml:space="preserve"> adds everything, for galaxies set inside nebulosity.</w:t>
+      </w:r>
+    </w:p>
+    <w:p>
+      <w:pPr>
+        <w:spacing w:after="120"/>
+      </w:pPr>
+      <w:r>
         <w:t xml:space="preserve">Each filter is stacked separately on page 2 (one row each; keep </w:t>
       </w:r>
       <w:r>
@@ -18578,7 +18653,7 @@
           <w:sz w:val="19"/>
           <w:szCs w:val="19"/>
         </w:rPr>
-        <w:t xml:space="preserve">Hold for Before</w:t>
+        <w:t xml:space="preserve">HII regions</w:t>
       </w:r>
       <w:r>
         <w:rPr>
@@ -18587,14 +18662,14 @@
         </w:rPr>
         <w:tab/>
       </w:r>
-      <w:hyperlink w:history="1" w:anchor="s_8_7">
+      <w:hyperlink w:history="1" w:anchor="s_10_3">
         <w:r>
           <w:rPr>
             <w:rStyle w:val="Hyperlink"/>
             <w:sz w:val="19"/>
             <w:szCs w:val="19"/>
           </w:rPr>
-          <w:t xml:space="preserve">8.7</w:t>
+          <w:t xml:space="preserve">10.3</w:t>
         </w:r>
       </w:hyperlink>
     </w:p>
@@ -18610,7 +18685,7 @@
           <w:sz w:val="19"/>
           <w:szCs w:val="19"/>
         </w:rPr>
-        <w:t xml:space="preserve">Hold for Before (Finishing Touches)</w:t>
+        <w:t xml:space="preserve">Hold for Before</w:t>
       </w:r>
       <w:r>
         <w:rPr>
@@ -18619,14 +18694,14 @@
         </w:rPr>
         <w:tab/>
       </w:r>
-      <w:hyperlink w:history="1" w:anchor="s_9_2">
+      <w:hyperlink w:history="1" w:anchor="s_8_7">
         <w:r>
           <w:rPr>
             <w:rStyle w:val="Hyperlink"/>
             <w:sz w:val="19"/>
             <w:szCs w:val="19"/>
           </w:rPr>
-          <w:t xml:space="preserve">9.2</w:t>
+          <w:t xml:space="preserve">8.7</w:t>
         </w:r>
       </w:hyperlink>
     </w:p>
@@ -18642,7 +18717,7 @@
           <w:sz w:val="19"/>
           <w:szCs w:val="19"/>
         </w:rPr>
-        <w:t xml:space="preserve">Hubble palette</w:t>
+        <w:t xml:space="preserve">Hold for Before (Finishing Touches)</w:t>
       </w:r>
       <w:r>
         <w:rPr>
@@ -18651,13 +18726,45 @@
         </w:rPr>
         <w:tab/>
       </w:r>
-      <w:hyperlink w:history="1" w:anchor="s_10_4">
+      <w:hyperlink w:history="1" w:anchor="s_9_2">
         <w:r>
           <w:rPr>
             <w:rStyle w:val="Hyperlink"/>
             <w:sz w:val="19"/>
             <w:szCs w:val="19"/>
           </w:rPr>
+          <w:t xml:space="preserve">9.2</w:t>
+        </w:r>
+      </w:hyperlink>
+    </w:p>
+    <w:p>
+      <w:pPr>
+        <w:tabs>
+          <w:tab w:val="right" w:pos="4200" w:leader="dot"/>
+        </w:tabs>
+        <w:spacing w:after="10"/>
+      </w:pPr>
+      <w:r>
+        <w:rPr>
+          <w:sz w:val="19"/>
+          <w:szCs w:val="19"/>
+        </w:rPr>
+        <w:t xml:space="preserve">Hubble palette</w:t>
+      </w:r>
+      <w:r>
+        <w:rPr>
+          <w:sz w:val="19"/>
+          <w:szCs w:val="19"/>
+        </w:rPr>
+        <w:tab/>
+      </w:r>
+      <w:hyperlink w:history="1" w:anchor="s_10_4">
+        <w:r>
+          <w:rPr>
+            <w:rStyle w:val="Hyperlink"/>
+            <w:sz w:val="19"/>
+            <w:szCs w:val="19"/>
+          </w:rPr>
           <w:t xml:space="preserve">10.4</w:t>
         </w:r>
       </w:hyperlink>
@@ -20807,6 +20914,38 @@
             <w:szCs w:val="19"/>
           </w:rPr>
           <w:t xml:space="preserve">5.3</w:t>
+        </w:r>
+      </w:hyperlink>
+    </w:p>
+    <w:p>
+      <w:pPr>
+        <w:tabs>
+          <w:tab w:val="right" w:pos="4200" w:leader="dot"/>
+        </w:tabs>
+        <w:spacing w:after="10"/>
+      </w:pPr>
+      <w:r>
+        <w:rPr>
+          <w:sz w:val="19"/>
+          <w:szCs w:val="19"/>
+        </w:rPr>
+        <w:t xml:space="preserve">RGB + Ha galaxies</w:t>
+      </w:r>
+      <w:r>
+        <w:rPr>
+          <w:sz w:val="19"/>
+          <w:szCs w:val="19"/>
+        </w:rPr>
+        <w:tab/>
+      </w:r>
+      <w:hyperlink w:history="1" w:anchor="s_10_3">
+        <w:r>
+          <w:rPr>
+            <w:rStyle w:val="Hyperlink"/>
+            <w:sz w:val="19"/>
+            <w:szCs w:val="19"/>
+          </w:rPr>
+          <w:t xml:space="preserve">10.3</w:t>
         </w:r>
       </w:hyperlink>
     </w:p>

</xml_diff>

<commit_message>
v0.9.22: comet stacking, target-type tailoring, SkyFlats dark guard
- Comets recognised by name; a second stack follows the comet and is joined with the
  star stack (sharp stars + sharp comet); _Comet and _Stars masters saved alongside.
  Faint or uncertain comets fall back to the ordinary stack with a clear log line.
- targets.py classifies galaxy / nebula / planetary / cluster / comet; Finishing Touches
  only moves steps between recommended and optional, never removes any.
- SkyFlats stops with a clear message when the dark/bias is as bright as the sky.
- Target names with '/' no longer create nested folders.
- Manual 10.6 Comets, 10.7 Target types.

Co-Authored-By: Claude Opus 5.5 <noreply@anthropic.com>
Claude-Session: https://claude.ai/code/session_01FKvd69QsnCvM2zbzYnPwmF
</commit_message>
<xml_diff>
--- a/docs/SubZeroAstro_User_Manual.docx
+++ b/docs/SubZeroAstro_User_Manual.docx
@@ -121,7 +121,7 @@
           <w:sz w:val="22"/>
           <w:szCs w:val="22"/>
         </w:rPr>
-        <w:t xml:space="preserve">Version 0.9.21 beta  ·  Windows and Mac (Apple silicon)</w:t>
+        <w:t xml:space="preserve">Version 0.9.22 beta  ·  Windows and Mac (Apple silicon)</w:t>
       </w:r>
     </w:p>
     <w:p>
@@ -1305,6 +1305,42 @@
         <w:tabs>
           <w:tab w:val="right" w:pos="9360" w:leader="dot"/>
         </w:tabs>
+        <w:spacing w:after="20" w:before="0"/>
+        <w:ind w:left="480"/>
+      </w:pPr>
+      <w:hyperlink w:history="1" w:anchor="s_10_6">
+        <w:r>
+          <w:rPr>
+            <w:b w:val="false"/>
+            <w:bCs w:val="false"/>
+          </w:rPr>
+          <w:t xml:space="preserve">10.6   Comets</w:t>
+        </w:r>
+      </w:hyperlink>
+    </w:p>
+    <w:p>
+      <w:pPr>
+        <w:tabs>
+          <w:tab w:val="right" w:pos="9360" w:leader="dot"/>
+        </w:tabs>
+        <w:spacing w:after="20" w:before="0"/>
+        <w:ind w:left="480"/>
+      </w:pPr>
+      <w:hyperlink w:history="1" w:anchor="s_10_7">
+        <w:r>
+          <w:rPr>
+            <w:b w:val="false"/>
+            <w:bCs w:val="false"/>
+          </w:rPr>
+          <w:t xml:space="preserve">10.7   Target types</w:t>
+        </w:r>
+      </w:hyperlink>
+    </w:p>
+    <w:p>
+      <w:pPr>
+        <w:tabs>
+          <w:tab w:val="right" w:pos="9360" w:leader="dot"/>
+        </w:tabs>
         <w:spacing w:after="20" w:before="140"/>
         <w:ind w:left="0"/>
       </w:pPr>
@@ -1326,7 +1362,7 @@
           <w:b/>
           <w:bCs/>
         </w:rPr>
-        <w:t xml:space="preserve">30</w:t>
+        <w:t xml:space="preserve">31</w:t>
       </w:r>
     </w:p>
     <w:p>
@@ -1391,7 +1427,7 @@
           <w:b/>
           <w:bCs/>
         </w:rPr>
-        <w:t xml:space="preserve">32</w:t>
+        <w:t xml:space="preserve">33</w:t>
       </w:r>
     </w:p>
     <w:p>
@@ -1456,7 +1492,7 @@
           <w:b/>
           <w:bCs/>
         </w:rPr>
-        <w:t xml:space="preserve">33</w:t>
+        <w:t xml:space="preserve">34</w:t>
       </w:r>
     </w:p>
     <w:p>
@@ -1521,7 +1557,7 @@
           <w:b/>
           <w:bCs/>
         </w:rPr>
-        <w:t xml:space="preserve">34</w:t>
+        <w:t xml:space="preserve">35</w:t>
       </w:r>
     </w:p>
     <w:p>
@@ -1586,7 +1622,7 @@
           <w:b/>
           <w:bCs/>
         </w:rPr>
-        <w:t xml:space="preserve">35</w:t>
+        <w:t xml:space="preserve">36</w:t>
       </w:r>
     </w:p>
     <w:p>
@@ -7991,6 +8027,14 @@
     </w:p>
     <w:p>
       <w:pPr>
+        <w:spacing w:after="120"/>
+      </w:pPr>
+      <w:r>
+        <w:t xml:space="preserve">A SkyFlat needs sky in the light frames. If the master dark or bias is as bright as the sky (a light leak, or the wrong exposure or gain), there is nothing left to make a flat from - SubZeroAstro then stops with a clear message instead of making a bad flat. Check the dark first (the calibration check on page 2 warns about it too).</w:t>
+      </w:r>
+    </w:p>
+    <w:p>
+      <w:pPr>
         <w:pBdr>
           <w:left w:val="single" w:color="2F6FD6" w:sz="18" w:space="8"/>
         </w:pBdr>
@@ -12628,6 +12672,200 @@
     </w:p>
     <w:p>
       <w:pPr>
+        <w:pStyle w:val="Heading2"/>
+      </w:pPr>
+      <w:bookmarkStart w:name="s_10_6" w:id="1"/>
+      <w:r>
+        <w:t xml:space="preserve">10.6   Comets</w:t>
+      </w:r>
+      <w:bookmarkEnd w:id="1"/>
+    </w:p>
+    <w:p>
+      <w:pPr>
+        <w:spacing w:after="120"/>
+      </w:pPr>
+      <w:r>
+        <w:t xml:space="preserve">A comet moves against the stars while you image it, so a normal stack (lined up on the stars) smears it, and a stack lined up on the comet trails the stars. SubZeroAstro does both and joins them. It recognises a comet by its name (</w:t>
+      </w:r>
+      <w:r>
+        <w:rPr>
+          <w:i/>
+          <w:iCs/>
+        </w:rPr>
+        <w:t xml:space="preserve">C/2023 A3</w:t>
+      </w:r>
+      <w:r>
+        <w:t xml:space="preserve">, </w:t>
+      </w:r>
+      <w:r>
+        <w:rPr>
+          <w:i/>
+          <w:iCs/>
+        </w:rPr>
+        <w:t xml:space="preserve">12P/Pons-Brooks</w:t>
+      </w:r>
+      <w:r>
+        <w:t xml:space="preserve">, </w:t>
+      </w:r>
+      <w:r>
+        <w:rPr>
+          <w:i/>
+          <w:iCs/>
+        </w:rPr>
+        <w:t xml:space="preserve">161P Hartley-IRAS</w:t>
+      </w:r>
+      <w:r>
+        <w:t xml:space="preserve">, or any name containing </w:t>
+      </w:r>
+      <w:r>
+        <w:rPr>
+          <w:i/>
+          <w:iCs/>
+        </w:rPr>
+        <w:t xml:space="preserve">comet</w:t>
+      </w:r>
+      <w:r>
+        <w:t xml:space="preserve">) - page 2's plan shows ☄ for it. While stacking it finds the comet's head in every frame, works out its motion from the frames' times, makes a </w:t>
+      </w:r>
+      <w:r>
+        <w:rPr>
+          <w:b/>
+          <w:bCs/>
+        </w:rPr>
+        <w:t xml:space="preserve">second stack that follows the comet</w:t>
+      </w:r>
+      <w:r>
+        <w:t xml:space="preserve"> (the stars, which move through it, are rejected), and saves three masters: the main one with </w:t>
+      </w:r>
+      <w:r>
+        <w:rPr>
+          <w:b/>
+          <w:bCs/>
+        </w:rPr>
+        <w:t xml:space="preserve">sharp stars and a sharp comet</w:t>
+      </w:r>
+      <w:r>
+        <w:t xml:space="preserve">, plus </w:t>
+      </w:r>
+      <w:r>
+        <w:rPr>
+          <w:b/>
+          <w:bCs/>
+        </w:rPr>
+        <w:t xml:space="preserve">_Comet</w:t>
+      </w:r>
+      <w:r>
+        <w:t xml:space="preserve"> (comet only) and </w:t>
+      </w:r>
+      <w:r>
+        <w:rPr>
+          <w:b/>
+          <w:bCs/>
+        </w:rPr>
+        <w:t xml:space="preserve">_Stars</w:t>
+      </w:r>
+      <w:r>
+        <w:t xml:space="preserve"> (star-aligned) next to it. The log says how far the comet moved.</w:t>
+      </w:r>
+    </w:p>
+    <w:p>
+      <w:pPr>
+        <w:spacing w:after="120"/>
+      </w:pPr>
+      <w:r>
+        <w:t xml:space="preserve">When the comet barely moved during the session (under 3 pixels - common with short sessions), or it is too faint or too uncertain to follow, only the ordinary stack is saved and the log says why. Long sessions of several frames per minute work best. On page 4 the main master goes through the usual steps; for a comet </w:t>
+      </w:r>
+      <w:r>
+        <w:rPr>
+          <w:b/>
+          <w:bCs/>
+        </w:rPr>
+        <w:t xml:space="preserve">Darken the Sky</w:t>
+      </w:r>
+      <w:r>
+        <w:t xml:space="preserve"> is recommended, while star steps (</w:t>
+      </w:r>
+      <w:r>
+        <w:rPr>
+          <w:i/>
+          <w:iCs/>
+        </w:rPr>
+        <w:t xml:space="preserve">Take Stars Out</w:t>
+      </w:r>
+      <w:r>
+        <w:t xml:space="preserve">, </w:t>
+      </w:r>
+      <w:r>
+        <w:rPr>
+          <w:i/>
+          <w:iCs/>
+        </w:rPr>
+        <w:t xml:space="preserve">Shrink Stars</w:t>
+      </w:r>
+      <w:r>
+        <w:t xml:space="preserve">) are optional.</w:t>
+      </w:r>
+    </w:p>
+    <w:p>
+      <w:pPr>
+        <w:pStyle w:val="Heading2"/>
+      </w:pPr>
+      <w:bookmarkStart w:name="s_10_7" w:id="1"/>
+      <w:r>
+        <w:t xml:space="preserve">10.7   Target types</w:t>
+      </w:r>
+      <w:bookmarkEnd w:id="1"/>
+    </w:p>
+    <w:p>
+      <w:pPr>
+        <w:spacing w:after="120"/>
+      </w:pPr>
+      <w:r>
+        <w:t xml:space="preserve">From the target's name SubZeroAstro works out what kind of object it is - </w:t>
+      </w:r>
+      <w:r>
+        <w:rPr>
+          <w:b/>
+          <w:bCs/>
+        </w:rPr>
+        <w:t xml:space="preserve">galaxy, nebula, planetary nebula, star cluster or comet</w:t>
+      </w:r>
+      <w:r>
+        <w:t xml:space="preserve"> - and shows it in the title of page 4. The type only fine-tunes the recommendations; </w:t>
+      </w:r>
+      <w:r>
+        <w:rPr>
+          <w:b/>
+          <w:bCs/>
+        </w:rPr>
+        <w:t xml:space="preserve">no step is ever taken away</w:t>
+      </w:r>
+      <w:r>
+        <w:t xml:space="preserve">. Galaxies get </w:t>
+      </w:r>
+      <w:r>
+        <w:rPr>
+          <w:i/>
+          <w:iCs/>
+        </w:rPr>
+        <w:t xml:space="preserve">Local Contrast</w:t>
+      </w:r>
+      <w:r>
+        <w:t xml:space="preserve"> recommended and HII regions in </w:t>
+      </w:r>
+      <w:r>
+        <w:rPr>
+          <w:i/>
+          <w:iCs/>
+        </w:rPr>
+        <w:t xml:space="preserve">Add Hydrogen Glow</w:t>
+      </w:r>
+      <w:r>
+        <w:t xml:space="preserve">; star clusters make star removal and shrinking optional (the stars are the subject); comets get a comet stack on page 2. When the name gives nothing away, the usual workflow for your data applies.</w:t>
+      </w:r>
+    </w:p>
+    <w:p>
+      <w:pPr>
         <w:pStyle w:val="Heading1"/>
         <w:pageBreakBefore/>
       </w:pPr>
@@ -15785,7 +16023,7 @@
           <w:sz w:val="24"/>
           <w:szCs w:val="24"/>
         </w:rPr>
-        <w:t xml:space="preserve">A</w:t>
+        <w:t xml:space="preserve">_</w:t>
       </w:r>
     </w:p>
     <w:p>
@@ -15800,7 +16038,7 @@
           <w:sz w:val="19"/>
           <w:szCs w:val="19"/>
         </w:rPr>
-        <w:t xml:space="preserve">Add Folders</w:t>
+        <w:t xml:space="preserve">_Comet master</w:t>
       </w:r>
       <w:r>
         <w:rPr>
@@ -15809,14 +16047,14 @@
         </w:rPr>
         <w:tab/>
       </w:r>
-      <w:hyperlink w:history="1" w:anchor="s_6_1">
+      <w:hyperlink w:history="1" w:anchor="s_10_6">
         <w:r>
           <w:rPr>
             <w:rStyle w:val="Hyperlink"/>
             <w:sz w:val="19"/>
             <w:szCs w:val="19"/>
           </w:rPr>
-          <w:t xml:space="preserve">6.1</w:t>
+          <w:t xml:space="preserve">10.6</w:t>
         </w:r>
       </w:hyperlink>
     </w:p>
@@ -15832,7 +16070,7 @@
           <w:sz w:val="19"/>
           <w:szCs w:val="19"/>
         </w:rPr>
-        <w:t xml:space="preserve">Add Hydrogen Glow</w:t>
+        <w:t xml:space="preserve">_Stars master</w:t>
       </w:r>
       <w:r>
         <w:rPr>
@@ -15841,16 +16079,32 @@
         </w:rPr>
         <w:tab/>
       </w:r>
-      <w:hyperlink w:history="1" w:anchor="s_9_3">
+      <w:hyperlink w:history="1" w:anchor="s_10_6">
         <w:r>
           <w:rPr>
             <w:rStyle w:val="Hyperlink"/>
             <w:sz w:val="19"/>
             <w:szCs w:val="19"/>
           </w:rPr>
-          <w:t xml:space="preserve">9.3</w:t>
-        </w:r>
-      </w:hyperlink>
+          <w:t xml:space="preserve">10.6</w:t>
+        </w:r>
+      </w:hyperlink>
+    </w:p>
+    <w:p>
+      <w:pPr>
+        <w:keepNext/>
+        <w:spacing w:after="40" w:before="160"/>
+      </w:pPr>
+      <w:r>
+        <w:rPr>
+          <w:b/>
+          <w:bCs/>
+          <w:color w:val="2F6FD6"/>
+          <w:sz w:val="24"/>
+          <w:szCs w:val="24"/>
+        </w:rPr>
+        <w:t xml:space="preserve">A</w:t>
+      </w:r>
     </w:p>
     <w:p>
       <w:pPr>
@@ -15864,7 +16118,7 @@
           <w:sz w:val="19"/>
           <w:szCs w:val="19"/>
         </w:rPr>
-        <w:t xml:space="preserve">Add Masters</w:t>
+        <w:t xml:space="preserve">Add Folders</w:t>
       </w:r>
       <w:r>
         <w:rPr>
@@ -15873,14 +16127,14 @@
         </w:rPr>
         <w:tab/>
       </w:r>
-      <w:hyperlink w:history="1" w:anchor="s_8_1">
+      <w:hyperlink w:history="1" w:anchor="s_6_1">
         <w:r>
           <w:rPr>
             <w:rStyle w:val="Hyperlink"/>
             <w:sz w:val="19"/>
             <w:szCs w:val="19"/>
           </w:rPr>
-          <w:t xml:space="preserve">8.1</w:t>
+          <w:t xml:space="preserve">6.1</w:t>
         </w:r>
       </w:hyperlink>
     </w:p>
@@ -15896,7 +16150,7 @@
           <w:sz w:val="19"/>
           <w:szCs w:val="19"/>
         </w:rPr>
-        <w:t xml:space="preserve">Aggressive</w:t>
+        <w:t xml:space="preserve">Add Hydrogen Glow</w:t>
       </w:r>
       <w:r>
         <w:rPr>
@@ -15905,14 +16159,14 @@
         </w:rPr>
         <w:tab/>
       </w:r>
-      <w:hyperlink w:history="1" w:anchor="s_6_3">
+      <w:hyperlink w:history="1" w:anchor="s_9_3">
         <w:r>
           <w:rPr>
             <w:rStyle w:val="Hyperlink"/>
             <w:sz w:val="19"/>
             <w:szCs w:val="19"/>
           </w:rPr>
-          <w:t xml:space="preserve">6.3</w:t>
+          <w:t xml:space="preserve">9.3</w:t>
         </w:r>
       </w:hyperlink>
     </w:p>
@@ -15928,7 +16182,7 @@
           <w:sz w:val="19"/>
           <w:szCs w:val="19"/>
         </w:rPr>
-        <w:t xml:space="preserve">Alt-az</w:t>
+        <w:t xml:space="preserve">Add Masters</w:t>
       </w:r>
       <w:r>
         <w:rPr>
@@ -15937,14 +16191,14 @@
         </w:rPr>
         <w:tab/>
       </w:r>
-      <w:hyperlink w:history="1" w:anchor="s_10_5">
+      <w:hyperlink w:history="1" w:anchor="s_8_1">
         <w:r>
           <w:rPr>
             <w:rStyle w:val="Hyperlink"/>
             <w:sz w:val="19"/>
             <w:szCs w:val="19"/>
           </w:rPr>
-          <w:t xml:space="preserve">10.5</w:t>
+          <w:t xml:space="preserve">8.1</w:t>
         </w:r>
       </w:hyperlink>
     </w:p>
@@ -15960,7 +16214,7 @@
           <w:sz w:val="19"/>
           <w:szCs w:val="19"/>
         </w:rPr>
-        <w:t xml:space="preserve">Apply</w:t>
+        <w:t xml:space="preserve">Aggressive</w:t>
       </w:r>
       <w:r>
         <w:rPr>
@@ -15969,14 +16223,14 @@
         </w:rPr>
         <w:tab/>
       </w:r>
-      <w:hyperlink w:history="1" w:anchor="s_9_1">
+      <w:hyperlink w:history="1" w:anchor="s_6_3">
         <w:r>
           <w:rPr>
             <w:rStyle w:val="Hyperlink"/>
             <w:sz w:val="19"/>
             <w:szCs w:val="19"/>
           </w:rPr>
-          <w:t xml:space="preserve">9.1</w:t>
+          <w:t xml:space="preserve">6.3</w:t>
         </w:r>
       </w:hyperlink>
     </w:p>
@@ -15992,7 +16246,7 @@
           <w:sz w:val="19"/>
           <w:szCs w:val="19"/>
         </w:rPr>
-        <w:t xml:space="preserve">Askar D1</w:t>
+        <w:t xml:space="preserve">Alt-az</w:t>
       </w:r>
       <w:r>
         <w:rPr>
@@ -16001,14 +16255,14 @@
         </w:rPr>
         <w:tab/>
       </w:r>
-      <w:hyperlink w:history="1" w:anchor="s_10_2">
+      <w:hyperlink w:history="1" w:anchor="s_10_5">
         <w:r>
           <w:rPr>
             <w:rStyle w:val="Hyperlink"/>
             <w:sz w:val="19"/>
             <w:szCs w:val="19"/>
           </w:rPr>
-          <w:t xml:space="preserve">10.2</w:t>
+          <w:t xml:space="preserve">10.5</w:t>
         </w:r>
       </w:hyperlink>
     </w:p>
@@ -16024,7 +16278,7 @@
           <w:sz w:val="19"/>
           <w:szCs w:val="19"/>
         </w:rPr>
-        <w:t xml:space="preserve">Askar D2</w:t>
+        <w:t xml:space="preserve">Apply</w:t>
       </w:r>
       <w:r>
         <w:rPr>
@@ -16033,14 +16287,14 @@
         </w:rPr>
         <w:tab/>
       </w:r>
-      <w:hyperlink w:history="1" w:anchor="s_10_2">
+      <w:hyperlink w:history="1" w:anchor="s_9_1">
         <w:r>
           <w:rPr>
             <w:rStyle w:val="Hyperlink"/>
             <w:sz w:val="19"/>
             <w:szCs w:val="19"/>
           </w:rPr>
-          <w:t xml:space="preserve">10.2</w:t>
+          <w:t xml:space="preserve">9.1</w:t>
         </w:r>
       </w:hyperlink>
     </w:p>
@@ -16056,7 +16310,7 @@
           <w:sz w:val="19"/>
           <w:szCs w:val="19"/>
         </w:rPr>
-        <w:t xml:space="preserve">ASTAP</w:t>
+        <w:t xml:space="preserve">Askar D1</w:t>
       </w:r>
       <w:r>
         <w:rPr>
@@ -16065,27 +16319,46 @@
         </w:rPr>
         <w:tab/>
       </w:r>
-      <w:hyperlink w:history="1" w:anchor="s_2_2">
+      <w:hyperlink w:history="1" w:anchor="s_10_2">
         <w:r>
           <w:rPr>
             <w:rStyle w:val="Hyperlink"/>
             <w:sz w:val="19"/>
             <w:szCs w:val="19"/>
           </w:rPr>
-          <w:t xml:space="preserve">2.2</w:t>
-        </w:r>
-      </w:hyperlink>
-      <w:r>
-        <w:t xml:space="preserve">, </w:t>
-      </w:r>
-      <w:hyperlink w:history="1" w:anchor="s_4_1">
+          <w:t xml:space="preserve">10.2</w:t>
+        </w:r>
+      </w:hyperlink>
+    </w:p>
+    <w:p>
+      <w:pPr>
+        <w:tabs>
+          <w:tab w:val="right" w:pos="4200" w:leader="dot"/>
+        </w:tabs>
+        <w:spacing w:after="10"/>
+      </w:pPr>
+      <w:r>
+        <w:rPr>
+          <w:sz w:val="19"/>
+          <w:szCs w:val="19"/>
+        </w:rPr>
+        <w:t xml:space="preserve">Askar D2</w:t>
+      </w:r>
+      <w:r>
+        <w:rPr>
+          <w:sz w:val="19"/>
+          <w:szCs w:val="19"/>
+        </w:rPr>
+        <w:tab/>
+      </w:r>
+      <w:hyperlink w:history="1" w:anchor="s_10_2">
         <w:r>
           <w:rPr>
             <w:rStyle w:val="Hyperlink"/>
             <w:sz w:val="19"/>
             <w:szCs w:val="19"/>
           </w:rPr>
-          <w:t xml:space="preserve">4.1</w:t>
+          <w:t xml:space="preserve">10.2</w:t>
         </w:r>
       </w:hyperlink>
     </w:p>
@@ -16101,7 +16374,7 @@
           <w:sz w:val="19"/>
           <w:szCs w:val="19"/>
         </w:rPr>
-        <w:t xml:space="preserve">AstroBin</w:t>
+        <w:t xml:space="preserve">ASTAP</w:t>
       </w:r>
       <w:r>
         <w:rPr>
@@ -16110,46 +16383,27 @@
         </w:rPr>
         <w:tab/>
       </w:r>
-      <w:hyperlink w:history="1" w:anchor="s_9_7">
+      <w:hyperlink w:history="1" w:anchor="s_2_2">
         <w:r>
           <w:rPr>
             <w:rStyle w:val="Hyperlink"/>
             <w:sz w:val="19"/>
             <w:szCs w:val="19"/>
           </w:rPr>
-          <w:t xml:space="preserve">9.7</w:t>
-        </w:r>
-      </w:hyperlink>
-    </w:p>
-    <w:p>
-      <w:pPr>
-        <w:tabs>
-          <w:tab w:val="right" w:pos="4200" w:leader="dot"/>
-        </w:tabs>
-        <w:spacing w:after="10"/>
-      </w:pPr>
-      <w:r>
-        <w:rPr>
-          <w:sz w:val="19"/>
-          <w:szCs w:val="19"/>
-        </w:rPr>
-        <w:t xml:space="preserve">Auto-crop</w:t>
-      </w:r>
-      <w:r>
-        <w:rPr>
-          <w:sz w:val="19"/>
-          <w:szCs w:val="19"/>
-        </w:rPr>
-        <w:tab/>
-      </w:r>
-      <w:hyperlink w:history="1" w:anchor="s_8_2">
+          <w:t xml:space="preserve">2.2</w:t>
+        </w:r>
+      </w:hyperlink>
+      <w:r>
+        <w:t xml:space="preserve">, </w:t>
+      </w:r>
+      <w:hyperlink w:history="1" w:anchor="s_4_1">
         <w:r>
           <w:rPr>
             <w:rStyle w:val="Hyperlink"/>
             <w:sz w:val="19"/>
             <w:szCs w:val="19"/>
           </w:rPr>
-          <w:t xml:space="preserve">8.2</w:t>
+          <w:t xml:space="preserve">4.1</w:t>
         </w:r>
       </w:hyperlink>
     </w:p>
@@ -16165,7 +16419,7 @@
           <w:sz w:val="19"/>
           <w:szCs w:val="19"/>
         </w:rPr>
-        <w:t xml:space="preserve">Auto-cull</w:t>
+        <w:t xml:space="preserve">AstroBin</w:t>
       </w:r>
       <w:r>
         <w:rPr>
@@ -16174,14 +16428,14 @@
         </w:rPr>
         <w:tab/>
       </w:r>
-      <w:hyperlink w:history="1" w:anchor="s_6_3">
+      <w:hyperlink w:history="1" w:anchor="s_9_7">
         <w:r>
           <w:rPr>
             <w:rStyle w:val="Hyperlink"/>
             <w:sz w:val="19"/>
             <w:szCs w:val="19"/>
           </w:rPr>
-          <w:t xml:space="preserve">6.3</w:t>
+          <w:t xml:space="preserve">9.7</w:t>
         </w:r>
       </w:hyperlink>
     </w:p>
@@ -16197,7 +16451,7 @@
           <w:sz w:val="19"/>
           <w:szCs w:val="19"/>
         </w:rPr>
-        <w:t xml:space="preserve">Auto-Flag</w:t>
+        <w:t xml:space="preserve">Auto-crop</w:t>
       </w:r>
       <w:r>
         <w:rPr>
@@ -16206,13 +16460,77 @@
         </w:rPr>
         <w:tab/>
       </w:r>
-      <w:hyperlink w:history="1" w:anchor="s_6_3">
+      <w:hyperlink w:history="1" w:anchor="s_8_2">
         <w:r>
           <w:rPr>
             <w:rStyle w:val="Hyperlink"/>
             <w:sz w:val="19"/>
             <w:szCs w:val="19"/>
           </w:rPr>
+          <w:t xml:space="preserve">8.2</w:t>
+        </w:r>
+      </w:hyperlink>
+    </w:p>
+    <w:p>
+      <w:pPr>
+        <w:tabs>
+          <w:tab w:val="right" w:pos="4200" w:leader="dot"/>
+        </w:tabs>
+        <w:spacing w:after="10"/>
+      </w:pPr>
+      <w:r>
+        <w:rPr>
+          <w:sz w:val="19"/>
+          <w:szCs w:val="19"/>
+        </w:rPr>
+        <w:t xml:space="preserve">Auto-cull</w:t>
+      </w:r>
+      <w:r>
+        <w:rPr>
+          <w:sz w:val="19"/>
+          <w:szCs w:val="19"/>
+        </w:rPr>
+        <w:tab/>
+      </w:r>
+      <w:hyperlink w:history="1" w:anchor="s_6_3">
+        <w:r>
+          <w:rPr>
+            <w:rStyle w:val="Hyperlink"/>
+            <w:sz w:val="19"/>
+            <w:szCs w:val="19"/>
+          </w:rPr>
+          <w:t xml:space="preserve">6.3</w:t>
+        </w:r>
+      </w:hyperlink>
+    </w:p>
+    <w:p>
+      <w:pPr>
+        <w:tabs>
+          <w:tab w:val="right" w:pos="4200" w:leader="dot"/>
+        </w:tabs>
+        <w:spacing w:after="10"/>
+      </w:pPr>
+      <w:r>
+        <w:rPr>
+          <w:sz w:val="19"/>
+          <w:szCs w:val="19"/>
+        </w:rPr>
+        <w:t xml:space="preserve">Auto-Flag</w:t>
+      </w:r>
+      <w:r>
+        <w:rPr>
+          <w:sz w:val="19"/>
+          <w:szCs w:val="19"/>
+        </w:rPr>
+        <w:tab/>
+      </w:r>
+      <w:hyperlink w:history="1" w:anchor="s_6_3">
+        <w:r>
+          <w:rPr>
+            <w:rStyle w:val="Hyperlink"/>
+            <w:sz w:val="19"/>
+            <w:szCs w:val="19"/>
+          </w:rPr>
           <w:t xml:space="preserve">6.3</w:t>
         </w:r>
       </w:hyperlink>
@@ -16978,7 +17296,7 @@
           <w:sz w:val="19"/>
           <w:szCs w:val="19"/>
         </w:rPr>
-        <w:t xml:space="preserve">Continue button</w:t>
+        <w:t xml:space="preserve">Comet stack</w:t>
       </w:r>
       <w:r>
         <w:rPr>
@@ -16987,14 +17305,14 @@
         </w:rPr>
         <w:tab/>
       </w:r>
-      <w:hyperlink w:history="1" w:anchor="s_5_1">
+      <w:hyperlink w:history="1" w:anchor="s_10_6">
         <w:r>
           <w:rPr>
             <w:rStyle w:val="Hyperlink"/>
             <w:sz w:val="19"/>
             <w:szCs w:val="19"/>
           </w:rPr>
-          <w:t xml:space="preserve">5.1</w:t>
+          <w:t xml:space="preserve">10.6</w:t>
         </w:r>
       </w:hyperlink>
     </w:p>
@@ -17010,7 +17328,7 @@
           <w:sz w:val="19"/>
           <w:szCs w:val="19"/>
         </w:rPr>
-        <w:t xml:space="preserve">Continue to Calibrate and Stack</w:t>
+        <w:t xml:space="preserve">Comets</w:t>
       </w:r>
       <w:r>
         <w:rPr>
@@ -17019,14 +17337,14 @@
         </w:rPr>
         <w:tab/>
       </w:r>
-      <w:hyperlink w:history="1" w:anchor="s_6_5">
+      <w:hyperlink w:history="1" w:anchor="s_10_6">
         <w:r>
           <w:rPr>
             <w:rStyle w:val="Hyperlink"/>
             <w:sz w:val="19"/>
             <w:szCs w:val="19"/>
           </w:rPr>
-          <w:t xml:space="preserve">6.5</w:t>
+          <w:t xml:space="preserve">10.6</w:t>
         </w:r>
       </w:hyperlink>
     </w:p>
@@ -17042,7 +17360,7 @@
           <w:sz w:val="19"/>
           <w:szCs w:val="19"/>
         </w:rPr>
-        <w:t xml:space="preserve">Continue With the Rest</w:t>
+        <w:t xml:space="preserve">Continue button</w:t>
       </w:r>
       <w:r>
         <w:rPr>
@@ -17051,14 +17369,14 @@
         </w:rPr>
         <w:tab/>
       </w:r>
-      <w:hyperlink w:history="1" w:anchor="s_7_4">
+      <w:hyperlink w:history="1" w:anchor="s_5_1">
         <w:r>
           <w:rPr>
             <w:rStyle w:val="Hyperlink"/>
             <w:sz w:val="19"/>
             <w:szCs w:val="19"/>
           </w:rPr>
-          <w:t xml:space="preserve">7.4</w:t>
+          <w:t xml:space="preserve">5.1</w:t>
         </w:r>
       </w:hyperlink>
     </w:p>
@@ -17074,7 +17392,7 @@
           <w:sz w:val="19"/>
           <w:szCs w:val="19"/>
         </w:rPr>
-        <w:t xml:space="preserve">Crash recovery</w:t>
+        <w:t xml:space="preserve">Continue to Calibrate and Stack</w:t>
       </w:r>
       <w:r>
         <w:rPr>
@@ -17083,14 +17401,14 @@
         </w:rPr>
         <w:tab/>
       </w:r>
-      <w:hyperlink w:history="1" w:anchor="s_5_3">
+      <w:hyperlink w:history="1" w:anchor="s_6_5">
         <w:r>
           <w:rPr>
             <w:rStyle w:val="Hyperlink"/>
             <w:sz w:val="19"/>
             <w:szCs w:val="19"/>
           </w:rPr>
-          <w:t xml:space="preserve">5.3</w:t>
+          <w:t xml:space="preserve">6.5</w:t>
         </w:r>
       </w:hyperlink>
     </w:p>
@@ -17106,7 +17424,7 @@
           <w:sz w:val="19"/>
           <w:szCs w:val="19"/>
         </w:rPr>
-        <w:t xml:space="preserve">Credits</w:t>
+        <w:t xml:space="preserve">Continue With the Rest</w:t>
       </w:r>
       <w:r>
         <w:rPr>
@@ -17115,14 +17433,14 @@
         </w:rPr>
         <w:tab/>
       </w:r>
-      <w:hyperlink w:history="1" w:anchor="s_14_2">
+      <w:hyperlink w:history="1" w:anchor="s_7_4">
         <w:r>
           <w:rPr>
             <w:rStyle w:val="Hyperlink"/>
             <w:sz w:val="19"/>
             <w:szCs w:val="19"/>
           </w:rPr>
-          <w:t xml:space="preserve">14.2</w:t>
+          <w:t xml:space="preserve">7.4</w:t>
         </w:r>
       </w:hyperlink>
     </w:p>
@@ -17138,7 +17456,7 @@
           <w:sz w:val="19"/>
           <w:szCs w:val="19"/>
         </w:rPr>
-        <w:t xml:space="preserve">Crop</w:t>
+        <w:t xml:space="preserve">Crash recovery</w:t>
       </w:r>
       <w:r>
         <w:rPr>
@@ -17147,14 +17465,14 @@
         </w:rPr>
         <w:tab/>
       </w:r>
-      <w:hyperlink w:history="1" w:anchor="s_8_2">
+      <w:hyperlink w:history="1" w:anchor="s_5_3">
         <w:r>
           <w:rPr>
             <w:rStyle w:val="Hyperlink"/>
             <w:sz w:val="19"/>
             <w:szCs w:val="19"/>
           </w:rPr>
-          <w:t xml:space="preserve">8.2</w:t>
+          <w:t xml:space="preserve">5.3</w:t>
         </w:r>
       </w:hyperlink>
     </w:p>
@@ -17170,7 +17488,7 @@
           <w:sz w:val="19"/>
           <w:szCs w:val="19"/>
         </w:rPr>
-        <w:t xml:space="preserve">Curves</w:t>
+        <w:t xml:space="preserve">Credits</w:t>
       </w:r>
       <w:r>
         <w:rPr>
@@ -17179,13 +17497,77 @@
         </w:rPr>
         <w:tab/>
       </w:r>
-      <w:hyperlink w:history="1" w:anchor="s_9_3">
+      <w:hyperlink w:history="1" w:anchor="s_14_2">
         <w:r>
           <w:rPr>
             <w:rStyle w:val="Hyperlink"/>
             <w:sz w:val="19"/>
             <w:szCs w:val="19"/>
           </w:rPr>
+          <w:t xml:space="preserve">14.2</w:t>
+        </w:r>
+      </w:hyperlink>
+    </w:p>
+    <w:p>
+      <w:pPr>
+        <w:tabs>
+          <w:tab w:val="right" w:pos="4200" w:leader="dot"/>
+        </w:tabs>
+        <w:spacing w:after="10"/>
+      </w:pPr>
+      <w:r>
+        <w:rPr>
+          <w:sz w:val="19"/>
+          <w:szCs w:val="19"/>
+        </w:rPr>
+        <w:t xml:space="preserve">Crop</w:t>
+      </w:r>
+      <w:r>
+        <w:rPr>
+          <w:sz w:val="19"/>
+          <w:szCs w:val="19"/>
+        </w:rPr>
+        <w:tab/>
+      </w:r>
+      <w:hyperlink w:history="1" w:anchor="s_8_2">
+        <w:r>
+          <w:rPr>
+            <w:rStyle w:val="Hyperlink"/>
+            <w:sz w:val="19"/>
+            <w:szCs w:val="19"/>
+          </w:rPr>
+          <w:t xml:space="preserve">8.2</w:t>
+        </w:r>
+      </w:hyperlink>
+    </w:p>
+    <w:p>
+      <w:pPr>
+        <w:tabs>
+          <w:tab w:val="right" w:pos="4200" w:leader="dot"/>
+        </w:tabs>
+        <w:spacing w:after="10"/>
+      </w:pPr>
+      <w:r>
+        <w:rPr>
+          <w:sz w:val="19"/>
+          <w:szCs w:val="19"/>
+        </w:rPr>
+        <w:t xml:space="preserve">Curves</w:t>
+      </w:r>
+      <w:r>
+        <w:rPr>
+          <w:sz w:val="19"/>
+          <w:szCs w:val="19"/>
+        </w:rPr>
+        <w:tab/>
+      </w:r>
+      <w:hyperlink w:history="1" w:anchor="s_9_3">
+        <w:r>
+          <w:rPr>
+            <w:rStyle w:val="Hyperlink"/>
+            <w:sz w:val="19"/>
+            <w:szCs w:val="19"/>
+          </w:rPr>
           <w:t xml:space="preserve">9.3</w:t>
         </w:r>
       </w:hyperlink>
@@ -18291,7 +18673,7 @@
           <w:sz w:val="19"/>
           <w:szCs w:val="19"/>
         </w:rPr>
-        <w:t xml:space="preserve">Gatekeeper</w:t>
+        <w:t xml:space="preserve">Galaxy</w:t>
       </w:r>
       <w:r>
         <w:rPr>
@@ -18300,14 +18682,14 @@
         </w:rPr>
         <w:tab/>
       </w:r>
-      <w:hyperlink w:history="1" w:anchor="s_3_2">
+      <w:hyperlink w:history="1" w:anchor="s_10_7">
         <w:r>
           <w:rPr>
             <w:rStyle w:val="Hyperlink"/>
             <w:sz w:val="19"/>
             <w:szCs w:val="19"/>
           </w:rPr>
-          <w:t xml:space="preserve">3.2</w:t>
+          <w:t xml:space="preserve">10.7</w:t>
         </w:r>
       </w:hyperlink>
     </w:p>
@@ -18323,7 +18705,7 @@
           <w:sz w:val="19"/>
           <w:szCs w:val="19"/>
         </w:rPr>
-        <w:t xml:space="preserve">Glossary</w:t>
+        <w:t xml:space="preserve">Gatekeeper</w:t>
       </w:r>
       <w:r>
         <w:rPr>
@@ -18332,14 +18714,14 @@
         </w:rPr>
         <w:tab/>
       </w:r>
-      <w:hyperlink w:history="1" w:anchor="s_1_3">
+      <w:hyperlink w:history="1" w:anchor="s_3_2">
         <w:r>
           <w:rPr>
             <w:rStyle w:val="Hyperlink"/>
             <w:sz w:val="19"/>
             <w:szCs w:val="19"/>
           </w:rPr>
-          <w:t xml:space="preserve">1.3</w:t>
+          <w:t xml:space="preserve">3.2</w:t>
         </w:r>
       </w:hyperlink>
     </w:p>
@@ -18355,7 +18737,7 @@
           <w:sz w:val="19"/>
           <w:szCs w:val="19"/>
         </w:rPr>
-        <w:t xml:space="preserve">Go Back &amp; Redo This Step</w:t>
+        <w:t xml:space="preserve">Glossary</w:t>
       </w:r>
       <w:r>
         <w:rPr>
@@ -18364,14 +18746,14 @@
         </w:rPr>
         <w:tab/>
       </w:r>
-      <w:hyperlink w:history="1" w:anchor="s_8_7">
+      <w:hyperlink w:history="1" w:anchor="s_1_3">
         <w:r>
           <w:rPr>
             <w:rStyle w:val="Hyperlink"/>
             <w:sz w:val="19"/>
             <w:szCs w:val="19"/>
           </w:rPr>
-          <w:t xml:space="preserve">8.7</w:t>
+          <w:t xml:space="preserve">1.3</w:t>
         </w:r>
       </w:hyperlink>
     </w:p>
@@ -18387,7 +18769,7 @@
           <w:sz w:val="19"/>
           <w:szCs w:val="19"/>
         </w:rPr>
-        <w:t xml:space="preserve">Go Back to Here</w:t>
+        <w:t xml:space="preserve">Go Back &amp; Redo This Step</w:t>
       </w:r>
       <w:r>
         <w:rPr>
@@ -18396,14 +18778,14 @@
         </w:rPr>
         <w:tab/>
       </w:r>
-      <w:hyperlink w:history="1" w:anchor="s_9_2">
+      <w:hyperlink w:history="1" w:anchor="s_8_7">
         <w:r>
           <w:rPr>
             <w:rStyle w:val="Hyperlink"/>
             <w:sz w:val="19"/>
             <w:szCs w:val="19"/>
           </w:rPr>
-          <w:t xml:space="preserve">9.2</w:t>
+          <w:t xml:space="preserve">8.7</w:t>
         </w:r>
       </w:hyperlink>
     </w:p>
@@ -18419,7 +18801,7 @@
           <w:sz w:val="19"/>
           <w:szCs w:val="19"/>
         </w:rPr>
-        <w:t xml:space="preserve">Gradient removal</w:t>
+        <w:t xml:space="preserve">Go Back to Here</w:t>
       </w:r>
       <w:r>
         <w:rPr>
@@ -18428,14 +18810,14 @@
         </w:rPr>
         <w:tab/>
       </w:r>
-      <w:hyperlink w:history="1" w:anchor="s_8_4">
+      <w:hyperlink w:history="1" w:anchor="s_9_2">
         <w:r>
           <w:rPr>
             <w:rStyle w:val="Hyperlink"/>
             <w:sz w:val="19"/>
             <w:szCs w:val="19"/>
           </w:rPr>
-          <w:t xml:space="preserve">8.4</w:t>
+          <w:t xml:space="preserve">9.2</w:t>
         </w:r>
       </w:hyperlink>
     </w:p>
@@ -18451,7 +18833,7 @@
           <w:sz w:val="19"/>
           <w:szCs w:val="19"/>
         </w:rPr>
-        <w:t xml:space="preserve">Graphics card (GPU)</w:t>
+        <w:t xml:space="preserve">Gradient removal</w:t>
       </w:r>
       <w:r>
         <w:rPr>
@@ -18460,14 +18842,14 @@
         </w:rPr>
         <w:tab/>
       </w:r>
-      <w:hyperlink w:history="1" w:anchor="s_2_1">
+      <w:hyperlink w:history="1" w:anchor="s_8_4">
         <w:r>
           <w:rPr>
             <w:rStyle w:val="Hyperlink"/>
             <w:sz w:val="19"/>
             <w:szCs w:val="19"/>
           </w:rPr>
-          <w:t xml:space="preserve">2.1</w:t>
+          <w:t xml:space="preserve">8.4</w:t>
         </w:r>
       </w:hyperlink>
     </w:p>
@@ -18483,7 +18865,7 @@
           <w:sz w:val="19"/>
           <w:szCs w:val="19"/>
         </w:rPr>
-        <w:t xml:space="preserve">GraXpert</w:t>
+        <w:t xml:space="preserve">Graphics card (GPU)</w:t>
       </w:r>
       <w:r>
         <w:rPr>
@@ -18492,71 +18874,103 @@
         </w:rPr>
         <w:tab/>
       </w:r>
-      <w:hyperlink w:history="1" w:anchor="s_2_2">
+      <w:hyperlink w:history="1" w:anchor="s_2_1">
         <w:r>
           <w:rPr>
             <w:rStyle w:val="Hyperlink"/>
             <w:sz w:val="19"/>
             <w:szCs w:val="19"/>
           </w:rPr>
-          <w:t xml:space="preserve">2.2</w:t>
-        </w:r>
-      </w:hyperlink>
-      <w:r>
-        <w:t xml:space="preserve">, </w:t>
-      </w:r>
-      <w:hyperlink w:history="1" w:anchor="s_4_1">
+          <w:t xml:space="preserve">2.1</w:t>
+        </w:r>
+      </w:hyperlink>
+    </w:p>
+    <w:p>
+      <w:pPr>
+        <w:tabs>
+          <w:tab w:val="right" w:pos="4200" w:leader="dot"/>
+        </w:tabs>
+        <w:spacing w:after="10"/>
+      </w:pPr>
+      <w:r>
+        <w:rPr>
+          <w:sz w:val="19"/>
+          <w:szCs w:val="19"/>
+        </w:rPr>
+        <w:t xml:space="preserve">GraXpert</w:t>
+      </w:r>
+      <w:r>
+        <w:rPr>
+          <w:sz w:val="19"/>
+          <w:szCs w:val="19"/>
+        </w:rPr>
+        <w:tab/>
+      </w:r>
+      <w:hyperlink w:history="1" w:anchor="s_2_2">
         <w:r>
           <w:rPr>
             <w:rStyle w:val="Hyperlink"/>
             <w:sz w:val="19"/>
             <w:szCs w:val="19"/>
           </w:rPr>
-          <w:t xml:space="preserve">4.1</w:t>
+          <w:t xml:space="preserve">2.2</w:t>
         </w:r>
       </w:hyperlink>
       <w:r>
         <w:t xml:space="preserve">, </w:t>
       </w:r>
-      <w:hyperlink w:history="1" w:anchor="s_8_4">
+      <w:hyperlink w:history="1" w:anchor="s_4_1">
         <w:r>
           <w:rPr>
             <w:rStyle w:val="Hyperlink"/>
             <w:sz w:val="19"/>
             <w:szCs w:val="19"/>
           </w:rPr>
-          <w:t xml:space="preserve">8.4</w:t>
-        </w:r>
-      </w:hyperlink>
-    </w:p>
-    <w:p>
-      <w:pPr>
-        <w:tabs>
-          <w:tab w:val="right" w:pos="4200" w:leader="dot"/>
-        </w:tabs>
-        <w:spacing w:after="10"/>
-      </w:pPr>
-      <w:r>
-        <w:rPr>
-          <w:sz w:val="19"/>
-          <w:szCs w:val="19"/>
-        </w:rPr>
-        <w:t xml:space="preserve">Grey sky</w:t>
-      </w:r>
-      <w:r>
-        <w:rPr>
-          <w:sz w:val="19"/>
-          <w:szCs w:val="19"/>
-        </w:rPr>
-        <w:tab/>
-      </w:r>
-      <w:hyperlink w:history="1" w:anchor="s_9_6">
+          <w:t xml:space="preserve">4.1</w:t>
+        </w:r>
+      </w:hyperlink>
+      <w:r>
+        <w:t xml:space="preserve">, </w:t>
+      </w:r>
+      <w:hyperlink w:history="1" w:anchor="s_8_4">
         <w:r>
           <w:rPr>
             <w:rStyle w:val="Hyperlink"/>
             <w:sz w:val="19"/>
             <w:szCs w:val="19"/>
           </w:rPr>
+          <w:t xml:space="preserve">8.4</w:t>
+        </w:r>
+      </w:hyperlink>
+    </w:p>
+    <w:p>
+      <w:pPr>
+        <w:tabs>
+          <w:tab w:val="right" w:pos="4200" w:leader="dot"/>
+        </w:tabs>
+        <w:spacing w:after="10"/>
+      </w:pPr>
+      <w:r>
+        <w:rPr>
+          <w:sz w:val="19"/>
+          <w:szCs w:val="19"/>
+        </w:rPr>
+        <w:t xml:space="preserve">Grey sky</w:t>
+      </w:r>
+      <w:r>
+        <w:rPr>
+          <w:sz w:val="19"/>
+          <w:szCs w:val="19"/>
+        </w:rPr>
+        <w:tab/>
+      </w:r>
+      <w:hyperlink w:history="1" w:anchor="s_9_6">
+        <w:r>
+          <w:rPr>
+            <w:rStyle w:val="Hyperlink"/>
+            <w:sz w:val="19"/>
+            <w:szCs w:val="19"/>
+          </w:rPr>
           <w:t xml:space="preserve">9.6</w:t>
         </w:r>
       </w:hyperlink>
@@ -19770,7 +20184,7 @@
           <w:sz w:val="19"/>
           <w:szCs w:val="19"/>
         </w:rPr>
-        <w:t xml:space="preserve">Network drive (NAS)</w:t>
+        <w:t xml:space="preserve">Nebula</w:t>
       </w:r>
       <w:r>
         <w:rPr>
@@ -19779,14 +20193,14 @@
         </w:rPr>
         <w:tab/>
       </w:r>
-      <w:hyperlink w:history="1" w:anchor="s_6_1">
+      <w:hyperlink w:history="1" w:anchor="s_10_7">
         <w:r>
           <w:rPr>
             <w:rStyle w:val="Hyperlink"/>
             <w:sz w:val="19"/>
             <w:szCs w:val="19"/>
           </w:rPr>
-          <w:t xml:space="preserve">6.1</w:t>
+          <w:t xml:space="preserve">10.7</w:t>
         </w:r>
       </w:hyperlink>
     </w:p>
@@ -19802,7 +20216,7 @@
           <w:sz w:val="19"/>
           <w:szCs w:val="19"/>
         </w:rPr>
-        <w:t xml:space="preserve">New project</w:t>
+        <w:t xml:space="preserve">Network drive (NAS)</w:t>
       </w:r>
       <w:r>
         <w:rPr>
@@ -19811,14 +20225,14 @@
         </w:rPr>
         <w:tab/>
       </w:r>
-      <w:hyperlink w:history="1" w:anchor="s_9_8">
+      <w:hyperlink w:history="1" w:anchor="s_6_1">
         <w:r>
           <w:rPr>
             <w:rStyle w:val="Hyperlink"/>
             <w:sz w:val="19"/>
             <w:szCs w:val="19"/>
           </w:rPr>
-          <w:t xml:space="preserve">9.8</w:t>
+          <w:t xml:space="preserve">6.1</w:t>
         </w:r>
       </w:hyperlink>
     </w:p>
@@ -19834,7 +20248,7 @@
           <w:sz w:val="19"/>
           <w:szCs w:val="19"/>
         </w:rPr>
-        <w:t xml:space="preserve">Next target</w:t>
+        <w:t xml:space="preserve">New project</w:t>
       </w:r>
       <w:r>
         <w:rPr>
@@ -19866,7 +20280,7 @@
           <w:sz w:val="19"/>
           <w:szCs w:val="19"/>
         </w:rPr>
-        <w:t xml:space="preserve">No flats</w:t>
+        <w:t xml:space="preserve">Next target</w:t>
       </w:r>
       <w:r>
         <w:rPr>
@@ -19875,14 +20289,14 @@
         </w:rPr>
         <w:tab/>
       </w:r>
-      <w:hyperlink w:history="1" w:anchor="s_7_2">
+      <w:hyperlink w:history="1" w:anchor="s_9_8">
         <w:r>
           <w:rPr>
             <w:rStyle w:val="Hyperlink"/>
             <w:sz w:val="19"/>
             <w:szCs w:val="19"/>
           </w:rPr>
-          <w:t xml:space="preserve">7.2</w:t>
+          <w:t xml:space="preserve">9.8</w:t>
         </w:r>
       </w:hyperlink>
     </w:p>
@@ -19898,7 +20312,7 @@
           <w:sz w:val="19"/>
           <w:szCs w:val="19"/>
         </w:rPr>
-        <w:t xml:space="preserve">NoiseXTerminator</w:t>
+        <w:t xml:space="preserve">No flats</w:t>
       </w:r>
       <w:r>
         <w:rPr>
@@ -19907,26 +20321,58 @@
         </w:rPr>
         <w:tab/>
       </w:r>
-      <w:hyperlink w:history="1" w:anchor="s_2_2">
+      <w:hyperlink w:history="1" w:anchor="s_7_2">
         <w:r>
           <w:rPr>
             <w:rStyle w:val="Hyperlink"/>
             <w:sz w:val="19"/>
             <w:szCs w:val="19"/>
           </w:rPr>
-          <w:t xml:space="preserve">2.2</w:t>
-        </w:r>
-      </w:hyperlink>
-      <w:r>
-        <w:t xml:space="preserve">, </w:t>
-      </w:r>
-      <w:hyperlink w:history="1" w:anchor="s_8_5">
+          <w:t xml:space="preserve">7.2</w:t>
+        </w:r>
+      </w:hyperlink>
+    </w:p>
+    <w:p>
+      <w:pPr>
+        <w:tabs>
+          <w:tab w:val="right" w:pos="4200" w:leader="dot"/>
+        </w:tabs>
+        <w:spacing w:after="10"/>
+      </w:pPr>
+      <w:r>
+        <w:rPr>
+          <w:sz w:val="19"/>
+          <w:szCs w:val="19"/>
+        </w:rPr>
+        <w:t xml:space="preserve">NoiseXTerminator</w:t>
+      </w:r>
+      <w:r>
+        <w:rPr>
+          <w:sz w:val="19"/>
+          <w:szCs w:val="19"/>
+        </w:rPr>
+        <w:tab/>
+      </w:r>
+      <w:hyperlink w:history="1" w:anchor="s_2_2">
         <w:r>
           <w:rPr>
             <w:rStyle w:val="Hyperlink"/>
             <w:sz w:val="19"/>
             <w:szCs w:val="19"/>
           </w:rPr>
+          <w:t xml:space="preserve">2.2</w:t>
+        </w:r>
+      </w:hyperlink>
+      <w:r>
+        <w:t xml:space="preserve">, </w:t>
+      </w:r>
+      <w:hyperlink w:history="1" w:anchor="s_8_5">
+        <w:r>
+          <w:rPr>
+            <w:rStyle w:val="Hyperlink"/>
+            <w:sz w:val="19"/>
+            <w:szCs w:val="19"/>
+          </w:rPr>
           <w:t xml:space="preserve">8.5</w:t>
         </w:r>
       </w:hyperlink>
@@ -20327,7 +20773,7 @@
           <w:sz w:val="19"/>
           <w:szCs w:val="19"/>
         </w:rPr>
-        <w:t xml:space="preserve">Plate solve</w:t>
+        <w:t xml:space="preserve">Planetary nebula</w:t>
       </w:r>
       <w:r>
         <w:rPr>
@@ -20336,14 +20782,14 @@
         </w:rPr>
         <w:tab/>
       </w:r>
-      <w:hyperlink w:history="1" w:anchor="s_8_3">
+      <w:hyperlink w:history="1" w:anchor="s_10_7">
         <w:r>
           <w:rPr>
             <w:rStyle w:val="Hyperlink"/>
             <w:sz w:val="19"/>
             <w:szCs w:val="19"/>
           </w:rPr>
-          <w:t xml:space="preserve">8.3</w:t>
+          <w:t xml:space="preserve">10.7</w:t>
         </w:r>
       </w:hyperlink>
     </w:p>
@@ -20359,7 +20805,7 @@
           <w:sz w:val="19"/>
           <w:szCs w:val="19"/>
         </w:rPr>
-        <w:t xml:space="preserve">Plate solving</w:t>
+        <w:t xml:space="preserve">Plate solve</w:t>
       </w:r>
       <w:r>
         <w:rPr>
@@ -20368,14 +20814,14 @@
         </w:rPr>
         <w:tab/>
       </w:r>
-      <w:hyperlink w:history="1" w:anchor="s_1_3">
+      <w:hyperlink w:history="1" w:anchor="s_8_3">
         <w:r>
           <w:rPr>
             <w:rStyle w:val="Hyperlink"/>
             <w:sz w:val="19"/>
             <w:szCs w:val="19"/>
           </w:rPr>
-          <w:t xml:space="preserve">1.3</w:t>
+          <w:t xml:space="preserve">8.3</w:t>
         </w:r>
       </w:hyperlink>
     </w:p>
@@ -20391,7 +20837,7 @@
           <w:sz w:val="19"/>
           <w:szCs w:val="19"/>
         </w:rPr>
-        <w:t xml:space="preserve">Prepared folder</w:t>
+        <w:t xml:space="preserve">Plate solving</w:t>
       </w:r>
       <w:r>
         <w:rPr>
@@ -20400,14 +20846,14 @@
         </w:rPr>
         <w:tab/>
       </w:r>
-      <w:hyperlink w:history="1" w:anchor="s_13_1">
+      <w:hyperlink w:history="1" w:anchor="s_1_3">
         <w:r>
           <w:rPr>
             <w:rStyle w:val="Hyperlink"/>
             <w:sz w:val="19"/>
             <w:szCs w:val="19"/>
           </w:rPr>
-          <w:t xml:space="preserve">13.1</w:t>
+          <w:t xml:space="preserve">1.3</w:t>
         </w:r>
       </w:hyperlink>
     </w:p>
@@ -20423,7 +20869,7 @@
           <w:sz w:val="19"/>
           <w:szCs w:val="19"/>
         </w:rPr>
-        <w:t xml:space="preserve">Preview palette</w:t>
+        <w:t xml:space="preserve">Prepared folder</w:t>
       </w:r>
       <w:r>
         <w:rPr>
@@ -20432,14 +20878,14 @@
         </w:rPr>
         <w:tab/>
       </w:r>
-      <w:hyperlink w:history="1" w:anchor="s_8_6">
+      <w:hyperlink w:history="1" w:anchor="s_13_1">
         <w:r>
           <w:rPr>
             <w:rStyle w:val="Hyperlink"/>
             <w:sz w:val="19"/>
             <w:szCs w:val="19"/>
           </w:rPr>
-          <w:t xml:space="preserve">8.6</w:t>
+          <w:t xml:space="preserve">13.1</w:t>
         </w:r>
       </w:hyperlink>
     </w:p>
@@ -20455,7 +20901,7 @@
           <w:sz w:val="19"/>
           <w:szCs w:val="19"/>
         </w:rPr>
-        <w:t xml:space="preserve">Privacy</w:t>
+        <w:t xml:space="preserve">Preview palette</w:t>
       </w:r>
       <w:r>
         <w:rPr>
@@ -20464,14 +20910,14 @@
         </w:rPr>
         <w:tab/>
       </w:r>
-      <w:hyperlink w:history="1" w:anchor="s_14_1">
+      <w:hyperlink w:history="1" w:anchor="s_8_6">
         <w:r>
           <w:rPr>
             <w:rStyle w:val="Hyperlink"/>
             <w:sz w:val="19"/>
             <w:szCs w:val="19"/>
           </w:rPr>
-          <w:t xml:space="preserve">14.1</w:t>
+          <w:t xml:space="preserve">8.6</w:t>
         </w:r>
       </w:hyperlink>
     </w:p>
@@ -20487,7 +20933,7 @@
           <w:sz w:val="19"/>
           <w:szCs w:val="19"/>
         </w:rPr>
-        <w:t xml:space="preserve">Progress bar</w:t>
+        <w:t xml:space="preserve">Privacy</w:t>
       </w:r>
       <w:r>
         <w:rPr>
@@ -20496,14 +20942,14 @@
         </w:rPr>
         <w:tab/>
       </w:r>
-      <w:hyperlink w:history="1" w:anchor="s_5_2">
+      <w:hyperlink w:history="1" w:anchor="s_14_1">
         <w:r>
           <w:rPr>
             <w:rStyle w:val="Hyperlink"/>
             <w:sz w:val="19"/>
             <w:szCs w:val="19"/>
           </w:rPr>
-          <w:t xml:space="preserve">5.2</w:t>
+          <w:t xml:space="preserve">14.1</w:t>
         </w:r>
       </w:hyperlink>
     </w:p>
@@ -20519,7 +20965,7 @@
           <w:sz w:val="19"/>
           <w:szCs w:val="19"/>
         </w:rPr>
-        <w:t xml:space="preserve">Put Stars Back</w:t>
+        <w:t xml:space="preserve">Progress bar</w:t>
       </w:r>
       <w:r>
         <w:rPr>
@@ -20528,13 +20974,45 @@
         </w:rPr>
         <w:tab/>
       </w:r>
-      <w:hyperlink w:history="1" w:anchor="s_9_3">
+      <w:hyperlink w:history="1" w:anchor="s_5_2">
         <w:r>
           <w:rPr>
             <w:rStyle w:val="Hyperlink"/>
             <w:sz w:val="19"/>
             <w:szCs w:val="19"/>
           </w:rPr>
+          <w:t xml:space="preserve">5.2</w:t>
+        </w:r>
+      </w:hyperlink>
+    </w:p>
+    <w:p>
+      <w:pPr>
+        <w:tabs>
+          <w:tab w:val="right" w:pos="4200" w:leader="dot"/>
+        </w:tabs>
+        <w:spacing w:after="10"/>
+      </w:pPr>
+      <w:r>
+        <w:rPr>
+          <w:sz w:val="19"/>
+          <w:szCs w:val="19"/>
+        </w:rPr>
+        <w:t xml:space="preserve">Put Stars Back</w:t>
+      </w:r>
+      <w:r>
+        <w:rPr>
+          <w:sz w:val="19"/>
+          <w:szCs w:val="19"/>
+        </w:rPr>
+        <w:tab/>
+      </w:r>
+      <w:hyperlink w:history="1" w:anchor="s_9_3">
+        <w:r>
+          <w:rPr>
+            <w:rStyle w:val="Hyperlink"/>
+            <w:sz w:val="19"/>
+            <w:szCs w:val="19"/>
+          </w:rPr>
           <w:t xml:space="preserve">9.3</w:t>
         </w:r>
       </w:hyperlink>
@@ -22104,7 +22582,7 @@
           <w:sz w:val="19"/>
           <w:szCs w:val="19"/>
         </w:rPr>
-        <w:t xml:space="preserve">Star Colours</w:t>
+        <w:t xml:space="preserve">Star cluster</w:t>
       </w:r>
       <w:r>
         <w:rPr>
@@ -22113,14 +22591,14 @@
         </w:rPr>
         <w:tab/>
       </w:r>
-      <w:hyperlink w:history="1" w:anchor="s_9_3">
+      <w:hyperlink w:history="1" w:anchor="s_10_7">
         <w:r>
           <w:rPr>
             <w:rStyle w:val="Hyperlink"/>
             <w:sz w:val="19"/>
             <w:szCs w:val="19"/>
           </w:rPr>
-          <w:t xml:space="preserve">9.3</w:t>
+          <w:t xml:space="preserve">10.7</w:t>
         </w:r>
       </w:hyperlink>
     </w:p>
@@ -22136,7 +22614,7 @@
           <w:sz w:val="19"/>
           <w:szCs w:val="19"/>
         </w:rPr>
-        <w:t xml:space="preserve">Star count</w:t>
+        <w:t xml:space="preserve">Star Colours</w:t>
       </w:r>
       <w:r>
         <w:rPr>
@@ -22145,14 +22623,14 @@
         </w:rPr>
         <w:tab/>
       </w:r>
-      <w:hyperlink w:history="1" w:anchor="s_6_2">
+      <w:hyperlink w:history="1" w:anchor="s_9_3">
         <w:r>
           <w:rPr>
             <w:rStyle w:val="Hyperlink"/>
             <w:sz w:val="19"/>
             <w:szCs w:val="19"/>
           </w:rPr>
-          <w:t xml:space="preserve">6.2</w:t>
+          <w:t xml:space="preserve">9.3</w:t>
         </w:r>
       </w:hyperlink>
     </w:p>
@@ -22168,7 +22646,7 @@
           <w:sz w:val="19"/>
           <w:szCs w:val="19"/>
         </w:rPr>
-        <w:t xml:space="preserve">Star measurement</w:t>
+        <w:t xml:space="preserve">Star count</w:t>
       </w:r>
       <w:r>
         <w:rPr>
@@ -22177,14 +22655,14 @@
         </w:rPr>
         <w:tab/>
       </w:r>
-      <w:hyperlink w:history="1" w:anchor="s_4_4">
+      <w:hyperlink w:history="1" w:anchor="s_6_2">
         <w:r>
           <w:rPr>
             <w:rStyle w:val="Hyperlink"/>
             <w:sz w:val="19"/>
             <w:szCs w:val="19"/>
           </w:rPr>
-          <w:t xml:space="preserve">4.4</w:t>
+          <w:t xml:space="preserve">6.2</w:t>
         </w:r>
       </w:hyperlink>
     </w:p>
@@ -22200,7 +22678,7 @@
           <w:sz w:val="19"/>
           <w:szCs w:val="19"/>
         </w:rPr>
-        <w:t xml:space="preserve">Starless</w:t>
+        <w:t xml:space="preserve">Star measurement</w:t>
       </w:r>
       <w:r>
         <w:rPr>
@@ -22209,14 +22687,14 @@
         </w:rPr>
         <w:tab/>
       </w:r>
-      <w:hyperlink w:history="1" w:anchor="s_9_5">
+      <w:hyperlink w:history="1" w:anchor="s_4_4">
         <w:r>
           <w:rPr>
             <w:rStyle w:val="Hyperlink"/>
             <w:sz w:val="19"/>
             <w:szCs w:val="19"/>
           </w:rPr>
-          <w:t xml:space="preserve">9.5</w:t>
+          <w:t xml:space="preserve">4.4</w:t>
         </w:r>
       </w:hyperlink>
     </w:p>
@@ -22232,7 +22710,7 @@
           <w:sz w:val="19"/>
           <w:szCs w:val="19"/>
         </w:rPr>
-        <w:t xml:space="preserve">Stars workflow</w:t>
+        <w:t xml:space="preserve">Starless</w:t>
       </w:r>
       <w:r>
         <w:rPr>
@@ -22264,7 +22742,7 @@
           <w:sz w:val="19"/>
           <w:szCs w:val="19"/>
         </w:rPr>
-        <w:t xml:space="preserve">Start Fresh</w:t>
+        <w:t xml:space="preserve">Stars workflow</w:t>
       </w:r>
       <w:r>
         <w:rPr>
@@ -22273,14 +22751,14 @@
         </w:rPr>
         <w:tab/>
       </w:r>
-      <w:hyperlink w:history="1" w:anchor="s_8_7">
+      <w:hyperlink w:history="1" w:anchor="s_9_5">
         <w:r>
           <w:rPr>
             <w:rStyle w:val="Hyperlink"/>
             <w:sz w:val="19"/>
             <w:szCs w:val="19"/>
           </w:rPr>
-          <w:t xml:space="preserve">8.7</w:t>
+          <w:t xml:space="preserve">9.5</w:t>
         </w:r>
       </w:hyperlink>
     </w:p>
@@ -22296,7 +22774,7 @@
           <w:sz w:val="19"/>
           <w:szCs w:val="19"/>
         </w:rPr>
-        <w:t xml:space="preserve">StarXTerminator</w:t>
+        <w:t xml:space="preserve">Start Fresh</w:t>
       </w:r>
       <w:r>
         <w:rPr>
@@ -22305,59 +22783,59 @@
         </w:rPr>
         <w:tab/>
       </w:r>
-      <w:hyperlink w:history="1" w:anchor="s_2_2">
+      <w:hyperlink w:history="1" w:anchor="s_8_7">
         <w:r>
           <w:rPr>
             <w:rStyle w:val="Hyperlink"/>
             <w:sz w:val="19"/>
             <w:szCs w:val="19"/>
           </w:rPr>
-          <w:t xml:space="preserve">2.2</w:t>
-        </w:r>
-      </w:hyperlink>
-      <w:r>
-        <w:t xml:space="preserve">, </w:t>
-      </w:r>
-      <w:hyperlink w:history="1" w:anchor="s_8_5">
+          <w:t xml:space="preserve">8.7</w:t>
+        </w:r>
+      </w:hyperlink>
+    </w:p>
+    <w:p>
+      <w:pPr>
+        <w:tabs>
+          <w:tab w:val="right" w:pos="4200" w:leader="dot"/>
+        </w:tabs>
+        <w:spacing w:after="10"/>
+      </w:pPr>
+      <w:r>
+        <w:rPr>
+          <w:sz w:val="19"/>
+          <w:szCs w:val="19"/>
+        </w:rPr>
+        <w:t xml:space="preserve">StarXTerminator</w:t>
+      </w:r>
+      <w:r>
+        <w:rPr>
+          <w:sz w:val="19"/>
+          <w:szCs w:val="19"/>
+        </w:rPr>
+        <w:tab/>
+      </w:r>
+      <w:hyperlink w:history="1" w:anchor="s_2_2">
         <w:r>
           <w:rPr>
             <w:rStyle w:val="Hyperlink"/>
             <w:sz w:val="19"/>
             <w:szCs w:val="19"/>
           </w:rPr>
-          <w:t xml:space="preserve">8.5</w:t>
-        </w:r>
-      </w:hyperlink>
-    </w:p>
-    <w:p>
-      <w:pPr>
-        <w:tabs>
-          <w:tab w:val="right" w:pos="4200" w:leader="dot"/>
-        </w:tabs>
-        <w:spacing w:after="10"/>
-      </w:pPr>
-      <w:r>
-        <w:rPr>
-          <w:sz w:val="19"/>
-          <w:szCs w:val="19"/>
-        </w:rPr>
-        <w:t xml:space="preserve">Status bar</w:t>
-      </w:r>
-      <w:r>
-        <w:rPr>
-          <w:sz w:val="19"/>
-          <w:szCs w:val="19"/>
-        </w:rPr>
-        <w:tab/>
-      </w:r>
-      <w:hyperlink w:history="1" w:anchor="s_5_2">
+          <w:t xml:space="preserve">2.2</w:t>
+        </w:r>
+      </w:hyperlink>
+      <w:r>
+        <w:t xml:space="preserve">, </w:t>
+      </w:r>
+      <w:hyperlink w:history="1" w:anchor="s_8_5">
         <w:r>
           <w:rPr>
             <w:rStyle w:val="Hyperlink"/>
             <w:sz w:val="19"/>
             <w:szCs w:val="19"/>
           </w:rPr>
-          <w:t xml:space="preserve">5.2</w:t>
+          <w:t xml:space="preserve">8.5</w:t>
         </w:r>
       </w:hyperlink>
     </w:p>
@@ -22373,7 +22851,7 @@
           <w:sz w:val="19"/>
           <w:szCs w:val="19"/>
         </w:rPr>
-        <w:t xml:space="preserve">Step history</w:t>
+        <w:t xml:space="preserve">Status bar</w:t>
       </w:r>
       <w:r>
         <w:rPr>
@@ -22382,14 +22860,14 @@
         </w:rPr>
         <w:tab/>
       </w:r>
-      <w:hyperlink w:history="1" w:anchor="s_8_7">
+      <w:hyperlink w:history="1" w:anchor="s_5_2">
         <w:r>
           <w:rPr>
             <w:rStyle w:val="Hyperlink"/>
             <w:sz w:val="19"/>
             <w:szCs w:val="19"/>
           </w:rPr>
-          <w:t xml:space="preserve">8.7</w:t>
+          <w:t xml:space="preserve">5.2</w:t>
         </w:r>
       </w:hyperlink>
     </w:p>
@@ -22405,7 +22883,7 @@
           <w:sz w:val="19"/>
           <w:szCs w:val="19"/>
         </w:rPr>
-        <w:t xml:space="preserve">Stop Here – Continue in PixInsight</w:t>
+        <w:t xml:space="preserve">Step history</w:t>
       </w:r>
       <w:r>
         <w:rPr>
@@ -22414,14 +22892,14 @@
         </w:rPr>
         <w:tab/>
       </w:r>
-      <w:hyperlink w:history="1" w:anchor="s_5_4">
+      <w:hyperlink w:history="1" w:anchor="s_8_7">
         <w:r>
           <w:rPr>
             <w:rStyle w:val="Hyperlink"/>
             <w:sz w:val="19"/>
             <w:szCs w:val="19"/>
           </w:rPr>
-          <w:t xml:space="preserve">5.4</w:t>
+          <w:t xml:space="preserve">8.7</w:t>
         </w:r>
       </w:hyperlink>
     </w:p>
@@ -22437,7 +22915,7 @@
           <w:sz w:val="19"/>
           <w:szCs w:val="19"/>
         </w:rPr>
-        <w:t xml:space="preserve">Stretched</w:t>
+        <w:t xml:space="preserve">Stop Here – Continue in PixInsight</w:t>
       </w:r>
       <w:r>
         <w:rPr>
@@ -22446,14 +22924,14 @@
         </w:rPr>
         <w:tab/>
       </w:r>
-      <w:hyperlink w:history="1" w:anchor="s_1_3">
+      <w:hyperlink w:history="1" w:anchor="s_5_4">
         <w:r>
           <w:rPr>
             <w:rStyle w:val="Hyperlink"/>
             <w:sz w:val="19"/>
             <w:szCs w:val="19"/>
           </w:rPr>
-          <w:t xml:space="preserve">1.3</w:t>
+          <w:t xml:space="preserve">5.4</w:t>
         </w:r>
       </w:hyperlink>
     </w:p>
@@ -22469,7 +22947,7 @@
           <w:sz w:val="19"/>
           <w:szCs w:val="19"/>
         </w:rPr>
-        <w:t xml:space="preserve">Sub-frame</w:t>
+        <w:t xml:space="preserve">Stretched</w:t>
       </w:r>
       <w:r>
         <w:rPr>
@@ -22501,7 +22979,7 @@
           <w:sz w:val="19"/>
           <w:szCs w:val="19"/>
         </w:rPr>
-        <w:t xml:space="preserve">Support</w:t>
+        <w:t xml:space="preserve">Sub-frame</w:t>
       </w:r>
       <w:r>
         <w:rPr>
@@ -22510,14 +22988,14 @@
         </w:rPr>
         <w:tab/>
       </w:r>
-      <w:hyperlink w:history="1" w:anchor="s_11_2">
+      <w:hyperlink w:history="1" w:anchor="s_1_3">
         <w:r>
           <w:rPr>
             <w:rStyle w:val="Hyperlink"/>
             <w:sz w:val="19"/>
             <w:szCs w:val="19"/>
           </w:rPr>
-          <w:t xml:space="preserve">11.2</w:t>
+          <w:t xml:space="preserve">1.3</w:t>
         </w:r>
       </w:hyperlink>
     </w:p>
@@ -22533,7 +23011,7 @@
           <w:sz w:val="19"/>
           <w:szCs w:val="19"/>
         </w:rPr>
-        <w:t xml:space="preserve">Synthetic flat</w:t>
+        <w:t xml:space="preserve">Support</w:t>
       </w:r>
       <w:r>
         <w:rPr>
@@ -22542,14 +23020,14 @@
         </w:rPr>
         <w:tab/>
       </w:r>
-      <w:hyperlink w:history="1" w:anchor="s_9_4">
+      <w:hyperlink w:history="1" w:anchor="s_11_2">
         <w:r>
           <w:rPr>
             <w:rStyle w:val="Hyperlink"/>
             <w:sz w:val="19"/>
             <w:szCs w:val="19"/>
           </w:rPr>
-          <w:t xml:space="preserve">9.4</w:t>
+          <w:t xml:space="preserve">11.2</w:t>
         </w:r>
       </w:hyperlink>
     </w:p>
@@ -22565,7 +23043,7 @@
           <w:sz w:val="19"/>
           <w:szCs w:val="19"/>
         </w:rPr>
-        <w:t xml:space="preserve">System requirements</w:t>
+        <w:t xml:space="preserve">Synthetic flat</w:t>
       </w:r>
       <w:r>
         <w:rPr>
@@ -22574,13 +23052,45 @@
         </w:rPr>
         <w:tab/>
       </w:r>
-      <w:hyperlink w:history="1" w:anchor="s_2_1">
+      <w:hyperlink w:history="1" w:anchor="s_9_4">
         <w:r>
           <w:rPr>
             <w:rStyle w:val="Hyperlink"/>
             <w:sz w:val="19"/>
             <w:szCs w:val="19"/>
           </w:rPr>
+          <w:t xml:space="preserve">9.4</w:t>
+        </w:r>
+      </w:hyperlink>
+    </w:p>
+    <w:p>
+      <w:pPr>
+        <w:tabs>
+          <w:tab w:val="right" w:pos="4200" w:leader="dot"/>
+        </w:tabs>
+        <w:spacing w:after="10"/>
+      </w:pPr>
+      <w:r>
+        <w:rPr>
+          <w:sz w:val="19"/>
+          <w:szCs w:val="19"/>
+        </w:rPr>
+        <w:t xml:space="preserve">System requirements</w:t>
+      </w:r>
+      <w:r>
+        <w:rPr>
+          <w:sz w:val="19"/>
+          <w:szCs w:val="19"/>
+        </w:rPr>
+        <w:tab/>
+      </w:r>
+      <w:hyperlink w:history="1" w:anchor="s_2_1">
+        <w:r>
+          <w:rPr>
+            <w:rStyle w:val="Hyperlink"/>
+            <w:sz w:val="19"/>
+            <w:szCs w:val="19"/>
+          </w:rPr>
           <w:t xml:space="preserve">2.1</w:t>
         </w:r>
       </w:hyperlink>
@@ -22694,6 +23204,38 @@
             <w:szCs w:val="19"/>
           </w:rPr>
           <w:t xml:space="preserve">8.1</w:t>
+        </w:r>
+      </w:hyperlink>
+    </w:p>
+    <w:p>
+      <w:pPr>
+        <w:tabs>
+          <w:tab w:val="right" w:pos="4200" w:leader="dot"/>
+        </w:tabs>
+        <w:spacing w:after="10"/>
+      </w:pPr>
+      <w:r>
+        <w:rPr>
+          <w:sz w:val="19"/>
+          <w:szCs w:val="19"/>
+        </w:rPr>
+        <w:t xml:space="preserve">Target types</w:t>
+      </w:r>
+      <w:r>
+        <w:rPr>
+          <w:sz w:val="19"/>
+          <w:szCs w:val="19"/>
+        </w:rPr>
+        <w:tab/>
+      </w:r>
+      <w:hyperlink w:history="1" w:anchor="s_10_7">
+        <w:r>
+          <w:rPr>
+            <w:rStyle w:val="Hyperlink"/>
+            <w:sz w:val="19"/>
+            <w:szCs w:val="19"/>
+          </w:rPr>
+          <w:t xml:space="preserve">10.7</w:t>
         </w:r>
       </w:hyperlink>
     </w:p>

</xml_diff>

<commit_message>
v0.9.23: SkyFlats are checked; a poor one asks - proceed without flats, use anyway, or cancel
A SkyFlat that is grainy, built from too few frames, has a brightness range no vignetting
has, is largely filled in, or can't be made (dark/bias as bright as the sky) no longer
stops or silently spoils the run: stacking pauses and asks. Default: proceed without flats.

Co-Authored-By: Claude Opus 5.5 <noreply@anthropic.com>
Claude-Session: https://claude.ai/code/session_01FKvd69QsnCvM2zbzYnPwmF
</commit_message>
<xml_diff>
--- a/docs/SubZeroAstro_User_Manual.docx
+++ b/docs/SubZeroAstro_User_Manual.docx
@@ -121,7 +121,7 @@
           <w:sz w:val="22"/>
           <w:szCs w:val="22"/>
         </w:rPr>
-        <w:t xml:space="preserve">Version 0.9.22 beta  ·  Windows and Mac (Apple silicon)</w:t>
+        <w:t xml:space="preserve">Version 0.9.23 beta  ·  Windows and Mac (Apple silicon)</w:t>
       </w:r>
     </w:p>
     <w:p>
@@ -8030,7 +8030,54 @@
         <w:spacing w:after="120"/>
       </w:pPr>
       <w:r>
-        <w:t xml:space="preserve">A SkyFlat needs sky in the light frames. If the master dark or bias is as bright as the sky (a light leak, or the wrong exposure or gain), there is nothing left to make a flat from - SubZeroAstro then stops with a clear message instead of making a bad flat. Check the dark first (the calibration check on page 2 warns about it too).</w:t>
+        <w:rPr>
+          <w:b/>
+          <w:bCs/>
+        </w:rPr>
+        <w:t xml:space="preserve">Every SkyFlat is checked before it is used.</w:t>
+      </w:r>
+      <w:r>
+        <w:t xml:space="preserve"> If it may not be good enough - too few usable frames, grainy, a brightness range no vignetting has (nebulosity or a light-pollution gradient got in), large areas filled in - or it cannot be made at all because the master dark or bias is as bright as the sky (a light leak, or the wrong exposure or gain), SubZeroAstro stops and asks: </w:t>
+      </w:r>
+      <w:r>
+        <w:rPr>
+          <w:b/>
+          <w:bCs/>
+        </w:rPr>
+        <w:t xml:space="preserve">Proceed Without Flats</w:t>
+      </w:r>
+      <w:r>
+        <w:t xml:space="preserve"> (the default), </w:t>
+      </w:r>
+      <w:r>
+        <w:rPr>
+          <w:b/>
+          <w:bCs/>
+        </w:rPr>
+        <w:t xml:space="preserve">Use the SkyFlat Anyway</w:t>
+      </w:r>
+      <w:r>
+        <w:t xml:space="preserve">, or </w:t>
+      </w:r>
+      <w:r>
+        <w:rPr>
+          <w:b/>
+          <w:bCs/>
+        </w:rPr>
+        <w:t xml:space="preserve">Cancel Stacking</w:t>
+      </w:r>
+      <w:r>
+        <w:t xml:space="preserve">. The reasons are listed in the box and in the log. A poor flat adds blotches or rings instead of removing them; without flats you can still fix dust donuts afterwards with </w:t>
+      </w:r>
+      <w:r>
+        <w:rPr>
+          <w:i/>
+          <w:iCs/>
+        </w:rPr>
+        <w:t xml:space="preserve">Mote Buster – Fix Dust Donuts</w:t>
+      </w:r>
+      <w:r>
+        <w:t xml:space="preserve"> on Finishing Touches.</w:t>
       </w:r>
     </w:p>
     <w:p>

</xml_diff>

<commit_message>
v0.9.24: Build Calibration Masters (no lights needed)
Page 2 > Build Calibration Masters…: one folder of mixed bias / dark / flat / dark-flat
subframes is sorted by type (header, file or folder name), camera, exposure, gain, offset,
temperature and filter; each set becomes a master, is checked (light leak, dark far above
bias, bias at zero, clipped or dim flats) and saved to the calibration library. The rig
name comes from a '<scope>Calis' folder name. Manual 7.6.

Co-Authored-By: Claude Opus 5.5 <noreply@anthropic.com>
Claude-Session: https://claude.ai/code/session_01FKvd69QsnCvM2zbzYnPwmF
</commit_message>
<xml_diff>
--- a/docs/SubZeroAstro_User_Manual.docx
+++ b/docs/SubZeroAstro_User_Manual.docx
@@ -121,7 +121,7 @@
           <w:sz w:val="22"/>
           <w:szCs w:val="22"/>
         </w:rPr>
-        <w:t xml:space="preserve">Version 0.9.23 beta  ·  Windows and Mac (Apple silicon)</w:t>
+        <w:t xml:space="preserve">Version 0.9.24 beta  ·  Windows and Mac (Apple silicon)</w:t>
       </w:r>
     </w:p>
     <w:p>
@@ -858,6 +858,24 @@
         <w:tabs>
           <w:tab w:val="right" w:pos="9360" w:leader="dot"/>
         </w:tabs>
+        <w:spacing w:after="20" w:before="0"/>
+        <w:ind w:left="480"/>
+      </w:pPr>
+      <w:hyperlink w:history="1" w:anchor="s_7_6">
+        <w:r>
+          <w:rPr>
+            <w:b w:val="false"/>
+            <w:bCs w:val="false"/>
+          </w:rPr>
+          <w:t xml:space="preserve">7.6   Build Calibration Masters (no lights needed)</w:t>
+        </w:r>
+      </w:hyperlink>
+    </w:p>
+    <w:p>
+      <w:pPr>
+        <w:tabs>
+          <w:tab w:val="right" w:pos="9360" w:leader="dot"/>
+        </w:tabs>
         <w:spacing w:after="20" w:before="140"/>
         <w:ind w:left="0"/>
       </w:pPr>
@@ -879,7 +897,7 @@
           <w:b/>
           <w:bCs/>
         </w:rPr>
-        <w:t xml:space="preserve">20</w:t>
+        <w:t xml:space="preserve">21</w:t>
       </w:r>
     </w:p>
     <w:p>
@@ -1034,7 +1052,7 @@
           <w:b/>
           <w:bCs/>
         </w:rPr>
-        <w:t xml:space="preserve">24</w:t>
+        <w:t xml:space="preserve">25</w:t>
       </w:r>
     </w:p>
     <w:p>
@@ -1207,7 +1225,7 @@
           <w:b/>
           <w:bCs/>
         </w:rPr>
-        <w:t xml:space="preserve">29</w:t>
+        <w:t xml:space="preserve">30</w:t>
       </w:r>
     </w:p>
     <w:p>
@@ -1362,7 +1380,7 @@
           <w:b/>
           <w:bCs/>
         </w:rPr>
-        <w:t xml:space="preserve">31</w:t>
+        <w:t xml:space="preserve">32</w:t>
       </w:r>
     </w:p>
     <w:p>
@@ -1427,7 +1445,7 @@
           <w:b/>
           <w:bCs/>
         </w:rPr>
-        <w:t xml:space="preserve">33</w:t>
+        <w:t xml:space="preserve">34</w:t>
       </w:r>
     </w:p>
     <w:p>
@@ -1492,7 +1510,7 @@
           <w:b/>
           <w:bCs/>
         </w:rPr>
-        <w:t xml:space="preserve">34</w:t>
+        <w:t xml:space="preserve">35</w:t>
       </w:r>
     </w:p>
     <w:p>
@@ -1557,7 +1575,7 @@
           <w:b/>
           <w:bCs/>
         </w:rPr>
-        <w:t xml:space="preserve">35</w:t>
+        <w:t xml:space="preserve">36</w:t>
       </w:r>
     </w:p>
     <w:p>
@@ -1622,7 +1640,7 @@
           <w:b/>
           <w:bCs/>
         </w:rPr>
-        <w:t xml:space="preserve">36</w:t>
+        <w:t xml:space="preserve">37</w:t>
       </w:r>
     </w:p>
     <w:p>
@@ -8458,6 +8476,291 @@
     </w:p>
     <w:p>
       <w:pPr>
+        <w:pStyle w:val="Heading2"/>
+      </w:pPr>
+      <w:bookmarkStart w:name="s_7_6" w:id="1"/>
+      <w:r>
+        <w:t xml:space="preserve">7.6   Build Calibration Masters (no lights needed)</w:t>
+      </w:r>
+      <w:bookmarkEnd w:id="1"/>
+    </w:p>
+    <w:p>
+      <w:pPr>
+        <w:spacing w:after="120"/>
+      </w:pPr>
+      <w:r>
+        <w:t xml:space="preserve">Took a fresh set of darks, flats or bias? Turn them into masters right away: click </w:t>
+      </w:r>
+      <w:r>
+        <w:rPr>
+          <w:b/>
+          <w:bCs/>
+        </w:rPr>
+        <w:t xml:space="preserve">Build Calibration Masters…</w:t>
+      </w:r>
+      <w:r>
+        <w:t xml:space="preserve"> in the </w:t>
+      </w:r>
+      <w:r>
+        <w:rPr>
+          <w:i/>
+          <w:iCs/>
+        </w:rPr>
+        <w:t xml:space="preserve">Calibration frames</w:t>
+      </w:r>
+      <w:r>
+        <w:t xml:space="preserve"> box on page 2. Choose the folder with the subframes - bias, darks, flats and dark-flats can all be mixed together in one folder (for example </w:t>
+      </w:r>
+      <w:r>
+        <w:rPr>
+          <w:i/>
+          <w:iCs/>
+        </w:rPr>
+        <w:t xml:space="preserve">RedCat51Calis</w:t>
+      </w:r>
+      <w:r>
+        <w:t xml:space="preserve">), or sit in subfolders. SubZeroAstro reads each file's header (and, if the header doesn't say, the file or folder name: </w:t>
+      </w:r>
+      <w:r>
+        <w:rPr>
+          <w:i/>
+          <w:iCs/>
+        </w:rPr>
+        <w:t xml:space="preserve">Darks</w:t>
+      </w:r>
+      <w:r>
+        <w:t xml:space="preserve">, </w:t>
+      </w:r>
+      <w:r>
+        <w:rPr>
+          <w:i/>
+          <w:iCs/>
+        </w:rPr>
+        <w:t xml:space="preserve">Flats</w:t>
+      </w:r>
+      <w:r>
+        <w:t xml:space="preserve">, </w:t>
+      </w:r>
+      <w:r>
+        <w:rPr>
+          <w:i/>
+          <w:iCs/>
+        </w:rPr>
+        <w:t xml:space="preserve">Bias</w:t>
+      </w:r>
+      <w:r>
+        <w:t xml:space="preserve">…) and sorts them:</w:t>
+      </w:r>
+    </w:p>
+    <w:p>
+      <w:pPr>
+        <w:pStyle w:val="ListParagraph"/>
+        <w:numPr>
+          <w:ilvl w:val="0"/>
+          <w:numId w:val="2"/>
+        </w:numPr>
+        <w:spacing w:after="60"/>
+      </w:pPr>
+      <w:r>
+        <w:rPr>
+          <w:b/>
+          <w:bCs/>
+        </w:rPr>
+        <w:t xml:space="preserve">Bias</w:t>
+      </w:r>
+      <w:r>
+        <w:t xml:space="preserve"> - one master per gain and offset.</w:t>
+      </w:r>
+    </w:p>
+    <w:p>
+      <w:pPr>
+        <w:pStyle w:val="ListParagraph"/>
+        <w:numPr>
+          <w:ilvl w:val="0"/>
+          <w:numId w:val="2"/>
+        </w:numPr>
+        <w:spacing w:after="60"/>
+      </w:pPr>
+      <w:r>
+        <w:rPr>
+          <w:b/>
+          <w:bCs/>
+        </w:rPr>
+        <w:t xml:space="preserve">Darks</w:t>
+      </w:r>
+      <w:r>
+        <w:t xml:space="preserve"> - one master per exposure, gain, offset and temperature (180 s and 300 s darks make two master darks).</w:t>
+      </w:r>
+    </w:p>
+    <w:p>
+      <w:pPr>
+        <w:pStyle w:val="ListParagraph"/>
+        <w:numPr>
+          <w:ilvl w:val="0"/>
+          <w:numId w:val="2"/>
+        </w:numPr>
+        <w:spacing w:after="60"/>
+      </w:pPr>
+      <w:r>
+        <w:rPr>
+          <w:b/>
+          <w:bCs/>
+        </w:rPr>
+        <w:t xml:space="preserve">Flats</w:t>
+      </w:r>
+      <w:r>
+        <w:t xml:space="preserve"> - one master per filter (and night). Each flat is calibrated with dark-flats or short darks of the same exposure, or else a bias - from the same folder or already in your library.</w:t>
+      </w:r>
+    </w:p>
+    <w:p>
+      <w:pPr>
+        <w:pStyle w:val="ListParagraph"/>
+        <w:numPr>
+          <w:ilvl w:val="0"/>
+          <w:numId w:val="2"/>
+        </w:numPr>
+        <w:spacing w:after="60"/>
+      </w:pPr>
+      <w:r>
+        <w:rPr>
+          <w:b/>
+          <w:bCs/>
+        </w:rPr>
+        <w:t xml:space="preserve">Dark-flats</w:t>
+      </w:r>
+      <w:r>
+        <w:t xml:space="preserve"> - saved as masters too, for next time.</w:t>
+      </w:r>
+    </w:p>
+    <w:p>
+      <w:pPr>
+        <w:spacing w:after="120"/>
+      </w:pPr>
+      <w:r>
+        <w:t xml:space="preserve">The telescope (rig) name is taken from the folder name (</w:t>
+      </w:r>
+      <w:r>
+        <w:rPr>
+          <w:i/>
+          <w:iCs/>
+        </w:rPr>
+        <w:t xml:space="preserve">RedCat51Calis</w:t>
+      </w:r>
+      <w:r>
+        <w:t xml:space="preserve"> → </w:t>
+      </w:r>
+      <w:r>
+        <w:rPr>
+          <w:i/>
+          <w:iCs/>
+        </w:rPr>
+        <w:t xml:space="preserve">RedCat51</w:t>
+      </w:r>
+      <w:r>
+        <w:t xml:space="preserve">) or the headers - check it, because flats are only used for lights from the same rig. Untick any set you don't want, then click </w:t>
+      </w:r>
+      <w:r>
+        <w:rPr>
+          <w:b/>
+          <w:bCs/>
+        </w:rPr>
+        <w:t xml:space="preserve">Build Masters</w:t>
+      </w:r>
+      <w:r>
+        <w:t xml:space="preserve">. Each master is saved to your calibration library (</w:t>
+      </w:r>
+      <w:r>
+        <w:rPr>
+          <w:i/>
+          <w:iCs/>
+        </w:rPr>
+        <w:t xml:space="preserve">&lt;library&gt;/&lt;rig&gt;/Masters/&lt;camera&gt;/…</w:t>
+      </w:r>
+      <w:r>
+        <w:t xml:space="preserve">) with its settings in the name, and is used automatically whenever you stack lights with matching settings.</w:t>
+      </w:r>
+    </w:p>
+    <w:p>
+      <w:pPr>
+        <w:spacing w:after="120"/>
+      </w:pPr>
+      <w:r>
+        <w:t xml:space="preserve">Every master is checked as it is built. You are warned when a dark or bias is </w:t>
+      </w:r>
+      <w:r>
+        <w:rPr>
+          <w:b/>
+          <w:bCs/>
+        </w:rPr>
+        <w:t xml:space="preserve">uneven like a picture</w:t>
+      </w:r>
+      <w:r>
+        <w:t xml:space="preserve"> (light leaked in), a dark is </w:t>
+      </w:r>
+      <w:r>
+        <w:rPr>
+          <w:b/>
+          <w:bCs/>
+        </w:rPr>
+        <w:t xml:space="preserve">far brighter than the bias</w:t>
+      </w:r>
+      <w:r>
+        <w:t xml:space="preserve"> (light, or the camera not cooled), a bias is </w:t>
+      </w:r>
+      <w:r>
+        <w:rPr>
+          <w:b/>
+          <w:bCs/>
+        </w:rPr>
+        <w:t xml:space="preserve">practically zero</w:t>
+      </w:r>
+      <w:r>
+        <w:t xml:space="preserve"> (saved on a 0..1 scale or with a pedestal taken off), or flats are </w:t>
+      </w:r>
+      <w:r>
+        <w:rPr>
+          <w:b/>
+          <w:bCs/>
+        </w:rPr>
+        <w:t xml:space="preserve">over-exposed</w:t>
+      </w:r>
+      <w:r>
+        <w:t xml:space="preserve"> (clipped) or </w:t>
+      </w:r>
+      <w:r>
+        <w:rPr>
+          <w:b/>
+          <w:bCs/>
+        </w:rPr>
+        <w:t xml:space="preserve">very dim</w:t>
+      </w:r>
+      <w:r>
+        <w:t xml:space="preserve">. A warned master is still saved, so you can compare - but better to retake that set.</w:t>
+      </w:r>
+    </w:p>
+    <w:p>
+      <w:pPr>
+        <w:pBdr>
+          <w:left w:val="single" w:color="2F6FD6" w:sz="18" w:space="8"/>
+        </w:pBdr>
+        <w:shd w:fill="EAF1FB" w:color="auto" w:val="clear"/>
+        <w:spacing w:after="160" w:before="120"/>
+        <w:ind w:left="200" w:right="200"/>
+      </w:pPr>
+      <w:r>
+        <w:rPr>
+          <w:b/>
+          <w:bCs/>
+          <w:color w:val="2F6FD6"/>
+        </w:rPr>
+        <w:t xml:space="preserve">Taking good darks:  </w:t>
+      </w:r>
+      <w:r>
+        <w:t xml:space="preserve">Darks: cap the telescope (or take the camera off) and cover it, at night or in a dark room, with the filter wheel on a filter - not an empty slot. Match the lights' exposure, gain, offset and temperature.</w:t>
+      </w:r>
+    </w:p>
+    <w:p>
+      <w:pPr>
         <w:pStyle w:val="Heading1"/>
         <w:pageBreakBefore/>
       </w:pPr>
@@ -16997,6 +17300,38 @@
     </w:p>
     <w:p>
       <w:pPr>
+        <w:tabs>
+          <w:tab w:val="right" w:pos="4200" w:leader="dot"/>
+        </w:tabs>
+        <w:spacing w:after="10"/>
+      </w:pPr>
+      <w:r>
+        <w:rPr>
+          <w:sz w:val="19"/>
+          <w:szCs w:val="19"/>
+        </w:rPr>
+        <w:t xml:space="preserve">Build Calibration Masters</w:t>
+      </w:r>
+      <w:r>
+        <w:rPr>
+          <w:sz w:val="19"/>
+          <w:szCs w:val="19"/>
+        </w:rPr>
+        <w:tab/>
+      </w:r>
+      <w:hyperlink w:history="1" w:anchor="s_7_6">
+        <w:r>
+          <w:rPr>
+            <w:rStyle w:val="Hyperlink"/>
+            <w:sz w:val="19"/>
+            <w:szCs w:val="19"/>
+          </w:rPr>
+          <w:t xml:space="preserve">7.6</w:t>
+        </w:r>
+      </w:hyperlink>
+    </w:p>
+    <w:p>
+      <w:pPr>
         <w:keepNext/>
         <w:spacing w:after="40" w:before="160"/>
       </w:pPr>
@@ -17138,36 +17473,17 @@
           <w:t xml:space="preserve">4.3</w:t>
         </w:r>
       </w:hyperlink>
-    </w:p>
-    <w:p>
-      <w:pPr>
-        <w:tabs>
-          <w:tab w:val="right" w:pos="4200" w:leader="dot"/>
-        </w:tabs>
-        <w:spacing w:after="10"/>
-      </w:pPr>
-      <w:r>
-        <w:rPr>
-          <w:sz w:val="19"/>
-          <w:szCs w:val="19"/>
-        </w:rPr>
-        <w:t xml:space="preserve">Calibration masters folder</w:t>
-      </w:r>
-      <w:r>
-        <w:rPr>
-          <w:sz w:val="19"/>
-          <w:szCs w:val="19"/>
-        </w:rPr>
-        <w:tab/>
-      </w:r>
-      <w:hyperlink w:history="1" w:anchor="s_4_2">
+      <w:r>
+        <w:t xml:space="preserve">, </w:t>
+      </w:r>
+      <w:hyperlink w:history="1" w:anchor="s_7_6">
         <w:r>
           <w:rPr>
             <w:rStyle w:val="Hyperlink"/>
             <w:sz w:val="19"/>
             <w:szCs w:val="19"/>
           </w:rPr>
-          <w:t xml:space="preserve">4.2</w:t>
+          <w:t xml:space="preserve">7.6</w:t>
         </w:r>
       </w:hyperlink>
     </w:p>
@@ -17183,7 +17499,7 @@
           <w:sz w:val="19"/>
           <w:szCs w:val="19"/>
         </w:rPr>
-        <w:t xml:space="preserve">Cancel</w:t>
+        <w:t xml:space="preserve">Calibration masters folder</w:t>
       </w:r>
       <w:r>
         <w:rPr>
@@ -17192,14 +17508,14 @@
         </w:rPr>
         <w:tab/>
       </w:r>
-      <w:hyperlink w:history="1" w:anchor="s_9_1">
+      <w:hyperlink w:history="1" w:anchor="s_4_2">
         <w:r>
           <w:rPr>
             <w:rStyle w:val="Hyperlink"/>
             <w:sz w:val="19"/>
             <w:szCs w:val="19"/>
           </w:rPr>
-          <w:t xml:space="preserve">9.1</w:t>
+          <w:t xml:space="preserve">4.2</w:t>
         </w:r>
       </w:hyperlink>
     </w:p>
@@ -17215,7 +17531,7 @@
           <w:sz w:val="19"/>
           <w:szCs w:val="19"/>
         </w:rPr>
-        <w:t xml:space="preserve">Check &amp; Stack</w:t>
+        <w:t xml:space="preserve">Cancel</w:t>
       </w:r>
       <w:r>
         <w:rPr>
@@ -17224,14 +17540,14 @@
         </w:rPr>
         <w:tab/>
       </w:r>
-      <w:hyperlink w:history="1" w:anchor="s_7_4">
+      <w:hyperlink w:history="1" w:anchor="s_9_1">
         <w:r>
           <w:rPr>
             <w:rStyle w:val="Hyperlink"/>
             <w:sz w:val="19"/>
             <w:szCs w:val="19"/>
           </w:rPr>
-          <w:t xml:space="preserve">7.4</w:t>
+          <w:t xml:space="preserve">9.1</w:t>
         </w:r>
       </w:hyperlink>
     </w:p>
@@ -17247,7 +17563,7 @@
           <w:sz w:val="19"/>
           <w:szCs w:val="19"/>
         </w:rPr>
-        <w:t xml:space="preserve">Choose a Colour Palette</w:t>
+        <w:t xml:space="preserve">Check &amp; Stack</w:t>
       </w:r>
       <w:r>
         <w:rPr>
@@ -17256,14 +17572,14 @@
         </w:rPr>
         <w:tab/>
       </w:r>
-      <w:hyperlink w:history="1" w:anchor="s_9_3">
+      <w:hyperlink w:history="1" w:anchor="s_7_4">
         <w:r>
           <w:rPr>
             <w:rStyle w:val="Hyperlink"/>
             <w:sz w:val="19"/>
             <w:szCs w:val="19"/>
           </w:rPr>
-          <w:t xml:space="preserve">9.3</w:t>
+          <w:t xml:space="preserve">7.4</w:t>
         </w:r>
       </w:hyperlink>
     </w:p>
@@ -17279,7 +17595,7 @@
           <w:sz w:val="19"/>
           <w:szCs w:val="19"/>
         </w:rPr>
-        <w:t xml:space="preserve">Colour cameras</w:t>
+        <w:t xml:space="preserve">Choose a Colour Palette</w:t>
       </w:r>
       <w:r>
         <w:rPr>
@@ -17288,14 +17604,14 @@
         </w:rPr>
         <w:tab/>
       </w:r>
-      <w:hyperlink w:history="1" w:anchor="s_7_3">
+      <w:hyperlink w:history="1" w:anchor="s_9_3">
         <w:r>
           <w:rPr>
             <w:rStyle w:val="Hyperlink"/>
             <w:sz w:val="19"/>
             <w:szCs w:val="19"/>
           </w:rPr>
-          <w:t xml:space="preserve">7.3</w:t>
+          <w:t xml:space="preserve">9.3</w:t>
         </w:r>
       </w:hyperlink>
     </w:p>
@@ -17311,7 +17627,7 @@
           <w:sz w:val="19"/>
           <w:szCs w:val="19"/>
         </w:rPr>
-        <w:t xml:space="preserve">Combine Colour Channels</w:t>
+        <w:t xml:space="preserve">Colour cameras</w:t>
       </w:r>
       <w:r>
         <w:rPr>
@@ -17320,14 +17636,14 @@
         </w:rPr>
         <w:tab/>
       </w:r>
-      <w:hyperlink w:history="1" w:anchor="s_9_3">
+      <w:hyperlink w:history="1" w:anchor="s_7_3">
         <w:r>
           <w:rPr>
             <w:rStyle w:val="Hyperlink"/>
             <w:sz w:val="19"/>
             <w:szCs w:val="19"/>
           </w:rPr>
-          <w:t xml:space="preserve">9.3</w:t>
+          <w:t xml:space="preserve">7.3</w:t>
         </w:r>
       </w:hyperlink>
     </w:p>
@@ -17343,7 +17659,7 @@
           <w:sz w:val="19"/>
           <w:szCs w:val="19"/>
         </w:rPr>
-        <w:t xml:space="preserve">Comet stack</w:t>
+        <w:t xml:space="preserve">Combine Colour Channels</w:t>
       </w:r>
       <w:r>
         <w:rPr>
@@ -17352,14 +17668,14 @@
         </w:rPr>
         <w:tab/>
       </w:r>
-      <w:hyperlink w:history="1" w:anchor="s_10_6">
+      <w:hyperlink w:history="1" w:anchor="s_9_3">
         <w:r>
           <w:rPr>
             <w:rStyle w:val="Hyperlink"/>
             <w:sz w:val="19"/>
             <w:szCs w:val="19"/>
           </w:rPr>
-          <w:t xml:space="preserve">10.6</w:t>
+          <w:t xml:space="preserve">9.3</w:t>
         </w:r>
       </w:hyperlink>
     </w:p>
@@ -17375,7 +17691,7 @@
           <w:sz w:val="19"/>
           <w:szCs w:val="19"/>
         </w:rPr>
-        <w:t xml:space="preserve">Comets</w:t>
+        <w:t xml:space="preserve">Comet stack</w:t>
       </w:r>
       <w:r>
         <w:rPr>
@@ -17407,7 +17723,7 @@
           <w:sz w:val="19"/>
           <w:szCs w:val="19"/>
         </w:rPr>
-        <w:t xml:space="preserve">Continue button</w:t>
+        <w:t xml:space="preserve">Comets</w:t>
       </w:r>
       <w:r>
         <w:rPr>
@@ -17416,14 +17732,14 @@
         </w:rPr>
         <w:tab/>
       </w:r>
-      <w:hyperlink w:history="1" w:anchor="s_5_1">
+      <w:hyperlink w:history="1" w:anchor="s_10_6">
         <w:r>
           <w:rPr>
             <w:rStyle w:val="Hyperlink"/>
             <w:sz w:val="19"/>
             <w:szCs w:val="19"/>
           </w:rPr>
-          <w:t xml:space="preserve">5.1</w:t>
+          <w:t xml:space="preserve">10.6</w:t>
         </w:r>
       </w:hyperlink>
     </w:p>
@@ -17439,7 +17755,7 @@
           <w:sz w:val="19"/>
           <w:szCs w:val="19"/>
         </w:rPr>
-        <w:t xml:space="preserve">Continue to Calibrate and Stack</w:t>
+        <w:t xml:space="preserve">Continue button</w:t>
       </w:r>
       <w:r>
         <w:rPr>
@@ -17448,14 +17764,14 @@
         </w:rPr>
         <w:tab/>
       </w:r>
-      <w:hyperlink w:history="1" w:anchor="s_6_5">
+      <w:hyperlink w:history="1" w:anchor="s_5_1">
         <w:r>
           <w:rPr>
             <w:rStyle w:val="Hyperlink"/>
             <w:sz w:val="19"/>
             <w:szCs w:val="19"/>
           </w:rPr>
-          <w:t xml:space="preserve">6.5</w:t>
+          <w:t xml:space="preserve">5.1</w:t>
         </w:r>
       </w:hyperlink>
     </w:p>
@@ -17471,7 +17787,7 @@
           <w:sz w:val="19"/>
           <w:szCs w:val="19"/>
         </w:rPr>
-        <w:t xml:space="preserve">Continue With the Rest</w:t>
+        <w:t xml:space="preserve">Continue to Calibrate and Stack</w:t>
       </w:r>
       <w:r>
         <w:rPr>
@@ -17480,14 +17796,14 @@
         </w:rPr>
         <w:tab/>
       </w:r>
-      <w:hyperlink w:history="1" w:anchor="s_7_4">
+      <w:hyperlink w:history="1" w:anchor="s_6_5">
         <w:r>
           <w:rPr>
             <w:rStyle w:val="Hyperlink"/>
             <w:sz w:val="19"/>
             <w:szCs w:val="19"/>
           </w:rPr>
-          <w:t xml:space="preserve">7.4</w:t>
+          <w:t xml:space="preserve">6.5</w:t>
         </w:r>
       </w:hyperlink>
     </w:p>
@@ -17503,7 +17819,7 @@
           <w:sz w:val="19"/>
           <w:szCs w:val="19"/>
         </w:rPr>
-        <w:t xml:space="preserve">Crash recovery</w:t>
+        <w:t xml:space="preserve">Continue With the Rest</w:t>
       </w:r>
       <w:r>
         <w:rPr>
@@ -17512,14 +17828,14 @@
         </w:rPr>
         <w:tab/>
       </w:r>
-      <w:hyperlink w:history="1" w:anchor="s_5_3">
+      <w:hyperlink w:history="1" w:anchor="s_7_4">
         <w:r>
           <w:rPr>
             <w:rStyle w:val="Hyperlink"/>
             <w:sz w:val="19"/>
             <w:szCs w:val="19"/>
           </w:rPr>
-          <w:t xml:space="preserve">5.3</w:t>
+          <w:t xml:space="preserve">7.4</w:t>
         </w:r>
       </w:hyperlink>
     </w:p>
@@ -17535,7 +17851,7 @@
           <w:sz w:val="19"/>
           <w:szCs w:val="19"/>
         </w:rPr>
-        <w:t xml:space="preserve">Credits</w:t>
+        <w:t xml:space="preserve">Crash recovery</w:t>
       </w:r>
       <w:r>
         <w:rPr>
@@ -17544,14 +17860,14 @@
         </w:rPr>
         <w:tab/>
       </w:r>
-      <w:hyperlink w:history="1" w:anchor="s_14_2">
+      <w:hyperlink w:history="1" w:anchor="s_5_3">
         <w:r>
           <w:rPr>
             <w:rStyle w:val="Hyperlink"/>
             <w:sz w:val="19"/>
             <w:szCs w:val="19"/>
           </w:rPr>
-          <w:t xml:space="preserve">14.2</w:t>
+          <w:t xml:space="preserve">5.3</w:t>
         </w:r>
       </w:hyperlink>
     </w:p>
@@ -17567,7 +17883,7 @@
           <w:sz w:val="19"/>
           <w:szCs w:val="19"/>
         </w:rPr>
-        <w:t xml:space="preserve">Crop</w:t>
+        <w:t xml:space="preserve">Credits</w:t>
       </w:r>
       <w:r>
         <w:rPr>
@@ -17576,14 +17892,14 @@
         </w:rPr>
         <w:tab/>
       </w:r>
-      <w:hyperlink w:history="1" w:anchor="s_8_2">
+      <w:hyperlink w:history="1" w:anchor="s_14_2">
         <w:r>
           <w:rPr>
             <w:rStyle w:val="Hyperlink"/>
             <w:sz w:val="19"/>
             <w:szCs w:val="19"/>
           </w:rPr>
-          <w:t xml:space="preserve">8.2</w:t>
+          <w:t xml:space="preserve">14.2</w:t>
         </w:r>
       </w:hyperlink>
     </w:p>
@@ -17599,7 +17915,7 @@
           <w:sz w:val="19"/>
           <w:szCs w:val="19"/>
         </w:rPr>
-        <w:t xml:space="preserve">Curves</w:t>
+        <w:t xml:space="preserve">Crop</w:t>
       </w:r>
       <w:r>
         <w:rPr>
@@ -17608,13 +17924,45 @@
         </w:rPr>
         <w:tab/>
       </w:r>
-      <w:hyperlink w:history="1" w:anchor="s_9_3">
+      <w:hyperlink w:history="1" w:anchor="s_8_2">
         <w:r>
           <w:rPr>
             <w:rStyle w:val="Hyperlink"/>
             <w:sz w:val="19"/>
             <w:szCs w:val="19"/>
           </w:rPr>
+          <w:t xml:space="preserve">8.2</w:t>
+        </w:r>
+      </w:hyperlink>
+    </w:p>
+    <w:p>
+      <w:pPr>
+        <w:tabs>
+          <w:tab w:val="right" w:pos="4200" w:leader="dot"/>
+        </w:tabs>
+        <w:spacing w:after="10"/>
+      </w:pPr>
+      <w:r>
+        <w:rPr>
+          <w:sz w:val="19"/>
+          <w:szCs w:val="19"/>
+        </w:rPr>
+        <w:t xml:space="preserve">Curves</w:t>
+      </w:r>
+      <w:r>
+        <w:rPr>
+          <w:sz w:val="19"/>
+          <w:szCs w:val="19"/>
+        </w:rPr>
+        <w:tab/>
+      </w:r>
+      <w:hyperlink w:history="1" w:anchor="s_9_3">
+        <w:r>
+          <w:rPr>
+            <w:rStyle w:val="Hyperlink"/>
+            <w:sz w:val="19"/>
+            <w:szCs w:val="19"/>
+          </w:rPr>
           <w:t xml:space="preserve">9.3</w:t>
         </w:r>
       </w:hyperlink>
@@ -17666,81 +18014,62 @@
           <w:t xml:space="preserve">4.3</w:t>
         </w:r>
       </w:hyperlink>
-    </w:p>
-    <w:p>
-      <w:pPr>
-        <w:tabs>
-          <w:tab w:val="right" w:pos="4200" w:leader="dot"/>
-        </w:tabs>
-        <w:spacing w:after="10"/>
-      </w:pPr>
-      <w:r>
-        <w:rPr>
-          <w:sz w:val="19"/>
-          <w:szCs w:val="19"/>
-        </w:rPr>
-        <w:t xml:space="preserve">Darken the Sky Background</w:t>
-      </w:r>
-      <w:r>
-        <w:rPr>
-          <w:sz w:val="19"/>
-          <w:szCs w:val="19"/>
-        </w:rPr>
-        <w:tab/>
-      </w:r>
-      <w:hyperlink w:history="1" w:anchor="s_9_3">
+      <w:r>
+        <w:t xml:space="preserve">, </w:t>
+      </w:r>
+      <w:hyperlink w:history="1" w:anchor="s_7_6">
         <w:r>
           <w:rPr>
             <w:rStyle w:val="Hyperlink"/>
             <w:sz w:val="19"/>
             <w:szCs w:val="19"/>
           </w:rPr>
-          <w:t xml:space="preserve">9.3</w:t>
-        </w:r>
-      </w:hyperlink>
-      <w:r>
-        <w:t xml:space="preserve">, </w:t>
-      </w:r>
-      <w:hyperlink w:history="1" w:anchor="s_9_6">
+          <w:t xml:space="preserve">7.6</w:t>
+        </w:r>
+      </w:hyperlink>
+    </w:p>
+    <w:p>
+      <w:pPr>
+        <w:tabs>
+          <w:tab w:val="right" w:pos="4200" w:leader="dot"/>
+        </w:tabs>
+        <w:spacing w:after="10"/>
+      </w:pPr>
+      <w:r>
+        <w:rPr>
+          <w:sz w:val="19"/>
+          <w:szCs w:val="19"/>
+        </w:rPr>
+        <w:t xml:space="preserve">Darken the Sky Background</w:t>
+      </w:r>
+      <w:r>
+        <w:rPr>
+          <w:sz w:val="19"/>
+          <w:szCs w:val="19"/>
+        </w:rPr>
+        <w:tab/>
+      </w:r>
+      <w:hyperlink w:history="1" w:anchor="s_9_3">
         <w:r>
           <w:rPr>
             <w:rStyle w:val="Hyperlink"/>
             <w:sz w:val="19"/>
             <w:szCs w:val="19"/>
           </w:rPr>
-          <w:t xml:space="preserve">9.6</w:t>
-        </w:r>
-      </w:hyperlink>
-    </w:p>
-    <w:p>
-      <w:pPr>
-        <w:tabs>
-          <w:tab w:val="right" w:pos="4200" w:leader="dot"/>
-        </w:tabs>
-        <w:spacing w:after="10"/>
-      </w:pPr>
-      <w:r>
-        <w:rPr>
-          <w:sz w:val="19"/>
-          <w:szCs w:val="19"/>
-        </w:rPr>
-        <w:t xml:space="preserve">Darks</w:t>
-      </w:r>
-      <w:r>
-        <w:rPr>
-          <w:sz w:val="19"/>
-          <w:szCs w:val="19"/>
-        </w:rPr>
-        <w:tab/>
-      </w:r>
-      <w:hyperlink w:history="1" w:anchor="s_4_3">
+          <w:t xml:space="preserve">9.3</w:t>
+        </w:r>
+      </w:hyperlink>
+      <w:r>
+        <w:t xml:space="preserve">, </w:t>
+      </w:r>
+      <w:hyperlink w:history="1" w:anchor="s_9_6">
         <w:r>
           <w:rPr>
             <w:rStyle w:val="Hyperlink"/>
             <w:sz w:val="19"/>
             <w:szCs w:val="19"/>
           </w:rPr>
-          <w:t xml:space="preserve">4.3</w:t>
+          <w:t xml:space="preserve">9.6</w:t>
         </w:r>
       </w:hyperlink>
     </w:p>
@@ -17756,7 +18085,7 @@
           <w:sz w:val="19"/>
           <w:szCs w:val="19"/>
         </w:rPr>
-        <w:t xml:space="preserve">Device (GPU)</w:t>
+        <w:t xml:space="preserve">Darks</w:t>
       </w:r>
       <w:r>
         <w:rPr>
@@ -17765,14 +18094,14 @@
         </w:rPr>
         <w:tab/>
       </w:r>
-      <w:hyperlink w:history="1" w:anchor="s_4_1">
+      <w:hyperlink w:history="1" w:anchor="s_4_3">
         <w:r>
           <w:rPr>
             <w:rStyle w:val="Hyperlink"/>
             <w:sz w:val="19"/>
             <w:szCs w:val="19"/>
           </w:rPr>
-          <w:t xml:space="preserve">4.1</w:t>
+          <w:t xml:space="preserve">4.3</w:t>
         </w:r>
       </w:hyperlink>
     </w:p>
@@ -17788,7 +18117,7 @@
           <w:sz w:val="19"/>
           <w:szCs w:val="19"/>
         </w:rPr>
-        <w:t xml:space="preserve">Disk space</w:t>
+        <w:t xml:space="preserve">Device (GPU)</w:t>
       </w:r>
       <w:r>
         <w:rPr>
@@ -17797,14 +18126,14 @@
         </w:rPr>
         <w:tab/>
       </w:r>
-      <w:hyperlink w:history="1" w:anchor="s_2_1">
+      <w:hyperlink w:history="1" w:anchor="s_4_1">
         <w:r>
           <w:rPr>
             <w:rStyle w:val="Hyperlink"/>
             <w:sz w:val="19"/>
             <w:szCs w:val="19"/>
           </w:rPr>
-          <w:t xml:space="preserve">2.1</w:t>
+          <w:t xml:space="preserve">4.1</w:t>
         </w:r>
       </w:hyperlink>
     </w:p>
@@ -17820,7 +18149,7 @@
           <w:sz w:val="19"/>
           <w:szCs w:val="19"/>
         </w:rPr>
-        <w:t xml:space="preserve">Do It</w:t>
+        <w:t xml:space="preserve">Disk space</w:t>
       </w:r>
       <w:r>
         <w:rPr>
@@ -17829,14 +18158,14 @@
         </w:rPr>
         <w:tab/>
       </w:r>
-      <w:hyperlink w:history="1" w:anchor="s_9_1">
+      <w:hyperlink w:history="1" w:anchor="s_2_1">
         <w:r>
           <w:rPr>
             <w:rStyle w:val="Hyperlink"/>
             <w:sz w:val="19"/>
             <w:szCs w:val="19"/>
           </w:rPr>
-          <w:t xml:space="preserve">9.1</w:t>
+          <w:t xml:space="preserve">2.1</w:t>
         </w:r>
       </w:hyperlink>
     </w:p>
@@ -17852,7 +18181,7 @@
           <w:sz w:val="19"/>
           <w:szCs w:val="19"/>
         </w:rPr>
-        <w:t xml:space="preserve">Dual-band filter</w:t>
+        <w:t xml:space="preserve">Do It</w:t>
       </w:r>
       <w:r>
         <w:rPr>
@@ -17861,14 +18190,14 @@
         </w:rPr>
         <w:tab/>
       </w:r>
-      <w:hyperlink w:history="1" w:anchor="s_1_3">
+      <w:hyperlink w:history="1" w:anchor="s_9_1">
         <w:r>
           <w:rPr>
             <w:rStyle w:val="Hyperlink"/>
             <w:sz w:val="19"/>
             <w:szCs w:val="19"/>
           </w:rPr>
-          <w:t xml:space="preserve">1.3</w:t>
+          <w:t xml:space="preserve">9.1</w:t>
         </w:r>
       </w:hyperlink>
     </w:p>
@@ -17884,7 +18213,7 @@
           <w:sz w:val="19"/>
           <w:szCs w:val="19"/>
         </w:rPr>
-        <w:t xml:space="preserve">Dual-band recipe</w:t>
+        <w:t xml:space="preserve">Dual-band filter</w:t>
       </w:r>
       <w:r>
         <w:rPr>
@@ -17893,14 +18222,14 @@
         </w:rPr>
         <w:tab/>
       </w:r>
-      <w:hyperlink w:history="1" w:anchor="s_10_2">
+      <w:hyperlink w:history="1" w:anchor="s_1_3">
         <w:r>
           <w:rPr>
             <w:rStyle w:val="Hyperlink"/>
             <w:sz w:val="19"/>
             <w:szCs w:val="19"/>
           </w:rPr>
-          <w:t xml:space="preserve">10.2</w:t>
+          <w:t xml:space="preserve">1.3</w:t>
         </w:r>
       </w:hyperlink>
     </w:p>
@@ -17916,7 +18245,7 @@
           <w:sz w:val="19"/>
           <w:szCs w:val="19"/>
         </w:rPr>
-        <w:t xml:space="preserve">Dust donuts</w:t>
+        <w:t xml:space="preserve">Dual-band recipe</w:t>
       </w:r>
       <w:r>
         <w:rPr>
@@ -17925,14 +18254,14 @@
         </w:rPr>
         <w:tab/>
       </w:r>
-      <w:hyperlink w:history="1" w:anchor="s_9_4">
+      <w:hyperlink w:history="1" w:anchor="s_10_2">
         <w:r>
           <w:rPr>
             <w:rStyle w:val="Hyperlink"/>
             <w:sz w:val="19"/>
             <w:szCs w:val="19"/>
           </w:rPr>
-          <w:t xml:space="preserve">9.4</w:t>
+          <w:t xml:space="preserve">10.2</w:t>
         </w:r>
       </w:hyperlink>
     </w:p>
@@ -17948,7 +18277,7 @@
           <w:sz w:val="19"/>
           <w:szCs w:val="19"/>
         </w:rPr>
-        <w:t xml:space="preserve">Dust motes</w:t>
+        <w:t xml:space="preserve">Dust donuts</w:t>
       </w:r>
       <w:r>
         <w:rPr>
@@ -17980,7 +18309,7 @@
           <w:sz w:val="19"/>
           <w:szCs w:val="19"/>
         </w:rPr>
-        <w:t xml:space="preserve">DWARF</w:t>
+        <w:t xml:space="preserve">Dust motes</w:t>
       </w:r>
       <w:r>
         <w:rPr>
@@ -17989,13 +18318,45 @@
         </w:rPr>
         <w:tab/>
       </w:r>
-      <w:hyperlink w:history="1" w:anchor="s_10_5">
+      <w:hyperlink w:history="1" w:anchor="s_9_4">
         <w:r>
           <w:rPr>
             <w:rStyle w:val="Hyperlink"/>
             <w:sz w:val="19"/>
             <w:szCs w:val="19"/>
           </w:rPr>
+          <w:t xml:space="preserve">9.4</w:t>
+        </w:r>
+      </w:hyperlink>
+    </w:p>
+    <w:p>
+      <w:pPr>
+        <w:tabs>
+          <w:tab w:val="right" w:pos="4200" w:leader="dot"/>
+        </w:tabs>
+        <w:spacing w:after="10"/>
+      </w:pPr>
+      <w:r>
+        <w:rPr>
+          <w:sz w:val="19"/>
+          <w:szCs w:val="19"/>
+        </w:rPr>
+        <w:t xml:space="preserve">DWARF</w:t>
+      </w:r>
+      <w:r>
+        <w:rPr>
+          <w:sz w:val="19"/>
+          <w:szCs w:val="19"/>
+        </w:rPr>
+        <w:tab/>
+      </w:r>
+      <w:hyperlink w:history="1" w:anchor="s_10_5">
+        <w:r>
+          <w:rPr>
+            <w:rStyle w:val="Hyperlink"/>
+            <w:sz w:val="19"/>
+            <w:szCs w:val="19"/>
+          </w:rPr>
           <w:t xml:space="preserve">10.5</w:t>
         </w:r>
       </w:hyperlink>
@@ -19931,6 +20292,102 @@
             <w:szCs w:val="19"/>
           </w:rPr>
           <w:t xml:space="preserve">1.3</w:t>
+        </w:r>
+      </w:hyperlink>
+    </w:p>
+    <w:p>
+      <w:pPr>
+        <w:tabs>
+          <w:tab w:val="right" w:pos="4200" w:leader="dot"/>
+        </w:tabs>
+        <w:spacing w:after="10"/>
+      </w:pPr>
+      <w:r>
+        <w:rPr>
+          <w:sz w:val="19"/>
+          <w:szCs w:val="19"/>
+        </w:rPr>
+        <w:t xml:space="preserve">Master bias</w:t>
+      </w:r>
+      <w:r>
+        <w:rPr>
+          <w:sz w:val="19"/>
+          <w:szCs w:val="19"/>
+        </w:rPr>
+        <w:tab/>
+      </w:r>
+      <w:hyperlink w:history="1" w:anchor="s_7_6">
+        <w:r>
+          <w:rPr>
+            <w:rStyle w:val="Hyperlink"/>
+            <w:sz w:val="19"/>
+            <w:szCs w:val="19"/>
+          </w:rPr>
+          <w:t xml:space="preserve">7.6</w:t>
+        </w:r>
+      </w:hyperlink>
+    </w:p>
+    <w:p>
+      <w:pPr>
+        <w:tabs>
+          <w:tab w:val="right" w:pos="4200" w:leader="dot"/>
+        </w:tabs>
+        <w:spacing w:after="10"/>
+      </w:pPr>
+      <w:r>
+        <w:rPr>
+          <w:sz w:val="19"/>
+          <w:szCs w:val="19"/>
+        </w:rPr>
+        <w:t xml:space="preserve">Master dark</w:t>
+      </w:r>
+      <w:r>
+        <w:rPr>
+          <w:sz w:val="19"/>
+          <w:szCs w:val="19"/>
+        </w:rPr>
+        <w:tab/>
+      </w:r>
+      <w:hyperlink w:history="1" w:anchor="s_7_6">
+        <w:r>
+          <w:rPr>
+            <w:rStyle w:val="Hyperlink"/>
+            <w:sz w:val="19"/>
+            <w:szCs w:val="19"/>
+          </w:rPr>
+          <w:t xml:space="preserve">7.6</w:t>
+        </w:r>
+      </w:hyperlink>
+    </w:p>
+    <w:p>
+      <w:pPr>
+        <w:tabs>
+          <w:tab w:val="right" w:pos="4200" w:leader="dot"/>
+        </w:tabs>
+        <w:spacing w:after="10"/>
+      </w:pPr>
+      <w:r>
+        <w:rPr>
+          <w:sz w:val="19"/>
+          <w:szCs w:val="19"/>
+        </w:rPr>
+        <w:t xml:space="preserve">Master flat</w:t>
+      </w:r>
+      <w:r>
+        <w:rPr>
+          <w:sz w:val="19"/>
+          <w:szCs w:val="19"/>
+        </w:rPr>
+        <w:tab/>
+      </w:r>
+      <w:hyperlink w:history="1" w:anchor="s_7_6">
+        <w:r>
+          <w:rPr>
+            <w:rStyle w:val="Hyperlink"/>
+            <w:sz w:val="19"/>
+            <w:szCs w:val="19"/>
+          </w:rPr>
+          <w:t xml:space="preserve">7.6</w:t>
         </w:r>
       </w:hyperlink>
     </w:p>

</xml_diff>

<commit_message>
v0.9.25: Build Calibration Masters from page 1 (Stack menu), no lights needed
Page 2 only opens with light frames, so the builder is now also in page 1's Stack menu,
and the 'load lights first' message offers it.

Co-Authored-By: Claude Opus 5.5 <noreply@anthropic.com>
Claude-Session: https://claude.ai/code/session_01FKvd69QsnCvM2zbzYnPwmF
</commit_message>
<xml_diff>
--- a/docs/SubZeroAstro_User_Manual.docx
+++ b/docs/SubZeroAstro_User_Manual.docx
@@ -121,7 +121,7 @@
           <w:sz w:val="22"/>
           <w:szCs w:val="22"/>
         </w:rPr>
-        <w:t xml:space="preserve">Version 0.9.24 beta  ·  Windows and Mac (Apple silicon)</w:t>
+        <w:t xml:space="preserve">Version 0.9.25 beta  ·  Windows and Mac (Apple silicon)</w:t>
       </w:r>
     </w:p>
     <w:p>
@@ -8489,7 +8489,27 @@
         <w:spacing w:after="120"/>
       </w:pPr>
       <w:r>
-        <w:t xml:space="preserve">Took a fresh set of darks, flats or bias? Turn them into masters right away: click </w:t>
+        <w:t xml:space="preserve">Took a fresh set of darks, flats or bias? Turn them into masters right away - </w:t>
+      </w:r>
+      <w:r>
+        <w:rPr>
+          <w:b/>
+          <w:bCs/>
+        </w:rPr>
+        <w:t xml:space="preserve">no light frames needed</w:t>
+      </w:r>
+      <w:r>
+        <w:t xml:space="preserve">: on page 1 choose </w:t>
+      </w:r>
+      <w:r>
+        <w:rPr>
+          <w:b/>
+          <w:bCs/>
+        </w:rPr>
+        <w:t xml:space="preserve">Stack › Build Calibration Masters…</w:t>
+      </w:r>
+      <w:r>
+        <w:t xml:space="preserve"> (or click </w:t>
       </w:r>
       <w:r>
         <w:rPr>
@@ -8509,7 +8529,7 @@
         <w:t xml:space="preserve">Calibration frames</w:t>
       </w:r>
       <w:r>
-        <w:t xml:space="preserve"> box on page 2. Choose the folder with the subframes - bias, darks, flats and dark-flats can all be mixed together in one folder (for example </w:t>
+        <w:t xml:space="preserve"> box on page 2). Choose the folder with the subframes - bias, darks, flats and dark-flats can all be mixed together in one folder (for example </w:t>
       </w:r>
       <w:r>
         <w:rPr>

</xml_diff>

<commit_message>
v0.9.26: 'Load Data' is now 'Load Light Frame Data'
So calibration frames aren't loaded there by mistake; the tooltip and manual point to
Stack > Build Calibration Masters for bias, darks and flats.

Co-Authored-By: Claude Opus 5.5 <noreply@anthropic.com>
Claude-Session: https://claude.ai/code/session_01FKvd69QsnCvM2zbzYnPwmF
</commit_message>
<xml_diff>
--- a/docs/SubZeroAstro_User_Manual.docx
+++ b/docs/SubZeroAstro_User_Manual.docx
@@ -121,7 +121,7 @@
           <w:sz w:val="22"/>
           <w:szCs w:val="22"/>
         </w:rPr>
-        <w:t xml:space="preserve">Version 0.9.25 beta  ·  Windows and Mac (Apple silicon)</w:t>
+        <w:t xml:space="preserve">Version 0.9.26 beta  ·  Windows and Mac (Apple silicon)</w:t>
       </w:r>
     </w:p>
     <w:p>
@@ -6407,7 +6407,7 @@
           <w:b/>
           <w:bCs/>
         </w:rPr>
-        <w:t xml:space="preserve">Load Data</w:t>
+        <w:t xml:space="preserve">Load Light Frame Data</w:t>
       </w:r>
       <w:r>
         <w:t xml:space="preserve"> (Ctrl+O), then </w:t>
@@ -6560,7 +6560,7 @@
           <wp:inline distT="0" distB="0" distL="0" distR="0">
             <wp:extent cx="4572000" cy="2647950"/>
             <wp:effectExtent t="0" r="0" b="0" l="0"/>
-            <wp:docPr id="1" name="7_load_data_window.png" descr="The Load Data window" title="The Load Data window"/>
+            <wp:docPr id="1" name="7_load_data_window.png" descr="The Load Light Frame Data window" title="The Load Light Frame Data window"/>
             <wp:cNvGraphicFramePr>
               <a:graphicFrameLocks xmlns:a="http://schemas.openxmlformats.org/drawingml/2006/main" noChangeAspect="1"/>
             </wp:cNvGraphicFramePr>
@@ -6609,7 +6609,48 @@
           <w:sz w:val="18"/>
           <w:szCs w:val="18"/>
         </w:rPr>
-        <w:t xml:space="preserve">The Load Data window</w:t>
+        <w:t xml:space="preserve">The Load Light Frame Data window</w:t>
+      </w:r>
+    </w:p>
+    <w:p>
+      <w:pPr>
+        <w:pBdr>
+          <w:left w:val="single" w:color="2F6FD6" w:sz="18" w:space="8"/>
+        </w:pBdr>
+        <w:shd w:fill="EAF1FB" w:color="auto" w:val="clear"/>
+        <w:spacing w:after="160" w:before="120"/>
+        <w:ind w:left="200" w:right="200"/>
+      </w:pPr>
+      <w:r>
+        <w:rPr>
+          <w:b/>
+          <w:bCs/>
+          <w:color w:val="2F6FD6"/>
+        </w:rPr>
+        <w:t xml:space="preserve">Calibration frames?:  </w:t>
+      </w:r>
+      <w:r>
+        <w:t xml:space="preserve">Load Light Frame Data is for </w:t>
+      </w:r>
+      <w:r>
+        <w:rPr>
+          <w:b/>
+          <w:bCs/>
+        </w:rPr>
+        <w:t xml:space="preserve">light frames only</w:t>
+      </w:r>
+      <w:r>
+        <w:t xml:space="preserve">. To turn bias, darks and flats into masters, use </w:t>
+      </w:r>
+      <w:r>
+        <w:rPr>
+          <w:b/>
+          <w:bCs/>
+        </w:rPr>
+        <w:t xml:space="preserve">Stack › Build Calibration Masters…</w:t>
+      </w:r>
+      <w:r>
+        <w:t xml:space="preserve"> instead (7.6) - no light frames needed.</w:t>
       </w:r>
     </w:p>
     <w:p>
@@ -12657,7 +12698,7 @@
           <w:b/>
           <w:bCs/>
         </w:rPr>
-        <w:t xml:space="preserve">Load Data</w:t>
+        <w:t xml:space="preserve">Load Light Frame Data</w:t>
       </w:r>
       <w:r>
         <w:t xml:space="preserve"> window open, ready for the next target's light frames: cull, stack, process and finish, from the beginning.</w:t>
@@ -14933,7 +14974,7 @@
           </w:tcPr>
           <w:p>
             <w:r>
-              <w:t xml:space="preserve">Load Data</w:t>
+              <w:t xml:space="preserve">Load Light Frame Data</w:t>
             </w:r>
           </w:p>
         </w:tc>
@@ -20151,7 +20192,7 @@
           <w:sz w:val="19"/>
           <w:szCs w:val="19"/>
         </w:rPr>
-        <w:t xml:space="preserve">Load Data</w:t>
+        <w:t xml:space="preserve">Load Light Frame Data</w:t>
       </w:r>
       <w:r>
         <w:rPr>

</xml_diff>

<commit_message>
v0.9.27: open filling the screen (maximised, not full screen)
On a Mac full screen hides the menu bar; the app now opens maximised - menu bar and Dock
stay - and remembers if you made it smaller. Manual tip for Mac window size.

Co-Authored-By: Claude Opus 5.5 <noreply@anthropic.com>
Claude-Session: https://claude.ai/code/session_01FKvd69QsnCvM2zbzYnPwmF
</commit_message>
<xml_diff>
--- a/docs/SubZeroAstro_User_Manual.docx
+++ b/docs/SubZeroAstro_User_Manual.docx
@@ -121,7 +121,7 @@
           <w:sz w:val="22"/>
           <w:szCs w:val="22"/>
         </w:rPr>
-        <w:t xml:space="preserve">Version 0.9.26 beta  ·  Windows and Mac (Apple silicon)</w:t>
+        <w:t xml:space="preserve">Version 0.9.27 beta  ·  Windows and Mac (Apple silicon)</w:t>
       </w:r>
     </w:p>
     <w:p>
@@ -4488,6 +4488,57 @@
       </w:r>
       <w:r>
         <w:t xml:space="preserve">Both messages appear because SubZeroAstro is not yet signed by Microsoft or notarized by Apple. Signing is being set up for future versions.</w:t>
+      </w:r>
+    </w:p>
+    <w:p>
+      <w:pPr>
+        <w:pBdr>
+          <w:left w:val="single" w:color="2F6FD6" w:sz="18" w:space="8"/>
+        </w:pBdr>
+        <w:shd w:fill="EAF1FB" w:color="auto" w:val="clear"/>
+        <w:spacing w:after="160" w:before="120"/>
+        <w:ind w:left="200" w:right="200"/>
+      </w:pPr>
+      <w:r>
+        <w:rPr>
+          <w:b/>
+          <w:bCs/>
+          <w:color w:val="2F6FD6"/>
+        </w:rPr>
+        <w:t xml:space="preserve">Mac: window size:  </w:t>
+      </w:r>
+      <w:r>
+        <w:t xml:space="preserve">SubZeroAstro opens filling the screen, with the menu bar and Dock still showing. Avoid the green button's full-screen mode on a Mac: it hides the menu bar (where </w:t>
+      </w:r>
+      <w:r>
+        <w:rPr>
+          <w:b/>
+          <w:bCs/>
+        </w:rPr>
+        <w:t xml:space="preserve">Stack › Build Calibration Masters…</w:t>
+      </w:r>
+      <w:r>
+        <w:t xml:space="preserve"> and </w:t>
+      </w:r>
+      <w:r>
+        <w:rPr>
+          <w:b/>
+          <w:bCs/>
+        </w:rPr>
+        <w:t xml:space="preserve">Help</w:t>
+      </w:r>
+      <w:r>
+        <w:t xml:space="preserve"> live). To fill the screen yourself, </w:t>
+      </w:r>
+      <w:r>
+        <w:rPr>
+          <w:b/>
+          <w:bCs/>
+        </w:rPr>
+        <w:t xml:space="preserve">Option-click</w:t>
+      </w:r>
+      <w:r>
+        <w:t xml:space="preserve"> the green button, or double-click the window's title bar. If you make the window smaller, it opens at that size next time.</w:t>
       </w:r>
     </w:p>
     <w:p>

</xml_diff>

<commit_message>
v0.9.28: XISF light frames on page 1; every XISF compression
- Load Light Frame Data finds and measures .xisf lights (16-bit or 0..1 float) exactly like FITS
- XISF reader handles zlib, LZ4, LZ4-HC and Zstandard (+ byte shuffling); a built-in LZ4 decoder
  is the fallback; lz4 and zstandard added to the requirements
- write_xisf can write UInt16 and compressed files (used by the tests)

Suggested by an astrophotographer trying the app.

Co-Authored-By: Claude Opus 5.5 <noreply@anthropic.com>
Claude-Session: https://claude.ai/code/session_01FKvd69QsnCvM2zbzYnPwmF
</commit_message>
<xml_diff>
--- a/docs/SubZeroAstro_User_Manual.docx
+++ b/docs/SubZeroAstro_User_Manual.docx
@@ -121,7 +121,7 @@
           <w:sz w:val="22"/>
           <w:szCs w:val="22"/>
         </w:rPr>
-        <w:t xml:space="preserve">Version 0.9.27 beta  ·  Windows and Mac (Apple silicon)</w:t>
+        <w:t xml:space="preserve">Version 0.9.28 beta  ·  Windows and Mac (Apple silicon)</w:t>
       </w:r>
     </w:p>
     <w:p>
@@ -4056,7 +4056,18 @@
         <w:t xml:space="preserve">XISF</w:t>
       </w:r>
       <w:r>
-        <w:t xml:space="preserve"> files, from capture programs such as N.I.N.A., ASIAIR, SharpCap and smart telescopes (ZWO Seestar, DWARF, Vaonis Vespera, Stellina, eVscope).</w:t>
+        <w:t xml:space="preserve"> (</w:t>
+      </w:r>
+      <w:r>
+        <w:rPr>
+          <w:rFonts w:ascii="Consolas" w:cs="Consolas" w:eastAsia="Consolas" w:hAnsi="Consolas"/>
+          <w:sz w:val="19"/>
+          <w:szCs w:val="19"/>
+        </w:rPr>
+        <w:t xml:space="preserve">.xisf</w:t>
+      </w:r>
+      <w:r>
+        <w:t xml:space="preserve">) files on every page - light frames, calibration frames and masters - from capture programs such as N.I.N.A., ASIAIR, SharpCap and smart telescopes (ZWO Seestar, DWARF, Vaonis Vespera, Stellina, eVscope). XISF files can be uncompressed or compressed with any of PixInsight's options (zlib, LZ4, LZ4-HC, Zstandard, with or without byte shuffling).</w:t>
       </w:r>
     </w:p>
     <w:p>

</xml_diff>

<commit_message>
v0.9.29: HOO for SHO sets, Flip the Picture, target line + drag-to-place signature, target description
- Combine Colour Channels offers plain HOO when Ha, OIII and SII are all there
- Flip the Picture (optional, before Final Crop): mirror, flip upside down, turn 180°
- Sign Your Picture: a Target name line above the signature (filled in, e.g. NGC 281 "Pacman Nebula",
  remembered per target); drag the dashed box (or click) to place it anywhere
- Save the Picture: optional <target>_about.txt with the opening of the Wikipedia article,
  shown and editable first, source credited

Co-Authored-By: Claude Opus 5.5 <noreply@anthropic.com>
Claude-Session: https://claude.ai/code/session_01FKvd69QsnCvM2zbzYnPwmF
</commit_message>
<xml_diff>
--- a/docs/SubZeroAstro_User_Manual.docx
+++ b/docs/SubZeroAstro_User_Manual.docx
@@ -121,7 +121,7 @@
           <w:sz w:val="22"/>
           <w:szCs w:val="22"/>
         </w:rPr>
-        <w:t xml:space="preserve">Version 0.9.28 beta  ·  Windows and Mac (Apple silicon)</w:t>
+        <w:t xml:space="preserve">Version 0.9.29 beta  ·  Windows and Mac (Apple silicon)</w:t>
       </w:r>
     </w:p>
     <w:p>
@@ -11805,7 +11805,7 @@
           </w:tcPr>
           <w:p>
             <w:r>
-              <w:t xml:space="preserve">Final Crop ◇</w:t>
+              <w:t xml:space="preserve">Flip the Picture ◇</w:t>
             </w:r>
           </w:p>
         </w:tc>
@@ -11827,7 +11827,7 @@
           </w:tcPr>
           <w:p>
             <w:r>
-              <w:t xml:space="preserve">A last clean-up crop; finds ragged or off-colour edges for you</w:t>
+              <w:t xml:space="preserve">Mirror left ↔ right, flip upside down or turn 180° - the saved pictures are flipped too</w:t>
             </w:r>
           </w:p>
         </w:tc>
@@ -11849,7 +11849,7 @@
           </w:tcPr>
           <w:p>
             <w:r>
-              <w:t xml:space="preserve">DynamicCrop</w:t>
+              <w:t xml:space="preserve">FastRotation</w:t>
             </w:r>
           </w:p>
         </w:tc>
@@ -11876,7 +11876,7 @@
           </w:tcPr>
           <w:p>
             <w:r>
-              <w:t xml:space="preserve">Spot Fix ◇</w:t>
+              <w:t xml:space="preserve">Final Crop ◇</w:t>
             </w:r>
           </w:p>
         </w:tc>
@@ -11898,7 +11898,7 @@
           </w:tcPr>
           <w:p>
             <w:r>
-              <w:t xml:space="preserve">Click dust donuts, satellite remnants or hot pixels to patch them</w:t>
+              <w:t xml:space="preserve">A last clean-up crop; finds ragged or off-colour edges for you</w:t>
             </w:r>
           </w:p>
         </w:tc>
@@ -11920,7 +11920,7 @@
           </w:tcPr>
           <w:p>
             <w:r>
-              <w:t xml:space="preserve">CloneStamp</w:t>
+              <w:t xml:space="preserve">DynamicCrop</w:t>
             </w:r>
           </w:p>
         </w:tc>
@@ -11947,6 +11947,77 @@
           </w:tcPr>
           <w:p>
             <w:r>
+              <w:t xml:space="preserve">Spot Fix ◇</w:t>
+            </w:r>
+          </w:p>
+        </w:tc>
+        <w:tc>
+          <w:tcPr>
+            <w:tcW w:type="dxa" w:w="4460"/>
+            <w:tcBorders>
+              <w:top w:val="single" w:color="BFBFBF" w:sz="4"/>
+              <w:left w:val="single" w:color="BFBFBF" w:sz="4"/>
+              <w:bottom w:val="single" w:color="BFBFBF" w:sz="4"/>
+              <w:right w:val="single" w:color="BFBFBF" w:sz="4"/>
+            </w:tcBorders>
+            <w:tcMar>
+              <w:top w:type="dxa" w:w="60"/>
+              <w:left w:type="dxa" w:w="100"/>
+              <w:bottom w:type="dxa" w:w="60"/>
+              <w:right w:type="dxa" w:w="100"/>
+            </w:tcMar>
+          </w:tcPr>
+          <w:p>
+            <w:r>
+              <w:t xml:space="preserve">Click dust donuts, satellite remnants or hot pixels to patch them</w:t>
+            </w:r>
+          </w:p>
+        </w:tc>
+        <w:tc>
+          <w:tcPr>
+            <w:tcW w:type="dxa" w:w="2400"/>
+            <w:tcBorders>
+              <w:top w:val="single" w:color="BFBFBF" w:sz="4"/>
+              <w:left w:val="single" w:color="BFBFBF" w:sz="4"/>
+              <w:bottom w:val="single" w:color="BFBFBF" w:sz="4"/>
+              <w:right w:val="single" w:color="BFBFBF" w:sz="4"/>
+            </w:tcBorders>
+            <w:tcMar>
+              <w:top w:type="dxa" w:w="60"/>
+              <w:left w:type="dxa" w:w="100"/>
+              <w:bottom w:type="dxa" w:w="60"/>
+              <w:right w:type="dxa" w:w="100"/>
+            </w:tcMar>
+          </w:tcPr>
+          <w:p>
+            <w:r>
+              <w:t xml:space="preserve">CloneStamp</w:t>
+            </w:r>
+          </w:p>
+        </w:tc>
+      </w:tr>
+      <w:tr>
+        <w:trPr>
+          <w:cantSplit/>
+        </w:trPr>
+        <w:tc>
+          <w:tcPr>
+            <w:tcW w:type="dxa" w:w="2500"/>
+            <w:tcBorders>
+              <w:top w:val="single" w:color="BFBFBF" w:sz="4"/>
+              <w:left w:val="single" w:color="BFBFBF" w:sz="4"/>
+              <w:bottom w:val="single" w:color="BFBFBF" w:sz="4"/>
+              <w:right w:val="single" w:color="BFBFBF" w:sz="4"/>
+            </w:tcBorders>
+            <w:tcMar>
+              <w:top w:type="dxa" w:w="60"/>
+              <w:left w:type="dxa" w:w="100"/>
+              <w:bottom w:type="dxa" w:w="60"/>
+              <w:right w:type="dxa" w:w="100"/>
+            </w:tcMar>
+          </w:tcPr>
+          <w:p>
+            <w:r>
               <w:t xml:space="preserve">Sign Your Picture ◇</w:t>
             </w:r>
           </w:p>
@@ -11969,7 +12040,7 @@
           </w:tcPr>
           <w:p>
             <w:r>
-              <w:t xml:space="preserve">Your signature in a corner, in one of three fonts</w:t>
+              <w:t xml:space="preserve">Your signature - and the target name above it - in a corner or wherever you drag it</w:t>
             </w:r>
           </w:p>
         </w:tc>
@@ -12489,17 +12560,17 @@
           <w:b/>
           <w:bCs/>
         </w:rPr>
-        <w:t xml:space="preserve">Sign Your Picture</w:t>
-      </w:r>
-      <w:r>
-        <w:t xml:space="preserve">: type your name once (it is remembered), pick a font - </w:t>
+        <w:t xml:space="preserve">Flip the Picture</w:t>
+      </w:r>
+      <w:r>
+        <w:t xml:space="preserve"> (optional): </w:t>
       </w:r>
       <w:r>
         <w:rPr>
           <w:i/>
           <w:iCs/>
         </w:rPr>
-        <w:t xml:space="preserve">Elegant script</w:t>
+        <w:t xml:space="preserve">Mirror left ↔ right</w:t>
       </w:r>
       <w:r>
         <w:t xml:space="preserve">, </w:t>
@@ -12509,7 +12580,7 @@
           <w:i/>
           <w:iCs/>
         </w:rPr>
-        <w:t xml:space="preserve">Handwritten</w:t>
+        <w:t xml:space="preserve">Flip upside down</w:t>
       </w:r>
       <w:r>
         <w:t xml:space="preserve"> or </w:t>
@@ -12519,10 +12590,110 @@
           <w:i/>
           <w:iCs/>
         </w:rPr>
+        <w:t xml:space="preserve">Turn 180°</w:t>
+      </w:r>
+      <w:r>
+        <w:t xml:space="preserve"> - to match how the object usually looks in charts and other pictures. Flip before signing, so the signature reads the right way.</w:t>
+      </w:r>
+    </w:p>
+    <w:p>
+      <w:pPr>
+        <w:pStyle w:val="ListParagraph"/>
+        <w:numPr>
+          <w:ilvl w:val="0"/>
+          <w:numId w:val="2"/>
+        </w:numPr>
+        <w:spacing w:after="60"/>
+      </w:pPr>
+      <w:r>
+        <w:rPr>
+          <w:b/>
+          <w:bCs/>
+        </w:rPr>
+        <w:t xml:space="preserve">Sign Your Picture</w:t>
+      </w:r>
+      <w:r>
+        <w:t xml:space="preserve">: type your name once (it is remembered) and, if you like, a </w:t>
+      </w:r>
+      <w:r>
+        <w:rPr>
+          <w:b/>
+          <w:bCs/>
+        </w:rPr>
+        <w:t xml:space="preserve">Target name</w:t>
+      </w:r>
+      <w:r>
+        <w:t xml:space="preserve"> for a line above it - filled in for you (for example </w:t>
+      </w:r>
+      <w:r>
+        <w:rPr>
+          <w:i/>
+          <w:iCs/>
+        </w:rPr>
+        <w:t xml:space="preserve">NGC 281 "Pacman Nebula"</w:t>
+      </w:r>
+      <w:r>
+        <w:t xml:space="preserve">) and remembered for each target; empty it for none. Pick a font - </w:t>
+      </w:r>
+      <w:r>
+        <w:rPr>
+          <w:i/>
+          <w:iCs/>
+        </w:rPr>
+        <w:t xml:space="preserve">Elegant script</w:t>
+      </w:r>
+      <w:r>
+        <w:t xml:space="preserve">, </w:t>
+      </w:r>
+      <w:r>
+        <w:rPr>
+          <w:i/>
+          <w:iCs/>
+        </w:rPr>
+        <w:t xml:space="preserve">Handwritten</w:t>
+      </w:r>
+      <w:r>
+        <w:t xml:space="preserve"> or </w:t>
+      </w:r>
+      <w:r>
+        <w:rPr>
+          <w:i/>
+          <w:iCs/>
+        </w:rPr>
         <w:t xml:space="preserve">Classic</w:t>
       </w:r>
       <w:r>
-        <w:t xml:space="preserve"> - the corner and colour, and fine-tune size, opacity and distance from the edge. Do this last: the signature becomes part of the picture.</w:t>
+        <w:t xml:space="preserve"> - a corner and a colour, and fine-tune size, opacity and distance from the edge. To put it anywhere else, </w:t>
+      </w:r>
+      <w:r>
+        <w:rPr>
+          <w:b/>
+          <w:bCs/>
+        </w:rPr>
+        <w:t xml:space="preserve">drag the dashed box</w:t>
+      </w:r>
+      <w:r>
+        <w:t xml:space="preserve"> on the picture (or click where it should go); </w:t>
+      </w:r>
+      <w:r>
+        <w:rPr>
+          <w:i/>
+          <w:iCs/>
+        </w:rPr>
+        <w:t xml:space="preserve">Place</w:t>
+      </w:r>
+      <w:r>
+        <w:t xml:space="preserve"> then says </w:t>
+      </w:r>
+      <w:r>
+        <w:rPr>
+          <w:i/>
+          <w:iCs/>
+        </w:rPr>
+        <w:t xml:space="preserve">Where I dragged it</w:t>
+      </w:r>
+      <w:r>
+        <w:t xml:space="preserve">. Do this last: the signature becomes part of the picture.</w:t>
       </w:r>
     </w:p>
     <w:p>
@@ -12615,7 +12786,27 @@
         <w:t xml:space="preserve">Save the Picture…</w:t>
       </w:r>
       <w:r>
-        <w:t xml:space="preserve"> - TIFF (16-bit), JPG, PNG, XISF or FITS. Each target remembers its own folder.</w:t>
+        <w:t xml:space="preserve"> - TIFF (16-bit), JPG, PNG, XISF or FITS. Each target remembers its own folder. Tick </w:t>
+      </w:r>
+      <w:r>
+        <w:rPr>
+          <w:b/>
+          <w:bCs/>
+        </w:rPr>
+        <w:t xml:space="preserve">Also save a short description of the target</w:t>
+      </w:r>
+      <w:r>
+        <w:t xml:space="preserve"> to save the opening paragraphs of its Wikipedia article as </w:t>
+      </w:r>
+      <w:r>
+        <w:rPr>
+          <w:i/>
+          <w:iCs/>
+        </w:rPr>
+        <w:t xml:space="preserve">&lt;target&gt;_about.txt</w:t>
+      </w:r>
+      <w:r>
+        <w:t xml:space="preserve"> next to the pictures - shown first so you can edit it (or type your own when there is no internet), with the source credited.</w:t>
       </w:r>
     </w:p>
     <w:p>
@@ -19064,6 +19255,38 @@
             <w:szCs w:val="19"/>
           </w:rPr>
           <w:t xml:space="preserve">4.3</w:t>
+        </w:r>
+      </w:hyperlink>
+    </w:p>
+    <w:p>
+      <w:pPr>
+        <w:tabs>
+          <w:tab w:val="right" w:pos="4200" w:leader="dot"/>
+        </w:tabs>
+        <w:spacing w:after="10"/>
+      </w:pPr>
+      <w:r>
+        <w:rPr>
+          <w:sz w:val="19"/>
+          <w:szCs w:val="19"/>
+        </w:rPr>
+        <w:t xml:space="preserve">Flip the Picture</w:t>
+      </w:r>
+      <w:r>
+        <w:rPr>
+          <w:sz w:val="19"/>
+          <w:szCs w:val="19"/>
+        </w:rPr>
+        <w:tab/>
+      </w:r>
+      <w:hyperlink w:history="1" w:anchor="s_9_3">
+        <w:r>
+          <w:rPr>
+            <w:rStyle w:val="Hyperlink"/>
+            <w:sz w:val="19"/>
+            <w:szCs w:val="19"/>
+          </w:rPr>
+          <w:t xml:space="preserve">9.3</w:t>
         </w:r>
       </w:hyperlink>
     </w:p>

</xml_diff>

<commit_message>
v0.9.30: Spot Fix / Mote Buster circles - click, then the wheel sizes that circle live
Click places a circle; the mouse wheel resizes the picked (blue) circle at once; click a circle to
pick it again and drag to move it; right-click removes the one under the mouse; a dashed ring follows
the mouse showing the next circle's size. Reported by the user: the circle only appeared after the wheel.

Co-Authored-By: Claude Opus 5.5 <noreply@anthropic.com>
Claude-Session: https://claude.ai/code/session_01FKvd69QsnCvM2zbzYnPwmF
</commit_message>
<xml_diff>
--- a/docs/SubZeroAstro_User_Manual.docx
+++ b/docs/SubZeroAstro_User_Manual.docx
@@ -121,7 +121,7 @@
           <w:sz w:val="22"/>
           <w:szCs w:val="22"/>
         </w:rPr>
-        <w:t xml:space="preserve">Version 0.9.29 beta  ·  Windows and Mac (Apple silicon)</w:t>
+        <w:t xml:space="preserve">Version 0.9.30 beta  ·  Windows and Mac (Apple silicon)</w:t>
       </w:r>
     </w:p>
     <w:p>
@@ -1225,7 +1225,7 @@
           <w:b/>
           <w:bCs/>
         </w:rPr>
-        <w:t xml:space="preserve">30</w:t>
+        <w:t xml:space="preserve">31</w:t>
       </w:r>
     </w:p>
     <w:p>
@@ -1380,7 +1380,7 @@
           <w:b/>
           <w:bCs/>
         </w:rPr>
-        <w:t xml:space="preserve">32</w:t>
+        <w:t xml:space="preserve">33</w:t>
       </w:r>
     </w:p>
     <w:p>
@@ -1445,7 +1445,7 @@
           <w:b/>
           <w:bCs/>
         </w:rPr>
-        <w:t xml:space="preserve">34</w:t>
+        <w:t xml:space="preserve">35</w:t>
       </w:r>
     </w:p>
     <w:p>
@@ -1510,7 +1510,7 @@
           <w:b/>
           <w:bCs/>
         </w:rPr>
-        <w:t xml:space="preserve">35</w:t>
+        <w:t xml:space="preserve">36</w:t>
       </w:r>
     </w:p>
     <w:p>
@@ -1575,7 +1575,7 @@
           <w:b/>
           <w:bCs/>
         </w:rPr>
-        <w:t xml:space="preserve">36</w:t>
+        <w:t xml:space="preserve">37</w:t>
       </w:r>
     </w:p>
     <w:p>
@@ -1640,7 +1640,7 @@
           <w:b/>
           <w:bCs/>
         </w:rPr>
-        <w:t xml:space="preserve">37</w:t>
+        <w:t xml:space="preserve">38</w:t>
       </w:r>
     </w:p>
     <w:p>
@@ -12192,7 +12192,17 @@
         <w:t xml:space="preserve">click</w:t>
       </w:r>
       <w:r>
-        <w:t xml:space="preserve"> those yourself. The mouse wheel sets the circle size (just cover the donut); right-click removes the last circle. Clicks need not be exact: each circle is centred on its donut automatically.</w:t>
+        <w:t xml:space="preserve"> those yourself. Click to place a circle, then </w:t>
+      </w:r>
+      <w:r>
+        <w:rPr>
+          <w:b/>
+          <w:bCs/>
+        </w:rPr>
+        <w:t xml:space="preserve">turn the mouse wheel to size that circle</w:t>
+      </w:r>
+      <w:r>
+        <w:t xml:space="preserve"> while you watch (just cover the donut). Click a circle to pick it again (it turns blue) and drag to move it; right-click removes it. A dashed ring follows the mouse to show the size of the next circle. Clicks need not be exact: each circle is centred on its donut automatically.</w:t>
       </w:r>
     </w:p>
     <w:p>
@@ -12533,7 +12543,17 @@
         <w:t xml:space="preserve">Spot Fix</w:t>
       </w:r>
       <w:r>
-        <w:t xml:space="preserve">: click each blemish (the mouse wheel sets the size, right-click removes the last mark), then </w:t>
+        <w:t xml:space="preserve">: click the middle of a blemish - a circle appears - then </w:t>
+      </w:r>
+      <w:r>
+        <w:rPr>
+          <w:b/>
+          <w:bCs/>
+        </w:rPr>
+        <w:t xml:space="preserve">turn the mouse wheel to make that circle bigger or smaller</w:t>
+      </w:r>
+      <w:r>
+        <w:t xml:space="preserve"> until it just covers the blemish. Click a circle to pick it again (it turns blue) and drag to move it; right-click removes it. A dashed ring follows the mouse to show the size of the next circle. Then </w:t>
       </w:r>
       <w:r>
         <w:rPr>

</xml_diff>

<commit_message>
v0.9.31: ignore macOS '._' AppleDouble files and other dot-files when scanning
On a NAS or external drive a Mac writes a hidden '._<name>' copy next to every file; they were
listed as unreadable frames (half of a 258-frame session). Page 1, page 2, Build Calibration
Masters and Add Masters now skip dot-files and hidden folders.

Co-Authored-By: Claude Opus 5.5 <noreply@anthropic.com>
Claude-Session: https://claude.ai/code/session_01FKvd69QsnCvM2zbzYnPwmF
</commit_message>
<xml_diff>
--- a/docs/SubZeroAstro_User_Manual.docx
+++ b/docs/SubZeroAstro_User_Manual.docx
@@ -121,7 +121,7 @@
           <w:sz w:val="22"/>
           <w:szCs w:val="22"/>
         </w:rPr>
-        <w:t xml:space="preserve">Version 0.9.30 beta  ·  Windows and Mac (Apple silicon)</w:t>
+        <w:t xml:space="preserve">Version 0.9.31 beta  ·  Windows and Mac (Apple silicon)</w:t>
       </w:r>
     </w:p>
     <w:p>
@@ -14523,6 +14523,94 @@
           <w:p>
             <w:r>
               <w:t xml:space="preserve">Restart: SubZeroAstro offers to resume from its saved progress.</w:t>
+            </w:r>
+          </w:p>
+        </w:tc>
+      </w:tr>
+      <w:tr>
+        <w:trPr>
+          <w:cantSplit/>
+        </w:trPr>
+        <w:tc>
+          <w:tcPr>
+            <w:tcW w:type="dxa" w:w="3300"/>
+            <w:tcBorders>
+              <w:top w:val="single" w:color="BFBFBF" w:sz="4"/>
+              <w:left w:val="single" w:color="BFBFBF" w:sz="4"/>
+              <w:bottom w:val="single" w:color="BFBFBF" w:sz="4"/>
+              <w:right w:val="single" w:color="BFBFBF" w:sz="4"/>
+            </w:tcBorders>
+            <w:tcMar>
+              <w:top w:type="dxa" w:w="60"/>
+              <w:left w:type="dxa" w:w="100"/>
+              <w:bottom w:type="dxa" w:w="60"/>
+              <w:right w:type="dxa" w:w="100"/>
+            </w:tcMar>
+          </w:tcPr>
+          <w:p>
+            <w:r>
+              <w:t xml:space="preserve">Half the frames show </w:t>
+            </w:r>
+            <w:r>
+              <w:rPr>
+                <w:i/>
+                <w:iCs/>
+              </w:rPr>
+              <w:t xml:space="preserve">unreadable</w:t>
+            </w:r>
+            <w:r>
+              <w:t xml:space="preserve">, names starting with </w:t>
+            </w:r>
+            <w:r>
+              <w:rPr>
+                <w:rFonts w:ascii="Consolas" w:cs="Consolas" w:eastAsia="Consolas" w:hAnsi="Consolas"/>
+                <w:sz w:val="19"/>
+                <w:szCs w:val="19"/>
+              </w:rPr>
+              <w:t xml:space="preserve">._</w:t>
+            </w:r>
+          </w:p>
+        </w:tc>
+        <w:tc>
+          <w:tcPr>
+            <w:tcW w:type="dxa" w:w="6060"/>
+            <w:tcBorders>
+              <w:top w:val="single" w:color="BFBFBF" w:sz="4"/>
+              <w:left w:val="single" w:color="BFBFBF" w:sz="4"/>
+              <w:bottom w:val="single" w:color="BFBFBF" w:sz="4"/>
+              <w:right w:val="single" w:color="BFBFBF" w:sz="4"/>
+            </w:tcBorders>
+            <w:tcMar>
+              <w:top w:type="dxa" w:w="60"/>
+              <w:left w:type="dxa" w:w="100"/>
+              <w:bottom w:type="dxa" w:w="60"/>
+              <w:right w:type="dxa" w:w="100"/>
+            </w:tcMar>
+          </w:tcPr>
+          <w:p>
+            <w:r>
+              <w:t xml:space="preserve">Those are hidden macOS copies (AppleDouble files) that a Mac writes next to every file on a NAS or external drive - not pictures. Version 0.9.31 and later ignore them; with an older version, delete the </w:t>
+            </w:r>
+            <w:r>
+              <w:rPr>
+                <w:rFonts w:ascii="Consolas" w:cs="Consolas" w:eastAsia="Consolas" w:hAnsi="Consolas"/>
+                <w:sz w:val="19"/>
+                <w:szCs w:val="19"/>
+              </w:rPr>
+              <w:t xml:space="preserve">._</w:t>
+            </w:r>
+            <w:r>
+              <w:t xml:space="preserve"> files or turn off </w:t>
+            </w:r>
+            <w:r>
+              <w:rPr>
+                <w:i/>
+                <w:iCs/>
+              </w:rPr>
+              <w:t xml:space="preserve">Include subfolders</w:t>
+            </w:r>
+            <w:r>
+              <w:t xml:space="preserve">.</w:t>
             </w:r>
           </w:p>
         </w:tc>

</xml_diff>

<commit_message>
v0.9.32: Flip the Picture - Flip Horizontally / Flip Vertically toggle buttons
Each press flips the preview, pressing again flips back; Keep This Orientation applies it.
Turn 180° removed (both buttons together do it). Old projects with the previous flip steps still load.

Co-Authored-By: Claude Opus 5.5 <noreply@anthropic.com>
Claude-Session: https://claude.ai/code/session_01FKvd69QsnCvM2zbzYnPwmF
</commit_message>
<xml_diff>
--- a/docs/SubZeroAstro_User_Manual.docx
+++ b/docs/SubZeroAstro_User_Manual.docx
@@ -121,7 +121,7 @@
           <w:sz w:val="22"/>
           <w:szCs w:val="22"/>
         </w:rPr>
-        <w:t xml:space="preserve">Version 0.9.31 beta  ·  Windows and Mac (Apple silicon)</w:t>
+        <w:t xml:space="preserve">Version 0.9.32 beta  ·  Windows and Mac (Apple silicon)</w:t>
       </w:r>
     </w:p>
     <w:p>
@@ -11827,7 +11827,7 @@
           </w:tcPr>
           <w:p>
             <w:r>
-              <w:t xml:space="preserve">Mirror left ↔ right, flip upside down or turn 180° - the saved pictures are flipped too</w:t>
+              <w:t xml:space="preserve">Flip Horizontally and/or Flip Vertically (each press toggles) - the saved pictures are flipped too</w:t>
             </w:r>
           </w:p>
         </w:tc>
@@ -12583,37 +12583,37 @@
         <w:t xml:space="preserve">Flip the Picture</w:t>
       </w:r>
       <w:r>
-        <w:t xml:space="preserve"> (optional): </w:t>
-      </w:r>
-      <w:r>
-        <w:rPr>
-          <w:i/>
-          <w:iCs/>
-        </w:rPr>
-        <w:t xml:space="preserve">Mirror left ↔ right</w:t>
-      </w:r>
-      <w:r>
-        <w:t xml:space="preserve">, </w:t>
-      </w:r>
-      <w:r>
-        <w:rPr>
-          <w:i/>
-          <w:iCs/>
-        </w:rPr>
-        <w:t xml:space="preserve">Flip upside down</w:t>
-      </w:r>
-      <w:r>
-        <w:t xml:space="preserve"> or </w:t>
-      </w:r>
-      <w:r>
-        <w:rPr>
-          <w:i/>
-          <w:iCs/>
-        </w:rPr>
-        <w:t xml:space="preserve">Turn 180°</w:t>
-      </w:r>
-      <w:r>
-        <w:t xml:space="preserve"> - to match how the object usually looks in charts and other pictures. Flip before signing, so the signature reads the right way.</w:t>
+        <w:t xml:space="preserve"> (optional): press </w:t>
+      </w:r>
+      <w:r>
+        <w:rPr>
+          <w:b/>
+          <w:bCs/>
+        </w:rPr>
+        <w:t xml:space="preserve">Flip Horizontally</w:t>
+      </w:r>
+      <w:r>
+        <w:t xml:space="preserve"> (left ↔ right) and/or </w:t>
+      </w:r>
+      <w:r>
+        <w:rPr>
+          <w:b/>
+          <w:bCs/>
+        </w:rPr>
+        <w:t xml:space="preserve">Flip Vertically</w:t>
+      </w:r>
+      <w:r>
+        <w:t xml:space="preserve"> (upside down) - each press flips the preview, pressing again flips it back (both together turn it 180°). When it looks right, press </w:t>
+      </w:r>
+      <w:r>
+        <w:rPr>
+          <w:b/>
+          <w:bCs/>
+        </w:rPr>
+        <w:t xml:space="preserve">Keep This Orientation</w:t>
+      </w:r>
+      <w:r>
+        <w:t xml:space="preserve">. Useful to match how the object usually looks in charts and other pictures. Flip before signing, so the signature reads the right way.</w:t>
       </w:r>
     </w:p>
     <w:p>

</xml_diff>

<commit_message>
v0.9.34: target description adds facts from SIMBAD
Type of object, J2000 position and V magnitude from SIMBAD (via the CDS Sesame resolver),
under the Wikipedia text - or on their own for objects without a Wikipedia article. Each source
is looked up separately (one failing never stops the other) and credited.

Co-Authored-By: Claude Opus 5.5 <noreply@anthropic.com>
Claude-Session: https://claude.ai/code/session_01FKvd69QsnCvM2zbzYnPwmF
</commit_message>
<xml_diff>
--- a/docs/SubZeroAstro_User_Manual.docx
+++ b/docs/SubZeroAstro_User_Manual.docx
@@ -121,7 +121,7 @@
           <w:sz w:val="22"/>
           <w:szCs w:val="22"/>
         </w:rPr>
-        <w:t xml:space="preserve">Version 0.9.33 beta  ·  Windows and Mac (Apple silicon)</w:t>
+        <w:t xml:space="preserve">Version 0.9.34 beta  ·  Windows and Mac (Apple silicon)</w:t>
       </w:r>
     </w:p>
     <w:p>
@@ -12816,7 +12816,7 @@
         <w:t xml:space="preserve">Also save a short description of the target</w:t>
       </w:r>
       <w:r>
-        <w:t xml:space="preserve"> to save the opening paragraphs of its Wikipedia article as </w:t>
+        <w:t xml:space="preserve"> to save </w:t>
       </w:r>
       <w:r>
         <w:rPr>
@@ -12826,7 +12826,17 @@
         <w:t xml:space="preserve">&lt;target&gt;_about.txt</w:t>
       </w:r>
       <w:r>
-        <w:t xml:space="preserve"> next to the pictures - shown first so you can edit it (or type your own when there is no internet), with the source credited.</w:t>
+        <w:t xml:space="preserve"> next to the pictures: the opening paragraphs of its Wikipedia article plus </w:t>
+      </w:r>
+      <w:r>
+        <w:rPr>
+          <w:b/>
+          <w:bCs/>
+        </w:rPr>
+        <w:t xml:space="preserve">facts from SIMBAD</w:t>
+      </w:r>
+      <w:r>
+        <w:t xml:space="preserve"> (the professional astronomy database at CDS, Strasbourg) - the kind of object, its position (RA / Dec) and brightness. Faint objects without a Wikipedia article still get the SIMBAD facts. It is shown first so you can edit it (or type your own when there is no internet), and both sources are credited.</w:t>
       </w:r>
     </w:p>
     <w:p>

</xml_diff>

<commit_message>
v0.9.36: plate solving retries other field sizes; a failure says why
ASTAP got a 0.71° field from the header and found no solution on every M104 master. The field
from the header is often wrong (binning not counted, reducer/extender); the solve now retries at
1/2, 2x, 0.7x, 1.4x, 1/4 and 4x, and a final failure names the field sizes tried, the star
databases ASTAP has (D50/D80 needed for small fields) and what to do.

Co-Authored-By: Claude Opus 5.5 <noreply@anthropic.com>
Claude-Session: https://claude.ai/code/session_01FKvd69QsnCvM2zbzYnPwmF
</commit_message>
<xml_diff>
--- a/docs/SubZeroAstro_User_Manual.docx
+++ b/docs/SubZeroAstro_User_Manual.docx
@@ -121,7 +121,7 @@
           <w:sz w:val="22"/>
           <w:szCs w:val="22"/>
         </w:rPr>
-        <w:t xml:space="preserve">Version 0.9.35 beta  ·  Windows and Mac (Apple silicon)</w:t>
+        <w:t xml:space="preserve">Version 0.9.36 beta  ·  Windows and Mac (Apple silicon)</w:t>
       </w:r>
     </w:p>
     <w:p>
@@ -14088,17 +14088,37 @@
           </w:tcPr>
           <w:p>
             <w:r>
-              <w:t xml:space="preserve">Tick </w:t>
+              <w:t xml:space="preserve">SubZeroAstro already retries with other field sizes (wrong binning or a reducer in the header are the usual cause). If it still fails, read the log line: for small fields (under about 0.5°, e.g. galaxies with long focal lengths) ASTAP needs the </w:t>
             </w:r>
             <w:r>
               <w:rPr>
                 <w:b/>
                 <w:bCs/>
               </w:rPr>
-              <w:t xml:space="preserve">Blind solve</w:t>
-            </w:r>
-            <w:r>
-              <w:t xml:space="preserve">; check that ASTAP has a star database installed.</w:t>
+              <w:t xml:space="preserve">D50</w:t>
+            </w:r>
+            <w:r>
+              <w:t xml:space="preserve"> or </w:t>
+            </w:r>
+            <w:r>
+              <w:rPr>
+                <w:b/>
+                <w:bCs/>
+              </w:rPr>
+              <w:t xml:space="preserve">D80</w:t>
+            </w:r>
+            <w:r>
+              <w:t xml:space="preserve"> star database; with no pointing in the header tick </w:t>
+            </w:r>
+            <w:r>
+              <w:rPr>
+                <w:b/>
+                <w:bCs/>
+              </w:rPr>
+              <w:t xml:space="preserve">Search the whole sky</w:t>
+            </w:r>
+            <w:r>
+              <w:t xml:space="preserve">. A failed solve only means the picture has no sky coordinates - every other step works as usual.</w:t>
             </w:r>
           </w:p>
         </w:tc>

</xml_diff>

<commit_message>
v0.9.37: plate solve when the header has no focal length (Telescope Live: FOCALLEN = 0)
With no pixel scale ASTAP fell back to a 0.71° field and the retries never ran. Typical fields
from 0.25° to 4.5° are now tried near the header's pointing; the field that works is tried first
for the other masters, and a run where nothing works doesn't repeat the full search per master.

Co-Authored-By: Claude Opus 5.5 <noreply@anthropic.com>
Claude-Session: https://claude.ai/code/session_01FKvd69QsnCvM2zbzYnPwmF
</commit_message>
<xml_diff>
--- a/docs/SubZeroAstro_User_Manual.docx
+++ b/docs/SubZeroAstro_User_Manual.docx
@@ -121,7 +121,7 @@
           <w:sz w:val="22"/>
           <w:szCs w:val="22"/>
         </w:rPr>
-        <w:t xml:space="preserve">Version 0.9.36 beta  ·  Windows and Mac (Apple silicon)</w:t>
+        <w:t xml:space="preserve">Version 0.9.37 beta  ·  Windows and Mac (Apple silicon)</w:t>
       </w:r>
     </w:p>
     <w:p>
@@ -14088,7 +14088,7 @@
           </w:tcPr>
           <w:p>
             <w:r>
-              <w:t xml:space="preserve">SubZeroAstro already retries with other field sizes (wrong binning or a reducer in the header are the usual cause). If it still fails, read the log line: for small fields (under about 0.5°, e.g. galaxies with long focal lengths) ASTAP needs the </w:t>
+              <w:t xml:space="preserve">SubZeroAstro already retries with other field sizes (wrong binning or a reducer in the header are the usual cause; when the header has no focal length at all - Telescope Live files say 0 - typical fields from 0.25° to 4.5° are tried, and the one that works is reused for the other masters). If it still fails, read the log line: for small fields (under about 0.5°, e.g. galaxies with long focal lengths) ASTAP needs the </w:t>
             </w:r>
             <w:r>
               <w:rPr>

</xml_diff>

<commit_message>
v0.9.38: Save the Picture - a new target starts in the folder used last
The folder was remembered per target only, so every new target went back to its masters'
folder and the user's choice seemed not to stick. Now the last folder used is the start for new
targets (each target still keeps its own), and the choice is written at once.

Co-Authored-By: Claude Opus 5.5 <noreply@anthropic.com>
Claude-Session: https://claude.ai/code/session_01FKvd69QsnCvM2zbzYnPwmF
</commit_message>
<xml_diff>
--- a/docs/SubZeroAstro_User_Manual.docx
+++ b/docs/SubZeroAstro_User_Manual.docx
@@ -121,7 +121,7 @@
           <w:sz w:val="22"/>
           <w:szCs w:val="22"/>
         </w:rPr>
-        <w:t xml:space="preserve">Version 0.9.37 beta  ·  Windows and Mac (Apple silicon)</w:t>
+        <w:t xml:space="preserve">Version 0.9.38 beta  ·  Windows and Mac (Apple silicon)</w:t>
       </w:r>
     </w:p>
     <w:p>
@@ -12806,7 +12806,7 @@
         <w:t xml:space="preserve">Save the Picture…</w:t>
       </w:r>
       <w:r>
-        <w:t xml:space="preserve"> - TIFF (16-bit), JPG, PNG, XISF or FITS. Each target remembers its own folder. Tick </w:t>
+        <w:t xml:space="preserve"> - TIFF (16-bit), JPG, PNG, XISF or FITS. The folder you pick is remembered: each target keeps its own, and a new target starts in the folder you used last. Tick </w:t>
       </w:r>
       <w:r>
         <w:rPr>

</xml_diff>

<commit_message>
v0.9.39: Save the Picture - every file of a picture in its own <target>_<scope> folder
Inside the chosen folder, e.g. Final Astro Pics/M101_RedCat51/ holds the TIFF, JPG, FITS/XISF and
the description. The scope name comes from the masters' TELESCOP (two rigs are joined with +).

Co-Authored-By: Claude Opus 5.5 <noreply@anthropic.com>
Claude-Session: https://claude.ai/code/session_01FKvd69QsnCvM2zbzYnPwmF
</commit_message>
<xml_diff>
--- a/docs/SubZeroAstro_User_Manual.docx
+++ b/docs/SubZeroAstro_User_Manual.docx
@@ -121,7 +121,7 @@
           <w:sz w:val="22"/>
           <w:szCs w:val="22"/>
         </w:rPr>
-        <w:t xml:space="preserve">Version 0.9.38 beta  ·  Windows and Mac (Apple silicon)</w:t>
+        <w:t xml:space="preserve">Version 0.9.39 beta  ·  Windows and Mac (Apple silicon)</w:t>
       </w:r>
     </w:p>
     <w:p>
@@ -12806,7 +12806,27 @@
         <w:t xml:space="preserve">Save the Picture…</w:t>
       </w:r>
       <w:r>
-        <w:t xml:space="preserve"> - TIFF (16-bit), JPG, PNG, XISF or FITS. The folder you pick is remembered: each target keeps its own, and a new target starts in the folder you used last. Tick </w:t>
+        <w:t xml:space="preserve"> - TIFF (16-bit), JPG, PNG, XISF or FITS. All the files of one picture go into </w:t>
+      </w:r>
+      <w:r>
+        <w:rPr>
+          <w:b/>
+          <w:bCs/>
+        </w:rPr>
+        <w:t xml:space="preserve">their own folder inside the one you pick</w:t>
+      </w:r>
+      <w:r>
+        <w:t xml:space="preserve">, named after the target and telescope - for example </w:t>
+      </w:r>
+      <w:r>
+        <w:rPr>
+          <w:i/>
+          <w:iCs/>
+        </w:rPr>
+        <w:t xml:space="preserve">Final Astro Pics/M101_RedCat51/</w:t>
+      </w:r>
+      <w:r>
+        <w:t xml:space="preserve"> holds M101_finished.tif, .jpg, .fits and the description. The folder you pick is remembered: each target keeps its own, and a new target starts in the folder you used last. Tick </w:t>
       </w:r>
       <w:r>
         <w:rPr>

</xml_diff>

<commit_message>
v0.9.41: Finishing Touches uses every master and corrects field distortion between setups
Thor's Helmet from 25 masters (FLI PL16083 and ProLine PL9000) came out with orange/blue double
stars growing towards the corners: only the last master of each filter was used, and masters from
different setups did not line up at the edges (an affine match can't follow optical distortion).
Now every master is matched to a reference by its stars with a polynomial distortion model
(corner stars from ~12 px apart to 0.03 px in the test), and masters of the same filter are
brightness-matched and noise-weighted averaged.

Co-Authored-By: Claude Opus 5.5 <noreply@anthropic.com>
Claude-Session: https://claude.ai/code/session_01FKvd69QsnCvM2zbzYnPwmF
</commit_message>
<xml_diff>
--- a/docs/SubZeroAstro_User_Manual.docx
+++ b/docs/SubZeroAstro_User_Manual.docx
@@ -121,7 +121,7 @@
           <w:sz w:val="22"/>
           <w:szCs w:val="22"/>
         </w:rPr>
-        <w:t xml:space="preserve">Version 0.9.40 beta  ·  Windows and Mac (Apple silicon)</w:t>
+        <w:t xml:space="preserve">Version 0.9.41 beta  ·  Windows and Mac (Apple silicon)</w:t>
       </w:r>
     </w:p>
     <w:p>
@@ -10273,6 +10273,21 @@
     </w:p>
     <w:p>
       <w:pPr>
+        <w:spacing w:after="120"/>
+      </w:pPr>
+      <w:r>
+        <w:rPr>
+          <w:b/>
+          <w:bCs/>
+        </w:rPr>
+        <w:t xml:space="preserve">Several masters per filter, or masters from different setups.</w:t>
+      </w:r>
+      <w:r>
+        <w:t xml:space="preserve"> When you load more than one master of the same filter (other nights, other cameras or telescopes), all of them are used: they are brought to the same brightness and averaged, the less noisy ones counting more. Every master is first matched star by star to one reference master. Masters from another camera or telescope are bent slightly differently by their optics - most at the edges, which would give coloured double stars in the corners - so SubZeroAstro measures that distortion from hundreds of stars and corrects it. The note under the title says how many masters were combined and corrected.</w:t>
+      </w:r>
+    </w:p>
+    <w:p>
+      <w:pPr>
         <w:pStyle w:val="Heading2"/>
       </w:pPr>
       <w:bookmarkStart w:name="s_9_2" w:id="1"/>
@@ -18685,7 +18700,7 @@
           <w:sz w:val="19"/>
           <w:szCs w:val="19"/>
         </w:rPr>
-        <w:t xml:space="preserve">Dual-band filter</w:t>
+        <w:t xml:space="preserve">Double stars</w:t>
       </w:r>
       <w:r>
         <w:rPr>
@@ -18694,14 +18709,14 @@
         </w:rPr>
         <w:tab/>
       </w:r>
-      <w:hyperlink w:history="1" w:anchor="s_1_3">
+      <w:hyperlink w:history="1" w:anchor="s_9_1">
         <w:r>
           <w:rPr>
             <w:rStyle w:val="Hyperlink"/>
             <w:sz w:val="19"/>
             <w:szCs w:val="19"/>
           </w:rPr>
-          <w:t xml:space="preserve">1.3</w:t>
+          <w:t xml:space="preserve">9.1</w:t>
         </w:r>
       </w:hyperlink>
     </w:p>
@@ -18717,7 +18732,7 @@
           <w:sz w:val="19"/>
           <w:szCs w:val="19"/>
         </w:rPr>
-        <w:t xml:space="preserve">Dual-band recipe</w:t>
+        <w:t xml:space="preserve">Dual-band filter</w:t>
       </w:r>
       <w:r>
         <w:rPr>
@@ -18726,14 +18741,14 @@
         </w:rPr>
         <w:tab/>
       </w:r>
-      <w:hyperlink w:history="1" w:anchor="s_10_2">
+      <w:hyperlink w:history="1" w:anchor="s_1_3">
         <w:r>
           <w:rPr>
             <w:rStyle w:val="Hyperlink"/>
             <w:sz w:val="19"/>
             <w:szCs w:val="19"/>
           </w:rPr>
-          <w:t xml:space="preserve">10.2</w:t>
+          <w:t xml:space="preserve">1.3</w:t>
         </w:r>
       </w:hyperlink>
     </w:p>
@@ -18749,7 +18764,7 @@
           <w:sz w:val="19"/>
           <w:szCs w:val="19"/>
         </w:rPr>
-        <w:t xml:space="preserve">Dust donuts</w:t>
+        <w:t xml:space="preserve">Dual-band recipe</w:t>
       </w:r>
       <w:r>
         <w:rPr>
@@ -18758,14 +18773,14 @@
         </w:rPr>
         <w:tab/>
       </w:r>
-      <w:hyperlink w:history="1" w:anchor="s_9_4">
+      <w:hyperlink w:history="1" w:anchor="s_10_2">
         <w:r>
           <w:rPr>
             <w:rStyle w:val="Hyperlink"/>
             <w:sz w:val="19"/>
             <w:szCs w:val="19"/>
           </w:rPr>
-          <w:t xml:space="preserve">9.4</w:t>
+          <w:t xml:space="preserve">10.2</w:t>
         </w:r>
       </w:hyperlink>
     </w:p>
@@ -18781,7 +18796,7 @@
           <w:sz w:val="19"/>
           <w:szCs w:val="19"/>
         </w:rPr>
-        <w:t xml:space="preserve">Dust motes</w:t>
+        <w:t xml:space="preserve">Dust donuts</w:t>
       </w:r>
       <w:r>
         <w:rPr>
@@ -18813,7 +18828,7 @@
           <w:sz w:val="19"/>
           <w:szCs w:val="19"/>
         </w:rPr>
-        <w:t xml:space="preserve">DWARF</w:t>
+        <w:t xml:space="preserve">Dust motes</w:t>
       </w:r>
       <w:r>
         <w:rPr>
@@ -18822,13 +18837,45 @@
         </w:rPr>
         <w:tab/>
       </w:r>
-      <w:hyperlink w:history="1" w:anchor="s_10_5">
+      <w:hyperlink w:history="1" w:anchor="s_9_4">
         <w:r>
           <w:rPr>
             <w:rStyle w:val="Hyperlink"/>
             <w:sz w:val="19"/>
             <w:szCs w:val="19"/>
           </w:rPr>
+          <w:t xml:space="preserve">9.4</w:t>
+        </w:r>
+      </w:hyperlink>
+    </w:p>
+    <w:p>
+      <w:pPr>
+        <w:tabs>
+          <w:tab w:val="right" w:pos="4200" w:leader="dot"/>
+        </w:tabs>
+        <w:spacing w:after="10"/>
+      </w:pPr>
+      <w:r>
+        <w:rPr>
+          <w:sz w:val="19"/>
+          <w:szCs w:val="19"/>
+        </w:rPr>
+        <w:t xml:space="preserve">DWARF</w:t>
+      </w:r>
+      <w:r>
+        <w:rPr>
+          <w:sz w:val="19"/>
+          <w:szCs w:val="19"/>
+        </w:rPr>
+        <w:tab/>
+      </w:r>
+      <w:hyperlink w:history="1" w:anchor="s_10_5">
+        <w:r>
+          <w:rPr>
+            <w:rStyle w:val="Hyperlink"/>
+            <w:sz w:val="19"/>
+            <w:szCs w:val="19"/>
+          </w:rPr>
           <w:t xml:space="preserve">10.5</w:t>
         </w:r>
       </w:hyperlink>
@@ -18986,7 +19033,7 @@
           <w:sz w:val="19"/>
           <w:szCs w:val="19"/>
         </w:rPr>
-        <w:t xml:space="preserve">File formats</w:t>
+        <w:t xml:space="preserve">Field distortion</w:t>
       </w:r>
       <w:r>
         <w:rPr>
@@ -18995,14 +19042,14 @@
         </w:rPr>
         <w:tab/>
       </w:r>
-      <w:hyperlink w:history="1" w:anchor="s_2_3">
+      <w:hyperlink w:history="1" w:anchor="s_9_1">
         <w:r>
           <w:rPr>
             <w:rStyle w:val="Hyperlink"/>
             <w:sz w:val="19"/>
             <w:szCs w:val="19"/>
           </w:rPr>
-          <w:t xml:space="preserve">2.3</w:t>
+          <w:t xml:space="preserve">9.1</w:t>
         </w:r>
       </w:hyperlink>
     </w:p>
@@ -19018,7 +19065,7 @@
           <w:sz w:val="19"/>
           <w:szCs w:val="19"/>
         </w:rPr>
-        <w:t xml:space="preserve">Filter column</w:t>
+        <w:t xml:space="preserve">File formats</w:t>
       </w:r>
       <w:r>
         <w:rPr>
@@ -19027,14 +19074,14 @@
         </w:rPr>
         <w:tab/>
       </w:r>
-      <w:hyperlink w:history="1" w:anchor="s_7_1">
+      <w:hyperlink w:history="1" w:anchor="s_2_3">
         <w:r>
           <w:rPr>
             <w:rStyle w:val="Hyperlink"/>
             <w:sz w:val="19"/>
             <w:szCs w:val="19"/>
           </w:rPr>
-          <w:t xml:space="preserve">7.1</w:t>
+          <w:t xml:space="preserve">2.3</w:t>
         </w:r>
       </w:hyperlink>
     </w:p>
@@ -19050,7 +19097,7 @@
           <w:sz w:val="19"/>
           <w:szCs w:val="19"/>
         </w:rPr>
-        <w:t xml:space="preserve">Filter used</w:t>
+        <w:t xml:space="preserve">Filter column</w:t>
       </w:r>
       <w:r>
         <w:rPr>
@@ -19059,14 +19106,14 @@
         </w:rPr>
         <w:tab/>
       </w:r>
-      <w:hyperlink w:history="1" w:anchor="s_6_1">
+      <w:hyperlink w:history="1" w:anchor="s_7_1">
         <w:r>
           <w:rPr>
             <w:rStyle w:val="Hyperlink"/>
             <w:sz w:val="19"/>
             <w:szCs w:val="19"/>
           </w:rPr>
-          <w:t xml:space="preserve">6.1</w:t>
+          <w:t xml:space="preserve">7.1</w:t>
         </w:r>
       </w:hyperlink>
     </w:p>
@@ -19082,7 +19129,7 @@
           <w:sz w:val="19"/>
           <w:szCs w:val="19"/>
         </w:rPr>
-        <w:t xml:space="preserve">Final Crop</w:t>
+        <w:t xml:space="preserve">Filter used</w:t>
       </w:r>
       <w:r>
         <w:rPr>
@@ -19091,59 +19138,59 @@
         </w:rPr>
         <w:tab/>
       </w:r>
-      <w:hyperlink w:history="1" w:anchor="s_9_3">
+      <w:hyperlink w:history="1" w:anchor="s_6_1">
         <w:r>
           <w:rPr>
             <w:rStyle w:val="Hyperlink"/>
             <w:sz w:val="19"/>
             <w:szCs w:val="19"/>
           </w:rPr>
-          <w:t xml:space="preserve">9.3</w:t>
-        </w:r>
-      </w:hyperlink>
-      <w:r>
-        <w:t xml:space="preserve">, </w:t>
-      </w:r>
-      <w:hyperlink w:history="1" w:anchor="s_9_6">
+          <w:t xml:space="preserve">6.1</w:t>
+        </w:r>
+      </w:hyperlink>
+    </w:p>
+    <w:p>
+      <w:pPr>
+        <w:tabs>
+          <w:tab w:val="right" w:pos="4200" w:leader="dot"/>
+        </w:tabs>
+        <w:spacing w:after="10"/>
+      </w:pPr>
+      <w:r>
+        <w:rPr>
+          <w:sz w:val="19"/>
+          <w:szCs w:val="19"/>
+        </w:rPr>
+        <w:t xml:space="preserve">Final Crop</w:t>
+      </w:r>
+      <w:r>
+        <w:rPr>
+          <w:sz w:val="19"/>
+          <w:szCs w:val="19"/>
+        </w:rPr>
+        <w:tab/>
+      </w:r>
+      <w:hyperlink w:history="1" w:anchor="s_9_3">
         <w:r>
           <w:rPr>
             <w:rStyle w:val="Hyperlink"/>
             <w:sz w:val="19"/>
             <w:szCs w:val="19"/>
           </w:rPr>
-          <w:t xml:space="preserve">9.6</w:t>
-        </w:r>
-      </w:hyperlink>
-    </w:p>
-    <w:p>
-      <w:pPr>
-        <w:tabs>
-          <w:tab w:val="right" w:pos="4200" w:leader="dot"/>
-        </w:tabs>
-        <w:spacing w:after="10"/>
-      </w:pPr>
-      <w:r>
-        <w:rPr>
-          <w:sz w:val="19"/>
-          <w:szCs w:val="19"/>
-        </w:rPr>
-        <w:t xml:space="preserve">Final Noise Reduction</w:t>
-      </w:r>
-      <w:r>
-        <w:rPr>
-          <w:sz w:val="19"/>
-          <w:szCs w:val="19"/>
-        </w:rPr>
-        <w:tab/>
-      </w:r>
-      <w:hyperlink w:history="1" w:anchor="s_9_3">
+          <w:t xml:space="preserve">9.3</w:t>
+        </w:r>
+      </w:hyperlink>
+      <w:r>
+        <w:t xml:space="preserve">, </w:t>
+      </w:r>
+      <w:hyperlink w:history="1" w:anchor="s_9_6">
         <w:r>
           <w:rPr>
             <w:rStyle w:val="Hyperlink"/>
             <w:sz w:val="19"/>
             <w:szCs w:val="19"/>
           </w:rPr>
-          <w:t xml:space="preserve">9.3</w:t>
+          <w:t xml:space="preserve">9.6</w:t>
         </w:r>
       </w:hyperlink>
     </w:p>
@@ -19159,7 +19206,7 @@
           <w:sz w:val="19"/>
           <w:szCs w:val="19"/>
         </w:rPr>
-        <w:t xml:space="preserve">Fine-tune</w:t>
+        <w:t xml:space="preserve">Final Noise Reduction</w:t>
       </w:r>
       <w:r>
         <w:rPr>
@@ -19168,14 +19215,14 @@
         </w:rPr>
         <w:tab/>
       </w:r>
-      <w:hyperlink w:history="1" w:anchor="s_9_1">
+      <w:hyperlink w:history="1" w:anchor="s_9_3">
         <w:r>
           <w:rPr>
             <w:rStyle w:val="Hyperlink"/>
             <w:sz w:val="19"/>
             <w:szCs w:val="19"/>
           </w:rPr>
-          <w:t xml:space="preserve">9.1</w:t>
+          <w:t xml:space="preserve">9.3</w:t>
         </w:r>
       </w:hyperlink>
     </w:p>
@@ -19191,7 +19238,7 @@
           <w:sz w:val="19"/>
           <w:szCs w:val="19"/>
         </w:rPr>
-        <w:t xml:space="preserve">Finished folder</w:t>
+        <w:t xml:space="preserve">Fine-tune</w:t>
       </w:r>
       <w:r>
         <w:rPr>
@@ -19200,14 +19247,14 @@
         </w:rPr>
         <w:tab/>
       </w:r>
-      <w:hyperlink w:history="1" w:anchor="s_13_1">
+      <w:hyperlink w:history="1" w:anchor="s_9_1">
         <w:r>
           <w:rPr>
             <w:rStyle w:val="Hyperlink"/>
             <w:sz w:val="19"/>
             <w:szCs w:val="19"/>
           </w:rPr>
-          <w:t xml:space="preserve">13.1</w:t>
+          <w:t xml:space="preserve">9.1</w:t>
         </w:r>
       </w:hyperlink>
     </w:p>
@@ -19223,7 +19270,7 @@
           <w:sz w:val="19"/>
           <w:szCs w:val="19"/>
         </w:rPr>
-        <w:t xml:space="preserve">FITS</w:t>
+        <w:t xml:space="preserve">Finished folder</w:t>
       </w:r>
       <w:r>
         <w:rPr>
@@ -19232,14 +19279,14 @@
         </w:rPr>
         <w:tab/>
       </w:r>
-      <w:hyperlink w:history="1" w:anchor="s_2_3">
+      <w:hyperlink w:history="1" w:anchor="s_13_1">
         <w:r>
           <w:rPr>
             <w:rStyle w:val="Hyperlink"/>
             <w:sz w:val="19"/>
             <w:szCs w:val="19"/>
           </w:rPr>
-          <w:t xml:space="preserve">2.3</w:t>
+          <w:t xml:space="preserve">13.1</w:t>
         </w:r>
       </w:hyperlink>
     </w:p>
@@ -19255,7 +19302,7 @@
           <w:sz w:val="19"/>
           <w:szCs w:val="19"/>
         </w:rPr>
-        <w:t xml:space="preserve">FITS header</w:t>
+        <w:t xml:space="preserve">FITS</w:t>
       </w:r>
       <w:r>
         <w:rPr>
@@ -19264,14 +19311,14 @@
         </w:rPr>
         <w:tab/>
       </w:r>
-      <w:hyperlink w:history="1" w:anchor="s_6_4">
+      <w:hyperlink w:history="1" w:anchor="s_2_3">
         <w:r>
           <w:rPr>
             <w:rStyle w:val="Hyperlink"/>
             <w:sz w:val="19"/>
             <w:szCs w:val="19"/>
           </w:rPr>
-          <w:t xml:space="preserve">6.4</w:t>
+          <w:t xml:space="preserve">2.3</w:t>
         </w:r>
       </w:hyperlink>
     </w:p>
@@ -19287,7 +19334,7 @@
           <w:sz w:val="19"/>
           <w:szCs w:val="19"/>
         </w:rPr>
-        <w:t xml:space="preserve">Fix Dust Donuts</w:t>
+        <w:t xml:space="preserve">FITS header</w:t>
       </w:r>
       <w:r>
         <w:rPr>
@@ -19296,59 +19343,59 @@
         </w:rPr>
         <w:tab/>
       </w:r>
-      <w:hyperlink w:history="1" w:anchor="s_9_3">
+      <w:hyperlink w:history="1" w:anchor="s_6_4">
         <w:r>
           <w:rPr>
             <w:rStyle w:val="Hyperlink"/>
             <w:sz w:val="19"/>
             <w:szCs w:val="19"/>
           </w:rPr>
-          <w:t xml:space="preserve">9.3</w:t>
-        </w:r>
-      </w:hyperlink>
-      <w:r>
-        <w:t xml:space="preserve">, </w:t>
-      </w:r>
-      <w:hyperlink w:history="1" w:anchor="s_9_4">
+          <w:t xml:space="preserve">6.4</w:t>
+        </w:r>
+      </w:hyperlink>
+    </w:p>
+    <w:p>
+      <w:pPr>
+        <w:tabs>
+          <w:tab w:val="right" w:pos="4200" w:leader="dot"/>
+        </w:tabs>
+        <w:spacing w:after="10"/>
+      </w:pPr>
+      <w:r>
+        <w:rPr>
+          <w:sz w:val="19"/>
+          <w:szCs w:val="19"/>
+        </w:rPr>
+        <w:t xml:space="preserve">Fix Dust Donuts</w:t>
+      </w:r>
+      <w:r>
+        <w:rPr>
+          <w:sz w:val="19"/>
+          <w:szCs w:val="19"/>
+        </w:rPr>
+        <w:tab/>
+      </w:r>
+      <w:hyperlink w:history="1" w:anchor="s_9_3">
         <w:r>
           <w:rPr>
             <w:rStyle w:val="Hyperlink"/>
             <w:sz w:val="19"/>
             <w:szCs w:val="19"/>
           </w:rPr>
-          <w:t xml:space="preserve">9.4</w:t>
-        </w:r>
-      </w:hyperlink>
-    </w:p>
-    <w:p>
-      <w:pPr>
-        <w:tabs>
-          <w:tab w:val="right" w:pos="4200" w:leader="dot"/>
-        </w:tabs>
-        <w:spacing w:after="10"/>
-      </w:pPr>
-      <w:r>
-        <w:rPr>
-          <w:sz w:val="19"/>
-          <w:szCs w:val="19"/>
-        </w:rPr>
-        <w:t xml:space="preserve">Flag</w:t>
-      </w:r>
-      <w:r>
-        <w:rPr>
-          <w:sz w:val="19"/>
-          <w:szCs w:val="19"/>
-        </w:rPr>
-        <w:tab/>
-      </w:r>
-      <w:hyperlink w:history="1" w:anchor="s_6_3">
+          <w:t xml:space="preserve">9.3</w:t>
+        </w:r>
+      </w:hyperlink>
+      <w:r>
+        <w:t xml:space="preserve">, </w:t>
+      </w:r>
+      <w:hyperlink w:history="1" w:anchor="s_9_4">
         <w:r>
           <w:rPr>
             <w:rStyle w:val="Hyperlink"/>
             <w:sz w:val="19"/>
             <w:szCs w:val="19"/>
           </w:rPr>
-          <w:t xml:space="preserve">6.3</w:t>
+          <w:t xml:space="preserve">9.4</w:t>
         </w:r>
       </w:hyperlink>
     </w:p>
@@ -19364,7 +19411,7 @@
           <w:sz w:val="19"/>
           <w:szCs w:val="19"/>
         </w:rPr>
-        <w:t xml:space="preserve">Flat warnings</w:t>
+        <w:t xml:space="preserve">Flag</w:t>
       </w:r>
       <w:r>
         <w:rPr>
@@ -19373,14 +19420,14 @@
         </w:rPr>
         <w:tab/>
       </w:r>
-      <w:hyperlink w:history="1" w:anchor="s_7_2">
+      <w:hyperlink w:history="1" w:anchor="s_6_3">
         <w:r>
           <w:rPr>
             <w:rStyle w:val="Hyperlink"/>
             <w:sz w:val="19"/>
             <w:szCs w:val="19"/>
           </w:rPr>
-          <w:t xml:space="preserve">7.2</w:t>
+          <w:t xml:space="preserve">6.3</w:t>
         </w:r>
       </w:hyperlink>
     </w:p>
@@ -19396,7 +19443,7 @@
           <w:sz w:val="19"/>
           <w:szCs w:val="19"/>
         </w:rPr>
-        <w:t xml:space="preserve">Flats</w:t>
+        <w:t xml:space="preserve">Flat warnings</w:t>
       </w:r>
       <w:r>
         <w:rPr>
@@ -19405,14 +19452,14 @@
         </w:rPr>
         <w:tab/>
       </w:r>
-      <w:hyperlink w:history="1" w:anchor="s_4_3">
+      <w:hyperlink w:history="1" w:anchor="s_7_2">
         <w:r>
           <w:rPr>
             <w:rStyle w:val="Hyperlink"/>
             <w:sz w:val="19"/>
             <w:szCs w:val="19"/>
           </w:rPr>
-          <w:t xml:space="preserve">4.3</w:t>
+          <w:t xml:space="preserve">7.2</w:t>
         </w:r>
       </w:hyperlink>
     </w:p>
@@ -19428,7 +19475,7 @@
           <w:sz w:val="19"/>
           <w:szCs w:val="19"/>
         </w:rPr>
-        <w:t xml:space="preserve">Flip the Picture</w:t>
+        <w:t xml:space="preserve">Flats</w:t>
       </w:r>
       <w:r>
         <w:rPr>
@@ -19437,14 +19484,14 @@
         </w:rPr>
         <w:tab/>
       </w:r>
-      <w:hyperlink w:history="1" w:anchor="s_9_3">
+      <w:hyperlink w:history="1" w:anchor="s_4_3">
         <w:r>
           <w:rPr>
             <w:rStyle w:val="Hyperlink"/>
             <w:sz w:val="19"/>
             <w:szCs w:val="19"/>
           </w:rPr>
-          <w:t xml:space="preserve">9.3</w:t>
+          <w:t xml:space="preserve">4.3</w:t>
         </w:r>
       </w:hyperlink>
     </w:p>
@@ -19460,7 +19507,7 @@
           <w:sz w:val="19"/>
           <w:szCs w:val="19"/>
         </w:rPr>
-        <w:t xml:space="preserve">Folder organisation</w:t>
+        <w:t xml:space="preserve">Flip the Picture</w:t>
       </w:r>
       <w:r>
         <w:rPr>
@@ -19469,14 +19516,14 @@
         </w:rPr>
         <w:tab/>
       </w:r>
-      <w:hyperlink w:history="1" w:anchor="s_2_3">
+      <w:hyperlink w:history="1" w:anchor="s_9_3">
         <w:r>
           <w:rPr>
             <w:rStyle w:val="Hyperlink"/>
             <w:sz w:val="19"/>
             <w:szCs w:val="19"/>
           </w:rPr>
-          <w:t xml:space="preserve">2.3</w:t>
+          <w:t xml:space="preserve">9.3</w:t>
         </w:r>
       </w:hyperlink>
     </w:p>
@@ -19492,7 +19539,7 @@
           <w:sz w:val="19"/>
           <w:szCs w:val="19"/>
         </w:rPr>
-        <w:t xml:space="preserve">Four pages</w:t>
+        <w:t xml:space="preserve">Folder organisation</w:t>
       </w:r>
       <w:r>
         <w:rPr>
@@ -19501,14 +19548,14 @@
         </w:rPr>
         <w:tab/>
       </w:r>
-      <w:hyperlink w:history="1" w:anchor="s_1_1">
+      <w:hyperlink w:history="1" w:anchor="s_2_3">
         <w:r>
           <w:rPr>
             <w:rStyle w:val="Hyperlink"/>
             <w:sz w:val="19"/>
             <w:szCs w:val="19"/>
           </w:rPr>
-          <w:t xml:space="preserve">1.1</w:t>
+          <w:t xml:space="preserve">2.3</w:t>
         </w:r>
       </w:hyperlink>
     </w:p>
@@ -19524,7 +19571,7 @@
           <w:sz w:val="19"/>
           <w:szCs w:val="19"/>
         </w:rPr>
-        <w:t xml:space="preserve">FWHM</w:t>
+        <w:t xml:space="preserve">Four pages</w:t>
       </w:r>
       <w:r>
         <w:rPr>
@@ -19533,26 +19580,58 @@
         </w:rPr>
         <w:tab/>
       </w:r>
-      <w:hyperlink w:history="1" w:anchor="s_1_3">
+      <w:hyperlink w:history="1" w:anchor="s_1_1">
         <w:r>
           <w:rPr>
             <w:rStyle w:val="Hyperlink"/>
             <w:sz w:val="19"/>
             <w:szCs w:val="19"/>
           </w:rPr>
-          <w:t xml:space="preserve">1.3</w:t>
-        </w:r>
-      </w:hyperlink>
-      <w:r>
-        <w:t xml:space="preserve">, </w:t>
-      </w:r>
-      <w:hyperlink w:history="1" w:anchor="s_6_2">
+          <w:t xml:space="preserve">1.1</w:t>
+        </w:r>
+      </w:hyperlink>
+    </w:p>
+    <w:p>
+      <w:pPr>
+        <w:tabs>
+          <w:tab w:val="right" w:pos="4200" w:leader="dot"/>
+        </w:tabs>
+        <w:spacing w:after="10"/>
+      </w:pPr>
+      <w:r>
+        <w:rPr>
+          <w:sz w:val="19"/>
+          <w:szCs w:val="19"/>
+        </w:rPr>
+        <w:t xml:space="preserve">FWHM</w:t>
+      </w:r>
+      <w:r>
+        <w:rPr>
+          <w:sz w:val="19"/>
+          <w:szCs w:val="19"/>
+        </w:rPr>
+        <w:tab/>
+      </w:r>
+      <w:hyperlink w:history="1" w:anchor="s_1_3">
         <w:r>
           <w:rPr>
             <w:rStyle w:val="Hyperlink"/>
             <w:sz w:val="19"/>
             <w:szCs w:val="19"/>
           </w:rPr>
+          <w:t xml:space="preserve">1.3</w:t>
+        </w:r>
+      </w:hyperlink>
+      <w:r>
+        <w:t xml:space="preserve">, </w:t>
+      </w:r>
+      <w:hyperlink w:history="1" w:anchor="s_6_2">
+        <w:r>
+          <w:rPr>
+            <w:rStyle w:val="Hyperlink"/>
+            <w:sz w:val="19"/>
+            <w:szCs w:val="19"/>
+          </w:rPr>
           <w:t xml:space="preserve">6.2</w:t>
         </w:r>
       </w:hyperlink>
@@ -23088,6 +23167,38 @@
             <w:szCs w:val="19"/>
           </w:rPr>
           <w:t xml:space="preserve">6.1</w:t>
+        </w:r>
+      </w:hyperlink>
+    </w:p>
+    <w:p>
+      <w:pPr>
+        <w:tabs>
+          <w:tab w:val="right" w:pos="4200" w:leader="dot"/>
+        </w:tabs>
+        <w:spacing w:after="10"/>
+      </w:pPr>
+      <w:r>
+        <w:rPr>
+          <w:sz w:val="19"/>
+          <w:szCs w:val="19"/>
+        </w:rPr>
+        <w:t xml:space="preserve">Several masters per filter</w:t>
+      </w:r>
+      <w:r>
+        <w:rPr>
+          <w:sz w:val="19"/>
+          <w:szCs w:val="19"/>
+        </w:rPr>
+        <w:tab/>
+      </w:r>
+      <w:hyperlink w:history="1" w:anchor="s_9_1">
+        <w:r>
+          <w:rPr>
+            <w:rStyle w:val="Hyperlink"/>
+            <w:sz w:val="19"/>
+            <w:szCs w:val="19"/>
+          </w:rPr>
+          <w:t xml:space="preserve">9.1</w:t>
         </w:r>
       </w:hyperlink>
     </w:p>

</xml_diff>

<commit_message>
v0.9.42: Finishing Touches leaves out masters it can't line up; crops to the common area
Thor's Helmet (Telescope Live, 3 years of masters): most masters could not be star-matched on
pages 2-4 and were 'used as they are', giving double stars and coloured wedge borders. A master
whose stars don't match is now left out when its filter has other masters, and the picture is
cropped to the area all masters cover. (The matcher itself needs real data to improve - a random
field still finds ~20 chance matches, so it can't simply be loosened.)

Co-Authored-By: Claude Opus 5.5 <noreply@anthropic.com>
Claude-Session: https://claude.ai/code/session_01FKvd69QsnCvM2zbzYnPwmF
</commit_message>
<xml_diff>
--- a/docs/SubZeroAstro_User_Manual.docx
+++ b/docs/SubZeroAstro_User_Manual.docx
@@ -121,7 +121,7 @@
           <w:sz w:val="22"/>
           <w:szCs w:val="22"/>
         </w:rPr>
-        <w:t xml:space="preserve">Version 0.9.41 beta  ·  Windows and Mac (Apple silicon)</w:t>
+        <w:t xml:space="preserve">Version 0.9.42 beta  ·  Windows and Mac (Apple silicon)</w:t>
       </w:r>
     </w:p>
     <w:p>
@@ -10283,7 +10283,7 @@
         <w:t xml:space="preserve">Several masters per filter, or masters from different setups.</w:t>
       </w:r>
       <w:r>
-        <w:t xml:space="preserve"> When you load more than one master of the same filter (other nights, other cameras or telescopes), all of them are used: they are brought to the same brightness and averaged, the less noisy ones counting more. Every master is first matched star by star to one reference master. Masters from another camera or telescope are bent slightly differently by their optics - most at the edges, which would give coloured double stars in the corners - so SubZeroAstro measures that distortion from hundreds of stars and corrects it. The note under the title says how many masters were combined and corrected.</w:t>
+        <w:t xml:space="preserve"> When you load more than one master of the same filter (other nights, other cameras or telescopes), all of them are used: they are brought to the same brightness and averaged, the less noisy ones counting more. Every master is first matched star by star to one reference master. Masters from another camera or telescope are bent slightly differently by their optics - most at the edges, which would give coloured double stars in the corners - so SubZeroAstro measures that distortion from hundreds of stars and corrects it. A master whose stars cannot be matched to the others is left out (when its filter has other masters), so it can't cause double stars, and the picture is cropped to the area all masters cover. The note under the title says how many masters were combined, corrected or left out.</w:t>
       </w:r>
     </w:p>
     <w:p>

</xml_diff>

<commit_message>
v0.9.43: stacking corrects field distortion per frame (meridian flips, other setups)
Thor's Helmet from one session still had doubled stars of the same colour near the edges: after a
meridian flip the optics' (decentred) distortion turns with the camera, so an affine alignment
matches the centre but not the corners. Each frame's stars are now re-paired with a wider tolerance
and, when the edges are off by 0.6 px or more, the frame is warped with a polynomial model (order
2-3) fitted to its stars. Test: edge-star sharpness 0.063 -> 0.067 (= centre).

Co-Authored-By: Claude Opus 5.5 <noreply@anthropic.com>
Claude-Session: https://claude.ai/code/session_01FKvd69QsnCvM2zbzYnPwmF
</commit_message>
<xml_diff>
--- a/docs/SubZeroAstro_User_Manual.docx
+++ b/docs/SubZeroAstro_User_Manual.docx
@@ -121,7 +121,7 @@
           <w:sz w:val="22"/>
           <w:szCs w:val="22"/>
         </w:rPr>
-        <w:t xml:space="preserve">Version 0.9.42 beta  ·  Windows and Mac (Apple silicon)</w:t>
+        <w:t xml:space="preserve">Version 0.9.43 beta  ·  Windows and Mac (Apple silicon)</w:t>
       </w:r>
     </w:p>
     <w:p>
@@ -8436,6 +8436,31 @@
       </w:r>
       <w:r>
         <w:t xml:space="preserve"> (on) - all masters of a target share one pixel grid, ready to combine (LRGB, SHO).</w:t>
+      </w:r>
+    </w:p>
+    <w:p>
+      <w:pPr>
+        <w:spacing w:after="120"/>
+      </w:pPr>
+      <w:r>
+        <w:rPr>
+          <w:b/>
+          <w:bCs/>
+        </w:rPr>
+        <w:t xml:space="preserve">Sharp stars to the corners.</w:t>
+      </w:r>
+      <w:r>
+        <w:t xml:space="preserve"> Every telescope bends the field a little, mostly at the edges. After a </w:t>
+      </w:r>
+      <w:r>
+        <w:rPr>
+          <w:b/>
+          <w:bCs/>
+        </w:rPr>
+        <w:t xml:space="preserve">meridian flip</w:t>
+      </w:r>
+      <w:r>
+        <w:t xml:space="preserve"> (or between nights with another setup) that bending is turned round with the camera, so a plain shift-and-rotate alignment lines up the centre but leaves stars a pixel or two apart near the edges - doubled or smeared corner stars. SubZeroAstro measures each frame's stars against the reference and, when the edges are off, lines that frame up with a smooth distortion model instead. The stack log says how many frames were corrected.</w:t>
       </w:r>
     </w:p>
     <w:p>

</xml_diff>

<commit_message>
v0.9.47: run Mote Buster and Spot Fix again on the fixed picture
After a fix the tool stays open on the new picture: circle what is left and fix again (each
round is its own step, Undo takes back the last). 'Done – Next Step' closes it and moves on.
Both tools can also be reopened from the step list after they are done.

Co-Authored-By: Claude Opus 5.5 <noreply@anthropic.com>
Claude-Session: https://claude.ai/code/session_01FKvd69QsnCvM2zbzYnPwmF
</commit_message>
<xml_diff>
--- a/docs/SubZeroAstro_User_Manual.docx
+++ b/docs/SubZeroAstro_User_Manual.docx
@@ -121,7 +121,7 @@
           <w:sz w:val="22"/>
           <w:szCs w:val="22"/>
         </w:rPr>
-        <w:t xml:space="preserve">Version 0.9.46 beta  ·  Windows and Mac (Apple silicon)</w:t>
+        <w:t xml:space="preserve">Version 0.9.47 beta  ·  Windows and Mac (Apple silicon)</w:t>
       </w:r>
     </w:p>
     <w:p>
@@ -12255,17 +12255,37 @@
         <w:spacing w:after="60"/>
       </w:pPr>
       <w:r>
-        <w:t xml:space="preserve">Check the preview, then </w:t>
-      </w:r>
-      <w:r>
-        <w:rPr>
-          <w:b/>
-          <w:bCs/>
-        </w:rPr>
-        <w:t xml:space="preserve">Apply</w:t>
-      </w:r>
-      <w:r>
-        <w:t xml:space="preserve">. For small specks (hot pixels, satellite remnants) use </w:t>
+        <w:t xml:space="preserve">Check the preview, then press the fix button. Mote Buster stays open on the </w:t>
+      </w:r>
+      <w:r>
+        <w:rPr>
+          <w:b/>
+          <w:bCs/>
+        </w:rPr>
+        <w:t xml:space="preserve">fixed picture</w:t>
+      </w:r>
+      <w:r>
+        <w:t xml:space="preserve">, so you can circle any donuts that are left and fix again - as many rounds as you like (each round is its own step; </w:t>
+      </w:r>
+      <w:r>
+        <w:rPr>
+          <w:i/>
+          <w:iCs/>
+        </w:rPr>
+        <w:t xml:space="preserve">Undo Last Step</w:t>
+      </w:r>
+      <w:r>
+        <w:t xml:space="preserve"> takes back the last one). Press </w:t>
+      </w:r>
+      <w:r>
+        <w:rPr>
+          <w:b/>
+          <w:bCs/>
+        </w:rPr>
+        <w:t xml:space="preserve">Done – Next Step ➜</w:t>
+      </w:r>
+      <w:r>
+        <w:t xml:space="preserve"> when you are happy. Spot Fix works the same way. For small specks (hot pixels, satellite remnants) use </w:t>
       </w:r>
       <w:r>
         <w:rPr>

</xml_diff>

<commit_message>
v0.9.48: Do It Again for repeatable steps; previews say how much they change
The preview note now says what share of the picture a version or fine-tune setting visibly
changes, and says plainly when it barely changes anything (e.g. no green cast or burnt core to
fix), so sliders that seem to do nothing are explained. Includes 'Do It Again'.

Co-Authored-By: Claude Opus 5.5 <noreply@anthropic.com>
Claude-Session: https://claude.ai/code/session_01FKvd69QsnCvM2zbzYnPwmF
</commit_message>
<xml_diff>
--- a/docs/SubZeroAstro_User_Manual.docx
+++ b/docs/SubZeroAstro_User_Manual.docx
@@ -121,7 +121,7 @@
           <w:sz w:val="22"/>
           <w:szCs w:val="22"/>
         </w:rPr>
-        <w:t xml:space="preserve">Version 0.9.47 beta  ·  Windows and Mac (Apple silicon)</w:t>
+        <w:t xml:space="preserve">Version 0.9.48 beta  ·  Windows and Mac (Apple silicon)</w:t>
       </w:r>
     </w:p>
     <w:p>
@@ -10197,7 +10197,17 @@
         <w:t xml:space="preserve">Reset</w:t>
       </w:r>
       <w:r>
-        <w:t xml:space="preserve"> returns to the version you picked.</w:t>
+        <w:t xml:space="preserve"> returns to the version you picked. Under the sliders the app says how much of the picture the setting visibly changes - if it says </w:t>
+      </w:r>
+      <w:r>
+        <w:rPr>
+          <w:i/>
+          <w:iCs/>
+        </w:rPr>
+        <w:t xml:space="preserve">This barely changes your picture</w:t>
+      </w:r>
+      <w:r>
+        <w:t xml:space="preserve">, there is little for that step to do on this target (no green cast to remove, no burnt-out core to tame), so the sliders have almost nothing to work on.</w:t>
       </w:r>
     </w:p>
     <w:p>
@@ -10231,6 +10241,39 @@
       </w:r>
       <w:r>
         <w:t xml:space="preserve"> to leave the picture exactly as it was.</w:t>
+      </w:r>
+    </w:p>
+    <w:p>
+      <w:pPr>
+        <w:pStyle w:val="ListParagraph"/>
+        <w:numPr>
+          <w:ilvl w:val="0"/>
+          <w:numId w:val="8"/>
+        </w:numPr>
+        <w:spacing w:after="60"/>
+      </w:pPr>
+      <w:r>
+        <w:t xml:space="preserve">Not quite enough? Many steps can be run again on their own result: after one of them the card shows </w:t>
+      </w:r>
+      <w:r>
+        <w:rPr>
+          <w:b/>
+          <w:bCs/>
+        </w:rPr>
+        <w:t xml:space="preserve">↻ Do It Again</w:t>
+      </w:r>
+      <w:r>
+        <w:t xml:space="preserve"> (and a ✓ step in the list can be clicked to run it again). That works for Balance Colours, Remove Green Cast, Tame Bright Core, Curves, Saturation, Bring Out Hidden Structure, Shrink Stars, Star Colours, Mote Buster, Darken the Sky Background, Final Noise Reduction, Flip, Final Crop and Spot Fix. One-way steps - combining, brightening, taking the stars out or putting them back, signing - are not repeated; use </w:t>
+      </w:r>
+      <w:r>
+        <w:rPr>
+          <w:b/>
+          <w:bCs/>
+        </w:rPr>
+        <w:t xml:space="preserve">Go Back to Here</w:t>
+      </w:r>
+      <w:r>
+        <w:t xml:space="preserve"> to redo those.</w:t>
       </w:r>
     </w:p>
     <w:p>
@@ -18714,6 +18757,38 @@
           <w:szCs w:val="19"/>
         </w:rPr>
         <w:t xml:space="preserve">Do It</w:t>
+      </w:r>
+      <w:r>
+        <w:rPr>
+          <w:sz w:val="19"/>
+          <w:szCs w:val="19"/>
+        </w:rPr>
+        <w:tab/>
+      </w:r>
+      <w:hyperlink w:history="1" w:anchor="s_9_1">
+        <w:r>
+          <w:rPr>
+            <w:rStyle w:val="Hyperlink"/>
+            <w:sz w:val="19"/>
+            <w:szCs w:val="19"/>
+          </w:rPr>
+          <w:t xml:space="preserve">9.1</w:t>
+        </w:r>
+      </w:hyperlink>
+    </w:p>
+    <w:p>
+      <w:pPr>
+        <w:tabs>
+          <w:tab w:val="right" w:pos="4200" w:leader="dot"/>
+        </w:tabs>
+        <w:spacing w:after="10"/>
+      </w:pPr>
+      <w:r>
+        <w:rPr>
+          <w:sz w:val="19"/>
+          <w:szCs w:val="19"/>
+        </w:rPr>
+        <w:t xml:space="preserve">Do It Again</w:t>
       </w:r>
       <w:r>
         <w:rPr>

</xml_diff>

<commit_message>
v0.9.49: recognise ready-made (already calibrated) light frames
Telescope Live (PROC = True), MaxIm DL (CALSTAT), PixInsight/Siril calibration notes and
_cal / _c file names mark a set as already calibrated: no bias, darks, flats or SkyFlat are
applied again, no missing-calibration warnings, and such frames never go into a SkyFlat.

Co-Authored-By: Claude Opus 5.5 <noreply@anthropic.com>
Claude-Session: https://claude.ai/code/session_01FKvd69QsnCvM2zbzYnPwmF
</commit_message>
<xml_diff>
--- a/docs/SubZeroAstro_User_Manual.docx
+++ b/docs/SubZeroAstro_User_Manual.docx
@@ -121,7 +121,7 @@
           <w:sz w:val="22"/>
           <w:szCs w:val="22"/>
         </w:rPr>
-        <w:t xml:space="preserve">Version 0.9.48 beta  ·  Windows and Mac (Apple silicon)</w:t>
+        <w:t xml:space="preserve">Version 0.9.49 beta  ·  Windows and Mac (Apple silicon)</w:t>
       </w:r>
     </w:p>
     <w:p>
@@ -8144,6 +8144,71 @@
       </w:r>
       <w:r>
         <w:t xml:space="preserve"> on Finishing Touches works on one picture.)</w:t>
+      </w:r>
+    </w:p>
+    <w:p>
+      <w:pPr>
+        <w:spacing w:after="120"/>
+      </w:pPr>
+      <w:r>
+        <w:rPr>
+          <w:b/>
+          <w:bCs/>
+        </w:rPr>
+        <w:t xml:space="preserve">Ready-made data is recognised.</w:t>
+      </w:r>
+      <w:r>
+        <w:t xml:space="preserve"> Lights bought already calibrated - from Telescope Live and similar services, or calibrated earlier in other software - must not be calibrated again (the dark would be subtracted twice and the flat divided in twice). SubZeroAstro recognises them from their headers and names: Telescope Live's </w:t>
+      </w:r>
+      <w:r>
+        <w:rPr>
+          <w:i/>
+          <w:iCs/>
+        </w:rPr>
+        <w:t xml:space="preserve">PROC = True</w:t>
+      </w:r>
+      <w:r>
+        <w:t xml:space="preserve">, MaxIm DL's </w:t>
+      </w:r>
+      <w:r>
+        <w:rPr>
+          <w:i/>
+          <w:iCs/>
+        </w:rPr>
+        <w:t xml:space="preserve">CALSTAT</w:t>
+      </w:r>
+      <w:r>
+        <w:t xml:space="preserve">, PixInsight's and Siril's calibration notes, and names such as </w:t>
+      </w:r>
+      <w:r>
+        <w:rPr>
+          <w:i/>
+          <w:iCs/>
+        </w:rPr>
+        <w:t xml:space="preserve">_cal.fits</w:t>
+      </w:r>
+      <w:r>
+        <w:t xml:space="preserve"> or PixInsight's </w:t>
+      </w:r>
+      <w:r>
+        <w:rPr>
+          <w:i/>
+          <w:iCs/>
+        </w:rPr>
+        <w:t xml:space="preserve">_c.xisf</w:t>
+      </w:r>
+      <w:r>
+        <w:t xml:space="preserve">. Such a set shows ✓ </w:t>
+      </w:r>
+      <w:r>
+        <w:rPr>
+          <w:i/>
+          <w:iCs/>
+        </w:rPr>
+        <w:t xml:space="preserve">not needed - the lights are already calibrated (…)</w:t>
+      </w:r>
+      <w:r>
+        <w:t xml:space="preserve"> in the Bias, Darks and Flats cells, gets no SkyFlat, raises no missing-calibration warnings - and its frames are never used to build a SkyFlat for your own lights.</w:t>
       </w:r>
     </w:p>
     <w:p>

</xml_diff>

<commit_message>
v0.9.50: report FITS files damaged by a text-mode download
Binary data saved as text turns every byte above 127 into the replacement character EF BF BD:
the file roughly doubles in size and the picture is noise while the header reads fine. Such
files are now reported as damaged (with what to do) instead of being stacked.

Co-Authored-By: Claude Opus 5.5 <noreply@anthropic.com>
Claude-Session: https://claude.ai/code/session_01FKvd69QsnCvM2zbzYnPwmF
</commit_message>
<xml_diff>
--- a/docs/SubZeroAstro_User_Manual.docx
+++ b/docs/SubZeroAstro_User_Manual.docx
@@ -121,7 +121,7 @@
           <w:sz w:val="22"/>
           <w:szCs w:val="22"/>
         </w:rPr>
-        <w:t xml:space="preserve">Version 0.9.49 beta  ·  Windows and Mac (Apple silicon)</w:t>
+        <w:t xml:space="preserve">Version 0.9.50 beta  ·  Windows and Mac (Apple silicon)</w:t>
       </w:r>
     </w:p>
     <w:p>
@@ -14741,6 +14741,62 @@
           <w:p>
             <w:r>
               <w:t xml:space="preserve">Restart: SubZeroAstro offers to resume from its saved progress.</w:t>
+            </w:r>
+          </w:p>
+        </w:tc>
+      </w:tr>
+      <w:tr>
+        <w:trPr>
+          <w:cantSplit/>
+        </w:trPr>
+        <w:tc>
+          <w:tcPr>
+            <w:tcW w:type="dxa" w:w="3300"/>
+            <w:tcBorders>
+              <w:top w:val="single" w:color="BFBFBF" w:sz="4"/>
+              <w:left w:val="single" w:color="BFBFBF" w:sz="4"/>
+              <w:bottom w:val="single" w:color="BFBFBF" w:sz="4"/>
+              <w:right w:val="single" w:color="BFBFBF" w:sz="4"/>
+            </w:tcBorders>
+            <w:tcMar>
+              <w:top w:type="dxa" w:w="60"/>
+              <w:left w:type="dxa" w:w="100"/>
+              <w:bottom w:type="dxa" w:w="60"/>
+              <w:right w:type="dxa" w:w="100"/>
+            </w:tcMar>
+          </w:tcPr>
+          <w:p>
+            <w:r>
+              <w:t xml:space="preserve">A frame shows </w:t>
+            </w:r>
+            <w:r>
+              <w:rPr>
+                <w:i/>
+                <w:iCs/>
+              </w:rPr>
+              <w:t xml:space="preserve">This file is damaged: its picture data was converted to text</w:t>
+            </w:r>
+          </w:p>
+        </w:tc>
+        <w:tc>
+          <w:tcPr>
+            <w:tcW w:type="dxa" w:w="6060"/>
+            <w:tcBorders>
+              <w:top w:val="single" w:color="BFBFBF" w:sz="4"/>
+              <w:left w:val="single" w:color="BFBFBF" w:sz="4"/>
+              <w:bottom w:val="single" w:color="BFBFBF" w:sz="4"/>
+              <w:right w:val="single" w:color="BFBFBF" w:sz="4"/>
+            </w:tcBorders>
+            <w:tcMar>
+              <w:top w:type="dxa" w:w="60"/>
+              <w:left w:type="dxa" w:w="100"/>
+              <w:bottom w:type="dxa" w:w="60"/>
+              <w:right w:type="dxa" w:w="100"/>
+            </w:tcMar>
+          </w:tcPr>
+          <w:p>
+            <w:r>
+              <w:t xml:space="preserve">The file was downloaded or copied in a way that treated it as text: every byte the text conversion didn't understand was replaced, so the file is about twice its proper size (a 3056×3056 16-bit frame should be about 18.7 MB) and the picture is noise - while the header still reads fine. Such frames can never be aligned or stacked. Download them again (another browser, or as a zip) and check the file size.</w:t>
             </w:r>
           </w:p>
         </w:tc>

</xml_diff>

<commit_message>
v0.9.51: hot pixels are not taken for stars (fixes doubled stars with remote-observatory data)
Undithered calibrated frames (e.g. Telescope Live CHI-1) keep hundreds of hot pixels; 88% of the
'stars' found were sensor defects fixed on the sensor, so frames from different nights could be
matched on the sensor instead of the sky (72 px apart: doubled stars). Single-pixel spikes are now
replaced before stars are looked for (mono data), when stacking and when lining up masters. On the
user's frames all 12 pairings now match with 121-143 stars at 0.14-0.20 px.

Co-Authored-By: Claude Opus 5.5 <noreply@anthropic.com>
Claude-Session: https://claude.ai/code/session_01FKvd69QsnCvM2zbzYnPwmF
</commit_message>
<xml_diff>
--- a/docs/SubZeroAstro_User_Manual.docx
+++ b/docs/SubZeroAstro_User_Manual.docx
@@ -121,7 +121,7 @@
           <w:sz w:val="22"/>
           <w:szCs w:val="22"/>
         </w:rPr>
-        <w:t xml:space="preserve">Version 0.9.50 beta  ·  Windows and Mac (Apple silicon)</w:t>
+        <w:t xml:space="preserve">Version 0.9.51 beta  ·  Windows and Mac (Apple silicon)</w:t>
       </w:r>
     </w:p>
     <w:p>
@@ -14741,6 +14741,55 @@
           <w:p>
             <w:r>
               <w:t xml:space="preserve">Restart: SubZeroAstro offers to resume from its saved progress.</w:t>
+            </w:r>
+          </w:p>
+        </w:tc>
+      </w:tr>
+      <w:tr>
+        <w:trPr>
+          <w:cantSplit/>
+        </w:trPr>
+        <w:tc>
+          <w:tcPr>
+            <w:tcW w:type="dxa" w:w="3300"/>
+            <w:tcBorders>
+              <w:top w:val="single" w:color="BFBFBF" w:sz="4"/>
+              <w:left w:val="single" w:color="BFBFBF" w:sz="4"/>
+              <w:bottom w:val="single" w:color="BFBFBF" w:sz="4"/>
+              <w:right w:val="single" w:color="BFBFBF" w:sz="4"/>
+            </w:tcBorders>
+            <w:tcMar>
+              <w:top w:type="dxa" w:w="60"/>
+              <w:left w:type="dxa" w:w="100"/>
+              <w:bottom w:type="dxa" w:w="60"/>
+              <w:right w:type="dxa" w:w="100"/>
+            </w:tcMar>
+          </w:tcPr>
+          <w:p>
+            <w:r>
+              <w:t xml:space="preserve">Doubled stars with frames from a remote observatory (or any camera with many hot pixels)</w:t>
+            </w:r>
+          </w:p>
+        </w:tc>
+        <w:tc>
+          <w:tcPr>
+            <w:tcW w:type="dxa" w:w="6060"/>
+            <w:tcBorders>
+              <w:top w:val="single" w:color="BFBFBF" w:sz="4"/>
+              <w:left w:val="single" w:color="BFBFBF" w:sz="4"/>
+              <w:bottom w:val="single" w:color="BFBFBF" w:sz="4"/>
+              <w:right w:val="single" w:color="BFBFBF" w:sz="4"/>
+            </w:tcBorders>
+            <w:tcMar>
+              <w:top w:type="dxa" w:w="60"/>
+              <w:left w:type="dxa" w:w="100"/>
+              <w:bottom w:type="dxa" w:w="60"/>
+              <w:right w:type="dxa" w:w="100"/>
+            </w:tcMar>
+          </w:tcPr>
+          <w:p>
+            <w:r>
+              <w:t xml:space="preserve">Fixed in 0.9.51. Calibrated frames that were not dithered can keep hundreds of hot pixels, and those sit in the same place on the sensor in every frame. Before 0.9.51 most of the "stars" found could be hot pixels, so frames from different nights could be lined up on the sensor instead of the sky - giving doubled stars. Now single-pixel spikes are ignored when stars are matched (a real star always spills light into its neighbours). Re-stack such data with 0.9.51 or later.</w:t>
             </w:r>
           </w:p>
         </w:tc>

</xml_diff>

<commit_message>
v0.9.52: File > Clear Everything - Start From Scratch (like PixInsight's Reset Engine)
Forgets saved quality measurements, deletes all saved progress, optionally moves old master
lights aside into 'Old masters <date>' and resets settings to factory defaults (folders, tool
locations, rigs and signature kept). Nothing is deleted from images or masters.

Co-Authored-By: Claude Opus 5.5 <noreply@anthropic.com>
Claude-Session: https://claude.ai/code/session_01FKvd69QsnCvM2zbzYnPwmF
</commit_message>
<xml_diff>
--- a/docs/SubZeroAstro_User_Manual.docx
+++ b/docs/SubZeroAstro_User_Manual.docx
@@ -121,7 +121,7 @@
           <w:sz w:val="22"/>
           <w:szCs w:val="22"/>
         </w:rPr>
-        <w:t xml:space="preserve">Version 0.9.51 beta  ·  Windows and Mac (Apple silicon)</w:t>
+        <w:t xml:space="preserve">Version 0.9.52 beta  ·  Windows and Mac (Apple silicon)</w:t>
       </w:r>
     </w:p>
     <w:p>
@@ -6338,6 +6338,56 @@
       </w:r>
       <w:r>
         <w:t xml:space="preserve">, and reopening the same masters later resumes the project.</w:t>
+      </w:r>
+    </w:p>
+    <w:p>
+      <w:pPr>
+        <w:pStyle w:val="ListParagraph"/>
+        <w:numPr>
+          <w:ilvl w:val="0"/>
+          <w:numId w:val="2"/>
+        </w:numPr>
+        <w:spacing w:after="60"/>
+      </w:pPr>
+      <w:r>
+        <w:rPr>
+          <w:b/>
+          <w:bCs/>
+        </w:rPr>
+        <w:t xml:space="preserve">Clear everything and start from scratch</w:t>
+      </w:r>
+      <w:r>
+        <w:t xml:space="preserve">: </w:t>
+      </w:r>
+      <w:r>
+        <w:rPr>
+          <w:b/>
+          <w:bCs/>
+        </w:rPr>
+        <w:t xml:space="preserve">File › Clear Everything – Start From Scratch…</w:t>
+      </w:r>
+      <w:r>
+        <w:t xml:space="preserve"> forgets the saved quality measurements (page 1 measures every frame again), deletes all saved progress (stacking resume points, page 3 and page 4 step histories, the last session) can move your existing master lights aside into an </w:t>
+      </w:r>
+      <w:r>
+        <w:rPr>
+          <w:i/>
+          <w:iCs/>
+        </w:rPr>
+        <w:t xml:space="preserve">Old masters &lt;date&gt;</w:t>
+      </w:r>
+      <w:r>
+        <w:t xml:space="preserve"> folder, so a new stack starts truly from nothing, and can reset all settings to factory defaults (your folders, tool locations, rig names and signature are kept) - like PixInsight's </w:t>
+      </w:r>
+      <w:r>
+        <w:rPr>
+          <w:i/>
+          <w:iCs/>
+        </w:rPr>
+        <w:t xml:space="preserve">Reset Engine</w:t>
+      </w:r>
+      <w:r>
+        <w:t xml:space="preserve">. Your images, calibration library and masters are never deleted. Then load your light frames again.</w:t>
       </w:r>
     </w:p>
     <w:p>

</xml_diff>

<commit_message>
v0.9.53: plate solutions guide alignment; manual opens with a Highlights section
Frames and masters that carry a plate solution (PinPoint in remote-observatory data, the
reference frame's copied into our masters, ASTAP's on page 3) are lined up from where they point
on the sky, with the stars fine-tuning it: used when the star match fails (NGC 2359 masters and
frames that were 'used as is' or skipped) and when a star match disagrees with the plate solutions
by more than 15 px. Page 3 now lines masters up to the deepest master and gives lined-up masters
the reference's plate solution. The manual gets a two-page Highlights section after the cover.

Co-Authored-By: Claude Opus 5.5 <noreply@anthropic.com>
Claude-Session: https://claude.ai/code/session_01FKvd69QsnCvM2zbzYnPwmF
</commit_message>
<xml_diff>
--- a/docs/SubZeroAstro_User_Manual.docx
+++ b/docs/SubZeroAstro_User_Manual.docx
@@ -121,7 +121,7 @@
           <w:sz w:val="22"/>
           <w:szCs w:val="22"/>
         </w:rPr>
-        <w:t xml:space="preserve">Version 0.9.52 beta  ·  Windows and Mac (Apple silicon)</w:t>
+        <w:t xml:space="preserve">Version 0.9.53 beta  ·  Windows and Mac (Apple silicon)</w:t>
       </w:r>
     </w:p>
     <w:p>
@@ -143,6 +143,3045 @@
         <w:pageBreakBefore/>
       </w:pPr>
       <w:r>
+        <w:t xml:space="preserve">Highlights – what makes SubZeroAstro special</w:t>
+      </w:r>
+    </w:p>
+    <w:p>
+      <w:pPr>
+        <w:spacing w:after="160"/>
+      </w:pPr>
+      <w:r>
+        <w:t xml:space="preserve">The features that set SubZeroAstro apart, grouped by page, with the version each arrived in. Each one is explained in its chapter.</w:t>
+      </w:r>
+    </w:p>
+    <w:p>
+      <w:pPr>
+        <w:pStyle w:val="Heading3"/>
+      </w:pPr>
+      <w:r>
+        <w:t xml:space="preserve">Across the whole app</w:t>
+      </w:r>
+    </w:p>
+    <w:tbl>
+      <w:tblPr>
+        <w:tblW w:type="dxa" w:w="9360"/>
+        <w:tblBorders>
+          <w:top w:val="single" w:color="auto" w:sz="4"/>
+          <w:left w:val="single" w:color="auto" w:sz="4"/>
+          <w:bottom w:val="single" w:color="auto" w:sz="4"/>
+          <w:right w:val="single" w:color="auto" w:sz="4"/>
+          <w:insideH w:val="single" w:color="auto" w:sz="4"/>
+          <w:insideV w:val="single" w:color="auto" w:sz="4"/>
+        </w:tblBorders>
+      </w:tblPr>
+      <w:tblGrid>
+        <w:gridCol w:w="2500"/>
+        <w:gridCol w:w="5960"/>
+        <w:gridCol w:w="900"/>
+      </w:tblGrid>
+      <w:tr>
+        <w:trPr>
+          <w:tblHeader/>
+        </w:trPr>
+        <w:tc>
+          <w:tcPr>
+            <w:tcW w:type="dxa" w:w="2500"/>
+            <w:tcBorders>
+              <w:top w:val="single" w:color="BFBFBF" w:sz="4"/>
+              <w:left w:val="single" w:color="BFBFBF" w:sz="4"/>
+              <w:bottom w:val="single" w:color="BFBFBF" w:sz="4"/>
+              <w:right w:val="single" w:color="BFBFBF" w:sz="4"/>
+            </w:tcBorders>
+            <w:shd w:fill="DCE6F2" w:color="auto" w:val="clear"/>
+            <w:tcMar>
+              <w:top w:type="dxa" w:w="30"/>
+              <w:left w:type="dxa" w:w="90"/>
+              <w:bottom w:type="dxa" w:w="30"/>
+              <w:right w:type="dxa" w:w="90"/>
+            </w:tcMar>
+          </w:tcPr>
+          <w:p>
+            <w:r>
+              <w:rPr>
+                <w:b/>
+                <w:bCs/>
+                <w:sz w:val="18"/>
+                <w:szCs w:val="18"/>
+              </w:rPr>
+              <w:t xml:space="preserve">Feature</w:t>
+            </w:r>
+          </w:p>
+        </w:tc>
+        <w:tc>
+          <w:tcPr>
+            <w:tcW w:type="dxa" w:w="5960"/>
+            <w:tcBorders>
+              <w:top w:val="single" w:color="BFBFBF" w:sz="4"/>
+              <w:left w:val="single" w:color="BFBFBF" w:sz="4"/>
+              <w:bottom w:val="single" w:color="BFBFBF" w:sz="4"/>
+              <w:right w:val="single" w:color="BFBFBF" w:sz="4"/>
+            </w:tcBorders>
+            <w:shd w:fill="DCE6F2" w:color="auto" w:val="clear"/>
+            <w:tcMar>
+              <w:top w:type="dxa" w:w="30"/>
+              <w:left w:type="dxa" w:w="90"/>
+              <w:bottom w:type="dxa" w:w="30"/>
+              <w:right w:type="dxa" w:w="90"/>
+            </w:tcMar>
+          </w:tcPr>
+          <w:p>
+            <w:r>
+              <w:rPr>
+                <w:b/>
+                <w:bCs/>
+                <w:sz w:val="18"/>
+                <w:szCs w:val="18"/>
+              </w:rPr>
+              <w:t xml:space="preserve">What it does</w:t>
+            </w:r>
+          </w:p>
+        </w:tc>
+        <w:tc>
+          <w:tcPr>
+            <w:tcW w:type="dxa" w:w="900"/>
+            <w:tcBorders>
+              <w:top w:val="single" w:color="BFBFBF" w:sz="4"/>
+              <w:left w:val="single" w:color="BFBFBF" w:sz="4"/>
+              <w:bottom w:val="single" w:color="BFBFBF" w:sz="4"/>
+              <w:right w:val="single" w:color="BFBFBF" w:sz="4"/>
+            </w:tcBorders>
+            <w:shd w:fill="DCE6F2" w:color="auto" w:val="clear"/>
+            <w:tcMar>
+              <w:top w:type="dxa" w:w="30"/>
+              <w:left w:type="dxa" w:w="90"/>
+              <w:bottom w:type="dxa" w:w="30"/>
+              <w:right w:type="dxa" w:w="90"/>
+            </w:tcMar>
+          </w:tcPr>
+          <w:p>
+            <w:r>
+              <w:rPr>
+                <w:b/>
+                <w:bCs/>
+                <w:sz w:val="18"/>
+                <w:szCs w:val="18"/>
+              </w:rPr>
+              <w:t xml:space="preserve">Since</w:t>
+            </w:r>
+          </w:p>
+        </w:tc>
+      </w:tr>
+      <w:tr>
+        <w:trPr>
+          <w:cantSplit/>
+        </w:trPr>
+        <w:tc>
+          <w:tcPr>
+            <w:tcW w:type="dxa" w:w="2500"/>
+            <w:tcBorders>
+              <w:top w:val="single" w:color="BFBFBF" w:sz="4"/>
+              <w:left w:val="single" w:color="BFBFBF" w:sz="4"/>
+              <w:bottom w:val="single" w:color="BFBFBF" w:sz="4"/>
+              <w:right w:val="single" w:color="BFBFBF" w:sz="4"/>
+            </w:tcBorders>
+            <w:tcMar>
+              <w:top w:type="dxa" w:w="30"/>
+              <w:left w:type="dxa" w:w="90"/>
+              <w:bottom w:type="dxa" w:w="30"/>
+              <w:right w:type="dxa" w:w="90"/>
+            </w:tcMar>
+          </w:tcPr>
+          <w:p>
+            <w:r>
+              <w:rPr>
+                <w:sz w:val="18"/>
+                <w:szCs w:val="18"/>
+              </w:rPr>
+              <w:t xml:space="preserve">Ready-made data recognised</w:t>
+            </w:r>
+          </w:p>
+        </w:tc>
+        <w:tc>
+          <w:tcPr>
+            <w:tcW w:type="dxa" w:w="5960"/>
+            <w:tcBorders>
+              <w:top w:val="single" w:color="BFBFBF" w:sz="4"/>
+              <w:left w:val="single" w:color="BFBFBF" w:sz="4"/>
+              <w:bottom w:val="single" w:color="BFBFBF" w:sz="4"/>
+              <w:right w:val="single" w:color="BFBFBF" w:sz="4"/>
+            </w:tcBorders>
+            <w:tcMar>
+              <w:top w:type="dxa" w:w="30"/>
+              <w:left w:type="dxa" w:w="90"/>
+              <w:bottom w:type="dxa" w:w="30"/>
+              <w:right w:type="dxa" w:w="90"/>
+            </w:tcMar>
+          </w:tcPr>
+          <w:p>
+            <w:r>
+              <w:rPr>
+                <w:sz w:val="18"/>
+                <w:szCs w:val="18"/>
+              </w:rPr>
+              <w:t xml:space="preserve">Telescope Live (PROC = True), MaxIm DL (CALSTAT), PixInsight and Siril calibration notes, and _cal / _c file names mark lights as already calibrated: no double calibration, no SkyFlat, no false warnings</w:t>
+            </w:r>
+          </w:p>
+        </w:tc>
+        <w:tc>
+          <w:tcPr>
+            <w:tcW w:type="dxa" w:w="900"/>
+            <w:tcBorders>
+              <w:top w:val="single" w:color="BFBFBF" w:sz="4"/>
+              <w:left w:val="single" w:color="BFBFBF" w:sz="4"/>
+              <w:bottom w:val="single" w:color="BFBFBF" w:sz="4"/>
+              <w:right w:val="single" w:color="BFBFBF" w:sz="4"/>
+            </w:tcBorders>
+            <w:tcMar>
+              <w:top w:type="dxa" w:w="30"/>
+              <w:left w:type="dxa" w:w="90"/>
+              <w:bottom w:type="dxa" w:w="30"/>
+              <w:right w:type="dxa" w:w="90"/>
+            </w:tcMar>
+          </w:tcPr>
+          <w:p>
+            <w:r>
+              <w:rPr>
+                <w:sz w:val="18"/>
+                <w:szCs w:val="18"/>
+              </w:rPr>
+              <w:t xml:space="preserve">0.9.49</w:t>
+            </w:r>
+          </w:p>
+        </w:tc>
+      </w:tr>
+      <w:tr>
+        <w:trPr>
+          <w:cantSplit/>
+        </w:trPr>
+        <w:tc>
+          <w:tcPr>
+            <w:tcW w:type="dxa" w:w="2500"/>
+            <w:tcBorders>
+              <w:top w:val="single" w:color="BFBFBF" w:sz="4"/>
+              <w:left w:val="single" w:color="BFBFBF" w:sz="4"/>
+              <w:bottom w:val="single" w:color="BFBFBF" w:sz="4"/>
+              <w:right w:val="single" w:color="BFBFBF" w:sz="4"/>
+            </w:tcBorders>
+            <w:tcMar>
+              <w:top w:type="dxa" w:w="30"/>
+              <w:left w:type="dxa" w:w="90"/>
+              <w:bottom w:type="dxa" w:w="30"/>
+              <w:right w:type="dxa" w:w="90"/>
+            </w:tcMar>
+          </w:tcPr>
+          <w:p>
+            <w:r>
+              <w:rPr>
+                <w:sz w:val="18"/>
+                <w:szCs w:val="18"/>
+              </w:rPr>
+              <w:t xml:space="preserve">Damaged-file detection</w:t>
+            </w:r>
+          </w:p>
+        </w:tc>
+        <w:tc>
+          <w:tcPr>
+            <w:tcW w:type="dxa" w:w="5960"/>
+            <w:tcBorders>
+              <w:top w:val="single" w:color="BFBFBF" w:sz="4"/>
+              <w:left w:val="single" w:color="BFBFBF" w:sz="4"/>
+              <w:bottom w:val="single" w:color="BFBFBF" w:sz="4"/>
+              <w:right w:val="single" w:color="BFBFBF" w:sz="4"/>
+            </w:tcBorders>
+            <w:tcMar>
+              <w:top w:type="dxa" w:w="30"/>
+              <w:left w:type="dxa" w:w="90"/>
+              <w:bottom w:type="dxa" w:w="30"/>
+              <w:right w:type="dxa" w:w="90"/>
+            </w:tcMar>
+          </w:tcPr>
+          <w:p>
+            <w:r>
+              <w:rPr>
+                <w:sz w:val="18"/>
+                <w:szCs w:val="18"/>
+              </w:rPr>
+              <w:t xml:space="preserve">Spots FITS files whose picture data was turned into text by a bad download or copy, and says so instead of stacking noise</w:t>
+            </w:r>
+          </w:p>
+        </w:tc>
+        <w:tc>
+          <w:tcPr>
+            <w:tcW w:type="dxa" w:w="900"/>
+            <w:tcBorders>
+              <w:top w:val="single" w:color="BFBFBF" w:sz="4"/>
+              <w:left w:val="single" w:color="BFBFBF" w:sz="4"/>
+              <w:bottom w:val="single" w:color="BFBFBF" w:sz="4"/>
+              <w:right w:val="single" w:color="BFBFBF" w:sz="4"/>
+            </w:tcBorders>
+            <w:tcMar>
+              <w:top w:type="dxa" w:w="30"/>
+              <w:left w:type="dxa" w:w="90"/>
+              <w:bottom w:type="dxa" w:w="30"/>
+              <w:right w:type="dxa" w:w="90"/>
+            </w:tcMar>
+          </w:tcPr>
+          <w:p>
+            <w:r>
+              <w:rPr>
+                <w:sz w:val="18"/>
+                <w:szCs w:val="18"/>
+              </w:rPr>
+              <w:t xml:space="preserve">0.9.50</w:t>
+            </w:r>
+          </w:p>
+        </w:tc>
+      </w:tr>
+      <w:tr>
+        <w:trPr>
+          <w:cantSplit/>
+        </w:trPr>
+        <w:tc>
+          <w:tcPr>
+            <w:tcW w:type="dxa" w:w="2500"/>
+            <w:tcBorders>
+              <w:top w:val="single" w:color="BFBFBF" w:sz="4"/>
+              <w:left w:val="single" w:color="BFBFBF" w:sz="4"/>
+              <w:bottom w:val="single" w:color="BFBFBF" w:sz="4"/>
+              <w:right w:val="single" w:color="BFBFBF" w:sz="4"/>
+            </w:tcBorders>
+            <w:tcMar>
+              <w:top w:type="dxa" w:w="30"/>
+              <w:left w:type="dxa" w:w="90"/>
+              <w:bottom w:type="dxa" w:w="30"/>
+              <w:right w:type="dxa" w:w="90"/>
+            </w:tcMar>
+          </w:tcPr>
+          <w:p>
+            <w:r>
+              <w:rPr>
+                <w:sz w:val="18"/>
+                <w:szCs w:val="18"/>
+              </w:rPr>
+              <w:t xml:space="preserve">Clear Everything – Start From Scratch</w:t>
+            </w:r>
+          </w:p>
+        </w:tc>
+        <w:tc>
+          <w:tcPr>
+            <w:tcW w:type="dxa" w:w="5960"/>
+            <w:tcBorders>
+              <w:top w:val="single" w:color="BFBFBF" w:sz="4"/>
+              <w:left w:val="single" w:color="BFBFBF" w:sz="4"/>
+              <w:bottom w:val="single" w:color="BFBFBF" w:sz="4"/>
+              <w:right w:val="single" w:color="BFBFBF" w:sz="4"/>
+            </w:tcBorders>
+            <w:tcMar>
+              <w:top w:type="dxa" w:w="30"/>
+              <w:left w:type="dxa" w:w="90"/>
+              <w:bottom w:type="dxa" w:w="30"/>
+              <w:right w:type="dxa" w:w="90"/>
+            </w:tcMar>
+          </w:tcPr>
+          <w:p>
+            <w:r>
+              <w:rPr>
+                <w:sz w:val="18"/>
+                <w:szCs w:val="18"/>
+              </w:rPr>
+              <w:t xml:space="preserve">One menu item, like PixInsight's Reset Engine: forgets measurements and progress, moves old masters aside, optionally resets settings (keeps folders and tools)</w:t>
+            </w:r>
+          </w:p>
+        </w:tc>
+        <w:tc>
+          <w:tcPr>
+            <w:tcW w:type="dxa" w:w="900"/>
+            <w:tcBorders>
+              <w:top w:val="single" w:color="BFBFBF" w:sz="4"/>
+              <w:left w:val="single" w:color="BFBFBF" w:sz="4"/>
+              <w:bottom w:val="single" w:color="BFBFBF" w:sz="4"/>
+              <w:right w:val="single" w:color="BFBFBF" w:sz="4"/>
+            </w:tcBorders>
+            <w:tcMar>
+              <w:top w:type="dxa" w:w="30"/>
+              <w:left w:type="dxa" w:w="90"/>
+              <w:bottom w:type="dxa" w:w="30"/>
+              <w:right w:type="dxa" w:w="90"/>
+            </w:tcMar>
+          </w:tcPr>
+          <w:p>
+            <w:r>
+              <w:rPr>
+                <w:sz w:val="18"/>
+                <w:szCs w:val="18"/>
+              </w:rPr>
+              <w:t xml:space="preserve">0.9.52</w:t>
+            </w:r>
+          </w:p>
+        </w:tc>
+      </w:tr>
+      <w:tr>
+        <w:trPr>
+          <w:cantSplit/>
+        </w:trPr>
+        <w:tc>
+          <w:tcPr>
+            <w:tcW w:type="dxa" w:w="2500"/>
+            <w:tcBorders>
+              <w:top w:val="single" w:color="BFBFBF" w:sz="4"/>
+              <w:left w:val="single" w:color="BFBFBF" w:sz="4"/>
+              <w:bottom w:val="single" w:color="BFBFBF" w:sz="4"/>
+              <w:right w:val="single" w:color="BFBFBF" w:sz="4"/>
+            </w:tcBorders>
+            <w:tcMar>
+              <w:top w:type="dxa" w:w="30"/>
+              <w:left w:type="dxa" w:w="90"/>
+              <w:bottom w:type="dxa" w:w="30"/>
+              <w:right w:type="dxa" w:w="90"/>
+            </w:tcMar>
+          </w:tcPr>
+          <w:p>
+            <w:r>
+              <w:rPr>
+                <w:sz w:val="18"/>
+                <w:szCs w:val="18"/>
+              </w:rPr>
+              <w:t xml:space="preserve">Crash recovery</w:t>
+            </w:r>
+          </w:p>
+        </w:tc>
+        <w:tc>
+          <w:tcPr>
+            <w:tcW w:type="dxa" w:w="5960"/>
+            <w:tcBorders>
+              <w:top w:val="single" w:color="BFBFBF" w:sz="4"/>
+              <w:left w:val="single" w:color="BFBFBF" w:sz="4"/>
+              <w:bottom w:val="single" w:color="BFBFBF" w:sz="4"/>
+              <w:right w:val="single" w:color="BFBFBF" w:sz="4"/>
+            </w:tcBorders>
+            <w:tcMar>
+              <w:top w:type="dxa" w:w="30"/>
+              <w:left w:type="dxa" w:w="90"/>
+              <w:bottom w:type="dxa" w:w="30"/>
+              <w:right w:type="dxa" w:w="90"/>
+            </w:tcMar>
+          </w:tcPr>
+          <w:p>
+            <w:r>
+              <w:rPr>
+                <w:sz w:val="18"/>
+                <w:szCs w:val="18"/>
+              </w:rPr>
+              <w:t xml:space="preserve">Every page saves as it goes; after a crash or restart the app offers to bring you back to the same page</w:t>
+            </w:r>
+          </w:p>
+        </w:tc>
+        <w:tc>
+          <w:tcPr>
+            <w:tcW w:type="dxa" w:w="900"/>
+            <w:tcBorders>
+              <w:top w:val="single" w:color="BFBFBF" w:sz="4"/>
+              <w:left w:val="single" w:color="BFBFBF" w:sz="4"/>
+              <w:bottom w:val="single" w:color="BFBFBF" w:sz="4"/>
+              <w:right w:val="single" w:color="BFBFBF" w:sz="4"/>
+            </w:tcBorders>
+            <w:tcMar>
+              <w:top w:type="dxa" w:w="30"/>
+              <w:left w:type="dxa" w:w="90"/>
+              <w:bottom w:type="dxa" w:w="30"/>
+              <w:right w:type="dxa" w:w="90"/>
+            </w:tcMar>
+          </w:tcPr>
+          <w:p>
+            <w:r>
+              <w:rPr>
+                <w:sz w:val="18"/>
+                <w:szCs w:val="18"/>
+              </w:rPr>
+              <w:t xml:space="preserve">0.6</w:t>
+            </w:r>
+          </w:p>
+        </w:tc>
+      </w:tr>
+      <w:tr>
+        <w:trPr>
+          <w:cantSplit/>
+        </w:trPr>
+        <w:tc>
+          <w:tcPr>
+            <w:tcW w:type="dxa" w:w="2500"/>
+            <w:tcBorders>
+              <w:top w:val="single" w:color="BFBFBF" w:sz="4"/>
+              <w:left w:val="single" w:color="BFBFBF" w:sz="4"/>
+              <w:bottom w:val="single" w:color="BFBFBF" w:sz="4"/>
+              <w:right w:val="single" w:color="BFBFBF" w:sz="4"/>
+            </w:tcBorders>
+            <w:tcMar>
+              <w:top w:type="dxa" w:w="30"/>
+              <w:left w:type="dxa" w:w="90"/>
+              <w:bottom w:type="dxa" w:w="30"/>
+              <w:right w:type="dxa" w:w="90"/>
+            </w:tcMar>
+          </w:tcPr>
+          <w:p>
+            <w:r>
+              <w:rPr>
+                <w:sz w:val="18"/>
+                <w:szCs w:val="18"/>
+              </w:rPr>
+              <w:t xml:space="preserve">Stop Here – Continue in PixInsight</w:t>
+            </w:r>
+          </w:p>
+        </w:tc>
+        <w:tc>
+          <w:tcPr>
+            <w:tcW w:type="dxa" w:w="5960"/>
+            <w:tcBorders>
+              <w:top w:val="single" w:color="BFBFBF" w:sz="4"/>
+              <w:left w:val="single" w:color="BFBFBF" w:sz="4"/>
+              <w:bottom w:val="single" w:color="BFBFBF" w:sz="4"/>
+              <w:right w:val="single" w:color="BFBFBF" w:sz="4"/>
+            </w:tcBorders>
+            <w:tcMar>
+              <w:top w:type="dxa" w:w="30"/>
+              <w:left w:type="dxa" w:w="90"/>
+              <w:bottom w:type="dxa" w:w="30"/>
+              <w:right w:type="dxa" w:w="90"/>
+            </w:tcMar>
+          </w:tcPr>
+          <w:p>
+            <w:r>
+              <w:rPr>
+                <w:sz w:val="18"/>
+                <w:szCs w:val="18"/>
+              </w:rPr>
+              <w:t xml:space="preserve">From pages 2, 3 or 4, hands the image over as PixInsight-ready XISF with a note of the processes to use next</w:t>
+            </w:r>
+          </w:p>
+        </w:tc>
+        <w:tc>
+          <w:tcPr>
+            <w:tcW w:type="dxa" w:w="900"/>
+            <w:tcBorders>
+              <w:top w:val="single" w:color="BFBFBF" w:sz="4"/>
+              <w:left w:val="single" w:color="BFBFBF" w:sz="4"/>
+              <w:bottom w:val="single" w:color="BFBFBF" w:sz="4"/>
+              <w:right w:val="single" w:color="BFBFBF" w:sz="4"/>
+            </w:tcBorders>
+            <w:tcMar>
+              <w:top w:type="dxa" w:w="30"/>
+              <w:left w:type="dxa" w:w="90"/>
+              <w:bottom w:type="dxa" w:w="30"/>
+              <w:right w:type="dxa" w:w="90"/>
+            </w:tcMar>
+          </w:tcPr>
+          <w:p>
+            <w:r>
+              <w:rPr>
+                <w:sz w:val="18"/>
+                <w:szCs w:val="18"/>
+              </w:rPr>
+              <w:t xml:space="preserve">0.7</w:t>
+            </w:r>
+          </w:p>
+        </w:tc>
+      </w:tr>
+      <w:tr>
+        <w:trPr>
+          <w:cantSplit/>
+        </w:trPr>
+        <w:tc>
+          <w:tcPr>
+            <w:tcW w:type="dxa" w:w="2500"/>
+            <w:tcBorders>
+              <w:top w:val="single" w:color="BFBFBF" w:sz="4"/>
+              <w:left w:val="single" w:color="BFBFBF" w:sz="4"/>
+              <w:bottom w:val="single" w:color="BFBFBF" w:sz="4"/>
+              <w:right w:val="single" w:color="BFBFBF" w:sz="4"/>
+            </w:tcBorders>
+            <w:tcMar>
+              <w:top w:type="dxa" w:w="30"/>
+              <w:left w:type="dxa" w:w="90"/>
+              <w:bottom w:type="dxa" w:w="30"/>
+              <w:right w:type="dxa" w:w="90"/>
+            </w:tcMar>
+          </w:tcPr>
+          <w:p>
+            <w:r>
+              <w:rPr>
+                <w:sz w:val="18"/>
+                <w:szCs w:val="18"/>
+              </w:rPr>
+              <w:t xml:space="preserve">Smart telescopes</w:t>
+            </w:r>
+          </w:p>
+        </w:tc>
+        <w:tc>
+          <w:tcPr>
+            <w:tcW w:type="dxa" w:w="5960"/>
+            <w:tcBorders>
+              <w:top w:val="single" w:color="BFBFBF" w:sz="4"/>
+              <w:left w:val="single" w:color="BFBFBF" w:sz="4"/>
+              <w:bottom w:val="single" w:color="BFBFBF" w:sz="4"/>
+              <w:right w:val="single" w:color="BFBFBF" w:sz="4"/>
+            </w:tcBorders>
+            <w:tcMar>
+              <w:top w:type="dxa" w:w="30"/>
+              <w:left w:type="dxa" w:w="90"/>
+              <w:bottom w:type="dxa" w:w="30"/>
+              <w:right w:type="dxa" w:w="90"/>
+            </w:tcMar>
+          </w:tcPr>
+          <w:p>
+            <w:r>
+              <w:rPr>
+                <w:sz w:val="18"/>
+                <w:szCs w:val="18"/>
+              </w:rPr>
+              <w:t xml:space="preserve">Seestar, DWARF, Vespera, Stellina and eVscope raw subs and stacks are recognised and handled without calibration frames</w:t>
+            </w:r>
+          </w:p>
+        </w:tc>
+        <w:tc>
+          <w:tcPr>
+            <w:tcW w:type="dxa" w:w="900"/>
+            <w:tcBorders>
+              <w:top w:val="single" w:color="BFBFBF" w:sz="4"/>
+              <w:left w:val="single" w:color="BFBFBF" w:sz="4"/>
+              <w:bottom w:val="single" w:color="BFBFBF" w:sz="4"/>
+              <w:right w:val="single" w:color="BFBFBF" w:sz="4"/>
+            </w:tcBorders>
+            <w:tcMar>
+              <w:top w:type="dxa" w:w="30"/>
+              <w:left w:type="dxa" w:w="90"/>
+              <w:bottom w:type="dxa" w:w="30"/>
+              <w:right w:type="dxa" w:w="90"/>
+            </w:tcMar>
+          </w:tcPr>
+          <w:p>
+            <w:r>
+              <w:rPr>
+                <w:sz w:val="18"/>
+                <w:szCs w:val="18"/>
+              </w:rPr>
+              <w:t xml:space="preserve">0.6</w:t>
+            </w:r>
+          </w:p>
+        </w:tc>
+      </w:tr>
+      <w:tr>
+        <w:trPr>
+          <w:cantSplit/>
+        </w:trPr>
+        <w:tc>
+          <w:tcPr>
+            <w:tcW w:type="dxa" w:w="2500"/>
+            <w:tcBorders>
+              <w:top w:val="single" w:color="BFBFBF" w:sz="4"/>
+              <w:left w:val="single" w:color="BFBFBF" w:sz="4"/>
+              <w:bottom w:val="single" w:color="BFBFBF" w:sz="4"/>
+              <w:right w:val="single" w:color="BFBFBF" w:sz="4"/>
+            </w:tcBorders>
+            <w:tcMar>
+              <w:top w:type="dxa" w:w="30"/>
+              <w:left w:type="dxa" w:w="90"/>
+              <w:bottom w:type="dxa" w:w="30"/>
+              <w:right w:type="dxa" w:w="90"/>
+            </w:tcMar>
+          </w:tcPr>
+          <w:p>
+            <w:r>
+              <w:rPr>
+                <w:sz w:val="18"/>
+                <w:szCs w:val="18"/>
+              </w:rPr>
+              <w:t xml:space="preserve">XISF everywhere</w:t>
+            </w:r>
+          </w:p>
+        </w:tc>
+        <w:tc>
+          <w:tcPr>
+            <w:tcW w:type="dxa" w:w="5960"/>
+            <w:tcBorders>
+              <w:top w:val="single" w:color="BFBFBF" w:sz="4"/>
+              <w:left w:val="single" w:color="BFBFBF" w:sz="4"/>
+              <w:bottom w:val="single" w:color="BFBFBF" w:sz="4"/>
+              <w:right w:val="single" w:color="BFBFBF" w:sz="4"/>
+            </w:tcBorders>
+            <w:tcMar>
+              <w:top w:type="dxa" w:w="30"/>
+              <w:left w:type="dxa" w:w="90"/>
+              <w:bottom w:type="dxa" w:w="30"/>
+              <w:right w:type="dxa" w:w="90"/>
+            </w:tcMar>
+          </w:tcPr>
+          <w:p>
+            <w:r>
+              <w:rPr>
+                <w:sz w:val="18"/>
+                <w:szCs w:val="18"/>
+              </w:rPr>
+              <w:t xml:space="preserve">Reads PixInsight XISF light frames, including every compression (zlib, LZ4, LZ4-HC, Zstandard)</w:t>
+            </w:r>
+          </w:p>
+        </w:tc>
+        <w:tc>
+          <w:tcPr>
+            <w:tcW w:type="dxa" w:w="900"/>
+            <w:tcBorders>
+              <w:top w:val="single" w:color="BFBFBF" w:sz="4"/>
+              <w:left w:val="single" w:color="BFBFBF" w:sz="4"/>
+              <w:bottom w:val="single" w:color="BFBFBF" w:sz="4"/>
+              <w:right w:val="single" w:color="BFBFBF" w:sz="4"/>
+            </w:tcBorders>
+            <w:tcMar>
+              <w:top w:type="dxa" w:w="30"/>
+              <w:left w:type="dxa" w:w="90"/>
+              <w:bottom w:type="dxa" w:w="30"/>
+              <w:right w:type="dxa" w:w="90"/>
+            </w:tcMar>
+          </w:tcPr>
+          <w:p>
+            <w:r>
+              <w:rPr>
+                <w:sz w:val="18"/>
+                <w:szCs w:val="18"/>
+              </w:rPr>
+              <w:t xml:space="preserve">0.9.28</w:t>
+            </w:r>
+          </w:p>
+        </w:tc>
+      </w:tr>
+      <w:tr>
+        <w:trPr>
+          <w:cantSplit/>
+        </w:trPr>
+        <w:tc>
+          <w:tcPr>
+            <w:tcW w:type="dxa" w:w="2500"/>
+            <w:tcBorders>
+              <w:top w:val="single" w:color="BFBFBF" w:sz="4"/>
+              <w:left w:val="single" w:color="BFBFBF" w:sz="4"/>
+              <w:bottom w:val="single" w:color="BFBFBF" w:sz="4"/>
+              <w:right w:val="single" w:color="BFBFBF" w:sz="4"/>
+            </w:tcBorders>
+            <w:tcMar>
+              <w:top w:type="dxa" w:w="30"/>
+              <w:left w:type="dxa" w:w="90"/>
+              <w:bottom w:type="dxa" w:w="30"/>
+              <w:right w:type="dxa" w:w="90"/>
+            </w:tcMar>
+          </w:tcPr>
+          <w:p>
+            <w:r>
+              <w:rPr>
+                <w:sz w:val="18"/>
+                <w:szCs w:val="18"/>
+              </w:rPr>
+              <w:t xml:space="preserve">Windows and Apple-silicon Mac</w:t>
+            </w:r>
+          </w:p>
+        </w:tc>
+        <w:tc>
+          <w:tcPr>
+            <w:tcW w:type="dxa" w:w="5960"/>
+            <w:tcBorders>
+              <w:top w:val="single" w:color="BFBFBF" w:sz="4"/>
+              <w:left w:val="single" w:color="BFBFBF" w:sz="4"/>
+              <w:bottom w:val="single" w:color="BFBFBF" w:sz="4"/>
+              <w:right w:val="single" w:color="BFBFBF" w:sz="4"/>
+            </w:tcBorders>
+            <w:tcMar>
+              <w:top w:type="dxa" w:w="30"/>
+              <w:left w:type="dxa" w:w="90"/>
+              <w:bottom w:type="dxa" w:w="30"/>
+              <w:right w:type="dxa" w:w="90"/>
+            </w:tcMar>
+          </w:tcPr>
+          <w:p>
+            <w:r>
+              <w:rPr>
+                <w:sz w:val="18"/>
+                <w:szCs w:val="18"/>
+              </w:rPr>
+              <w:t xml:space="preserve">Both builds run a full self-test on real hardware before every release</w:t>
+            </w:r>
+          </w:p>
+        </w:tc>
+        <w:tc>
+          <w:tcPr>
+            <w:tcW w:type="dxa" w:w="900"/>
+            <w:tcBorders>
+              <w:top w:val="single" w:color="BFBFBF" w:sz="4"/>
+              <w:left w:val="single" w:color="BFBFBF" w:sz="4"/>
+              <w:bottom w:val="single" w:color="BFBFBF" w:sz="4"/>
+              <w:right w:val="single" w:color="BFBFBF" w:sz="4"/>
+            </w:tcBorders>
+            <w:tcMar>
+              <w:top w:type="dxa" w:w="30"/>
+              <w:left w:type="dxa" w:w="90"/>
+              <w:bottom w:type="dxa" w:w="30"/>
+              <w:right w:type="dxa" w:w="90"/>
+            </w:tcMar>
+          </w:tcPr>
+          <w:p>
+            <w:r>
+              <w:rPr>
+                <w:sz w:val="18"/>
+                <w:szCs w:val="18"/>
+              </w:rPr>
+              <w:t xml:space="preserve">0.9.0</w:t>
+            </w:r>
+          </w:p>
+        </w:tc>
+      </w:tr>
+    </w:tbl>
+    <w:p>
+      <w:pPr>
+        <w:spacing w:after="120"/>
+      </w:pPr>
+    </w:p>
+    <w:p>
+      <w:pPr>
+        <w:pStyle w:val="Heading3"/>
+      </w:pPr>
+      <w:r>
+        <w:t xml:space="preserve">Page 1 – Quality &amp; Cull</w:t>
+      </w:r>
+    </w:p>
+    <w:tbl>
+      <w:tblPr>
+        <w:tblW w:type="dxa" w:w="9360"/>
+        <w:tblBorders>
+          <w:top w:val="single" w:color="auto" w:sz="4"/>
+          <w:left w:val="single" w:color="auto" w:sz="4"/>
+          <w:bottom w:val="single" w:color="auto" w:sz="4"/>
+          <w:right w:val="single" w:color="auto" w:sz="4"/>
+          <w:insideH w:val="single" w:color="auto" w:sz="4"/>
+          <w:insideV w:val="single" w:color="auto" w:sz="4"/>
+        </w:tblBorders>
+      </w:tblPr>
+      <w:tblGrid>
+        <w:gridCol w:w="2500"/>
+        <w:gridCol w:w="5960"/>
+        <w:gridCol w:w="900"/>
+      </w:tblGrid>
+      <w:tr>
+        <w:trPr>
+          <w:tblHeader/>
+        </w:trPr>
+        <w:tc>
+          <w:tcPr>
+            <w:tcW w:type="dxa" w:w="2500"/>
+            <w:tcBorders>
+              <w:top w:val="single" w:color="BFBFBF" w:sz="4"/>
+              <w:left w:val="single" w:color="BFBFBF" w:sz="4"/>
+              <w:bottom w:val="single" w:color="BFBFBF" w:sz="4"/>
+              <w:right w:val="single" w:color="BFBFBF" w:sz="4"/>
+            </w:tcBorders>
+            <w:shd w:fill="DCE6F2" w:color="auto" w:val="clear"/>
+            <w:tcMar>
+              <w:top w:type="dxa" w:w="30"/>
+              <w:left w:type="dxa" w:w="90"/>
+              <w:bottom w:type="dxa" w:w="30"/>
+              <w:right w:type="dxa" w:w="90"/>
+            </w:tcMar>
+          </w:tcPr>
+          <w:p>
+            <w:r>
+              <w:rPr>
+                <w:b/>
+                <w:bCs/>
+                <w:sz w:val="18"/>
+                <w:szCs w:val="18"/>
+              </w:rPr>
+              <w:t xml:space="preserve">Feature</w:t>
+            </w:r>
+          </w:p>
+        </w:tc>
+        <w:tc>
+          <w:tcPr>
+            <w:tcW w:type="dxa" w:w="5960"/>
+            <w:tcBorders>
+              <w:top w:val="single" w:color="BFBFBF" w:sz="4"/>
+              <w:left w:val="single" w:color="BFBFBF" w:sz="4"/>
+              <w:bottom w:val="single" w:color="BFBFBF" w:sz="4"/>
+              <w:right w:val="single" w:color="BFBFBF" w:sz="4"/>
+            </w:tcBorders>
+            <w:shd w:fill="DCE6F2" w:color="auto" w:val="clear"/>
+            <w:tcMar>
+              <w:top w:type="dxa" w:w="30"/>
+              <w:left w:type="dxa" w:w="90"/>
+              <w:bottom w:type="dxa" w:w="30"/>
+              <w:right w:type="dxa" w:w="90"/>
+            </w:tcMar>
+          </w:tcPr>
+          <w:p>
+            <w:r>
+              <w:rPr>
+                <w:b/>
+                <w:bCs/>
+                <w:sz w:val="18"/>
+                <w:szCs w:val="18"/>
+              </w:rPr>
+              <w:t xml:space="preserve">What it does</w:t>
+            </w:r>
+          </w:p>
+        </w:tc>
+        <w:tc>
+          <w:tcPr>
+            <w:tcW w:type="dxa" w:w="900"/>
+            <w:tcBorders>
+              <w:top w:val="single" w:color="BFBFBF" w:sz="4"/>
+              <w:left w:val="single" w:color="BFBFBF" w:sz="4"/>
+              <w:bottom w:val="single" w:color="BFBFBF" w:sz="4"/>
+              <w:right w:val="single" w:color="BFBFBF" w:sz="4"/>
+            </w:tcBorders>
+            <w:shd w:fill="DCE6F2" w:color="auto" w:val="clear"/>
+            <w:tcMar>
+              <w:top w:type="dxa" w:w="30"/>
+              <w:left w:type="dxa" w:w="90"/>
+              <w:bottom w:type="dxa" w:w="30"/>
+              <w:right w:type="dxa" w:w="90"/>
+            </w:tcMar>
+          </w:tcPr>
+          <w:p>
+            <w:r>
+              <w:rPr>
+                <w:b/>
+                <w:bCs/>
+                <w:sz w:val="18"/>
+                <w:szCs w:val="18"/>
+              </w:rPr>
+              <w:t xml:space="preserve">Since</w:t>
+            </w:r>
+          </w:p>
+        </w:tc>
+      </w:tr>
+      <w:tr>
+        <w:trPr>
+          <w:cantSplit/>
+        </w:trPr>
+        <w:tc>
+          <w:tcPr>
+            <w:tcW w:type="dxa" w:w="2500"/>
+            <w:tcBorders>
+              <w:top w:val="single" w:color="BFBFBF" w:sz="4"/>
+              <w:left w:val="single" w:color="BFBFBF" w:sz="4"/>
+              <w:bottom w:val="single" w:color="BFBFBF" w:sz="4"/>
+              <w:right w:val="single" w:color="BFBFBF" w:sz="4"/>
+            </w:tcBorders>
+            <w:tcMar>
+              <w:top w:type="dxa" w:w="30"/>
+              <w:left w:type="dxa" w:w="90"/>
+              <w:bottom w:type="dxa" w:w="30"/>
+              <w:right w:type="dxa" w:w="90"/>
+            </w:tcMar>
+          </w:tcPr>
+          <w:p>
+            <w:r>
+              <w:rPr>
+                <w:sz w:val="18"/>
+                <w:szCs w:val="18"/>
+              </w:rPr>
+              <w:t xml:space="preserve">Star quality on every frame</w:t>
+            </w:r>
+          </w:p>
+        </w:tc>
+        <w:tc>
+          <w:tcPr>
+            <w:tcW w:type="dxa" w:w="5960"/>
+            <w:tcBorders>
+              <w:top w:val="single" w:color="BFBFBF" w:sz="4"/>
+              <w:left w:val="single" w:color="BFBFBF" w:sz="4"/>
+              <w:bottom w:val="single" w:color="BFBFBF" w:sz="4"/>
+              <w:right w:val="single" w:color="BFBFBF" w:sz="4"/>
+            </w:tcBorders>
+            <w:tcMar>
+              <w:top w:type="dxa" w:w="30"/>
+              <w:left w:type="dxa" w:w="90"/>
+              <w:bottom w:type="dxa" w:w="30"/>
+              <w:right w:type="dxa" w:w="90"/>
+            </w:tcMar>
+          </w:tcPr>
+          <w:p>
+            <w:r>
+              <w:rPr>
+                <w:sz w:val="18"/>
+                <w:szCs w:val="18"/>
+              </w:rPr>
+              <w:t xml:space="preserve">FWHM, eccentricity, SNR, star count and background, with a badge and a score against frames of the same camera and filter</w:t>
+            </w:r>
+          </w:p>
+        </w:tc>
+        <w:tc>
+          <w:tcPr>
+            <w:tcW w:type="dxa" w:w="900"/>
+            <w:tcBorders>
+              <w:top w:val="single" w:color="BFBFBF" w:sz="4"/>
+              <w:left w:val="single" w:color="BFBFBF" w:sz="4"/>
+              <w:bottom w:val="single" w:color="BFBFBF" w:sz="4"/>
+              <w:right w:val="single" w:color="BFBFBF" w:sz="4"/>
+            </w:tcBorders>
+            <w:tcMar>
+              <w:top w:type="dxa" w:w="30"/>
+              <w:left w:type="dxa" w:w="90"/>
+              <w:bottom w:type="dxa" w:w="30"/>
+              <w:right w:type="dxa" w:w="90"/>
+            </w:tcMar>
+          </w:tcPr>
+          <w:p>
+            <w:r>
+              <w:rPr>
+                <w:sz w:val="18"/>
+                <w:szCs w:val="18"/>
+              </w:rPr>
+              <w:t xml:space="preserve">Stage 2</w:t>
+            </w:r>
+          </w:p>
+        </w:tc>
+      </w:tr>
+      <w:tr>
+        <w:trPr>
+          <w:cantSplit/>
+        </w:trPr>
+        <w:tc>
+          <w:tcPr>
+            <w:tcW w:type="dxa" w:w="2500"/>
+            <w:tcBorders>
+              <w:top w:val="single" w:color="BFBFBF" w:sz="4"/>
+              <w:left w:val="single" w:color="BFBFBF" w:sz="4"/>
+              <w:bottom w:val="single" w:color="BFBFBF" w:sz="4"/>
+              <w:right w:val="single" w:color="BFBFBF" w:sz="4"/>
+            </w:tcBorders>
+            <w:tcMar>
+              <w:top w:type="dxa" w:w="30"/>
+              <w:left w:type="dxa" w:w="90"/>
+              <w:bottom w:type="dxa" w:w="30"/>
+              <w:right w:type="dxa" w:w="90"/>
+            </w:tcMar>
+          </w:tcPr>
+          <w:p>
+            <w:r>
+              <w:rPr>
+                <w:sz w:val="18"/>
+                <w:szCs w:val="18"/>
+              </w:rPr>
+              <w:t xml:space="preserve">Session chart</w:t>
+            </w:r>
+          </w:p>
+        </w:tc>
+        <w:tc>
+          <w:tcPr>
+            <w:tcW w:type="dxa" w:w="5960"/>
+            <w:tcBorders>
+              <w:top w:val="single" w:color="BFBFBF" w:sz="4"/>
+              <w:left w:val="single" w:color="BFBFBF" w:sz="4"/>
+              <w:bottom w:val="single" w:color="BFBFBF" w:sz="4"/>
+              <w:right w:val="single" w:color="BFBFBF" w:sz="4"/>
+            </w:tcBorders>
+            <w:tcMar>
+              <w:top w:type="dxa" w:w="30"/>
+              <w:left w:type="dxa" w:w="90"/>
+              <w:bottom w:type="dxa" w:w="30"/>
+              <w:right w:type="dxa" w:w="90"/>
+            </w:tcMar>
+          </w:tcPr>
+          <w:p>
+            <w:r>
+              <w:rPr>
+                <w:sz w:val="18"/>
+                <w:szCs w:val="18"/>
+              </w:rPr>
+              <w:t xml:space="preserve">One dot per frame in capture order, nights separated; click to jump, drag a range to flag or reject</w:t>
+            </w:r>
+          </w:p>
+        </w:tc>
+        <w:tc>
+          <w:tcPr>
+            <w:tcW w:type="dxa" w:w="900"/>
+            <w:tcBorders>
+              <w:top w:val="single" w:color="BFBFBF" w:sz="4"/>
+              <w:left w:val="single" w:color="BFBFBF" w:sz="4"/>
+              <w:bottom w:val="single" w:color="BFBFBF" w:sz="4"/>
+              <w:right w:val="single" w:color="BFBFBF" w:sz="4"/>
+            </w:tcBorders>
+            <w:tcMar>
+              <w:top w:type="dxa" w:w="30"/>
+              <w:left w:type="dxa" w:w="90"/>
+              <w:bottom w:type="dxa" w:w="30"/>
+              <w:right w:type="dxa" w:w="90"/>
+            </w:tcMar>
+          </w:tcPr>
+          <w:p>
+            <w:r>
+              <w:rPr>
+                <w:sz w:val="18"/>
+                <w:szCs w:val="18"/>
+              </w:rPr>
+              <w:t xml:space="preserve">Stage 2</w:t>
+            </w:r>
+          </w:p>
+        </w:tc>
+      </w:tr>
+      <w:tr>
+        <w:trPr>
+          <w:cantSplit/>
+        </w:trPr>
+        <w:tc>
+          <w:tcPr>
+            <w:tcW w:type="dxa" w:w="2500"/>
+            <w:tcBorders>
+              <w:top w:val="single" w:color="BFBFBF" w:sz="4"/>
+              <w:left w:val="single" w:color="BFBFBF" w:sz="4"/>
+              <w:bottom w:val="single" w:color="BFBFBF" w:sz="4"/>
+              <w:right w:val="single" w:color="BFBFBF" w:sz="4"/>
+            </w:tcBorders>
+            <w:tcMar>
+              <w:top w:type="dxa" w:w="30"/>
+              <w:left w:type="dxa" w:w="90"/>
+              <w:bottom w:type="dxa" w:w="30"/>
+              <w:right w:type="dxa" w:w="90"/>
+            </w:tcMar>
+          </w:tcPr>
+          <w:p>
+            <w:r>
+              <w:rPr>
+                <w:sz w:val="18"/>
+                <w:szCs w:val="18"/>
+              </w:rPr>
+              <w:t xml:space="preserve">Auto-cull presets</w:t>
+            </w:r>
+          </w:p>
+        </w:tc>
+        <w:tc>
+          <w:tcPr>
+            <w:tcW w:type="dxa" w:w="5960"/>
+            <w:tcBorders>
+              <w:top w:val="single" w:color="BFBFBF" w:sz="4"/>
+              <w:left w:val="single" w:color="BFBFBF" w:sz="4"/>
+              <w:bottom w:val="single" w:color="BFBFBF" w:sz="4"/>
+              <w:right w:val="single" w:color="BFBFBF" w:sz="4"/>
+            </w:tcBorders>
+            <w:tcMar>
+              <w:top w:type="dxa" w:w="30"/>
+              <w:left w:type="dxa" w:w="90"/>
+              <w:bottom w:type="dxa" w:w="30"/>
+              <w:right w:type="dxa" w:w="90"/>
+            </w:tcMar>
+          </w:tcPr>
+          <w:p>
+            <w:r>
+              <w:rPr>
+                <w:sz w:val="18"/>
+                <w:szCs w:val="18"/>
+              </w:rPr>
+              <w:t xml:space="preserve">Three strengths flag frames from FWHM, stars, SNR (catches thin cloud) and eccentricity; you review before rejecting, and it can be undone</w:t>
+            </w:r>
+          </w:p>
+        </w:tc>
+        <w:tc>
+          <w:tcPr>
+            <w:tcW w:type="dxa" w:w="900"/>
+            <w:tcBorders>
+              <w:top w:val="single" w:color="BFBFBF" w:sz="4"/>
+              <w:left w:val="single" w:color="BFBFBF" w:sz="4"/>
+              <w:bottom w:val="single" w:color="BFBFBF" w:sz="4"/>
+              <w:right w:val="single" w:color="BFBFBF" w:sz="4"/>
+            </w:tcBorders>
+            <w:tcMar>
+              <w:top w:type="dxa" w:w="30"/>
+              <w:left w:type="dxa" w:w="90"/>
+              <w:bottom w:type="dxa" w:w="30"/>
+              <w:right w:type="dxa" w:w="90"/>
+            </w:tcMar>
+          </w:tcPr>
+          <w:p>
+            <w:r>
+              <w:rPr>
+                <w:sz w:val="18"/>
+                <w:szCs w:val="18"/>
+              </w:rPr>
+              <w:t xml:space="preserve">0.3.0</w:t>
+            </w:r>
+          </w:p>
+        </w:tc>
+      </w:tr>
+      <w:tr>
+        <w:trPr>
+          <w:cantSplit/>
+        </w:trPr>
+        <w:tc>
+          <w:tcPr>
+            <w:tcW w:type="dxa" w:w="2500"/>
+            <w:tcBorders>
+              <w:top w:val="single" w:color="BFBFBF" w:sz="4"/>
+              <w:left w:val="single" w:color="BFBFBF" w:sz="4"/>
+              <w:bottom w:val="single" w:color="BFBFBF" w:sz="4"/>
+              <w:right w:val="single" w:color="BFBFBF" w:sz="4"/>
+            </w:tcBorders>
+            <w:tcMar>
+              <w:top w:type="dxa" w:w="30"/>
+              <w:left w:type="dxa" w:w="90"/>
+              <w:bottom w:type="dxa" w:w="30"/>
+              <w:right w:type="dxa" w:w="90"/>
+            </w:tcMar>
+          </w:tcPr>
+          <w:p>
+            <w:r>
+              <w:rPr>
+                <w:sz w:val="18"/>
+                <w:szCs w:val="18"/>
+              </w:rPr>
+              <w:t xml:space="preserve">Fast measuring over a NAS</w:t>
+            </w:r>
+          </w:p>
+        </w:tc>
+        <w:tc>
+          <w:tcPr>
+            <w:tcW w:type="dxa" w:w="5960"/>
+            <w:tcBorders>
+              <w:top w:val="single" w:color="BFBFBF" w:sz="4"/>
+              <w:left w:val="single" w:color="BFBFBF" w:sz="4"/>
+              <w:bottom w:val="single" w:color="BFBFBF" w:sz="4"/>
+              <w:right w:val="single" w:color="BFBFBF" w:sz="4"/>
+            </w:tcBorders>
+            <w:tcMar>
+              <w:top w:type="dxa" w:w="30"/>
+              <w:left w:type="dxa" w:w="90"/>
+              <w:bottom w:type="dxa" w:w="30"/>
+              <w:right w:type="dxa" w:w="90"/>
+            </w:tcMar>
+          </w:tcPr>
+          <w:p>
+            <w:r>
+              <w:rPr>
+                <w:sz w:val="18"/>
+                <w:szCs w:val="18"/>
+              </w:rPr>
+              <w:t xml:space="preserve">Reads about a quarter of each file, 3–4× faster on network drives; results are saved, so reopening is nearly instant</w:t>
+            </w:r>
+          </w:p>
+        </w:tc>
+        <w:tc>
+          <w:tcPr>
+            <w:tcW w:type="dxa" w:w="900"/>
+            <w:tcBorders>
+              <w:top w:val="single" w:color="BFBFBF" w:sz="4"/>
+              <w:left w:val="single" w:color="BFBFBF" w:sz="4"/>
+              <w:bottom w:val="single" w:color="BFBFBF" w:sz="4"/>
+              <w:right w:val="single" w:color="BFBFBF" w:sz="4"/>
+            </w:tcBorders>
+            <w:tcMar>
+              <w:top w:type="dxa" w:w="30"/>
+              <w:left w:type="dxa" w:w="90"/>
+              <w:bottom w:type="dxa" w:w="30"/>
+              <w:right w:type="dxa" w:w="90"/>
+            </w:tcMar>
+          </w:tcPr>
+          <w:p>
+            <w:r>
+              <w:rPr>
+                <w:sz w:val="18"/>
+                <w:szCs w:val="18"/>
+              </w:rPr>
+              <w:t xml:space="preserve">Stage 2</w:t>
+            </w:r>
+          </w:p>
+        </w:tc>
+      </w:tr>
+    </w:tbl>
+    <w:p>
+      <w:pPr>
+        <w:spacing w:after="120"/>
+      </w:pPr>
+    </w:p>
+    <w:p>
+      <w:pPr>
+        <w:pStyle w:val="Heading3"/>
+      </w:pPr>
+      <w:r>
+        <w:t xml:space="preserve">Page 2 – Calibrate &amp; Stack</w:t>
+      </w:r>
+    </w:p>
+    <w:tbl>
+      <w:tblPr>
+        <w:tblW w:type="dxa" w:w="9360"/>
+        <w:tblBorders>
+          <w:top w:val="single" w:color="auto" w:sz="4"/>
+          <w:left w:val="single" w:color="auto" w:sz="4"/>
+          <w:bottom w:val="single" w:color="auto" w:sz="4"/>
+          <w:right w:val="single" w:color="auto" w:sz="4"/>
+          <w:insideH w:val="single" w:color="auto" w:sz="4"/>
+          <w:insideV w:val="single" w:color="auto" w:sz="4"/>
+        </w:tblBorders>
+      </w:tblPr>
+      <w:tblGrid>
+        <w:gridCol w:w="2500"/>
+        <w:gridCol w:w="5960"/>
+        <w:gridCol w:w="900"/>
+      </w:tblGrid>
+      <w:tr>
+        <w:trPr>
+          <w:tblHeader/>
+        </w:trPr>
+        <w:tc>
+          <w:tcPr>
+            <w:tcW w:type="dxa" w:w="2500"/>
+            <w:tcBorders>
+              <w:top w:val="single" w:color="BFBFBF" w:sz="4"/>
+              <w:left w:val="single" w:color="BFBFBF" w:sz="4"/>
+              <w:bottom w:val="single" w:color="BFBFBF" w:sz="4"/>
+              <w:right w:val="single" w:color="BFBFBF" w:sz="4"/>
+            </w:tcBorders>
+            <w:shd w:fill="DCE6F2" w:color="auto" w:val="clear"/>
+            <w:tcMar>
+              <w:top w:type="dxa" w:w="30"/>
+              <w:left w:type="dxa" w:w="90"/>
+              <w:bottom w:type="dxa" w:w="30"/>
+              <w:right w:type="dxa" w:w="90"/>
+            </w:tcMar>
+          </w:tcPr>
+          <w:p>
+            <w:r>
+              <w:rPr>
+                <w:b/>
+                <w:bCs/>
+                <w:sz w:val="18"/>
+                <w:szCs w:val="18"/>
+              </w:rPr>
+              <w:t xml:space="preserve">Feature</w:t>
+            </w:r>
+          </w:p>
+        </w:tc>
+        <w:tc>
+          <w:tcPr>
+            <w:tcW w:type="dxa" w:w="5960"/>
+            <w:tcBorders>
+              <w:top w:val="single" w:color="BFBFBF" w:sz="4"/>
+              <w:left w:val="single" w:color="BFBFBF" w:sz="4"/>
+              <w:bottom w:val="single" w:color="BFBFBF" w:sz="4"/>
+              <w:right w:val="single" w:color="BFBFBF" w:sz="4"/>
+            </w:tcBorders>
+            <w:shd w:fill="DCE6F2" w:color="auto" w:val="clear"/>
+            <w:tcMar>
+              <w:top w:type="dxa" w:w="30"/>
+              <w:left w:type="dxa" w:w="90"/>
+              <w:bottom w:type="dxa" w:w="30"/>
+              <w:right w:type="dxa" w:w="90"/>
+            </w:tcMar>
+          </w:tcPr>
+          <w:p>
+            <w:r>
+              <w:rPr>
+                <w:b/>
+                <w:bCs/>
+                <w:sz w:val="18"/>
+                <w:szCs w:val="18"/>
+              </w:rPr>
+              <w:t xml:space="preserve">What it does</w:t>
+            </w:r>
+          </w:p>
+        </w:tc>
+        <w:tc>
+          <w:tcPr>
+            <w:tcW w:type="dxa" w:w="900"/>
+            <w:tcBorders>
+              <w:top w:val="single" w:color="BFBFBF" w:sz="4"/>
+              <w:left w:val="single" w:color="BFBFBF" w:sz="4"/>
+              <w:bottom w:val="single" w:color="BFBFBF" w:sz="4"/>
+              <w:right w:val="single" w:color="BFBFBF" w:sz="4"/>
+            </w:tcBorders>
+            <w:shd w:fill="DCE6F2" w:color="auto" w:val="clear"/>
+            <w:tcMar>
+              <w:top w:type="dxa" w:w="30"/>
+              <w:left w:type="dxa" w:w="90"/>
+              <w:bottom w:type="dxa" w:w="30"/>
+              <w:right w:type="dxa" w:w="90"/>
+            </w:tcMar>
+          </w:tcPr>
+          <w:p>
+            <w:r>
+              <w:rPr>
+                <w:b/>
+                <w:bCs/>
+                <w:sz w:val="18"/>
+                <w:szCs w:val="18"/>
+              </w:rPr>
+              <w:t xml:space="preserve">Since</w:t>
+            </w:r>
+          </w:p>
+        </w:tc>
+      </w:tr>
+      <w:tr>
+        <w:trPr>
+          <w:cantSplit/>
+        </w:trPr>
+        <w:tc>
+          <w:tcPr>
+            <w:tcW w:type="dxa" w:w="2500"/>
+            <w:tcBorders>
+              <w:top w:val="single" w:color="BFBFBF" w:sz="4"/>
+              <w:left w:val="single" w:color="BFBFBF" w:sz="4"/>
+              <w:bottom w:val="single" w:color="BFBFBF" w:sz="4"/>
+              <w:right w:val="single" w:color="BFBFBF" w:sz="4"/>
+            </w:tcBorders>
+            <w:tcMar>
+              <w:top w:type="dxa" w:w="30"/>
+              <w:left w:type="dxa" w:w="90"/>
+              <w:bottom w:type="dxa" w:w="30"/>
+              <w:right w:type="dxa" w:w="90"/>
+            </w:tcMar>
+          </w:tcPr>
+          <w:p>
+            <w:r>
+              <w:rPr>
+                <w:sz w:val="18"/>
+                <w:szCs w:val="18"/>
+              </w:rPr>
+              <w:t xml:space="preserve">Automatic calibration matching</w:t>
+            </w:r>
+          </w:p>
+        </w:tc>
+        <w:tc>
+          <w:tcPr>
+            <w:tcW w:type="dxa" w:w="5960"/>
+            <w:tcBorders>
+              <w:top w:val="single" w:color="BFBFBF" w:sz="4"/>
+              <w:left w:val="single" w:color="BFBFBF" w:sz="4"/>
+              <w:bottom w:val="single" w:color="BFBFBF" w:sz="4"/>
+              <w:right w:val="single" w:color="BFBFBF" w:sz="4"/>
+            </w:tcBorders>
+            <w:tcMar>
+              <w:top w:type="dxa" w:w="30"/>
+              <w:left w:type="dxa" w:w="90"/>
+              <w:bottom w:type="dxa" w:w="30"/>
+              <w:right w:type="dxa" w:w="90"/>
+            </w:tcMar>
+          </w:tcPr>
+          <w:p>
+            <w:r>
+              <w:rPr>
+                <w:sz w:val="18"/>
+                <w:szCs w:val="18"/>
+              </w:rPr>
+              <w:t xml:space="preserve">Bias, darks and flats picked by camera, gain, offset, temperature, exposure, filter, rig and nearest date, with ✓ ⚠ ✗ and a plain reason</w:t>
+            </w:r>
+          </w:p>
+        </w:tc>
+        <w:tc>
+          <w:tcPr>
+            <w:tcW w:type="dxa" w:w="900"/>
+            <w:tcBorders>
+              <w:top w:val="single" w:color="BFBFBF" w:sz="4"/>
+              <w:left w:val="single" w:color="BFBFBF" w:sz="4"/>
+              <w:bottom w:val="single" w:color="BFBFBF" w:sz="4"/>
+              <w:right w:val="single" w:color="BFBFBF" w:sz="4"/>
+            </w:tcBorders>
+            <w:tcMar>
+              <w:top w:type="dxa" w:w="30"/>
+              <w:left w:type="dxa" w:w="90"/>
+              <w:bottom w:type="dxa" w:w="30"/>
+              <w:right w:type="dxa" w:w="90"/>
+            </w:tcMar>
+          </w:tcPr>
+          <w:p>
+            <w:r>
+              <w:rPr>
+                <w:sz w:val="18"/>
+                <w:szCs w:val="18"/>
+              </w:rPr>
+              <w:t xml:space="preserve">0.4.0</w:t>
+            </w:r>
+          </w:p>
+        </w:tc>
+      </w:tr>
+      <w:tr>
+        <w:trPr>
+          <w:cantSplit/>
+        </w:trPr>
+        <w:tc>
+          <w:tcPr>
+            <w:tcW w:type="dxa" w:w="2500"/>
+            <w:tcBorders>
+              <w:top w:val="single" w:color="BFBFBF" w:sz="4"/>
+              <w:left w:val="single" w:color="BFBFBF" w:sz="4"/>
+              <w:bottom w:val="single" w:color="BFBFBF" w:sz="4"/>
+              <w:right w:val="single" w:color="BFBFBF" w:sz="4"/>
+            </w:tcBorders>
+            <w:tcMar>
+              <w:top w:type="dxa" w:w="30"/>
+              <w:left w:type="dxa" w:w="90"/>
+              <w:bottom w:type="dxa" w:w="30"/>
+              <w:right w:type="dxa" w:w="90"/>
+            </w:tcMar>
+          </w:tcPr>
+          <w:p>
+            <w:r>
+              <w:rPr>
+                <w:sz w:val="18"/>
+                <w:szCs w:val="18"/>
+              </w:rPr>
+              <w:t xml:space="preserve">SkyFlats (Mote Buster)</w:t>
+            </w:r>
+          </w:p>
+        </w:tc>
+        <w:tc>
+          <w:tcPr>
+            <w:tcW w:type="dxa" w:w="5960"/>
+            <w:tcBorders>
+              <w:top w:val="single" w:color="BFBFBF" w:sz="4"/>
+              <w:left w:val="single" w:color="BFBFBF" w:sz="4"/>
+              <w:bottom w:val="single" w:color="BFBFBF" w:sz="4"/>
+              <w:right w:val="single" w:color="BFBFBF" w:sz="4"/>
+            </w:tcBorders>
+            <w:tcMar>
+              <w:top w:type="dxa" w:w="30"/>
+              <w:left w:type="dxa" w:w="90"/>
+              <w:bottom w:type="dxa" w:w="30"/>
+              <w:right w:type="dxa" w:w="90"/>
+            </w:tcMar>
+          </w:tcPr>
+          <w:p>
+            <w:r>
+              <w:rPr>
+                <w:sz w:val="18"/>
+                <w:szCs w:val="18"/>
+              </w:rPr>
+              <w:t xml:space="preserve">No flats? A flat is built from your own light frames; a poor one stops and asks before it is used</w:t>
+            </w:r>
+          </w:p>
+        </w:tc>
+        <w:tc>
+          <w:tcPr>
+            <w:tcW w:type="dxa" w:w="900"/>
+            <w:tcBorders>
+              <w:top w:val="single" w:color="BFBFBF" w:sz="4"/>
+              <w:left w:val="single" w:color="BFBFBF" w:sz="4"/>
+              <w:bottom w:val="single" w:color="BFBFBF" w:sz="4"/>
+              <w:right w:val="single" w:color="BFBFBF" w:sz="4"/>
+            </w:tcBorders>
+            <w:tcMar>
+              <w:top w:type="dxa" w:w="30"/>
+              <w:left w:type="dxa" w:w="90"/>
+              <w:bottom w:type="dxa" w:w="30"/>
+              <w:right w:type="dxa" w:w="90"/>
+            </w:tcMar>
+          </w:tcPr>
+          <w:p>
+            <w:r>
+              <w:rPr>
+                <w:sz w:val="18"/>
+                <w:szCs w:val="18"/>
+              </w:rPr>
+              <w:t xml:space="preserve">0.9.22</w:t>
+            </w:r>
+          </w:p>
+        </w:tc>
+      </w:tr>
+      <w:tr>
+        <w:trPr>
+          <w:cantSplit/>
+        </w:trPr>
+        <w:tc>
+          <w:tcPr>
+            <w:tcW w:type="dxa" w:w="2500"/>
+            <w:tcBorders>
+              <w:top w:val="single" w:color="BFBFBF" w:sz="4"/>
+              <w:left w:val="single" w:color="BFBFBF" w:sz="4"/>
+              <w:bottom w:val="single" w:color="BFBFBF" w:sz="4"/>
+              <w:right w:val="single" w:color="BFBFBF" w:sz="4"/>
+            </w:tcBorders>
+            <w:tcMar>
+              <w:top w:type="dxa" w:w="30"/>
+              <w:left w:type="dxa" w:w="90"/>
+              <w:bottom w:type="dxa" w:w="30"/>
+              <w:right w:type="dxa" w:w="90"/>
+            </w:tcMar>
+          </w:tcPr>
+          <w:p>
+            <w:r>
+              <w:rPr>
+                <w:sz w:val="18"/>
+                <w:szCs w:val="18"/>
+              </w:rPr>
+              <w:t xml:space="preserve">Build Calibration Masters</w:t>
+            </w:r>
+          </w:p>
+        </w:tc>
+        <w:tc>
+          <w:tcPr>
+            <w:tcW w:type="dxa" w:w="5960"/>
+            <w:tcBorders>
+              <w:top w:val="single" w:color="BFBFBF" w:sz="4"/>
+              <w:left w:val="single" w:color="BFBFBF" w:sz="4"/>
+              <w:bottom w:val="single" w:color="BFBFBF" w:sz="4"/>
+              <w:right w:val="single" w:color="BFBFBF" w:sz="4"/>
+            </w:tcBorders>
+            <w:tcMar>
+              <w:top w:type="dxa" w:w="30"/>
+              <w:left w:type="dxa" w:w="90"/>
+              <w:bottom w:type="dxa" w:w="30"/>
+              <w:right w:type="dxa" w:w="90"/>
+            </w:tcMar>
+          </w:tcPr>
+          <w:p>
+            <w:r>
+              <w:rPr>
+                <w:sz w:val="18"/>
+                <w:szCs w:val="18"/>
+              </w:rPr>
+              <w:t xml:space="preserve">One folder of mixed bias, dark, flat and dark-flat subs is sorted, checked and turned into masters, no lights needed</w:t>
+            </w:r>
+          </w:p>
+        </w:tc>
+        <w:tc>
+          <w:tcPr>
+            <w:tcW w:type="dxa" w:w="900"/>
+            <w:tcBorders>
+              <w:top w:val="single" w:color="BFBFBF" w:sz="4"/>
+              <w:left w:val="single" w:color="BFBFBF" w:sz="4"/>
+              <w:bottom w:val="single" w:color="BFBFBF" w:sz="4"/>
+              <w:right w:val="single" w:color="BFBFBF" w:sz="4"/>
+            </w:tcBorders>
+            <w:tcMar>
+              <w:top w:type="dxa" w:w="30"/>
+              <w:left w:type="dxa" w:w="90"/>
+              <w:bottom w:type="dxa" w:w="30"/>
+              <w:right w:type="dxa" w:w="90"/>
+            </w:tcMar>
+          </w:tcPr>
+          <w:p>
+            <w:r>
+              <w:rPr>
+                <w:sz w:val="18"/>
+                <w:szCs w:val="18"/>
+              </w:rPr>
+              <w:t xml:space="preserve">0.9.24</w:t>
+            </w:r>
+          </w:p>
+        </w:tc>
+      </w:tr>
+      <w:tr>
+        <w:trPr>
+          <w:cantSplit/>
+        </w:trPr>
+        <w:tc>
+          <w:tcPr>
+            <w:tcW w:type="dxa" w:w="2500"/>
+            <w:tcBorders>
+              <w:top w:val="single" w:color="BFBFBF" w:sz="4"/>
+              <w:left w:val="single" w:color="BFBFBF" w:sz="4"/>
+              <w:bottom w:val="single" w:color="BFBFBF" w:sz="4"/>
+              <w:right w:val="single" w:color="BFBFBF" w:sz="4"/>
+            </w:tcBorders>
+            <w:tcMar>
+              <w:top w:type="dxa" w:w="30"/>
+              <w:left w:type="dxa" w:w="90"/>
+              <w:bottom w:type="dxa" w:w="30"/>
+              <w:right w:type="dxa" w:w="90"/>
+            </w:tcMar>
+          </w:tcPr>
+          <w:p>
+            <w:r>
+              <w:rPr>
+                <w:sz w:val="18"/>
+                <w:szCs w:val="18"/>
+              </w:rPr>
+              <w:t xml:space="preserve">Field-distortion correction</w:t>
+            </w:r>
+          </w:p>
+        </w:tc>
+        <w:tc>
+          <w:tcPr>
+            <w:tcW w:type="dxa" w:w="5960"/>
+            <w:tcBorders>
+              <w:top w:val="single" w:color="BFBFBF" w:sz="4"/>
+              <w:left w:val="single" w:color="BFBFBF" w:sz="4"/>
+              <w:bottom w:val="single" w:color="BFBFBF" w:sz="4"/>
+              <w:right w:val="single" w:color="BFBFBF" w:sz="4"/>
+            </w:tcBorders>
+            <w:tcMar>
+              <w:top w:type="dxa" w:w="30"/>
+              <w:left w:type="dxa" w:w="90"/>
+              <w:bottom w:type="dxa" w:w="30"/>
+              <w:right w:type="dxa" w:w="90"/>
+            </w:tcMar>
+          </w:tcPr>
+          <w:p>
+            <w:r>
+              <w:rPr>
+                <w:sz w:val="18"/>
+                <w:szCs w:val="18"/>
+              </w:rPr>
+              <w:t xml:space="preserve">Meridian flips and other setups get a distortion model per frame, so corner stars stay sharp</w:t>
+            </w:r>
+          </w:p>
+        </w:tc>
+        <w:tc>
+          <w:tcPr>
+            <w:tcW w:type="dxa" w:w="900"/>
+            <w:tcBorders>
+              <w:top w:val="single" w:color="BFBFBF" w:sz="4"/>
+              <w:left w:val="single" w:color="BFBFBF" w:sz="4"/>
+              <w:bottom w:val="single" w:color="BFBFBF" w:sz="4"/>
+              <w:right w:val="single" w:color="BFBFBF" w:sz="4"/>
+            </w:tcBorders>
+            <w:tcMar>
+              <w:top w:type="dxa" w:w="30"/>
+              <w:left w:type="dxa" w:w="90"/>
+              <w:bottom w:type="dxa" w:w="30"/>
+              <w:right w:type="dxa" w:w="90"/>
+            </w:tcMar>
+          </w:tcPr>
+          <w:p>
+            <w:r>
+              <w:rPr>
+                <w:sz w:val="18"/>
+                <w:szCs w:val="18"/>
+              </w:rPr>
+              <w:t xml:space="preserve">0.9.43</w:t>
+            </w:r>
+          </w:p>
+        </w:tc>
+      </w:tr>
+      <w:tr>
+        <w:trPr>
+          <w:cantSplit/>
+        </w:trPr>
+        <w:tc>
+          <w:tcPr>
+            <w:tcW w:type="dxa" w:w="2500"/>
+            <w:tcBorders>
+              <w:top w:val="single" w:color="BFBFBF" w:sz="4"/>
+              <w:left w:val="single" w:color="BFBFBF" w:sz="4"/>
+              <w:bottom w:val="single" w:color="BFBFBF" w:sz="4"/>
+              <w:right w:val="single" w:color="BFBFBF" w:sz="4"/>
+            </w:tcBorders>
+            <w:tcMar>
+              <w:top w:type="dxa" w:w="30"/>
+              <w:left w:type="dxa" w:w="90"/>
+              <w:bottom w:type="dxa" w:w="30"/>
+              <w:right w:type="dxa" w:w="90"/>
+            </w:tcMar>
+          </w:tcPr>
+          <w:p>
+            <w:r>
+              <w:rPr>
+                <w:sz w:val="18"/>
+                <w:szCs w:val="18"/>
+              </w:rPr>
+              <w:t xml:space="preserve">Hot-pixel-proof star matching</w:t>
+            </w:r>
+          </w:p>
+        </w:tc>
+        <w:tc>
+          <w:tcPr>
+            <w:tcW w:type="dxa" w:w="5960"/>
+            <w:tcBorders>
+              <w:top w:val="single" w:color="BFBFBF" w:sz="4"/>
+              <w:left w:val="single" w:color="BFBFBF" w:sz="4"/>
+              <w:bottom w:val="single" w:color="BFBFBF" w:sz="4"/>
+              <w:right w:val="single" w:color="BFBFBF" w:sz="4"/>
+            </w:tcBorders>
+            <w:tcMar>
+              <w:top w:type="dxa" w:w="30"/>
+              <w:left w:type="dxa" w:w="90"/>
+              <w:bottom w:type="dxa" w:w="30"/>
+              <w:right w:type="dxa" w:w="90"/>
+            </w:tcMar>
+          </w:tcPr>
+          <w:p>
+            <w:r>
+              <w:rPr>
+                <w:sz w:val="18"/>
+                <w:szCs w:val="18"/>
+              </w:rPr>
+              <w:t xml:space="preserve">Single-pixel spikes are ignored, so frames with hundreds of hot pixels line up on the sky, not the sensor</w:t>
+            </w:r>
+          </w:p>
+        </w:tc>
+        <w:tc>
+          <w:tcPr>
+            <w:tcW w:type="dxa" w:w="900"/>
+            <w:tcBorders>
+              <w:top w:val="single" w:color="BFBFBF" w:sz="4"/>
+              <w:left w:val="single" w:color="BFBFBF" w:sz="4"/>
+              <w:bottom w:val="single" w:color="BFBFBF" w:sz="4"/>
+              <w:right w:val="single" w:color="BFBFBF" w:sz="4"/>
+            </w:tcBorders>
+            <w:tcMar>
+              <w:top w:type="dxa" w:w="30"/>
+              <w:left w:type="dxa" w:w="90"/>
+              <w:bottom w:type="dxa" w:w="30"/>
+              <w:right w:type="dxa" w:w="90"/>
+            </w:tcMar>
+          </w:tcPr>
+          <w:p>
+            <w:r>
+              <w:rPr>
+                <w:sz w:val="18"/>
+                <w:szCs w:val="18"/>
+              </w:rPr>
+              <w:t xml:space="preserve">0.9.51</w:t>
+            </w:r>
+          </w:p>
+        </w:tc>
+      </w:tr>
+      <w:tr>
+        <w:trPr>
+          <w:cantSplit/>
+        </w:trPr>
+        <w:tc>
+          <w:tcPr>
+            <w:tcW w:type="dxa" w:w="2500"/>
+            <w:tcBorders>
+              <w:top w:val="single" w:color="BFBFBF" w:sz="4"/>
+              <w:left w:val="single" w:color="BFBFBF" w:sz="4"/>
+              <w:bottom w:val="single" w:color="BFBFBF" w:sz="4"/>
+              <w:right w:val="single" w:color="BFBFBF" w:sz="4"/>
+            </w:tcBorders>
+            <w:tcMar>
+              <w:top w:type="dxa" w:w="30"/>
+              <w:left w:type="dxa" w:w="90"/>
+              <w:bottom w:type="dxa" w:w="30"/>
+              <w:right w:type="dxa" w:w="90"/>
+            </w:tcMar>
+          </w:tcPr>
+          <w:p>
+            <w:r>
+              <w:rPr>
+                <w:sz w:val="18"/>
+                <w:szCs w:val="18"/>
+              </w:rPr>
+              <w:t xml:space="preserve">Plate-solution guided alignment</w:t>
+            </w:r>
+          </w:p>
+        </w:tc>
+        <w:tc>
+          <w:tcPr>
+            <w:tcW w:type="dxa" w:w="5960"/>
+            <w:tcBorders>
+              <w:top w:val="single" w:color="BFBFBF" w:sz="4"/>
+              <w:left w:val="single" w:color="BFBFBF" w:sz="4"/>
+              <w:bottom w:val="single" w:color="BFBFBF" w:sz="4"/>
+              <w:right w:val="single" w:color="BFBFBF" w:sz="4"/>
+            </w:tcBorders>
+            <w:tcMar>
+              <w:top w:type="dxa" w:w="30"/>
+              <w:left w:type="dxa" w:w="90"/>
+              <w:bottom w:type="dxa" w:w="30"/>
+              <w:right w:type="dxa" w:w="90"/>
+            </w:tcMar>
+          </w:tcPr>
+          <w:p>
+            <w:r>
+              <w:rPr>
+                <w:sz w:val="18"/>
+                <w:szCs w:val="18"/>
+              </w:rPr>
+              <w:t xml:space="preserve">Frames and masters that carry a plate solution are lined up from where they point on the sky, with the stars fine-tuning it - rescues matches that fail and catches ones that are wrong</w:t>
+            </w:r>
+          </w:p>
+        </w:tc>
+        <w:tc>
+          <w:tcPr>
+            <w:tcW w:type="dxa" w:w="900"/>
+            <w:tcBorders>
+              <w:top w:val="single" w:color="BFBFBF" w:sz="4"/>
+              <w:left w:val="single" w:color="BFBFBF" w:sz="4"/>
+              <w:bottom w:val="single" w:color="BFBFBF" w:sz="4"/>
+              <w:right w:val="single" w:color="BFBFBF" w:sz="4"/>
+            </w:tcBorders>
+            <w:tcMar>
+              <w:top w:type="dxa" w:w="30"/>
+              <w:left w:type="dxa" w:w="90"/>
+              <w:bottom w:type="dxa" w:w="30"/>
+              <w:right w:type="dxa" w:w="90"/>
+            </w:tcMar>
+          </w:tcPr>
+          <w:p>
+            <w:r>
+              <w:rPr>
+                <w:sz w:val="18"/>
+                <w:szCs w:val="18"/>
+              </w:rPr>
+              <w:t xml:space="preserve">0.9.53</w:t>
+            </w:r>
+          </w:p>
+        </w:tc>
+      </w:tr>
+      <w:tr>
+        <w:trPr>
+          <w:cantSplit/>
+        </w:trPr>
+        <w:tc>
+          <w:tcPr>
+            <w:tcW w:type="dxa" w:w="2500"/>
+            <w:tcBorders>
+              <w:top w:val="single" w:color="BFBFBF" w:sz="4"/>
+              <w:left w:val="single" w:color="BFBFBF" w:sz="4"/>
+              <w:bottom w:val="single" w:color="BFBFBF" w:sz="4"/>
+              <w:right w:val="single" w:color="BFBFBF" w:sz="4"/>
+            </w:tcBorders>
+            <w:tcMar>
+              <w:top w:type="dxa" w:w="30"/>
+              <w:left w:type="dxa" w:w="90"/>
+              <w:bottom w:type="dxa" w:w="30"/>
+              <w:right w:type="dxa" w:w="90"/>
+            </w:tcMar>
+          </w:tcPr>
+          <w:p>
+            <w:r>
+              <w:rPr>
+                <w:sz w:val="18"/>
+                <w:szCs w:val="18"/>
+              </w:rPr>
+              <w:t xml:space="preserve">Comet stacking</w:t>
+            </w:r>
+          </w:p>
+        </w:tc>
+        <w:tc>
+          <w:tcPr>
+            <w:tcW w:type="dxa" w:w="5960"/>
+            <w:tcBorders>
+              <w:top w:val="single" w:color="BFBFBF" w:sz="4"/>
+              <w:left w:val="single" w:color="BFBFBF" w:sz="4"/>
+              <w:bottom w:val="single" w:color="BFBFBF" w:sz="4"/>
+              <w:right w:val="single" w:color="BFBFBF" w:sz="4"/>
+            </w:tcBorders>
+            <w:tcMar>
+              <w:top w:type="dxa" w:w="30"/>
+              <w:left w:type="dxa" w:w="90"/>
+              <w:bottom w:type="dxa" w:w="30"/>
+              <w:right w:type="dxa" w:w="90"/>
+            </w:tcMar>
+          </w:tcPr>
+          <w:p>
+            <w:r>
+              <w:rPr>
+                <w:sz w:val="18"/>
+                <w:szCs w:val="18"/>
+              </w:rPr>
+              <w:t xml:space="preserve">A second stack follows the comet; stars and comet are both sharp in the final master</w:t>
+            </w:r>
+          </w:p>
+        </w:tc>
+        <w:tc>
+          <w:tcPr>
+            <w:tcW w:type="dxa" w:w="900"/>
+            <w:tcBorders>
+              <w:top w:val="single" w:color="BFBFBF" w:sz="4"/>
+              <w:left w:val="single" w:color="BFBFBF" w:sz="4"/>
+              <w:bottom w:val="single" w:color="BFBFBF" w:sz="4"/>
+              <w:right w:val="single" w:color="BFBFBF" w:sz="4"/>
+            </w:tcBorders>
+            <w:tcMar>
+              <w:top w:type="dxa" w:w="30"/>
+              <w:left w:type="dxa" w:w="90"/>
+              <w:bottom w:type="dxa" w:w="30"/>
+              <w:right w:type="dxa" w:w="90"/>
+            </w:tcMar>
+          </w:tcPr>
+          <w:p>
+            <w:r>
+              <w:rPr>
+                <w:sz w:val="18"/>
+                <w:szCs w:val="18"/>
+              </w:rPr>
+              <w:t xml:space="preserve">0.9.22</w:t>
+            </w:r>
+          </w:p>
+        </w:tc>
+      </w:tr>
+    </w:tbl>
+    <w:p>
+      <w:pPr>
+        <w:spacing w:after="120"/>
+      </w:pPr>
+    </w:p>
+    <w:p>
+      <w:pPr>
+        <w:pStyle w:val="Heading3"/>
+      </w:pPr>
+      <w:r>
+        <w:t xml:space="preserve">Page 3 – Astro Image Processing</w:t>
+      </w:r>
+    </w:p>
+    <w:tbl>
+      <w:tblPr>
+        <w:tblW w:type="dxa" w:w="9360"/>
+        <w:tblBorders>
+          <w:top w:val="single" w:color="auto" w:sz="4"/>
+          <w:left w:val="single" w:color="auto" w:sz="4"/>
+          <w:bottom w:val="single" w:color="auto" w:sz="4"/>
+          <w:right w:val="single" w:color="auto" w:sz="4"/>
+          <w:insideH w:val="single" w:color="auto" w:sz="4"/>
+          <w:insideV w:val="single" w:color="auto" w:sz="4"/>
+        </w:tblBorders>
+      </w:tblPr>
+      <w:tblGrid>
+        <w:gridCol w:w="2500"/>
+        <w:gridCol w:w="5960"/>
+        <w:gridCol w:w="900"/>
+      </w:tblGrid>
+      <w:tr>
+        <w:trPr>
+          <w:tblHeader/>
+        </w:trPr>
+        <w:tc>
+          <w:tcPr>
+            <w:tcW w:type="dxa" w:w="2500"/>
+            <w:tcBorders>
+              <w:top w:val="single" w:color="BFBFBF" w:sz="4"/>
+              <w:left w:val="single" w:color="BFBFBF" w:sz="4"/>
+              <w:bottom w:val="single" w:color="BFBFBF" w:sz="4"/>
+              <w:right w:val="single" w:color="BFBFBF" w:sz="4"/>
+            </w:tcBorders>
+            <w:shd w:fill="DCE6F2" w:color="auto" w:val="clear"/>
+            <w:tcMar>
+              <w:top w:type="dxa" w:w="30"/>
+              <w:left w:type="dxa" w:w="90"/>
+              <w:bottom w:type="dxa" w:w="30"/>
+              <w:right w:type="dxa" w:w="90"/>
+            </w:tcMar>
+          </w:tcPr>
+          <w:p>
+            <w:r>
+              <w:rPr>
+                <w:b/>
+                <w:bCs/>
+                <w:sz w:val="18"/>
+                <w:szCs w:val="18"/>
+              </w:rPr>
+              <w:t xml:space="preserve">Feature</w:t>
+            </w:r>
+          </w:p>
+        </w:tc>
+        <w:tc>
+          <w:tcPr>
+            <w:tcW w:type="dxa" w:w="5960"/>
+            <w:tcBorders>
+              <w:top w:val="single" w:color="BFBFBF" w:sz="4"/>
+              <w:left w:val="single" w:color="BFBFBF" w:sz="4"/>
+              <w:bottom w:val="single" w:color="BFBFBF" w:sz="4"/>
+              <w:right w:val="single" w:color="BFBFBF" w:sz="4"/>
+            </w:tcBorders>
+            <w:shd w:fill="DCE6F2" w:color="auto" w:val="clear"/>
+            <w:tcMar>
+              <w:top w:type="dxa" w:w="30"/>
+              <w:left w:type="dxa" w:w="90"/>
+              <w:bottom w:type="dxa" w:w="30"/>
+              <w:right w:type="dxa" w:w="90"/>
+            </w:tcMar>
+          </w:tcPr>
+          <w:p>
+            <w:r>
+              <w:rPr>
+                <w:b/>
+                <w:bCs/>
+                <w:sz w:val="18"/>
+                <w:szCs w:val="18"/>
+              </w:rPr>
+              <w:t xml:space="preserve">What it does</w:t>
+            </w:r>
+          </w:p>
+        </w:tc>
+        <w:tc>
+          <w:tcPr>
+            <w:tcW w:type="dxa" w:w="900"/>
+            <w:tcBorders>
+              <w:top w:val="single" w:color="BFBFBF" w:sz="4"/>
+              <w:left w:val="single" w:color="BFBFBF" w:sz="4"/>
+              <w:bottom w:val="single" w:color="BFBFBF" w:sz="4"/>
+              <w:right w:val="single" w:color="BFBFBF" w:sz="4"/>
+            </w:tcBorders>
+            <w:shd w:fill="DCE6F2" w:color="auto" w:val="clear"/>
+            <w:tcMar>
+              <w:top w:type="dxa" w:w="30"/>
+              <w:left w:type="dxa" w:w="90"/>
+              <w:bottom w:type="dxa" w:w="30"/>
+              <w:right w:type="dxa" w:w="90"/>
+            </w:tcMar>
+          </w:tcPr>
+          <w:p>
+            <w:r>
+              <w:rPr>
+                <w:b/>
+                <w:bCs/>
+                <w:sz w:val="18"/>
+                <w:szCs w:val="18"/>
+              </w:rPr>
+              <w:t xml:space="preserve">Since</w:t>
+            </w:r>
+          </w:p>
+        </w:tc>
+      </w:tr>
+      <w:tr>
+        <w:trPr>
+          <w:cantSplit/>
+        </w:trPr>
+        <w:tc>
+          <w:tcPr>
+            <w:tcW w:type="dxa" w:w="2500"/>
+            <w:tcBorders>
+              <w:top w:val="single" w:color="BFBFBF" w:sz="4"/>
+              <w:left w:val="single" w:color="BFBFBF" w:sz="4"/>
+              <w:bottom w:val="single" w:color="BFBFBF" w:sz="4"/>
+              <w:right w:val="single" w:color="BFBFBF" w:sz="4"/>
+            </w:tcBorders>
+            <w:tcMar>
+              <w:top w:type="dxa" w:w="30"/>
+              <w:left w:type="dxa" w:w="90"/>
+              <w:bottom w:type="dxa" w:w="30"/>
+              <w:right w:type="dxa" w:w="90"/>
+            </w:tcMar>
+          </w:tcPr>
+          <w:p>
+            <w:r>
+              <w:rPr>
+                <w:sz w:val="18"/>
+                <w:szCs w:val="18"/>
+              </w:rPr>
+              <w:t xml:space="preserve">One run for every filter</w:t>
+            </w:r>
+          </w:p>
+        </w:tc>
+        <w:tc>
+          <w:tcPr>
+            <w:tcW w:type="dxa" w:w="5960"/>
+            <w:tcBorders>
+              <w:top w:val="single" w:color="BFBFBF" w:sz="4"/>
+              <w:left w:val="single" w:color="BFBFBF" w:sz="4"/>
+              <w:bottom w:val="single" w:color="BFBFBF" w:sz="4"/>
+              <w:right w:val="single" w:color="BFBFBF" w:sz="4"/>
+            </w:tcBorders>
+            <w:tcMar>
+              <w:top w:type="dxa" w:w="30"/>
+              <w:left w:type="dxa" w:w="90"/>
+              <w:bottom w:type="dxa" w:w="30"/>
+              <w:right w:type="dxa" w:w="90"/>
+            </w:tcMar>
+          </w:tcPr>
+          <w:p>
+            <w:r>
+              <w:rPr>
+                <w:sz w:val="18"/>
+                <w:szCs w:val="18"/>
+              </w:rPr>
+              <w:t xml:space="preserve">Auto-crop, plate solve, gradient removal and the RC-Astro tools on every master of the target, with the same crop</w:t>
+            </w:r>
+          </w:p>
+        </w:tc>
+        <w:tc>
+          <w:tcPr>
+            <w:tcW w:type="dxa" w:w="900"/>
+            <w:tcBorders>
+              <w:top w:val="single" w:color="BFBFBF" w:sz="4"/>
+              <w:left w:val="single" w:color="BFBFBF" w:sz="4"/>
+              <w:bottom w:val="single" w:color="BFBFBF" w:sz="4"/>
+              <w:right w:val="single" w:color="BFBFBF" w:sz="4"/>
+            </w:tcBorders>
+            <w:tcMar>
+              <w:top w:type="dxa" w:w="30"/>
+              <w:left w:type="dxa" w:w="90"/>
+              <w:bottom w:type="dxa" w:w="30"/>
+              <w:right w:type="dxa" w:w="90"/>
+            </w:tcMar>
+          </w:tcPr>
+          <w:p>
+            <w:r>
+              <w:rPr>
+                <w:sz w:val="18"/>
+                <w:szCs w:val="18"/>
+              </w:rPr>
+              <w:t xml:space="preserve">0.5.0</w:t>
+            </w:r>
+          </w:p>
+        </w:tc>
+      </w:tr>
+      <w:tr>
+        <w:trPr>
+          <w:cantSplit/>
+        </w:trPr>
+        <w:tc>
+          <w:tcPr>
+            <w:tcW w:type="dxa" w:w="2500"/>
+            <w:tcBorders>
+              <w:top w:val="single" w:color="BFBFBF" w:sz="4"/>
+              <w:left w:val="single" w:color="BFBFBF" w:sz="4"/>
+              <w:bottom w:val="single" w:color="BFBFBF" w:sz="4"/>
+              <w:right w:val="single" w:color="BFBFBF" w:sz="4"/>
+            </w:tcBorders>
+            <w:tcMar>
+              <w:top w:type="dxa" w:w="30"/>
+              <w:left w:type="dxa" w:w="90"/>
+              <w:bottom w:type="dxa" w:w="30"/>
+              <w:right w:type="dxa" w:w="90"/>
+            </w:tcMar>
+          </w:tcPr>
+          <w:p>
+            <w:r>
+              <w:rPr>
+                <w:sz w:val="18"/>
+                <w:szCs w:val="18"/>
+              </w:rPr>
+              <w:t xml:space="preserve">RC-Astro without a terminal</w:t>
+            </w:r>
+          </w:p>
+        </w:tc>
+        <w:tc>
+          <w:tcPr>
+            <w:tcW w:type="dxa" w:w="5960"/>
+            <w:tcBorders>
+              <w:top w:val="single" w:color="BFBFBF" w:sz="4"/>
+              <w:left w:val="single" w:color="BFBFBF" w:sz="4"/>
+              <w:bottom w:val="single" w:color="BFBFBF" w:sz="4"/>
+              <w:right w:val="single" w:color="BFBFBF" w:sz="4"/>
+            </w:tcBorders>
+            <w:tcMar>
+              <w:top w:type="dxa" w:w="30"/>
+              <w:left w:type="dxa" w:w="90"/>
+              <w:bottom w:type="dxa" w:w="30"/>
+              <w:right w:type="dxa" w:w="90"/>
+            </w:tcMar>
+          </w:tcPr>
+          <w:p>
+            <w:r>
+              <w:rPr>
+                <w:sz w:val="18"/>
+                <w:szCs w:val="18"/>
+              </w:rPr>
+              <w:t xml:space="preserve">BlurXTerminator, NoiseXTerminator and StarXTerminator through the RC-Astro CLI, on the fast GPU, licences activated with a pasted code</w:t>
+            </w:r>
+          </w:p>
+        </w:tc>
+        <w:tc>
+          <w:tcPr>
+            <w:tcW w:type="dxa" w:w="900"/>
+            <w:tcBorders>
+              <w:top w:val="single" w:color="BFBFBF" w:sz="4"/>
+              <w:left w:val="single" w:color="BFBFBF" w:sz="4"/>
+              <w:bottom w:val="single" w:color="BFBFBF" w:sz="4"/>
+              <w:right w:val="single" w:color="BFBFBF" w:sz="4"/>
+            </w:tcBorders>
+            <w:tcMar>
+              <w:top w:type="dxa" w:w="30"/>
+              <w:left w:type="dxa" w:w="90"/>
+              <w:bottom w:type="dxa" w:w="30"/>
+              <w:right w:type="dxa" w:w="90"/>
+            </w:tcMar>
+          </w:tcPr>
+          <w:p>
+            <w:r>
+              <w:rPr>
+                <w:sz w:val="18"/>
+                <w:szCs w:val="18"/>
+              </w:rPr>
+              <w:t xml:space="preserve">0.5.0</w:t>
+            </w:r>
+          </w:p>
+        </w:tc>
+      </w:tr>
+      <w:tr>
+        <w:trPr>
+          <w:cantSplit/>
+        </w:trPr>
+        <w:tc>
+          <w:tcPr>
+            <w:tcW w:type="dxa" w:w="2500"/>
+            <w:tcBorders>
+              <w:top w:val="single" w:color="BFBFBF" w:sz="4"/>
+              <w:left w:val="single" w:color="BFBFBF" w:sz="4"/>
+              <w:bottom w:val="single" w:color="BFBFBF" w:sz="4"/>
+              <w:right w:val="single" w:color="BFBFBF" w:sz="4"/>
+            </w:tcBorders>
+            <w:tcMar>
+              <w:top w:type="dxa" w:w="30"/>
+              <w:left w:type="dxa" w:w="90"/>
+              <w:bottom w:type="dxa" w:w="30"/>
+              <w:right w:type="dxa" w:w="90"/>
+            </w:tcMar>
+          </w:tcPr>
+          <w:p>
+            <w:r>
+              <w:rPr>
+                <w:sz w:val="18"/>
+                <w:szCs w:val="18"/>
+              </w:rPr>
+              <w:t xml:space="preserve">Persistent plate solving</w:t>
+            </w:r>
+          </w:p>
+        </w:tc>
+        <w:tc>
+          <w:tcPr>
+            <w:tcW w:type="dxa" w:w="5960"/>
+            <w:tcBorders>
+              <w:top w:val="single" w:color="BFBFBF" w:sz="4"/>
+              <w:left w:val="single" w:color="BFBFBF" w:sz="4"/>
+              <w:bottom w:val="single" w:color="BFBFBF" w:sz="4"/>
+              <w:right w:val="single" w:color="BFBFBF" w:sz="4"/>
+            </w:tcBorders>
+            <w:tcMar>
+              <w:top w:type="dxa" w:w="30"/>
+              <w:left w:type="dxa" w:w="90"/>
+              <w:bottom w:type="dxa" w:w="30"/>
+              <w:right w:type="dxa" w:w="90"/>
+            </w:tcMar>
+          </w:tcPr>
+          <w:p>
+            <w:r>
+              <w:rPr>
+                <w:sz w:val="18"/>
+                <w:szCs w:val="18"/>
+              </w:rPr>
+              <w:t xml:space="preserve">ASTAP retries other field sizes and works when the header has no focal length</w:t>
+            </w:r>
+          </w:p>
+        </w:tc>
+        <w:tc>
+          <w:tcPr>
+            <w:tcW w:type="dxa" w:w="900"/>
+            <w:tcBorders>
+              <w:top w:val="single" w:color="BFBFBF" w:sz="4"/>
+              <w:left w:val="single" w:color="BFBFBF" w:sz="4"/>
+              <w:bottom w:val="single" w:color="BFBFBF" w:sz="4"/>
+              <w:right w:val="single" w:color="BFBFBF" w:sz="4"/>
+            </w:tcBorders>
+            <w:tcMar>
+              <w:top w:type="dxa" w:w="30"/>
+              <w:left w:type="dxa" w:w="90"/>
+              <w:bottom w:type="dxa" w:w="30"/>
+              <w:right w:type="dxa" w:w="90"/>
+            </w:tcMar>
+          </w:tcPr>
+          <w:p>
+            <w:r>
+              <w:rPr>
+                <w:sz w:val="18"/>
+                <w:szCs w:val="18"/>
+              </w:rPr>
+              <w:t xml:space="preserve">0.9.37</w:t>
+            </w:r>
+          </w:p>
+        </w:tc>
+      </w:tr>
+      <w:tr>
+        <w:trPr>
+          <w:cantSplit/>
+        </w:trPr>
+        <w:tc>
+          <w:tcPr>
+            <w:tcW w:type="dxa" w:w="2500"/>
+            <w:tcBorders>
+              <w:top w:val="single" w:color="BFBFBF" w:sz="4"/>
+              <w:left w:val="single" w:color="BFBFBF" w:sz="4"/>
+              <w:bottom w:val="single" w:color="BFBFBF" w:sz="4"/>
+              <w:right w:val="single" w:color="BFBFBF" w:sz="4"/>
+            </w:tcBorders>
+            <w:tcMar>
+              <w:top w:type="dxa" w:w="30"/>
+              <w:left w:type="dxa" w:w="90"/>
+              <w:bottom w:type="dxa" w:w="30"/>
+              <w:right w:type="dxa" w:w="90"/>
+            </w:tcMar>
+          </w:tcPr>
+          <w:p>
+            <w:r>
+              <w:rPr>
+                <w:sz w:val="18"/>
+                <w:szCs w:val="18"/>
+              </w:rPr>
+              <w:t xml:space="preserve">PixInsight next steps</w:t>
+            </w:r>
+          </w:p>
+        </w:tc>
+        <w:tc>
+          <w:tcPr>
+            <w:tcW w:type="dxa" w:w="5960"/>
+            <w:tcBorders>
+              <w:top w:val="single" w:color="BFBFBF" w:sz="4"/>
+              <w:left w:val="single" w:color="BFBFBF" w:sz="4"/>
+              <w:bottom w:val="single" w:color="BFBFBF" w:sz="4"/>
+              <w:right w:val="single" w:color="BFBFBF" w:sz="4"/>
+            </w:tcBorders>
+            <w:tcMar>
+              <w:top w:type="dxa" w:w="30"/>
+              <w:left w:type="dxa" w:w="90"/>
+              <w:bottom w:type="dxa" w:w="30"/>
+              <w:right w:type="dxa" w:w="90"/>
+            </w:tcMar>
+          </w:tcPr>
+          <w:p>
+            <w:r>
+              <w:rPr>
+                <w:sz w:val="18"/>
+                <w:szCs w:val="18"/>
+              </w:rPr>
+              <w:t xml:space="preserve">Linear XISF/FITS plus a plan of the PixInsight processes still to run, with done steps ticked</w:t>
+            </w:r>
+          </w:p>
+        </w:tc>
+        <w:tc>
+          <w:tcPr>
+            <w:tcW w:type="dxa" w:w="900"/>
+            <w:tcBorders>
+              <w:top w:val="single" w:color="BFBFBF" w:sz="4"/>
+              <w:left w:val="single" w:color="BFBFBF" w:sz="4"/>
+              <w:bottom w:val="single" w:color="BFBFBF" w:sz="4"/>
+              <w:right w:val="single" w:color="BFBFBF" w:sz="4"/>
+            </w:tcBorders>
+            <w:tcMar>
+              <w:top w:type="dxa" w:w="30"/>
+              <w:left w:type="dxa" w:w="90"/>
+              <w:bottom w:type="dxa" w:w="30"/>
+              <w:right w:type="dxa" w:w="90"/>
+            </w:tcMar>
+          </w:tcPr>
+          <w:p>
+            <w:r>
+              <w:rPr>
+                <w:sz w:val="18"/>
+                <w:szCs w:val="18"/>
+              </w:rPr>
+              <w:t xml:space="preserve">0.5.0</w:t>
+            </w:r>
+          </w:p>
+        </w:tc>
+      </w:tr>
+    </w:tbl>
+    <w:p>
+      <w:pPr>
+        <w:spacing w:after="120"/>
+      </w:pPr>
+    </w:p>
+    <w:p>
+      <w:pPr>
+        <w:pStyle w:val="Heading3"/>
+      </w:pPr>
+      <w:r>
+        <w:t xml:space="preserve">Page 4 – Finishing Touches</w:t>
+      </w:r>
+    </w:p>
+    <w:tbl>
+      <w:tblPr>
+        <w:tblW w:type="dxa" w:w="9360"/>
+        <w:tblBorders>
+          <w:top w:val="single" w:color="auto" w:sz="4"/>
+          <w:left w:val="single" w:color="auto" w:sz="4"/>
+          <w:bottom w:val="single" w:color="auto" w:sz="4"/>
+          <w:right w:val="single" w:color="auto" w:sz="4"/>
+          <w:insideH w:val="single" w:color="auto" w:sz="4"/>
+          <w:insideV w:val="single" w:color="auto" w:sz="4"/>
+        </w:tblBorders>
+      </w:tblPr>
+      <w:tblGrid>
+        <w:gridCol w:w="2500"/>
+        <w:gridCol w:w="5960"/>
+        <w:gridCol w:w="900"/>
+      </w:tblGrid>
+      <w:tr>
+        <w:trPr>
+          <w:tblHeader/>
+        </w:trPr>
+        <w:tc>
+          <w:tcPr>
+            <w:tcW w:type="dxa" w:w="2500"/>
+            <w:tcBorders>
+              <w:top w:val="single" w:color="BFBFBF" w:sz="4"/>
+              <w:left w:val="single" w:color="BFBFBF" w:sz="4"/>
+              <w:bottom w:val="single" w:color="BFBFBF" w:sz="4"/>
+              <w:right w:val="single" w:color="BFBFBF" w:sz="4"/>
+            </w:tcBorders>
+            <w:shd w:fill="DCE6F2" w:color="auto" w:val="clear"/>
+            <w:tcMar>
+              <w:top w:type="dxa" w:w="30"/>
+              <w:left w:type="dxa" w:w="90"/>
+              <w:bottom w:type="dxa" w:w="30"/>
+              <w:right w:type="dxa" w:w="90"/>
+            </w:tcMar>
+          </w:tcPr>
+          <w:p>
+            <w:r>
+              <w:rPr>
+                <w:b/>
+                <w:bCs/>
+                <w:sz w:val="18"/>
+                <w:szCs w:val="18"/>
+              </w:rPr>
+              <w:t xml:space="preserve">Feature</w:t>
+            </w:r>
+          </w:p>
+        </w:tc>
+        <w:tc>
+          <w:tcPr>
+            <w:tcW w:type="dxa" w:w="5960"/>
+            <w:tcBorders>
+              <w:top w:val="single" w:color="BFBFBF" w:sz="4"/>
+              <w:left w:val="single" w:color="BFBFBF" w:sz="4"/>
+              <w:bottom w:val="single" w:color="BFBFBF" w:sz="4"/>
+              <w:right w:val="single" w:color="BFBFBF" w:sz="4"/>
+            </w:tcBorders>
+            <w:shd w:fill="DCE6F2" w:color="auto" w:val="clear"/>
+            <w:tcMar>
+              <w:top w:type="dxa" w:w="30"/>
+              <w:left w:type="dxa" w:w="90"/>
+              <w:bottom w:type="dxa" w:w="30"/>
+              <w:right w:type="dxa" w:w="90"/>
+            </w:tcMar>
+          </w:tcPr>
+          <w:p>
+            <w:r>
+              <w:rPr>
+                <w:b/>
+                <w:bCs/>
+                <w:sz w:val="18"/>
+                <w:szCs w:val="18"/>
+              </w:rPr>
+              <w:t xml:space="preserve">What it does</w:t>
+            </w:r>
+          </w:p>
+        </w:tc>
+        <w:tc>
+          <w:tcPr>
+            <w:tcW w:type="dxa" w:w="900"/>
+            <w:tcBorders>
+              <w:top w:val="single" w:color="BFBFBF" w:sz="4"/>
+              <w:left w:val="single" w:color="BFBFBF" w:sz="4"/>
+              <w:bottom w:val="single" w:color="BFBFBF" w:sz="4"/>
+              <w:right w:val="single" w:color="BFBFBF" w:sz="4"/>
+            </w:tcBorders>
+            <w:shd w:fill="DCE6F2" w:color="auto" w:val="clear"/>
+            <w:tcMar>
+              <w:top w:type="dxa" w:w="30"/>
+              <w:left w:type="dxa" w:w="90"/>
+              <w:bottom w:type="dxa" w:w="30"/>
+              <w:right w:type="dxa" w:w="90"/>
+            </w:tcMar>
+          </w:tcPr>
+          <w:p>
+            <w:r>
+              <w:rPr>
+                <w:b/>
+                <w:bCs/>
+                <w:sz w:val="18"/>
+                <w:szCs w:val="18"/>
+              </w:rPr>
+              <w:t xml:space="preserve">Since</w:t>
+            </w:r>
+          </w:p>
+        </w:tc>
+      </w:tr>
+      <w:tr>
+        <w:trPr>
+          <w:cantSplit/>
+        </w:trPr>
+        <w:tc>
+          <w:tcPr>
+            <w:tcW w:type="dxa" w:w="2500"/>
+            <w:tcBorders>
+              <w:top w:val="single" w:color="BFBFBF" w:sz="4"/>
+              <w:left w:val="single" w:color="BFBFBF" w:sz="4"/>
+              <w:bottom w:val="single" w:color="BFBFBF" w:sz="4"/>
+              <w:right w:val="single" w:color="BFBFBF" w:sz="4"/>
+            </w:tcBorders>
+            <w:tcMar>
+              <w:top w:type="dxa" w:w="30"/>
+              <w:left w:type="dxa" w:w="90"/>
+              <w:bottom w:type="dxa" w:w="30"/>
+              <w:right w:type="dxa" w:w="90"/>
+            </w:tcMar>
+          </w:tcPr>
+          <w:p>
+            <w:r>
+              <w:rPr>
+                <w:sz w:val="18"/>
+                <w:szCs w:val="18"/>
+              </w:rPr>
+              <w:t xml:space="preserve">Recommended next step</w:t>
+            </w:r>
+          </w:p>
+        </w:tc>
+        <w:tc>
+          <w:tcPr>
+            <w:tcW w:type="dxa" w:w="5960"/>
+            <w:tcBorders>
+              <w:top w:val="single" w:color="BFBFBF" w:sz="4"/>
+              <w:left w:val="single" w:color="BFBFBF" w:sz="4"/>
+              <w:bottom w:val="single" w:color="BFBFBF" w:sz="4"/>
+              <w:right w:val="single" w:color="BFBFBF" w:sz="4"/>
+            </w:tcBorders>
+            <w:tcMar>
+              <w:top w:type="dxa" w:w="30"/>
+              <w:left w:type="dxa" w:w="90"/>
+              <w:bottom w:type="dxa" w:w="30"/>
+              <w:right w:type="dxa" w:w="90"/>
+            </w:tcMar>
+          </w:tcPr>
+          <w:p>
+            <w:r>
+              <w:rPr>
+                <w:sz w:val="18"/>
+                <w:szCs w:val="18"/>
+              </w:rPr>
+              <w:t xml:space="preserve">Tailored to your data (colour, mono, narrowband, smart scope) and the target (galaxy, nebula, cluster, comet)</w:t>
+            </w:r>
+          </w:p>
+        </w:tc>
+        <w:tc>
+          <w:tcPr>
+            <w:tcW w:type="dxa" w:w="900"/>
+            <w:tcBorders>
+              <w:top w:val="single" w:color="BFBFBF" w:sz="4"/>
+              <w:left w:val="single" w:color="BFBFBF" w:sz="4"/>
+              <w:bottom w:val="single" w:color="BFBFBF" w:sz="4"/>
+              <w:right w:val="single" w:color="BFBFBF" w:sz="4"/>
+            </w:tcBorders>
+            <w:tcMar>
+              <w:top w:type="dxa" w:w="30"/>
+              <w:left w:type="dxa" w:w="90"/>
+              <w:bottom w:type="dxa" w:w="30"/>
+              <w:right w:type="dxa" w:w="90"/>
+            </w:tcMar>
+          </w:tcPr>
+          <w:p>
+            <w:r>
+              <w:rPr>
+                <w:sz w:val="18"/>
+                <w:szCs w:val="18"/>
+              </w:rPr>
+              <w:t xml:space="preserve">0.7</w:t>
+            </w:r>
+          </w:p>
+        </w:tc>
+      </w:tr>
+      <w:tr>
+        <w:trPr>
+          <w:cantSplit/>
+        </w:trPr>
+        <w:tc>
+          <w:tcPr>
+            <w:tcW w:type="dxa" w:w="2500"/>
+            <w:tcBorders>
+              <w:top w:val="single" w:color="BFBFBF" w:sz="4"/>
+              <w:left w:val="single" w:color="BFBFBF" w:sz="4"/>
+              <w:bottom w:val="single" w:color="BFBFBF" w:sz="4"/>
+              <w:right w:val="single" w:color="BFBFBF" w:sz="4"/>
+            </w:tcBorders>
+            <w:tcMar>
+              <w:top w:type="dxa" w:w="30"/>
+              <w:left w:type="dxa" w:w="90"/>
+              <w:bottom w:type="dxa" w:w="30"/>
+              <w:right w:type="dxa" w:w="90"/>
+            </w:tcMar>
+          </w:tcPr>
+          <w:p>
+            <w:r>
+              <w:rPr>
+                <w:sz w:val="18"/>
+                <w:szCs w:val="18"/>
+              </w:rPr>
+              <w:t xml:space="preserve">Pick from your own image, then fine-tune</w:t>
+            </w:r>
+          </w:p>
+        </w:tc>
+        <w:tc>
+          <w:tcPr>
+            <w:tcW w:type="dxa" w:w="5960"/>
+            <w:tcBorders>
+              <w:top w:val="single" w:color="BFBFBF" w:sz="4"/>
+              <w:left w:val="single" w:color="BFBFBF" w:sz="4"/>
+              <w:bottom w:val="single" w:color="BFBFBF" w:sz="4"/>
+              <w:right w:val="single" w:color="BFBFBF" w:sz="4"/>
+            </w:tcBorders>
+            <w:tcMar>
+              <w:top w:type="dxa" w:w="30"/>
+              <w:left w:type="dxa" w:w="90"/>
+              <w:bottom w:type="dxa" w:w="30"/>
+              <w:right w:type="dxa" w:w="90"/>
+            </w:tcMar>
+          </w:tcPr>
+          <w:p>
+            <w:r>
+              <w:rPr>
+                <w:sz w:val="18"/>
+                <w:szCs w:val="18"/>
+              </w:rPr>
+              <w:t xml:space="preserve">Small versions of your picture to choose from; clicking previews big without applying; plain-language sliders fine-tune it, and the app says how much of the picture they change</w:t>
+            </w:r>
+          </w:p>
+        </w:tc>
+        <w:tc>
+          <w:tcPr>
+            <w:tcW w:type="dxa" w:w="900"/>
+            <w:tcBorders>
+              <w:top w:val="single" w:color="BFBFBF" w:sz="4"/>
+              <w:left w:val="single" w:color="BFBFBF" w:sz="4"/>
+              <w:bottom w:val="single" w:color="BFBFBF" w:sz="4"/>
+              <w:right w:val="single" w:color="BFBFBF" w:sz="4"/>
+            </w:tcBorders>
+            <w:tcMar>
+              <w:top w:type="dxa" w:w="30"/>
+              <w:left w:type="dxa" w:w="90"/>
+              <w:bottom w:type="dxa" w:w="30"/>
+              <w:right w:type="dxa" w:w="90"/>
+            </w:tcMar>
+          </w:tcPr>
+          <w:p>
+            <w:r>
+              <w:rPr>
+                <w:sz w:val="18"/>
+                <w:szCs w:val="18"/>
+              </w:rPr>
+              <w:t xml:space="preserve">0.7 / 0.9.48</w:t>
+            </w:r>
+          </w:p>
+        </w:tc>
+      </w:tr>
+      <w:tr>
+        <w:trPr>
+          <w:cantSplit/>
+        </w:trPr>
+        <w:tc>
+          <w:tcPr>
+            <w:tcW w:type="dxa" w:w="2500"/>
+            <w:tcBorders>
+              <w:top w:val="single" w:color="BFBFBF" w:sz="4"/>
+              <w:left w:val="single" w:color="BFBFBF" w:sz="4"/>
+              <w:bottom w:val="single" w:color="BFBFBF" w:sz="4"/>
+              <w:right w:val="single" w:color="BFBFBF" w:sz="4"/>
+            </w:tcBorders>
+            <w:tcMar>
+              <w:top w:type="dxa" w:w="30"/>
+              <w:left w:type="dxa" w:w="90"/>
+              <w:bottom w:type="dxa" w:w="30"/>
+              <w:right w:type="dxa" w:w="90"/>
+            </w:tcMar>
+          </w:tcPr>
+          <w:p>
+            <w:r>
+              <w:rPr>
+                <w:sz w:val="18"/>
+                <w:szCs w:val="18"/>
+              </w:rPr>
+              <w:t xml:space="preserve">Do It Again</w:t>
+            </w:r>
+          </w:p>
+        </w:tc>
+        <w:tc>
+          <w:tcPr>
+            <w:tcW w:type="dxa" w:w="5960"/>
+            <w:tcBorders>
+              <w:top w:val="single" w:color="BFBFBF" w:sz="4"/>
+              <w:left w:val="single" w:color="BFBFBF" w:sz="4"/>
+              <w:bottom w:val="single" w:color="BFBFBF" w:sz="4"/>
+              <w:right w:val="single" w:color="BFBFBF" w:sz="4"/>
+            </w:tcBorders>
+            <w:tcMar>
+              <w:top w:type="dxa" w:w="30"/>
+              <w:left w:type="dxa" w:w="90"/>
+              <w:bottom w:type="dxa" w:w="30"/>
+              <w:right w:type="dxa" w:w="90"/>
+            </w:tcMar>
+          </w:tcPr>
+          <w:p>
+            <w:r>
+              <w:rPr>
+                <w:sz w:val="18"/>
+                <w:szCs w:val="18"/>
+              </w:rPr>
+              <w:t xml:space="preserve">Repeatable steps (curves, saturation, noise, Mote Buster …) can be run once more on their own result</w:t>
+            </w:r>
+          </w:p>
+        </w:tc>
+        <w:tc>
+          <w:tcPr>
+            <w:tcW w:type="dxa" w:w="900"/>
+            <w:tcBorders>
+              <w:top w:val="single" w:color="BFBFBF" w:sz="4"/>
+              <w:left w:val="single" w:color="BFBFBF" w:sz="4"/>
+              <w:bottom w:val="single" w:color="BFBFBF" w:sz="4"/>
+              <w:right w:val="single" w:color="BFBFBF" w:sz="4"/>
+            </w:tcBorders>
+            <w:tcMar>
+              <w:top w:type="dxa" w:w="30"/>
+              <w:left w:type="dxa" w:w="90"/>
+              <w:bottom w:type="dxa" w:w="30"/>
+              <w:right w:type="dxa" w:w="90"/>
+            </w:tcMar>
+          </w:tcPr>
+          <w:p>
+            <w:r>
+              <w:rPr>
+                <w:sz w:val="18"/>
+                <w:szCs w:val="18"/>
+              </w:rPr>
+              <w:t xml:space="preserve">0.9.48</w:t>
+            </w:r>
+          </w:p>
+        </w:tc>
+      </w:tr>
+      <w:tr>
+        <w:trPr>
+          <w:cantSplit/>
+        </w:trPr>
+        <w:tc>
+          <w:tcPr>
+            <w:tcW w:type="dxa" w:w="2500"/>
+            <w:tcBorders>
+              <w:top w:val="single" w:color="BFBFBF" w:sz="4"/>
+              <w:left w:val="single" w:color="BFBFBF" w:sz="4"/>
+              <w:bottom w:val="single" w:color="BFBFBF" w:sz="4"/>
+              <w:right w:val="single" w:color="BFBFBF" w:sz="4"/>
+            </w:tcBorders>
+            <w:tcMar>
+              <w:top w:type="dxa" w:w="30"/>
+              <w:left w:type="dxa" w:w="90"/>
+              <w:bottom w:type="dxa" w:w="30"/>
+              <w:right w:type="dxa" w:w="90"/>
+            </w:tcMar>
+          </w:tcPr>
+          <w:p>
+            <w:r>
+              <w:rPr>
+                <w:sz w:val="18"/>
+                <w:szCs w:val="18"/>
+              </w:rPr>
+              <w:t xml:space="preserve">Mote Buster – Fix Dust Donuts</w:t>
+            </w:r>
+          </w:p>
+        </w:tc>
+        <w:tc>
+          <w:tcPr>
+            <w:tcW w:type="dxa" w:w="5960"/>
+            <w:tcBorders>
+              <w:top w:val="single" w:color="BFBFBF" w:sz="4"/>
+              <w:left w:val="single" w:color="BFBFBF" w:sz="4"/>
+              <w:bottom w:val="single" w:color="BFBFBF" w:sz="4"/>
+              <w:right w:val="single" w:color="BFBFBF" w:sz="4"/>
+            </w:tcBorders>
+            <w:tcMar>
+              <w:top w:type="dxa" w:w="30"/>
+              <w:left w:type="dxa" w:w="90"/>
+              <w:bottom w:type="dxa" w:w="30"/>
+              <w:right w:type="dxa" w:w="90"/>
+            </w:tcMar>
+          </w:tcPr>
+          <w:p>
+            <w:r>
+              <w:rPr>
+                <w:sz w:val="18"/>
+                <w:szCs w:val="18"/>
+              </w:rPr>
+              <w:t xml:space="preserve">Measures each dust shadow ring by ring and divides it out with a synthetic flat, so the detail underneath comes back; run it in rounds</w:t>
+            </w:r>
+          </w:p>
+        </w:tc>
+        <w:tc>
+          <w:tcPr>
+            <w:tcW w:type="dxa" w:w="900"/>
+            <w:tcBorders>
+              <w:top w:val="single" w:color="BFBFBF" w:sz="4"/>
+              <w:left w:val="single" w:color="BFBFBF" w:sz="4"/>
+              <w:bottom w:val="single" w:color="BFBFBF" w:sz="4"/>
+              <w:right w:val="single" w:color="BFBFBF" w:sz="4"/>
+            </w:tcBorders>
+            <w:tcMar>
+              <w:top w:type="dxa" w:w="30"/>
+              <w:left w:type="dxa" w:w="90"/>
+              <w:bottom w:type="dxa" w:w="30"/>
+              <w:right w:type="dxa" w:w="90"/>
+            </w:tcMar>
+          </w:tcPr>
+          <w:p>
+            <w:r>
+              <w:rPr>
+                <w:sz w:val="18"/>
+                <w:szCs w:val="18"/>
+              </w:rPr>
+              <w:t xml:space="preserve">0.9.22 / 0.9.47</w:t>
+            </w:r>
+          </w:p>
+        </w:tc>
+      </w:tr>
+      <w:tr>
+        <w:trPr>
+          <w:cantSplit/>
+        </w:trPr>
+        <w:tc>
+          <w:tcPr>
+            <w:tcW w:type="dxa" w:w="2500"/>
+            <w:tcBorders>
+              <w:top w:val="single" w:color="BFBFBF" w:sz="4"/>
+              <w:left w:val="single" w:color="BFBFBF" w:sz="4"/>
+              <w:bottom w:val="single" w:color="BFBFBF" w:sz="4"/>
+              <w:right w:val="single" w:color="BFBFBF" w:sz="4"/>
+            </w:tcBorders>
+            <w:tcMar>
+              <w:top w:type="dxa" w:w="30"/>
+              <w:left w:type="dxa" w:w="90"/>
+              <w:bottom w:type="dxa" w:w="30"/>
+              <w:right w:type="dxa" w:w="90"/>
+            </w:tcMar>
+          </w:tcPr>
+          <w:p>
+            <w:r>
+              <w:rPr>
+                <w:sz w:val="18"/>
+                <w:szCs w:val="18"/>
+              </w:rPr>
+              <w:t xml:space="preserve">Every master used</w:t>
+            </w:r>
+          </w:p>
+        </w:tc>
+        <w:tc>
+          <w:tcPr>
+            <w:tcW w:type="dxa" w:w="5960"/>
+            <w:tcBorders>
+              <w:top w:val="single" w:color="BFBFBF" w:sz="4"/>
+              <w:left w:val="single" w:color="BFBFBF" w:sz="4"/>
+              <w:bottom w:val="single" w:color="BFBFBF" w:sz="4"/>
+              <w:right w:val="single" w:color="BFBFBF" w:sz="4"/>
+            </w:tcBorders>
+            <w:tcMar>
+              <w:top w:type="dxa" w:w="30"/>
+              <w:left w:type="dxa" w:w="90"/>
+              <w:bottom w:type="dxa" w:w="30"/>
+              <w:right w:type="dxa" w:w="90"/>
+            </w:tcMar>
+          </w:tcPr>
+          <w:p>
+            <w:r>
+              <w:rPr>
+                <w:sz w:val="18"/>
+                <w:szCs w:val="18"/>
+              </w:rPr>
+              <w:t xml:space="preserve">Several masters per filter averaged (less noisy ones count more), other setups bent onto one grid, unmatched ones left out</w:t>
+            </w:r>
+          </w:p>
+        </w:tc>
+        <w:tc>
+          <w:tcPr>
+            <w:tcW w:type="dxa" w:w="900"/>
+            <w:tcBorders>
+              <w:top w:val="single" w:color="BFBFBF" w:sz="4"/>
+              <w:left w:val="single" w:color="BFBFBF" w:sz="4"/>
+              <w:bottom w:val="single" w:color="BFBFBF" w:sz="4"/>
+              <w:right w:val="single" w:color="BFBFBF" w:sz="4"/>
+            </w:tcBorders>
+            <w:tcMar>
+              <w:top w:type="dxa" w:w="30"/>
+              <w:left w:type="dxa" w:w="90"/>
+              <w:bottom w:type="dxa" w:w="30"/>
+              <w:right w:type="dxa" w:w="90"/>
+            </w:tcMar>
+          </w:tcPr>
+          <w:p>
+            <w:r>
+              <w:rPr>
+                <w:sz w:val="18"/>
+                <w:szCs w:val="18"/>
+              </w:rPr>
+              <w:t xml:space="preserve">0.9.41</w:t>
+            </w:r>
+          </w:p>
+        </w:tc>
+      </w:tr>
+      <w:tr>
+        <w:trPr>
+          <w:cantSplit/>
+        </w:trPr>
+        <w:tc>
+          <w:tcPr>
+            <w:tcW w:type="dxa" w:w="2500"/>
+            <w:tcBorders>
+              <w:top w:val="single" w:color="BFBFBF" w:sz="4"/>
+              <w:left w:val="single" w:color="BFBFBF" w:sz="4"/>
+              <w:bottom w:val="single" w:color="BFBFBF" w:sz="4"/>
+              <w:right w:val="single" w:color="BFBFBF" w:sz="4"/>
+            </w:tcBorders>
+            <w:tcMar>
+              <w:top w:type="dxa" w:w="30"/>
+              <w:left w:type="dxa" w:w="90"/>
+              <w:bottom w:type="dxa" w:w="30"/>
+              <w:right w:type="dxa" w:w="90"/>
+            </w:tcMar>
+          </w:tcPr>
+          <w:p>
+            <w:r>
+              <w:rPr>
+                <w:sz w:val="18"/>
+                <w:szCs w:val="18"/>
+              </w:rPr>
+              <w:t xml:space="preserve">Target description</w:t>
+            </w:r>
+          </w:p>
+        </w:tc>
+        <w:tc>
+          <w:tcPr>
+            <w:tcW w:type="dxa" w:w="5960"/>
+            <w:tcBorders>
+              <w:top w:val="single" w:color="BFBFBF" w:sz="4"/>
+              <w:left w:val="single" w:color="BFBFBF" w:sz="4"/>
+              <w:bottom w:val="single" w:color="BFBFBF" w:sz="4"/>
+              <w:right w:val="single" w:color="BFBFBF" w:sz="4"/>
+            </w:tcBorders>
+            <w:tcMar>
+              <w:top w:type="dxa" w:w="30"/>
+              <w:left w:type="dxa" w:w="90"/>
+              <w:bottom w:type="dxa" w:w="30"/>
+              <w:right w:type="dxa" w:w="90"/>
+            </w:tcMar>
+          </w:tcPr>
+          <w:p>
+            <w:r>
+              <w:rPr>
+                <w:sz w:val="18"/>
+                <w:szCs w:val="18"/>
+              </w:rPr>
+              <w:t xml:space="preserve">A short write-up from Wikipedia plus SIMBAD facts, credited, saved next to your picture</w:t>
+            </w:r>
+          </w:p>
+        </w:tc>
+        <w:tc>
+          <w:tcPr>
+            <w:tcW w:type="dxa" w:w="900"/>
+            <w:tcBorders>
+              <w:top w:val="single" w:color="BFBFBF" w:sz="4"/>
+              <w:left w:val="single" w:color="BFBFBF" w:sz="4"/>
+              <w:bottom w:val="single" w:color="BFBFBF" w:sz="4"/>
+              <w:right w:val="single" w:color="BFBFBF" w:sz="4"/>
+            </w:tcBorders>
+            <w:tcMar>
+              <w:top w:type="dxa" w:w="30"/>
+              <w:left w:type="dxa" w:w="90"/>
+              <w:bottom w:type="dxa" w:w="30"/>
+              <w:right w:type="dxa" w:w="90"/>
+            </w:tcMar>
+          </w:tcPr>
+          <w:p>
+            <w:r>
+              <w:rPr>
+                <w:sz w:val="18"/>
+                <w:szCs w:val="18"/>
+              </w:rPr>
+              <w:t xml:space="preserve">0.9.34</w:t>
+            </w:r>
+          </w:p>
+        </w:tc>
+      </w:tr>
+    </w:tbl>
+    <w:p>
+      <w:pPr>
+        <w:spacing w:after="120"/>
+      </w:pPr>
+    </w:p>
+    <w:p>
+      <w:pPr>
+        <w:pStyle w:val="Heading1"/>
+        <w:pageBreakBefore/>
+      </w:pPr>
+      <w:r>
         <w:t xml:space="preserve">Contents</w:t>
       </w:r>
     </w:p>
@@ -172,7 +3211,7 @@
           <w:b/>
           <w:bCs/>
         </w:rPr>
-        <w:t xml:space="preserve">4</w:t>
+        <w:t xml:space="preserve">6</w:t>
       </w:r>
     </w:p>
     <w:p>
@@ -255,7 +3294,7 @@
           <w:b/>
           <w:bCs/>
         </w:rPr>
-        <w:t xml:space="preserve">6</w:t>
+        <w:t xml:space="preserve">8</w:t>
       </w:r>
     </w:p>
     <w:p>
@@ -338,7 +3377,7 @@
           <w:b/>
           <w:bCs/>
         </w:rPr>
-        <w:t xml:space="preserve">8</w:t>
+        <w:t xml:space="preserve">10</w:t>
       </w:r>
     </w:p>
     <w:p>
@@ -439,7 +3478,7 @@
           <w:b/>
           <w:bCs/>
         </w:rPr>
-        <w:t xml:space="preserve">9</w:t>
+        <w:t xml:space="preserve">11</w:t>
       </w:r>
     </w:p>
     <w:p>
@@ -540,7 +3579,7 @@
           <w:b/>
           <w:bCs/>
         </w:rPr>
-        <w:t xml:space="preserve">14</w:t>
+        <w:t xml:space="preserve">16</w:t>
       </w:r>
     </w:p>
     <w:p>
@@ -641,7 +3680,7 @@
           <w:b/>
           <w:bCs/>
         </w:rPr>
-        <w:t xml:space="preserve">15</w:t>
+        <w:t xml:space="preserve">17</w:t>
       </w:r>
     </w:p>
     <w:p>
@@ -760,7 +3799,7 @@
           <w:b/>
           <w:bCs/>
         </w:rPr>
-        <w:t xml:space="preserve">18</w:t>
+        <w:t xml:space="preserve">20</w:t>
       </w:r>
     </w:p>
     <w:p>
@@ -897,7 +3936,7 @@
           <w:b/>
           <w:bCs/>
         </w:rPr>
-        <w:t xml:space="preserve">21</w:t>
+        <w:t xml:space="preserve">23</w:t>
       </w:r>
     </w:p>
     <w:p>
@@ -1052,7 +4091,7 @@
           <w:b/>
           <w:bCs/>
         </w:rPr>
-        <w:t xml:space="preserve">25</w:t>
+        <w:t xml:space="preserve">27</w:t>
       </w:r>
     </w:p>
     <w:p>
@@ -1225,7 +4264,7 @@
           <w:b/>
           <w:bCs/>
         </w:rPr>
-        <w:t xml:space="preserve">31</w:t>
+        <w:t xml:space="preserve">33</w:t>
       </w:r>
     </w:p>
     <w:p>
@@ -1380,7 +4419,7 @@
           <w:b/>
           <w:bCs/>
         </w:rPr>
-        <w:t xml:space="preserve">33</w:t>
+        <w:t xml:space="preserve">35</w:t>
       </w:r>
     </w:p>
     <w:p>
@@ -1445,7 +4484,7 @@
           <w:b/>
           <w:bCs/>
         </w:rPr>
-        <w:t xml:space="preserve">35</w:t>
+        <w:t xml:space="preserve">37</w:t>
       </w:r>
     </w:p>
     <w:p>
@@ -1510,7 +4549,7 @@
           <w:b/>
           <w:bCs/>
         </w:rPr>
-        <w:t xml:space="preserve">36</w:t>
+        <w:t xml:space="preserve">38</w:t>
       </w:r>
     </w:p>
     <w:p>
@@ -1575,7 +4614,7 @@
           <w:b/>
           <w:bCs/>
         </w:rPr>
-        <w:t xml:space="preserve">37</w:t>
+        <w:t xml:space="preserve">39</w:t>
       </w:r>
     </w:p>
     <w:p>
@@ -1640,7 +4679,7 @@
           <w:b/>
           <w:bCs/>
         </w:rPr>
-        <w:t xml:space="preserve">38</w:t>
+        <w:t xml:space="preserve">40</w:t>
       </w:r>
     </w:p>
     <w:p>
@@ -10466,7 +13505,7 @@
         <w:t xml:space="preserve">Several masters per filter, or masters from different setups.</w:t>
       </w:r>
       <w:r>
-        <w:t xml:space="preserve"> When you load more than one master of the same filter (other nights, other cameras or telescopes), all of them are used: they are brought to the same brightness and averaged, the less noisy ones counting more. Every master is first matched star by star to one reference master. Masters from another camera or telescope are bent slightly differently by their optics - most at the edges, which would give coloured double stars in the corners - so SubZeroAstro measures that distortion from hundreds of stars and corrects it. A master whose stars cannot be matched to the others is left out (when its filter has other masters), so it can't cause double stars, and the picture is cropped to the area all masters cover. The note under the title says how many masters were combined, corrected or left out.</w:t>
+        <w:t xml:space="preserve"> When you load more than one master of the same filter (other nights, other cameras or telescopes), all of them are used: they are brought to the same brightness and averaged, the less noisy ones counting more. Every master is first matched star by star to one reference master. Masters from another camera or telescope are bent slightly differently by their optics - most at the edges, which would give coloured double stars in the corners - so SubZeroAstro measures that distortion from hundreds of stars and corrects it. When the masters carry a plate solution (data from remote observatories usually does, and page 3 adds one with ASTAP), it guides the match: the masters are lined up from where they point on the sky and the stars fine-tune it, so even masters with few stars in common line up. A master whose stars cannot be matched to the others is left out (when its filter has other masters), so it can't cause double stars, and the picture is cropped to the area all masters cover. The note under the title says how many masters were combined, corrected or left out.</w:t>
       </w:r>
     </w:p>
     <w:p>

</xml_diff>

<commit_message>
v0.9.54: page 4 lines up to the deepest master; hot pixels removed before stacking
Finishing Touches used the first Ha master as the reference for all others - for NGC 2359 a
3-frame 2019 master that page 3 could not line up, so every filter was registered to a poor grid
(red/green/blue star offsets). The deepest master (EXPTOTAL) is now the reference, as on page 3.
Stacking gets cosmetic correction (on by default, 'Remove hot pixels'): single-pixel hot pixels and
cosmic rays are replaced by the median of their neighbours in each calibrated frame (per colour for
Bayer data), so undithered remote-observatory data no longer leaves coloured specks.

Co-Authored-By: Claude Opus 5.5 <noreply@anthropic.com>
Claude-Session: https://claude.ai/code/session_01FKvd69QsnCvM2zbzYnPwmF
</commit_message>
<xml_diff>
--- a/docs/SubZeroAstro_User_Manual.docx
+++ b/docs/SubZeroAstro_User_Manual.docx
@@ -121,7 +121,7 @@
           <w:sz w:val="22"/>
           <w:szCs w:val="22"/>
         </w:rPr>
-        <w:t xml:space="preserve">Version 0.9.53 beta  ·  Windows and Mac (Apple silicon)</w:t>
+        <w:t xml:space="preserve">Version 0.9.54 beta  ·  Windows and Mac (Apple silicon)</w:t>
       </w:r>
     </w:p>
     <w:p>
@@ -1841,6 +1841,89 @@
                 <w:szCs w:val="18"/>
               </w:rPr>
               <w:t xml:space="preserve">0.9.43</w:t>
+            </w:r>
+          </w:p>
+        </w:tc>
+      </w:tr>
+      <w:tr>
+        <w:trPr>
+          <w:cantSplit/>
+        </w:trPr>
+        <w:tc>
+          <w:tcPr>
+            <w:tcW w:type="dxa" w:w="2500"/>
+            <w:tcBorders>
+              <w:top w:val="single" w:color="BFBFBF" w:sz="4"/>
+              <w:left w:val="single" w:color="BFBFBF" w:sz="4"/>
+              <w:bottom w:val="single" w:color="BFBFBF" w:sz="4"/>
+              <w:right w:val="single" w:color="BFBFBF" w:sz="4"/>
+            </w:tcBorders>
+            <w:tcMar>
+              <w:top w:type="dxa" w:w="30"/>
+              <w:left w:type="dxa" w:w="90"/>
+              <w:bottom w:type="dxa" w:w="30"/>
+              <w:right w:type="dxa" w:w="90"/>
+            </w:tcMar>
+          </w:tcPr>
+          <w:p>
+            <w:r>
+              <w:rPr>
+                <w:sz w:val="18"/>
+                <w:szCs w:val="18"/>
+              </w:rPr>
+              <w:t xml:space="preserve">Hot pixels removed</w:t>
+            </w:r>
+          </w:p>
+        </w:tc>
+        <w:tc>
+          <w:tcPr>
+            <w:tcW w:type="dxa" w:w="5960"/>
+            <w:tcBorders>
+              <w:top w:val="single" w:color="BFBFBF" w:sz="4"/>
+              <w:left w:val="single" w:color="BFBFBF" w:sz="4"/>
+              <w:bottom w:val="single" w:color="BFBFBF" w:sz="4"/>
+              <w:right w:val="single" w:color="BFBFBF" w:sz="4"/>
+            </w:tcBorders>
+            <w:tcMar>
+              <w:top w:type="dxa" w:w="30"/>
+              <w:left w:type="dxa" w:w="90"/>
+              <w:bottom w:type="dxa" w:w="30"/>
+              <w:right w:type="dxa" w:w="90"/>
+            </w:tcMar>
+          </w:tcPr>
+          <w:p>
+            <w:r>
+              <w:rPr>
+                <w:sz w:val="18"/>
+                <w:szCs w:val="18"/>
+              </w:rPr>
+              <w:t xml:space="preserve">Cosmetic correction in every frame: hot pixels and cosmic-ray hits are replaced by their neighbours, so undithered data has no coloured specks</w:t>
+            </w:r>
+          </w:p>
+        </w:tc>
+        <w:tc>
+          <w:tcPr>
+            <w:tcW w:type="dxa" w:w="900"/>
+            <w:tcBorders>
+              <w:top w:val="single" w:color="BFBFBF" w:sz="4"/>
+              <w:left w:val="single" w:color="BFBFBF" w:sz="4"/>
+              <w:bottom w:val="single" w:color="BFBFBF" w:sz="4"/>
+              <w:right w:val="single" w:color="BFBFBF" w:sz="4"/>
+            </w:tcBorders>
+            <w:tcMar>
+              <w:top w:type="dxa" w:w="30"/>
+              <w:left w:type="dxa" w:w="90"/>
+              <w:bottom w:type="dxa" w:w="30"/>
+              <w:right w:type="dxa" w:w="90"/>
+            </w:tcMar>
+          </w:tcPr>
+          <w:p>
+            <w:r>
+              <w:rPr>
+                <w:sz w:val="18"/>
+                <w:szCs w:val="18"/>
+              </w:rPr>
+              <w:t xml:space="preserve">0.9.54</w:t>
             </w:r>
           </w:p>
         </w:tc>
@@ -13505,7 +13588,7 @@
         <w:t xml:space="preserve">Several masters per filter, or masters from different setups.</w:t>
       </w:r>
       <w:r>
-        <w:t xml:space="preserve"> When you load more than one master of the same filter (other nights, other cameras or telescopes), all of them are used: they are brought to the same brightness and averaged, the less noisy ones counting more. Every master is first matched star by star to one reference master. Masters from another camera or telescope are bent slightly differently by their optics - most at the edges, which would give coloured double stars in the corners - so SubZeroAstro measures that distortion from hundreds of stars and corrects it. When the masters carry a plate solution (data from remote observatories usually does, and page 3 adds one with ASTAP), it guides the match: the masters are lined up from where they point on the sky and the stars fine-tune it, so even masters with few stars in common line up. A master whose stars cannot be matched to the others is left out (when its filter has other masters), so it can't cause double stars, and the picture is cropped to the area all masters cover. The note under the title says how many masters were combined, corrected or left out.</w:t>
+        <w:t xml:space="preserve"> When you load more than one master of the same filter (other nights, other cameras or telescopes), all of them are used: they are brought to the same brightness and averaged, the less noisy ones counting more. Every master is first matched star by star to one reference master. Masters from another camera or telescope are bent slightly differently by their optics - most at the edges, which would give coloured double stars in the corners - so SubZeroAstro measures that distortion from hundreds of stars and corrects it. When the masters carry a plate solution (data from remote observatories usually does, and page 3 adds one with ASTAP), it guides the match: the masters are lined up from where they point on the sky and the stars fine-tune it, so even masters with few stars in common line up. The deepest master (the most hours) is the reference everything is lined up to. A master whose stars cannot be matched to the others is left out (when its filter has other masters), so it can't cause double stars, and the picture is cropped to the area all masters cover. The note under the title says how many masters were combined, corrected or left out.</w:t>
       </w:r>
     </w:p>
     <w:p>
@@ -17830,6 +17913,65 @@
           <w:p>
             <w:r>
               <w:t xml:space="preserve">Restart: SubZeroAstro offers to resume from its saved progress.</w:t>
+            </w:r>
+          </w:p>
+        </w:tc>
+      </w:tr>
+      <w:tr>
+        <w:trPr>
+          <w:cantSplit/>
+        </w:trPr>
+        <w:tc>
+          <w:tcPr>
+            <w:tcW w:type="dxa" w:w="3300"/>
+            <w:tcBorders>
+              <w:top w:val="single" w:color="BFBFBF" w:sz="4"/>
+              <w:left w:val="single" w:color="BFBFBF" w:sz="4"/>
+              <w:bottom w:val="single" w:color="BFBFBF" w:sz="4"/>
+              <w:right w:val="single" w:color="BFBFBF" w:sz="4"/>
+            </w:tcBorders>
+            <w:tcMar>
+              <w:top w:type="dxa" w:w="60"/>
+              <w:left w:type="dxa" w:w="100"/>
+              <w:bottom w:type="dxa" w:w="60"/>
+              <w:right w:type="dxa" w:w="100"/>
+            </w:tcMar>
+          </w:tcPr>
+          <w:p>
+            <w:r>
+              <w:t xml:space="preserve">Coloured specks (single red, green or blue pixels) all over the picture</w:t>
+            </w:r>
+          </w:p>
+        </w:tc>
+        <w:tc>
+          <w:tcPr>
+            <w:tcW w:type="dxa" w:w="6060"/>
+            <w:tcBorders>
+              <w:top w:val="single" w:color="BFBFBF" w:sz="4"/>
+              <w:left w:val="single" w:color="BFBFBF" w:sz="4"/>
+              <w:bottom w:val="single" w:color="BFBFBF" w:sz="4"/>
+              <w:right w:val="single" w:color="BFBFBF" w:sz="4"/>
+            </w:tcBorders>
+            <w:tcMar>
+              <w:top w:type="dxa" w:w="60"/>
+              <w:left w:type="dxa" w:w="100"/>
+              <w:bottom w:type="dxa" w:w="60"/>
+              <w:right w:type="dxa" w:w="100"/>
+            </w:tcMar>
+          </w:tcPr>
+          <w:p>
+            <w:r>
+              <w:t xml:space="preserve">Hot pixels that survived stacking - they do when the frames were not dithered (common with remote-observatory data), because they sit on the same pixel in every frame. Since 0.9.54 </w:t>
+            </w:r>
+            <w:r>
+              <w:rPr>
+                <w:b/>
+                <w:bCs/>
+              </w:rPr>
+              <w:t xml:space="preserve">Remove hot pixels</w:t>
+            </w:r>
+            <w:r>
+              <w:t xml:space="preserve"> (page 2, on by default) replaces them in every frame before stacking; re-stack such data.</w:t>
             </w:r>
           </w:p>
         </w:tc>

</xml_diff>

<commit_message>
v0.9.55: page 4 checks every master's corner stars after lining up; hot-pixel guard
After lining up, each master's stars in the four outer corners are compared with the reference's;
a master still more than 1.5 px off is left out when its filter has other masters (named in the
notes), and the notes report how closely the rest match. Cosmetic correction is skipped for frames
where more than 0.2% of pixels look like hot pixels - the stars themselves are that sharp (binned
CHI-1 frames reported 10,000-30,000), so it would erase stars.

Co-Authored-By: Claude Opus 5.5 <noreply@anthropic.com>
Claude-Session: https://claude.ai/code/session_01FKvd69QsnCvM2zbzYnPwmF
</commit_message>
<xml_diff>
--- a/docs/SubZeroAstro_User_Manual.docx
+++ b/docs/SubZeroAstro_User_Manual.docx
@@ -121,7 +121,7 @@
           <w:sz w:val="22"/>
           <w:szCs w:val="22"/>
         </w:rPr>
-        <w:t xml:space="preserve">Version 0.9.54 beta  ·  Windows and Mac (Apple silicon)</w:t>
+        <w:t xml:space="preserve">Version 0.9.55 beta  ·  Windows and Mac (Apple silicon)</w:t>
       </w:r>
     </w:p>
     <w:p>
@@ -4347,7 +4347,7 @@
           <w:b/>
           <w:bCs/>
         </w:rPr>
-        <w:t xml:space="preserve">33</w:t>
+        <w:t xml:space="preserve">34</w:t>
       </w:r>
     </w:p>
     <w:p>
@@ -4502,7 +4502,7 @@
           <w:b/>
           <w:bCs/>
         </w:rPr>
-        <w:t xml:space="preserve">35</w:t>
+        <w:t xml:space="preserve">36</w:t>
       </w:r>
     </w:p>
     <w:p>
@@ -4567,7 +4567,7 @@
           <w:b/>
           <w:bCs/>
         </w:rPr>
-        <w:t xml:space="preserve">37</w:t>
+        <w:t xml:space="preserve">38</w:t>
       </w:r>
     </w:p>
     <w:p>
@@ -4632,7 +4632,7 @@
           <w:b/>
           <w:bCs/>
         </w:rPr>
-        <w:t xml:space="preserve">38</w:t>
+        <w:t xml:space="preserve">39</w:t>
       </w:r>
     </w:p>
     <w:p>
@@ -4697,7 +4697,7 @@
           <w:b/>
           <w:bCs/>
         </w:rPr>
-        <w:t xml:space="preserve">39</w:t>
+        <w:t xml:space="preserve">40</w:t>
       </w:r>
     </w:p>
     <w:p>
@@ -4762,7 +4762,7 @@
           <w:b/>
           <w:bCs/>
         </w:rPr>
-        <w:t xml:space="preserve">40</w:t>
+        <w:t xml:space="preserve">41</w:t>
       </w:r>
     </w:p>
     <w:p>
@@ -13588,7 +13588,17 @@
         <w:t xml:space="preserve">Several masters per filter, or masters from different setups.</w:t>
       </w:r>
       <w:r>
-        <w:t xml:space="preserve"> When you load more than one master of the same filter (other nights, other cameras or telescopes), all of them are used: they are brought to the same brightness and averaged, the less noisy ones counting more. Every master is first matched star by star to one reference master. Masters from another camera or telescope are bent slightly differently by their optics - most at the edges, which would give coloured double stars in the corners - so SubZeroAstro measures that distortion from hundreds of stars and corrects it. When the masters carry a plate solution (data from remote observatories usually does, and page 3 adds one with ASTAP), it guides the match: the masters are lined up from where they point on the sky and the stars fine-tune it, so even masters with few stars in common line up. The deepest master (the most hours) is the reference everything is lined up to. A master whose stars cannot be matched to the others is left out (when its filter has other masters), so it can't cause double stars, and the picture is cropped to the area all masters cover. The note under the title says how many masters were combined, corrected or left out.</w:t>
+        <w:t xml:space="preserve"> When you load more than one master of the same filter (other nights, other cameras or telescopes), all of them are used: they are brought to the same brightness and averaged, the less noisy ones counting more. Every master is first matched star by star to one reference master. Masters from another camera or telescope are bent slightly differently by their optics - most at the edges, which would give coloured double stars in the corners - so SubZeroAstro measures that distortion from hundreds of stars and corrects it. When the masters carry a plate solution (data from remote observatories usually does, and page 3 adds one with ASTAP), it guides the match: the masters are lined up from where they point on the sky and the stars fine-tune it, so even masters with few stars in common line up. The deepest master (the most hours) is the reference everything is lined up to. After lining up, every master is checked: its stars in all four corners are compared with the reference's, and one still more than 1.5 px off is left out (when its filter has other masters) - the note says </w:t>
+      </w:r>
+      <w:r>
+        <w:rPr>
+          <w:i/>
+          <w:iCs/>
+        </w:rPr>
+        <w:t xml:space="preserve">alignment check: … within X px in every corner</w:t>
+      </w:r>
+      <w:r>
+        <w:t xml:space="preserve">. A master whose stars cannot be matched to the others is left out (when its filter has other masters), so it can't cause double stars, and the picture is cropped to the area all masters cover. The note under the title says how many masters were combined, corrected or left out.</w:t>
       </w:r>
     </w:p>
     <w:p>

</xml_diff>

<commit_message>
v0.9.56: page 4 lines up starless masters by their stars; trusts page 3's grid
The masters page 4 gets after StarXTerminator are starless: it looked for stars in them, matched
leftover blobs and nebula knots and bent 8 well-aligned NGC 2359 masters out of place (coloured
corner stars). Registration and the corner check now use starless + stars-only together; masters
page 3 already lined up (ALIGNREF, now written by page 3) are used as they are when the check
agrees. The corner check compares image patches by phase correlation, so large offsets show (it
could only see offsets under 4 px before). Page 4 now gets every master of the target from page 3
(the file-name filter was case-sensitive: NGC2359 / ngc2359 / Ngc2359 were treated as different).

Co-Authored-By: Claude Opus 5.5 <noreply@anthropic.com>
Claude-Session: https://claude.ai/code/session_01FKvd69QsnCvM2zbzYnPwmF
</commit_message>
<xml_diff>
--- a/docs/SubZeroAstro_User_Manual.docx
+++ b/docs/SubZeroAstro_User_Manual.docx
@@ -121,7 +121,7 @@
           <w:sz w:val="22"/>
           <w:szCs w:val="22"/>
         </w:rPr>
-        <w:t xml:space="preserve">Version 0.9.55 beta  ·  Windows and Mac (Apple silicon)</w:t>
+        <w:t xml:space="preserve">Version 0.9.56 beta  ·  Windows and Mac (Apple silicon)</w:t>
       </w:r>
     </w:p>
     <w:p>
@@ -13588,7 +13588,7 @@
         <w:t xml:space="preserve">Several masters per filter, or masters from different setups.</w:t>
       </w:r>
       <w:r>
-        <w:t xml:space="preserve"> When you load more than one master of the same filter (other nights, other cameras or telescopes), all of them are used: they are brought to the same brightness and averaged, the less noisy ones counting more. Every master is first matched star by star to one reference master. Masters from another camera or telescope are bent slightly differently by their optics - most at the edges, which would give coloured double stars in the corners - so SubZeroAstro measures that distortion from hundreds of stars and corrects it. When the masters carry a plate solution (data from remote observatories usually does, and page 3 adds one with ASTAP), it guides the match: the masters are lined up from where they point on the sky and the stars fine-tune it, so even masters with few stars in common line up. The deepest master (the most hours) is the reference everything is lined up to. After lining up, every master is checked: its stars in all four corners are compared with the reference's, and one still more than 1.5 px off is left out (when its filter has other masters) - the note says </w:t>
+        <w:t xml:space="preserve"> When you load more than one master of the same filter (other nights, other cameras or telescopes), all of them are used: they are brought to the same brightness and averaged, the less noisy ones counting more. Every master is first matched star by star to one reference master. Masters from another camera or telescope are bent slightly differently by their optics - most at the edges, which would give coloured double stars in the corners - so SubZeroAstro measures that distortion from hundreds of stars and corrects it. When the masters carry a plate solution (data from remote observatories usually does, and page 3 adds one with ASTAP), it guides the match: the masters are lined up from where they point on the sky and the stars fine-tune it, so even masters with few stars in common line up. The deepest master (the most hours) is the reference everything is lined up to. Masters that page 3 already put on one grid are used as they are, and starless masters (StarXTerminator on page 3) are measured together with their stars-only images, so the stars are always there to line up by. After lining up, every master is checked: its four corners are compared with the reference's, and one still more than 1.5 px off is left out (when its filter has other masters) - the note says </w:t>
       </w:r>
       <w:r>
         <w:rPr>

</xml_diff>

<commit_message>
v0.9.57: Flip or Rotate the Picture - rotate 90° clockwise / counter-clockwise
Two new buttons beside Flip Horizontally / Vertically turn the picture a quarter turn per press
(the preview follows; flips are applied first, then the turn). The saved pictures, stars and every
channel are turned too; the step is named after what was done ('flipped horizontally and turned
90° clockwise').

Co-Authored-By: Claude Opus 5.5 <noreply@anthropic.com>
Claude-Session: https://claude.ai/code/session_01FKvd69QsnCvM2zbzYnPwmF
</commit_message>
<xml_diff>
--- a/docs/SubZeroAstro_User_Manual.docx
+++ b/docs/SubZeroAstro_User_Manual.docx
@@ -121,7 +121,7 @@
           <w:sz w:val="22"/>
           <w:szCs w:val="22"/>
         </w:rPr>
-        <w:t xml:space="preserve">Version 0.9.56 beta  ·  Windows and Mac (Apple silicon)</w:t>
+        <w:t xml:space="preserve">Version 0.9.57 beta  ·  Windows and Mac (Apple silicon)</w:t>
       </w:r>
     </w:p>
     <w:p>
@@ -15135,7 +15135,7 @@
           </w:tcPr>
           <w:p>
             <w:r>
-              <w:t xml:space="preserve">Flip the Picture ◇</w:t>
+              <w:t xml:space="preserve">Flip or Rotate the Picture ◇</w:t>
             </w:r>
           </w:p>
         </w:tc>
@@ -15157,7 +15157,7 @@
           </w:tcPr>
           <w:p>
             <w:r>
-              <w:t xml:space="preserve">Flip Horizontally and/or Flip Vertically (each press toggles) - the saved pictures are flipped too</w:t>
+              <w:t xml:space="preserve">Flip Horizontally and/or Vertically (each press toggles), Rotate 90° Clockwise or Counter-clockwise (each press turns once more) - the saved pictures are turned too</w:t>
             </w:r>
           </w:p>
         </w:tc>
@@ -15930,7 +15930,7 @@
           <w:b/>
           <w:bCs/>
         </w:rPr>
-        <w:t xml:space="preserve">Flip the Picture</w:t>
+        <w:t xml:space="preserve">Flip or Rotate the Picture</w:t>
       </w:r>
       <w:r>
         <w:t xml:space="preserve"> (optional): press </w:t>
@@ -15953,7 +15953,27 @@
         <w:t xml:space="preserve">Flip Vertically</w:t>
       </w:r>
       <w:r>
-        <w:t xml:space="preserve"> (upside down) - each press flips the preview, pressing again flips it back (both together turn it 180°). When it looks right, press </w:t>
+        <w:t xml:space="preserve"> (upside down) - each press flips the preview, pressing again flips it back (both together turn it 180°). </w:t>
+      </w:r>
+      <w:r>
+        <w:rPr>
+          <w:b/>
+          <w:bCs/>
+        </w:rPr>
+        <w:t xml:space="preserve">Rotate 90° Clockwise</w:t>
+      </w:r>
+      <w:r>
+        <w:t xml:space="preserve"> and </w:t>
+      </w:r>
+      <w:r>
+        <w:rPr>
+          <w:b/>
+          <w:bCs/>
+        </w:rPr>
+        <w:t xml:space="preserve">Rotate 90° Counter-clockwise</w:t>
+      </w:r>
+      <w:r>
+        <w:t xml:space="preserve"> turn it a quarter turn per press (a portrait picture becomes landscape). When it looks right, press </w:t>
       </w:r>
       <w:r>
         <w:rPr>
@@ -23038,7 +23058,7 @@
           <w:sz w:val="19"/>
           <w:szCs w:val="19"/>
         </w:rPr>
-        <w:t xml:space="preserve">Flip the Picture</w:t>
+        <w:t xml:space="preserve">Flip or Rotate the Picture</w:t>
       </w:r>
       <w:r>
         <w:rPr>

</xml_diff>

<commit_message>
v0.9.58: Adjust Colours step; Full Window and zoom on Finishing Touches
Adjust Colours (optional, repeatable, after Colour Intensity): versions to pick from (Boost blues,
Boost reds, Blues and reds, Boost magentas, Calm the greens) and one slider per colour range
(reds/yellows/greens/cyans/blues/magentas, 1 = unchanged), Brighten boosted colours and Protect the
sky; grey and white are untouched. Full Window hides the step list, panels and log (Esc returns);
scroll zooms (drawing the full-resolution picture past the preview's pixels), drag pans,
double-click fits - at every step and in the step history.

Co-Authored-By: Claude Opus 5.5 <noreply@anthropic.com>
Claude-Session: https://claude.ai/code/session_01FKvd69QsnCvM2zbzYnPwmF
</commit_message>
<xml_diff>
--- a/docs/SubZeroAstro_User_Manual.docx
+++ b/docs/SubZeroAstro_User_Manual.docx
@@ -121,7 +121,7 @@
           <w:sz w:val="22"/>
           <w:szCs w:val="22"/>
         </w:rPr>
-        <w:t xml:space="preserve">Version 0.9.57 beta  ·  Windows and Mac (Apple silicon)</w:t>
+        <w:t xml:space="preserve">Version 0.9.58 beta  ·  Windows and Mac (Apple silicon)</w:t>
       </w:r>
     </w:p>
     <w:p>
@@ -3000,6 +3000,89 @@
                 <w:szCs w:val="18"/>
               </w:rPr>
               <w:t xml:space="preserve">0.9.48</w:t>
+            </w:r>
+          </w:p>
+        </w:tc>
+      </w:tr>
+      <w:tr>
+        <w:trPr>
+          <w:cantSplit/>
+        </w:trPr>
+        <w:tc>
+          <w:tcPr>
+            <w:tcW w:type="dxa" w:w="2500"/>
+            <w:tcBorders>
+              <w:top w:val="single" w:color="BFBFBF" w:sz="4"/>
+              <w:left w:val="single" w:color="BFBFBF" w:sz="4"/>
+              <w:bottom w:val="single" w:color="BFBFBF" w:sz="4"/>
+              <w:right w:val="single" w:color="BFBFBF" w:sz="4"/>
+            </w:tcBorders>
+            <w:tcMar>
+              <w:top w:type="dxa" w:w="30"/>
+              <w:left w:type="dxa" w:w="90"/>
+              <w:bottom w:type="dxa" w:w="30"/>
+              <w:right w:type="dxa" w:w="90"/>
+            </w:tcMar>
+          </w:tcPr>
+          <w:p>
+            <w:r>
+              <w:rPr>
+                <w:sz w:val="18"/>
+                <w:szCs w:val="18"/>
+              </w:rPr>
+              <w:t xml:space="preserve">Adjust Colours, Full Window, zoom</w:t>
+            </w:r>
+          </w:p>
+        </w:tc>
+        <w:tc>
+          <w:tcPr>
+            <w:tcW w:type="dxa" w:w="5960"/>
+            <w:tcBorders>
+              <w:top w:val="single" w:color="BFBFBF" w:sz="4"/>
+              <w:left w:val="single" w:color="BFBFBF" w:sz="4"/>
+              <w:bottom w:val="single" w:color="BFBFBF" w:sz="4"/>
+              <w:right w:val="single" w:color="BFBFBF" w:sz="4"/>
+            </w:tcBorders>
+            <w:tcMar>
+              <w:top w:type="dxa" w:w="30"/>
+              <w:left w:type="dxa" w:w="90"/>
+              <w:bottom w:type="dxa" w:w="30"/>
+              <w:right w:type="dxa" w:w="90"/>
+            </w:tcMar>
+          </w:tcPr>
+          <w:p>
+            <w:r>
+              <w:rPr>
+                <w:sz w:val="18"/>
+                <w:szCs w:val="18"/>
+              </w:rPr>
+              <w:t xml:space="preserve">Bring out one colour at a time; see the picture full-window and zoom in to full resolution at any step</w:t>
+            </w:r>
+          </w:p>
+        </w:tc>
+        <w:tc>
+          <w:tcPr>
+            <w:tcW w:type="dxa" w:w="900"/>
+            <w:tcBorders>
+              <w:top w:val="single" w:color="BFBFBF" w:sz="4"/>
+              <w:left w:val="single" w:color="BFBFBF" w:sz="4"/>
+              <w:bottom w:val="single" w:color="BFBFBF" w:sz="4"/>
+              <w:right w:val="single" w:color="BFBFBF" w:sz="4"/>
+            </w:tcBorders>
+            <w:tcMar>
+              <w:top w:type="dxa" w:w="30"/>
+              <w:left w:type="dxa" w:w="90"/>
+              <w:bottom w:type="dxa" w:w="30"/>
+              <w:right w:type="dxa" w:w="90"/>
+            </w:tcMar>
+          </w:tcPr>
+          <w:p>
+            <w:r>
+              <w:rPr>
+                <w:sz w:val="18"/>
+                <w:szCs w:val="18"/>
+              </w:rPr>
+              <w:t xml:space="preserve">0.9.58</w:t>
             </w:r>
           </w:p>
         </w:tc>
@@ -13603,6 +13686,116 @@
     </w:p>
     <w:p>
       <w:pPr>
+        <w:spacing w:after="120"/>
+      </w:pPr>
+      <w:r>
+        <w:rPr>
+          <w:b/>
+          <w:bCs/>
+        </w:rPr>
+        <w:t xml:space="preserve">Looking closely.</w:t>
+      </w:r>
+      <w:r>
+        <w:t xml:space="preserve"> Scroll on the picture to zoom in (past the preview's own pixels the full-resolution picture is drawn), drag to move around, double-click to fit it again. </w:t>
+      </w:r>
+      <w:r>
+        <w:rPr>
+          <w:b/>
+          <w:bCs/>
+        </w:rPr>
+        <w:t xml:space="preserve">⛶ Full Window</w:t>
+      </w:r>
+      <w:r>
+        <w:t xml:space="preserve"> (next to </w:t>
+      </w:r>
+      <w:r>
+        <w:rPr>
+          <w:i/>
+          <w:iCs/>
+        </w:rPr>
+        <w:t xml:space="preserve">Show:</w:t>
+      </w:r>
+      <w:r>
+        <w:t xml:space="preserve">) hides the step list, the panels and the log so the picture fills the window - press it again or </w:t>
+      </w:r>
+      <w:r>
+        <w:rPr>
+          <w:b/>
+          <w:bCs/>
+        </w:rPr>
+        <w:t xml:space="preserve">Esc</w:t>
+      </w:r>
+      <w:r>
+        <w:t xml:space="preserve"> to go back. Both work at every step, also while looking back through earlier steps.</w:t>
+      </w:r>
+    </w:p>
+    <w:p>
+      <w:pPr>
+        <w:spacing w:after="120"/>
+      </w:pPr>
+      <w:r>
+        <w:rPr>
+          <w:b/>
+          <w:bCs/>
+        </w:rPr>
+        <w:t xml:space="preserve">Bringing out one colour.</w:t>
+      </w:r>
+      <w:r>
+        <w:t xml:space="preserve"> </w:t>
+      </w:r>
+      <w:r>
+        <w:rPr>
+          <w:i/>
+          <w:iCs/>
+        </w:rPr>
+        <w:t xml:space="preserve">Adjust Colours</w:t>
+      </w:r>
+      <w:r>
+        <w:t xml:space="preserve"> strengthens or calms one colour range at a time: pick a version (Boost blues, Boost reds, Blues and reds, Boost magentas, Calm the greens), then fine-tune with one slider per colour (1 = unchanged), </w:t>
+      </w:r>
+      <w:r>
+        <w:rPr>
+          <w:i/>
+          <w:iCs/>
+        </w:rPr>
+        <w:t xml:space="preserve">Brighten boosted colours</w:t>
+      </w:r>
+      <w:r>
+        <w:t xml:space="preserve"> and </w:t>
+      </w:r>
+      <w:r>
+        <w:rPr>
+          <w:i/>
+          <w:iCs/>
+        </w:rPr>
+        <w:t xml:space="preserve">Protect the sky</w:t>
+      </w:r>
+      <w:r>
+        <w:t xml:space="preserve">. It is best done after </w:t>
+      </w:r>
+      <w:r>
+        <w:rPr>
+          <w:i/>
+          <w:iCs/>
+        </w:rPr>
+        <w:t xml:space="preserve">Colour Intensity</w:t>
+      </w:r>
+      <w:r>
+        <w:t xml:space="preserve"> and before </w:t>
+      </w:r>
+      <w:r>
+        <w:rPr>
+          <w:i/>
+          <w:iCs/>
+        </w:rPr>
+        <w:t xml:space="preserve">Final Noise Reduction</w:t>
+      </w:r>
+      <w:r>
+        <w:t xml:space="preserve"> - boosting a colour also boosts its colour noise, which the noise step then cleans - but it can be opened at any time later too (and run again).</w:t>
+      </w:r>
+    </w:p>
+    <w:p>
+      <w:pPr>
         <w:pStyle w:val="Heading2"/>
       </w:pPr>
       <w:bookmarkStart w:name="s_9_2" w:id="1"/>
@@ -14399,6 +14592,77 @@
           <w:p>
             <w:r>
               <w:t xml:space="preserve">STF / HistogramTransformation / GHS</w:t>
+            </w:r>
+          </w:p>
+        </w:tc>
+      </w:tr>
+      <w:tr>
+        <w:trPr>
+          <w:cantSplit/>
+        </w:trPr>
+        <w:tc>
+          <w:tcPr>
+            <w:tcW w:type="dxa" w:w="2500"/>
+            <w:tcBorders>
+              <w:top w:val="single" w:color="BFBFBF" w:sz="4"/>
+              <w:left w:val="single" w:color="BFBFBF" w:sz="4"/>
+              <w:bottom w:val="single" w:color="BFBFBF" w:sz="4"/>
+              <w:right w:val="single" w:color="BFBFBF" w:sz="4"/>
+            </w:tcBorders>
+            <w:tcMar>
+              <w:top w:type="dxa" w:w="60"/>
+              <w:left w:type="dxa" w:w="100"/>
+              <w:bottom w:type="dxa" w:w="60"/>
+              <w:right w:type="dxa" w:w="100"/>
+            </w:tcMar>
+          </w:tcPr>
+          <w:p>
+            <w:r>
+              <w:t xml:space="preserve">Adjust Colours ◇</w:t>
+            </w:r>
+          </w:p>
+        </w:tc>
+        <w:tc>
+          <w:tcPr>
+            <w:tcW w:type="dxa" w:w="4460"/>
+            <w:tcBorders>
+              <w:top w:val="single" w:color="BFBFBF" w:sz="4"/>
+              <w:left w:val="single" w:color="BFBFBF" w:sz="4"/>
+              <w:bottom w:val="single" w:color="BFBFBF" w:sz="4"/>
+              <w:right w:val="single" w:color="BFBFBF" w:sz="4"/>
+            </w:tcBorders>
+            <w:tcMar>
+              <w:top w:type="dxa" w:w="60"/>
+              <w:left w:type="dxa" w:w="100"/>
+              <w:bottom w:type="dxa" w:w="60"/>
+              <w:right w:type="dxa" w:w="100"/>
+            </w:tcMar>
+          </w:tcPr>
+          <w:p>
+            <w:r>
+              <w:t xml:space="preserve">Bring out (or calm) one colour at a time - reds, yellows, greens, cyans, blues, magentas; grey and white stay as they are</w:t>
+            </w:r>
+          </w:p>
+        </w:tc>
+        <w:tc>
+          <w:tcPr>
+            <w:tcW w:type="dxa" w:w="2400"/>
+            <w:tcBorders>
+              <w:top w:val="single" w:color="BFBFBF" w:sz="4"/>
+              <w:left w:val="single" w:color="BFBFBF" w:sz="4"/>
+              <w:bottom w:val="single" w:color="BFBFBF" w:sz="4"/>
+              <w:right w:val="single" w:color="BFBFBF" w:sz="4"/>
+            </w:tcBorders>
+            <w:tcMar>
+              <w:top w:type="dxa" w:w="60"/>
+              <w:left w:type="dxa" w:w="100"/>
+              <w:bottom w:type="dxa" w:w="60"/>
+              <w:right w:type="dxa" w:w="100"/>
+            </w:tcMar>
+          </w:tcPr>
+          <w:p>
+            <w:r>
+              <w:t xml:space="preserve">ColorSaturation</w:t>
             </w:r>
           </w:p>
         </w:tc>
@@ -20570,7 +20834,7 @@
           <w:sz w:val="19"/>
           <w:szCs w:val="19"/>
         </w:rPr>
-        <w:t xml:space="preserve">Aggressive</w:t>
+        <w:t xml:space="preserve">Adjust Colours</w:t>
       </w:r>
       <w:r>
         <w:rPr>
@@ -20579,14 +20843,14 @@
         </w:rPr>
         <w:tab/>
       </w:r>
-      <w:hyperlink w:history="1" w:anchor="s_6_3">
+      <w:hyperlink w:history="1" w:anchor="s_9_3">
         <w:r>
           <w:rPr>
             <w:rStyle w:val="Hyperlink"/>
             <w:sz w:val="19"/>
             <w:szCs w:val="19"/>
           </w:rPr>
-          <w:t xml:space="preserve">6.3</w:t>
+          <w:t xml:space="preserve">9.3</w:t>
         </w:r>
       </w:hyperlink>
     </w:p>
@@ -20602,7 +20866,7 @@
           <w:sz w:val="19"/>
           <w:szCs w:val="19"/>
         </w:rPr>
-        <w:t xml:space="preserve">Alt-az</w:t>
+        <w:t xml:space="preserve">Aggressive</w:t>
       </w:r>
       <w:r>
         <w:rPr>
@@ -20611,14 +20875,14 @@
         </w:rPr>
         <w:tab/>
       </w:r>
-      <w:hyperlink w:history="1" w:anchor="s_10_5">
+      <w:hyperlink w:history="1" w:anchor="s_6_3">
         <w:r>
           <w:rPr>
             <w:rStyle w:val="Hyperlink"/>
             <w:sz w:val="19"/>
             <w:szCs w:val="19"/>
           </w:rPr>
-          <w:t xml:space="preserve">10.5</w:t>
+          <w:t xml:space="preserve">6.3</w:t>
         </w:r>
       </w:hyperlink>
     </w:p>
@@ -20634,7 +20898,7 @@
           <w:sz w:val="19"/>
           <w:szCs w:val="19"/>
         </w:rPr>
-        <w:t xml:space="preserve">Apply</w:t>
+        <w:t xml:space="preserve">Alt-az</w:t>
       </w:r>
       <w:r>
         <w:rPr>
@@ -20643,14 +20907,14 @@
         </w:rPr>
         <w:tab/>
       </w:r>
-      <w:hyperlink w:history="1" w:anchor="s_9_1">
+      <w:hyperlink w:history="1" w:anchor="s_10_5">
         <w:r>
           <w:rPr>
             <w:rStyle w:val="Hyperlink"/>
             <w:sz w:val="19"/>
             <w:szCs w:val="19"/>
           </w:rPr>
-          <w:t xml:space="preserve">9.1</w:t>
+          <w:t xml:space="preserve">10.5</w:t>
         </w:r>
       </w:hyperlink>
     </w:p>
@@ -20666,7 +20930,7 @@
           <w:sz w:val="19"/>
           <w:szCs w:val="19"/>
         </w:rPr>
-        <w:t xml:space="preserve">Askar D1</w:t>
+        <w:t xml:space="preserve">Apply</w:t>
       </w:r>
       <w:r>
         <w:rPr>
@@ -20675,14 +20939,14 @@
         </w:rPr>
         <w:tab/>
       </w:r>
-      <w:hyperlink w:history="1" w:anchor="s_10_2">
+      <w:hyperlink w:history="1" w:anchor="s_9_1">
         <w:r>
           <w:rPr>
             <w:rStyle w:val="Hyperlink"/>
             <w:sz w:val="19"/>
             <w:szCs w:val="19"/>
           </w:rPr>
-          <w:t xml:space="preserve">10.2</w:t>
+          <w:t xml:space="preserve">9.1</w:t>
         </w:r>
       </w:hyperlink>
     </w:p>
@@ -20698,7 +20962,7 @@
           <w:sz w:val="19"/>
           <w:szCs w:val="19"/>
         </w:rPr>
-        <w:t xml:space="preserve">Askar D2</w:t>
+        <w:t xml:space="preserve">Askar D1</w:t>
       </w:r>
       <w:r>
         <w:rPr>
@@ -20730,7 +20994,7 @@
           <w:sz w:val="19"/>
           <w:szCs w:val="19"/>
         </w:rPr>
-        <w:t xml:space="preserve">ASTAP</w:t>
+        <w:t xml:space="preserve">Askar D2</w:t>
       </w:r>
       <w:r>
         <w:rPr>
@@ -20739,59 +21003,59 @@
         </w:rPr>
         <w:tab/>
       </w:r>
-      <w:hyperlink w:history="1" w:anchor="s_2_2">
+      <w:hyperlink w:history="1" w:anchor="s_10_2">
         <w:r>
           <w:rPr>
             <w:rStyle w:val="Hyperlink"/>
             <w:sz w:val="19"/>
             <w:szCs w:val="19"/>
           </w:rPr>
-          <w:t xml:space="preserve">2.2</w:t>
-        </w:r>
-      </w:hyperlink>
-      <w:r>
-        <w:t xml:space="preserve">, </w:t>
-      </w:r>
-      <w:hyperlink w:history="1" w:anchor="s_4_1">
+          <w:t xml:space="preserve">10.2</w:t>
+        </w:r>
+      </w:hyperlink>
+    </w:p>
+    <w:p>
+      <w:pPr>
+        <w:tabs>
+          <w:tab w:val="right" w:pos="4200" w:leader="dot"/>
+        </w:tabs>
+        <w:spacing w:after="10"/>
+      </w:pPr>
+      <w:r>
+        <w:rPr>
+          <w:sz w:val="19"/>
+          <w:szCs w:val="19"/>
+        </w:rPr>
+        <w:t xml:space="preserve">ASTAP</w:t>
+      </w:r>
+      <w:r>
+        <w:rPr>
+          <w:sz w:val="19"/>
+          <w:szCs w:val="19"/>
+        </w:rPr>
+        <w:tab/>
+      </w:r>
+      <w:hyperlink w:history="1" w:anchor="s_2_2">
         <w:r>
           <w:rPr>
             <w:rStyle w:val="Hyperlink"/>
             <w:sz w:val="19"/>
             <w:szCs w:val="19"/>
           </w:rPr>
-          <w:t xml:space="preserve">4.1</w:t>
-        </w:r>
-      </w:hyperlink>
-    </w:p>
-    <w:p>
-      <w:pPr>
-        <w:tabs>
-          <w:tab w:val="right" w:pos="4200" w:leader="dot"/>
-        </w:tabs>
-        <w:spacing w:after="10"/>
-      </w:pPr>
-      <w:r>
-        <w:rPr>
-          <w:sz w:val="19"/>
-          <w:szCs w:val="19"/>
-        </w:rPr>
-        <w:t xml:space="preserve">AstroBin</w:t>
-      </w:r>
-      <w:r>
-        <w:rPr>
-          <w:sz w:val="19"/>
-          <w:szCs w:val="19"/>
-        </w:rPr>
-        <w:tab/>
-      </w:r>
-      <w:hyperlink w:history="1" w:anchor="s_9_7">
+          <w:t xml:space="preserve">2.2</w:t>
+        </w:r>
+      </w:hyperlink>
+      <w:r>
+        <w:t xml:space="preserve">, </w:t>
+      </w:r>
+      <w:hyperlink w:history="1" w:anchor="s_4_1">
         <w:r>
           <w:rPr>
             <w:rStyle w:val="Hyperlink"/>
             <w:sz w:val="19"/>
             <w:szCs w:val="19"/>
           </w:rPr>
-          <w:t xml:space="preserve">9.7</w:t>
+          <w:t xml:space="preserve">4.1</w:t>
         </w:r>
       </w:hyperlink>
     </w:p>
@@ -20807,7 +21071,7 @@
           <w:sz w:val="19"/>
           <w:szCs w:val="19"/>
         </w:rPr>
-        <w:t xml:space="preserve">Auto-crop</w:t>
+        <w:t xml:space="preserve">AstroBin</w:t>
       </w:r>
       <w:r>
         <w:rPr>
@@ -20816,14 +21080,14 @@
         </w:rPr>
         <w:tab/>
       </w:r>
-      <w:hyperlink w:history="1" w:anchor="s_8_2">
+      <w:hyperlink w:history="1" w:anchor="s_9_7">
         <w:r>
           <w:rPr>
             <w:rStyle w:val="Hyperlink"/>
             <w:sz w:val="19"/>
             <w:szCs w:val="19"/>
           </w:rPr>
-          <w:t xml:space="preserve">8.2</w:t>
+          <w:t xml:space="preserve">9.7</w:t>
         </w:r>
       </w:hyperlink>
     </w:p>
@@ -20839,7 +21103,7 @@
           <w:sz w:val="19"/>
           <w:szCs w:val="19"/>
         </w:rPr>
-        <w:t xml:space="preserve">Auto-cull</w:t>
+        <w:t xml:space="preserve">Auto-crop</w:t>
       </w:r>
       <w:r>
         <w:rPr>
@@ -20848,14 +21112,14 @@
         </w:rPr>
         <w:tab/>
       </w:r>
-      <w:hyperlink w:history="1" w:anchor="s_6_3">
+      <w:hyperlink w:history="1" w:anchor="s_8_2">
         <w:r>
           <w:rPr>
             <w:rStyle w:val="Hyperlink"/>
             <w:sz w:val="19"/>
             <w:szCs w:val="19"/>
           </w:rPr>
-          <w:t xml:space="preserve">6.3</w:t>
+          <w:t xml:space="preserve">8.2</w:t>
         </w:r>
       </w:hyperlink>
     </w:p>
@@ -20871,7 +21135,7 @@
           <w:sz w:val="19"/>
           <w:szCs w:val="19"/>
         </w:rPr>
-        <w:t xml:space="preserve">Auto-Flag</w:t>
+        <w:t xml:space="preserve">Auto-cull</w:t>
       </w:r>
       <w:r>
         <w:rPr>
@@ -20893,6 +21157,38 @@
     </w:p>
     <w:p>
       <w:pPr>
+        <w:tabs>
+          <w:tab w:val="right" w:pos="4200" w:leader="dot"/>
+        </w:tabs>
+        <w:spacing w:after="10"/>
+      </w:pPr>
+      <w:r>
+        <w:rPr>
+          <w:sz w:val="19"/>
+          <w:szCs w:val="19"/>
+        </w:rPr>
+        <w:t xml:space="preserve">Auto-Flag</w:t>
+      </w:r>
+      <w:r>
+        <w:rPr>
+          <w:sz w:val="19"/>
+          <w:szCs w:val="19"/>
+        </w:rPr>
+        <w:tab/>
+      </w:r>
+      <w:hyperlink w:history="1" w:anchor="s_6_3">
+        <w:r>
+          <w:rPr>
+            <w:rStyle w:val="Hyperlink"/>
+            <w:sz w:val="19"/>
+            <w:szCs w:val="19"/>
+          </w:rPr>
+          <w:t xml:space="preserve">6.3</w:t>
+        </w:r>
+      </w:hyperlink>
+    </w:p>
+    <w:p>
+      <w:pPr>
         <w:keepNext/>
         <w:spacing w:after="40" w:before="160"/>
       </w:pPr>
@@ -23154,7 +23450,7 @@
           <w:sz w:val="19"/>
           <w:szCs w:val="19"/>
         </w:rPr>
-        <w:t xml:space="preserve">FWHM</w:t>
+        <w:t xml:space="preserve">Full Window</w:t>
       </w:r>
       <w:r>
         <w:rPr>
@@ -23163,26 +23459,58 @@
         </w:rPr>
         <w:tab/>
       </w:r>
-      <w:hyperlink w:history="1" w:anchor="s_1_3">
+      <w:hyperlink w:history="1" w:anchor="s_9_1">
         <w:r>
           <w:rPr>
             <w:rStyle w:val="Hyperlink"/>
             <w:sz w:val="19"/>
             <w:szCs w:val="19"/>
           </w:rPr>
-          <w:t xml:space="preserve">1.3</w:t>
-        </w:r>
-      </w:hyperlink>
-      <w:r>
-        <w:t xml:space="preserve">, </w:t>
-      </w:r>
-      <w:hyperlink w:history="1" w:anchor="s_6_2">
+          <w:t xml:space="preserve">9.1</w:t>
+        </w:r>
+      </w:hyperlink>
+    </w:p>
+    <w:p>
+      <w:pPr>
+        <w:tabs>
+          <w:tab w:val="right" w:pos="4200" w:leader="dot"/>
+        </w:tabs>
+        <w:spacing w:after="10"/>
+      </w:pPr>
+      <w:r>
+        <w:rPr>
+          <w:sz w:val="19"/>
+          <w:szCs w:val="19"/>
+        </w:rPr>
+        <w:t xml:space="preserve">FWHM</w:t>
+      </w:r>
+      <w:r>
+        <w:rPr>
+          <w:sz w:val="19"/>
+          <w:szCs w:val="19"/>
+        </w:rPr>
+        <w:tab/>
+      </w:r>
+      <w:hyperlink w:history="1" w:anchor="s_1_3">
         <w:r>
           <w:rPr>
             <w:rStyle w:val="Hyperlink"/>
             <w:sz w:val="19"/>
             <w:szCs w:val="19"/>
           </w:rPr>
+          <w:t xml:space="preserve">1.3</w:t>
+        </w:r>
+      </w:hyperlink>
+      <w:r>
+        <w:t xml:space="preserve">, </w:t>
+      </w:r>
+      <w:hyperlink w:history="1" w:anchor="s_6_2">
+        <w:r>
+          <w:rPr>
+            <w:rStyle w:val="Hyperlink"/>
+            <w:sz w:val="19"/>
+            <w:szCs w:val="19"/>
+          </w:rPr>
           <w:t xml:space="preserve">6.2</w:t>
         </w:r>
       </w:hyperlink>
@@ -28447,6 +28775,38 @@
             <w:szCs w:val="19"/>
           </w:rPr>
           <w:t xml:space="preserve">11.2</w:t>
+        </w:r>
+      </w:hyperlink>
+    </w:p>
+    <w:p>
+      <w:pPr>
+        <w:tabs>
+          <w:tab w:val="right" w:pos="4200" w:leader="dot"/>
+        </w:tabs>
+        <w:spacing w:after="10"/>
+      </w:pPr>
+      <w:r>
+        <w:rPr>
+          <w:sz w:val="19"/>
+          <w:szCs w:val="19"/>
+        </w:rPr>
+        <w:t xml:space="preserve">Zoom</w:t>
+      </w:r>
+      <w:r>
+        <w:rPr>
+          <w:sz w:val="19"/>
+          <w:szCs w:val="19"/>
+        </w:rPr>
+        <w:tab/>
+      </w:r>
+      <w:hyperlink w:history="1" w:anchor="s_9_1">
+        <w:r>
+          <w:rPr>
+            <w:rStyle w:val="Hyperlink"/>
+            <w:sz w:val="19"/>
+            <w:szCs w:val="19"/>
+          </w:rPr>
+          <w:t xml:space="preserve">9.1</w:t>
         </w:r>
       </w:hyperlink>
     </w:p>

</xml_diff>

<commit_message>
v0.9.59 beta: optional 'Processed with SubZeroAstro' credit on finished pictures
Small light-grey line in the bottom-left corner of TIFF/JPG/PNG (bottom-right when
the signature is bottom-left); never on XISF/FITS. Tick box in Save the Picture,
on by default and remembered; AstroBin sharing follows it. Self-test and manual.

Co-Authored-By: Claude Opus 5.5 <noreply@anthropic.com>
Claude-Session: https://claude.ai/code/session_01FKvd69QsnCvM2zbzYnPwmF
</commit_message>
<xml_diff>
--- a/docs/SubZeroAstro_User_Manual.docx
+++ b/docs/SubZeroAstro_User_Manual.docx
@@ -121,7 +121,7 @@
           <w:sz w:val="22"/>
           <w:szCs w:val="22"/>
         </w:rPr>
-        <w:t xml:space="preserve">Version 0.9.58 beta  ·  Windows and Mac (Apple silicon)</w:t>
+        <w:t xml:space="preserve">Version 0.9.59 beta  ·  Windows and Mac (Apple silicon)</w:t>
       </w:r>
     </w:p>
     <w:p>
@@ -3083,6 +3083,89 @@
                 <w:szCs w:val="18"/>
               </w:rPr>
               <w:t xml:space="preserve">0.9.58</w:t>
+            </w:r>
+          </w:p>
+        </w:tc>
+      </w:tr>
+      <w:tr>
+        <w:trPr>
+          <w:cantSplit/>
+        </w:trPr>
+        <w:tc>
+          <w:tcPr>
+            <w:tcW w:type="dxa" w:w="2500"/>
+            <w:tcBorders>
+              <w:top w:val="single" w:color="BFBFBF" w:sz="4"/>
+              <w:left w:val="single" w:color="BFBFBF" w:sz="4"/>
+              <w:bottom w:val="single" w:color="BFBFBF" w:sz="4"/>
+              <w:right w:val="single" w:color="BFBFBF" w:sz="4"/>
+            </w:tcBorders>
+            <w:tcMar>
+              <w:top w:type="dxa" w:w="30"/>
+              <w:left w:type="dxa" w:w="90"/>
+              <w:bottom w:type="dxa" w:w="30"/>
+              <w:right w:type="dxa" w:w="90"/>
+            </w:tcMar>
+          </w:tcPr>
+          <w:p>
+            <w:r>
+              <w:rPr>
+                <w:sz w:val="18"/>
+                <w:szCs w:val="18"/>
+              </w:rPr>
+              <w:t xml:space="preserve">“Processed with SubZeroAstro” credit</w:t>
+            </w:r>
+          </w:p>
+        </w:tc>
+        <w:tc>
+          <w:tcPr>
+            <w:tcW w:type="dxa" w:w="5960"/>
+            <w:tcBorders>
+              <w:top w:val="single" w:color="BFBFBF" w:sz="4"/>
+              <w:left w:val="single" w:color="BFBFBF" w:sz="4"/>
+              <w:bottom w:val="single" w:color="BFBFBF" w:sz="4"/>
+              <w:right w:val="single" w:color="BFBFBF" w:sz="4"/>
+            </w:tcBorders>
+            <w:tcMar>
+              <w:top w:type="dxa" w:w="30"/>
+              <w:left w:type="dxa" w:w="90"/>
+              <w:bottom w:type="dxa" w:w="30"/>
+              <w:right w:type="dxa" w:w="90"/>
+            </w:tcMar>
+          </w:tcPr>
+          <w:p>
+            <w:r>
+              <w:rPr>
+                <w:sz w:val="18"/>
+                <w:szCs w:val="18"/>
+              </w:rPr>
+              <w:t xml:space="preserve">A small, optional credit line in the corner of finished pictures - moves aside for your signature; never on XISF / FITS data</w:t>
+            </w:r>
+          </w:p>
+        </w:tc>
+        <w:tc>
+          <w:tcPr>
+            <w:tcW w:type="dxa" w:w="900"/>
+            <w:tcBorders>
+              <w:top w:val="single" w:color="BFBFBF" w:sz="4"/>
+              <w:left w:val="single" w:color="BFBFBF" w:sz="4"/>
+              <w:bottom w:val="single" w:color="BFBFBF" w:sz="4"/>
+              <w:right w:val="single" w:color="BFBFBF" w:sz="4"/>
+            </w:tcBorders>
+            <w:tcMar>
+              <w:top w:type="dxa" w:w="30"/>
+              <w:left w:type="dxa" w:w="90"/>
+              <w:bottom w:type="dxa" w:w="30"/>
+              <w:right w:type="dxa" w:w="90"/>
+            </w:tcMar>
+          </w:tcPr>
+          <w:p>
+            <w:r>
+              <w:rPr>
+                <w:sz w:val="18"/>
+                <w:szCs w:val="18"/>
+              </w:rPr>
+              <w:t xml:space="preserve">0.9.59</w:t>
             </w:r>
           </w:p>
         </w:tc>
@@ -16490,7 +16573,17 @@
         <w:t xml:space="preserve">facts from SIMBAD</w:t>
       </w:r>
       <w:r>
-        <w:t xml:space="preserve"> (the professional astronomy database at CDS, Strasbourg) - the kind of object, its position (RA / Dec) and brightness. Faint objects without a Wikipedia article still get the SIMBAD facts. It is shown first so you can edit it (or type your own when there is no internet), and both sources are credited.</w:t>
+        <w:t xml:space="preserve"> (the professional astronomy database at CDS, Strasbourg) - the kind of object, its position (RA / Dec) and brightness. Faint objects without a Wikipedia article still get the SIMBAD facts. It is shown first so you can edit it (or type your own when there is no internet), and both sources are credited. </w:t>
+      </w:r>
+      <w:r>
+        <w:rPr>
+          <w:b/>
+          <w:bCs/>
+        </w:rPr>
+        <w:t xml:space="preserve">Add a small “Processed with SubZeroAstro” credit</w:t>
+      </w:r>
+      <w:r>
+        <w:t xml:space="preserve"> (ticked at first) puts that line in small, light-grey, see-through letters in the bottom-left corner of the TIFF, JPG and PNG pictures - or the bottom-right corner if your signature is bottom-left. XISF and FITS files are never marked, and untick the box to leave the pictures clean (the choice is remembered; pictures shared to AstroBin follow it too).</w:t>
       </w:r>
     </w:p>
     <w:p>

</xml_diff>

<commit_message>
v0.9.60 beta: Spot Fix circles visible and as large as Mote Buster's
Circles start at a size you can see on a shrunk-to-fit picture, are drawn 2 px thick
(never smaller than 3 px on screen), and grow up to 700 px. Big patches are filled
coarse-to-fine so the sky's slope carries across, with grain measured from
neighbour differences. Self-tests and manual.

Co-Authored-By: Claude Opus 5.5 <noreply@anthropic.com>
Claude-Session: https://claude.ai/code/session_01FKvd69QsnCvM2zbzYnPwmF
</commit_message>
<xml_diff>
--- a/docs/SubZeroAstro_User_Manual.docx
+++ b/docs/SubZeroAstro_User_Manual.docx
@@ -121,7 +121,7 @@
           <w:sz w:val="22"/>
           <w:szCs w:val="22"/>
         </w:rPr>
-        <w:t xml:space="preserve">Version 0.9.59 beta  ·  Windows and Mac (Apple silicon)</w:t>
+        <w:t xml:space="preserve">Version 0.9.60 beta  ·  Windows and Mac (Apple silicon)</w:t>
       </w:r>
     </w:p>
     <w:p>
@@ -16250,7 +16250,7 @@
         <w:t xml:space="preserve">turn the mouse wheel to make that circle bigger or smaller</w:t>
       </w:r>
       <w:r>
-        <w:t xml:space="preserve"> until it just covers the blemish. Click a circle to pick it again (it turns blue) and drag to move it; right-click removes it. A dashed ring follows the mouse to show the size of the next circle. Then </w:t>
+        <w:t xml:space="preserve"> until it just covers the blemish. Click a circle to pick it again (it turns blue) and drag to move it; right-click removes it. A dashed ring follows the mouse to show the size of the next circle. Circles go from a hot pixel to a large satellite blob or halo (up to 700 pixels across in radius, like Mote Buster's), and the patch blends in smoothly with the sky's own slope and grain even when it is big. Then </w:t>
       </w:r>
       <w:r>
         <w:rPr>

</xml_diff>

<commit_message>
v0.9.61 beta: flipping a signed picture keeps the signature readable
Flip or Rotate after Sign Your Picture now turns the picture as it was before signing
(redoing crop / Spot Fix / colour steps done after signing), then puts the same
signature back on top. Other later steps: asks to go back and sign again.
Self-test and manual.

Co-Authored-By: Claude Opus 5.5 <noreply@anthropic.com>
Claude-Session: https://claude.ai/code/session_01FKvd69QsnCvM2zbzYnPwmF
</commit_message>
<xml_diff>
--- a/docs/SubZeroAstro_User_Manual.docx
+++ b/docs/SubZeroAstro_User_Manual.docx
@@ -121,7 +121,7 @@
           <w:sz w:val="22"/>
           <w:szCs w:val="22"/>
         </w:rPr>
-        <w:t xml:space="preserve">Version 0.9.60 beta  ·  Windows and Mac (Apple silicon)</w:t>
+        <w:t xml:space="preserve">Version 0.9.61 beta  ·  Windows and Mac (Apple silicon)</w:t>
       </w:r>
     </w:p>
     <w:p>
@@ -16250,7 +16250,7 @@
         <w:t xml:space="preserve">turn the mouse wheel to make that circle bigger or smaller</w:t>
       </w:r>
       <w:r>
-        <w:t xml:space="preserve"> until it just covers the blemish. Click a circle to pick it again (it turns blue) and drag to move it; right-click removes it. A dashed ring follows the mouse to show the size of the next circle. Circles go from a hot pixel to a large satellite blob or halo (up to 700 pixels across in radius, like Mote Buster's), and the patch blends in smoothly with the sky's own slope and grain even when it is big. Then </w:t>
+        <w:t xml:space="preserve"> until it just covers the blemish. Click a circle to pick it again (it turns blue) and drag to move it; right-click removes it. A dashed ring follows the mouse to show the size of the next circle. Circles go from a hot pixel to a large satellite blob or halo (up to 700 pixels in radius, like Mote Buster's), and the patch blends in smoothly with the sky's own slope and grain even when it is big. Then </w:t>
       </w:r>
       <w:r>
         <w:rPr>
@@ -16330,7 +16330,7 @@
         <w:t xml:space="preserve">Keep This Orientation</w:t>
       </w:r>
       <w:r>
-        <w:t xml:space="preserve">. Useful to match how the object usually looks in charts and other pictures. Flip before signing, so the signature reads the right way.</w:t>
+        <w:t xml:space="preserve">. Useful to match how the object usually looks in charts and other pictures. If the picture is already signed, the preview turns the signature too, but when you keep it the signature is put back on top the right way round, in the same place (steps done after signing - crop, Spot Fix, colour - are done again underneath it).</w:t>
       </w:r>
     </w:p>
     <w:p>

</xml_diff>

<commit_message>
v0.9.62 beta: Spot Fix keeps the stars inside its circles
Stars in the circle are lifted off (top-hat), the sky under them is patched, and they
are put back brightened by as much as the blemish dimmed them. Whatever sits at the
middle of the circle (the clicked hot pixel, satellite remnant or star) is still
removed. Self-test and manual.

Co-Authored-By: Claude Opus 5.5 <noreply@anthropic.com>
Claude-Session: https://claude.ai/code/session_01FKvd69QsnCvM2zbzYnPwmF
</commit_message>
<xml_diff>
--- a/docs/SubZeroAstro_User_Manual.docx
+++ b/docs/SubZeroAstro_User_Manual.docx
@@ -121,7 +121,7 @@
           <w:sz w:val="22"/>
           <w:szCs w:val="22"/>
         </w:rPr>
-        <w:t xml:space="preserve">Version 0.9.61 beta  ·  Windows and Mac (Apple silicon)</w:t>
+        <w:t xml:space="preserve">Version 0.9.62 beta  ·  Windows and Mac (Apple silicon)</w:t>
       </w:r>
     </w:p>
     <w:p>
@@ -16250,7 +16250,17 @@
         <w:t xml:space="preserve">turn the mouse wheel to make that circle bigger or smaller</w:t>
       </w:r>
       <w:r>
-        <w:t xml:space="preserve"> until it just covers the blemish. Click a circle to pick it again (it turns blue) and drag to move it; right-click removes it. A dashed ring follows the mouse to show the size of the next circle. Circles go from a hot pixel to a large satellite blob or halo (up to 700 pixels in radius, like Mote Buster's), and the patch blends in smoothly with the sky's own slope and grain even when it is big. Then </w:t>
+        <w:t xml:space="preserve"> until it just covers the blemish. Click a circle to pick it again (it turns blue) and drag to move it; right-click removes it. A dashed ring follows the mouse to show the size of the next circle. Circles go from a hot pixel to a large satellite blob or halo (up to 700 pixels in radius, like Mote Buster's), and the patch blends in smoothly with the sky's own slope and grain even when it is big. </w:t>
+      </w:r>
+      <w:r>
+        <w:rPr>
+          <w:b/>
+          <w:bCs/>
+        </w:rPr>
+        <w:t xml:space="preserve">Stars inside the circle are kept</w:t>
+      </w:r>
+      <w:r>
+        <w:t xml:space="preserve">: they are lifted off, the sky under them is patched, and they are put back on top - as bright as they really are, since a dust donut dims its stars too. Only the thing at the middle of the circle (what you clicked on - a hot pixel, a satellite remnant, an unwanted star) is removed. Then </w:t>
       </w:r>
       <w:r>
         <w:rPr>

</xml_diff>

<commit_message>
v0.9.63 beta: colour-camera masters are combined, not just the first one used
Page 4 used only the first colour master it found. Now all masters of the filter are
lined up around the deepest and noise-weighted (like mono masters), and unfiltered
masters are set aside when there is dual-band data. The log says what was used.
Coverage crop ignores single clipped noise pixels. Self-test and manual.

Co-Authored-By: Claude Opus 5.5 <noreply@anthropic.com>
Claude-Session: https://claude.ai/code/session_01FKvd69QsnCvM2zbzYnPwmF
</commit_message>
<xml_diff>
--- a/docs/SubZeroAstro_User_Manual.docx
+++ b/docs/SubZeroAstro_User_Manual.docx
@@ -121,7 +121,7 @@
           <w:sz w:val="22"/>
           <w:szCs w:val="22"/>
         </w:rPr>
-        <w:t xml:space="preserve">Version 0.9.62 beta  ·  Windows and Mac (Apple silicon)</w:t>
+        <w:t xml:space="preserve">Version 0.9.63 beta  ·  Windows and Mac (Apple silicon)</w:t>
       </w:r>
     </w:p>
     <w:p>
@@ -13754,7 +13754,27 @@
         <w:t xml:space="preserve">Several masters per filter, or masters from different setups.</w:t>
       </w:r>
       <w:r>
-        <w:t xml:space="preserve"> When you load more than one master of the same filter (other nights, other cameras or telescopes), all of them are used: they are brought to the same brightness and averaged, the less noisy ones counting more. Every master is first matched star by star to one reference master. Masters from another camera or telescope are bent slightly differently by their optics - most at the edges, which would give coloured double stars in the corners - so SubZeroAstro measures that distortion from hundreds of stars and corrects it. When the masters carry a plate solution (data from remote observatories usually does, and page 3 adds one with ASTAP), it guides the match: the masters are lined up from where they point on the sky and the stars fine-tune it, so even masters with few stars in common line up. The deepest master (the most hours) is the reference everything is lined up to. Masters that page 3 already put on one grid are used as they are, and starless masters (StarXTerminator on page 3) are measured together with their stars-only images, so the stars are always there to line up by. After lining up, every master is checked: its four corners are compared with the reference's, and one still more than 1.5 px off is left out (when its filter has other masters) - the note says </w:t>
+        <w:t xml:space="preserve"> When you load more than one master of the same filter (other nights, other cameras or telescopes), all of them are used: they are brought to the same brightness and averaged, the less noisy ones counting more. This works the same for colour cameras (each colour separately). With a colour camera and a </w:t>
+      </w:r>
+      <w:r>
+        <w:rPr>
+          <w:b/>
+          <w:bCs/>
+        </w:rPr>
+        <w:t xml:space="preserve">dual-band filter</w:t>
+      </w:r>
+      <w:r>
+        <w:t xml:space="preserve"> (L-Ultimate, L-eXtreme …), masters taken </w:t>
+      </w:r>
+      <w:r>
+        <w:rPr>
+          <w:b/>
+          <w:bCs/>
+        </w:rPr>
+        <w:t xml:space="preserve">without</w:t>
+      </w:r>
+      <w:r>
+        <w:t xml:space="preserve"> the filter are left out of the picture - broadband starlight would bloat the stars and wash out the Ha / OIII colours - and the log says so. Every master is first matched star by star to one reference master. Masters from another camera or telescope are bent slightly differently by their optics - most at the edges, which would give coloured double stars in the corners - so SubZeroAstro measures that distortion from hundreds of stars and corrects it. When the masters carry a plate solution (data from remote observatories usually does, and page 3 adds one with ASTAP), it guides the match: the masters are lined up from where they point on the sky and the stars fine-tune it, so even masters with few stars in common line up. The deepest master (the most hours) is the reference everything is lined up to. Masters that page 3 already put on one grid are used as they are, and starless masters (StarXTerminator on page 3) are measured together with their stars-only images, so the stars are always there to line up by. After lining up, every master is checked: its four corners are compared with the reference's, and one still more than 1.5 px off is left out (when its filter has other masters) - the note says </w:t>
       </w:r>
       <w:r>
         <w:rPr>

</xml_diff>

<commit_message>
v0.9.64 beta: Tame Bright Core works on strongly brightened cores
The core was re-mapped only between its edge brightness and 93% white, so after Curves
and Saturation there was no room and the tool barely changed anything. Now, like
HDRMultiscaleTransform, the core's glow is lowered towards its surroundings (adaptively,
so the peak lands well below white) and its structure is kept on top; white pixels are
re-made from the linear data at their true scale, with a soft shoulder instead of a
hard clip. Self-test and manual.

Co-Authored-By: Claude Opus 5.5 <noreply@anthropic.com>
Claude-Session: https://claude.ai/code/session_01FKvd69QsnCvM2zbzYnPwmF
</commit_message>
<xml_diff>
--- a/docs/SubZeroAstro_User_Manual.docx
+++ b/docs/SubZeroAstro_User_Manual.docx
@@ -121,7 +121,7 @@
           <w:sz w:val="22"/>
           <w:szCs w:val="22"/>
         </w:rPr>
-        <w:t xml:space="preserve">Version 0.9.63 beta  ·  Windows and Mac (Apple silicon)</w:t>
+        <w:t xml:space="preserve">Version 0.9.64 beta  ·  Windows and Mac (Apple silicon)</w:t>
       </w:r>
     </w:p>
     <w:p>
@@ -14814,7 +14814,7 @@
           </w:tcPr>
           <w:p>
             <w:r>
-              <w:t xml:space="preserve">Recovers detail in a burnt-out galaxy core or bright nebula</w:t>
+              <w:t xml:space="preserve">Recovers detail in a burnt-out galaxy core or bright nebula: lowers the core's glow towards its surroundings and brings its structure back from the linear data (works best right after Brighten the Image)</w:t>
             </w:r>
           </w:p>
         </w:tc>

</xml_diff>

<commit_message>
v0.9.65 beta: clear Apply / Applied state, stars-only star steps, full view after steps
* Apply is green; after a step the panel says it was applied, Apply goes away and an
  amber '✓ Applied – Next Step' opens the next recommended step (repeatable steps
  also offer 'Apply Again').
* Brighten Stars Separately, Shrink Stars and Star Colours show the stars on their own;
  a tick box shows them over the nebula.
* After every step the whole picture is shown again, not the last close-up preview.

Co-Authored-By: Claude Opus 5.5 <noreply@anthropic.com>
Claude-Session: https://claude.ai/code/session_01FKvd69QsnCvM2zbzYnPwmF
</commit_message>
<xml_diff>
--- a/docs/SubZeroAstro_User_Manual.docx
+++ b/docs/SubZeroAstro_User_Manual.docx
@@ -121,7 +121,7 @@
           <w:sz w:val="22"/>
           <w:szCs w:val="22"/>
         </w:rPr>
-        <w:t xml:space="preserve">Version 0.9.64 beta  ·  Windows and Mac (Apple silicon)</w:t>
+        <w:t xml:space="preserve">Version 0.9.65 beta  ·  Windows and Mac (Apple silicon)</w:t>
       </w:r>
     </w:p>
     <w:p>
@@ -13623,7 +13623,7 @@
         <w:spacing w:after="60"/>
       </w:pPr>
       <w:r>
-        <w:t xml:space="preserve">Press </w:t>
+        <w:t xml:space="preserve">Press the green </w:t>
       </w:r>
       <w:r>
         <w:rPr>
@@ -13643,7 +13643,37 @@
         <w:t xml:space="preserve">Cancel</w:t>
       </w:r>
       <w:r>
-        <w:t xml:space="preserve"> to leave the picture exactly as it was.</w:t>
+        <w:t xml:space="preserve"> to leave the picture exactly as it was. When the step is done the panel says so in green (</w:t>
+      </w:r>
+      <w:r>
+        <w:rPr>
+          <w:b/>
+          <w:bCs/>
+        </w:rPr>
+        <w:t xml:space="preserve">✓ … applied</w:t>
+      </w:r>
+      <w:r>
+        <w:t xml:space="preserve">), Apply disappears and an amber </w:t>
+      </w:r>
+      <w:r>
+        <w:rPr>
+          <w:b/>
+          <w:bCs/>
+        </w:rPr>
+        <w:t xml:space="preserve">✓ Applied – Next Step ➜</w:t>
+      </w:r>
+      <w:r>
+        <w:t xml:space="preserve"> button takes you straight to the next recommended step - so after a break you can always tell whether a step was applied. Steps that can be repeated also offer </w:t>
+      </w:r>
+      <w:r>
+        <w:rPr>
+          <w:b/>
+          <w:bCs/>
+        </w:rPr>
+        <w:t xml:space="preserve">Apply Again</w:t>
+      </w:r>
+      <w:r>
+        <w:t xml:space="preserve">. The picture goes back to the whole view after every step.</w:t>
       </w:r>
     </w:p>
     <w:p>
@@ -15098,7 +15128,17 @@
           </w:tcPr>
           <w:p>
             <w:r>
-              <w:t xml:space="preserve">Gentle star stretch - small, colourful stars</w:t>
+              <w:t xml:space="preserve">Gentle star stretch - small, colourful stars. The star steps show the stars on their own; tick </w:t>
+            </w:r>
+            <w:r>
+              <w:rPr>
+                <w:i/>
+                <w:iCs/>
+              </w:rPr>
+              <w:t xml:space="preserve">Show the nebula behind the stars</w:t>
+            </w:r>
+            <w:r>
+              <w:t xml:space="preserve"> to see them over the nebula</w:t>
             </w:r>
           </w:p>
         </w:tc>
@@ -15939,7 +15979,7 @@
           <w:b/>
           <w:bCs/>
         </w:rPr>
-        <w:t xml:space="preserve">Done – Next Step ➜</w:t>
+        <w:t xml:space="preserve">✓ Applied – Next Step ➜</w:t>
       </w:r>
       <w:r>
         <w:t xml:space="preserve"> when you are happy. Spot Fix works the same way. For small specks (hot pixels, satellite remnants) use </w:t>

</xml_diff>

<commit_message>
v0.9.66 beta: SkyFlat handles meridian flips (no turned ghost of the nebula)
With the camera turned 180° between the two sides of a flip, an uneven split let the
nebula of the bigger side leak into the flat, printing a dark, 180°-turned ghost into
the other side's frames. The frames are now split into the two sides from their own
content, and each flat pixel is taken from the side showing plain sky there.

Co-Authored-By: Claude Opus 5.5 <noreply@anthropic.com>
Claude-Session: https://claude.ai/code/session_01FKvd69QsnCvM2zbzYnPwmF
</commit_message>
<xml_diff>
--- a/docs/SubZeroAstro_User_Manual.docx
+++ b/docs/SubZeroAstro_User_Manual.docx
@@ -121,7 +121,7 @@
           <w:sz w:val="22"/>
           <w:szCs w:val="22"/>
         </w:rPr>
-        <w:t xml:space="preserve">Version 0.9.65 beta  ·  Windows and Mac (Apple silicon)</w:t>
+        <w:t xml:space="preserve">Version 0.9.66 beta  ·  Windows and Mac (Apple silicon)</w:t>
       </w:r>
     </w:p>
     <w:p>
@@ -11602,6 +11602,21 @@
       </w:r>
       <w:r>
         <w:t xml:space="preserve"> on Finishing Touches.</w:t>
+      </w:r>
+    </w:p>
+    <w:p>
+      <w:pPr>
+        <w:spacing w:after="120"/>
+      </w:pPr>
+      <w:r>
+        <w:rPr>
+          <w:b/>
+          <w:bCs/>
+        </w:rPr>
+        <w:t xml:space="preserve">Meridian flips are handled.</w:t>
+      </w:r>
+      <w:r>
+        <w:t xml:space="preserve"> When the camera turned 180° with the telescope halfway through the night, the nebula sits on different sensor pixels before and after the flip. SubZeroAstro finds the two sides from the frames themselves and takes each pixel of the SkyFlat from the side that shows plain sky there - otherwise a faint dark copy of the nebula, turned upside down, would be printed into the picture. The stacking log says when this was done.</w:t>
       </w:r>
     </w:p>
     <w:p>

</xml_diff>

<commit_message>
v0.9.67 beta: Tame Bright Core leaves no hard white dot at a galaxy nucleus
* Very bright spikes on top of the lowered glow are squeezed smoothly (dark detail is
  untouched); the top roll-off starts lower and gentler.
* A nucleus clipped even in the masters is rounded off instead of staying a flat disc.
* The glow is lowered from its true peak, so a tiny nucleus is not left out.
* Stronger versions take in more of the area around the core (Core size 0.82 -> 0.55).

Co-Authored-By: Claude Opus 5.5 <noreply@anthropic.com>
Claude-Session: https://claude.ai/code/session_01FKvd69QsnCvM2zbzYnPwmF
</commit_message>
<xml_diff>
--- a/docs/SubZeroAstro_User_Manual.docx
+++ b/docs/SubZeroAstro_User_Manual.docx
@@ -121,7 +121,7 @@
           <w:sz w:val="22"/>
           <w:szCs w:val="22"/>
         </w:rPr>
-        <w:t xml:space="preserve">Version 0.9.66 beta  ·  Windows and Mac (Apple silicon)</w:t>
+        <w:t xml:space="preserve">Version 0.9.67 beta  ·  Windows and Mac (Apple silicon)</w:t>
       </w:r>
     </w:p>
     <w:p>
@@ -14859,7 +14859,7 @@
           </w:tcPr>
           <w:p>
             <w:r>
-              <w:t xml:space="preserve">Recovers detail in a burnt-out galaxy core or bright nebula: lowers the core's glow towards its surroundings and brings its structure back from the linear data (works best right after Brighten the Image)</w:t>
+              <w:t xml:space="preserve">Recovers detail in a burnt-out galaxy core or bright nebula: lowers the core's glow towards its surroundings and brings its structure back from the linear data; a nucleus burnt out even in the masters is rounded off so no hard white dot is left, and the stronger versions take in more of the area around the core (works best right after Brighten the Image)</w:t>
             </w:r>
           </w:p>
         </w:tc>

</xml_diff>

<commit_message>
v0.9.68 beta: Tame Bright Core is a recommended step for galaxies
Right after Brighten the Image (before Curves and Saturation); other targets keep it
optional unless a burnt-out core is found. Self-test and manual.

Co-Authored-By: Claude Opus 5.5 <noreply@anthropic.com>
Claude-Session: https://claude.ai/code/session_01FKvd69QsnCvM2zbzYnPwmF
</commit_message>
<xml_diff>
--- a/docs/SubZeroAstro_User_Manual.docx
+++ b/docs/SubZeroAstro_User_Manual.docx
@@ -121,7 +121,7 @@
           <w:sz w:val="22"/>
           <w:szCs w:val="22"/>
         </w:rPr>
-        <w:t xml:space="preserve">Version 0.9.67 beta  ·  Windows and Mac (Apple silicon)</w:t>
+        <w:t xml:space="preserve">Version 0.9.68 beta  ·  Windows and Mac (Apple silicon)</w:t>
       </w:r>
     </w:p>
     <w:p>
@@ -17374,20 +17374,30 @@
           <w:i/>
           <w:iCs/>
         </w:rPr>
-        <w:t xml:space="preserve">Local Contrast</w:t>
-      </w:r>
-      <w:r>
-        <w:t xml:space="preserve"> recommended and HII regions in </w:t>
+        <w:t xml:space="preserve">Tame Bright Core</w:t>
+      </w:r>
+      <w:r>
+        <w:t xml:space="preserve"> (right after brightening - skip it if the core already shows its detail) and </w:t>
       </w:r>
       <w:r>
         <w:rPr>
           <w:i/>
           <w:iCs/>
         </w:rPr>
+        <w:t xml:space="preserve">Local Contrast</w:t>
+      </w:r>
+      <w:r>
+        <w:t xml:space="preserve"> recommended, and HII regions in </w:t>
+      </w:r>
+      <w:r>
+        <w:rPr>
+          <w:i/>
+          <w:iCs/>
+        </w:rPr>
         <w:t xml:space="preserve">Add Hydrogen Glow</w:t>
       </w:r>
       <w:r>
-        <w:t xml:space="preserve">; star clusters make star removal and shrinking optional (the stars are the subject); comets get a comet stack on page 2. When the name gives nothing away, the usual workflow for your data applies.</w:t>
+        <w:t xml:space="preserve">; other targets get Tame Bright Core recommended only when a burnt-out core is found; star clusters make star removal and shrinking optional (the stars are the subject); comets get a comet stack on page 2. When the name gives nothing away, the usual workflow for your data applies.</w:t>
       </w:r>
     </w:p>
     <w:p>

</xml_diff>

<commit_message>
v0.9.69 beta: open a saved project from page 1
'Open a Saved Project…' in the Load Light Frame Data window and in page 1's File menu
(Ctrl+Shift+O) goes straight to Finishing Touches on the project's last step. Picking
the folder it was saved into finds the <target>.szproj inside. Self-test and manual.

Co-Authored-By: Claude Opus 5.5 <noreply@anthropic.com>
Claude-Session: https://claude.ai/code/session_01FKvd69QsnCvM2zbzYnPwmF
</commit_message>
<xml_diff>
--- a/docs/SubZeroAstro_User_Manual.docx
+++ b/docs/SubZeroAstro_User_Manual.docx
@@ -121,7 +121,7 @@
           <w:sz w:val="22"/>
           <w:szCs w:val="22"/>
         </w:rPr>
-        <w:t xml:space="preserve">Version 0.9.68 beta  ·  Windows and Mac (Apple silicon)</w:t>
+        <w:t xml:space="preserve">Version 0.9.69 beta  ·  Windows and Mac (Apple silicon)</w:t>
       </w:r>
     </w:p>
     <w:p>
@@ -16688,7 +16688,27 @@
         <w:t xml:space="preserve">Save Project As… / Open Project…</w:t>
       </w:r>
       <w:r>
-        <w:t xml:space="preserve"> - keep every step in a folder of your choice and carry on later.</w:t>
+        <w:t xml:space="preserve"> - keep every step in a folder of your choice and carry on later. A saved project can also be opened </w:t>
+      </w:r>
+      <w:r>
+        <w:rPr>
+          <w:b/>
+          <w:bCs/>
+        </w:rPr>
+        <w:t xml:space="preserve">right from the start</w:t>
+      </w:r>
+      <w:r>
+        <w:t xml:space="preserve">: the </w:t>
+      </w:r>
+      <w:r>
+        <w:rPr>
+          <w:b/>
+          <w:bCs/>
+        </w:rPr>
+        <w:t xml:space="preserve">Open a Saved Project…</w:t>
+      </w:r>
+      <w:r>
+        <w:t xml:space="preserve"> button in the Load Light Frame Data window (or File › Open a Saved Project, Ctrl+Shift+O, on page 1) goes straight to Finishing Touches on its last step. Pick the project's folder or the folder you saved it into.</w:t>
       </w:r>
     </w:p>
     <w:p>

</xml_diff>

<commit_message>
Manual: planetary nebulae - the bright part is the ring, not the centre
Co-Authored-By: Claude Opus 5.5 <noreply@anthropic.com>
Claude-Session: https://claude.ai/code/session_01FKvd69QsnCvM2zbzYnPwmF
</commit_message>
<xml_diff>
--- a/docs/SubZeroAstro_User_Manual.docx
+++ b/docs/SubZeroAstro_User_Manual.docx
@@ -21701,7 +21701,7 @@
         <w:t xml:space="preserve">They are tiny and very bright.</w:t>
       </w:r>
       <w:r>
-        <w:t xml:space="preserve"> Brighten the Image sets the brightness for the faint background, which pushes the nebula to nearly white - that is why it looks "hot" and colourless. Use </w:t>
+        <w:t xml:space="preserve"> Brighten the Image sets the brightness for the faint background, which pushes the bright ring or shell to nearly white - that is why it looks "hot" and colourless. Use </w:t>
       </w:r>
       <w:r>
         <w:rPr>
@@ -21721,7 +21721,7 @@
         <w:t xml:space="preserve">Protect bright areas</w:t>
       </w:r>
       <w:r>
-        <w:t xml:space="preserve">.</w:t>
+        <w:t xml:space="preserve"> until the ring sits clearly below white.</w:t>
       </w:r>
     </w:p>
     <w:p>
@@ -21738,50 +21738,30 @@
           <w:b/>
           <w:bCs/>
         </w:rPr>
-        <w:t xml:space="preserve">Tame Bright Core</w:t>
-      </w:r>
-      <w:r>
-        <w:t xml:space="preserve"> is the key step: </w:t>
+        <w:t xml:space="preserve">Their centre is the dim part.</w:t>
+      </w:r>
+      <w:r>
+        <w:t xml:space="preserve"> A planetary's bright light is in its ring or shell; the middle is faint and see-through. </w:t>
       </w:r>
       <w:r>
         <w:rPr>
           <w:i/>
           <w:iCs/>
         </w:rPr>
-        <w:t xml:space="preserve">Strong</w:t>
-      </w:r>
-      <w:r>
-        <w:t xml:space="preserve"> or </w:t>
+        <w:t xml:space="preserve">Tame Bright Core</w:t>
+      </w:r>
+      <w:r>
+        <w:t xml:space="preserve"> is made for a bright centre, so it helps little here - keep the ring below white with Brighten the Image instead. (A dedicated </w:t>
       </w:r>
       <w:r>
         <w:rPr>
           <w:i/>
           <w:iCs/>
         </w:rPr>
-        <w:t xml:space="preserve">Maximum</w:t>
-      </w:r>
-      <w:r>
-        <w:t xml:space="preserve">, with </w:t>
-      </w:r>
-      <w:r>
-        <w:rPr>
-          <w:i/>
-          <w:iCs/>
-        </w:rPr>
-        <w:t xml:space="preserve">Core size</w:t>
-      </w:r>
-      <w:r>
-        <w:t xml:space="preserve"> dragged left until </w:t>
-      </w:r>
-      <w:r>
-        <w:rPr>
-          <w:i/>
-          <w:iCs/>
-        </w:rPr>
-        <w:t xml:space="preserve">Show what will change</w:t>
-      </w:r>
-      <w:r>
-        <w:t xml:space="preserve"> tints the whole shell, not just the middle. The darker centre and the ring's structure come back.</w:t>
+        <w:t xml:space="preserve">Tame the Ring</w:t>
+      </w:r>
+      <w:r>
+        <w:t xml:space="preserve"> tool is planned.)</w:t>
       </w:r>
     </w:p>
     <w:p>

</xml_diff>

<commit_message>
Manual: dual-band filters on galaxies work with long integration (M31 example)
Co-Authored-By: Claude Opus 5.5 <noreply@anthropic.com>
Claude-Session: https://claude.ai/code/session_01FKvd69QsnCvM2zbzYnPwmF
</commit_message>
<xml_diff>
--- a/docs/SubZeroAstro_User_Manual.docx
+++ b/docs/SubZeroAstro_User_Manual.docx
@@ -5119,7 +5119,7 @@
           <w:b/>
           <w:bCs/>
         </w:rPr>
-        <w:t xml:space="preserve">44</w:t>
+        <w:t xml:space="preserve">45</w:t>
       </w:r>
     </w:p>
     <w:p>
@@ -21341,7 +21341,7 @@
         <w:t xml:space="preserve">Filters:</w:t>
       </w:r>
       <w:r>
-        <w:t xml:space="preserve"> dual-band filters (L-eNhance, L-Ultimate) cut most of a galaxy's starlight - broadband (or a mild light-pollution filter) gives brighter arms and natural colours.</w:t>
+        <w:t xml:space="preserve"> broadband (or a mild light-pollution filter) gives the brightest arms and most natural colours. A dual-band filter (L-eNhance, L-Ultimate) lets through only a little of a galaxy's starlight, but with long integration it works well and makes the red HII regions stand out - M31 with a 55 mm refractor, an ASI2600MC and an L-Ultimate over about 20 hours shows the disc, the dust lanes and the HII regions clearly.</w:t>
       </w:r>
     </w:p>
     <w:p>

</xml_diff>

<commit_message>
Manual: galaxy tips - warm core / blue arms, faint outer disc
Co-Authored-By: Claude Opus 5.5 <noreply@anthropic.com>
Claude-Session: https://claude.ai/code/session_01FKvd69QsnCvM2zbzYnPwmF
</commit_message>
<xml_diff>
--- a/docs/SubZeroAstro_User_Manual.docx
+++ b/docs/SubZeroAstro_User_Manual.docx
@@ -21422,6 +21422,96 @@
       </w:r>
       <w:r>
         <w:t xml:space="preserve"> keeps the faint outer arms and halo that make a galaxy look real.</w:t>
+      </w:r>
+    </w:p>
+    <w:p>
+      <w:pPr>
+        <w:pStyle w:val="ListParagraph"/>
+        <w:numPr>
+          <w:ilvl w:val="0"/>
+          <w:numId w:val="2"/>
+        </w:numPr>
+        <w:spacing w:after="60"/>
+      </w:pPr>
+      <w:r>
+        <w:rPr>
+          <w:b/>
+          <w:bCs/>
+        </w:rPr>
+        <w:t xml:space="preserve">Warm core, blue arms:</w:t>
+      </w:r>
+      <w:r>
+        <w:t xml:space="preserve"> a spiral's bulge is old, yellowish starlight and its arms young, blue stars. If the disc looks grey, a gentle </w:t>
+      </w:r>
+      <w:r>
+        <w:rPr>
+          <w:i/>
+          <w:iCs/>
+        </w:rPr>
+        <w:t xml:space="preserve">Adjust Colours › Boost reds</w:t>
+      </w:r>
+      <w:r>
+        <w:t xml:space="preserve"> (with </w:t>
+      </w:r>
+      <w:r>
+        <w:rPr>
+          <w:i/>
+          <w:iCs/>
+        </w:rPr>
+        <w:t xml:space="preserve">Protect the sky</w:t>
+      </w:r>
+      <w:r>
+        <w:t xml:space="preserve"> up) warms the core, and </w:t>
+      </w:r>
+      <w:r>
+        <w:rPr>
+          <w:i/>
+          <w:iCs/>
+        </w:rPr>
+        <w:t xml:space="preserve">Boost blues</w:t>
+      </w:r>
+      <w:r>
+        <w:t xml:space="preserve"> the arms.</w:t>
+      </w:r>
+    </w:p>
+    <w:p>
+      <w:pPr>
+        <w:pStyle w:val="ListParagraph"/>
+        <w:numPr>
+          <w:ilvl w:val="0"/>
+          <w:numId w:val="2"/>
+        </w:numPr>
+        <w:spacing w:after="60"/>
+      </w:pPr>
+      <w:r>
+        <w:rPr>
+          <w:b/>
+          <w:bCs/>
+        </w:rPr>
+        <w:t xml:space="preserve">The faint outer disc:</w:t>
+      </w:r>
+      <w:r>
+        <w:t xml:space="preserve"> a gentle </w:t>
+      </w:r>
+      <w:r>
+        <w:rPr>
+          <w:i/>
+          <w:iCs/>
+        </w:rPr>
+        <w:t xml:space="preserve">Curves › Lift faint detail</w:t>
+      </w:r>
+      <w:r>
+        <w:t xml:space="preserve"> before </w:t>
+      </w:r>
+      <w:r>
+        <w:rPr>
+          <w:i/>
+          <w:iCs/>
+        </w:rPr>
+        <w:t xml:space="preserve">Darken the Sky Background</w:t>
+      </w:r>
+      <w:r>
+        <w:t xml:space="preserve"> shows more of the outer arms and halo, when the data is deep enough.</w:t>
       </w:r>
     </w:p>
     <w:p>

</xml_diff>

<commit_message>
v0.9.71 beta: Tame the Ring for planetary nebulae; visible mask tint
* For a planetary nebula Tame Bright Core works as 'Tame the Ring' (recommended): all
  brighter than the Ring level is rolled off below white (structure from the linear
  data), the faint centre and outer halo are left exactly as they are. Ring level / Area
  / Strength sliders; larger default area.
* Area (Core size) now goes down to 0.2, so the mask can always reach round the object.
* 'Show what will change' tints in green with a yellow edge line (red vanished on red
  nebulae).
* The 'round off a clipped top' fix applies only to a small nucleus, not a clipped ring.

Co-Authored-By: Claude Opus 5.5 <noreply@anthropic.com>
Claude-Session: https://claude.ai/code/session_01FKvd69QsnCvM2zbzYnPwmF
</commit_message>
<xml_diff>
--- a/docs/SubZeroAstro_User_Manual.docx
+++ b/docs/SubZeroAstro_User_Manual.docx
@@ -121,7 +121,7 @@
           <w:sz w:val="22"/>
           <w:szCs w:val="22"/>
         </w:rPr>
-        <w:t xml:space="preserve">Version 0.9.70 beta  ·  Windows and Mac (Apple silicon)</w:t>
+        <w:t xml:space="preserve">Version 0.9.71 beta  ·  Windows and Mac (Apple silicon)</w:t>
       </w:r>
     </w:p>
     <w:p>
@@ -21828,10 +21828,10 @@
           <w:b/>
           <w:bCs/>
         </w:rPr>
-        <w:t xml:space="preserve">Their centre is the dim part.</w:t>
-      </w:r>
-      <w:r>
-        <w:t xml:space="preserve"> A planetary's bright light is in its ring or shell; the middle is faint and see-through. </w:t>
+        <w:t xml:space="preserve">Tame the ring, not the centre.</w:t>
+      </w:r>
+      <w:r>
+        <w:t xml:space="preserve"> A planetary's bright light is in its ring or shell; the middle is faint and see-through. For a planetary nebula </w:t>
       </w:r>
       <w:r>
         <w:rPr>
@@ -21841,7 +21841,7 @@
         <w:t xml:space="preserve">Tame Bright Core</w:t>
       </w:r>
       <w:r>
-        <w:t xml:space="preserve"> is made for a bright centre, so it helps little here - keep the ring below white with Brighten the Image instead. (A dedicated </w:t>
+        <w:t xml:space="preserve"> (recommended, right after brightening) works as </w:t>
       </w:r>
       <w:r>
         <w:rPr>
@@ -21851,7 +21851,57 @@
         <w:t xml:space="preserve">Tame the Ring</w:t>
       </w:r>
       <w:r>
-        <w:t xml:space="preserve"> tool is planned.)</w:t>
+        <w:t xml:space="preserve">: everything brighter than the </w:t>
+      </w:r>
+      <w:r>
+        <w:rPr>
+          <w:i/>
+          <w:iCs/>
+        </w:rPr>
+        <w:t xml:space="preserve">Ring level</w:t>
+      </w:r>
+      <w:r>
+        <w:t xml:space="preserve"> is rolled off below white, the faint centre and the outer halo are left exactly as they are. Tick </w:t>
+      </w:r>
+      <w:r>
+        <w:rPr>
+          <w:i/>
+          <w:iCs/>
+        </w:rPr>
+        <w:t xml:space="preserve">Show what will change</w:t>
+      </w:r>
+      <w:r>
+        <w:t xml:space="preserve"> - the green tint (yellow line at its edge) must cover the whole ring; drag </w:t>
+      </w:r>
+      <w:r>
+        <w:rPr>
+          <w:i/>
+          <w:iCs/>
+        </w:rPr>
+        <w:t xml:space="preserve">Area</w:t>
+      </w:r>
+      <w:r>
+        <w:t xml:space="preserve"> to the left until it does. </w:t>
+      </w:r>
+      <w:r>
+        <w:rPr>
+          <w:i/>
+          <w:iCs/>
+        </w:rPr>
+        <w:t xml:space="preserve">Medium</w:t>
+      </w:r>
+      <w:r>
+        <w:t xml:space="preserve"> or </w:t>
+      </w:r>
+      <w:r>
+        <w:rPr>
+          <w:i/>
+          <w:iCs/>
+        </w:rPr>
+        <w:t xml:space="preserve">Strong</w:t>
+      </w:r>
+      <w:r>
+        <w:t xml:space="preserve"> is a good start.</w:t>
       </w:r>
     </w:p>
     <w:p>

</xml_diff>

<commit_message>
v0.9.72 beta: planetary nebulae - ring tamed after Curves; nebula rescued from the stars image
* For a planetary nebula Tame Bright Core (Tame the Ring) comes after Curves, whose
  contrast otherwise makes the ring white again; before Saturation.
* Take Stars Out: anything in the stars-only image much wider than a star, near the
  middle (a planetary StarXTerminator took for a star), goes back to the nebula image;
  bright stars stay. Self-tests and manual.

Co-Authored-By: Claude Opus 5.5 <noreply@anthropic.com>
Claude-Session: https://claude.ai/code/session_01FKvd69QsnCvM2zbzYnPwmF
</commit_message>
<xml_diff>
--- a/docs/SubZeroAstro_User_Manual.docx
+++ b/docs/SubZeroAstro_User_Manual.docx
@@ -121,7 +121,7 @@
           <w:sz w:val="22"/>
           <w:szCs w:val="22"/>
         </w:rPr>
-        <w:t xml:space="preserve">Version 0.9.71 beta  ·  Windows and Mac (Apple silicon)</w:t>
+        <w:t xml:space="preserve">Version 0.9.72 beta  ·  Windows and Mac (Apple silicon)</w:t>
       </w:r>
     </w:p>
     <w:p>
@@ -21841,7 +21841,17 @@
         <w:t xml:space="preserve">Tame Bright Core</w:t>
       </w:r>
       <w:r>
-        <w:t xml:space="preserve"> (recommended, right after brightening) works as </w:t>
+        <w:t xml:space="preserve"> (recommended, right </w:t>
+      </w:r>
+      <w:r>
+        <w:rPr>
+          <w:b/>
+          <w:bCs/>
+        </w:rPr>
+        <w:t xml:space="preserve">after Curves</w:t>
+      </w:r>
+      <w:r>
+        <w:t xml:space="preserve"> - the workflow puts it there, because Curves' contrast would make the ring white again) works as </w:t>
       </w:r>
       <w:r>
         <w:rPr>
@@ -21901,7 +21911,37 @@
         <w:t xml:space="preserve">Strong</w:t>
       </w:r>
       <w:r>
-        <w:t xml:space="preserve"> is a good start.</w:t>
+        <w:t xml:space="preserve"> is a good start. Don't brighten or add contrast after it.</w:t>
+      </w:r>
+    </w:p>
+    <w:p>
+      <w:pPr>
+        <w:pStyle w:val="ListParagraph"/>
+        <w:numPr>
+          <w:ilvl w:val="0"/>
+          <w:numId w:val="2"/>
+        </w:numPr>
+        <w:spacing w:after="60"/>
+      </w:pPr>
+      <w:r>
+        <w:rPr>
+          <w:b/>
+          <w:bCs/>
+        </w:rPr>
+        <w:t xml:space="preserve">Star removal and small nebulae:</w:t>
+      </w:r>
+      <w:r>
+        <w:t xml:space="preserve"> StarXTerminator can take a small, bright planetary for a star and put part of it in the stars image - where no nebula step reaches it, and </w:t>
+      </w:r>
+      <w:r>
+        <w:rPr>
+          <w:i/>
+          <w:iCs/>
+        </w:rPr>
+        <w:t xml:space="preserve">Put Stars Back</w:t>
+      </w:r>
+      <w:r>
+        <w:t xml:space="preserve"> makes it white again. For a planetary nebula SubZeroAstro moves anything in the stars image that is much wider than a star, near the middle of the picture, back to the nebula when the stars are taken out.</w:t>
       </w:r>
     </w:p>
     <w:p>

</xml_diff>

<commit_message>
v0.9.73 beta: Tame the Ring re-brightens the planetary gently from the linear data
The ring mode only rolled values above a level off to just below white, so a planetary
whose ring AND interior were near white barely changed. Now the nebula inside the mask
is brightened again from the linear data: edge kept, brightest part to the chosen Ring
brightness (Gentle 85% … Maximum 55%), the rest following its real brightness - ring
and inside separate and leave white behind; the halo stays. Self-test and manual.

Co-Authored-By: Claude Opus 5.5 <noreply@anthropic.com>
Claude-Session: https://claude.ai/code/session_01FKvd69QsnCvM2zbzYnPwmF
</commit_message>
<xml_diff>
--- a/docs/SubZeroAstro_User_Manual.docx
+++ b/docs/SubZeroAstro_User_Manual.docx
@@ -121,7 +121,7 @@
           <w:sz w:val="22"/>
           <w:szCs w:val="22"/>
         </w:rPr>
-        <w:t xml:space="preserve">Version 0.9.72 beta  ·  Windows and Mac (Apple silicon)</w:t>
+        <w:t xml:space="preserve">Version 0.9.73 beta  ·  Windows and Mac (Apple silicon)</w:t>
       </w:r>
     </w:p>
     <w:p>
@@ -21861,17 +21861,17 @@
         <w:t xml:space="preserve">Tame the Ring</w:t>
       </w:r>
       <w:r>
-        <w:t xml:space="preserve">: everything brighter than the </w:t>
+        <w:t xml:space="preserve">: inside the mask the nebula is brightened again, gently, from the linear data - the brightest part of the ring goes to the </w:t>
       </w:r>
       <w:r>
         <w:rPr>
           <w:i/>
           <w:iCs/>
         </w:rPr>
-        <w:t xml:space="preserve">Ring level</w:t>
-      </w:r>
-      <w:r>
-        <w:t xml:space="preserve"> is rolled off below white, the faint centre and the outer halo are left exactly as they are. Tick </w:t>
+        <w:t xml:space="preserve">Ring brightness</w:t>
+      </w:r>
+      <w:r>
+        <w:t xml:space="preserve"> you pick (Gentle 85% … Maximum 55%), everything else follows the nebula's real brightness, so ring and inside separate again and both leave white behind. The outer halo is left as it is. Tick </w:t>
       </w:r>
       <w:r>
         <w:rPr>

</xml_diff>

<commit_message>
v0.9.75 beta: version and manual (light green wash, area outside the ring)
Co-Authored-By: Claude Opus 5.5 <noreply@anthropic.com>
Claude-Session: https://claude.ai/code/session_01FKvd69QsnCvM2zbzYnPwmF
</commit_message>
<xml_diff>
--- a/docs/SubZeroAstro_User_Manual.docx
+++ b/docs/SubZeroAstro_User_Manual.docx
@@ -121,7 +121,7 @@
           <w:sz w:val="22"/>
           <w:szCs w:val="22"/>
         </w:rPr>
-        <w:t xml:space="preserve">Version 0.9.74 beta  ·  Windows and Mac (Apple silicon)</w:t>
+        <w:t xml:space="preserve">Version 0.9.75 beta  ·  Windows and Mac (Apple silicon)</w:t>
       </w:r>
     </w:p>
     <w:p>
@@ -21881,7 +21881,7 @@
         <w:t xml:space="preserve">Show what will change</w:t>
       </w:r>
       <w:r>
-        <w:t xml:space="preserve"> - the green tint (yellow line at its edge) must cover the whole ring; drag </w:t>
+        <w:t xml:space="preserve"> to see the area - a light green wash with a yellow line at its edge, which should lie outside the ring; drag </w:t>
       </w:r>
       <w:r>
         <w:rPr>
@@ -21891,7 +21891,7 @@
         <w:t xml:space="preserve">Area</w:t>
       </w:r>
       <w:r>
-        <w:t xml:space="preserve"> to the left until it does. </w:t>
+        <w:t xml:space="preserve"> to the left if it doesn't. The result shows through the wash; untick the box for a clean look. </w:t>
       </w:r>
       <w:r>
         <w:rPr>

</xml_diff>

<commit_message>
v0.9.76 beta: planetary nebulae are brightened colour-preserving
The GHS stretch (default for starless pictures) brightens each colour separately and
pushes a bright planetary's three colours to the top together - M57 turned grey and no
colour step could bring it back. Planetary nebulae now default to the colour-preserving
method (luminance brightened, each pixel's colour mix kept). Self-test and manual.

Co-Authored-By: Claude Opus 5.5 <noreply@anthropic.com>
Claude-Session: https://claude.ai/code/session_01FKvd69QsnCvM2zbzYnPwmF
</commit_message>
<xml_diff>
--- a/docs/SubZeroAstro_User_Manual.docx
+++ b/docs/SubZeroAstro_User_Manual.docx
@@ -121,7 +121,7 @@
           <w:sz w:val="22"/>
           <w:szCs w:val="22"/>
         </w:rPr>
-        <w:t xml:space="preserve">Version 0.9.75 beta  ·  Windows and Mac (Apple silicon)</w:t>
+        <w:t xml:space="preserve">Version 0.9.76 beta  ·  Windows and Mac (Apple silicon)</w:t>
       </w:r>
     </w:p>
     <w:p>
@@ -21791,7 +21791,7 @@
         <w:t xml:space="preserve">They are tiny and very bright.</w:t>
       </w:r>
       <w:r>
-        <w:t xml:space="preserve"> Brighten the Image sets the brightness for the faint background, which pushes the bright ring or shell to nearly white - that is why it looks "hot" and colourless. Use </w:t>
+        <w:t xml:space="preserve"> Brighten the Image sets the brightness for the faint background, which pushes the bright ring or shell to nearly white - that is why it looks "hot". Use </w:t>
       </w:r>
       <w:r>
         <w:rPr>
@@ -21801,17 +21801,37 @@
         <w:t xml:space="preserve">Gentle</w:t>
       </w:r>
       <w:r>
-        <w:t xml:space="preserve"> and raise </w:t>
+        <w:t xml:space="preserve">, and keep the </w:t>
       </w:r>
       <w:r>
         <w:rPr>
           <w:i/>
           <w:iCs/>
         </w:rPr>
-        <w:t xml:space="preserve">Protect bright areas</w:t>
-      </w:r>
-      <w:r>
-        <w:t xml:space="preserve"> until the ring sits clearly below white.</w:t>
+        <w:t xml:space="preserve">Method</w:t>
+      </w:r>
+      <w:r>
+        <w:t xml:space="preserve"> on </w:t>
+      </w:r>
+      <w:r>
+        <w:rPr>
+          <w:b/>
+          <w:bCs/>
+        </w:rPr>
+        <w:t xml:space="preserve">Colour-preserving</w:t>
+      </w:r>
+      <w:r>
+        <w:t xml:space="preserve"> (the default for planetary nebulae): the </w:t>
+      </w:r>
+      <w:r>
+        <w:rPr>
+          <w:i/>
+          <w:iCs/>
+        </w:rPr>
+        <w:t xml:space="preserve">Hyperbolic (GHS)</w:t>
+      </w:r>
+      <w:r>
+        <w:t xml:space="preserve"> method brightens each colour separately and turns a bright planetary grey - no colour step can bring that back.</w:t>
       </w:r>
     </w:p>
     <w:p>

</xml_diff>

<commit_message>
v0.9.77 beta: smooth colour transitions; radiograph fades softly on the splash
* Adjust Colours: 'Smooth colour transitions' (default 0.3) blends the colours where
  they change abruptly - colour only, brightness and detail kept.
* Splash: the radiograph's edges fade smoothly to transparent and its outline is gone,
  so it melts into the background instead of showing a rectangle.

Co-Authored-By: Claude Opus 5.5 <noreply@anthropic.com>
Claude-Session: https://claude.ai/code/session_01FKvd69QsnCvM2zbzYnPwmF
</commit_message>
<xml_diff>
--- a/docs/SubZeroAstro_User_Manual.docx
+++ b/docs/SubZeroAstro_User_Manual.docx
@@ -121,7 +121,7 @@
           <w:sz w:val="22"/>
           <w:szCs w:val="22"/>
         </w:rPr>
-        <w:t xml:space="preserve">Version 0.9.76 beta  ·  Windows and Mac (Apple silicon)</w:t>
+        <w:t xml:space="preserve">Version 0.9.77 beta  ·  Windows and Mac (Apple silicon)</w:t>
       </w:r>
     </w:p>
     <w:p>
@@ -22031,7 +22031,7 @@
         <w:t xml:space="preserve">Rich</w:t>
       </w:r>
       <w:r>
-        <w:t xml:space="preserve"> (Bold mostly bleeds colour into the edges), then </w:t>
+        <w:t xml:space="preserve">, then </w:t>
       </w:r>
       <w:r>
         <w:rPr>
@@ -22041,7 +22041,27 @@
         <w:t xml:space="preserve">Adjust Colours › Blues and reds</w:t>
       </w:r>
       <w:r>
-        <w:t xml:space="preserve">.</w:t>
+        <w:t xml:space="preserve"> (lower </w:t>
+      </w:r>
+      <w:r>
+        <w:rPr>
+          <w:i/>
+          <w:iCs/>
+        </w:rPr>
+        <w:t xml:space="preserve">Reds</w:t>
+      </w:r>
+      <w:r>
+        <w:t xml:space="preserve"> a little for a bluer centre). If the colours change in hard bands around the ring, raise </w:t>
+      </w:r>
+      <w:r>
+        <w:rPr>
+          <w:i/>
+          <w:iCs/>
+        </w:rPr>
+        <w:t xml:space="preserve">Smooth colour transitions</w:t>
+      </w:r>
+      <w:r>
+        <w:t xml:space="preserve"> - it blends the colours without softening the detail.</w:t>
       </w:r>
     </w:p>
     <w:p>

</xml_diff>

<commit_message>
Manual Highlights: planetary nebulae recognised and the process tailored
Co-Authored-By: Claude Opus 5.5 <noreply@anthropic.com>
Claude-Session: https://claude.ai/code/session_01FKvd69QsnCvM2zbzYnPwmF
</commit_message>
<xml_diff>
--- a/docs/SubZeroAstro_User_Manual.docx
+++ b/docs/SubZeroAstro_User_Manual.docx
@@ -3166,6 +3166,89 @@
                 <w:szCs w:val="18"/>
               </w:rPr>
               <w:t xml:space="preserve">0.9.59</w:t>
+            </w:r>
+          </w:p>
+        </w:tc>
+      </w:tr>
+      <w:tr>
+        <w:trPr>
+          <w:cantSplit/>
+        </w:trPr>
+        <w:tc>
+          <w:tcPr>
+            <w:tcW w:type="dxa" w:w="2500"/>
+            <w:tcBorders>
+              <w:top w:val="single" w:color="BFBFBF" w:sz="4"/>
+              <w:left w:val="single" w:color="BFBFBF" w:sz="4"/>
+              <w:bottom w:val="single" w:color="BFBFBF" w:sz="4"/>
+              <w:right w:val="single" w:color="BFBFBF" w:sz="4"/>
+            </w:tcBorders>
+            <w:tcMar>
+              <w:top w:type="dxa" w:w="30"/>
+              <w:left w:type="dxa" w:w="90"/>
+              <w:bottom w:type="dxa" w:w="30"/>
+              <w:right w:type="dxa" w:w="90"/>
+            </w:tcMar>
+          </w:tcPr>
+          <w:p>
+            <w:r>
+              <w:rPr>
+                <w:sz w:val="18"/>
+                <w:szCs w:val="18"/>
+              </w:rPr>
+              <w:t xml:space="preserve">Planetary nebulae recognised</w:t>
+            </w:r>
+          </w:p>
+        </w:tc>
+        <w:tc>
+          <w:tcPr>
+            <w:tcW w:type="dxa" w:w="5960"/>
+            <w:tcBorders>
+              <w:top w:val="single" w:color="BFBFBF" w:sz="4"/>
+              <w:left w:val="single" w:color="BFBFBF" w:sz="4"/>
+              <w:bottom w:val="single" w:color="BFBFBF" w:sz="4"/>
+              <w:right w:val="single" w:color="BFBFBF" w:sz="4"/>
+            </w:tcBorders>
+            <w:tcMar>
+              <w:top w:type="dxa" w:w="30"/>
+              <w:left w:type="dxa" w:w="90"/>
+              <w:bottom w:type="dxa" w:w="30"/>
+              <w:right w:type="dxa" w:w="90"/>
+            </w:tcMar>
+          </w:tcPr>
+          <w:p>
+            <w:r>
+              <w:rPr>
+                <w:sz w:val="18"/>
+                <w:szCs w:val="18"/>
+              </w:rPr>
+              <w:t xml:space="preserve">From the name (M57, M27 …) the whole process is tailored: colour-preserving brightening, the nebula moved back from the stars image, Tame the Ring keeps the centre and halo</w:t>
+            </w:r>
+          </w:p>
+        </w:tc>
+        <w:tc>
+          <w:tcPr>
+            <w:tcW w:type="dxa" w:w="900"/>
+            <w:tcBorders>
+              <w:top w:val="single" w:color="BFBFBF" w:sz="4"/>
+              <w:left w:val="single" w:color="BFBFBF" w:sz="4"/>
+              <w:bottom w:val="single" w:color="BFBFBF" w:sz="4"/>
+              <w:right w:val="single" w:color="BFBFBF" w:sz="4"/>
+            </w:tcBorders>
+            <w:tcMar>
+              <w:top w:type="dxa" w:w="30"/>
+              <w:left w:type="dxa" w:w="90"/>
+              <w:bottom w:type="dxa" w:w="30"/>
+              <w:right w:type="dxa" w:w="90"/>
+            </w:tcMar>
+          </w:tcPr>
+          <w:p>
+            <w:r>
+              <w:rPr>
+                <w:sz w:val="18"/>
+                <w:szCs w:val="18"/>
+              </w:rPr>
+              <w:t xml:space="preserve">0.9.71-0.9.76</w:t>
             </w:r>
           </w:p>
         </w:tc>

</xml_diff>

<commit_message>
Manual 1.4: Your data, improved - never painted
What every step works from, how the AI tools are used, and the few places pixels are
replaced (only to remove flaws: Spot Fix, behind removed stars, dust/vignetting).

Co-Authored-By: Claude Opus 5.5 <noreply@anthropic.com>
Claude-Session: https://claude.ai/code/session_01FKvd69QsnCvM2zbzYnPwmF
</commit_message>
<xml_diff>
--- a/docs/SubZeroAstro_User_Manual.docx
+++ b/docs/SubZeroAstro_User_Manual.docx
@@ -3605,6 +3605,24 @@
         <w:tabs>
           <w:tab w:val="right" w:pos="9360" w:leader="dot"/>
         </w:tabs>
+        <w:spacing w:after="20" w:before="0"/>
+        <w:ind w:left="480"/>
+      </w:pPr>
+      <w:hyperlink w:history="1" w:anchor="s_1_4">
+        <w:r>
+          <w:rPr>
+            <w:b w:val="false"/>
+            <w:bCs w:val="false"/>
+          </w:rPr>
+          <w:t xml:space="preserve">1.4   Your data, improved - never painted</w:t>
+        </w:r>
+      </w:hyperlink>
+    </w:p>
+    <w:p>
+      <w:pPr>
+        <w:tabs>
+          <w:tab w:val="right" w:pos="9360" w:leader="dot"/>
+        </w:tabs>
         <w:spacing w:after="20" w:before="140"/>
         <w:ind w:left="0"/>
       </w:pPr>
@@ -3626,7 +3644,7 @@
           <w:b/>
           <w:bCs/>
         </w:rPr>
-        <w:t xml:space="preserve">8</w:t>
+        <w:t xml:space="preserve">9</w:t>
       </w:r>
     </w:p>
     <w:p>
@@ -3709,7 +3727,7 @@
           <w:b/>
           <w:bCs/>
         </w:rPr>
-        <w:t xml:space="preserve">10</w:t>
+        <w:t xml:space="preserve">11</w:t>
       </w:r>
     </w:p>
     <w:p>
@@ -3810,7 +3828,7 @@
           <w:b/>
           <w:bCs/>
         </w:rPr>
-        <w:t xml:space="preserve">11</w:t>
+        <w:t xml:space="preserve">12</w:t>
       </w:r>
     </w:p>
     <w:p>
@@ -3911,7 +3929,7 @@
           <w:b/>
           <w:bCs/>
         </w:rPr>
-        <w:t xml:space="preserve">16</w:t>
+        <w:t xml:space="preserve">17</w:t>
       </w:r>
     </w:p>
     <w:p>
@@ -4012,7 +4030,7 @@
           <w:b/>
           <w:bCs/>
         </w:rPr>
-        <w:t xml:space="preserve">17</w:t>
+        <w:t xml:space="preserve">18</w:t>
       </w:r>
     </w:p>
     <w:p>
@@ -4131,7 +4149,7 @@
           <w:b/>
           <w:bCs/>
         </w:rPr>
-        <w:t xml:space="preserve">20</w:t>
+        <w:t xml:space="preserve">21</w:t>
       </w:r>
     </w:p>
     <w:p>
@@ -4268,7 +4286,7 @@
           <w:b/>
           <w:bCs/>
         </w:rPr>
-        <w:t xml:space="preserve">23</w:t>
+        <w:t xml:space="preserve">24</w:t>
       </w:r>
     </w:p>
     <w:p>
@@ -4423,7 +4441,7 @@
           <w:b/>
           <w:bCs/>
         </w:rPr>
-        <w:t xml:space="preserve">27</w:t>
+        <w:t xml:space="preserve">28</w:t>
       </w:r>
     </w:p>
     <w:p>
@@ -4596,7 +4614,7 @@
           <w:b/>
           <w:bCs/>
         </w:rPr>
-        <w:t xml:space="preserve">34</w:t>
+        <w:t xml:space="preserve">35</w:t>
       </w:r>
     </w:p>
     <w:p>
@@ -4751,7 +4769,7 @@
           <w:b/>
           <w:bCs/>
         </w:rPr>
-        <w:t xml:space="preserve">36</w:t>
+        <w:t xml:space="preserve">37</w:t>
       </w:r>
     </w:p>
     <w:p>
@@ -4816,7 +4834,7 @@
           <w:b/>
           <w:bCs/>
         </w:rPr>
-        <w:t xml:space="preserve">38</w:t>
+        <w:t xml:space="preserve">39</w:t>
       </w:r>
     </w:p>
     <w:p>
@@ -4881,7 +4899,7 @@
           <w:b/>
           <w:bCs/>
         </w:rPr>
-        <w:t xml:space="preserve">39</w:t>
+        <w:t xml:space="preserve">40</w:t>
       </w:r>
     </w:p>
     <w:p>
@@ -4946,7 +4964,7 @@
           <w:b/>
           <w:bCs/>
         </w:rPr>
-        <w:t xml:space="preserve">40</w:t>
+        <w:t xml:space="preserve">41</w:t>
       </w:r>
     </w:p>
     <w:p>
@@ -5011,7 +5029,7 @@
           <w:b/>
           <w:bCs/>
         </w:rPr>
-        <w:t xml:space="preserve">41</w:t>
+        <w:t xml:space="preserve">42</w:t>
       </w:r>
     </w:p>
     <w:p>
@@ -5202,7 +5220,7 @@
           <w:b/>
           <w:bCs/>
         </w:rPr>
-        <w:t xml:space="preserve">45</w:t>
+        <w:t xml:space="preserve">46</w:t>
       </w:r>
     </w:p>
     <w:p>
@@ -6388,6 +6406,196 @@
     </w:p>
     <w:p>
       <w:pPr>
+        <w:pStyle w:val="Heading2"/>
+      </w:pPr>
+      <w:bookmarkStart w:name="s_1_4" w:id="1"/>
+      <w:r>
+        <w:t xml:space="preserve">1.4   Your data, improved - never painted</w:t>
+      </w:r>
+      <w:bookmarkEnd w:id="1"/>
+    </w:p>
+    <w:p>
+      <w:pPr>
+        <w:spacing w:after="120"/>
+      </w:pPr>
+      <w:r>
+        <w:t xml:space="preserve">SubZeroAstro brings out what your camera </w:t>
+      </w:r>
+      <w:r>
+        <w:rPr>
+          <w:b/>
+          <w:bCs/>
+        </w:rPr>
+        <w:t xml:space="preserve">recorded</w:t>
+      </w:r>
+      <w:r>
+        <w:t xml:space="preserve"> - it does not invent detail or paint the target. Every step works from your own data:</w:t>
+      </w:r>
+    </w:p>
+    <w:p>
+      <w:pPr>
+        <w:pStyle w:val="ListParagraph"/>
+        <w:numPr>
+          <w:ilvl w:val="0"/>
+          <w:numId w:val="2"/>
+        </w:numPr>
+        <w:spacing w:after="60"/>
+      </w:pPr>
+      <w:r>
+        <w:rPr>
+          <w:b/>
+          <w:bCs/>
+        </w:rPr>
+        <w:t xml:space="preserve">Brightness and colour:</w:t>
+      </w:r>
+      <w:r>
+        <w:t xml:space="preserve"> brightening, Curves, Saturation and the colour tools re-map the brightness and colour your camera measured. The colour-preserving stretch keeps each pixel's measured colour mix; palettes such as HOO and Foraxx assign your filters' real signal to colours.</w:t>
+      </w:r>
+    </w:p>
+    <w:p>
+      <w:pPr>
+        <w:pStyle w:val="ListParagraph"/>
+        <w:numPr>
+          <w:ilvl w:val="0"/>
+          <w:numId w:val="2"/>
+        </w:numPr>
+        <w:spacing w:after="60"/>
+      </w:pPr>
+      <w:r>
+        <w:rPr>
+          <w:b/>
+          <w:bCs/>
+        </w:rPr>
+        <w:t xml:space="preserve">Bright cores and rings:</w:t>
+      </w:r>
+      <w:r>
+        <w:t xml:space="preserve"> Tame Bright Core and Tame the Ring re-make bright areas from your own unstretched (linear) data - detail they show was in your frames, hidden by the brightening.</w:t>
+      </w:r>
+    </w:p>
+    <w:p>
+      <w:pPr>
+        <w:pStyle w:val="ListParagraph"/>
+        <w:numPr>
+          <w:ilvl w:val="0"/>
+          <w:numId w:val="2"/>
+        </w:numPr>
+        <w:spacing w:after="60"/>
+      </w:pPr>
+      <w:r>
+        <w:rPr>
+          <w:b/>
+          <w:bCs/>
+        </w:rPr>
+        <w:t xml:space="preserve">AI, used the accepted way:</w:t>
+      </w:r>
+      <w:r>
+        <w:t xml:space="preserve"> BlurXTerminator sharpens by deconvolution using the blur measured from your own stars; NoiseXTerminator removes noise; GraXpert models the light-pollution gradient so it can be subtracted. None of them adds structure that is not in the data.</w:t>
+      </w:r>
+    </w:p>
+    <w:p>
+      <w:pPr>
+        <w:pStyle w:val="ListParagraph"/>
+        <w:numPr>
+          <w:ilvl w:val="0"/>
+          <w:numId w:val="2"/>
+        </w:numPr>
+        <w:spacing w:after="60"/>
+      </w:pPr>
+      <w:r>
+        <w:rPr>
+          <w:b/>
+          <w:bCs/>
+        </w:rPr>
+        <w:t xml:space="preserve">Smoothing</w:t>
+      </w:r>
+      <w:r>
+        <w:t xml:space="preserve"> (colour transitions, noise reduction) only averages what is there.</w:t>
+      </w:r>
+    </w:p>
+    <w:p>
+      <w:pPr>
+        <w:spacing w:after="120"/>
+      </w:pPr>
+      <w:r>
+        <w:rPr>
+          <w:b/>
+          <w:bCs/>
+        </w:rPr>
+        <w:t xml:space="preserve">Where pixels are replaced - always to remove a flaw, never to add to the target:</w:t>
+      </w:r>
+    </w:p>
+    <w:p>
+      <w:pPr>
+        <w:pStyle w:val="ListParagraph"/>
+        <w:numPr>
+          <w:ilvl w:val="0"/>
+          <w:numId w:val="2"/>
+        </w:numPr>
+        <w:spacing w:after="60"/>
+      </w:pPr>
+      <w:r>
+        <w:rPr>
+          <w:b/>
+          <w:bCs/>
+        </w:rPr>
+        <w:t xml:space="preserve">Spot Fix</w:t>
+      </w:r>
+      <w:r>
+        <w:t xml:space="preserve"> fills a blemish you circle (a hot pixel, a satellite remnant, a dust speck) from the sky around it - like PixInsight's CloneStamp, and only where you ask.</w:t>
+      </w:r>
+    </w:p>
+    <w:p>
+      <w:pPr>
+        <w:pStyle w:val="ListParagraph"/>
+        <w:numPr>
+          <w:ilvl w:val="0"/>
+          <w:numId w:val="2"/>
+        </w:numPr>
+        <w:spacing w:after="60"/>
+      </w:pPr>
+      <w:r>
+        <w:rPr>
+          <w:b/>
+          <w:bCs/>
+        </w:rPr>
+        <w:t xml:space="preserve">Star removal</w:t>
+      </w:r>
+      <w:r>
+        <w:t xml:space="preserve"> (StarXTerminator) has to fill in the background behind each star it lifts out; </w:t>
+      </w:r>
+      <w:r>
+        <w:rPr>
+          <w:i/>
+          <w:iCs/>
+        </w:rPr>
+        <w:t xml:space="preserve">Put Stars Back</w:t>
+      </w:r>
+      <w:r>
+        <w:t xml:space="preserve"> covers those places again with your real stars.</w:t>
+      </w:r>
+    </w:p>
+    <w:p>
+      <w:pPr>
+        <w:pStyle w:val="ListParagraph"/>
+        <w:numPr>
+          <w:ilvl w:val="0"/>
+          <w:numId w:val="2"/>
+        </w:numPr>
+        <w:spacing w:after="60"/>
+      </w:pPr>
+      <w:r>
+        <w:rPr>
+          <w:b/>
+          <w:bCs/>
+        </w:rPr>
+        <w:t xml:space="preserve">Mote Buster</w:t>
+      </w:r>
+      <w:r>
+        <w:t xml:space="preserve"> and flats correct dust shadows and vignetting - artefacts of the optics, not of the sky.</w:t>
+      </w:r>
+    </w:p>
+    <w:p>
+      <w:pPr>
         <w:pStyle w:val="Heading1"/>
         <w:pageBreakBefore/>
       </w:pPr>
@@ -23918,7 +24126,7 @@
           <w:sz w:val="19"/>
           <w:szCs w:val="19"/>
         </w:rPr>
-        <w:t xml:space="preserve">Alt-az</w:t>
+        <w:t xml:space="preserve">AI</w:t>
       </w:r>
       <w:r>
         <w:rPr>
@@ -23927,14 +24135,14 @@
         </w:rPr>
         <w:tab/>
       </w:r>
-      <w:hyperlink w:history="1" w:anchor="s_10_5">
+      <w:hyperlink w:history="1" w:anchor="s_1_4">
         <w:r>
           <w:rPr>
             <w:rStyle w:val="Hyperlink"/>
             <w:sz w:val="19"/>
             <w:szCs w:val="19"/>
           </w:rPr>
-          <w:t xml:space="preserve">10.5</w:t>
+          <w:t xml:space="preserve">1.4</w:t>
         </w:r>
       </w:hyperlink>
     </w:p>
@@ -23950,7 +24158,7 @@
           <w:sz w:val="19"/>
           <w:szCs w:val="19"/>
         </w:rPr>
-        <w:t xml:space="preserve">Apply</w:t>
+        <w:t xml:space="preserve">Alt-az</w:t>
       </w:r>
       <w:r>
         <w:rPr>
@@ -23959,14 +24167,14 @@
         </w:rPr>
         <w:tab/>
       </w:r>
-      <w:hyperlink w:history="1" w:anchor="s_9_1">
+      <w:hyperlink w:history="1" w:anchor="s_10_5">
         <w:r>
           <w:rPr>
             <w:rStyle w:val="Hyperlink"/>
             <w:sz w:val="19"/>
             <w:szCs w:val="19"/>
           </w:rPr>
-          <w:t xml:space="preserve">9.1</w:t>
+          <w:t xml:space="preserve">10.5</w:t>
         </w:r>
       </w:hyperlink>
     </w:p>
@@ -23982,7 +24190,7 @@
           <w:sz w:val="19"/>
           <w:szCs w:val="19"/>
         </w:rPr>
-        <w:t xml:space="preserve">Askar D1</w:t>
+        <w:t xml:space="preserve">Apply</w:t>
       </w:r>
       <w:r>
         <w:rPr>
@@ -23991,14 +24199,14 @@
         </w:rPr>
         <w:tab/>
       </w:r>
-      <w:hyperlink w:history="1" w:anchor="s_10_2">
+      <w:hyperlink w:history="1" w:anchor="s_9_1">
         <w:r>
           <w:rPr>
             <w:rStyle w:val="Hyperlink"/>
             <w:sz w:val="19"/>
             <w:szCs w:val="19"/>
           </w:rPr>
-          <w:t xml:space="preserve">10.2</w:t>
+          <w:t xml:space="preserve">9.1</w:t>
         </w:r>
       </w:hyperlink>
     </w:p>
@@ -24014,7 +24222,7 @@
           <w:sz w:val="19"/>
           <w:szCs w:val="19"/>
         </w:rPr>
-        <w:t xml:space="preserve">Askar D2</w:t>
+        <w:t xml:space="preserve">Askar D1</w:t>
       </w:r>
       <w:r>
         <w:rPr>
@@ -24046,7 +24254,7 @@
           <w:sz w:val="19"/>
           <w:szCs w:val="19"/>
         </w:rPr>
-        <w:t xml:space="preserve">ASTAP</w:t>
+        <w:t xml:space="preserve">Askar D2</w:t>
       </w:r>
       <w:r>
         <w:rPr>
@@ -24055,59 +24263,59 @@
         </w:rPr>
         <w:tab/>
       </w:r>
-      <w:hyperlink w:history="1" w:anchor="s_2_2">
+      <w:hyperlink w:history="1" w:anchor="s_10_2">
         <w:r>
           <w:rPr>
             <w:rStyle w:val="Hyperlink"/>
             <w:sz w:val="19"/>
             <w:szCs w:val="19"/>
           </w:rPr>
-          <w:t xml:space="preserve">2.2</w:t>
-        </w:r>
-      </w:hyperlink>
-      <w:r>
-        <w:t xml:space="preserve">, </w:t>
-      </w:r>
-      <w:hyperlink w:history="1" w:anchor="s_4_1">
+          <w:t xml:space="preserve">10.2</w:t>
+        </w:r>
+      </w:hyperlink>
+    </w:p>
+    <w:p>
+      <w:pPr>
+        <w:tabs>
+          <w:tab w:val="right" w:pos="4200" w:leader="dot"/>
+        </w:tabs>
+        <w:spacing w:after="10"/>
+      </w:pPr>
+      <w:r>
+        <w:rPr>
+          <w:sz w:val="19"/>
+          <w:szCs w:val="19"/>
+        </w:rPr>
+        <w:t xml:space="preserve">ASTAP</w:t>
+      </w:r>
+      <w:r>
+        <w:rPr>
+          <w:sz w:val="19"/>
+          <w:szCs w:val="19"/>
+        </w:rPr>
+        <w:tab/>
+      </w:r>
+      <w:hyperlink w:history="1" w:anchor="s_2_2">
         <w:r>
           <w:rPr>
             <w:rStyle w:val="Hyperlink"/>
             <w:sz w:val="19"/>
             <w:szCs w:val="19"/>
           </w:rPr>
-          <w:t xml:space="preserve">4.1</w:t>
-        </w:r>
-      </w:hyperlink>
-    </w:p>
-    <w:p>
-      <w:pPr>
-        <w:tabs>
-          <w:tab w:val="right" w:pos="4200" w:leader="dot"/>
-        </w:tabs>
-        <w:spacing w:after="10"/>
-      </w:pPr>
-      <w:r>
-        <w:rPr>
-          <w:sz w:val="19"/>
-          <w:szCs w:val="19"/>
-        </w:rPr>
-        <w:t xml:space="preserve">AstroBin</w:t>
-      </w:r>
-      <w:r>
-        <w:rPr>
-          <w:sz w:val="19"/>
-          <w:szCs w:val="19"/>
-        </w:rPr>
-        <w:tab/>
-      </w:r>
-      <w:hyperlink w:history="1" w:anchor="s_9_7">
+          <w:t xml:space="preserve">2.2</w:t>
+        </w:r>
+      </w:hyperlink>
+      <w:r>
+        <w:t xml:space="preserve">, </w:t>
+      </w:r>
+      <w:hyperlink w:history="1" w:anchor="s_4_1">
         <w:r>
           <w:rPr>
             <w:rStyle w:val="Hyperlink"/>
             <w:sz w:val="19"/>
             <w:szCs w:val="19"/>
           </w:rPr>
-          <w:t xml:space="preserve">9.7</w:t>
+          <w:t xml:space="preserve">4.1</w:t>
         </w:r>
       </w:hyperlink>
     </w:p>
@@ -24123,7 +24331,7 @@
           <w:sz w:val="19"/>
           <w:szCs w:val="19"/>
         </w:rPr>
-        <w:t xml:space="preserve">Auto-crop</w:t>
+        <w:t xml:space="preserve">AstroBin</w:t>
       </w:r>
       <w:r>
         <w:rPr>
@@ -24132,14 +24340,14 @@
         </w:rPr>
         <w:tab/>
       </w:r>
-      <w:hyperlink w:history="1" w:anchor="s_8_2">
+      <w:hyperlink w:history="1" w:anchor="s_9_7">
         <w:r>
           <w:rPr>
             <w:rStyle w:val="Hyperlink"/>
             <w:sz w:val="19"/>
             <w:szCs w:val="19"/>
           </w:rPr>
-          <w:t xml:space="preserve">8.2</w:t>
+          <w:t xml:space="preserve">9.7</w:t>
         </w:r>
       </w:hyperlink>
     </w:p>
@@ -24155,7 +24363,7 @@
           <w:sz w:val="19"/>
           <w:szCs w:val="19"/>
         </w:rPr>
-        <w:t xml:space="preserve">Auto-cull</w:t>
+        <w:t xml:space="preserve">Auto-crop</w:t>
       </w:r>
       <w:r>
         <w:rPr>
@@ -24164,14 +24372,14 @@
         </w:rPr>
         <w:tab/>
       </w:r>
-      <w:hyperlink w:history="1" w:anchor="s_6_3">
+      <w:hyperlink w:history="1" w:anchor="s_8_2">
         <w:r>
           <w:rPr>
             <w:rStyle w:val="Hyperlink"/>
             <w:sz w:val="19"/>
             <w:szCs w:val="19"/>
           </w:rPr>
-          <w:t xml:space="preserve">6.3</w:t>
+          <w:t xml:space="preserve">8.2</w:t>
         </w:r>
       </w:hyperlink>
     </w:p>
@@ -24187,7 +24395,7 @@
           <w:sz w:val="19"/>
           <w:szCs w:val="19"/>
         </w:rPr>
-        <w:t xml:space="preserve">Auto-Flag</w:t>
+        <w:t xml:space="preserve">Auto-cull</w:t>
       </w:r>
       <w:r>
         <w:rPr>
@@ -24209,6 +24417,38 @@
     </w:p>
     <w:p>
       <w:pPr>
+        <w:tabs>
+          <w:tab w:val="right" w:pos="4200" w:leader="dot"/>
+        </w:tabs>
+        <w:spacing w:after="10"/>
+      </w:pPr>
+      <w:r>
+        <w:rPr>
+          <w:sz w:val="19"/>
+          <w:szCs w:val="19"/>
+        </w:rPr>
+        <w:t xml:space="preserve">Auto-Flag</w:t>
+      </w:r>
+      <w:r>
+        <w:rPr>
+          <w:sz w:val="19"/>
+          <w:szCs w:val="19"/>
+        </w:rPr>
+        <w:tab/>
+      </w:r>
+      <w:hyperlink w:history="1" w:anchor="s_6_3">
+        <w:r>
+          <w:rPr>
+            <w:rStyle w:val="Hyperlink"/>
+            <w:sz w:val="19"/>
+            <w:szCs w:val="19"/>
+          </w:rPr>
+          <w:t xml:space="preserve">6.3</w:t>
+        </w:r>
+      </w:hyperlink>
+    </w:p>
+    <w:p>
+      <w:pPr>
         <w:keepNext/>
         <w:spacing w:after="40" w:before="160"/>
       </w:pPr>
@@ -27514,7 +27754,7 @@
           <w:sz w:val="19"/>
           <w:szCs w:val="19"/>
         </w:rPr>
-        <w:t xml:space="preserve">HOO</w:t>
+        <w:t xml:space="preserve">Honest processing</w:t>
       </w:r>
       <w:r>
         <w:rPr>
@@ -27523,14 +27763,14 @@
         </w:rPr>
         <w:tab/>
       </w:r>
-      <w:hyperlink w:history="1" w:anchor="s_15_3">
+      <w:hyperlink w:history="1" w:anchor="s_1_4">
         <w:r>
           <w:rPr>
             <w:rStyle w:val="Hyperlink"/>
             <w:sz w:val="19"/>
             <w:szCs w:val="19"/>
           </w:rPr>
-          <w:t xml:space="preserve">15.3</w:t>
+          <w:t xml:space="preserve">1.4</w:t>
         </w:r>
       </w:hyperlink>
     </w:p>
@@ -27546,7 +27786,7 @@
           <w:sz w:val="19"/>
           <w:szCs w:val="19"/>
         </w:rPr>
-        <w:t xml:space="preserve">Hubble palette</w:t>
+        <w:t xml:space="preserve">HOO</w:t>
       </w:r>
       <w:r>
         <w:rPr>
@@ -27555,13 +27795,45 @@
         </w:rPr>
         <w:tab/>
       </w:r>
-      <w:hyperlink w:history="1" w:anchor="s_10_4">
+      <w:hyperlink w:history="1" w:anchor="s_15_3">
         <w:r>
           <w:rPr>
             <w:rStyle w:val="Hyperlink"/>
             <w:sz w:val="19"/>
             <w:szCs w:val="19"/>
           </w:rPr>
+          <w:t xml:space="preserve">15.3</w:t>
+        </w:r>
+      </w:hyperlink>
+    </w:p>
+    <w:p>
+      <w:pPr>
+        <w:tabs>
+          <w:tab w:val="right" w:pos="4200" w:leader="dot"/>
+        </w:tabs>
+        <w:spacing w:after="10"/>
+      </w:pPr>
+      <w:r>
+        <w:rPr>
+          <w:sz w:val="19"/>
+          <w:szCs w:val="19"/>
+        </w:rPr>
+        <w:t xml:space="preserve">Hubble palette</w:t>
+      </w:r>
+      <w:r>
+        <w:rPr>
+          <w:sz w:val="19"/>
+          <w:szCs w:val="19"/>
+        </w:rPr>
+        <w:tab/>
+      </w:r>
+      <w:hyperlink w:history="1" w:anchor="s_10_4">
+        <w:r>
+          <w:rPr>
+            <w:rStyle w:val="Hyperlink"/>
+            <w:sz w:val="19"/>
+            <w:szCs w:val="19"/>
+          </w:rPr>
           <w:t xml:space="preserve">10.4</w:t>
         </w:r>
       </w:hyperlink>
@@ -29412,7 +29684,7 @@
           <w:sz w:val="19"/>
           <w:szCs w:val="19"/>
         </w:rPr>
-        <w:t xml:space="preserve">Pick the one you like</w:t>
+        <w:t xml:space="preserve">Painting</w:t>
       </w:r>
       <w:r>
         <w:rPr>
@@ -29421,14 +29693,14 @@
         </w:rPr>
         <w:tab/>
       </w:r>
-      <w:hyperlink w:history="1" w:anchor="s_9_1">
+      <w:hyperlink w:history="1" w:anchor="s_1_4">
         <w:r>
           <w:rPr>
             <w:rStyle w:val="Hyperlink"/>
             <w:sz w:val="19"/>
             <w:szCs w:val="19"/>
           </w:rPr>
-          <w:t xml:space="preserve">9.1</w:t>
+          <w:t xml:space="preserve">1.4</w:t>
         </w:r>
       </w:hyperlink>
     </w:p>
@@ -29444,7 +29716,7 @@
           <w:sz w:val="19"/>
           <w:szCs w:val="19"/>
         </w:rPr>
-        <w:t xml:space="preserve">PixInsight</w:t>
+        <w:t xml:space="preserve">Pick the one you like</w:t>
       </w:r>
       <w:r>
         <w:rPr>
@@ -29453,14 +29725,14 @@
         </w:rPr>
         <w:tab/>
       </w:r>
-      <w:hyperlink w:history="1" w:anchor="s_2_2">
+      <w:hyperlink w:history="1" w:anchor="s_9_1">
         <w:r>
           <w:rPr>
             <w:rStyle w:val="Hyperlink"/>
             <w:sz w:val="19"/>
             <w:szCs w:val="19"/>
           </w:rPr>
-          <w:t xml:space="preserve">2.2</w:t>
+          <w:t xml:space="preserve">9.1</w:t>
         </w:r>
       </w:hyperlink>
     </w:p>
@@ -29476,7 +29748,7 @@
           <w:sz w:val="19"/>
           <w:szCs w:val="19"/>
         </w:rPr>
-        <w:t xml:space="preserve">PixInsight hand-over</w:t>
+        <w:t xml:space="preserve">PixInsight</w:t>
       </w:r>
       <w:r>
         <w:rPr>
@@ -29485,14 +29757,14 @@
         </w:rPr>
         <w:tab/>
       </w:r>
-      <w:hyperlink w:history="1" w:anchor="s_5_4">
+      <w:hyperlink w:history="1" w:anchor="s_2_2">
         <w:r>
           <w:rPr>
             <w:rStyle w:val="Hyperlink"/>
             <w:sz w:val="19"/>
             <w:szCs w:val="19"/>
           </w:rPr>
-          <w:t xml:space="preserve">5.4</w:t>
+          <w:t xml:space="preserve">2.2</w:t>
         </w:r>
       </w:hyperlink>
     </w:p>
@@ -29508,7 +29780,7 @@
           <w:sz w:val="19"/>
           <w:szCs w:val="19"/>
         </w:rPr>
-        <w:t xml:space="preserve">Planetary imaging</w:t>
+        <w:t xml:space="preserve">PixInsight hand-over</w:t>
       </w:r>
       <w:r>
         <w:rPr>
@@ -29517,14 +29789,14 @@
         </w:rPr>
         <w:tab/>
       </w:r>
-      <w:hyperlink w:history="1" w:anchor="s_15_8">
+      <w:hyperlink w:history="1" w:anchor="s_5_4">
         <w:r>
           <w:rPr>
             <w:rStyle w:val="Hyperlink"/>
             <w:sz w:val="19"/>
             <w:szCs w:val="19"/>
           </w:rPr>
-          <w:t xml:space="preserve">15.8</w:t>
+          <w:t xml:space="preserve">5.4</w:t>
         </w:r>
       </w:hyperlink>
     </w:p>
@@ -29540,7 +29812,7 @@
           <w:sz w:val="19"/>
           <w:szCs w:val="19"/>
         </w:rPr>
-        <w:t xml:space="preserve">Planetary nebula</w:t>
+        <w:t xml:space="preserve">Planetary imaging</w:t>
       </w:r>
       <w:r>
         <w:rPr>
@@ -29549,14 +29821,14 @@
         </w:rPr>
         <w:tab/>
       </w:r>
-      <w:hyperlink w:history="1" w:anchor="s_10_7">
+      <w:hyperlink w:history="1" w:anchor="s_15_8">
         <w:r>
           <w:rPr>
             <w:rStyle w:val="Hyperlink"/>
             <w:sz w:val="19"/>
             <w:szCs w:val="19"/>
           </w:rPr>
-          <w:t xml:space="preserve">10.7</w:t>
+          <w:t xml:space="preserve">15.8</w:t>
         </w:r>
       </w:hyperlink>
     </w:p>
@@ -29572,7 +29844,7 @@
           <w:sz w:val="19"/>
           <w:szCs w:val="19"/>
         </w:rPr>
-        <w:t xml:space="preserve">Planetary nebula processing</w:t>
+        <w:t xml:space="preserve">Planetary nebula</w:t>
       </w:r>
       <w:r>
         <w:rPr>
@@ -29581,14 +29853,14 @@
         </w:rPr>
         <w:tab/>
       </w:r>
-      <w:hyperlink w:history="1" w:anchor="s_15_4">
+      <w:hyperlink w:history="1" w:anchor="s_10_7">
         <w:r>
           <w:rPr>
             <w:rStyle w:val="Hyperlink"/>
             <w:sz w:val="19"/>
             <w:szCs w:val="19"/>
           </w:rPr>
-          <w:t xml:space="preserve">15.4</w:t>
+          <w:t xml:space="preserve">10.7</w:t>
         </w:r>
       </w:hyperlink>
     </w:p>
@@ -29604,7 +29876,7 @@
           <w:sz w:val="19"/>
           <w:szCs w:val="19"/>
         </w:rPr>
-        <w:t xml:space="preserve">Planetary nebulae</w:t>
+        <w:t xml:space="preserve">Planetary nebula processing</w:t>
       </w:r>
       <w:r>
         <w:rPr>
@@ -29636,7 +29908,7 @@
           <w:sz w:val="19"/>
           <w:szCs w:val="19"/>
         </w:rPr>
-        <w:t xml:space="preserve">Plate solve</w:t>
+        <w:t xml:space="preserve">Planetary nebulae</w:t>
       </w:r>
       <w:r>
         <w:rPr>
@@ -29645,14 +29917,14 @@
         </w:rPr>
         <w:tab/>
       </w:r>
-      <w:hyperlink w:history="1" w:anchor="s_8_3">
+      <w:hyperlink w:history="1" w:anchor="s_15_4">
         <w:r>
           <w:rPr>
             <w:rStyle w:val="Hyperlink"/>
             <w:sz w:val="19"/>
             <w:szCs w:val="19"/>
           </w:rPr>
-          <w:t xml:space="preserve">8.3</w:t>
+          <w:t xml:space="preserve">15.4</w:t>
         </w:r>
       </w:hyperlink>
     </w:p>
@@ -29668,7 +29940,7 @@
           <w:sz w:val="19"/>
           <w:szCs w:val="19"/>
         </w:rPr>
-        <w:t xml:space="preserve">Plate solving</w:t>
+        <w:t xml:space="preserve">Plate solve</w:t>
       </w:r>
       <w:r>
         <w:rPr>
@@ -29677,14 +29949,14 @@
         </w:rPr>
         <w:tab/>
       </w:r>
-      <w:hyperlink w:history="1" w:anchor="s_1_3">
+      <w:hyperlink w:history="1" w:anchor="s_8_3">
         <w:r>
           <w:rPr>
             <w:rStyle w:val="Hyperlink"/>
             <w:sz w:val="19"/>
             <w:szCs w:val="19"/>
           </w:rPr>
-          <w:t xml:space="preserve">1.3</w:t>
+          <w:t xml:space="preserve">8.3</w:t>
         </w:r>
       </w:hyperlink>
     </w:p>
@@ -29700,7 +29972,7 @@
           <w:sz w:val="19"/>
           <w:szCs w:val="19"/>
         </w:rPr>
-        <w:t xml:space="preserve">Prepared folder</w:t>
+        <w:t xml:space="preserve">Plate solving</w:t>
       </w:r>
       <w:r>
         <w:rPr>
@@ -29709,14 +29981,14 @@
         </w:rPr>
         <w:tab/>
       </w:r>
-      <w:hyperlink w:history="1" w:anchor="s_13_1">
+      <w:hyperlink w:history="1" w:anchor="s_1_3">
         <w:r>
           <w:rPr>
             <w:rStyle w:val="Hyperlink"/>
             <w:sz w:val="19"/>
             <w:szCs w:val="19"/>
           </w:rPr>
-          <w:t xml:space="preserve">13.1</w:t>
+          <w:t xml:space="preserve">1.3</w:t>
         </w:r>
       </w:hyperlink>
     </w:p>
@@ -29732,7 +30004,7 @@
           <w:sz w:val="19"/>
           <w:szCs w:val="19"/>
         </w:rPr>
-        <w:t xml:space="preserve">Preview palette</w:t>
+        <w:t xml:space="preserve">Prepared folder</w:t>
       </w:r>
       <w:r>
         <w:rPr>
@@ -29741,14 +30013,14 @@
         </w:rPr>
         <w:tab/>
       </w:r>
-      <w:hyperlink w:history="1" w:anchor="s_8_6">
+      <w:hyperlink w:history="1" w:anchor="s_13_1">
         <w:r>
           <w:rPr>
             <w:rStyle w:val="Hyperlink"/>
             <w:sz w:val="19"/>
             <w:szCs w:val="19"/>
           </w:rPr>
-          <w:t xml:space="preserve">8.6</w:t>
+          <w:t xml:space="preserve">13.1</w:t>
         </w:r>
       </w:hyperlink>
     </w:p>
@@ -29764,7 +30036,7 @@
           <w:sz w:val="19"/>
           <w:szCs w:val="19"/>
         </w:rPr>
-        <w:t xml:space="preserve">Privacy</w:t>
+        <w:t xml:space="preserve">Preview palette</w:t>
       </w:r>
       <w:r>
         <w:rPr>
@@ -29773,14 +30045,14 @@
         </w:rPr>
         <w:tab/>
       </w:r>
-      <w:hyperlink w:history="1" w:anchor="s_14_1">
+      <w:hyperlink w:history="1" w:anchor="s_8_6">
         <w:r>
           <w:rPr>
             <w:rStyle w:val="Hyperlink"/>
             <w:sz w:val="19"/>
             <w:szCs w:val="19"/>
           </w:rPr>
-          <w:t xml:space="preserve">14.1</w:t>
+          <w:t xml:space="preserve">8.6</w:t>
         </w:r>
       </w:hyperlink>
     </w:p>
@@ -29796,7 +30068,7 @@
           <w:sz w:val="19"/>
           <w:szCs w:val="19"/>
         </w:rPr>
-        <w:t xml:space="preserve">Processing tips</w:t>
+        <w:t xml:space="preserve">Privacy</w:t>
       </w:r>
       <w:r>
         <w:rPr>
@@ -29805,14 +30077,14 @@
         </w:rPr>
         <w:tab/>
       </w:r>
-      <w:hyperlink w:history="1" w:anchor="s_15_1">
+      <w:hyperlink w:history="1" w:anchor="s_14_1">
         <w:r>
           <w:rPr>
             <w:rStyle w:val="Hyperlink"/>
             <w:sz w:val="19"/>
             <w:szCs w:val="19"/>
           </w:rPr>
-          <w:t xml:space="preserve">15.1</w:t>
+          <w:t xml:space="preserve">14.1</w:t>
         </w:r>
       </w:hyperlink>
     </w:p>
@@ -29828,7 +30100,7 @@
           <w:sz w:val="19"/>
           <w:szCs w:val="19"/>
         </w:rPr>
-        <w:t xml:space="preserve">Progress bar</w:t>
+        <w:t xml:space="preserve">Processing tips</w:t>
       </w:r>
       <w:r>
         <w:rPr>
@@ -29837,14 +30109,14 @@
         </w:rPr>
         <w:tab/>
       </w:r>
-      <w:hyperlink w:history="1" w:anchor="s_5_2">
+      <w:hyperlink w:history="1" w:anchor="s_15_1">
         <w:r>
           <w:rPr>
             <w:rStyle w:val="Hyperlink"/>
             <w:sz w:val="19"/>
             <w:szCs w:val="19"/>
           </w:rPr>
-          <w:t xml:space="preserve">5.2</w:t>
+          <w:t xml:space="preserve">15.1</w:t>
         </w:r>
       </w:hyperlink>
     </w:p>
@@ -29860,7 +30132,7 @@
           <w:sz w:val="19"/>
           <w:szCs w:val="19"/>
         </w:rPr>
-        <w:t xml:space="preserve">Put Stars Back</w:t>
+        <w:t xml:space="preserve">Progress bar</w:t>
       </w:r>
       <w:r>
         <w:rPr>
@@ -29869,13 +30141,45 @@
         </w:rPr>
         <w:tab/>
       </w:r>
-      <w:hyperlink w:history="1" w:anchor="s_9_3">
+      <w:hyperlink w:history="1" w:anchor="s_5_2">
         <w:r>
           <w:rPr>
             <w:rStyle w:val="Hyperlink"/>
             <w:sz w:val="19"/>
             <w:szCs w:val="19"/>
           </w:rPr>
+          <w:t xml:space="preserve">5.2</w:t>
+        </w:r>
+      </w:hyperlink>
+    </w:p>
+    <w:p>
+      <w:pPr>
+        <w:tabs>
+          <w:tab w:val="right" w:pos="4200" w:leader="dot"/>
+        </w:tabs>
+        <w:spacing w:after="10"/>
+      </w:pPr>
+      <w:r>
+        <w:rPr>
+          <w:sz w:val="19"/>
+          <w:szCs w:val="19"/>
+        </w:rPr>
+        <w:t xml:space="preserve">Put Stars Back</w:t>
+      </w:r>
+      <w:r>
+        <w:rPr>
+          <w:sz w:val="19"/>
+          <w:szCs w:val="19"/>
+        </w:rPr>
+        <w:tab/>
+      </w:r>
+      <w:hyperlink w:history="1" w:anchor="s_9_3">
+        <w:r>
+          <w:rPr>
+            <w:rStyle w:val="Hyperlink"/>
+            <w:sz w:val="19"/>
+            <w:szCs w:val="19"/>
+          </w:rPr>
           <w:t xml:space="preserve">9.3</w:t>
         </w:r>
       </w:hyperlink>
@@ -30018,6 +30322,38 @@
             <w:szCs w:val="19"/>
           </w:rPr>
           <w:t xml:space="preserve">4.1</w:t>
+        </w:r>
+      </w:hyperlink>
+    </w:p>
+    <w:p>
+      <w:pPr>
+        <w:tabs>
+          <w:tab w:val="right" w:pos="4200" w:leader="dot"/>
+        </w:tabs>
+        <w:spacing w:after="10"/>
+      </w:pPr>
+      <w:r>
+        <w:rPr>
+          <w:sz w:val="19"/>
+          <w:szCs w:val="19"/>
+        </w:rPr>
+        <w:t xml:space="preserve">Real data</w:t>
+      </w:r>
+      <w:r>
+        <w:rPr>
+          <w:sz w:val="19"/>
+          <w:szCs w:val="19"/>
+        </w:rPr>
+        <w:tab/>
+      </w:r>
+      <w:hyperlink w:history="1" w:anchor="s_1_4">
+        <w:r>
+          <w:rPr>
+            <w:rStyle w:val="Hyperlink"/>
+            <w:sz w:val="19"/>
+            <w:szCs w:val="19"/>
+          </w:rPr>
+          <w:t xml:space="preserve">1.4</w:t>
         </w:r>
       </w:hyperlink>
     </w:p>

</xml_diff>

<commit_message>
Manual 15.4: worked example - the M57 recipe that works
Co-Authored-By: Claude Opus 5.5 <noreply@anthropic.com>
Claude-Session: https://claude.ai/code/session_01FKvd69QsnCvM2zbzYnPwmF
</commit_message>
<xml_diff>
--- a/docs/SubZeroAstro_User_Manual.docx
+++ b/docs/SubZeroAstro_User_Manual.docx
@@ -121,7 +121,7 @@
           <w:sz w:val="22"/>
           <w:szCs w:val="22"/>
         </w:rPr>
-        <w:t xml:space="preserve">Version 0.9.77 beta  ·  Windows and Mac (Apple silicon)</w:t>
+        <w:t xml:space="preserve">Version 0.9.78 beta  ·  Windows and Mac (Apple silicon)</w:t>
       </w:r>
     </w:p>
     <w:p>
@@ -22433,6 +22433,137 @@
       </w:r>
       <w:r>
         <w:t xml:space="preserve"> shorter subs (60-120 s) keep the brightest part from burning out in the masters; collect plenty of them.</w:t>
+      </w:r>
+    </w:p>
+    <w:p>
+      <w:pPr>
+        <w:pBdr>
+          <w:left w:val="single" w:color="2F6FD6" w:sz="18" w:space="8"/>
+        </w:pBdr>
+        <w:shd w:fill="EAF1FB" w:color="auto" w:val="clear"/>
+        <w:spacing w:after="160" w:before="120"/>
+        <w:ind w:left="200" w:right="200"/>
+      </w:pPr>
+      <w:r>
+        <w:rPr>
+          <w:b/>
+          <w:bCs/>
+          <w:color w:val="2F6FD6"/>
+        </w:rPr>
+        <w:t xml:space="preserve">Worked example:  </w:t>
+      </w:r>
+      <w:r>
+        <w:t xml:space="preserve">A recipe that works for M57 (colour camera + L-Ultimate, 3.6 h): </w:t>
+      </w:r>
+      <w:r>
+        <w:rPr>
+          <w:i/>
+          <w:iCs/>
+        </w:rPr>
+        <w:t xml:space="preserve">HOO</w:t>
+      </w:r>
+      <w:r>
+        <w:t xml:space="preserve"> palette · </w:t>
+      </w:r>
+      <w:r>
+        <w:rPr>
+          <w:i/>
+          <w:iCs/>
+        </w:rPr>
+        <w:t xml:space="preserve">Take Stars Out</w:t>
+      </w:r>
+      <w:r>
+        <w:t xml:space="preserve"> · </w:t>
+      </w:r>
+      <w:r>
+        <w:rPr>
+          <w:i/>
+          <w:iCs/>
+        </w:rPr>
+        <w:t xml:space="preserve">Brighten the Image: Gentle</w:t>
+      </w:r>
+      <w:r>
+        <w:t xml:space="preserve"> (Colour-preserving) · skip </w:t>
+      </w:r>
+      <w:r>
+        <w:rPr>
+          <w:i/>
+          <w:iCs/>
+        </w:rPr>
+        <w:t xml:space="preserve">Remove Green Cast</w:t>
+      </w:r>
+      <w:r>
+        <w:t xml:space="preserve"> · </w:t>
+      </w:r>
+      <w:r>
+        <w:rPr>
+          <w:i/>
+          <w:iCs/>
+        </w:rPr>
+        <w:t xml:space="preserve">Curves: Lift faint detail</w:t>
+      </w:r>
+      <w:r>
+        <w:t xml:space="preserve"> · </w:t>
+      </w:r>
+      <w:r>
+        <w:rPr>
+          <w:i/>
+          <w:iCs/>
+        </w:rPr>
+        <w:t xml:space="preserve">Tame Bright Core: Medium</w:t>
+      </w:r>
+      <w:r>
+        <w:t xml:space="preserve"> · </w:t>
+      </w:r>
+      <w:r>
+        <w:rPr>
+          <w:i/>
+          <w:iCs/>
+        </w:rPr>
+        <w:t xml:space="preserve">Saturation: Vivid</w:t>
+      </w:r>
+      <w:r>
+        <w:t xml:space="preserve"> · </w:t>
+      </w:r>
+      <w:r>
+        <w:rPr>
+          <w:i/>
+          <w:iCs/>
+        </w:rPr>
+        <w:t xml:space="preserve">Adjust Colours: Blues and reds</w:t>
+      </w:r>
+      <w:r>
+        <w:t xml:space="preserve"> with Blues about 1.3, Reds 0.85 and </w:t>
+      </w:r>
+      <w:r>
+        <w:rPr>
+          <w:i/>
+          <w:iCs/>
+        </w:rPr>
+        <w:t xml:space="preserve">Smooth colour transitions</w:t>
+      </w:r>
+      <w:r>
+        <w:t xml:space="preserve"> 0.6-1.0 · the star steps · </w:t>
+      </w:r>
+      <w:r>
+        <w:rPr>
+          <w:i/>
+          <w:iCs/>
+        </w:rPr>
+        <w:t xml:space="preserve">Put Stars Back</w:t>
+      </w:r>
+      <w:r>
+        <w:t xml:space="preserve"> · a tight </w:t>
+      </w:r>
+      <w:r>
+        <w:rPr>
+          <w:i/>
+          <w:iCs/>
+        </w:rPr>
+        <w:t xml:space="preserve">Final Crop</w:t>
+      </w:r>
+      <w:r>
+        <w:t xml:space="preserve">. The result: a blue centre, a gold-to-red ring and the faint outer halo.</w:t>
       </w:r>
     </w:p>
     <w:p>

</xml_diff>

<commit_message>
v0.9.79 beta: two dual-band filters (Askar D1 + D2) - cleaner OIII for SHO
* OIII from both filters: the Ha (D1) / SII (D2) that the green and blue pixels also
  catch is measured from the data (both filters see the same OIII) and taken out; the
  two OIII estimates are put on one scale and combined noise-weighted (was: a plain
  average). Fitted on smoothed copies so noise does not bias it; falls back to the
  average when unclear. The page 4 log reports the numbers.
* Filter names spelling out two lines ('D1 Ha/OIII', 'SII-OIII', 'Ha/OIII') are
  recognised as dual-band filters. Self-test and manual.

Co-Authored-By: Claude Opus 5.5 <noreply@anthropic.com>
Claude-Session: https://claude.ai/code/session_01FKvd69QsnCvM2zbzYnPwmF
</commit_message>
<xml_diff>
--- a/docs/SubZeroAstro_User_Manual.docx
+++ b/docs/SubZeroAstro_User_Manual.docx
@@ -121,7 +121,7 @@
           <w:sz w:val="22"/>
           <w:szCs w:val="22"/>
         </w:rPr>
-        <w:t xml:space="preserve">Version 0.9.78 beta  ·  Windows and Mac (Apple silicon)</w:t>
+        <w:t xml:space="preserve">Version 0.9.79 beta  ·  Windows and Mac (Apple silicon)</w:t>
       </w:r>
     </w:p>
     <w:p>
@@ -17456,7 +17456,97 @@
         <w:t xml:space="preserve">SHO</w:t>
       </w:r>
       <w:r>
-        <w:t xml:space="preserve"> set automatically.</w:t>
+        <w:t xml:space="preserve"> set automatically: the red pixels of the first give </w:t>
+      </w:r>
+      <w:r>
+        <w:rPr>
+          <w:b/>
+          <w:bCs/>
+        </w:rPr>
+        <w:t xml:space="preserve">Ha</w:t>
+      </w:r>
+      <w:r>
+        <w:t xml:space="preserve">, those of the second </w:t>
+      </w:r>
+      <w:r>
+        <w:rPr>
+          <w:b/>
+          <w:bCs/>
+        </w:rPr>
+        <w:t xml:space="preserve">SII</w:t>
+      </w:r>
+      <w:r>
+        <w:t xml:space="preserve">, and the green and blue pixels of both give </w:t>
+      </w:r>
+      <w:r>
+        <w:rPr>
+          <w:b/>
+          <w:bCs/>
+        </w:rPr>
+        <w:t xml:space="preserve">OIII</w:t>
+      </w:r>
+      <w:r>
+        <w:t xml:space="preserve">. Those pixels also catch a little of the red line, so each OIII estimate carries some Ha or SII; because both filters see the same OIII, SubZeroAstro measures that leakage from your data, takes it out, and combines the two OIII estimates weighted by how clean each one is (the page 4 log shows the numbers). </w:t>
+      </w:r>
+      <w:r>
+        <w:rPr>
+          <w:i/>
+          <w:iCs/>
+        </w:rPr>
+        <w:t xml:space="preserve">Combine Colour Channels</w:t>
+      </w:r>
+      <w:r>
+        <w:t xml:space="preserve"> then offers the narrowband palettes - </w:t>
+      </w:r>
+      <w:r>
+        <w:rPr>
+          <w:b/>
+          <w:bCs/>
+        </w:rPr>
+        <w:t xml:space="preserve">Hubble (SHO)</w:t>
+      </w:r>
+      <w:r>
+        <w:t xml:space="preserve">, HSO, HOO + SII … - exactly as for a mono SHO set. Filter names such as </w:t>
+      </w:r>
+      <w:r>
+        <w:rPr>
+          <w:i/>
+          <w:iCs/>
+        </w:rPr>
+        <w:t xml:space="preserve">D1</w:t>
+      </w:r>
+      <w:r>
+        <w:t xml:space="preserve">, </w:t>
+      </w:r>
+      <w:r>
+        <w:rPr>
+          <w:i/>
+          <w:iCs/>
+        </w:rPr>
+        <w:t xml:space="preserve">Askar D2</w:t>
+      </w:r>
+      <w:r>
+        <w:t xml:space="preserve">, </w:t>
+      </w:r>
+      <w:r>
+        <w:rPr>
+          <w:i/>
+          <w:iCs/>
+        </w:rPr>
+        <w:t xml:space="preserve">Ha/OIII</w:t>
+      </w:r>
+      <w:r>
+        <w:t xml:space="preserve"> or </w:t>
+      </w:r>
+      <w:r>
+        <w:rPr>
+          <w:i/>
+          <w:iCs/>
+        </w:rPr>
+        <w:t xml:space="preserve">SII-OIII</w:t>
+      </w:r>
+      <w:r>
+        <w:t xml:space="preserve"> are all recognised.</w:t>
       </w:r>
     </w:p>
     <w:p>

</xml_diff>

<commit_message>
0.9.80 beta: D1+D2 OIII leak fit uses one shared fraction (stable when OIII follows Ha)
Co-Authored-By: Claude Opus 5.5 <noreply@anthropic.com>
Claude-Session: https://claude.ai/code/session_01FKvd69QsnCvM2zbzYnPwmF
</commit_message>
<xml_diff>
--- a/docs/SubZeroAstro_User_Manual.docx
+++ b/docs/SubZeroAstro_User_Manual.docx
@@ -121,7 +121,7 @@
           <w:sz w:val="22"/>
           <w:szCs w:val="22"/>
         </w:rPr>
-        <w:t xml:space="preserve">Version 0.9.79 beta  ·  Windows and Mac (Apple silicon)</w:t>
+        <w:t xml:space="preserve">Version 0.9.80 beta  ·  Windows and Mac (Apple silicon)</w:t>
       </w:r>
     </w:p>
     <w:p>
@@ -17486,7 +17486,7 @@
         <w:t xml:space="preserve">OIII</w:t>
       </w:r>
       <w:r>
-        <w:t xml:space="preserve">. Those pixels also catch a little of the red line, so each OIII estimate carries some Ha or SII; because both filters see the same OIII, SubZeroAstro measures that leakage from your data, takes it out, and combines the two OIII estimates weighted by how clean each one is (the page 4 log shows the numbers). </w:t>
+        <w:t xml:space="preserve">. Those pixels also catch a little of the red line, so each OIII estimate carries some Ha or SII; because both filters see the same OIII, SubZeroAstro measures that leakage from your data (one fraction for both lines, so OIII that follows the Ha - as in IC 1396 - is not mistaken for leakage), takes it out, and combines the two OIII estimates weighted by how clean each one is (the page 4 log shows the numbers). </w:t>
       </w:r>
       <w:r>
         <w:rPr>

</xml_diff>

<commit_message>
0.9.82 beta: D1+D2 OIII weighted by exposure (20-80% guard) instead of post-NXT pixel noise
Co-Authored-By: Claude Opus 5.5 <noreply@anthropic.com>
Claude-Session: https://claude.ai/code/session_01FKvd69QsnCvM2zbzYnPwmF
</commit_message>
<xml_diff>
--- a/docs/SubZeroAstro_User_Manual.docx
+++ b/docs/SubZeroAstro_User_Manual.docx
@@ -121,7 +121,7 @@
           <w:sz w:val="22"/>
           <w:szCs w:val="22"/>
         </w:rPr>
-        <w:t xml:space="preserve">Version 0.9.81 beta  ·  Windows and Mac (Apple silicon)</w:t>
+        <w:t xml:space="preserve">Version 0.9.82 beta  ·  Windows and Mac (Apple silicon)</w:t>
       </w:r>
     </w:p>
     <w:p>
@@ -17486,7 +17486,7 @@
         <w:t xml:space="preserve">OIII</w:t>
       </w:r>
       <w:r>
-        <w:t xml:space="preserve">. Those pixels also catch a little of the red line, so each OIII estimate carries some Ha or SII; because both filters see the same OIII, SubZeroAstro measures that leakage from your data (one fraction for both lines, so OIII that follows the Ha - as in IC 1396 - is not mistaken for leakage), takes it out, and combines the two OIII estimates weighted by how clean each one is (the page 4 log shows the numbers). </w:t>
+        <w:t xml:space="preserve">. Those pixels also catch a little of the red line, so each OIII estimate carries some Ha or SII; because both filters see the same OIII, SubZeroAstro measures that leakage from your data (one fraction for both lines, so OIII that follows the Ha - as in IC 1396 - is not mistaken for leakage), takes it out, and combines the two OIII estimates weighted by each filter's exposure time (never less than 20% for either, since both hold real OIII) (the page 4 log shows the numbers). </w:t>
       </w:r>
       <w:r>
         <w:rPr>

</xml_diff>

<commit_message>
0.9.83 beta: Remove Green Cast turns SHO/HHO green (Ha) gold instead of deleting it
Co-Authored-By: Claude Opus 5.5 <noreply@anthropic.com>
Claude-Session: https://claude.ai/code/session_01FKvd69QsnCvM2zbzYnPwmF
</commit_message>
<xml_diff>
--- a/docs/SubZeroAstro_User_Manual.docx
+++ b/docs/SubZeroAstro_User_Manual.docx
@@ -121,7 +121,7 @@
           <w:sz w:val="22"/>
           <w:szCs w:val="22"/>
         </w:rPr>
-        <w:t xml:space="preserve">Version 0.9.82 beta  ·  Windows and Mac (Apple silicon)</w:t>
+        <w:t xml:space="preserve">Version 0.9.83 beta  ·  Windows and Mac (Apple silicon)</w:t>
       </w:r>
     </w:p>
     <w:p>
@@ -17747,7 +17747,27 @@
         <w:t xml:space="preserve">Combine Colour Channels</w:t>
       </w:r>
       <w:r>
-        <w:t xml:space="preserve"> › Hubble (SHO), Foraxx or HOO; then Remove Green Cast (turns the green gold), and </w:t>
+        <w:t xml:space="preserve"> › Hubble (SHO), Foraxx or HOO; then Remove Green Cast - for Hubble (SHO) and Gold &amp; blue it offers </w:t>
+      </w:r>
+      <w:r>
+        <w:rPr>
+          <w:b/>
+          <w:bCs/>
+        </w:rPr>
+        <w:t xml:space="preserve">Gold 50 / 75 / 100%</w:t>
+      </w:r>
+      <w:r>
+        <w:t xml:space="preserve">, which turn the green (your Ha, the strongest signal) gold instead of deleting it, so the bright structure keeps its brightness; </w:t>
+      </w:r>
+      <w:r>
+        <w:rPr>
+          <w:i/>
+          <w:iCs/>
+        </w:rPr>
+        <w:t xml:space="preserve">Remove only</w:t>
+      </w:r>
+      <w:r>
+        <w:t xml:space="preserve"> is plain SCNR (darker, bluer, more magenta) - and </w:t>
       </w:r>
       <w:r>
         <w:rPr>

</xml_diff>

<commit_message>
0.9.85 beta: Process Existing Masters from page 1; folders give the newest restack only
Co-Authored-By: Claude Opus 5.5 <noreply@anthropic.com>
Claude-Session: https://claude.ai/code/session_01FKvd69QsnCvM2zbzYnPwmF
</commit_message>
<xml_diff>
--- a/docs/SubZeroAstro_User_Manual.docx
+++ b/docs/SubZeroAstro_User_Manual.docx
@@ -121,7 +121,7 @@
           <w:sz w:val="22"/>
           <w:szCs w:val="22"/>
         </w:rPr>
-        <w:t xml:space="preserve">Version 0.9.84 beta  ·  Windows and Mac (Apple silicon)</w:t>
+        <w:t xml:space="preserve">Version 0.9.85 beta  ·  Windows and Mac (Apple silicon)</w:t>
       </w:r>
     </w:p>
     <w:p>
@@ -12916,7 +12916,17 @@
         <w:t xml:space="preserve">Add Folder…</w:t>
       </w:r>
       <w:r>
-        <w:t xml:space="preserve">). Masters of the </w:t>
+        <w:t xml:space="preserve">; with </w:t>
+      </w:r>
+      <w:r>
+        <w:rPr>
+          <w:b/>
+          <w:bCs/>
+        </w:rPr>
+        <w:t xml:space="preserve">Add Folder…</w:t>
+      </w:r>
+      <w:r>
+        <w:t xml:space="preserve"> only the newest restack of each master is taken). Masters of the </w:t>
       </w:r>
       <w:r>
         <w:rPr>
@@ -17191,6 +17201,46 @@
       </w:r>
       <w:r>
         <w:t xml:space="preserve"> button in the Load Light Frame Data window (or File › Open a Saved Project, Ctrl+Shift+O, on page 1) goes straight to Finishing Touches on its last step. Pick the project's folder or the folder you saved it into.</w:t>
+      </w:r>
+    </w:p>
+    <w:p>
+      <w:pPr>
+        <w:pStyle w:val="ListParagraph"/>
+        <w:numPr>
+          <w:ilvl w:val="0"/>
+          <w:numId w:val="2"/>
+        </w:numPr>
+        <w:spacing w:after="60"/>
+      </w:pPr>
+      <w:r>
+        <w:rPr>
+          <w:b/>
+          <w:bCs/>
+        </w:rPr>
+        <w:t xml:space="preserve">Already stacked, no saved project?</w:t>
+      </w:r>
+      <w:r>
+        <w:t xml:space="preserve"> Use </w:t>
+      </w:r>
+      <w:r>
+        <w:rPr>
+          <w:b/>
+          <w:bCs/>
+        </w:rPr>
+        <w:t xml:space="preserve">Process Existing Masters…</w:t>
+      </w:r>
+      <w:r>
+        <w:t xml:space="preserve"> in the same window (or File › Process Existing Master Lights…, Ctrl+Shift+M): pick your master lights - e.g. the D1 and D2 masters of one target - and you go straight to Astro Image Processing (page 2) without restacking. Masters are saved next to your lights' folder, named like </w:t>
+      </w:r>
+      <w:r>
+        <w:rPr>
+          <w:i/>
+          <w:iCs/>
+        </w:rPr>
+        <w:t xml:space="preserve">IC1396_Askar D1_Master_2026-06-29_to_2026-07-03.fits</w:t>
+      </w:r>
+      <w:r>
+        <w:t xml:space="preserve">; each restack adds _2, _3, … - from a folder only the newest is used.</w:t>
       </w:r>
     </w:p>
     <w:p>

</xml_diff>

<commit_message>
0.9.86 beta: D1+D2 OIII leak measured per filter from the lower envelope (tested on real IC1396 data)
Co-Authored-By: Claude Opus 5.5 <noreply@anthropic.com>
Claude-Session: https://claude.ai/code/session_01FKvd69QsnCvM2zbzYnPwmF
</commit_message>
<xml_diff>
--- a/docs/SubZeroAstro_User_Manual.docx
+++ b/docs/SubZeroAstro_User_Manual.docx
@@ -121,7 +121,7 @@
           <w:sz w:val="22"/>
           <w:szCs w:val="22"/>
         </w:rPr>
-        <w:t xml:space="preserve">Version 0.9.85 beta  ·  Windows and Mac (Apple silicon)</w:t>
+        <w:t xml:space="preserve">Version 0.9.86 beta  ·  Windows and Mac (Apple silicon)</w:t>
       </w:r>
     </w:p>
     <w:p>
@@ -17536,7 +17536,7 @@
         <w:t xml:space="preserve">OIII</w:t>
       </w:r>
       <w:r>
-        <w:t xml:space="preserve">. Those pixels also catch a little of the red line, so each OIII estimate carries some Ha or SII; because both filters see the same OIII, SubZeroAstro measures that leakage from your data (one fraction for both lines, so OIII that follows the Ha - as in IC 1396 - is not mistaken for leakage), takes it out, and combines the two OIII estimates weighted by each filter's exposure time (never less than 20% for either, since both hold real OIII) (the page 4 log shows the numbers). </w:t>
+        <w:t xml:space="preserve">. Those pixels also catch a little of the red line, so each OIII estimate carries some Ha or SII; because both filters see the same OIII, SubZeroAstro measures that leakage from your data, for each filter (real OIII is never negative, so where the Ha or SII is brightest the lowest OIII-to-line ratio is the leak - typically 5-9 %, never more than 10 %), takes it out, and combines the two OIII estimates weighted by each filter's exposure time (never less than 20% for either, since both hold real OIII) (the page 4 log shows the numbers). </w:t>
       </w:r>
       <w:r>
         <w:rPr>

</xml_diff>

<commit_message>
0.9.88 beta: Mote Buster fixes bright over-corrected rings per colour (tested on NGC281); bright stars keep their size
Co-Authored-By: Claude Opus 5.5 <noreply@anthropic.com>
Claude-Session: https://claude.ai/code/session_01FKvd69QsnCvM2zbzYnPwmF
</commit_message>
<xml_diff>
--- a/docs/SubZeroAstro_User_Manual.docx
+++ b/docs/SubZeroAstro_User_Manual.docx
@@ -121,7 +121,7 @@
           <w:sz w:val="22"/>
           <w:szCs w:val="22"/>
         </w:rPr>
-        <w:t xml:space="preserve">Version 0.9.87 beta  ·  Windows and Mac (Apple silicon)</w:t>
+        <w:t xml:space="preserve">Version 0.9.88 beta  ·  Windows and Mac (Apple silicon)</w:t>
       </w:r>
     </w:p>
     <w:p>
@@ -16459,6 +16459,36 @@
         <w:spacing w:after="60"/>
       </w:pPr>
       <w:r>
+        <w:rPr>
+          <w:b/>
+          <w:bCs/>
+        </w:rPr>
+        <w:t xml:space="preserve">Bright rings count too.</w:t>
+      </w:r>
+      <w:r>
+        <w:t xml:space="preserve"> When the dust moved between the flats and the lights (or a filter was cleaned), the flat over-corrects: you get a </w:t>
+      </w:r>
+      <w:r>
+        <w:rPr>
+          <w:i/>
+          <w:iCs/>
+        </w:rPr>
+        <w:t xml:space="preserve">brighter</w:t>
+      </w:r>
+      <w:r>
+        <w:t xml:space="preserve"> ring, often with a dark centre, and with mono filters it is usually in one filter only - a coloured (e.g. purple) halo. Mote Buster finds and fixes these as well, dimming the bright part and lifting the dark part. Every colour is centred and measured on its own (the same speck sits a little differently in each filter), and lopsided rings are followed too.</w:t>
+      </w:r>
+    </w:p>
+    <w:p>
+      <w:pPr>
+        <w:pStyle w:val="ListParagraph"/>
+        <w:numPr>
+          <w:ilvl w:val="0"/>
+          <w:numId w:val="2"/>
+        </w:numPr>
+        <w:spacing w:after="60"/>
+      </w:pPr>
+      <w:r>
         <w:t xml:space="preserve">Check the preview, then press the fix button. Mote Buster stays open on the </w:t>
       </w:r>
       <w:r>
@@ -23223,6 +23253,72 @@
                 <w:bCs/>
               </w:rPr>
               <w:t xml:space="preserve">What to try</w:t>
+            </w:r>
+          </w:p>
+        </w:tc>
+      </w:tr>
+      <w:tr>
+        <w:trPr>
+          <w:cantSplit/>
+        </w:trPr>
+        <w:tc>
+          <w:tcPr>
+            <w:tcW w:type="dxa" w:w="3300"/>
+            <w:tcBorders>
+              <w:top w:val="single" w:color="BFBFBF" w:sz="4"/>
+              <w:left w:val="single" w:color="BFBFBF" w:sz="4"/>
+              <w:bottom w:val="single" w:color="BFBFBF" w:sz="4"/>
+              <w:right w:val="single" w:color="BFBFBF" w:sz="4"/>
+            </w:tcBorders>
+            <w:tcMar>
+              <w:top w:type="dxa" w:w="60"/>
+              <w:left w:type="dxa" w:w="100"/>
+              <w:bottom w:type="dxa" w:w="60"/>
+              <w:right w:type="dxa" w:w="100"/>
+            </w:tcMar>
+          </w:tcPr>
+          <w:p>
+            <w:r>
+              <w:t xml:space="preserve">Bright stars turn into big soft discs</w:t>
+            </w:r>
+          </w:p>
+        </w:tc>
+        <w:tc>
+          <w:tcPr>
+            <w:tcW w:type="dxa" w:w="6060"/>
+            <w:tcBorders>
+              <w:top w:val="single" w:color="BFBFBF" w:sz="4"/>
+              <w:left w:val="single" w:color="BFBFBF" w:sz="4"/>
+              <w:bottom w:val="single" w:color="BFBFBF" w:sz="4"/>
+              <w:right w:val="single" w:color="BFBFBF" w:sz="4"/>
+            </w:tcBorders>
+            <w:tcMar>
+              <w:top w:type="dxa" w:w="60"/>
+              <w:left w:type="dxa" w:w="100"/>
+              <w:bottom w:type="dxa" w:w="60"/>
+              <w:right w:type="dxa" w:w="100"/>
+            </w:tcMar>
+          </w:tcPr>
+          <w:p>
+            <w:r>
+              <w:rPr>
+                <w:i/>
+                <w:iCs/>
+              </w:rPr>
+              <w:t xml:space="preserve">Brighten Stars Separately</w:t>
+            </w:r>
+            <w:r>
+              <w:t xml:space="preserve"> keeps bright stars their real size (fine-tune </w:t>
+            </w:r>
+            <w:r>
+              <w:rPr>
+                <w:i/>
+                <w:iCs/>
+              </w:rPr>
+              <w:t xml:space="preserve">Keep bright stars small</w:t>
+            </w:r>
+            <w:r>
+              <w:t xml:space="preserve">, about 0.85): one brightening curve for everything would lift a bright star's faint outer glow as much as a faint star's core. Turn it down toward 0 only if you want the big-glow look.</w:t>
             </w:r>
           </w:p>
         </w:tc>

</xml_diff>

<commit_message>
0.9.89 beta: BlurXTerminator starts at Sharpen Stars 0.50, Adjust Star Halos 0.40 for new users
Co-Authored-By: Claude Opus 5.5 <noreply@anthropic.com>
Claude-Session: https://claude.ai/code/session_01FKvd69QsnCvM2zbzYnPwmF
</commit_message>
<xml_diff>
--- a/docs/SubZeroAstro_User_Manual.docx
+++ b/docs/SubZeroAstro_User_Manual.docx
@@ -121,7 +121,7 @@
           <w:sz w:val="22"/>
           <w:szCs w:val="22"/>
         </w:rPr>
-        <w:t xml:space="preserve">Version 0.9.88 beta  ·  Windows and Mac (Apple silicon)</w:t>
+        <w:t xml:space="preserve">Version 0.9.89 beta  ·  Windows and Mac (Apple silicon)</w:t>
       </w:r>
     </w:p>
     <w:p>
@@ -13262,7 +13262,7 @@
           </w:tcPr>
           <w:p>
             <w:r>
-              <w:t xml:space="preserve">Sharpen Stars 0.25, Sharpen Nonstellar 0.50, Automatic PSF on</w:t>
+              <w:t xml:space="preserve">Sharpen Stars 0.50, Adjust Star Halos 0.40, Sharpen Nonstellar 0.50, Automatic PSF on</w:t>
             </w:r>
           </w:p>
         </w:tc>

</xml_diff>

<commit_message>
0.9.90 beta: remove a circle with Control-click (Mac) or Delete, not only right-click
Co-Authored-By: Claude Opus 5.5 <noreply@anthropic.com>
Claude-Session: https://claude.ai/code/session_01FKvd69QsnCvM2zbzYnPwmF
</commit_message>
<xml_diff>
--- a/docs/SubZeroAstro_User_Manual.docx
+++ b/docs/SubZeroAstro_User_Manual.docx
@@ -121,7 +121,7 @@
           <w:sz w:val="22"/>
           <w:szCs w:val="22"/>
         </w:rPr>
-        <w:t xml:space="preserve">Version 0.9.89 beta  ·  Windows and Mac (Apple silicon)</w:t>
+        <w:t xml:space="preserve">Version 0.9.90 beta  ·  Windows and Mac (Apple silicon)</w:t>
       </w:r>
     </w:p>
     <w:p>
@@ -16446,7 +16446,37 @@
         <w:t xml:space="preserve">turn the mouse wheel to size that circle</w:t>
       </w:r>
       <w:r>
-        <w:t xml:space="preserve"> while you watch (just cover the donut). Click a circle to pick it again (it turns blue) and drag to move it; right-click removes it. A dashed ring follows the mouse to show the size of the next circle. Clicks need not be exact: each circle is centred on its donut automatically.</w:t>
+        <w:t xml:space="preserve"> while you watch (just cover the donut). Click a circle to pick it again (it turns blue) and drag to move it; to remove it, </w:t>
+      </w:r>
+      <w:r>
+        <w:rPr>
+          <w:b/>
+          <w:bCs/>
+        </w:rPr>
+        <w:t xml:space="preserve">right-click</w:t>
+      </w:r>
+      <w:r>
+        <w:t xml:space="preserve"> it, </w:t>
+      </w:r>
+      <w:r>
+        <w:rPr>
+          <w:b/>
+          <w:bCs/>
+        </w:rPr>
+        <w:t xml:space="preserve">Control-click</w:t>
+      </w:r>
+      <w:r>
+        <w:t xml:space="preserve"> it on a Mac (Option- or Command-click also work), or pick it and press </w:t>
+      </w:r>
+      <w:r>
+        <w:rPr>
+          <w:b/>
+          <w:bCs/>
+        </w:rPr>
+        <w:t xml:space="preserve">Delete</w:t>
+      </w:r>
+      <w:r>
+        <w:t xml:space="preserve">. A dashed ring follows the mouse to show the size of the next circle. Clicks need not be exact: each circle is centred on its donut automatically.</w:t>
       </w:r>
     </w:p>
     <w:p>
@@ -16847,7 +16877,37 @@
         <w:t xml:space="preserve">turn the mouse wheel to make that circle bigger or smaller</w:t>
       </w:r>
       <w:r>
-        <w:t xml:space="preserve"> until it just covers the blemish. Click a circle to pick it again (it turns blue) and drag to move it; right-click removes it. A dashed ring follows the mouse to show the size of the next circle. Circles go from a hot pixel to a large satellite blob or halo (up to 700 pixels in radius, like Mote Buster's), and the patch blends in smoothly with the sky's own slope and grain even when it is big. </w:t>
+        <w:t xml:space="preserve"> until it just covers the blemish. Click a circle to pick it again (it turns blue) and drag to move it; to remove it, </w:t>
+      </w:r>
+      <w:r>
+        <w:rPr>
+          <w:b/>
+          <w:bCs/>
+        </w:rPr>
+        <w:t xml:space="preserve">right-click</w:t>
+      </w:r>
+      <w:r>
+        <w:t xml:space="preserve"> it, </w:t>
+      </w:r>
+      <w:r>
+        <w:rPr>
+          <w:b/>
+          <w:bCs/>
+        </w:rPr>
+        <w:t xml:space="preserve">Control-click</w:t>
+      </w:r>
+      <w:r>
+        <w:t xml:space="preserve"> it on a Mac (Option- or Command-click also work), or pick it and press </w:t>
+      </w:r>
+      <w:r>
+        <w:rPr>
+          <w:b/>
+          <w:bCs/>
+        </w:rPr>
+        <w:t xml:space="preserve">Delete</w:t>
+      </w:r>
+      <w:r>
+        <w:t xml:space="preserve">. A dashed ring follows the mouse to show the size of the next circle. Circles go from a hot pixel to a large satellite blob or halo (up to 700 pixels in radius, like Mote Buster's), and the patch blends in smoothly with the sky's own slope and grain even when it is big. </w:t>
       </w:r>
       <w:r>
         <w:rPr>

</xml_diff>

<commit_message>
0.9.91 beta: Bring Out Hidden Structure protects the sky (no boosted background blotches)
Co-Authored-By: Claude Opus 5.5 <noreply@anthropic.com>
Claude-Session: https://claude.ai/code/session_01FKvd69QsnCvM2zbzYnPwmF
</commit_message>
<xml_diff>
--- a/docs/SubZeroAstro_User_Manual.docx
+++ b/docs/SubZeroAstro_User_Manual.docx
@@ -121,7 +121,7 @@
           <w:sz w:val="22"/>
           <w:szCs w:val="22"/>
         </w:rPr>
-        <w:t xml:space="preserve">Version 0.9.90 beta  ·  Windows and Mac (Apple silicon)</w:t>
+        <w:t xml:space="preserve">Version 0.9.91 beta  ·  Windows and Mac (Apple silicon)</w:t>
       </w:r>
     </w:p>
     <w:p>
@@ -15564,7 +15564,17 @@
           </w:tcPr>
           <w:p>
             <w:r>
-              <w:t xml:space="preserve">Local contrast for dust lanes and cores</w:t>
+              <w:t xml:space="preserve">Local contrast for dust lanes and cores; the empty sky is protected (fine-tune </w:t>
+            </w:r>
+            <w:r>
+              <w:rPr>
+                <w:i/>
+                <w:iCs/>
+              </w:rPr>
+              <w:t xml:space="preserve">Protect the sky</w:t>
+            </w:r>
+            <w:r>
+              <w:t xml:space="preserve">)</w:t>
             </w:r>
           </w:p>
         </w:tc>
@@ -24094,6 +24104,105 @@
             </w:r>
             <w:r>
               <w:t xml:space="preserve">.</w:t>
+            </w:r>
+          </w:p>
+        </w:tc>
+      </w:tr>
+      <w:tr>
+        <w:trPr>
+          <w:cantSplit/>
+        </w:trPr>
+        <w:tc>
+          <w:tcPr>
+            <w:tcW w:type="dxa" w:w="3300"/>
+            <w:tcBorders>
+              <w:top w:val="single" w:color="BFBFBF" w:sz="4"/>
+              <w:left w:val="single" w:color="BFBFBF" w:sz="4"/>
+              <w:bottom w:val="single" w:color="BFBFBF" w:sz="4"/>
+              <w:right w:val="single" w:color="BFBFBF" w:sz="4"/>
+            </w:tcBorders>
+            <w:tcMar>
+              <w:top w:type="dxa" w:w="60"/>
+              <w:left w:type="dxa" w:w="100"/>
+              <w:bottom w:type="dxa" w:w="60"/>
+              <w:right w:type="dxa" w:w="100"/>
+            </w:tcMar>
+          </w:tcPr>
+          <w:p>
+            <w:r>
+              <w:t xml:space="preserve">The background shows blotches or a moire-like pattern</w:t>
+            </w:r>
+          </w:p>
+        </w:tc>
+        <w:tc>
+          <w:tcPr>
+            <w:tcW w:type="dxa" w:w="6060"/>
+            <w:tcBorders>
+              <w:top w:val="single" w:color="BFBFBF" w:sz="4"/>
+              <w:left w:val="single" w:color="BFBFBF" w:sz="4"/>
+              <w:bottom w:val="single" w:color="BFBFBF" w:sz="4"/>
+              <w:right w:val="single" w:color="BFBFBF" w:sz="4"/>
+            </w:tcBorders>
+            <w:tcMar>
+              <w:top w:type="dxa" w:w="60"/>
+              <w:left w:type="dxa" w:w="100"/>
+              <w:bottom w:type="dxa" w:w="60"/>
+              <w:right w:type="dxa" w:w="100"/>
+            </w:tcMar>
+          </w:tcPr>
+          <w:p>
+            <w:r>
+              <w:t xml:space="preserve">Faint leftover noise at a large scale (often well under 1 % of the sky brightness), made visible by a strong stretch. </w:t>
+            </w:r>
+            <w:r>
+              <w:rPr>
+                <w:i/>
+                <w:iCs/>
+              </w:rPr>
+              <w:t xml:space="preserve">Bring Out Hidden Structure</w:t>
+            </w:r>
+            <w:r>
+              <w:t xml:space="preserve"> protects the sky (keep </w:t>
+            </w:r>
+            <w:r>
+              <w:rPr>
+                <w:i/>
+                <w:iCs/>
+              </w:rPr>
+              <w:t xml:space="preserve">Protect the sky</w:t>
+            </w:r>
+            <w:r>
+              <w:t xml:space="preserve"> about 0.85); also try </w:t>
+            </w:r>
+            <w:r>
+              <w:rPr>
+                <w:i/>
+                <w:iCs/>
+              </w:rPr>
+              <w:t xml:space="preserve">Curves</w:t>
+            </w:r>
+            <w:r>
+              <w:t xml:space="preserve"> without </w:t>
+            </w:r>
+            <w:r>
+              <w:rPr>
+                <w:i/>
+                <w:iCs/>
+              </w:rPr>
+              <w:t xml:space="preserve">Darker background</w:t>
+            </w:r>
+            <w:r>
+              <w:t xml:space="preserve">, a stronger </w:t>
+            </w:r>
+            <w:r>
+              <w:rPr>
+                <w:i/>
+                <w:iCs/>
+              </w:rPr>
+              <w:t xml:space="preserve">Final Noise Reduction</w:t>
+            </w:r>
+            <w:r>
+              <w:t xml:space="preserve">, and dithering every 2-3 frames when you capture.</w:t>
             </w:r>
           </w:p>
         </w:tc>

</xml_diff>

<commit_message>
0.9.94 beta: every page shows 'Page N of 4' next to its title
Co-Authored-By: Claude Opus 5.5 <noreply@anthropic.com>
Claude-Session: https://claude.ai/code/session_01FKvd69QsnCvM2zbzYnPwmF
</commit_message>
<xml_diff>
--- a/docs/SubZeroAstro_User_Manual.docx
+++ b/docs/SubZeroAstro_User_Manual.docx
@@ -121,7 +121,7 @@
           <w:sz w:val="22"/>
           <w:szCs w:val="22"/>
         </w:rPr>
-        <w:t xml:space="preserve">Version 0.9.93 beta  ·  Windows and Mac (Apple silicon)</w:t>
+        <w:t xml:space="preserve">Version 0.9.94 beta  ·  Windows and Mac (Apple silicon)</w:t>
       </w:r>
     </w:p>
     <w:p>
@@ -5259,7 +5259,27 @@
         <w:t xml:space="preserve">from a folder of raw sub-frames to a finished astrophoto</w:t>
       </w:r>
       <w:r>
-        <w:t xml:space="preserve"> - with as little hassle as possible. It walks you through four pages, one after the other, like turning the pages of a book:</w:t>
+        <w:t xml:space="preserve"> - with as little hassle as possible. It walks you through four pages, one after the other, like turning the pages of a book (each shows </w:t>
+      </w:r>
+      <w:r>
+        <w:rPr>
+          <w:b/>
+          <w:bCs/>
+        </w:rPr>
+        <w:t xml:space="preserve">Page 1 of 4</w:t>
+      </w:r>
+      <w:r>
+        <w:t xml:space="preserve">, </w:t>
+      </w:r>
+      <w:r>
+        <w:rPr>
+          <w:b/>
+          <w:bCs/>
+        </w:rPr>
+        <w:t xml:space="preserve">Page 2 of 4</w:t>
+      </w:r>
+      <w:r>
+        <w:t xml:space="preserve"> … next to its title at the top, the same numbers this manual uses):</w:t>
       </w:r>
     </w:p>
     <w:tbl>

</xml_diff>

<commit_message>
0.9.96 beta: a galaxy with LRGB + Ha + OIII/SII gets the LRGB workflow (Add Hydrogen Glow first); Ha glow stays listed after combining
Co-Authored-By: Claude Opus 5.5 <noreply@anthropic.com>
Claude-Session: https://claude.ai/code/session_01FKvd69QsnCvM2zbzYnPwmF
</commit_message>
<xml_diff>
--- a/docs/SubZeroAstro_User_Manual.docx
+++ b/docs/SubZeroAstro_User_Manual.docx
@@ -121,7 +121,7 @@
           <w:sz w:val="22"/>
           <w:szCs w:val="22"/>
         </w:rPr>
-        <w:t xml:space="preserve">Version 0.9.95 beta  ·  Windows and Mac (Apple silicon)</w:t>
+        <w:t xml:space="preserve">Version 0.9.96 beta  ·  Windows and Mac (Apple silicon)</w:t>
       </w:r>
     </w:p>
     <w:p>
@@ -4913,7 +4913,7 @@
           <w:b/>
           <w:bCs/>
         </w:rPr>
-        <w:t xml:space="preserve">41</w:t>
+        <w:t xml:space="preserve">42</w:t>
       </w:r>
     </w:p>
     <w:p>
@@ -4978,7 +4978,7 @@
           <w:b/>
           <w:bCs/>
         </w:rPr>
-        <w:t xml:space="preserve">43</w:t>
+        <w:t xml:space="preserve">44</w:t>
       </w:r>
     </w:p>
     <w:p>
@@ -5043,7 +5043,7 @@
           <w:b/>
           <w:bCs/>
         </w:rPr>
-        <w:t xml:space="preserve">44</w:t>
+        <w:t xml:space="preserve">45</w:t>
       </w:r>
     </w:p>
     <w:p>
@@ -5108,7 +5108,7 @@
           <w:b/>
           <w:bCs/>
         </w:rPr>
-        <w:t xml:space="preserve">45</w:t>
+        <w:t xml:space="preserve">46</w:t>
       </w:r>
     </w:p>
     <w:p>
@@ -5173,7 +5173,7 @@
           <w:b/>
           <w:bCs/>
         </w:rPr>
-        <w:t xml:space="preserve">46</w:t>
+        <w:t xml:space="preserve">47</w:t>
       </w:r>
     </w:p>
     <w:p>
@@ -5364,7 +5364,7 @@
           <w:b/>
           <w:bCs/>
         </w:rPr>
-        <w:t xml:space="preserve">50</w:t>
+        <w:t xml:space="preserve">51</w:t>
       </w:r>
     </w:p>
     <w:p>
@@ -20458,6 +20458,74 @@
       </w:r>
       <w:r>
         <w:t xml:space="preserve">, crop, sign.</w:t>
+      </w:r>
+    </w:p>
+    <w:p>
+      <w:pPr>
+        <w:pBdr>
+          <w:left w:val="single" w:color="2F6FD6" w:sz="18" w:space="8"/>
+        </w:pBdr>
+        <w:shd w:fill="EAF1FB" w:color="auto" w:val="clear"/>
+        <w:spacing w:after="160" w:before="120"/>
+        <w:ind w:left="200" w:right="200"/>
+      </w:pPr>
+      <w:r>
+        <w:rPr>
+          <w:b/>
+          <w:bCs/>
+          <w:color w:val="2F6FD6"/>
+        </w:rPr>
+        <w:t xml:space="preserve">Order matters:  </w:t>
+      </w:r>
+      <w:r>
+        <w:rPr>
+          <w:b/>
+          <w:bCs/>
+        </w:rPr>
+        <w:t xml:space="preserve">Add Hydrogen Glow comes before Combine Colour Channels</w:t>
+      </w:r>
+      <w:r>
+        <w:t xml:space="preserve"> - it works on the separate R and Ha images. Combined without it? The step stays in the list marked ⤼ (passed by): use </w:t>
+      </w:r>
+      <w:r>
+        <w:rPr>
+          <w:b/>
+          <w:bCs/>
+        </w:rPr>
+        <w:t xml:space="preserve">Back to Start</w:t>
+      </w:r>
+      <w:r>
+        <w:t xml:space="preserve"> (or pick </w:t>
+      </w:r>
+      <w:r>
+        <w:rPr>
+          <w:i/>
+          <w:iCs/>
+        </w:rPr>
+        <w:t xml:space="preserve">Start (masters loaded)</w:t>
+      </w:r>
+      <w:r>
+        <w:t xml:space="preserve"> under </w:t>
+      </w:r>
+      <w:r>
+        <w:rPr>
+          <w:i/>
+          <w:iCs/>
+        </w:rPr>
+        <w:t xml:space="preserve">Show</w:t>
+      </w:r>
+      <w:r>
+        <w:t xml:space="preserve"> and press </w:t>
+      </w:r>
+      <w:r>
+        <w:rPr>
+          <w:i/>
+          <w:iCs/>
+        </w:rPr>
+        <w:t xml:space="preserve">Go Back to Here</w:t>
+      </w:r>
+      <w:r>
+        <w:t xml:space="preserve">), then Add Hydrogen Glow, then Combine. Also loaded OIII and SII masters of the galaxy? It is still processed as LRGB + Ha; the SHO and HOO palettes stay available under Combine Colour Channels.</w:t>
       </w:r>
     </w:p>
     <w:p>

</xml_diff>

<commit_message>
0.9.97 beta: stacking rows grouped broadband (L R G B) then narrowband, tinted, with one tick box per kind
Co-Authored-By: Claude Opus 5.5 <noreply@anthropic.com>
Claude-Session: https://claude.ai/code/session_01FKvd69QsnCvM2zbzYnPwmF
</commit_message>
<xml_diff>
--- a/docs/SubZeroAstro_User_Manual.docx
+++ b/docs/SubZeroAstro_User_Manual.docx
@@ -121,7 +121,7 @@
           <w:sz w:val="22"/>
           <w:szCs w:val="22"/>
         </w:rPr>
-        <w:t xml:space="preserve">Version 0.9.96 beta  ·  Windows and Mac (Apple silicon)</w:t>
+        <w:t xml:space="preserve">Version 0.9.97 beta  ·  Windows and Mac (Apple silicon)</w:t>
       </w:r>
     </w:p>
     <w:p>
@@ -4286,7 +4286,7 @@
           <w:b/>
           <w:bCs/>
         </w:rPr>
-        <w:t xml:space="preserve">25</w:t>
+        <w:t xml:space="preserve">26</w:t>
       </w:r>
     </w:p>
     <w:p>
@@ -4441,7 +4441,7 @@
           <w:b/>
           <w:bCs/>
         </w:rPr>
-        <w:t xml:space="preserve">29</w:t>
+        <w:t xml:space="preserve">30</w:t>
       </w:r>
     </w:p>
     <w:p>
@@ -4614,7 +4614,7 @@
           <w:b/>
           <w:bCs/>
         </w:rPr>
-        <w:t xml:space="preserve">36</w:t>
+        <w:t xml:space="preserve">37</w:t>
       </w:r>
     </w:p>
     <w:p>
@@ -4913,7 +4913,7 @@
           <w:b/>
           <w:bCs/>
         </w:rPr>
-        <w:t xml:space="preserve">42</w:t>
+        <w:t xml:space="preserve">43</w:t>
       </w:r>
     </w:p>
     <w:p>
@@ -4978,7 +4978,7 @@
           <w:b/>
           <w:bCs/>
         </w:rPr>
-        <w:t xml:space="preserve">44</w:t>
+        <w:t xml:space="preserve">45</w:t>
       </w:r>
     </w:p>
     <w:p>
@@ -5043,7 +5043,7 @@
           <w:b/>
           <w:bCs/>
         </w:rPr>
-        <w:t xml:space="preserve">45</w:t>
+        <w:t xml:space="preserve">46</w:t>
       </w:r>
     </w:p>
     <w:p>
@@ -5108,7 +5108,7 @@
           <w:b/>
           <w:bCs/>
         </w:rPr>
-        <w:t xml:space="preserve">46</w:t>
+        <w:t xml:space="preserve">47</w:t>
       </w:r>
     </w:p>
     <w:p>
@@ -5173,7 +5173,7 @@
           <w:b/>
           <w:bCs/>
         </w:rPr>
-        <w:t xml:space="preserve">47</w:t>
+        <w:t xml:space="preserve">48</w:t>
       </w:r>
     </w:p>
     <w:p>
@@ -5364,7 +5364,7 @@
           <w:b/>
           <w:bCs/>
         </w:rPr>
-        <w:t xml:space="preserve">51</w:t>
+        <w:t xml:space="preserve">52</w:t>
       </w:r>
     </w:p>
     <w:p>
@@ -11746,6 +11746,44 @@
         <w:spacing w:after="120"/>
       </w:pPr>
       <w:r>
+        <w:t xml:space="preserve">Each target's rows come </w:t>
+      </w:r>
+      <w:r>
+        <w:rPr>
+          <w:b/>
+          <w:bCs/>
+        </w:rPr>
+        <w:t xml:space="preserve">broadband first</w:t>
+      </w:r>
+      <w:r>
+        <w:t xml:space="preserve"> (L, R, G, B - tinted blue), then </w:t>
+      </w:r>
+      <w:r>
+        <w:rPr>
+          <w:b/>
+          <w:bCs/>
+        </w:rPr>
+        <w:t xml:space="preserve">narrowband</w:t>
+      </w:r>
+      <w:r>
+        <w:t xml:space="preserve"> (Ha, OIII, SII and dual-band filters - tinted red). The </w:t>
+      </w:r>
+      <w:r>
+        <w:rPr>
+          <w:b/>
+          <w:bCs/>
+        </w:rPr>
+        <w:t xml:space="preserve">Stack: Broadband / Narrowband</w:t>
+      </w:r>
+      <w:r>
+        <w:t xml:space="preserve"> tick boxes above the table include or leave out a whole kind at once - handy when one target has both, and you want, say, only the LRGB + Ha of a galaxy (untick a single row with its own box).</w:t>
+      </w:r>
+    </w:p>
+    <w:p>
+      <w:pPr>
+        <w:spacing w:after="120"/>
+      </w:pPr>
+      <w:r>
         <w:t xml:space="preserve">Your kept frames are grouped by </w:t>
       </w:r>
       <w:r>
@@ -28759,6 +28797,38 @@
             <w:szCs w:val="19"/>
           </w:rPr>
           <w:t xml:space="preserve">9.3</w:t>
+        </w:r>
+      </w:hyperlink>
+    </w:p>
+    <w:p>
+      <w:pPr>
+        <w:tabs>
+          <w:tab w:val="right" w:pos="4200" w:leader="dot"/>
+        </w:tabs>
+        <w:spacing w:after="10"/>
+      </w:pPr>
+      <w:r>
+        <w:rPr>
+          <w:sz w:val="19"/>
+          <w:szCs w:val="19"/>
+        </w:rPr>
+        <w:t xml:space="preserve">Broadband and narrowband rows</w:t>
+      </w:r>
+      <w:r>
+        <w:rPr>
+          <w:sz w:val="19"/>
+          <w:szCs w:val="19"/>
+        </w:rPr>
+        <w:tab/>
+      </w:r>
+      <w:hyperlink w:history="1" w:anchor="s_7_1">
+        <w:r>
+          <w:rPr>
+            <w:rStyle w:val="Hyperlink"/>
+            <w:sz w:val="19"/>
+            <w:szCs w:val="19"/>
+          </w:rPr>
+          <w:t xml:space="preserve">7.1</w:t>
         </w:r>
       </w:hyperlink>
     </w:p>

</xml_diff>

<commit_message>
0.9.98 beta: Darken the Sky calms colour blotches in the dark sky (Calm sky colours)
Co-Authored-By: Claude Opus 5.5 <noreply@anthropic.com>
Claude-Session: https://claude.ai/code/session_01FKvd69QsnCvM2zbzYnPwmF
</commit_message>
<xml_diff>
--- a/docs/SubZeroAstro_User_Manual.docx
+++ b/docs/SubZeroAstro_User_Manual.docx
@@ -121,7 +121,7 @@
           <w:sz w:val="22"/>
           <w:szCs w:val="22"/>
         </w:rPr>
-        <w:t xml:space="preserve">Version 0.9.97 beta  ·  Windows and Mac (Apple silicon)</w:t>
+        <w:t xml:space="preserve">Version 0.9.98 beta  ·  Windows and Mac (Apple silicon)</w:t>
       </w:r>
     </w:p>
     <w:p>
@@ -27392,6 +27392,95 @@
             </w:r>
             <w:r>
               <w:t xml:space="preserve">.</w:t>
+            </w:r>
+          </w:p>
+        </w:tc>
+      </w:tr>
+      <w:tr>
+        <w:trPr>
+          <w:cantSplit/>
+        </w:trPr>
+        <w:tc>
+          <w:tcPr>
+            <w:tcW w:type="dxa" w:w="3300"/>
+            <w:tcBorders>
+              <w:top w:val="single" w:color="BFBFBF" w:sz="4"/>
+              <w:left w:val="single" w:color="BFBFBF" w:sz="4"/>
+              <w:bottom w:val="single" w:color="BFBFBF" w:sz="4"/>
+              <w:right w:val="single" w:color="BFBFBF" w:sz="4"/>
+            </w:tcBorders>
+            <w:tcMar>
+              <w:top w:type="dxa" w:w="60"/>
+              <w:left w:type="dxa" w:w="100"/>
+              <w:bottom w:type="dxa" w:w="60"/>
+              <w:right w:type="dxa" w:w="100"/>
+            </w:tcMar>
+          </w:tcPr>
+          <w:p>
+            <w:r>
+              <w:t xml:space="preserve">Purple, blue or green blotches in the dark sky (narrowband)</w:t>
+            </w:r>
+          </w:p>
+        </w:tc>
+        <w:tc>
+          <w:tcPr>
+            <w:tcW w:type="dxa" w:w="6060"/>
+            <w:tcBorders>
+              <w:top w:val="single" w:color="BFBFBF" w:sz="4"/>
+              <w:left w:val="single" w:color="BFBFBF" w:sz="4"/>
+              <w:bottom w:val="single" w:color="BFBFBF" w:sz="4"/>
+              <w:right w:val="single" w:color="BFBFBF" w:sz="4"/>
+            </w:tcBorders>
+            <w:tcMar>
+              <w:top w:type="dxa" w:w="60"/>
+              <w:left w:type="dxa" w:w="100"/>
+              <w:bottom w:type="dxa" w:w="60"/>
+              <w:right w:type="dxa" w:w="100"/>
+            </w:tcMar>
+          </w:tcPr>
+          <w:p>
+            <w:r>
+              <w:t xml:space="preserve">Colour noise from the weaker filters (OIII, SII) showing in the faint sky. </w:t>
+            </w:r>
+            <w:r>
+              <w:rPr>
+                <w:i/>
+                <w:iCs/>
+              </w:rPr>
+              <w:t xml:space="preserve">Darken the Sky Background</w:t>
+            </w:r>
+            <w:r>
+              <w:t xml:space="preserve"> has </w:t>
+            </w:r>
+            <w:r>
+              <w:rPr>
+                <w:b/>
+                <w:bCs/>
+              </w:rPr>
+              <w:t xml:space="preserve">Calm sky colours</w:t>
+            </w:r>
+            <w:r>
+              <w:t xml:space="preserve"> (fine-tune; on by default, 0.6 for narrowband): it turns only the darkest areas grey and leaves the nebula's colours. Also: </w:t>
+            </w:r>
+            <w:r>
+              <w:rPr>
+                <w:i/>
+                <w:iCs/>
+              </w:rPr>
+              <w:t xml:space="preserve">Adjust Colours › Smooth colour transitions</w:t>
+            </w:r>
+            <w:r>
+              <w:t xml:space="preserve"> 0.4-0.6, </w:t>
+            </w:r>
+            <w:r>
+              <w:rPr>
+                <w:i/>
+                <w:iCs/>
+              </w:rPr>
+              <w:t xml:space="preserve">Colour Intensity › Slight</w:t>
+            </w:r>
+            <w:r>
+              <w:t xml:space="preserve">, and more time on OIII and SII.</w:t>
             </w:r>
           </w:p>
         </w:tc>

</xml_diff>

<commit_message>
0.9.100 beta: planetary core moved back from the stars image follows its own light - no square
Co-Authored-By: Claude Opus 5.5 <noreply@anthropic.com>
Claude-Session: https://claude.ai/code/session_01FKvd69QsnCvM2zbzYnPwmF
</commit_message>
<xml_diff>
--- a/docs/SubZeroAstro_User_Manual.docx
+++ b/docs/SubZeroAstro_User_Manual.docx
@@ -121,7 +121,7 @@
           <w:sz w:val="22"/>
           <w:szCs w:val="22"/>
         </w:rPr>
-        <w:t xml:space="preserve">Version 0.9.99 beta  ·  Windows and Mac (Apple silicon)</w:t>
+        <w:t xml:space="preserve">Version 0.9.100 beta  ·  Windows and Mac (Apple silicon)</w:t>
       </w:r>
     </w:p>
     <w:p>
@@ -27460,7 +27460,17 @@
               <w:t xml:space="preserve">Calm sky colours</w:t>
             </w:r>
             <w:r>
-              <w:t xml:space="preserve"> (fine-tune; on by default, 0.6 for narrowband): it turns only the darkest areas grey and leaves the nebula's colours. Also: </w:t>
+              <w:t xml:space="preserve"> (fine-tune; on by default, 0.6 for narrowband): it turns only the darkest areas grey and leaves the nebula's colours. When the faint areas are faint nebula rather than empty sky (IC 1396, the Veil), use </w:t>
+            </w:r>
+            <w:r>
+              <w:rPr>
+                <w:b/>
+                <w:bCs/>
+              </w:rPr>
+              <w:t xml:space="preserve">Adjust Colours › Calm blues and purples</w:t>
+            </w:r>
+            <w:r>
+              <w:t xml:space="preserve"> - it calms those hues everywhere, the gold and red untouched. Also: </w:t>
             </w:r>
             <w:r>
               <w:rPr>

</xml_diff>

<commit_message>
0.9.105: alt-az stacks without darks lose the circular swirls
With field rotation the camera's fixed pattern turns against the sky from frame to frame and stacks into
circular swirls (Vespera II NGC 281). When the frames turn more than half a degree and there is no dark, the
stacker measures the pattern from the lights (each frame minus the stacked sky, put back on the sensor), takes
its fine part out of every frame and combines again (two rounds).

Co-Authored-By: Claude Opus 5.5 <noreply@anthropic.com>
Claude-Session: https://claude.ai/code/session_01FKvd69QsnCvM2zbzYnPwmF
</commit_message>
<xml_diff>
--- a/docs/SubZeroAstro_User_Manual.docx
+++ b/docs/SubZeroAstro_User_Manual.docx
@@ -121,7 +121,7 @@
           <w:sz w:val="22"/>
           <w:szCs w:val="22"/>
         </w:rPr>
-        <w:t xml:space="preserve">Version 0.9.104 beta  ·  Windows and Mac (Apple silicon)</w:t>
+        <w:t xml:space="preserve">Version 0.9.105 beta  ·  Windows and Mac (Apple silicon)</w:t>
       </w:r>
     </w:p>
     <w:p>
@@ -18147,7 +18147,7 @@
         <w:spacing w:after="120"/>
       </w:pPr>
       <w:r>
-        <w:t xml:space="preserve">Raw subs are recognised as lights automatically, with no calibration needed (the telescope calibrates on board). Alt-az field rotation is handled during alignment and the rotated edges are cropped. Seestar </w:t>
+        <w:t xml:space="preserve">Raw subs are recognised as lights automatically, with no calibration needed (the telescope calibrates on board). Alt-az field rotation is handled during alignment and the rotated edges are cropped. Because the frames turn against each other, the camera's own fixed pattern (warm pixels and colour blotches that stay put on the sensor) would stack into circular swirls; without darks the stacker measures that pattern from the lights themselves and takes it out of every frame (it says so in the stack log). Dithering, if your telescope offers it, helps even more. Seestar </w:t>
       </w:r>
       <w:r>
         <w:rPr>

</xml_diff>

<commit_message>
0.9.107: HOO + faint OIII (lifts OIII-only glow such as the Squid in the Flying Bat)
Combine Colour Channels offers HOO + faint OIII when Ha and OIII are present: the OIII that follows the Ha
(measured where the Ha is bright) is taken away, what is left is smoothed, faded in above the sky's ripple and
added back on top of the OIII. Slider: Faint OIII boost (0-2).

Co-Authored-By: Claude Opus 5.5 <noreply@anthropic.com>
Claude-Session: https://claude.ai/code/session_01FKvd69QsnCvM2zbzYnPwmF
</commit_message>
<xml_diff>
--- a/docs/SubZeroAstro_User_Manual.docx
+++ b/docs/SubZeroAstro_User_Manual.docx
@@ -121,7 +121,7 @@
           <w:sz w:val="22"/>
           <w:szCs w:val="22"/>
         </w:rPr>
-        <w:t xml:space="preserve">Version 0.9.106 beta  ·  Windows and Mac (Apple silicon)</w:t>
+        <w:t xml:space="preserve">Version 0.9.107 beta  ·  Windows and Mac (Apple silicon)</w:t>
       </w:r>
     </w:p>
     <w:p>
@@ -14985,7 +14985,17 @@
           </w:tcPr>
           <w:p>
             <w:r>
-              <w:t xml:space="preserve">Builds colour from separate filters: RGB, LRGB, Hubble (SHO), HSO, HOO, Foraxx…</w:t>
+              <w:t xml:space="preserve">Builds colour from separate filters: RGB, LRGB, Hubble (SHO), HSO, HOO, Foraxx… and </w:t>
+            </w:r>
+            <w:r>
+              <w:rPr>
+                <w:b/>
+                <w:bCs/>
+              </w:rPr>
+              <w:t xml:space="preserve">HOO + faint OIII</w:t>
+            </w:r>
+            <w:r>
+              <w:t xml:space="preserve">, which lifts faint OIII-only glow (the Squid in the Flying Bat) while OIII that follows the Ha is left alone (slider: Faint OIII boost)</w:t>
             </w:r>
           </w:p>
         </w:tc>
@@ -15007,7 +15017,7 @@
           </w:tcPr>
           <w:p>
             <w:r>
-              <w:t xml:space="preserve">ChannelCombination / LRGBCombination</w:t>
+              <w:t xml:space="preserve">ChannelCombination / LRGBCombination; OIII minus scaled Ha in PixelMath</w:t>
             </w:r>
           </w:p>
         </w:tc>

</xml_diff>

<commit_message>
0.9.109: Calm sky colours reaches the whole sky (red blotches in galaxy pictures)
It only greyed the darkest 5-45 % of the picture, so blotches at the sky's own level stayed. Now everything
near the sky level (smoothed) counts as sky, softly edged: there the colour is smoothed far wider than the
blotches and pulled toward grey by the slider; brightness and the object's colours are untouched. Default
0.5 for broadband (was 0.3).

Co-Authored-By: Claude Opus 5.5 <noreply@anthropic.com>
Claude-Session: https://claude.ai/code/session_01FKvd69QsnCvM2zbzYnPwmF
</commit_message>
<xml_diff>
--- a/docs/SubZeroAstro_User_Manual.docx
+++ b/docs/SubZeroAstro_User_Manual.docx
@@ -121,7 +121,7 @@
           <w:sz w:val="22"/>
           <w:szCs w:val="22"/>
         </w:rPr>
-        <w:t xml:space="preserve">Version 0.9.108 beta  ·  Windows and Mac (Apple silicon)</w:t>
+        <w:t xml:space="preserve">Version 0.9.109 beta  ·  Windows and Mac (Apple silicon)</w:t>
       </w:r>
     </w:p>
     <w:p>
@@ -5364,7 +5364,7 @@
           <w:b/>
           <w:bCs/>
         </w:rPr>
-        <w:t xml:space="preserve">52</w:t>
+        <w:t xml:space="preserve">53</w:t>
       </w:r>
     </w:p>
     <w:p>
@@ -27428,7 +27428,7 @@
           </w:tcPr>
           <w:p>
             <w:r>
-              <w:t xml:space="preserve">Purple, blue or green blotches in the dark sky (narrowband)</w:t>
+              <w:t xml:space="preserve">Red, purple, blue or green blotches in the sky</w:t>
             </w:r>
           </w:p>
         </w:tc>
@@ -27450,7 +27450,7 @@
           </w:tcPr>
           <w:p>
             <w:r>
-              <w:t xml:space="preserve">Colour noise from the weaker filters (OIII, SII) showing in the faint sky. </w:t>
+              <w:t xml:space="preserve">Colour noise from the weaker colours or filters (OIII, SII; a short RGB set) showing in the sky. </w:t>
             </w:r>
             <w:r>
               <w:rPr>
@@ -27470,7 +27470,7 @@
               <w:t xml:space="preserve">Calm sky colours</w:t>
             </w:r>
             <w:r>
-              <w:t xml:space="preserve"> (fine-tune; on by default, 0.6 for narrowband): it turns only the darkest areas grey and leaves the nebula's colours. When the faint areas are faint nebula rather than empty sky (IC 1396, the Veil), use </w:t>
+              <w:t xml:space="preserve"> (fine-tune; on by default, 0.6 for narrowband, 0.5 otherwise): across the whole sky - everything near the sky's own level - it smooths the colour much wider than the blotches and pulls it toward grey, without touching the brightness or the galaxy's / nebula's colours. Raise it toward 1.0 for a neutral grey sky. When the faint areas are faint nebula rather than empty sky (IC 1396, the Veil), use </w:t>
             </w:r>
             <w:r>
               <w:rPr>

</xml_diff>

<commit_message>
0.9.113: open PixInsight projects; picked version stays marked; '(Stretch)' in the title
* File › Open a PixInsight Project…: reads project.xosm, decodes images PixInsight kept inside the project
  (its zstd 'rawimage' blocks), finds unchanged ones by their file (also after a move), leaves masks out,
  saves them as XISF and opens them on Astro Image Processing.
* After Apply, the version the user picked stays highlighted (was: the suggested one).
* Brighten the Image is now 'Brighten the Image (Stretch)'.

Co-Authored-By: Claude Opus 5.5 <noreply@anthropic.com>
Claude-Session: https://claude.ai/code/session_01FKvd69QsnCvM2zbzYnPwmF
</commit_message>
<xml_diff>
--- a/docs/SubZeroAstro_User_Manual.docx
+++ b/docs/SubZeroAstro_User_Manual.docx
@@ -121,7 +121,7 @@
           <w:sz w:val="22"/>
           <w:szCs w:val="22"/>
         </w:rPr>
-        <w:t xml:space="preserve">Version 0.9.112 beta  ·  Windows and Mac (Apple silicon)</w:t>
+        <w:t xml:space="preserve">Version 0.9.113 beta  ·  Windows and Mac (Apple silicon)</w:t>
       </w:r>
     </w:p>
     <w:p>
@@ -14439,7 +14439,7 @@
           <wp:inline distT="0" distB="0" distL="0" distR="0">
             <wp:extent cx="5715000" cy="3943350"/>
             <wp:effectExtent t="0" r="0" b="0" l="0"/>
-            <wp:docPr id="1" name="17_finish_brighten_choices.png" descr="Picking a version: Brighten the Image offers five strengths (example data)" title="Picking a version: Brighten the Image offers five strengths (example data)"/>
+            <wp:docPr id="1" name="17_finish_brighten_choices.png" descr="Picking a version: Brighten the Image (Stretch) offers five strengths (example data)" title="Picking a version: Brighten the Image (Stretch) offers five strengths (example data)"/>
             <wp:cNvGraphicFramePr>
               <a:graphicFrameLocks xmlns:a="http://schemas.openxmlformats.org/drawingml/2006/main" noChangeAspect="1"/>
             </wp:cNvGraphicFramePr>
@@ -14488,7 +14488,7 @@
           <w:sz w:val="18"/>
           <w:szCs w:val="18"/>
         </w:rPr>
-        <w:t xml:space="preserve">Picking a version: Brighten the Image offers five strengths (example data)</w:t>
+        <w:t xml:space="preserve">Picking a version: Brighten the Image (Stretch) offers five strengths (example data)</w:t>
       </w:r>
     </w:p>
     <w:p>
@@ -15409,7 +15409,7 @@
           </w:tcPr>
           <w:p>
             <w:r>
-              <w:t xml:space="preserve">Brighten the Image</w:t>
+              <w:t xml:space="preserve">Brighten the Image (Stretch)</w:t>
             </w:r>
           </w:p>
         </w:tc>
@@ -15573,7 +15573,7 @@
           </w:tcPr>
           <w:p>
             <w:r>
-              <w:t xml:space="preserve">Recovers detail in a burnt-out galaxy core or bright nebula: lowers the core's glow towards its surroundings and brings its structure back from the linear data; a nucleus burnt out even in the masters is rounded off so no hard white dot is left, and the stronger versions take in more of the area around the core (works best right after Brighten the Image)</w:t>
+              <w:t xml:space="preserve">Recovers detail in a burnt-out galaxy core or bright nebula: lowers the core's glow towards its surroundings and brings its structure back from the linear data; a nucleus burnt out even in the masters is rounded off so no hard white dot is left, and the stronger versions take in more of the area around the core (works best right after Brighten the Image (Stretch))</w:t>
             </w:r>
           </w:p>
         </w:tc>
@@ -17562,7 +17562,7 @@
         <w:t xml:space="preserve">IC1396_Askar D1_Master_2026-06-29_to_2026-07-03.fits</w:t>
       </w:r>
       <w:r>
-        <w:t xml:space="preserve">; each restack adds _2, _3, … - from a folder only the newest is used.</w:t>
+        <w:t xml:space="preserve">; each restack adds _2, _3, … - from a folder only the newest is used. WBPP masters from PixInsight open the same way.</w:t>
       </w:r>
     </w:p>
     <w:p>
@@ -17579,40 +17579,40 @@
           <w:b/>
           <w:bCs/>
         </w:rPr>
-        <w:t xml:space="preserve">Share to AstroBin…</w:t>
-      </w:r>
-      <w:r>
-        <w:t xml:space="preserve"> - saves an upload-ready JPG (and optional TIFF) plus an </w:t>
-      </w:r>
-      <w:r>
-        <w:rPr>
-          <w:b/>
-          <w:bCs/>
-        </w:rPr>
-        <w:t xml:space="preserve">acquisition CSV</w:t>
-      </w:r>
-      <w:r>
-        <w:t xml:space="preserve"> with every night's subs, exposure, gain, temperature and FWHM, then opens AstroBin's upload page. Upload the picture, and on the </w:t>
+        <w:t xml:space="preserve">A PixInsight project?</w:t>
+      </w:r>
+      <w:r>
+        <w:t xml:space="preserve"> File › </w:t>
+      </w:r>
+      <w:r>
+        <w:rPr>
+          <w:b/>
+          <w:bCs/>
+        </w:rPr>
+        <w:t xml:space="preserve">Open a PixInsight Project…</w:t>
+      </w:r>
+      <w:r>
+        <w:t xml:space="preserve">: pick the project's </w:t>
       </w:r>
       <w:r>
         <w:rPr>
           <w:i/>
           <w:iCs/>
         </w:rPr>
-        <w:t xml:space="preserve">Acquisition</w:t>
-      </w:r>
-      <w:r>
-        <w:t xml:space="preserve"> step choose </w:t>
-      </w:r>
-      <w:r>
-        <w:rPr>
-          <w:b/>
-          <w:bCs/>
-        </w:rPr>
-        <w:t xml:space="preserve">Import CSV</w:t>
-      </w:r>
-      <w:r>
-        <w:t xml:space="preserve">.</w:t>
+        <w:t xml:space="preserve">.pxiproject</w:t>
+      </w:r>
+      <w:r>
+        <w:t xml:space="preserve"> folder (or the folder it is in). Each picture in it - as PixInsight left it, including changes kept inside the project - is saved as an XISF file in </w:t>
+      </w:r>
+      <w:r>
+        <w:rPr>
+          <w:i/>
+          <w:iCs/>
+        </w:rPr>
+        <w:t xml:space="preserve">&lt;project&gt;_SubZeroAstro</w:t>
+      </w:r>
+      <w:r>
+        <w:t xml:space="preserve"> next to the project and opened on Astro Image Processing; masks are left out. If the project was moved, put the pictures' original files next to it so they can be found.</w:t>
       </w:r>
     </w:p>
     <w:p>
@@ -17629,6 +17629,56 @@
           <w:b/>
           <w:bCs/>
         </w:rPr>
+        <w:t xml:space="preserve">Share to AstroBin…</w:t>
+      </w:r>
+      <w:r>
+        <w:t xml:space="preserve"> - saves an upload-ready JPG (and optional TIFF) plus an </w:t>
+      </w:r>
+      <w:r>
+        <w:rPr>
+          <w:b/>
+          <w:bCs/>
+        </w:rPr>
+        <w:t xml:space="preserve">acquisition CSV</w:t>
+      </w:r>
+      <w:r>
+        <w:t xml:space="preserve"> with every night's subs, exposure, gain, temperature and FWHM, then opens AstroBin's upload page. Upload the picture, and on the </w:t>
+      </w:r>
+      <w:r>
+        <w:rPr>
+          <w:i/>
+          <w:iCs/>
+        </w:rPr>
+        <w:t xml:space="preserve">Acquisition</w:t>
+      </w:r>
+      <w:r>
+        <w:t xml:space="preserve"> step choose </w:t>
+      </w:r>
+      <w:r>
+        <w:rPr>
+          <w:b/>
+          <w:bCs/>
+        </w:rPr>
+        <w:t xml:space="preserve">Import CSV</w:t>
+      </w:r>
+      <w:r>
+        <w:t xml:space="preserve">.</w:t>
+      </w:r>
+    </w:p>
+    <w:p>
+      <w:pPr>
+        <w:pStyle w:val="ListParagraph"/>
+        <w:numPr>
+          <w:ilvl w:val="0"/>
+          <w:numId w:val="2"/>
+        </w:numPr>
+        <w:spacing w:after="60"/>
+      </w:pPr>
+      <w:r>
+        <w:rPr>
+          <w:b/>
+          <w:bCs/>
+        </w:rPr>
         <w:t xml:space="preserve">Stop Here – Continue in PixInsight</w:t>
       </w:r>
       <w:r>
@@ -18770,7 +18820,7 @@
           <w:b/>
           <w:bCs/>
         </w:rPr>
-        <w:t xml:space="preserve">Brighten the Image › Medium</w:t>
+        <w:t xml:space="preserve">Brighten the Image (Stretch) › Medium</w:t>
       </w:r>
       <w:r>
         <w:t xml:space="preserve"> (method </w:t>
@@ -19235,7 +19285,7 @@
           <w:b/>
           <w:bCs/>
         </w:rPr>
-        <w:t xml:space="preserve">Brighten the Image › Medium</w:t>
+        <w:t xml:space="preserve">Brighten the Image (Stretch) › Medium</w:t>
       </w:r>
       <w:r>
         <w:t xml:space="preserve"> (stronger is fine with the stars out).</w:t>
@@ -19680,7 +19730,7 @@
           <w:b/>
           <w:bCs/>
         </w:rPr>
-        <w:t xml:space="preserve">Brighten the Image › Medium</w:t>
+        <w:t xml:space="preserve">Brighten the Image (Stretch) › Medium</w:t>
       </w:r>
       <w:r>
         <w:t xml:space="preserve">.</w:t>
@@ -19968,7 +20018,7 @@
           <w:b/>
           <w:bCs/>
         </w:rPr>
-        <w:t xml:space="preserve">Brighten the Image › Medium</w:t>
+        <w:t xml:space="preserve">Brighten the Image (Stretch) › Medium</w:t>
       </w:r>
       <w:r>
         <w:t xml:space="preserve"> (</w:t>
@@ -20329,7 +20379,7 @@
           <w:b/>
           <w:bCs/>
         </w:rPr>
-        <w:t xml:space="preserve">Brighten the Image › Medium</w:t>
+        <w:t xml:space="preserve">Brighten the Image (Stretch) › Medium</w:t>
       </w:r>
       <w:r>
         <w:t xml:space="preserve"> or </w:t>
@@ -20731,7 +20781,7 @@
           <w:b/>
           <w:bCs/>
         </w:rPr>
-        <w:t xml:space="preserve">Brighten the Image › Medium</w:t>
+        <w:t xml:space="preserve">Brighten the Image (Stretch) › Medium</w:t>
       </w:r>
       <w:r>
         <w:t xml:space="preserve">.</w:t>
@@ -24950,7 +25000,7 @@
         <w:t xml:space="preserve">Protect bright areas</w:t>
       </w:r>
       <w:r>
-        <w:t xml:space="preserve"> in Brighten the Image, or Tame Bright Core); the colour then comes back on its own.</w:t>
+        <w:t xml:space="preserve"> in Brighten the Image (Stretch), or Tame Bright Core); the colour then comes back on its own.</w:t>
       </w:r>
     </w:p>
     <w:p>
@@ -25060,7 +25110,7 @@
         <w:t xml:space="preserve">Tame Bright Core</w:t>
       </w:r>
       <w:r>
-        <w:t xml:space="preserve"> is recommended for every galaxy, right after Brighten the Image. Start with </w:t>
+        <w:t xml:space="preserve"> is recommended for every galaxy, right after Brighten the Image (Stretch). Start with </w:t>
       </w:r>
       <w:r>
         <w:rPr>
@@ -25550,7 +25600,7 @@
         <w:t xml:space="preserve">Tame Bright Core</w:t>
       </w:r>
       <w:r>
-        <w:t xml:space="preserve"> right after Brighten the Image.</w:t>
+        <w:t xml:space="preserve"> right after Brighten the Image (Stretch).</w:t>
       </w:r>
     </w:p>
     <w:p>
@@ -25650,7 +25700,7 @@
         <w:t xml:space="preserve">They are tiny and very bright.</w:t>
       </w:r>
       <w:r>
-        <w:t xml:space="preserve"> Brighten the Image sets the brightness for the faint background, which pushes the bright ring or shell to nearly white - that is why it looks "hot". Use </w:t>
+        <w:t xml:space="preserve"> Brighten the Image (Stretch) sets the brightness for the faint background, which pushes the bright ring or shell to nearly white - that is why it looks "hot". Use </w:t>
       </w:r>
       <w:r>
         <w:rPr>
@@ -26048,7 +26098,7 @@
           <w:i/>
           <w:iCs/>
         </w:rPr>
-        <w:t xml:space="preserve">Brighten the Image: Gentle</w:t>
+        <w:t xml:space="preserve">Brighten the Image (Stretch): Gentle</w:t>
       </w:r>
       <w:r>
         <w:t xml:space="preserve"> (Colour-preserving) · skip </w:t>
@@ -26878,7 +26928,7 @@
                 <w:i/>
                 <w:iCs/>
               </w:rPr>
-              <w:t xml:space="preserve">Brighten the Image</w:t>
+              <w:t xml:space="preserve">Brighten the Image (Stretch)</w:t>
             </w:r>
             <w:r>
               <w:t xml:space="preserve"> - </w:t>
@@ -26921,7 +26971,7 @@
               <w:t xml:space="preserve">Protect bright areas</w:t>
             </w:r>
             <w:r>
-              <w:t xml:space="preserve"> in Brighten the Image.</w:t>
+              <w:t xml:space="preserve"> in Brighten the Image (Stretch).</w:t>
             </w:r>
           </w:p>
         </w:tc>
@@ -28867,7 +28917,7 @@
           <w:sz w:val="19"/>
           <w:szCs w:val="19"/>
         </w:rPr>
-        <w:t xml:space="preserve">Brighten the Image</w:t>
+        <w:t xml:space="preserve">Brighten the Image (Stretch)</w:t>
       </w:r>
       <w:r>
         <w:rPr>

</xml_diff>

<commit_message>
0.9.115: Even out the sky between frames (local normalization); unticked rows stay unticked
* Stacking: every frame's sky (block-median background map) is replaced by the reference frame's before
  combining, scale from the stars as before - like PixInsight's LocalNormalization. Option 'Even out the sky
  between frames', on by default.
* Calibrate and Stack: a light-frame row the user unticked stays unticked when calibration is added.

Co-Authored-By: Claude Opus 5.5 <noreply@anthropic.com>
Claude-Session: https://claude.ai/code/session_01FKvd69QsnCvM2zbzYnPwmF
</commit_message>
<xml_diff>
--- a/docs/SubZeroAstro_User_Manual.docx
+++ b/docs/SubZeroAstro_User_Manual.docx
@@ -121,7 +121,7 @@
           <w:sz w:val="22"/>
           <w:szCs w:val="22"/>
         </w:rPr>
-        <w:t xml:space="preserve">Version 0.9.114 beta  ·  Windows and Mac (Apple silicon)</w:t>
+        <w:t xml:space="preserve">Version 0.9.115 beta  ·  Windows and Mac (Apple silicon)</w:t>
       </w:r>
     </w:p>
     <w:p>
@@ -9714,6 +9714,26 @@
       </w:r>
       <w:r>
         <w:t xml:space="preserve">). This matters for ASIAIR, which records the mount, not the telescope.</w:t>
+      </w:r>
+    </w:p>
+    <w:p>
+      <w:pPr>
+        <w:pStyle w:val="ListParagraph"/>
+        <w:numPr>
+          <w:ilvl w:val="0"/>
+          <w:numId w:val="2"/>
+        </w:numPr>
+        <w:spacing w:after="60"/>
+      </w:pPr>
+      <w:r>
+        <w:rPr>
+          <w:b/>
+          <w:bCs/>
+        </w:rPr>
+        <w:t xml:space="preserve">Even out the sky between frames</w:t>
+      </w:r>
+      <w:r>
+        <w:t xml:space="preserve"> (on by default; PixInsight calls it LocalNormalization): light pollution, haze and moonlight change through the night, so each frame's sky is brighter in a different corner. Before combining, every frame's sky is matched to the best frame's, so satellites, planes and noise are rejected properly and the background comes out even.</w:t>
       </w:r>
     </w:p>
     <w:p>

</xml_diff>

<commit_message>
0.9.116: Double the resolution (drizzle 2x)
Stacking option (off by default): after the regular stack, every frame is drizzled onto a grid twice as fine -
each output pixel gathers the input pixels whose shrunken drops (pixfrac 0.8) overlap it, weighted by the
overlap; the regular stack's rejection leaves out satellites and planes; frames are normalised the same way
(incl. Even out the sky). Done in row bands in parallel. Pixels no drop reached are filled from the regular
stack.

Co-Authored-By: Claude Opus 5.5 <noreply@anthropic.com>
Claude-Session: https://claude.ai/code/session_01FKvd69QsnCvM2zbzYnPwmF
</commit_message>
<xml_diff>
--- a/docs/SubZeroAstro_User_Manual.docx
+++ b/docs/SubZeroAstro_User_Manual.docx
@@ -121,7 +121,7 @@
           <w:sz w:val="22"/>
           <w:szCs w:val="22"/>
         </w:rPr>
-        <w:t xml:space="preserve">Version 0.9.115 beta  ·  Windows and Mac (Apple silicon)</w:t>
+        <w:t xml:space="preserve">Version 0.9.116 beta  ·  Windows and Mac (Apple silicon)</w:t>
       </w:r>
     </w:p>
     <w:p>
@@ -9734,6 +9734,26 @@
       </w:r>
       <w:r>
         <w:t xml:space="preserve"> (on by default; PixInsight calls it LocalNormalization): light pollution, haze and moonlight change through the night, so each frame's sky is brighter in a different corner. Before combining, every frame's sky is matched to the best frame's, so satellites, planes and noise are rejected properly and the background comes out even.</w:t>
+      </w:r>
+    </w:p>
+    <w:p>
+      <w:pPr>
+        <w:pStyle w:val="ListParagraph"/>
+        <w:numPr>
+          <w:ilvl w:val="0"/>
+          <w:numId w:val="2"/>
+        </w:numPr>
+        <w:spacing w:after="60"/>
+      </w:pPr>
+      <w:r>
+        <w:rPr>
+          <w:b/>
+          <w:bCs/>
+        </w:rPr>
+        <w:t xml:space="preserve">Double the resolution (drizzle 2x)</w:t>
+      </w:r>
+      <w:r>
+        <w:t xml:space="preserve"> (off by default; PixInsight: DrizzleIntegration): if you dither (the scope moves a few pixels between frames) and your stars are small and blocky, the frames' slightly different positions are combined on a grid twice as fine - a master twice the size with finer stars. It uses the regular stack to leave out satellites and planes. Slower, the masters are 4x larger, and without dithering it adds nothing.</w:t>
       </w:r>
     </w:p>
     <w:p>

</xml_diff>

<commit_message>
0.9.119: tells you when drizzle would help (dithered frames, small stars)
After stacking, each group's frame shifts are checked: spread of at least 2 px and half of the sub-pixel
positions covered = dithered. With small stars (page-1 FWHM under 2.8 px, or unknown) and drizzle off, a tip
says to try 'Double the resolution (drizzle 2x)' and that it takes longer; with drizzle on but no dithering,
it says drizzle added little. Shown in the log and a non-blocking note.

Co-Authored-By: Claude Opus 5.5 <noreply@anthropic.com>
Claude-Session: https://claude.ai/code/session_01FKvd69QsnCvM2zbzYnPwmF
</commit_message>
<xml_diff>
--- a/docs/SubZeroAstro_User_Manual.docx
+++ b/docs/SubZeroAstro_User_Manual.docx
@@ -121,7 +121,7 @@
           <w:sz w:val="22"/>
           <w:szCs w:val="22"/>
         </w:rPr>
-        <w:t xml:space="preserve">Version 0.9.118 beta  ·  Windows and Mac (Apple silicon)</w:t>
+        <w:t xml:space="preserve">Version 0.9.119 beta  ·  Windows and Mac (Apple silicon)</w:t>
       </w:r>
     </w:p>
     <w:p>
@@ -9753,7 +9753,7 @@
         <w:t xml:space="preserve">Double the resolution (drizzle 2x)</w:t>
       </w:r>
       <w:r>
-        <w:t xml:space="preserve"> (off by default; PixInsight: DrizzleIntegration): if you dither (the scope moves a few pixels between frames) and your stars are small and blocky, the frames' slightly different positions are combined on a grid twice as fine - a master twice the size with finer stars. It uses the regular stack to leave out satellites and planes. Slower, the masters are 4x larger, and without dithering it adds nothing.</w:t>
+        <w:t xml:space="preserve"> (off by default; PixInsight: DrizzleIntegration): if you dither (the scope moves a few pixels between frames) and your stars are small and blocky, the frames' slightly different positions are combined on a grid twice as fine - a master twice the size with finer stars. It uses the regular stack to leave out satellites and planes. Slower, the masters are 4x larger, and without dithering it adds nothing. After stacking, SubZeroAstro tells you when your frames are dithered and the stars small enough for drizzle to help (and when it was on but the frames were hardly dithered).</w:t>
       </w:r>
     </w:p>
     <w:p>

</xml_diff>

<commit_message>
0.9.120: in-app updates - a blue bar says when a newer version is out, with What's New, Update Now (downloads, restarts into the new version) and Skip This Version; Help > Check for Updates
Co-Authored-By: Claude Opus 5.5 <noreply@anthropic.com>
Claude-Session: https://claude.ai/code/session_01FKvd69QsnCvM2zbzYnPwmF
</commit_message>
<xml_diff>
--- a/docs/SubZeroAstro_User_Manual.docx
+++ b/docs/SubZeroAstro_User_Manual.docx
@@ -121,7 +121,7 @@
           <w:sz w:val="22"/>
           <w:szCs w:val="22"/>
         </w:rPr>
-        <w:t xml:space="preserve">Version 0.9.119 beta  ·  Windows and Mac (Apple silicon)</w:t>
+        <w:t xml:space="preserve">Version 0.9.120 beta  ·  Windows and Mac (Apple silicon)</w:t>
       </w:r>
     </w:p>
     <w:p>
@@ -22857,6 +22857,71 @@
         <w:spacing w:after="120"/>
       </w:pPr>
       <w:r>
+        <w:rPr>
+          <w:b/>
+          <w:bCs/>
+        </w:rPr>
+        <w:t xml:space="preserve">Updates</w:t>
+      </w:r>
+      <w:r>
+        <w:t xml:space="preserve">: when a newer SubZeroAstro is published, a slim blue bar at the top of page 1 says so (checked quietly a few seconds after start-up). </w:t>
+      </w:r>
+      <w:r>
+        <w:rPr>
+          <w:b/>
+          <w:bCs/>
+        </w:rPr>
+        <w:t xml:space="preserve">What's New</w:t>
+      </w:r>
+      <w:r>
+        <w:t xml:space="preserve"> shows what changed, </w:t>
+      </w:r>
+      <w:r>
+        <w:rPr>
+          <w:b/>
+          <w:bCs/>
+        </w:rPr>
+        <w:t xml:space="preserve">Update Now</w:t>
+      </w:r>
+      <w:r>
+        <w:t xml:space="preserve"> downloads the new version, closes SubZeroAstro, puts the new files in place and starts it again - your settings and projects are kept - and </w:t>
+      </w:r>
+      <w:r>
+        <w:rPr>
+          <w:b/>
+          <w:bCs/>
+        </w:rPr>
+        <w:t xml:space="preserve">Skip This Version</w:t>
+      </w:r>
+      <w:r>
+        <w:t xml:space="preserve"> hides the bar until the next one. Let any stacking or processing finish first. </w:t>
+      </w:r>
+      <w:r>
+        <w:rPr>
+          <w:b/>
+          <w:bCs/>
+        </w:rPr>
+        <w:t xml:space="preserve">Help › Check for Updates…</w:t>
+      </w:r>
+      <w:r>
+        <w:t xml:space="preserve"> checks right away; untick </w:t>
+      </w:r>
+      <w:r>
+        <w:rPr>
+          <w:b/>
+          <w:bCs/>
+        </w:rPr>
+        <w:t xml:space="preserve">Help › Check for Updates at Startup</w:t>
+      </w:r>
+      <w:r>
+        <w:t xml:space="preserve"> to stop the automatic check. If SubZeroAstro is in a folder it can't write to (or runs from Python), Update Now opens the download page instead.</w:t>
+      </w:r>
+    </w:p>
+    <w:p>
+      <w:pPr>
+        <w:spacing w:after="120"/>
+      </w:pPr>
+      <w:r>
         <w:t xml:space="preserve">Note the version (in small print under the name at the top of every page, or </w:t>
       </w:r>
       <w:r>
@@ -29402,7 +29467,7 @@
           <w:sz w:val="19"/>
           <w:szCs w:val="19"/>
         </w:rPr>
-        <w:t xml:space="preserve">Choose a Colour Palette</w:t>
+        <w:t xml:space="preserve">Check for Updates</w:t>
       </w:r>
       <w:r>
         <w:rPr>
@@ -29411,14 +29476,14 @@
         </w:rPr>
         <w:tab/>
       </w:r>
-      <w:hyperlink w:history="1" w:anchor="s_9_3">
+      <w:hyperlink w:history="1" w:anchor="s_11_2">
         <w:r>
           <w:rPr>
             <w:rStyle w:val="Hyperlink"/>
             <w:sz w:val="19"/>
             <w:szCs w:val="19"/>
           </w:rPr>
-          <w:t xml:space="preserve">9.3</w:t>
+          <w:t xml:space="preserve">11.2</w:t>
         </w:r>
       </w:hyperlink>
     </w:p>
@@ -29434,7 +29499,7 @@
           <w:sz w:val="19"/>
           <w:szCs w:val="19"/>
         </w:rPr>
-        <w:t xml:space="preserve">Cluster recipe</w:t>
+        <w:t xml:space="preserve">Choose a Colour Palette</w:t>
       </w:r>
       <w:r>
         <w:rPr>
@@ -29443,14 +29508,14 @@
         </w:rPr>
         <w:tab/>
       </w:r>
-      <w:hyperlink w:history="1" w:anchor="s_10_15">
+      <w:hyperlink w:history="1" w:anchor="s_9_3">
         <w:r>
           <w:rPr>
             <w:rStyle w:val="Hyperlink"/>
             <w:sz w:val="19"/>
             <w:szCs w:val="19"/>
           </w:rPr>
-          <w:t xml:space="preserve">10.15</w:t>
+          <w:t xml:space="preserve">9.3</w:t>
         </w:r>
       </w:hyperlink>
     </w:p>
@@ -29466,7 +29531,7 @@
           <w:sz w:val="19"/>
           <w:szCs w:val="19"/>
         </w:rPr>
-        <w:t xml:space="preserve">Colour cameras</w:t>
+        <w:t xml:space="preserve">Cluster recipe</w:t>
       </w:r>
       <w:r>
         <w:rPr>
@@ -29475,14 +29540,14 @@
         </w:rPr>
         <w:tab/>
       </w:r>
-      <w:hyperlink w:history="1" w:anchor="s_7_3">
+      <w:hyperlink w:history="1" w:anchor="s_10_15">
         <w:r>
           <w:rPr>
             <w:rStyle w:val="Hyperlink"/>
             <w:sz w:val="19"/>
             <w:szCs w:val="19"/>
           </w:rPr>
-          <w:t xml:space="preserve">7.3</w:t>
+          <w:t xml:space="preserve">10.15</w:t>
         </w:r>
       </w:hyperlink>
     </w:p>
@@ -29498,7 +29563,7 @@
           <w:sz w:val="19"/>
           <w:szCs w:val="19"/>
         </w:rPr>
-        <w:t xml:space="preserve">Colour headroom</w:t>
+        <w:t xml:space="preserve">Colour cameras</w:t>
       </w:r>
       <w:r>
         <w:rPr>
@@ -29507,14 +29572,14 @@
         </w:rPr>
         <w:tab/>
       </w:r>
-      <w:hyperlink w:history="1" w:anchor="s_15_1">
+      <w:hyperlink w:history="1" w:anchor="s_7_3">
         <w:r>
           <w:rPr>
             <w:rStyle w:val="Hyperlink"/>
             <w:sz w:val="19"/>
             <w:szCs w:val="19"/>
           </w:rPr>
-          <w:t xml:space="preserve">15.1</w:t>
+          <w:t xml:space="preserve">7.3</w:t>
         </w:r>
       </w:hyperlink>
     </w:p>
@@ -29530,7 +29595,7 @@
           <w:sz w:val="19"/>
           <w:szCs w:val="19"/>
         </w:rPr>
-        <w:t xml:space="preserve">Combine Colour Channels</w:t>
+        <w:t xml:space="preserve">Colour headroom</w:t>
       </w:r>
       <w:r>
         <w:rPr>
@@ -29539,14 +29604,14 @@
         </w:rPr>
         <w:tab/>
       </w:r>
-      <w:hyperlink w:history="1" w:anchor="s_9_3">
+      <w:hyperlink w:history="1" w:anchor="s_15_1">
         <w:r>
           <w:rPr>
             <w:rStyle w:val="Hyperlink"/>
             <w:sz w:val="19"/>
             <w:szCs w:val="19"/>
           </w:rPr>
-          <w:t xml:space="preserve">9.3</w:t>
+          <w:t xml:space="preserve">15.1</w:t>
         </w:r>
       </w:hyperlink>
     </w:p>
@@ -29562,7 +29627,7 @@
           <w:sz w:val="19"/>
           <w:szCs w:val="19"/>
         </w:rPr>
-        <w:t xml:space="preserve">Comet processing</w:t>
+        <w:t xml:space="preserve">Combine Colour Channels</w:t>
       </w:r>
       <w:r>
         <w:rPr>
@@ -29571,14 +29636,14 @@
         </w:rPr>
         <w:tab/>
       </w:r>
-      <w:hyperlink w:history="1" w:anchor="s_15_7">
+      <w:hyperlink w:history="1" w:anchor="s_9_3">
         <w:r>
           <w:rPr>
             <w:rStyle w:val="Hyperlink"/>
             <w:sz w:val="19"/>
             <w:szCs w:val="19"/>
           </w:rPr>
-          <w:t xml:space="preserve">15.7</w:t>
+          <w:t xml:space="preserve">9.3</w:t>
         </w:r>
       </w:hyperlink>
     </w:p>
@@ -29594,7 +29659,7 @@
           <w:sz w:val="19"/>
           <w:szCs w:val="19"/>
         </w:rPr>
-        <w:t xml:space="preserve">Comet stack</w:t>
+        <w:t xml:space="preserve">Comet processing</w:t>
       </w:r>
       <w:r>
         <w:rPr>
@@ -29603,14 +29668,14 @@
         </w:rPr>
         <w:tab/>
       </w:r>
-      <w:hyperlink w:history="1" w:anchor="s_10_6">
+      <w:hyperlink w:history="1" w:anchor="s_15_7">
         <w:r>
           <w:rPr>
             <w:rStyle w:val="Hyperlink"/>
             <w:sz w:val="19"/>
             <w:szCs w:val="19"/>
           </w:rPr>
-          <w:t xml:space="preserve">10.6</w:t>
+          <w:t xml:space="preserve">15.7</w:t>
         </w:r>
       </w:hyperlink>
     </w:p>
@@ -29626,7 +29691,7 @@
           <w:sz w:val="19"/>
           <w:szCs w:val="19"/>
         </w:rPr>
-        <w:t xml:space="preserve">Comets</w:t>
+        <w:t xml:space="preserve">Comet stack</w:t>
       </w:r>
       <w:r>
         <w:rPr>
@@ -29658,7 +29723,7 @@
           <w:sz w:val="19"/>
           <w:szCs w:val="19"/>
         </w:rPr>
-        <w:t xml:space="preserve">Continue button</w:t>
+        <w:t xml:space="preserve">Comets</w:t>
       </w:r>
       <w:r>
         <w:rPr>
@@ -29667,14 +29732,14 @@
         </w:rPr>
         <w:tab/>
       </w:r>
-      <w:hyperlink w:history="1" w:anchor="s_5_1">
+      <w:hyperlink w:history="1" w:anchor="s_10_6">
         <w:r>
           <w:rPr>
             <w:rStyle w:val="Hyperlink"/>
             <w:sz w:val="19"/>
             <w:szCs w:val="19"/>
           </w:rPr>
-          <w:t xml:space="preserve">5.1</w:t>
+          <w:t xml:space="preserve">10.6</w:t>
         </w:r>
       </w:hyperlink>
     </w:p>
@@ -29690,7 +29755,7 @@
           <w:sz w:val="19"/>
           <w:szCs w:val="19"/>
         </w:rPr>
-        <w:t xml:space="preserve">Continue to Calibrate and Stack</w:t>
+        <w:t xml:space="preserve">Continue button</w:t>
       </w:r>
       <w:r>
         <w:rPr>
@@ -29699,14 +29764,14 @@
         </w:rPr>
         <w:tab/>
       </w:r>
-      <w:hyperlink w:history="1" w:anchor="s_6_5">
+      <w:hyperlink w:history="1" w:anchor="s_5_1">
         <w:r>
           <w:rPr>
             <w:rStyle w:val="Hyperlink"/>
             <w:sz w:val="19"/>
             <w:szCs w:val="19"/>
           </w:rPr>
-          <w:t xml:space="preserve">6.5</w:t>
+          <w:t xml:space="preserve">5.1</w:t>
         </w:r>
       </w:hyperlink>
     </w:p>
@@ -29722,7 +29787,7 @@
           <w:sz w:val="19"/>
           <w:szCs w:val="19"/>
         </w:rPr>
-        <w:t xml:space="preserve">Continue With the Rest</w:t>
+        <w:t xml:space="preserve">Continue to Calibrate and Stack</w:t>
       </w:r>
       <w:r>
         <w:rPr>
@@ -29731,14 +29796,14 @@
         </w:rPr>
         <w:tab/>
       </w:r>
-      <w:hyperlink w:history="1" w:anchor="s_7_4">
+      <w:hyperlink w:history="1" w:anchor="s_6_5">
         <w:r>
           <w:rPr>
             <w:rStyle w:val="Hyperlink"/>
             <w:sz w:val="19"/>
             <w:szCs w:val="19"/>
           </w:rPr>
-          <w:t xml:space="preserve">7.4</w:t>
+          <w:t xml:space="preserve">6.5</w:t>
         </w:r>
       </w:hyperlink>
     </w:p>
@@ -29754,7 +29819,7 @@
           <w:sz w:val="19"/>
           <w:szCs w:val="19"/>
         </w:rPr>
-        <w:t xml:space="preserve">Crash recovery</w:t>
+        <w:t xml:space="preserve">Continue With the Rest</w:t>
       </w:r>
       <w:r>
         <w:rPr>
@@ -29763,14 +29828,14 @@
         </w:rPr>
         <w:tab/>
       </w:r>
-      <w:hyperlink w:history="1" w:anchor="s_5_3">
+      <w:hyperlink w:history="1" w:anchor="s_7_4">
         <w:r>
           <w:rPr>
             <w:rStyle w:val="Hyperlink"/>
             <w:sz w:val="19"/>
             <w:szCs w:val="19"/>
           </w:rPr>
-          <w:t xml:space="preserve">5.3</w:t>
+          <w:t xml:space="preserve">7.4</w:t>
         </w:r>
       </w:hyperlink>
     </w:p>
@@ -29786,7 +29851,7 @@
           <w:sz w:val="19"/>
           <w:szCs w:val="19"/>
         </w:rPr>
-        <w:t xml:space="preserve">Credits</w:t>
+        <w:t xml:space="preserve">Crash recovery</w:t>
       </w:r>
       <w:r>
         <w:rPr>
@@ -29795,14 +29860,14 @@
         </w:rPr>
         <w:tab/>
       </w:r>
-      <w:hyperlink w:history="1" w:anchor="s_14_2">
+      <w:hyperlink w:history="1" w:anchor="s_5_3">
         <w:r>
           <w:rPr>
             <w:rStyle w:val="Hyperlink"/>
             <w:sz w:val="19"/>
             <w:szCs w:val="19"/>
           </w:rPr>
-          <w:t xml:space="preserve">14.2</w:t>
+          <w:t xml:space="preserve">5.3</w:t>
         </w:r>
       </w:hyperlink>
     </w:p>
@@ -29818,7 +29883,7 @@
           <w:sz w:val="19"/>
           <w:szCs w:val="19"/>
         </w:rPr>
-        <w:t xml:space="preserve">Crop</w:t>
+        <w:t xml:space="preserve">Credits</w:t>
       </w:r>
       <w:r>
         <w:rPr>
@@ -29827,14 +29892,14 @@
         </w:rPr>
         <w:tab/>
       </w:r>
-      <w:hyperlink w:history="1" w:anchor="s_8_2">
+      <w:hyperlink w:history="1" w:anchor="s_14_2">
         <w:r>
           <w:rPr>
             <w:rStyle w:val="Hyperlink"/>
             <w:sz w:val="19"/>
             <w:szCs w:val="19"/>
           </w:rPr>
-          <w:t xml:space="preserve">8.2</w:t>
+          <w:t xml:space="preserve">14.2</w:t>
         </w:r>
       </w:hyperlink>
     </w:p>
@@ -29850,7 +29915,7 @@
           <w:sz w:val="19"/>
           <w:szCs w:val="19"/>
         </w:rPr>
-        <w:t xml:space="preserve">Curves</w:t>
+        <w:t xml:space="preserve">Crop</w:t>
       </w:r>
       <w:r>
         <w:rPr>
@@ -29859,13 +29924,45 @@
         </w:rPr>
         <w:tab/>
       </w:r>
-      <w:hyperlink w:history="1" w:anchor="s_9_3">
+      <w:hyperlink w:history="1" w:anchor="s_8_2">
         <w:r>
           <w:rPr>
             <w:rStyle w:val="Hyperlink"/>
             <w:sz w:val="19"/>
             <w:szCs w:val="19"/>
           </w:rPr>
+          <w:t xml:space="preserve">8.2</w:t>
+        </w:r>
+      </w:hyperlink>
+    </w:p>
+    <w:p>
+      <w:pPr>
+        <w:tabs>
+          <w:tab w:val="right" w:pos="4200" w:leader="dot"/>
+        </w:tabs>
+        <w:spacing w:after="10"/>
+      </w:pPr>
+      <w:r>
+        <w:rPr>
+          <w:sz w:val="19"/>
+          <w:szCs w:val="19"/>
+        </w:rPr>
+        <w:t xml:space="preserve">Curves</w:t>
+      </w:r>
+      <w:r>
+        <w:rPr>
+          <w:sz w:val="19"/>
+          <w:szCs w:val="19"/>
+        </w:rPr>
+        <w:tab/>
+      </w:r>
+      <w:hyperlink w:history="1" w:anchor="s_9_3">
+        <w:r>
+          <w:rPr>
+            <w:rStyle w:val="Hyperlink"/>
+            <w:sz w:val="19"/>
+            <w:szCs w:val="19"/>
+          </w:rPr>
           <w:t xml:space="preserve">9.3</w:t>
         </w:r>
       </w:hyperlink>
@@ -37701,6 +37798,70 @@
             <w:szCs w:val="19"/>
           </w:rPr>
           <w:t xml:space="preserve">8.5</w:t>
+        </w:r>
+      </w:hyperlink>
+    </w:p>
+    <w:p>
+      <w:pPr>
+        <w:tabs>
+          <w:tab w:val="right" w:pos="4200" w:leader="dot"/>
+        </w:tabs>
+        <w:spacing w:after="10"/>
+      </w:pPr>
+      <w:r>
+        <w:rPr>
+          <w:sz w:val="19"/>
+          <w:szCs w:val="19"/>
+        </w:rPr>
+        <w:t xml:space="preserve">Update Now</w:t>
+      </w:r>
+      <w:r>
+        <w:rPr>
+          <w:sz w:val="19"/>
+          <w:szCs w:val="19"/>
+        </w:rPr>
+        <w:tab/>
+      </w:r>
+      <w:hyperlink w:history="1" w:anchor="s_11_2">
+        <w:r>
+          <w:rPr>
+            <w:rStyle w:val="Hyperlink"/>
+            <w:sz w:val="19"/>
+            <w:szCs w:val="19"/>
+          </w:rPr>
+          <w:t xml:space="preserve">11.2</w:t>
+        </w:r>
+      </w:hyperlink>
+    </w:p>
+    <w:p>
+      <w:pPr>
+        <w:tabs>
+          <w:tab w:val="right" w:pos="4200" w:leader="dot"/>
+        </w:tabs>
+        <w:spacing w:after="10"/>
+      </w:pPr>
+      <w:r>
+        <w:rPr>
+          <w:sz w:val="19"/>
+          <w:szCs w:val="19"/>
+        </w:rPr>
+        <w:t xml:space="preserve">Updates</w:t>
+      </w:r>
+      <w:r>
+        <w:rPr>
+          <w:sz w:val="19"/>
+          <w:szCs w:val="19"/>
+        </w:rPr>
+        <w:tab/>
+      </w:r>
+      <w:hyperlink w:history="1" w:anchor="s_11_2">
+        <w:r>
+          <w:rPr>
+            <w:rStyle w:val="Hyperlink"/>
+            <w:sz w:val="19"/>
+            <w:szCs w:val="19"/>
+          </w:rPr>
+          <w:t xml:space="preserve">11.2</w:t>
         </w:r>
       </w:hyperlink>
     </w:p>

</xml_diff>

<commit_message>
0.9.122: Update Now on the Mac - works when macOS runs the app from a hidden read-only copy (opened straight from Downloads) and when Applications itself is locked; the new version is swapped in only once fully copied; Zip My Logs says whether Update Now can install and why not
Co-Authored-By: Claude Opus 5.5 <noreply@anthropic.com>
Claude-Session: https://claude.ai/code/session_01FKvd69QsnCvM2zbzYnPwmF
</commit_message>
<xml_diff>
--- a/docs/SubZeroAstro_User_Manual.docx
+++ b/docs/SubZeroAstro_User_Manual.docx
@@ -121,7 +121,7 @@
           <w:sz w:val="22"/>
           <w:szCs w:val="22"/>
         </w:rPr>
-        <w:t xml:space="preserve">Version 0.9.120 beta  ·  Windows and Mac (Apple silicon)</w:t>
+        <w:t xml:space="preserve">Version 0.9.122 beta  ·  Windows and Mac (Apple silicon)</w:t>
       </w:r>
     </w:p>
     <w:p>
@@ -22914,7 +22914,27 @@
         <w:t xml:space="preserve">Help › Check for Updates at Startup</w:t>
       </w:r>
       <w:r>
-        <w:t xml:space="preserve"> to stop the automatic check. If SubZeroAstro is in a folder it can't write to (or runs from Python), Update Now opens the download page instead.</w:t>
+        <w:t xml:space="preserve"> to stop the automatic check. If SubZeroAstro is in a folder it can't write to (or runs from Python), the button says </w:t>
+      </w:r>
+      <w:r>
+        <w:rPr>
+          <w:b/>
+          <w:bCs/>
+        </w:rPr>
+        <w:t xml:space="preserve">Download…</w:t>
+      </w:r>
+      <w:r>
+        <w:t xml:space="preserve"> and opens the download page instead; hover over it to see why. On a Mac, keep SubZeroAstro.app in </w:t>
+      </w:r>
+      <w:r>
+        <w:rPr>
+          <w:b/>
+          <w:bCs/>
+        </w:rPr>
+        <w:t xml:space="preserve">Applications</w:t>
+      </w:r>
+      <w:r>
+        <w:t xml:space="preserve"> (or another folder of yours) - an app opened straight from the Downloads folder runs from a hidden read-only copy and can't update itself.</w:t>
       </w:r>
     </w:p>
     <w:p>

</xml_diff>

<commit_message>
0.9.125: author shown as Brian A. Poteet, DVM (every page, intro animation, Help > About, the manual and the app's file details)
Co-Authored-By: Claude Opus 5.5 <noreply@anthropic.com>
Claude-Session: https://claude.ai/code/session_01FKvd69QsnCvM2zbzYnPwmF
</commit_message>
<xml_diff>
--- a/docs/SubZeroAstro_User_Manual.docx
+++ b/docs/SubZeroAstro_User_Manual.docx
@@ -121,7 +121,7 @@
           <w:sz w:val="22"/>
           <w:szCs w:val="22"/>
         </w:rPr>
-        <w:t xml:space="preserve">Version 0.9.122 beta  ·  Windows and Mac (Apple silicon)</w:t>
+        <w:t xml:space="preserve">Version 0.9.125 beta  ·  Windows and Mac (Apple silicon)</w:t>
       </w:r>
     </w:p>
     <w:p>
@@ -134,7 +134,7 @@
           <w:sz w:val="22"/>
           <w:szCs w:val="22"/>
         </w:rPr>
-        <w:t xml:space="preserve">by Brian A. Poteet  ·  October 2026</w:t>
+        <w:t xml:space="preserve">by Brian A. Poteet, DVM  ·  October 2026</w:t>
       </w:r>
     </w:p>
     <w:p>
@@ -25033,7 +25033,7 @@
           <w:b/>
           <w:bCs/>
         </w:rPr>
-        <w:t xml:space="preserve">Brian A. Poteet</w:t>
+        <w:t xml:space="preserve">Brian A. Poteet, DVM</w:t>
       </w:r>
       <w:r>
         <w:t xml:space="preserve">, built with Claude (Anthropic). The culling view was inspired by FITS Blaster for macOS by Tom van Peer. PixInsight, BlurXTerminator, NoiseXTerminator, StarXTerminator, GraXpert, ASTAP, AstroBin and the telescope and filter names mentioned are trademarks of their respective owners.</w:t>

</xml_diff>

<commit_message>
0.9.126: comet processing - Bring Out the Tail and Reveal Comet Jets (Larson-Sekanina) on page 4 for comets; comets shot filter by filter (NINA Orbitals: R, G, B then L) are lined up across the filters while the stars stay put; full comet guide in the manual
Co-Authored-By: Claude Opus 5.5 <noreply@anthropic.com>
Claude-Session: https://claude.ai/code/session_01FKvd69QsnCvM2zbzYnPwmF
</commit_message>
<xml_diff>
--- a/docs/SubZeroAstro_User_Manual.docx
+++ b/docs/SubZeroAstro_User_Manual.docx
@@ -121,7 +121,7 @@
           <w:sz w:val="22"/>
           <w:szCs w:val="22"/>
         </w:rPr>
-        <w:t xml:space="preserve">Version 0.9.125 beta  ·  Windows and Mac (Apple silicon)</w:t>
+        <w:t xml:space="preserve">Version 0.9.126 beta  ·  Windows and Mac (Apple silicon)</w:t>
       </w:r>
     </w:p>
     <w:p>
@@ -2177,6 +2177,89 @@
           </w:p>
         </w:tc>
       </w:tr>
+      <w:tr>
+        <w:trPr>
+          <w:cantSplit/>
+        </w:trPr>
+        <w:tc>
+          <w:tcPr>
+            <w:tcW w:type="dxa" w:w="2500"/>
+            <w:tcBorders>
+              <w:top w:val="single" w:color="BFBFBF" w:sz="4"/>
+              <w:left w:val="single" w:color="BFBFBF" w:sz="4"/>
+              <w:bottom w:val="single" w:color="BFBFBF" w:sz="4"/>
+              <w:right w:val="single" w:color="BFBFBF" w:sz="4"/>
+            </w:tcBorders>
+            <w:tcMar>
+              <w:top w:type="dxa" w:w="30"/>
+              <w:left w:type="dxa" w:w="90"/>
+              <w:bottom w:type="dxa" w:w="30"/>
+              <w:right w:type="dxa" w:w="90"/>
+            </w:tcMar>
+          </w:tcPr>
+          <w:p>
+            <w:r>
+              <w:rPr>
+                <w:sz w:val="18"/>
+                <w:szCs w:val="18"/>
+              </w:rPr>
+              <w:t xml:space="preserve">Comet LRGB</w:t>
+            </w:r>
+          </w:p>
+        </w:tc>
+        <w:tc>
+          <w:tcPr>
+            <w:tcW w:type="dxa" w:w="5960"/>
+            <w:tcBorders>
+              <w:top w:val="single" w:color="BFBFBF" w:sz="4"/>
+              <w:left w:val="single" w:color="BFBFBF" w:sz="4"/>
+              <w:bottom w:val="single" w:color="BFBFBF" w:sz="4"/>
+              <w:right w:val="single" w:color="BFBFBF" w:sz="4"/>
+            </w:tcBorders>
+            <w:tcMar>
+              <w:top w:type="dxa" w:w="30"/>
+              <w:left w:type="dxa" w:w="90"/>
+              <w:bottom w:type="dxa" w:w="30"/>
+              <w:right w:type="dxa" w:w="90"/>
+            </w:tcMar>
+          </w:tcPr>
+          <w:p>
+            <w:r>
+              <w:rPr>
+                <w:sz w:val="18"/>
+                <w:szCs w:val="18"/>
+              </w:rPr>
+              <w:t xml:space="preserve">Filters shot one after another (NINA Orbitals): the comet is lined up across the filters on page 4, the stars stay put</w:t>
+            </w:r>
+          </w:p>
+        </w:tc>
+        <w:tc>
+          <w:tcPr>
+            <w:tcW w:type="dxa" w:w="900"/>
+            <w:tcBorders>
+              <w:top w:val="single" w:color="BFBFBF" w:sz="4"/>
+              <w:left w:val="single" w:color="BFBFBF" w:sz="4"/>
+              <w:bottom w:val="single" w:color="BFBFBF" w:sz="4"/>
+              <w:right w:val="single" w:color="BFBFBF" w:sz="4"/>
+            </w:tcBorders>
+            <w:tcMar>
+              <w:top w:type="dxa" w:w="30"/>
+              <w:left w:type="dxa" w:w="90"/>
+              <w:bottom w:type="dxa" w:w="30"/>
+              <w:right w:type="dxa" w:w="90"/>
+            </w:tcMar>
+          </w:tcPr>
+          <w:p>
+            <w:r>
+              <w:rPr>
+                <w:sz w:val="18"/>
+                <w:szCs w:val="18"/>
+              </w:rPr>
+              <w:t xml:space="preserve">0.9.126</w:t>
+            </w:r>
+          </w:p>
+        </w:tc>
+      </w:tr>
     </w:tbl>
     <w:p>
       <w:pPr>
@@ -2781,6 +2864,89 @@
                 <w:sz w:val="18"/>
                 <w:szCs w:val="18"/>
               </w:rPr>
+              <w:t xml:space="preserve">Comet steps</w:t>
+            </w:r>
+          </w:p>
+        </w:tc>
+        <w:tc>
+          <w:tcPr>
+            <w:tcW w:type="dxa" w:w="5960"/>
+            <w:tcBorders>
+              <w:top w:val="single" w:color="BFBFBF" w:sz="4"/>
+              <w:left w:val="single" w:color="BFBFBF" w:sz="4"/>
+              <w:bottom w:val="single" w:color="BFBFBF" w:sz="4"/>
+              <w:right w:val="single" w:color="BFBFBF" w:sz="4"/>
+            </w:tcBorders>
+            <w:tcMar>
+              <w:top w:type="dxa" w:w="30"/>
+              <w:left w:type="dxa" w:w="90"/>
+              <w:bottom w:type="dxa" w:w="30"/>
+              <w:right w:type="dxa" w:w="90"/>
+            </w:tcMar>
+          </w:tcPr>
+          <w:p>
+            <w:r>
+              <w:rPr>
+                <w:sz w:val="18"/>
+                <w:szCs w:val="18"/>
+              </w:rPr>
+              <w:t xml:space="preserve">Bring Out the Tail and Reveal Comet Jets (Larson-Sekanina), offered for comets after the stretch</w:t>
+            </w:r>
+          </w:p>
+        </w:tc>
+        <w:tc>
+          <w:tcPr>
+            <w:tcW w:type="dxa" w:w="900"/>
+            <w:tcBorders>
+              <w:top w:val="single" w:color="BFBFBF" w:sz="4"/>
+              <w:left w:val="single" w:color="BFBFBF" w:sz="4"/>
+              <w:bottom w:val="single" w:color="BFBFBF" w:sz="4"/>
+              <w:right w:val="single" w:color="BFBFBF" w:sz="4"/>
+            </w:tcBorders>
+            <w:tcMar>
+              <w:top w:type="dxa" w:w="30"/>
+              <w:left w:type="dxa" w:w="90"/>
+              <w:bottom w:type="dxa" w:w="30"/>
+              <w:right w:type="dxa" w:w="90"/>
+            </w:tcMar>
+          </w:tcPr>
+          <w:p>
+            <w:r>
+              <w:rPr>
+                <w:sz w:val="18"/>
+                <w:szCs w:val="18"/>
+              </w:rPr>
+              <w:t xml:space="preserve">0.9.126</w:t>
+            </w:r>
+          </w:p>
+        </w:tc>
+      </w:tr>
+      <w:tr>
+        <w:trPr>
+          <w:cantSplit/>
+        </w:trPr>
+        <w:tc>
+          <w:tcPr>
+            <w:tcW w:type="dxa" w:w="2500"/>
+            <w:tcBorders>
+              <w:top w:val="single" w:color="BFBFBF" w:sz="4"/>
+              <w:left w:val="single" w:color="BFBFBF" w:sz="4"/>
+              <w:bottom w:val="single" w:color="BFBFBF" w:sz="4"/>
+              <w:right w:val="single" w:color="BFBFBF" w:sz="4"/>
+            </w:tcBorders>
+            <w:tcMar>
+              <w:top w:type="dxa" w:w="30"/>
+              <w:left w:type="dxa" w:w="90"/>
+              <w:bottom w:type="dxa" w:w="30"/>
+              <w:right w:type="dxa" w:w="90"/>
+            </w:tcMar>
+          </w:tcPr>
+          <w:p>
+            <w:r>
+              <w:rPr>
+                <w:sz w:val="18"/>
+                <w:szCs w:val="18"/>
+              </w:rPr>
               <w:t xml:space="preserve">Recommended next step</w:t>
             </w:r>
           </w:p>
@@ -4614,7 +4780,7 @@
           <w:b/>
           <w:bCs/>
         </w:rPr>
-        <w:t xml:space="preserve">37</w:t>
+        <w:t xml:space="preserve">38</w:t>
       </w:r>
     </w:p>
     <w:p>
@@ -4913,7 +5079,7 @@
           <w:b/>
           <w:bCs/>
         </w:rPr>
-        <w:t xml:space="preserve">43</w:t>
+        <w:t xml:space="preserve">44</w:t>
       </w:r>
     </w:p>
     <w:p>
@@ -4978,7 +5144,7 @@
           <w:b/>
           <w:bCs/>
         </w:rPr>
-        <w:t xml:space="preserve">45</w:t>
+        <w:t xml:space="preserve">46</w:t>
       </w:r>
     </w:p>
     <w:p>
@@ -5043,7 +5209,7 @@
           <w:b/>
           <w:bCs/>
         </w:rPr>
-        <w:t xml:space="preserve">46</w:t>
+        <w:t xml:space="preserve">47</w:t>
       </w:r>
     </w:p>
     <w:p>
@@ -5108,7 +5274,7 @@
           <w:b/>
           <w:bCs/>
         </w:rPr>
-        <w:t xml:space="preserve">47</w:t>
+        <w:t xml:space="preserve">48</w:t>
       </w:r>
     </w:p>
     <w:p>
@@ -5173,7 +5339,7 @@
           <w:b/>
           <w:bCs/>
         </w:rPr>
-        <w:t xml:space="preserve">48</w:t>
+        <w:t xml:space="preserve">49</w:t>
       </w:r>
     </w:p>
     <w:p>
@@ -5298,7 +5464,7 @@
             <w:b w:val="false"/>
             <w:bCs w:val="false"/>
           </w:rPr>
-          <w:t xml:space="preserve">15.7   Comets (more coming)</w:t>
+          <w:t xml:space="preserve">15.7   Comets</w:t>
         </w:r>
       </w:hyperlink>
     </w:p>
@@ -5364,7 +5530,7 @@
           <w:b/>
           <w:bCs/>
         </w:rPr>
-        <w:t xml:space="preserve">53</w:t>
+        <w:t xml:space="preserve">54</w:t>
       </w:r>
     </w:p>
     <w:p>
@@ -15520,6 +15686,158 @@
           </w:tcPr>
           <w:p>
             <w:r>
+              <w:t xml:space="preserve">Bring Out the Tail ◇ (comets)</w:t>
+            </w:r>
+          </w:p>
+        </w:tc>
+        <w:tc>
+          <w:tcPr>
+            <w:tcW w:type="dxa" w:w="4460"/>
+            <w:tcBorders>
+              <w:top w:val="single" w:color="BFBFBF" w:sz="4"/>
+              <w:left w:val="single" w:color="BFBFBF" w:sz="4"/>
+              <w:bottom w:val="single" w:color="BFBFBF" w:sz="4"/>
+              <w:right w:val="single" w:color="BFBFBF" w:sz="4"/>
+            </w:tcBorders>
+            <w:tcMar>
+              <w:top w:type="dxa" w:w="60"/>
+              <w:left w:type="dxa" w:w="100"/>
+              <w:bottom w:type="dxa" w:w="60"/>
+              <w:right w:type="dxa" w:w="100"/>
+            </w:tcMar>
+          </w:tcPr>
+          <w:p>
+            <w:r>
+              <w:t xml:space="preserve">Takes away part of the round glow of the comet's head (the coma), measured all the way round the nucleus, so the tail and ion streamers stand out</w:t>
+            </w:r>
+          </w:p>
+        </w:tc>
+        <w:tc>
+          <w:tcPr>
+            <w:tcW w:type="dxa" w:w="2400"/>
+            <w:tcBorders>
+              <w:top w:val="single" w:color="BFBFBF" w:sz="4"/>
+              <w:left w:val="single" w:color="BFBFBF" w:sz="4"/>
+              <w:bottom w:val="single" w:color="BFBFBF" w:sz="4"/>
+              <w:right w:val="single" w:color="BFBFBF" w:sz="4"/>
+            </w:tcBorders>
+            <w:tcMar>
+              <w:top w:type="dxa" w:w="60"/>
+              <w:left w:type="dxa" w:w="100"/>
+              <w:bottom w:type="dxa" w:w="60"/>
+              <w:right w:type="dxa" w:w="100"/>
+            </w:tcMar>
+          </w:tcPr>
+          <w:p>
+            <w:r>
+              <w:t xml:space="preserve">1/rho or azimuthal-median coma model + PixelMath</w:t>
+            </w:r>
+          </w:p>
+        </w:tc>
+      </w:tr>
+      <w:tr>
+        <w:trPr>
+          <w:cantSplit/>
+        </w:trPr>
+        <w:tc>
+          <w:tcPr>
+            <w:tcW w:type="dxa" w:w="2500"/>
+            <w:tcBorders>
+              <w:top w:val="single" w:color="BFBFBF" w:sz="4"/>
+              <w:left w:val="single" w:color="BFBFBF" w:sz="4"/>
+              <w:bottom w:val="single" w:color="BFBFBF" w:sz="4"/>
+              <w:right w:val="single" w:color="BFBFBF" w:sz="4"/>
+            </w:tcBorders>
+            <w:tcMar>
+              <w:top w:type="dxa" w:w="60"/>
+              <w:left w:type="dxa" w:w="100"/>
+              <w:bottom w:type="dxa" w:w="60"/>
+              <w:right w:type="dxa" w:w="100"/>
+            </w:tcMar>
+          </w:tcPr>
+          <w:p>
+            <w:r>
+              <w:t xml:space="preserve">Reveal Comet Jets ◇ (comets)</w:t>
+            </w:r>
+          </w:p>
+        </w:tc>
+        <w:tc>
+          <w:tcPr>
+            <w:tcW w:type="dxa" w:w="4460"/>
+            <w:tcBorders>
+              <w:top w:val="single" w:color="BFBFBF" w:sz="4"/>
+              <w:left w:val="single" w:color="BFBFBF" w:sz="4"/>
+              <w:bottom w:val="single" w:color="BFBFBF" w:sz="4"/>
+              <w:right w:val="single" w:color="BFBFBF" w:sz="4"/>
+            </w:tcBorders>
+            <w:tcMar>
+              <w:top w:type="dxa" w:w="60"/>
+              <w:left w:type="dxa" w:w="100"/>
+              <w:bottom w:type="dxa" w:w="60"/>
+              <w:right w:type="dxa" w:w="100"/>
+            </w:tcMar>
+          </w:tcPr>
+          <w:p>
+            <w:r>
+              <w:t xml:space="preserve">Brings out jets and shells near the nucleus by comparing the picture with copies of itself turned a little around the nucleus (Larson-Sekanina); </w:t>
+            </w:r>
+            <w:r>
+              <w:rPr>
+                <w:i/>
+                <w:iCs/>
+              </w:rPr>
+              <w:t xml:space="preserve">Jets map only</w:t>
+            </w:r>
+            <w:r>
+              <w:t xml:space="preserve"> gives the grey study picture. Best with the stars out</w:t>
+            </w:r>
+          </w:p>
+        </w:tc>
+        <w:tc>
+          <w:tcPr>
+            <w:tcW w:type="dxa" w:w="2400"/>
+            <w:tcBorders>
+              <w:top w:val="single" w:color="BFBFBF" w:sz="4"/>
+              <w:left w:val="single" w:color="BFBFBF" w:sz="4"/>
+              <w:bottom w:val="single" w:color="BFBFBF" w:sz="4"/>
+              <w:right w:val="single" w:color="BFBFBF" w:sz="4"/>
+            </w:tcBorders>
+            <w:tcMar>
+              <w:top w:type="dxa" w:w="60"/>
+              <w:left w:type="dxa" w:w="100"/>
+              <w:bottom w:type="dxa" w:w="60"/>
+              <w:right w:type="dxa" w:w="100"/>
+            </w:tcMar>
+          </w:tcPr>
+          <w:p>
+            <w:r>
+              <w:t xml:space="preserve">LarsonSekanina</w:t>
+            </w:r>
+          </w:p>
+        </w:tc>
+      </w:tr>
+      <w:tr>
+        <w:trPr>
+          <w:cantSplit/>
+        </w:trPr>
+        <w:tc>
+          <w:tcPr>
+            <w:tcW w:type="dxa" w:w="2500"/>
+            <w:tcBorders>
+              <w:top w:val="single" w:color="BFBFBF" w:sz="4"/>
+              <w:left w:val="single" w:color="BFBFBF" w:sz="4"/>
+              <w:bottom w:val="single" w:color="BFBFBF" w:sz="4"/>
+              <w:right w:val="single" w:color="BFBFBF" w:sz="4"/>
+            </w:tcBorders>
+            <w:tcMar>
+              <w:top w:type="dxa" w:w="60"/>
+              <w:left w:type="dxa" w:w="100"/>
+              <w:bottom w:type="dxa" w:w="60"/>
+              <w:right w:type="dxa" w:w="100"/>
+            </w:tcMar>
+          </w:tcPr>
+          <w:p>
+            <w:r>
               <w:t xml:space="preserve">Adjust Colours ◇</w:t>
             </w:r>
           </w:p>
@@ -26675,7 +26993,7 @@
       </w:pPr>
       <w:bookmarkStart w:name="s_15_7" w:id="1"/>
       <w:r>
-        <w:t xml:space="preserve">15.7   Comets (more coming)</w:t>
+        <w:t xml:space="preserve">15.7   Comets</w:t>
       </w:r>
       <w:bookmarkEnd w:id="1"/>
     </w:p>
@@ -26684,27 +27002,217 @@
         <w:spacing w:after="120"/>
       </w:pPr>
       <w:r>
-        <w:t xml:space="preserve">SubZeroAstro already makes a second stack that follows the comet (10.6). A full comet guide comes with the comet update. For now: many short subs (the comet moves), and process the </w:t>
+        <w:t xml:space="preserve">SubZeroAstro recognises a comet by its name (</w:t>
       </w:r>
       <w:r>
         <w:rPr>
           <w:i/>
           <w:iCs/>
         </w:rPr>
-        <w:t xml:space="preserve">_Comet</w:t>
-      </w:r>
-      <w:r>
-        <w:t xml:space="preserve"> master for the comet and the </w:t>
+        <w:t xml:space="preserve">C/2023 A3</w:t>
+      </w:r>
+      <w:r>
+        <w:t xml:space="preserve">, </w:t>
       </w:r>
       <w:r>
         <w:rPr>
           <w:i/>
           <w:iCs/>
         </w:rPr>
+        <w:t xml:space="preserve">12P/Pons-Brooks</w:t>
+      </w:r>
+      <w:r>
+        <w:t xml:space="preserve">, or any name with </w:t>
+      </w:r>
+      <w:r>
+        <w:rPr>
+          <w:i/>
+          <w:iCs/>
+        </w:rPr>
+        <w:t xml:space="preserve">comet</w:t>
+      </w:r>
+      <w:r>
+        <w:t xml:space="preserve"> in it) and handles it from stacking to the finished picture:</w:t>
+      </w:r>
+    </w:p>
+    <w:p>
+      <w:pPr>
+        <w:pStyle w:val="ListParagraph"/>
+        <w:numPr>
+          <w:ilvl w:val="0"/>
+          <w:numId w:val="2"/>
+        </w:numPr>
+        <w:spacing w:after="60"/>
+      </w:pPr>
+      <w:r>
+        <w:rPr>
+          <w:b/>
+          <w:bCs/>
+        </w:rPr>
+        <w:t xml:space="preserve">Capturing:</w:t>
+      </w:r>
+      <w:r>
+        <w:t xml:space="preserve"> many short subs - the comet moves. With N.I.N.A.'s </w:t>
+      </w:r>
+      <w:r>
+        <w:rPr>
+          <w:b/>
+          <w:bCs/>
+        </w:rPr>
+        <w:t xml:space="preserve">Orbitals</w:t>
+      </w:r>
+      <w:r>
+        <w:t xml:space="preserve"> plugin the mount follows the comet; a typical plan cycles the filters, e.g. 6 x 60 s each of R, G and B, then 6 x 30 s of L, again and again. Keep the target name the comet's name so SubZeroAstro knows it is a comet. Take flats for every filter as usual.</w:t>
+      </w:r>
+    </w:p>
+    <w:p>
+      <w:pPr>
+        <w:pStyle w:val="ListParagraph"/>
+        <w:numPr>
+          <w:ilvl w:val="0"/>
+          <w:numId w:val="2"/>
+        </w:numPr>
+        <w:spacing w:after="60"/>
+      </w:pPr>
+      <w:r>
+        <w:rPr>
+          <w:b/>
+          <w:bCs/>
+        </w:rPr>
+        <w:t xml:space="preserve">Page 2 (stacking):</w:t>
+      </w:r>
+      <w:r>
+        <w:t xml:space="preserve"> each filter is stacked on the stars and then again following the comet (10.6). The main master joins the sharp stars and the sharp comet; </w:t>
+      </w:r>
+      <w:r>
+        <w:rPr>
+          <w:i/>
+          <w:iCs/>
+        </w:rPr>
+        <w:t xml:space="preserve">_Comet</w:t>
+      </w:r>
+      <w:r>
+        <w:t xml:space="preserve"> and </w:t>
+      </w:r>
+      <w:r>
+        <w:rPr>
+          <w:i/>
+          <w:iCs/>
+        </w:rPr>
         <w:t xml:space="preserve">_Stars</w:t>
       </w:r>
       <w:r>
-        <w:t xml:space="preserve"> master for the stars.</w:t>
+        <w:t xml:space="preserve"> masters are saved next to it.</w:t>
+      </w:r>
+    </w:p>
+    <w:p>
+      <w:pPr>
+        <w:pStyle w:val="ListParagraph"/>
+        <w:numPr>
+          <w:ilvl w:val="0"/>
+          <w:numId w:val="2"/>
+        </w:numPr>
+        <w:spacing w:after="60"/>
+      </w:pPr>
+      <w:r>
+        <w:rPr>
+          <w:b/>
+          <w:bCs/>
+        </w:rPr>
+        <w:t xml:space="preserve">Page 4 (combining):</w:t>
+      </w:r>
+      <w:r>
+        <w:t xml:space="preserve"> when the filters were shot one after another, the comet sits in a slightly different place in each filter's master. SubZeroAstro moves just the comet (head and tail) in each filter onto the comet in the L (or first) master, so the comet's colours line up while the stars stay where they are. The load note says how far each filter's comet was moved.</w:t>
+      </w:r>
+    </w:p>
+    <w:p>
+      <w:pPr>
+        <w:pStyle w:val="ListParagraph"/>
+        <w:numPr>
+          <w:ilvl w:val="0"/>
+          <w:numId w:val="2"/>
+        </w:numPr>
+        <w:spacing w:after="60"/>
+      </w:pPr>
+      <w:r>
+        <w:rPr>
+          <w:b/>
+          <w:bCs/>
+        </w:rPr>
+        <w:t xml:space="preserve">Page 4 (steps):</w:t>
+      </w:r>
+      <w:r>
+        <w:t xml:space="preserve"> after </w:t>
+      </w:r>
+      <w:r>
+        <w:rPr>
+          <w:b/>
+          <w:bCs/>
+        </w:rPr>
+        <w:t xml:space="preserve">Brighten the Image (Stretch)</w:t>
+      </w:r>
+      <w:r>
+        <w:t xml:space="preserve">, two comet steps are offered: </w:t>
+      </w:r>
+      <w:r>
+        <w:rPr>
+          <w:b/>
+          <w:bCs/>
+        </w:rPr>
+        <w:t xml:space="preserve">Bring Out the Tail</w:t>
+      </w:r>
+      <w:r>
+        <w:t xml:space="preserve"> (take away part of the round coma so the tail and streamers show) and </w:t>
+      </w:r>
+      <w:r>
+        <w:rPr>
+          <w:b/>
+          <w:bCs/>
+        </w:rPr>
+        <w:t xml:space="preserve">Reveal Comet Jets</w:t>
+      </w:r>
+      <w:r>
+        <w:t xml:space="preserve"> (Larson-Sekanina: jets and shells near the nucleus; </w:t>
+      </w:r>
+      <w:r>
+        <w:rPr>
+          <w:i/>
+          <w:iCs/>
+        </w:rPr>
+        <w:t xml:space="preserve">Jets map only</w:t>
+      </w:r>
+      <w:r>
+        <w:t xml:space="preserve"> makes the grey study picture to save separately). </w:t>
+      </w:r>
+      <w:r>
+        <w:rPr>
+          <w:b/>
+          <w:bCs/>
+        </w:rPr>
+        <w:t xml:space="preserve">Darken the Sky Background</w:t>
+      </w:r>
+      <w:r>
+        <w:t xml:space="preserve"> is recommended so the faint tail stands out; star removal and shrinking are optional.</w:t>
+      </w:r>
+    </w:p>
+    <w:p>
+      <w:pPr>
+        <w:pStyle w:val="ListParagraph"/>
+        <w:numPr>
+          <w:ilvl w:val="0"/>
+          <w:numId w:val="2"/>
+        </w:numPr>
+        <w:spacing w:after="60"/>
+      </w:pPr>
+      <w:r>
+        <w:rPr>
+          <w:b/>
+          <w:bCs/>
+        </w:rPr>
+        <w:t xml:space="preserve">Tips:</w:t>
+      </w:r>
+      <w:r>
+        <w:t xml:space="preserve"> take the stars out before Reveal Comet Jets (stars turned around the nucleus leave little arcs). Use Go Back to Here to compare versions. A comet that barely moves during the session is simply stacked on the stars.</w:t>
       </w:r>
     </w:p>
     <w:p>
@@ -29679,7 +30187,7 @@
           <w:sz w:val="19"/>
           <w:szCs w:val="19"/>
         </w:rPr>
-        <w:t xml:space="preserve">Comet processing</w:t>
+        <w:t xml:space="preserve">Comet LRGB</w:t>
       </w:r>
       <w:r>
         <w:rPr>
@@ -29711,7 +30219,7 @@
           <w:sz w:val="19"/>
           <w:szCs w:val="19"/>
         </w:rPr>
-        <w:t xml:space="preserve">Comet stack</w:t>
+        <w:t xml:space="preserve">Comet processing</w:t>
       </w:r>
       <w:r>
         <w:rPr>
@@ -29720,14 +30228,14 @@
         </w:rPr>
         <w:tab/>
       </w:r>
-      <w:hyperlink w:history="1" w:anchor="s_10_6">
+      <w:hyperlink w:history="1" w:anchor="s_15_7">
         <w:r>
           <w:rPr>
             <w:rStyle w:val="Hyperlink"/>
             <w:sz w:val="19"/>
             <w:szCs w:val="19"/>
           </w:rPr>
-          <w:t xml:space="preserve">10.6</w:t>
+          <w:t xml:space="preserve">15.7</w:t>
         </w:r>
       </w:hyperlink>
     </w:p>
@@ -29743,7 +30251,7 @@
           <w:sz w:val="19"/>
           <w:szCs w:val="19"/>
         </w:rPr>
-        <w:t xml:space="preserve">Comets</w:t>
+        <w:t xml:space="preserve">Comet stack</w:t>
       </w:r>
       <w:r>
         <w:rPr>
@@ -29775,7 +30283,7 @@
           <w:sz w:val="19"/>
           <w:szCs w:val="19"/>
         </w:rPr>
-        <w:t xml:space="preserve">Continue button</w:t>
+        <w:t xml:space="preserve">Comet tail</w:t>
       </w:r>
       <w:r>
         <w:rPr>
@@ -29784,14 +30292,14 @@
         </w:rPr>
         <w:tab/>
       </w:r>
-      <w:hyperlink w:history="1" w:anchor="s_5_1">
+      <w:hyperlink w:history="1" w:anchor="s_15_7">
         <w:r>
           <w:rPr>
             <w:rStyle w:val="Hyperlink"/>
             <w:sz w:val="19"/>
             <w:szCs w:val="19"/>
           </w:rPr>
-          <w:t xml:space="preserve">5.1</w:t>
+          <w:t xml:space="preserve">15.7</w:t>
         </w:r>
       </w:hyperlink>
     </w:p>
@@ -29807,7 +30315,7 @@
           <w:sz w:val="19"/>
           <w:szCs w:val="19"/>
         </w:rPr>
-        <w:t xml:space="preserve">Continue to Calibrate and Stack</w:t>
+        <w:t xml:space="preserve">Comets</w:t>
       </w:r>
       <w:r>
         <w:rPr>
@@ -29816,14 +30324,14 @@
         </w:rPr>
         <w:tab/>
       </w:r>
-      <w:hyperlink w:history="1" w:anchor="s_6_5">
+      <w:hyperlink w:history="1" w:anchor="s_10_6">
         <w:r>
           <w:rPr>
             <w:rStyle w:val="Hyperlink"/>
             <w:sz w:val="19"/>
             <w:szCs w:val="19"/>
           </w:rPr>
-          <w:t xml:space="preserve">6.5</w:t>
+          <w:t xml:space="preserve">10.6</w:t>
         </w:r>
       </w:hyperlink>
     </w:p>
@@ -29839,7 +30347,7 @@
           <w:sz w:val="19"/>
           <w:szCs w:val="19"/>
         </w:rPr>
-        <w:t xml:space="preserve">Continue With the Rest</w:t>
+        <w:t xml:space="preserve">Continue button</w:t>
       </w:r>
       <w:r>
         <w:rPr>
@@ -29848,14 +30356,14 @@
         </w:rPr>
         <w:tab/>
       </w:r>
-      <w:hyperlink w:history="1" w:anchor="s_7_4">
+      <w:hyperlink w:history="1" w:anchor="s_5_1">
         <w:r>
           <w:rPr>
             <w:rStyle w:val="Hyperlink"/>
             <w:sz w:val="19"/>
             <w:szCs w:val="19"/>
           </w:rPr>
-          <w:t xml:space="preserve">7.4</w:t>
+          <w:t xml:space="preserve">5.1</w:t>
         </w:r>
       </w:hyperlink>
     </w:p>
@@ -29871,7 +30379,7 @@
           <w:sz w:val="19"/>
           <w:szCs w:val="19"/>
         </w:rPr>
-        <w:t xml:space="preserve">Crash recovery</w:t>
+        <w:t xml:space="preserve">Continue to Calibrate and Stack</w:t>
       </w:r>
       <w:r>
         <w:rPr>
@@ -29880,14 +30388,14 @@
         </w:rPr>
         <w:tab/>
       </w:r>
-      <w:hyperlink w:history="1" w:anchor="s_5_3">
+      <w:hyperlink w:history="1" w:anchor="s_6_5">
         <w:r>
           <w:rPr>
             <w:rStyle w:val="Hyperlink"/>
             <w:sz w:val="19"/>
             <w:szCs w:val="19"/>
           </w:rPr>
-          <w:t xml:space="preserve">5.3</w:t>
+          <w:t xml:space="preserve">6.5</w:t>
         </w:r>
       </w:hyperlink>
     </w:p>
@@ -29903,7 +30411,7 @@
           <w:sz w:val="19"/>
           <w:szCs w:val="19"/>
         </w:rPr>
-        <w:t xml:space="preserve">Credits</w:t>
+        <w:t xml:space="preserve">Continue With the Rest</w:t>
       </w:r>
       <w:r>
         <w:rPr>
@@ -29912,14 +30420,14 @@
         </w:rPr>
         <w:tab/>
       </w:r>
-      <w:hyperlink w:history="1" w:anchor="s_14_2">
+      <w:hyperlink w:history="1" w:anchor="s_7_4">
         <w:r>
           <w:rPr>
             <w:rStyle w:val="Hyperlink"/>
             <w:sz w:val="19"/>
             <w:szCs w:val="19"/>
           </w:rPr>
-          <w:t xml:space="preserve">14.2</w:t>
+          <w:t xml:space="preserve">7.4</w:t>
         </w:r>
       </w:hyperlink>
     </w:p>
@@ -29935,7 +30443,7 @@
           <w:sz w:val="19"/>
           <w:szCs w:val="19"/>
         </w:rPr>
-        <w:t xml:space="preserve">Crop</w:t>
+        <w:t xml:space="preserve">Crash recovery</w:t>
       </w:r>
       <w:r>
         <w:rPr>
@@ -29944,14 +30452,14 @@
         </w:rPr>
         <w:tab/>
       </w:r>
-      <w:hyperlink w:history="1" w:anchor="s_8_2">
+      <w:hyperlink w:history="1" w:anchor="s_5_3">
         <w:r>
           <w:rPr>
             <w:rStyle w:val="Hyperlink"/>
             <w:sz w:val="19"/>
             <w:szCs w:val="19"/>
           </w:rPr>
-          <w:t xml:space="preserve">8.2</w:t>
+          <w:t xml:space="preserve">5.3</w:t>
         </w:r>
       </w:hyperlink>
     </w:p>
@@ -29967,7 +30475,7 @@
           <w:sz w:val="19"/>
           <w:szCs w:val="19"/>
         </w:rPr>
-        <w:t xml:space="preserve">Curves</w:t>
+        <w:t xml:space="preserve">Credits</w:t>
       </w:r>
       <w:r>
         <w:rPr>
@@ -29976,13 +30484,77 @@
         </w:rPr>
         <w:tab/>
       </w:r>
-      <w:hyperlink w:history="1" w:anchor="s_9_3">
+      <w:hyperlink w:history="1" w:anchor="s_14_2">
         <w:r>
           <w:rPr>
             <w:rStyle w:val="Hyperlink"/>
             <w:sz w:val="19"/>
             <w:szCs w:val="19"/>
           </w:rPr>
+          <w:t xml:space="preserve">14.2</w:t>
+        </w:r>
+      </w:hyperlink>
+    </w:p>
+    <w:p>
+      <w:pPr>
+        <w:tabs>
+          <w:tab w:val="right" w:pos="4200" w:leader="dot"/>
+        </w:tabs>
+        <w:spacing w:after="10"/>
+      </w:pPr>
+      <w:r>
+        <w:rPr>
+          <w:sz w:val="19"/>
+          <w:szCs w:val="19"/>
+        </w:rPr>
+        <w:t xml:space="preserve">Crop</w:t>
+      </w:r>
+      <w:r>
+        <w:rPr>
+          <w:sz w:val="19"/>
+          <w:szCs w:val="19"/>
+        </w:rPr>
+        <w:tab/>
+      </w:r>
+      <w:hyperlink w:history="1" w:anchor="s_8_2">
+        <w:r>
+          <w:rPr>
+            <w:rStyle w:val="Hyperlink"/>
+            <w:sz w:val="19"/>
+            <w:szCs w:val="19"/>
+          </w:rPr>
+          <w:t xml:space="preserve">8.2</w:t>
+        </w:r>
+      </w:hyperlink>
+    </w:p>
+    <w:p>
+      <w:pPr>
+        <w:tabs>
+          <w:tab w:val="right" w:pos="4200" w:leader="dot"/>
+        </w:tabs>
+        <w:spacing w:after="10"/>
+      </w:pPr>
+      <w:r>
+        <w:rPr>
+          <w:sz w:val="19"/>
+          <w:szCs w:val="19"/>
+        </w:rPr>
+        <w:t xml:space="preserve">Curves</w:t>
+      </w:r>
+      <w:r>
+        <w:rPr>
+          <w:sz w:val="19"/>
+          <w:szCs w:val="19"/>
+        </w:rPr>
+        <w:tab/>
+      </w:r>
+      <w:hyperlink w:history="1" w:anchor="s_9_3">
+        <w:r>
+          <w:rPr>
+            <w:rStyle w:val="Hyperlink"/>
+            <w:sz w:val="19"/>
+            <w:szCs w:val="19"/>
+          </w:rPr>
           <w:t xml:space="preserve">9.3</w:t>
         </w:r>
       </w:hyperlink>
@@ -32772,7 +33344,7 @@
           <w:sz w:val="19"/>
           <w:szCs w:val="19"/>
         </w:rPr>
-        <w:t xml:space="preserve">Less aggressive</w:t>
+        <w:t xml:space="preserve">Larson-Sekanina</w:t>
       </w:r>
       <w:r>
         <w:rPr>
@@ -32781,14 +33353,14 @@
         </w:rPr>
         <w:tab/>
       </w:r>
-      <w:hyperlink w:history="1" w:anchor="s_6_3">
+      <w:hyperlink w:history="1" w:anchor="s_15_7">
         <w:r>
           <w:rPr>
             <w:rStyle w:val="Hyperlink"/>
             <w:sz w:val="19"/>
             <w:szCs w:val="19"/>
           </w:rPr>
-          <w:t xml:space="preserve">6.3</w:t>
+          <w:t xml:space="preserve">15.7</w:t>
         </w:r>
       </w:hyperlink>
     </w:p>
@@ -32804,7 +33376,7 @@
           <w:sz w:val="19"/>
           <w:szCs w:val="19"/>
         </w:rPr>
-        <w:t xml:space="preserve">Licence</w:t>
+        <w:t xml:space="preserve">Less aggressive</w:t>
       </w:r>
       <w:r>
         <w:rPr>
@@ -32813,14 +33385,14 @@
         </w:rPr>
         <w:tab/>
       </w:r>
-      <w:hyperlink w:history="1" w:anchor="s_14_2">
+      <w:hyperlink w:history="1" w:anchor="s_6_3">
         <w:r>
           <w:rPr>
             <w:rStyle w:val="Hyperlink"/>
             <w:sz w:val="19"/>
             <w:szCs w:val="19"/>
           </w:rPr>
-          <w:t xml:space="preserve">14.2</w:t>
+          <w:t xml:space="preserve">6.3</w:t>
         </w:r>
       </w:hyperlink>
     </w:p>
@@ -32836,7 +33408,7 @@
           <w:sz w:val="19"/>
           <w:szCs w:val="19"/>
         </w:rPr>
-        <w:t xml:space="preserve">Light groups</w:t>
+        <w:t xml:space="preserve">Licence</w:t>
       </w:r>
       <w:r>
         <w:rPr>
@@ -32845,14 +33417,14 @@
         </w:rPr>
         <w:tab/>
       </w:r>
-      <w:hyperlink w:history="1" w:anchor="s_7_1">
+      <w:hyperlink w:history="1" w:anchor="s_14_2">
         <w:r>
           <w:rPr>
             <w:rStyle w:val="Hyperlink"/>
             <w:sz w:val="19"/>
             <w:szCs w:val="19"/>
           </w:rPr>
-          <w:t xml:space="preserve">7.1</w:t>
+          <w:t xml:space="preserve">14.2</w:t>
         </w:r>
       </w:hyperlink>
     </w:p>
@@ -32868,7 +33440,7 @@
           <w:sz w:val="19"/>
           <w:szCs w:val="19"/>
         </w:rPr>
-        <w:t xml:space="preserve">Light leak</w:t>
+        <w:t xml:space="preserve">Light groups</w:t>
       </w:r>
       <w:r>
         <w:rPr>
@@ -32877,14 +33449,14 @@
         </w:rPr>
         <w:tab/>
       </w:r>
-      <w:hyperlink w:history="1" w:anchor="s_7_2">
+      <w:hyperlink w:history="1" w:anchor="s_7_1">
         <w:r>
           <w:rPr>
             <w:rStyle w:val="Hyperlink"/>
             <w:sz w:val="19"/>
             <w:szCs w:val="19"/>
           </w:rPr>
-          <w:t xml:space="preserve">7.2</w:t>
+          <w:t xml:space="preserve">7.1</w:t>
         </w:r>
       </w:hyperlink>
     </w:p>
@@ -32900,7 +33472,7 @@
           <w:sz w:val="19"/>
           <w:szCs w:val="19"/>
         </w:rPr>
-        <w:t xml:space="preserve">Light pollution</w:t>
+        <w:t xml:space="preserve">Light leak</w:t>
       </w:r>
       <w:r>
         <w:rPr>
@@ -32909,14 +33481,14 @@
         </w:rPr>
         <w:tab/>
       </w:r>
-      <w:hyperlink w:history="1" w:anchor="s_8_4">
+      <w:hyperlink w:history="1" w:anchor="s_7_2">
         <w:r>
           <w:rPr>
             <w:rStyle w:val="Hyperlink"/>
             <w:sz w:val="19"/>
             <w:szCs w:val="19"/>
           </w:rPr>
-          <w:t xml:space="preserve">8.4</w:t>
+          <w:t xml:space="preserve">7.2</w:t>
         </w:r>
       </w:hyperlink>
     </w:p>
@@ -32932,7 +33504,7 @@
           <w:sz w:val="19"/>
           <w:szCs w:val="19"/>
         </w:rPr>
-        <w:t xml:space="preserve">Line up all filters</w:t>
+        <w:t xml:space="preserve">Light pollution</w:t>
       </w:r>
       <w:r>
         <w:rPr>
@@ -32941,14 +33513,14 @@
         </w:rPr>
         <w:tab/>
       </w:r>
-      <w:hyperlink w:history="1" w:anchor="s_7_3">
+      <w:hyperlink w:history="1" w:anchor="s_8_4">
         <w:r>
           <w:rPr>
             <w:rStyle w:val="Hyperlink"/>
             <w:sz w:val="19"/>
             <w:szCs w:val="19"/>
           </w:rPr>
-          <w:t xml:space="preserve">7.3</w:t>
+          <w:t xml:space="preserve">8.4</w:t>
         </w:r>
       </w:hyperlink>
     </w:p>
@@ -32964,7 +33536,7 @@
           <w:sz w:val="19"/>
           <w:szCs w:val="19"/>
         </w:rPr>
-        <w:t xml:space="preserve">Linear</w:t>
+        <w:t xml:space="preserve">Line up all filters</w:t>
       </w:r>
       <w:r>
         <w:rPr>
@@ -32973,14 +33545,14 @@
         </w:rPr>
         <w:tab/>
       </w:r>
-      <w:hyperlink w:history="1" w:anchor="s_1_3">
+      <w:hyperlink w:history="1" w:anchor="s_7_3">
         <w:r>
           <w:rPr>
             <w:rStyle w:val="Hyperlink"/>
             <w:sz w:val="19"/>
             <w:szCs w:val="19"/>
           </w:rPr>
-          <w:t xml:space="preserve">1.3</w:t>
+          <w:t xml:space="preserve">7.3</w:t>
         </w:r>
       </w:hyperlink>
     </w:p>
@@ -32996,7 +33568,7 @@
           <w:sz w:val="19"/>
           <w:szCs w:val="19"/>
         </w:rPr>
-        <w:t xml:space="preserve">Load Light Frame Data</w:t>
+        <w:t xml:space="preserve">Linear</w:t>
       </w:r>
       <w:r>
         <w:rPr>
@@ -33005,14 +33577,14 @@
         </w:rPr>
         <w:tab/>
       </w:r>
-      <w:hyperlink w:history="1" w:anchor="s_6_1">
+      <w:hyperlink w:history="1" w:anchor="s_1_3">
         <w:r>
           <w:rPr>
             <w:rStyle w:val="Hyperlink"/>
             <w:sz w:val="19"/>
             <w:szCs w:val="19"/>
           </w:rPr>
-          <w:t xml:space="preserve">6.1</w:t>
+          <w:t xml:space="preserve">1.3</w:t>
         </w:r>
       </w:hyperlink>
     </w:p>
@@ -33028,7 +33600,7 @@
           <w:sz w:val="19"/>
           <w:szCs w:val="19"/>
         </w:rPr>
-        <w:t xml:space="preserve">Log</w:t>
+        <w:t xml:space="preserve">Load Light Frame Data</w:t>
       </w:r>
       <w:r>
         <w:rPr>
@@ -33037,14 +33609,14 @@
         </w:rPr>
         <w:tab/>
       </w:r>
-      <w:hyperlink w:history="1" w:anchor="s_5_2">
+      <w:hyperlink w:history="1" w:anchor="s_6_1">
         <w:r>
           <w:rPr>
             <w:rStyle w:val="Hyperlink"/>
             <w:sz w:val="19"/>
             <w:szCs w:val="19"/>
           </w:rPr>
-          <w:t xml:space="preserve">5.2</w:t>
+          <w:t xml:space="preserve">6.1</w:t>
         </w:r>
       </w:hyperlink>
     </w:p>
@@ -33060,7 +33632,7 @@
           <w:sz w:val="19"/>
           <w:szCs w:val="19"/>
         </w:rPr>
-        <w:t xml:space="preserve">Logs</w:t>
+        <w:t xml:space="preserve">Log</w:t>
       </w:r>
       <w:r>
         <w:rPr>
@@ -33069,14 +33641,14 @@
         </w:rPr>
         <w:tab/>
       </w:r>
-      <w:hyperlink w:history="1" w:anchor="s_11_2">
+      <w:hyperlink w:history="1" w:anchor="s_5_2">
         <w:r>
           <w:rPr>
             <w:rStyle w:val="Hyperlink"/>
             <w:sz w:val="19"/>
             <w:szCs w:val="19"/>
           </w:rPr>
-          <w:t xml:space="preserve">11.2</w:t>
+          <w:t xml:space="preserve">5.2</w:t>
         </w:r>
       </w:hyperlink>
     </w:p>
@@ -33092,7 +33664,7 @@
           <w:sz w:val="19"/>
           <w:szCs w:val="19"/>
         </w:rPr>
-        <w:t xml:space="preserve">LRGB Ha step by step</w:t>
+        <w:t xml:space="preserve">Logs</w:t>
       </w:r>
       <w:r>
         <w:rPr>
@@ -33101,14 +33673,14 @@
         </w:rPr>
         <w:tab/>
       </w:r>
-      <w:hyperlink w:history="1" w:anchor="s_10_13">
+      <w:hyperlink w:history="1" w:anchor="s_11_2">
         <w:r>
           <w:rPr>
             <w:rStyle w:val="Hyperlink"/>
             <w:sz w:val="19"/>
             <w:szCs w:val="19"/>
           </w:rPr>
-          <w:t xml:space="preserve">10.13</w:t>
+          <w:t xml:space="preserve">11.2</w:t>
         </w:r>
       </w:hyperlink>
     </w:p>
@@ -33124,7 +33696,7 @@
           <w:sz w:val="19"/>
           <w:szCs w:val="19"/>
         </w:rPr>
-        <w:t xml:space="preserve">LRGB recipe</w:t>
+        <w:t xml:space="preserve">LRGB Ha step by step</w:t>
       </w:r>
       <w:r>
         <w:rPr>
@@ -33133,14 +33705,14 @@
         </w:rPr>
         <w:tab/>
       </w:r>
-      <w:hyperlink w:history="1" w:anchor="s_10_3">
+      <w:hyperlink w:history="1" w:anchor="s_10_13">
         <w:r>
           <w:rPr>
             <w:rStyle w:val="Hyperlink"/>
             <w:sz w:val="19"/>
             <w:szCs w:val="19"/>
           </w:rPr>
-          <w:t xml:space="preserve">10.3</w:t>
+          <w:t xml:space="preserve">10.13</w:t>
         </w:r>
       </w:hyperlink>
     </w:p>
@@ -33156,7 +33728,7 @@
           <w:sz w:val="19"/>
           <w:szCs w:val="19"/>
         </w:rPr>
-        <w:t xml:space="preserve">LRGB recipe step by step</w:t>
+        <w:t xml:space="preserve">LRGB recipe</w:t>
       </w:r>
       <w:r>
         <w:rPr>
@@ -33165,14 +33737,14 @@
         </w:rPr>
         <w:tab/>
       </w:r>
-      <w:hyperlink w:history="1" w:anchor="s_10_12">
+      <w:hyperlink w:history="1" w:anchor="s_10_3">
         <w:r>
           <w:rPr>
             <w:rStyle w:val="Hyperlink"/>
             <w:sz w:val="19"/>
             <w:szCs w:val="19"/>
           </w:rPr>
-          <w:t xml:space="preserve">10.12</w:t>
+          <w:t xml:space="preserve">10.3</w:t>
         </w:r>
       </w:hyperlink>
     </w:p>
@@ -33188,7 +33760,7 @@
           <w:sz w:val="19"/>
           <w:szCs w:val="19"/>
         </w:rPr>
-        <w:t xml:space="preserve">Lucky imaging</w:t>
+        <w:t xml:space="preserve">LRGB recipe step by step</w:t>
       </w:r>
       <w:r>
         <w:rPr>
@@ -33197,13 +33769,45 @@
         </w:rPr>
         <w:tab/>
       </w:r>
-      <w:hyperlink w:history="1" w:anchor="s_15_8">
+      <w:hyperlink w:history="1" w:anchor="s_10_12">
         <w:r>
           <w:rPr>
             <w:rStyle w:val="Hyperlink"/>
             <w:sz w:val="19"/>
             <w:szCs w:val="19"/>
           </w:rPr>
+          <w:t xml:space="preserve">10.12</w:t>
+        </w:r>
+      </w:hyperlink>
+    </w:p>
+    <w:p>
+      <w:pPr>
+        <w:tabs>
+          <w:tab w:val="right" w:pos="4200" w:leader="dot"/>
+        </w:tabs>
+        <w:spacing w:after="10"/>
+      </w:pPr>
+      <w:r>
+        <w:rPr>
+          <w:sz w:val="19"/>
+          <w:szCs w:val="19"/>
+        </w:rPr>
+        <w:t xml:space="preserve">Lucky imaging</w:t>
+      </w:r>
+      <w:r>
+        <w:rPr>
+          <w:sz w:val="19"/>
+          <w:szCs w:val="19"/>
+        </w:rPr>
+        <w:tab/>
+      </w:r>
+      <w:hyperlink w:history="1" w:anchor="s_15_8">
+        <w:r>
+          <w:rPr>
+            <w:rStyle w:val="Hyperlink"/>
+            <w:sz w:val="19"/>
+            <w:szCs w:val="19"/>
+          </w:rPr>
           <w:t xml:space="preserve">15.8</w:t>
         </w:r>
       </w:hyperlink>
@@ -34335,6 +34939,38 @@
             <w:szCs w:val="19"/>
           </w:rPr>
           <w:t xml:space="preserve">9.7</w:t>
+        </w:r>
+      </w:hyperlink>
+    </w:p>
+    <w:p>
+      <w:pPr>
+        <w:tabs>
+          <w:tab w:val="right" w:pos="4200" w:leader="dot"/>
+        </w:tabs>
+        <w:spacing w:after="10"/>
+      </w:pPr>
+      <w:r>
+        <w:rPr>
+          <w:sz w:val="19"/>
+          <w:szCs w:val="19"/>
+        </w:rPr>
+        <w:t xml:space="preserve">Orbitals</w:t>
+      </w:r>
+      <w:r>
+        <w:rPr>
+          <w:sz w:val="19"/>
+          <w:szCs w:val="19"/>
+        </w:rPr>
+        <w:tab/>
+      </w:r>
+      <w:hyperlink w:history="1" w:anchor="s_15_7">
+        <w:r>
+          <w:rPr>
+            <w:rStyle w:val="Hyperlink"/>
+            <w:sz w:val="19"/>
+            <w:szCs w:val="19"/>
+          </w:rPr>
+          <w:t xml:space="preserve">15.7</w:t>
         </w:r>
       </w:hyperlink>
     </w:p>

</xml_diff>

<commit_message>
0.9.127: Save Project As can keep the masters with the project (a Masters folder inside it, star images and stack logs included) - one folder per target; moved projects still find their masters
Co-Authored-By: Claude Opus 5.5 <noreply@anthropic.com>
Claude-Session: https://claude.ai/code/session_01FKvd69QsnCvM2zbzYnPwmF
</commit_message>
<xml_diff>
--- a/docs/SubZeroAstro_User_Manual.docx
+++ b/docs/SubZeroAstro_User_Manual.docx
@@ -121,7 +121,7 @@
           <w:sz w:val="22"/>
           <w:szCs w:val="22"/>
         </w:rPr>
-        <w:t xml:space="preserve">Version 0.9.126 beta  ·  Windows and Mac (Apple silicon)</w:t>
+        <w:t xml:space="preserve">Version 0.9.127 beta  ·  Windows and Mac (Apple silicon)</w:t>
       </w:r>
     </w:p>
     <w:p>
@@ -2834,6 +2834,89 @@
                 <w:szCs w:val="18"/>
               </w:rPr>
               <w:t xml:space="preserve">Since</w:t>
+            </w:r>
+          </w:p>
+        </w:tc>
+      </w:tr>
+      <w:tr>
+        <w:trPr>
+          <w:cantSplit/>
+        </w:trPr>
+        <w:tc>
+          <w:tcPr>
+            <w:tcW w:type="dxa" w:w="2500"/>
+            <w:tcBorders>
+              <w:top w:val="single" w:color="BFBFBF" w:sz="4"/>
+              <w:left w:val="single" w:color="BFBFBF" w:sz="4"/>
+              <w:bottom w:val="single" w:color="BFBFBF" w:sz="4"/>
+              <w:right w:val="single" w:color="BFBFBF" w:sz="4"/>
+            </w:tcBorders>
+            <w:tcMar>
+              <w:top w:type="dxa" w:w="30"/>
+              <w:left w:type="dxa" w:w="90"/>
+              <w:bottom w:type="dxa" w:w="30"/>
+              <w:right w:type="dxa" w:w="90"/>
+            </w:tcMar>
+          </w:tcPr>
+          <w:p>
+            <w:r>
+              <w:rPr>
+                <w:sz w:val="18"/>
+                <w:szCs w:val="18"/>
+              </w:rPr>
+              <w:t xml:space="preserve">Masters kept with the project</w:t>
+            </w:r>
+          </w:p>
+        </w:tc>
+        <w:tc>
+          <w:tcPr>
+            <w:tcW w:type="dxa" w:w="5960"/>
+            <w:tcBorders>
+              <w:top w:val="single" w:color="BFBFBF" w:sz="4"/>
+              <w:left w:val="single" w:color="BFBFBF" w:sz="4"/>
+              <w:bottom w:val="single" w:color="BFBFBF" w:sz="4"/>
+              <w:right w:val="single" w:color="BFBFBF" w:sz="4"/>
+            </w:tcBorders>
+            <w:tcMar>
+              <w:top w:type="dxa" w:w="30"/>
+              <w:left w:type="dxa" w:w="90"/>
+              <w:bottom w:type="dxa" w:w="30"/>
+              <w:right w:type="dxa" w:w="90"/>
+            </w:tcMar>
+          </w:tcPr>
+          <w:p>
+            <w:r>
+              <w:rPr>
+                <w:sz w:val="18"/>
+                <w:szCs w:val="18"/>
+              </w:rPr>
+              <w:t xml:space="preserve">Save Project As can copy the masters into the project folder - one folder per target</w:t>
+            </w:r>
+          </w:p>
+        </w:tc>
+        <w:tc>
+          <w:tcPr>
+            <w:tcW w:type="dxa" w:w="900"/>
+            <w:tcBorders>
+              <w:top w:val="single" w:color="BFBFBF" w:sz="4"/>
+              <w:left w:val="single" w:color="BFBFBF" w:sz="4"/>
+              <w:bottom w:val="single" w:color="BFBFBF" w:sz="4"/>
+              <w:right w:val="single" w:color="BFBFBF" w:sz="4"/>
+            </w:tcBorders>
+            <w:tcMar>
+              <w:top w:type="dxa" w:w="30"/>
+              <w:left w:type="dxa" w:w="90"/>
+              <w:bottom w:type="dxa" w:w="30"/>
+              <w:right w:type="dxa" w:w="90"/>
+            </w:tcMar>
+          </w:tcPr>
+          <w:p>
+            <w:r>
+              <w:rPr>
+                <w:sz w:val="18"/>
+                <w:szCs w:val="18"/>
+              </w:rPr>
+              <w:t xml:space="preserve">0.9.127</w:t>
             </w:r>
           </w:p>
         </w:tc>
@@ -17880,7 +17963,27 @@
         <w:t xml:space="preserve">Open a Saved Project…</w:t>
       </w:r>
       <w:r>
-        <w:t xml:space="preserve"> button in the Load Light Frame Data window (or File › Open a Saved Project, Ctrl+Shift+O, on page 1) goes straight to Finishing Touches on its last step. Pick the project's folder or the folder you saved it into.</w:t>
+        <w:t xml:space="preserve"> button in the Load Light Frame Data window (or File › Open a Saved Project, Ctrl+Shift+O, on page 1) goes straight to Finishing Touches on its last step. Pick the project's folder or the folder you saved it into. </w:t>
+      </w:r>
+      <w:r>
+        <w:rPr>
+          <w:b/>
+          <w:bCs/>
+        </w:rPr>
+        <w:t xml:space="preserve">Keep the masters with the project?</w:t>
+      </w:r>
+      <w:r>
+        <w:t xml:space="preserve"> (asked when you save; Yes by default) copies the masters the project uses - with their star images and stack logs - into a </w:t>
+      </w:r>
+      <w:r>
+        <w:rPr>
+          <w:i/>
+          <w:iCs/>
+        </w:rPr>
+        <w:t xml:space="preserve">Masters</w:t>
+      </w:r>
+      <w:r>
+        <w:t xml:space="preserve"> folder inside the project, so one folder holds everything for the target and you can move or back it up as a whole; redoing page 3, adding nights and Share to AstroBin keep working. Your original masters are not touched. For a project saved before this option existed: open it, choose Save Project As… and pick the same folder.</w:t>
       </w:r>
     </w:p>
     <w:p>

</xml_diff>

<commit_message>
0.9.128: keeping the masters with a project also keeps the stacked master behind each page-3 master; project folders copied between Mac and PC find their masters; page-3 masters record the stacked master they came from (ORIGFILE)
Co-Authored-By: Claude Opus 5.5 <noreply@anthropic.com>
Claude-Session: https://claude.ai/code/session_01FKvd69QsnCvM2zbzYnPwmF
</commit_message>
<xml_diff>
--- a/docs/SubZeroAstro_User_Manual.docx
+++ b/docs/SubZeroAstro_User_Manual.docx
@@ -121,7 +121,7 @@
           <w:sz w:val="22"/>
           <w:szCs w:val="22"/>
         </w:rPr>
-        <w:t xml:space="preserve">Version 0.9.127 beta  ·  Windows and Mac (Apple silicon)</w:t>
+        <w:t xml:space="preserve">Version 0.9.128 beta  ·  Windows and Mac (Apple silicon)</w:t>
       </w:r>
     </w:p>
     <w:p>
@@ -17983,7 +17983,17 @@
         <w:t xml:space="preserve">Masters</w:t>
       </w:r>
       <w:r>
-        <w:t xml:space="preserve"> folder inside the project, so one folder holds everything for the target and you can move or back it up as a whole; redoing page 3, adding nights and Share to AstroBin keep working. Your original masters are not touched. For a project saved before this option existed: open it, choose Save Project As… and pick the same folder.</w:t>
+        <w:t xml:space="preserve"> folder inside the project, so one folder holds everything for the target and you can move or back it up as a whole; redoing page 3, adding nights and Share to AstroBin keep working. It also keeps the stacked master behind each page 3 (</w:t>
+      </w:r>
+      <w:r>
+        <w:rPr>
+          <w:i/>
+          <w:iCs/>
+        </w:rPr>
+        <w:t xml:space="preserve">_prepared</w:t>
+      </w:r>
+      <w:r>
+        <w:t xml:space="preserve">) master, so you can redo page 3 from scratch. Your original masters are copied, never moved or deleted - delete them yourself once the project reopens fine. A project folder with its masters inside can be copied between a Mac and a PC and still finds them. For a project saved before this option existed: open it, choose Save Project As… and pick the same folder.</w:t>
       </w:r>
     </w:p>
     <w:p>

</xml_diff>

<commit_message>
Organize: Duplicates… - see each duplicate next to the kept copy; keep, move to a Duplicates folder (undoable) or delete (exact byte-for-byte copies only)
Co-Authored-By: Claude Opus 5.5 <noreply@anthropic.com>
Claude-Session: https://claude.ai/code/session_01FKvd69QsnCvM2zbzYnPwmF
</commit_message>
<xml_diff>
--- a/docs/SubZeroAstro_User_Manual.docx
+++ b/docs/SubZeroAstro_User_Manual.docx
@@ -121,7 +121,7 @@
           <w:sz w:val="22"/>
           <w:szCs w:val="22"/>
         </w:rPr>
-        <w:t xml:space="preserve">Version 0.9.129 beta  ·  Windows and Mac (Apple silicon)</w:t>
+        <w:t xml:space="preserve">Version 0.9.130 beta  ·  Windows and Mac (Apple silicon)</w:t>
       </w:r>
     </w:p>
     <w:p>
@@ -1110,7 +1110,7 @@
                 <w:sz w:val="18"/>
                 <w:szCs w:val="18"/>
               </w:rPr>
-              <w:t xml:space="preserve">Sorts a folder, drive or NAS of FITS/XISF subs and masters into Targets › night › LIGHT/FLAT, a darks library and masters folders - preview first, copy or move, undo</w:t>
+              <w:t xml:space="preserve">Sorts a folder, drive or NAS of FITS/XISF subs and masters into Targets › night › LIGHT/FLAT, a darks library and masters folders - preview first, copy or move, undo; duplicates flagged and kept, set aside or deleted</w:t>
             </w:r>
           </w:p>
         </w:tc>
@@ -1136,7 +1136,7 @@
                 <w:sz w:val="18"/>
                 <w:szCs w:val="18"/>
               </w:rPr>
-              <w:t xml:space="preserve">0.9.129</w:t>
+              <w:t xml:space="preserve">0.9.129 / 0.9.130</w:t>
             </w:r>
           </w:p>
         </w:tc>
@@ -26147,7 +26147,47 @@
         <w:t xml:space="preserve">L_001 copy.fits</w:t>
       </w:r>
       <w:r>
-        <w:t xml:space="preserve">) and files that can't be read are left where they are and listed, so you can check them and delete them yourself. SubZeroAstro never deletes a picture.</w:t>
+        <w:t xml:space="preserve">) are left where they are and flagged. Press </w:t>
+      </w:r>
+      <w:r>
+        <w:rPr>
+          <w:b/>
+          <w:bCs/>
+        </w:rPr>
+        <w:t xml:space="preserve">Duplicates…</w:t>
+      </w:r>
+      <w:r>
+        <w:t xml:space="preserve"> to see each one next to the copy that is kept, tick the ones to deal with, then </w:t>
+      </w:r>
+      <w:r>
+        <w:rPr>
+          <w:b/>
+          <w:bCs/>
+        </w:rPr>
+        <w:t xml:space="preserve">Keep Them</w:t>
+      </w:r>
+      <w:r>
+        <w:t xml:space="preserve">, </w:t>
+      </w:r>
+      <w:r>
+        <w:rPr>
+          <w:b/>
+          <w:bCs/>
+        </w:rPr>
+        <w:t xml:space="preserve">Move to a Duplicates Folder</w:t>
+      </w:r>
+      <w:r>
+        <w:t xml:space="preserve"> (set aside; Undo Last Run puts them back) or </w:t>
+      </w:r>
+      <w:r>
+        <w:rPr>
+          <w:b/>
+          <w:bCs/>
+        </w:rPr>
+        <w:t xml:space="preserve">Delete Ticked Duplicates…</w:t>
+      </w:r>
+      <w:r>
+        <w:t xml:space="preserve">. Delete compares every byte first and only deletes an exact copy - a file with the same capture time but different contents is kept for you to look at. Files that can't be read are left where they are and listed.</w:t>
       </w:r>
     </w:p>
     <w:p>

</xml_diff>

<commit_message>
Self-test: the updater test's pretend 'newer' release is now 9.0.x, so it stays newer than the app (it hung the 0.9.130 build waiting on an 'up to date' message); manual rebuilt
Co-Authored-By: Claude Opus 5.5 <noreply@anthropic.com>
Claude-Session: https://claude.ai/code/session_01FKvd69QsnCvM2zbzYnPwmF
</commit_message>
<xml_diff>
--- a/docs/SubZeroAstro_User_Manual.docx
+++ b/docs/SubZeroAstro_User_Manual.docx
@@ -9019,7 +9019,7 @@
         <w:spacing w:after="120"/>
       </w:pPr>
       <w:r>
-        <w:t xml:space="preserve">When SubZeroAstro starts, it checks for ASTAP, GraXpert and the RC-Astro CLI in the background. If one is missing - or RC-Astro is installed but a tool is not licensed - a slim </w:t>
+        <w:t xml:space="preserve">When SubZeroAstro starts, it checks for ASTAP, GraXpert and the RC-Astro CLI in the background. If one is missing - or RC-Astro is installed but a tool is not licensed, or ASTAP has no star database next to it (ASTAP can't plate solve without one; D50 is a separate download on the same page) - a slim </w:t>
       </w:r>
       <w:r>
         <w:rPr>
@@ -26701,7 +26701,67 @@
         <w:t xml:space="preserve">Saved projects</w:t>
       </w:r>
       <w:r>
-        <w:t xml:space="preserve"> (page 4) and files already in the right place are left alone, so running it again on the same library only tidies what is new.</w:t>
+        <w:t xml:space="preserve"> (page 4), files already in the right place, and the in-between folders other programs make (</w:t>
+      </w:r>
+      <w:r>
+        <w:rPr>
+          <w:i/>
+          <w:iCs/>
+        </w:rPr>
+        <w:t xml:space="preserve">calibrated</w:t>
+      </w:r>
+      <w:r>
+        <w:t xml:space="preserve">, </w:t>
+      </w:r>
+      <w:r>
+        <w:rPr>
+          <w:i/>
+          <w:iCs/>
+        </w:rPr>
+        <w:t xml:space="preserve">registered</w:t>
+      </w:r>
+      <w:r>
+        <w:t xml:space="preserve">, </w:t>
+      </w:r>
+      <w:r>
+        <w:rPr>
+          <w:i/>
+          <w:iCs/>
+        </w:rPr>
+        <w:t xml:space="preserve">debayered</w:t>
+      </w:r>
+      <w:r>
+        <w:t xml:space="preserve">, </w:t>
+      </w:r>
+      <w:r>
+        <w:rPr>
+          <w:i/>
+          <w:iCs/>
+        </w:rPr>
+        <w:t xml:space="preserve">process</w:t>
+      </w:r>
+      <w:r>
+        <w:t xml:space="preserve"> … from PixInsight WBPP, Siril or APP) are left alone, so running it again on the same library only tidies what is new.</w:t>
+      </w:r>
+    </w:p>
+    <w:p>
+      <w:pPr>
+        <w:pStyle w:val="ListParagraph"/>
+        <w:numPr>
+          <w:ilvl w:val="0"/>
+          <w:numId w:val="2"/>
+        </w:numPr>
+        <w:spacing w:after="60"/>
+      </w:pPr>
+      <w:r>
+        <w:rPr>
+          <w:b/>
+          <w:bCs/>
+        </w:rPr>
+        <w:t xml:space="preserve">Move on the same drive is instant</w:t>
+      </w:r>
+      <w:r>
+        <w:t xml:space="preserve"> - the files only get a new folder, nothing is copied - so organizing a big drive in place takes about as long as reading the headers. Copy, or moving to another drive, copies every byte.</w:t>
       </w:r>
     </w:p>
     <w:p>

</xml_diff>

<commit_message>
Stacking: a calibration subframe moved or deleted after it was added is left out (noted in the log) instead of stopping the stack; the drizzle suggestion says the stack is fine and offers Stack Again with Drizzle / Not Now; mount drivers in TELESCOP (AvalonStarGo.NET, EQMOD …) no longer become the telescope name; Organize buttons say Step 1 / Step 2
Co-Authored-By: Claude Opus 5.5 <noreply@anthropic.com>
Claude-Session: https://claude.ai/code/session_01FKvd69QsnCvM2zbzYnPwmF
</commit_message>
<xml_diff>
--- a/docs/SubZeroAstro_User_Manual.docx
+++ b/docs/SubZeroAstro_User_Manual.docx
@@ -121,7 +121,7 @@
           <w:sz w:val="22"/>
           <w:szCs w:val="22"/>
         </w:rPr>
-        <w:t xml:space="preserve">Version 0.9.131 beta  ·  Windows and Mac (Apple silicon)</w:t>
+        <w:t xml:space="preserve">Version 0.9.132 beta  ·  Windows and Mac (Apple silicon)</w:t>
       </w:r>
     </w:p>
     <w:p>
@@ -26568,7 +26568,7 @@
           <w:b/>
           <w:bCs/>
         </w:rPr>
-        <w:t xml:space="preserve">Look Through the Files</w:t>
+        <w:t xml:space="preserve">Step 1 – Look Through the Files</w:t>
       </w:r>
       <w:r>
         <w:t xml:space="preserve"> only reads - it shows how many files go where, and a list of each file, where it goes and why. Nothing changes until you press </w:t>
@@ -26578,10 +26578,10 @@
           <w:b/>
           <w:bCs/>
         </w:rPr>
-        <w:t xml:space="preserve">Organize</w:t>
-      </w:r>
-      <w:r>
-        <w:t xml:space="preserve">.</w:t>
+        <w:t xml:space="preserve">Step 2 – Organize</w:t>
+      </w:r>
+      <w:r>
+        <w:t xml:space="preserve"> (greyed out until Step 1 has run).</w:t>
       </w:r>
     </w:p>
     <w:p>

</xml_diff>

<commit_message>
Manual 13.3: diagrams of where Organize My Astro Files puts each file, and an example library
Co-Authored-By: Claude Opus 5.5 <noreply@anthropic.com>
Claude-Session: https://claude.ai/code/session_01FKvd69QsnCvM2zbzYnPwmF
</commit_message>
<xml_diff>
--- a/docs/SubZeroAstro_User_Manual.docx
+++ b/docs/SubZeroAstro_User_Manual.docx
@@ -5559,7 +5559,7 @@
           <w:b/>
           <w:bCs/>
         </w:rPr>
-        <w:t xml:space="preserve">51</w:t>
+        <w:t xml:space="preserve">52</w:t>
       </w:r>
     </w:p>
     <w:p>
@@ -5624,7 +5624,7 @@
           <w:b/>
           <w:bCs/>
         </w:rPr>
-        <w:t xml:space="preserve">52</w:t>
+        <w:t xml:space="preserve">53</w:t>
       </w:r>
     </w:p>
     <w:p>
@@ -5815,7 +5815,7 @@
           <w:b/>
           <w:bCs/>
         </w:rPr>
-        <w:t xml:space="preserve">57</w:t>
+        <w:t xml:space="preserve">58</w:t>
       </w:r>
     </w:p>
     <w:p>
@@ -26533,6 +26533,132 @@
       <w:pPr>
         <w:spacing w:after="120"/>
       </w:pPr>
+    </w:p>
+    <w:p>
+      <w:pPr>
+        <w:keepNext/>
+        <w:spacing w:after="40" w:before="120"/>
+        <w:jc w:val="center"/>
+      </w:pPr>
+      <w:r>
+        <w:drawing>
+          <wp:inline distT="0" distB="0" distL="0" distR="0">
+            <wp:extent cx="4572000" cy="3962400"/>
+            <wp:effectExtent t="0" r="0" b="0" l="0"/>
+            <wp:docPr id="1" name="organize_routing.png" descr="Where each file goes: the header decides - per-target folders (purple) and shared libraries by camera settings (teal)" title="Where each file goes: the header decides - per-target folders (purple) and shared libraries by camera settings (teal)"/>
+            <wp:cNvGraphicFramePr>
+              <a:graphicFrameLocks xmlns:a="http://schemas.openxmlformats.org/drawingml/2006/main" noChangeAspect="1"/>
+            </wp:cNvGraphicFramePr>
+            <a:graphic xmlns:a="http://schemas.openxmlformats.org/drawingml/2006/main">
+              <a:graphicData uri="http://schemas.openxmlformats.org/drawingml/2006/picture">
+                <pic:pic xmlns:pic="http://schemas.openxmlformats.org/drawingml/2006/picture">
+                  <pic:nvPicPr>
+                    <pic:cNvPr id="0" name="" descr=""/>
+                    <pic:cNvPicPr>
+                      <a:picLocks noChangeAspect="1" noChangeArrowheads="1"/>
+                    </pic:cNvPicPr>
+                  </pic:nvPicPr>
+                  <pic:blipFill>
+                    <a:blip r:embed="rId25" cstate="none"/>
+                    <a:srcRect/>
+                    <a:stretch>
+                      <a:fillRect/>
+                    </a:stretch>
+                  </pic:blipFill>
+                  <pic:spPr bwMode="auto">
+                    <a:xfrm>
+                      <a:off x="0" y="0"/>
+                      <a:ext cx="4572000" cy="3962400"/>
+                    </a:xfrm>
+                    <a:prstGeom prst="rect">
+                      <a:avLst/>
+                    </a:prstGeom>
+                  </pic:spPr>
+                </pic:pic>
+              </a:graphicData>
+            </a:graphic>
+          </wp:inline>
+        </w:drawing>
+      </w:r>
+    </w:p>
+    <w:p>
+      <w:pPr>
+        <w:spacing w:after="200"/>
+        <w:jc w:val="center"/>
+      </w:pPr>
+      <w:r>
+        <w:rPr>
+          <w:i/>
+          <w:iCs/>
+          <w:color w:val="595959"/>
+          <w:sz w:val="18"/>
+          <w:szCs w:val="18"/>
+        </w:rPr>
+        <w:t xml:space="preserve">Where each file goes: the header decides - per-target folders (purple) and shared libraries by camera settings (teal)</w:t>
+      </w:r>
+    </w:p>
+    <w:p>
+      <w:pPr>
+        <w:keepNext/>
+        <w:spacing w:after="40" w:before="120"/>
+        <w:jc w:val="center"/>
+      </w:pPr>
+      <w:r>
+        <w:drawing>
+          <wp:inline distT="0" distB="0" distL="0" distR="0">
+            <wp:extent cx="4572000" cy="3790950"/>
+            <wp:effectExtent t="0" r="0" b="0" l="0"/>
+            <wp:docPr id="1" name="organize_tree.png" descr="An organized library (example: M 31 shot with two telescopes)" title="An organized library (example: M 31 shot with two telescopes)"/>
+            <wp:cNvGraphicFramePr>
+              <a:graphicFrameLocks xmlns:a="http://schemas.openxmlformats.org/drawingml/2006/main" noChangeAspect="1"/>
+            </wp:cNvGraphicFramePr>
+            <a:graphic xmlns:a="http://schemas.openxmlformats.org/drawingml/2006/main">
+              <a:graphicData uri="http://schemas.openxmlformats.org/drawingml/2006/picture">
+                <pic:pic xmlns:pic="http://schemas.openxmlformats.org/drawingml/2006/picture">
+                  <pic:nvPicPr>
+                    <pic:cNvPr id="0" name="" descr=""/>
+                    <pic:cNvPicPr>
+                      <a:picLocks noChangeAspect="1" noChangeArrowheads="1"/>
+                    </pic:cNvPicPr>
+                  </pic:nvPicPr>
+                  <pic:blipFill>
+                    <a:blip r:embed="rId26" cstate="none"/>
+                    <a:srcRect/>
+                    <a:stretch>
+                      <a:fillRect/>
+                    </a:stretch>
+                  </pic:blipFill>
+                  <pic:spPr bwMode="auto">
+                    <a:xfrm>
+                      <a:off x="0" y="0"/>
+                      <a:ext cx="4572000" cy="3790950"/>
+                    </a:xfrm>
+                    <a:prstGeom prst="rect">
+                      <a:avLst/>
+                    </a:prstGeom>
+                  </pic:spPr>
+                </pic:pic>
+              </a:graphicData>
+            </a:graphic>
+          </wp:inline>
+        </w:drawing>
+      </w:r>
+    </w:p>
+    <w:p>
+      <w:pPr>
+        <w:spacing w:after="200"/>
+        <w:jc w:val="center"/>
+      </w:pPr>
+      <w:r>
+        <w:rPr>
+          <w:i/>
+          <w:iCs/>
+          <w:color w:val="595959"/>
+          <w:sz w:val="18"/>
+          <w:szCs w:val="18"/>
+        </w:rPr>
+        <w:t xml:space="preserve">An organized library (example: M 31 shot with two telescopes)</w:t>
+      </w:r>
     </w:p>
     <w:p>
       <w:pPr>

</xml_diff>

<commit_message>
Organize: calibration-only folders - flats join a target already organized from that night (same scope), else Flats/<scope>/<night>/<filter>; files without IMAGETYP recognised from Flats/Darks/Bias folders above them
Co-Authored-By: Claude Opus 5.5 <noreply@anthropic.com>
Claude-Session: https://claude.ai/code/session_01FKvd69QsnCvM2zbzYnPwmF
</commit_message>
<xml_diff>
--- a/docs/SubZeroAstro_User_Manual.docx
+++ b/docs/SubZeroAstro_User_Manual.docx
@@ -121,7 +121,7 @@
           <w:sz w:val="22"/>
           <w:szCs w:val="22"/>
         </w:rPr>
-        <w:t xml:space="preserve">Version 0.9.133 beta  ·  Windows and Mac (Apple silicon)</w:t>
+        <w:t xml:space="preserve">Version 0.9.134 beta  ·  Windows and Mac (Apple silicon)</w:t>
       </w:r>
     </w:p>
     <w:p>
@@ -26225,7 +26225,7 @@
               <w:t xml:space="preserve">Targets/&lt;target&gt;/&lt;night&gt;/FLAT/&lt;filter&gt;/</w:t>
             </w:r>
             <w:r>
-              <w:t xml:space="preserve"> - with the target shot that night (same telescope); </w:t>
+              <w:t xml:space="preserve"> - with the target shot that night with the same telescope, including targets organized in an earlier run (so a folder of calibration frames only can be sorted on its own); otherwise </w:t>
             </w:r>
             <w:r>
               <w:rPr>
@@ -26233,10 +26233,40 @@
                 <w:sz w:val="19"/>
                 <w:szCs w:val="19"/>
               </w:rPr>
-              <w:t xml:space="preserve">Flats/&lt;night&gt;/…</w:t>
-            </w:r>
-            <w:r>
-              <w:t xml:space="preserve"> if several targets could own them</w:t>
+              <w:t xml:space="preserve">Flats/&lt;scope&gt;/&lt;night&gt;/&lt;filter&gt;/</w:t>
+            </w:r>
+            <w:r>
+              <w:t xml:space="preserve">. Files without IMAGETYP are recognised from folder names above them (</w:t>
+            </w:r>
+            <w:r>
+              <w:rPr>
+                <w:i/>
+                <w:iCs/>
+              </w:rPr>
+              <w:t xml:space="preserve">Flats</w:t>
+            </w:r>
+            <w:r>
+              <w:t xml:space="preserve">, </w:t>
+            </w:r>
+            <w:r>
+              <w:rPr>
+                <w:i/>
+                <w:iCs/>
+              </w:rPr>
+              <w:t xml:space="preserve">Darks</w:t>
+            </w:r>
+            <w:r>
+              <w:t xml:space="preserve">, </w:t>
+            </w:r>
+            <w:r>
+              <w:rPr>
+                <w:i/>
+                <w:iCs/>
+              </w:rPr>
+              <w:t xml:space="preserve">Bias</w:t>
+            </w:r>
+            <w:r>
+              <w:t xml:space="preserve">)</w:t>
             </w:r>
           </w:p>
         </w:tc>
@@ -26704,10 +26734,20 @@
           <w:b/>
           <w:bCs/>
         </w:rPr>
-        <w:t xml:space="preserve">Step 2 – Organize</w:t>
-      </w:r>
-      <w:r>
-        <w:t xml:space="preserve"> (greyed out until Step 1 has run).</w:t>
+        <w:t xml:space="preserve">Step 3 – Organize</w:t>
+      </w:r>
+      <w:r>
+        <w:t xml:space="preserve"> (greyed out until Step 1 has run). Do </w:t>
+      </w:r>
+      <w:r>
+        <w:rPr>
+          <w:b/>
+          <w:bCs/>
+        </w:rPr>
+        <w:t xml:space="preserve">Step 2 – Duplicates…</w:t>
+      </w:r>
+      <w:r>
+        <w:t xml:space="preserve"> in between when Step 1 finds any.</w:t>
       </w:r>
     </w:p>
     <w:p>
@@ -26774,10 +26814,10 @@
           <w:b/>
           <w:bCs/>
         </w:rPr>
-        <w:t xml:space="preserve">Duplicates…</w:t>
-      </w:r>
-      <w:r>
-        <w:t xml:space="preserve"> to see each one next to the copy that is kept, tick the ones to deal with, then </w:t>
+        <w:t xml:space="preserve">Step 2 – Duplicates…</w:t>
+      </w:r>
+      <w:r>
+        <w:t xml:space="preserve"> (before Step 3 – Organize) to see each one next to the copy that is kept, tick the ones to deal with, then </w:t>
       </w:r>
       <w:r>
         <w:rPr>

</xml_diff>

<commit_message>
Organize: darks, bias and calibration masters are filed per rig (your SZA rig name, else telescope, else focal length, else the folder above Darks/Flats/Bias) - same-model cameras on different rigs keep separate libraries; same-moment frames from different rigs are never duplicates
Co-Authored-By: Claude Opus 5.5 <noreply@anthropic.com>
Claude-Session: https://claude.ai/code/session_01FKvd69QsnCvM2zbzYnPwmF
</commit_message>
<xml_diff>
--- a/docs/SubZeroAstro_User_Manual.docx
+++ b/docs/SubZeroAstro_User_Manual.docx
@@ -5559,7 +5559,7 @@
           <w:b/>
           <w:bCs/>
         </w:rPr>
-        <w:t xml:space="preserve">52</w:t>
+        <w:t xml:space="preserve">53</w:t>
       </w:r>
     </w:p>
     <w:p>
@@ -5624,7 +5624,7 @@
           <w:b/>
           <w:bCs/>
         </w:rPr>
-        <w:t xml:space="preserve">53</w:t>
+        <w:t xml:space="preserve">54</w:t>
       </w:r>
     </w:p>
     <w:p>
@@ -5815,7 +5815,7 @@
           <w:b/>
           <w:bCs/>
         </w:rPr>
-        <w:t xml:space="preserve">58</w:t>
+        <w:t xml:space="preserve">59</w:t>
       </w:r>
     </w:p>
     <w:p>
@@ -26320,7 +26320,10 @@
                 <w:sz w:val="19"/>
                 <w:szCs w:val="19"/>
               </w:rPr>
-              <w:t xml:space="preserve">Darks library/&lt;camera&gt;_G&lt;gain&gt;_O&lt;offset&gt;_&lt;temp&gt;C/&lt;exposure&gt;s/</w:t>
+              <w:t xml:space="preserve">Darks library/&lt;rig&gt;/&lt;camera&gt;_G&lt;gain&gt;_O&lt;offset&gt;_&lt;temp&gt;C/&lt;exposure&gt;s/</w:t>
+            </w:r>
+            <w:r>
+              <w:t xml:space="preserve"> - one library per rig, because two cameras of the same model are still two different sensors (hot pixels, amp glow)</w:t>
             </w:r>
           </w:p>
         </w:tc>
@@ -26374,7 +26377,7 @@
                 <w:sz w:val="19"/>
                 <w:szCs w:val="19"/>
               </w:rPr>
-              <w:t xml:space="preserve">Bias library/&lt;camera&gt;_G&lt;gain&gt;_O&lt;offset&gt;_&lt;temp&gt;C/</w:t>
+              <w:t xml:space="preserve">Bias library/&lt;rig&gt;/&lt;camera&gt;_G&lt;gain&gt;_O&lt;offset&gt;_&lt;temp&gt;C/</w:t>
             </w:r>
           </w:p>
         </w:tc>
@@ -26485,7 +26488,7 @@
                 <w:sz w:val="19"/>
                 <w:szCs w:val="19"/>
               </w:rPr>
-              <w:t xml:space="preserve">Calibration masters/&lt;camera&gt;_G&lt;gain&gt;_O&lt;offset&gt;_&lt;temp&gt;C/</w:t>
+              <w:t xml:space="preserve">Calibration masters/&lt;rig&gt;/&lt;camera&gt;_G&lt;gain&gt;_O&lt;offset&gt;_&lt;temp&gt;C/</w:t>
             </w:r>
             <w:r>
               <w:t xml:space="preserve"> (master flats in a </w:t>
@@ -26688,6 +26691,96 @@
           <w:szCs w:val="18"/>
         </w:rPr>
         <w:t xml:space="preserve">An organized library (example: M 31 shot with two telescopes)</w:t>
+      </w:r>
+    </w:p>
+    <w:p>
+      <w:pPr>
+        <w:pStyle w:val="ListParagraph"/>
+        <w:numPr>
+          <w:ilvl w:val="0"/>
+          <w:numId w:val="2"/>
+        </w:numPr>
+        <w:spacing w:after="60"/>
+      </w:pPr>
+      <w:r>
+        <w:rPr>
+          <w:b/>
+          <w:bCs/>
+        </w:rPr>
+        <w:t xml:space="preserve">The rig</w:t>
+      </w:r>
+      <w:r>
+        <w:t xml:space="preserve"> is the name you gave it in Calibrate and Stack (e.g. </w:t>
+      </w:r>
+      <w:r>
+        <w:rPr>
+          <w:i/>
+          <w:iCs/>
+        </w:rPr>
+        <w:t xml:space="preserve">Poseidon</w:t>
+      </w:r>
+      <w:r>
+        <w:t xml:space="preserve">); otherwise the telescope in the header (a mount driver such as </w:t>
+      </w:r>
+      <w:r>
+        <w:rPr>
+          <w:i/>
+          <w:iCs/>
+        </w:rPr>
+        <w:t xml:space="preserve">EQMOD</w:t>
+      </w:r>
+      <w:r>
+        <w:t xml:space="preserve"> or </w:t>
+      </w:r>
+      <w:r>
+        <w:rPr>
+          <w:i/>
+          <w:iCs/>
+        </w:rPr>
+        <w:t xml:space="preserve">AvalonStarGo.NET</w:t>
+      </w:r>
+      <w:r>
+        <w:t xml:space="preserve"> doesn't count), else the focal length, else - for calibration frames sorted by hand into </w:t>
+      </w:r>
+      <w:r>
+        <w:rPr>
+          <w:i/>
+          <w:iCs/>
+        </w:rPr>
+        <w:t xml:space="preserve">&lt;scope&gt;/Darks/…</w:t>
+      </w:r>
+      <w:r>
+        <w:t xml:space="preserve"> - the folder name above </w:t>
+      </w:r>
+      <w:r>
+        <w:rPr>
+          <w:i/>
+          <w:iCs/>
+        </w:rPr>
+        <w:t xml:space="preserve">Darks</w:t>
+      </w:r>
+      <w:r>
+        <w:t xml:space="preserve">, </w:t>
+      </w:r>
+      <w:r>
+        <w:rPr>
+          <w:i/>
+          <w:iCs/>
+        </w:rPr>
+        <w:t xml:space="preserve">Flats</w:t>
+      </w:r>
+      <w:r>
+        <w:t xml:space="preserve"> or </w:t>
+      </w:r>
+      <w:r>
+        <w:rPr>
+          <w:i/>
+          <w:iCs/>
+        </w:rPr>
+        <w:t xml:space="preserve">Bias</w:t>
+      </w:r>
+      <w:r>
+        <w:t xml:space="preserve">. So nine ASI2600s on nine rigs keep nine separate dark libraries.</w:t>
       </w:r>
     </w:p>
     <w:p>

</xml_diff>

<commit_message>
Organize: every night folder carries the rig (2026-10-01_SQA60), so lights and flats from different scopes never mix
Co-Authored-By: Claude Opus 5.5 <noreply@anthropic.com>
Claude-Session: https://claude.ai/code/session_01FKvd69QsnCvM2zbzYnPwmF
</commit_message>
<xml_diff>
--- a/docs/SubZeroAstro_User_Manual.docx
+++ b/docs/SubZeroAstro_User_Manual.docx
@@ -26143,7 +26143,7 @@
                 <w:sz w:val="19"/>
                 <w:szCs w:val="19"/>
               </w:rPr>
-              <w:t xml:space="preserve">Targets/&lt;target&gt;/&lt;night&gt;/LIGHT/&lt;filter&gt;/</w:t>
+              <w:t xml:space="preserve">Targets/&lt;target&gt;/&lt;night&gt;_&lt;rig&gt;/LIGHT/&lt;filter&gt;/</w:t>
             </w:r>
             <w:r>
               <w:t xml:space="preserve"> (rejected ones keep their </w:t>
@@ -26157,7 +26157,7 @@
               <w:t xml:space="preserve">REJECTED</w:t>
             </w:r>
             <w:r>
-              <w:t xml:space="preserve"> folder). A target shot with more than one telescope gets the rig in the night's name (</w:t>
+              <w:t xml:space="preserve"> folder). The night folder carries the rig (</w:t>
             </w:r>
             <w:r>
               <w:rPr>
@@ -26168,7 +26168,7 @@
               <w:t xml:space="preserve">2026-10-15_SQA60</w:t>
             </w:r>
             <w:r>
-              <w:t xml:space="preserve">), so flats are never matched to the other scope's lights</w:t>
+              <w:t xml:space="preserve">), so a target shot with several telescopes never mixes their lights and flats, and you can see which scope took them</w:t>
             </w:r>
           </w:p>
         </w:tc>
@@ -26222,7 +26222,7 @@
                 <w:sz w:val="19"/>
                 <w:szCs w:val="19"/>
               </w:rPr>
-              <w:t xml:space="preserve">Targets/&lt;target&gt;/&lt;night&gt;/FLAT/&lt;filter&gt;/</w:t>
+              <w:t xml:space="preserve">Targets/&lt;target&gt;/&lt;night&gt;_&lt;rig&gt;/FLAT/&lt;filter&gt;/</w:t>
             </w:r>
             <w:r>
               <w:t xml:space="preserve"> - with the target shot that night with the same telescope, including targets organized in an earlier run (so a folder of calibration frames only can be sorted on its own); otherwise </w:t>

</xml_diff>

<commit_message>
Organize: Layout choice - By rig (default): Lights/rig/target/night/filter and Calibration/rig/Flats, Dark flats, Darks, Bias, Masters; or By target. Manual and diagrams updated
Co-Authored-By: Claude Opus 5.5 <noreply@anthropic.com>
Claude-Session: https://claude.ai/code/session_01FKvd69QsnCvM2zbzYnPwmF
</commit_message>
<xml_diff>
--- a/docs/SubZeroAstro_User_Manual.docx
+++ b/docs/SubZeroAstro_User_Manual.docx
@@ -1193,7 +1193,7 @@
                 <w:sz w:val="18"/>
                 <w:szCs w:val="18"/>
               </w:rPr>
-              <w:t xml:space="preserve">Sorts a folder, drive or NAS of FITS/XISF subs and masters into Targets › night › LIGHT/FLAT, a darks library and masters folders - preview first, copy or move, undo; duplicates flagged and kept, set aside or deleted</w:t>
+              <w:t xml:space="preserve">Sorts a folder, drive or NAS of FITS/XISF subs and masters by rig (Lights / Calibration) or by target - preview first, copy or move, undo; duplicates flagged and kept, set aside or deleted</w:t>
             </w:r>
           </w:p>
         </w:tc>
@@ -26019,6 +26019,34 @@
         <w:t xml:space="preserve">, on a Mac the share as it appears under /Volumes) and where the organized files go (the same folder by default).</w:t>
       </w:r>
     </w:p>
+    <w:p>
+      <w:pPr>
+        <w:spacing w:after="120"/>
+      </w:pPr>
+      <w:r>
+        <w:t xml:space="preserve">Pick the </w:t>
+      </w:r>
+      <w:r>
+        <w:rPr>
+          <w:b/>
+          <w:bCs/>
+        </w:rPr>
+        <w:t xml:space="preserve">Layout</w:t>
+      </w:r>
+      <w:r>
+        <w:t xml:space="preserve"> in the window (remembered). </w:t>
+      </w:r>
+      <w:r>
+        <w:rPr>
+          <w:b/>
+          <w:bCs/>
+        </w:rPr>
+        <w:t xml:space="preserve">By rig</w:t>
+      </w:r>
+      <w:r>
+        <w:t xml:space="preserve"> (the default) keeps everything one rig - a telescope and the camera that lives on it - took in one place:</w:t>
+      </w:r>
+    </w:p>
     <w:tbl>
       <w:tblPr>
         <w:tblW w:type="dxa" w:w="9360"/>
@@ -26089,7 +26117,7 @@
                 <w:b/>
                 <w:bCs/>
               </w:rPr>
-              <w:t xml:space="preserve">Go to</w:t>
+              <w:t xml:space="preserve">Go to (By rig)</w:t>
             </w:r>
           </w:p>
         </w:tc>
@@ -26143,7 +26171,7 @@
                 <w:sz w:val="19"/>
                 <w:szCs w:val="19"/>
               </w:rPr>
-              <w:t xml:space="preserve">Targets/&lt;target&gt;/&lt;night&gt;_&lt;rig&gt;/LIGHT/&lt;filter&gt;/</w:t>
+              <w:t xml:space="preserve">Lights/&lt;rig&gt;/&lt;target&gt;/&lt;night&gt;/&lt;filter&gt;/</w:t>
             </w:r>
             <w:r>
               <w:t xml:space="preserve"> (rejected ones keep their </w:t>
@@ -26157,18 +26185,64 @@
               <w:t xml:space="preserve">REJECTED</w:t>
             </w:r>
             <w:r>
-              <w:t xml:space="preserve"> folder). The night folder carries the rig (</w:t>
-            </w:r>
+              <w:t xml:space="preserve"> folder)</w:t>
+            </w:r>
+          </w:p>
+        </w:tc>
+      </w:tr>
+      <w:tr>
+        <w:trPr>
+          <w:cantSplit/>
+        </w:trPr>
+        <w:tc>
+          <w:tcPr>
+            <w:tcW w:type="dxa" w:w="2600"/>
+            <w:tcBorders>
+              <w:top w:val="single" w:color="BFBFBF" w:sz="4"/>
+              <w:left w:val="single" w:color="BFBFBF" w:sz="4"/>
+              <w:bottom w:val="single" w:color="BFBFBF" w:sz="4"/>
+              <w:right w:val="single" w:color="BFBFBF" w:sz="4"/>
+            </w:tcBorders>
+            <w:tcMar>
+              <w:top w:type="dxa" w:w="60"/>
+              <w:left w:type="dxa" w:w="100"/>
+              <w:bottom w:type="dxa" w:w="60"/>
+              <w:right w:type="dxa" w:w="100"/>
+            </w:tcMar>
+          </w:tcPr>
+          <w:p>
+            <w:r>
+              <w:t xml:space="preserve">Master lights, finished pictures</w:t>
+            </w:r>
+          </w:p>
+        </w:tc>
+        <w:tc>
+          <w:tcPr>
+            <w:tcW w:type="dxa" w:w="6760"/>
+            <w:tcBorders>
+              <w:top w:val="single" w:color="BFBFBF" w:sz="4"/>
+              <w:left w:val="single" w:color="BFBFBF" w:sz="4"/>
+              <w:bottom w:val="single" w:color="BFBFBF" w:sz="4"/>
+              <w:right w:val="single" w:color="BFBFBF" w:sz="4"/>
+            </w:tcBorders>
+            <w:tcMar>
+              <w:top w:type="dxa" w:w="60"/>
+              <w:left w:type="dxa" w:w="100"/>
+              <w:bottom w:type="dxa" w:w="60"/>
+              <w:right w:type="dxa" w:w="100"/>
+            </w:tcMar>
+          </w:tcPr>
+          <w:p>
             <w:r>
               <w:rPr>
                 <w:rFonts w:ascii="Consolas" w:cs="Consolas" w:eastAsia="Consolas" w:hAnsi="Consolas"/>
                 <w:sz w:val="19"/>
                 <w:szCs w:val="19"/>
               </w:rPr>
-              <w:t xml:space="preserve">2026-10-15_SQA60</w:t>
-            </w:r>
-            <w:r>
-              <w:t xml:space="preserve">), so a target shot with several telescopes never mixes their lights and flats, and you can see which scope took them</w:t>
+              <w:t xml:space="preserve">Lights/&lt;rig&gt;/&lt;target&gt;/Masters/</w:t>
+            </w:r>
+            <w:r>
+              <w:t xml:space="preserve"> with their star images and stack logs</w:t>
             </w:r>
           </w:p>
         </w:tc>
@@ -26195,7 +26269,7 @@
           </w:tcPr>
           <w:p>
             <w:r>
-              <w:t xml:space="preserve">Flats and dark flats</w:t>
+              <w:t xml:space="preserve">Flats / dark flats</w:t>
             </w:r>
           </w:p>
         </w:tc>
@@ -26222,10 +26296,10 @@
                 <w:sz w:val="19"/>
                 <w:szCs w:val="19"/>
               </w:rPr>
-              <w:t xml:space="preserve">Targets/&lt;target&gt;/&lt;night&gt;_&lt;rig&gt;/FLAT/&lt;filter&gt;/</w:t>
-            </w:r>
-            <w:r>
-              <w:t xml:space="preserve"> - with the target shot that night with the same telescope, including targets organized in an earlier run (so a folder of calibration frames only can be sorted on its own); otherwise </w:t>
+              <w:t xml:space="preserve">Calibration/&lt;rig&gt;/Flats/&lt;night&gt;/&lt;filter&gt;/</w:t>
+            </w:r>
+            <w:r>
+              <w:t xml:space="preserve"> and </w:t>
             </w:r>
             <w:r>
               <w:rPr>
@@ -26233,40 +26307,7 @@
                 <w:sz w:val="19"/>
                 <w:szCs w:val="19"/>
               </w:rPr>
-              <w:t xml:space="preserve">Flats/&lt;scope&gt;/&lt;night&gt;/&lt;filter&gt;/</w:t>
-            </w:r>
-            <w:r>
-              <w:t xml:space="preserve">. Files without IMAGETYP are recognised from folder names above them (</w:t>
-            </w:r>
-            <w:r>
-              <w:rPr>
-                <w:i/>
-                <w:iCs/>
-              </w:rPr>
-              <w:t xml:space="preserve">Flats</w:t>
-            </w:r>
-            <w:r>
-              <w:t xml:space="preserve">, </w:t>
-            </w:r>
-            <w:r>
-              <w:rPr>
-                <w:i/>
-                <w:iCs/>
-              </w:rPr>
-              <w:t xml:space="preserve">Darks</w:t>
-            </w:r>
-            <w:r>
-              <w:t xml:space="preserve">, </w:t>
-            </w:r>
-            <w:r>
-              <w:rPr>
-                <w:i/>
-                <w:iCs/>
-              </w:rPr>
-              <w:t xml:space="preserve">Bias</w:t>
-            </w:r>
-            <w:r>
-              <w:t xml:space="preserve">)</w:t>
+              <w:t xml:space="preserve">Calibration/&lt;rig&gt;/Dark flats/&lt;night&gt;/&lt;filter&gt;/</w:t>
             </w:r>
           </w:p>
         </w:tc>
@@ -26320,10 +26361,7 @@
                 <w:sz w:val="19"/>
                 <w:szCs w:val="19"/>
               </w:rPr>
-              <w:t xml:space="preserve">Darks library/&lt;rig&gt;/&lt;camera&gt;_G&lt;gain&gt;_O&lt;offset&gt;_&lt;temp&gt;C/&lt;exposure&gt;s/</w:t>
-            </w:r>
-            <w:r>
-              <w:t xml:space="preserve"> - one library per rig, because two cameras of the same model are still two different sensors (hot pixels, amp glow)</w:t>
+              <w:t xml:space="preserve">Calibration/&lt;rig&gt;/Darks/&lt;camera&gt;_G&lt;gain&gt;_O&lt;offset&gt;_&lt;temp&gt;C/&lt;exposure&gt;s/</w:t>
             </w:r>
           </w:p>
         </w:tc>
@@ -26377,7 +26415,7 @@
                 <w:sz w:val="19"/>
                 <w:szCs w:val="19"/>
               </w:rPr>
-              <w:t xml:space="preserve">Bias library/&lt;rig&gt;/&lt;camera&gt;_G&lt;gain&gt;_O&lt;offset&gt;_&lt;temp&gt;C/</w:t>
+              <w:t xml:space="preserve">Calibration/&lt;rig&gt;/Bias/&lt;camera&gt;_G&lt;gain&gt;_O&lt;offset&gt;_&lt;temp&gt;C/</w:t>
             </w:r>
           </w:p>
         </w:tc>
@@ -26404,7 +26442,7 @@
           </w:tcPr>
           <w:p>
             <w:r>
-              <w:t xml:space="preserve">Master lights</w:t>
+              <w:t xml:space="preserve">Calibration masters</w:t>
             </w:r>
           </w:p>
         </w:tc>
@@ -26431,67 +26469,10 @@
                 <w:sz w:val="19"/>
                 <w:szCs w:val="19"/>
               </w:rPr>
-              <w:t xml:space="preserve">Targets/&lt;target&gt;/Masters/</w:t>
-            </w:r>
-            <w:r>
-              <w:t xml:space="preserve"> with their star images and stack logs</w:t>
-            </w:r>
-          </w:p>
-        </w:tc>
-      </w:tr>
-      <w:tr>
-        <w:trPr>
-          <w:cantSplit/>
-        </w:trPr>
-        <w:tc>
-          <w:tcPr>
-            <w:tcW w:type="dxa" w:w="2600"/>
-            <w:tcBorders>
-              <w:top w:val="single" w:color="BFBFBF" w:sz="4"/>
-              <w:left w:val="single" w:color="BFBFBF" w:sz="4"/>
-              <w:bottom w:val="single" w:color="BFBFBF" w:sz="4"/>
-              <w:right w:val="single" w:color="BFBFBF" w:sz="4"/>
-            </w:tcBorders>
-            <w:tcMar>
-              <w:top w:type="dxa" w:w="60"/>
-              <w:left w:type="dxa" w:w="100"/>
-              <w:bottom w:type="dxa" w:w="60"/>
-              <w:right w:type="dxa" w:w="100"/>
-            </w:tcMar>
-          </w:tcPr>
-          <w:p>
-            <w:r>
-              <w:t xml:space="preserve">Calibration masters</w:t>
-            </w:r>
-          </w:p>
-        </w:tc>
-        <w:tc>
-          <w:tcPr>
-            <w:tcW w:type="dxa" w:w="6760"/>
-            <w:tcBorders>
-              <w:top w:val="single" w:color="BFBFBF" w:sz="4"/>
-              <w:left w:val="single" w:color="BFBFBF" w:sz="4"/>
-              <w:bottom w:val="single" w:color="BFBFBF" w:sz="4"/>
-              <w:right w:val="single" w:color="BFBFBF" w:sz="4"/>
-            </w:tcBorders>
-            <w:tcMar>
-              <w:top w:type="dxa" w:w="60"/>
-              <w:left w:type="dxa" w:w="100"/>
-              <w:bottom w:type="dxa" w:w="60"/>
-              <w:right w:type="dxa" w:w="100"/>
-            </w:tcMar>
-          </w:tcPr>
-          <w:p>
-            <w:r>
-              <w:rPr>
-                <w:rFonts w:ascii="Consolas" w:cs="Consolas" w:eastAsia="Consolas" w:hAnsi="Consolas"/>
-                <w:sz w:val="19"/>
-                <w:szCs w:val="19"/>
-              </w:rPr>
-              <w:t xml:space="preserve">Calibration masters/&lt;rig&gt;/&lt;camera&gt;_G&lt;gain&gt;_O&lt;offset&gt;_&lt;temp&gt;C/</w:t>
-            </w:r>
-            <w:r>
-              <w:t xml:space="preserve"> (master flats in a </w:t>
+              <w:t xml:space="preserve">Calibration/&lt;rig&gt;/Masters/&lt;camera settings&gt;/</w:t>
+            </w:r>
+            <w:r>
+              <w:t xml:space="preserve"> (master flats in </w:t>
             </w:r>
             <w:r>
               <w:rPr>
@@ -26502,7 +26483,7 @@
               <w:t xml:space="preserve">Flats &lt;night&gt;/&lt;filter&gt;</w:t>
             </w:r>
             <w:r>
-              <w:t xml:space="preserve"> folder below it) - reused across targets for months</w:t>
+              <w:t xml:space="preserve">)</w:t>
             </w:r>
           </w:p>
         </w:tc>
@@ -26578,7 +26559,7 @@
           <wp:inline distT="0" distB="0" distL="0" distR="0">
             <wp:extent cx="4572000" cy="3962400"/>
             <wp:effectExtent t="0" r="0" b="0" l="0"/>
-            <wp:docPr id="1" name="organize_routing.png" descr="Where each file goes: the header decides - per-target folders (purple) and shared libraries by camera settings (teal)" title="Where each file goes: the header decides - per-target folders (purple) and shared libraries by camera settings (teal)"/>
+            <wp:docPr id="1" name="organize_routing.png" descr="Where each file goes (By rig): lights by rig, target and night (purple); each rig's own calibration (teal)" title="Where each file goes (By rig): lights by rig, target and night (purple); each rig's own calibration (teal)"/>
             <wp:cNvGraphicFramePr>
               <a:graphicFrameLocks xmlns:a="http://schemas.openxmlformats.org/drawingml/2006/main" noChangeAspect="1"/>
             </wp:cNvGraphicFramePr>
@@ -26627,7 +26608,7 @@
           <w:sz w:val="18"/>
           <w:szCs w:val="18"/>
         </w:rPr>
-        <w:t xml:space="preserve">Where each file goes: the header decides - per-target folders (purple) and shared libraries by camera settings (teal)</w:t>
+        <w:t xml:space="preserve">Where each file goes (By rig): lights by rig, target and night (purple); each rig's own calibration (teal)</w:t>
       </w:r>
     </w:p>
     <w:p>
@@ -26639,9 +26620,9 @@
       <w:r>
         <w:drawing>
           <wp:inline distT="0" distB="0" distL="0" distR="0">
-            <wp:extent cx="4572000" cy="3790950"/>
+            <wp:extent cx="4572000" cy="3648075"/>
             <wp:effectExtent t="0" r="0" b="0" l="0"/>
-            <wp:docPr id="1" name="organize_tree.png" descr="An organized library (example: M 31 shot with two telescopes)" title="An organized library (example: M 31 shot with two telescopes)"/>
+            <wp:docPr id="1" name="organize_tree.png" descr="An organized library, By rig (example: two telescopes with the same camera model)" title="An organized library, By rig (example: two telescopes with the same camera model)"/>
             <wp:cNvGraphicFramePr>
               <a:graphicFrameLocks xmlns:a="http://schemas.openxmlformats.org/drawingml/2006/main" noChangeAspect="1"/>
             </wp:cNvGraphicFramePr>
@@ -26664,7 +26645,7 @@
                   <pic:spPr bwMode="auto">
                     <a:xfrm>
                       <a:off x="0" y="0"/>
-                      <a:ext cx="4572000" cy="3790950"/>
+                      <a:ext cx="4572000" cy="3648075"/>
                     </a:xfrm>
                     <a:prstGeom prst="rect">
                       <a:avLst/>
@@ -26690,7 +26671,88 @@
           <w:sz w:val="18"/>
           <w:szCs w:val="18"/>
         </w:rPr>
-        <w:t xml:space="preserve">An organized library (example: M 31 shot with two telescopes)</w:t>
+        <w:t xml:space="preserve">An organized library, By rig (example: two telescopes with the same camera model)</w:t>
+      </w:r>
+    </w:p>
+    <w:p>
+      <w:pPr>
+        <w:spacing w:after="120"/>
+      </w:pPr>
+      <w:r>
+        <w:rPr>
+          <w:b/>
+          <w:bCs/>
+        </w:rPr>
+        <w:t xml:space="preserve">By target</w:t>
+      </w:r>
+      <w:r>
+        <w:t xml:space="preserve"> puts all of one object's data together instead: </w:t>
+      </w:r>
+      <w:r>
+        <w:rPr>
+          <w:rFonts w:ascii="Consolas" w:cs="Consolas" w:eastAsia="Consolas" w:hAnsi="Consolas"/>
+          <w:sz w:val="19"/>
+          <w:szCs w:val="19"/>
+        </w:rPr>
+        <w:t xml:space="preserve">Targets/&lt;target&gt;/&lt;night&gt;_&lt;rig&gt;/LIGHT/&lt;filter&gt;/</w:t>
+      </w:r>
+      <w:r>
+        <w:t xml:space="preserve"> and </w:t>
+      </w:r>
+      <w:r>
+        <w:rPr>
+          <w:rFonts w:ascii="Consolas" w:cs="Consolas" w:eastAsia="Consolas" w:hAnsi="Consolas"/>
+          <w:sz w:val="19"/>
+          <w:szCs w:val="19"/>
+        </w:rPr>
+        <w:t xml:space="preserve">…/FLAT/&lt;filter&gt;/</w:t>
+      </w:r>
+      <w:r>
+        <w:t xml:space="preserve">, </w:t>
+      </w:r>
+      <w:r>
+        <w:rPr>
+          <w:rFonts w:ascii="Consolas" w:cs="Consolas" w:eastAsia="Consolas" w:hAnsi="Consolas"/>
+          <w:sz w:val="19"/>
+          <w:szCs w:val="19"/>
+        </w:rPr>
+        <w:t xml:space="preserve">Targets/&lt;target&gt;/Masters/</w:t>
+      </w:r>
+      <w:r>
+        <w:t xml:space="preserve">, with darks and bias in </w:t>
+      </w:r>
+      <w:r>
+        <w:rPr>
+          <w:rFonts w:ascii="Consolas" w:cs="Consolas" w:eastAsia="Consolas" w:hAnsi="Consolas"/>
+          <w:sz w:val="19"/>
+          <w:szCs w:val="19"/>
+        </w:rPr>
+        <w:t xml:space="preserve">Darks library/&lt;rig&gt;/…</w:t>
+      </w:r>
+      <w:r>
+        <w:t xml:space="preserve"> and </w:t>
+      </w:r>
+      <w:r>
+        <w:rPr>
+          <w:rFonts w:ascii="Consolas" w:cs="Consolas" w:eastAsia="Consolas" w:hAnsi="Consolas"/>
+          <w:sz w:val="19"/>
+          <w:szCs w:val="19"/>
+        </w:rPr>
+        <w:t xml:space="preserve">Bias library/&lt;rig&gt;/…</w:t>
+      </w:r>
+      <w:r>
+        <w:t xml:space="preserve">. Flats join the target shot that night with the same telescope - including targets organized in an earlier run, so a folder of calibration frames only can be sorted on its own; otherwise they go to </w:t>
+      </w:r>
+      <w:r>
+        <w:rPr>
+          <w:rFonts w:ascii="Consolas" w:cs="Consolas" w:eastAsia="Consolas" w:hAnsi="Consolas"/>
+          <w:sz w:val="19"/>
+          <w:szCs w:val="19"/>
+        </w:rPr>
+        <w:t xml:space="preserve">Flats/&lt;scope&gt;/&lt;night&gt;/&lt;filter&gt;/</w:t>
+      </w:r>
+      <w:r>
+        <w:t xml:space="preserve">.</w:t>
       </w:r>
     </w:p>
     <w:p>
@@ -26780,7 +26842,7 @@
         <w:t xml:space="preserve">Bias</w:t>
       </w:r>
       <w:r>
-        <w:t xml:space="preserve">. So nine ASI2600s on nine rigs keep nine separate dark libraries.</w:t>
+        <w:t xml:space="preserve">. So sixteen ASI2600s on sixteen rigs keep sixteen separate sets of darks, bias and flats.</w:t>
       </w:r>
     </w:p>
     <w:p>

</xml_diff>

<commit_message>
Organize by rig: Calibration/rig/frame type/camera - flats and dark flats get the camera level too
Co-Authored-By: Claude Opus 5.5 <noreply@anthropic.com>
Claude-Session: https://claude.ai/code/session_01FKvd69QsnCvM2zbzYnPwmF
</commit_message>
<xml_diff>
--- a/docs/SubZeroAstro_User_Manual.docx
+++ b/docs/SubZeroAstro_User_Manual.docx
@@ -26044,7 +26044,27 @@
         <w:t xml:space="preserve">By rig</w:t>
       </w:r>
       <w:r>
-        <w:t xml:space="preserve"> (the default) keeps everything one rig - a telescope and the camera that lives on it - took in one place:</w:t>
+        <w:t xml:space="preserve"> (the default) starts with two big folders - </w:t>
+      </w:r>
+      <w:r>
+        <w:rPr>
+          <w:b/>
+          <w:bCs/>
+        </w:rPr>
+        <w:t xml:space="preserve">Lights</w:t>
+      </w:r>
+      <w:r>
+        <w:t xml:space="preserve"> and </w:t>
+      </w:r>
+      <w:r>
+        <w:rPr>
+          <w:b/>
+          <w:bCs/>
+        </w:rPr>
+        <w:t xml:space="preserve">Calibration</w:t>
+      </w:r>
+      <w:r>
+        <w:t xml:space="preserve"> - and under each, one folder per rig (a telescope and the camera that lives on it). Calibration then goes by frame type, then camera:</w:t>
       </w:r>
     </w:p>
     <w:tbl>
@@ -26296,7 +26316,7 @@
                 <w:sz w:val="19"/>
                 <w:szCs w:val="19"/>
               </w:rPr>
-              <w:t xml:space="preserve">Calibration/&lt;rig&gt;/Flats/&lt;night&gt;/&lt;filter&gt;/</w:t>
+              <w:t xml:space="preserve">Calibration/&lt;rig&gt;/Flats/&lt;camera&gt;/&lt;night&gt;/&lt;filter&gt;/</w:t>
             </w:r>
             <w:r>
               <w:t xml:space="preserve"> and </w:t>
@@ -26307,7 +26327,7 @@
                 <w:sz w:val="19"/>
                 <w:szCs w:val="19"/>
               </w:rPr>
-              <w:t xml:space="preserve">Calibration/&lt;rig&gt;/Dark flats/&lt;night&gt;/&lt;filter&gt;/</w:t>
+              <w:t xml:space="preserve">Calibration/&lt;rig&gt;/Dark flats/&lt;camera&gt;/&lt;night&gt;/&lt;filter&gt;/</w:t>
             </w:r>
           </w:p>
         </w:tc>

</xml_diff>

<commit_message>
Organize by rig: top folders are Light Frames and Calibration Frames
Co-Authored-By: Claude Opus 5.5 <noreply@anthropic.com>
Claude-Session: https://claude.ai/code/session_01FKvd69QsnCvM2zbzYnPwmF
</commit_message>
<xml_diff>
--- a/docs/SubZeroAstro_User_Manual.docx
+++ b/docs/SubZeroAstro_User_Manual.docx
@@ -1193,7 +1193,7 @@
                 <w:sz w:val="18"/>
                 <w:szCs w:val="18"/>
               </w:rPr>
-              <w:t xml:space="preserve">Sorts a folder, drive or NAS of FITS/XISF subs and masters by rig (Lights / Calibration) or by target - preview first, copy or move, undo; duplicates flagged and kept, set aside or deleted</w:t>
+              <w:t xml:space="preserve">Sorts a folder, drive or NAS of FITS/XISF subs and masters by rig (Light Frames / Calibration Frames) or by target - preview first, copy or move, undo; duplicates flagged and kept, set aside or deleted</w:t>
             </w:r>
           </w:p>
         </w:tc>
@@ -26051,7 +26051,7 @@
           <w:b/>
           <w:bCs/>
         </w:rPr>
-        <w:t xml:space="preserve">Lights</w:t>
+        <w:t xml:space="preserve">Light Frames</w:t>
       </w:r>
       <w:r>
         <w:t xml:space="preserve"> and </w:t>
@@ -26061,7 +26061,7 @@
           <w:b/>
           <w:bCs/>
         </w:rPr>
-        <w:t xml:space="preserve">Calibration</w:t>
+        <w:t xml:space="preserve">Calibration Frames</w:t>
       </w:r>
       <w:r>
         <w:t xml:space="preserve"> - and under each, one folder per rig (a telescope and the camera that lives on it). Calibration then goes by frame type, then camera:</w:t>
@@ -26191,7 +26191,7 @@
                 <w:sz w:val="19"/>
                 <w:szCs w:val="19"/>
               </w:rPr>
-              <w:t xml:space="preserve">Lights/&lt;rig&gt;/&lt;target&gt;/&lt;night&gt;/&lt;filter&gt;/</w:t>
+              <w:t xml:space="preserve">Light Frames/&lt;rig&gt;/&lt;target&gt;/&lt;night&gt;/&lt;filter&gt;/</w:t>
             </w:r>
             <w:r>
               <w:t xml:space="preserve"> (rejected ones keep their </w:t>
@@ -26259,7 +26259,7 @@
                 <w:sz w:val="19"/>
                 <w:szCs w:val="19"/>
               </w:rPr>
-              <w:t xml:space="preserve">Lights/&lt;rig&gt;/&lt;target&gt;/Masters/</w:t>
+              <w:t xml:space="preserve">Light Frames/&lt;rig&gt;/&lt;target&gt;/Masters/</w:t>
             </w:r>
             <w:r>
               <w:t xml:space="preserve"> with their star images and stack logs</w:t>
@@ -26316,7 +26316,7 @@
                 <w:sz w:val="19"/>
                 <w:szCs w:val="19"/>
               </w:rPr>
-              <w:t xml:space="preserve">Calibration/&lt;rig&gt;/Flats/&lt;camera&gt;/&lt;night&gt;/&lt;filter&gt;/</w:t>
+              <w:t xml:space="preserve">Calibration Frames/&lt;rig&gt;/Flats/&lt;camera&gt;/&lt;night&gt;/&lt;filter&gt;/</w:t>
             </w:r>
             <w:r>
               <w:t xml:space="preserve"> and </w:t>
@@ -26327,7 +26327,7 @@
                 <w:sz w:val="19"/>
                 <w:szCs w:val="19"/>
               </w:rPr>
-              <w:t xml:space="preserve">Calibration/&lt;rig&gt;/Dark flats/&lt;camera&gt;/&lt;night&gt;/&lt;filter&gt;/</w:t>
+              <w:t xml:space="preserve">Calibration Frames/&lt;rig&gt;/Dark flats/&lt;camera&gt;/&lt;night&gt;/&lt;filter&gt;/</w:t>
             </w:r>
           </w:p>
         </w:tc>
@@ -26381,7 +26381,7 @@
                 <w:sz w:val="19"/>
                 <w:szCs w:val="19"/>
               </w:rPr>
-              <w:t xml:space="preserve">Calibration/&lt;rig&gt;/Darks/&lt;camera&gt;_G&lt;gain&gt;_O&lt;offset&gt;_&lt;temp&gt;C/&lt;exposure&gt;s/</w:t>
+              <w:t xml:space="preserve">Calibration Frames/&lt;rig&gt;/Darks/&lt;camera&gt;_G&lt;gain&gt;_O&lt;offset&gt;_&lt;temp&gt;C/&lt;exposure&gt;s/</w:t>
             </w:r>
           </w:p>
         </w:tc>
@@ -26435,7 +26435,7 @@
                 <w:sz w:val="19"/>
                 <w:szCs w:val="19"/>
               </w:rPr>
-              <w:t xml:space="preserve">Calibration/&lt;rig&gt;/Bias/&lt;camera&gt;_G&lt;gain&gt;_O&lt;offset&gt;_&lt;temp&gt;C/</w:t>
+              <w:t xml:space="preserve">Calibration Frames/&lt;rig&gt;/Bias/&lt;camera&gt;_G&lt;gain&gt;_O&lt;offset&gt;_&lt;temp&gt;C/</w:t>
             </w:r>
           </w:p>
         </w:tc>
@@ -26489,7 +26489,7 @@
                 <w:sz w:val="19"/>
                 <w:szCs w:val="19"/>
               </w:rPr>
-              <w:t xml:space="preserve">Calibration/&lt;rig&gt;/Masters/&lt;camera settings&gt;/</w:t>
+              <w:t xml:space="preserve">Calibration Frames/&lt;rig&gt;/Masters/&lt;camera settings&gt;/</w:t>
             </w:r>
             <w:r>
               <w:t xml:space="preserve"> (master flats in </w:t>

</xml_diff>

<commit_message>
Organize: rigs without a telescope in the header are named from your own folders (SQA60Pro/...), not the focal length; Name Your Rigs... lists every rig found and lets you rename them (remembered, shared with Calibrate and Stack), re-planning without re-reading headers
Co-Authored-By: Claude Opus 5.5 <noreply@anthropic.com>
Claude-Session: https://claude.ai/code/session_01FKvd69QsnCvM2zbzYnPwmF
</commit_message>
<xml_diff>
--- a/docs/SubZeroAstro_User_Manual.docx
+++ b/docs/SubZeroAstro_User_Manual.docx
@@ -121,7 +121,7 @@
           <w:sz w:val="22"/>
           <w:szCs w:val="22"/>
         </w:rPr>
-        <w:t xml:space="preserve">Version 0.9.134 beta  ·  Windows and Mac (Apple silicon)</w:t>
+        <w:t xml:space="preserve">Version 0.9.135 beta  ·  Windows and Mac (Apple silicon)</w:t>
       </w:r>
     </w:p>
     <w:p>
@@ -26792,7 +26792,17 @@
         <w:t xml:space="preserve">The rig</w:t>
       </w:r>
       <w:r>
-        <w:t xml:space="preserve"> is the name you gave it in Calibrate and Stack (e.g. </w:t>
+        <w:t xml:space="preserve"> is the name you gave it (in </w:t>
+      </w:r>
+      <w:r>
+        <w:rPr>
+          <w:b/>
+          <w:bCs/>
+        </w:rPr>
+        <w:t xml:space="preserve">Name Your Rigs…</w:t>
+      </w:r>
+      <w:r>
+        <w:t xml:space="preserve"> or Calibrate and Stack, e.g. </w:t>
       </w:r>
       <w:r>
         <w:rPr>
@@ -26822,47 +26832,77 @@
         <w:t xml:space="preserve">AvalonStarGo.NET</w:t>
       </w:r>
       <w:r>
-        <w:t xml:space="preserve"> doesn't count), else the focal length, else - for calibration frames sorted by hand into </w:t>
+        <w:t xml:space="preserve"> doesn't count); otherwise </w:t>
+      </w:r>
+      <w:r>
+        <w:rPr>
+          <w:b/>
+          <w:bCs/>
+        </w:rPr>
+        <w:t xml:space="preserve">your own folder name</w:t>
+      </w:r>
+      <w:r>
+        <w:t xml:space="preserve"> - the folder a rig's files share that the other rigs' files don't (</w:t>
       </w:r>
       <w:r>
         <w:rPr>
           <w:i/>
           <w:iCs/>
         </w:rPr>
-        <w:t xml:space="preserve">&lt;scope&gt;/Darks/…</w:t>
-      </w:r>
-      <w:r>
-        <w:t xml:space="preserve"> - the folder name above </w:t>
+        <w:t xml:space="preserve">SQA60Pro</w:t>
+      </w:r>
+      <w:r>
+        <w:t xml:space="preserve"> in </w:t>
       </w:r>
       <w:r>
         <w:rPr>
           <w:i/>
           <w:iCs/>
         </w:rPr>
-        <w:t xml:space="preserve">Darks</w:t>
-      </w:r>
-      <w:r>
-        <w:t xml:space="preserve">, </w:t>
+        <w:t xml:space="preserve">SQA60Pro/Veil/2026-09-01/…</w:t>
+      </w:r>
+      <w:r>
+        <w:t xml:space="preserve">, or the folder above </w:t>
       </w:r>
       <w:r>
         <w:rPr>
           <w:i/>
           <w:iCs/>
         </w:rPr>
-        <w:t xml:space="preserve">Flats</w:t>
-      </w:r>
-      <w:r>
-        <w:t xml:space="preserve"> or </w:t>
+        <w:t xml:space="preserve">Darks</w:t>
+      </w:r>
+      <w:r>
+        <w:t xml:space="preserve">, </w:t>
       </w:r>
       <w:r>
         <w:rPr>
           <w:i/>
           <w:iCs/>
         </w:rPr>
+        <w:t xml:space="preserve">Flats</w:t>
+      </w:r>
+      <w:r>
+        <w:t xml:space="preserve"> or </w:t>
+      </w:r>
+      <w:r>
+        <w:rPr>
+          <w:i/>
+          <w:iCs/>
+        </w:rPr>
         <w:t xml:space="preserve">Bias</w:t>
       </w:r>
       <w:r>
-        <w:t xml:space="preserve">. So sixteen ASI2600s on sixteen rigs keep sixteen separate sets of darks, bias and flats.</w:t>
+        <w:t xml:space="preserve">); only then the focal length. After Step 1, </w:t>
+      </w:r>
+      <w:r>
+        <w:rPr>
+          <w:b/>
+          <w:bCs/>
+        </w:rPr>
+        <w:t xml:space="preserve">Name Your Rigs…</w:t>
+      </w:r>
+      <w:r>
+        <w:t xml:space="preserve"> lists every rig found (camera, focal length, what the header says, an example folder) with the name it will get - change any of them and the plan updates at once, without reading the files again. Names are remembered, and Calibrate and Stack uses them too. So sixteen ASI2600s on sixteen rigs keep sixteen separate sets of darks, bias and flats.</w:t>
       </w:r>
     </w:p>
     <w:p>

</xml_diff>

<commit_message>
Organize My Astro Files switched off (not in the File menu) while it is reworked
Co-Authored-By: Claude Opus 5.5 <noreply@anthropic.com>
Claude-Session: https://claude.ai/code/session_01FKvd69QsnCvM2zbzYnPwmF
</commit_message>
<xml_diff>
--- a/docs/SubZeroAstro_User_Manual.docx
+++ b/docs/SubZeroAstro_User_Manual.docx
@@ -121,7 +121,7 @@
           <w:sz w:val="22"/>
           <w:szCs w:val="22"/>
         </w:rPr>
-        <w:t xml:space="preserve">Version 0.9.135 beta  ·  Windows and Mac (Apple silicon)</w:t>
+        <w:t xml:space="preserve">Version 0.9.136 beta  ·  Windows and Mac (Apple silicon)</w:t>
       </w:r>
     </w:p>
     <w:p>
@@ -25972,6 +25972,21 @@
         <w:t xml:space="preserve">13.3   Organize My Astro Files</w:t>
       </w:r>
       <w:bookmarkEnd w:id="1"/>
+    </w:p>
+    <w:p>
+      <w:pPr>
+        <w:spacing w:after="120"/>
+      </w:pPr>
+      <w:r>
+        <w:rPr>
+          <w:b/>
+          <w:bCs/>
+        </w:rPr>
+        <w:t xml:space="preserve">Switched off in this version.</w:t>
+      </w:r>
+      <w:r>
+        <w:t xml:space="preserve"> Organize My Astro Files is being reworked and is not in the File menu for now - nothing in your folders is changed. The description below is for the coming version.</w:t>
+      </w:r>
     </w:p>
     <w:p>
       <w:pPr>

</xml_diff>

<commit_message>
Organize (still hidden; Ctrl+Alt+Shift+O for testing): Your Rigs first - rig name <-> focal lengths (±5 %, several per rig for a reducer, optional camera), Add New Rig, Find My Rigs in My Files; nothing filed under a guess - unmatched files wait, Which Rig? settles ties by folder (remembered)
Co-Authored-By: Claude Opus 5.5 <noreply@anthropic.com>
Claude-Session: https://claude.ai/code/session_01FKvd69QsnCvM2zbzYnPwmF
</commit_message>
<xml_diff>
--- a/docs/SubZeroAstro_User_Manual.docx
+++ b/docs/SubZeroAstro_User_Manual.docx
@@ -121,7 +121,7 @@
           <w:sz w:val="22"/>
           <w:szCs w:val="22"/>
         </w:rPr>
-        <w:t xml:space="preserve">Version 0.9.136 beta  ·  Windows and Mac (Apple silicon)</w:t>
+        <w:t xml:space="preserve">Version 0.9.137 beta  ·  Windows and Mac (Apple silicon)</w:t>
       </w:r>
     </w:p>
     <w:p>
@@ -26804,120 +26804,90 @@
           <w:b/>
           <w:bCs/>
         </w:rPr>
-        <w:t xml:space="preserve">The rig</w:t>
-      </w:r>
-      <w:r>
-        <w:t xml:space="preserve"> is the name you gave it (in </w:t>
-      </w:r>
-      <w:r>
-        <w:rPr>
-          <w:b/>
-          <w:bCs/>
-        </w:rPr>
-        <w:t xml:space="preserve">Name Your Rigs…</w:t>
-      </w:r>
-      <w:r>
-        <w:t xml:space="preserve"> or Calibrate and Stack, e.g. </w:t>
+        <w:t xml:space="preserve">Your Rigs… comes first</w:t>
+      </w:r>
+      <w:r>
+        <w:t xml:space="preserve"> (once): one row per rig - its short name (</w:t>
       </w:r>
       <w:r>
         <w:rPr>
           <w:i/>
           <w:iCs/>
         </w:rPr>
-        <w:t xml:space="preserve">Poseidon</w:t>
-      </w:r>
-      <w:r>
-        <w:t xml:space="preserve">); otherwise the telescope in the header (a mount driver such as </w:t>
+        <w:t xml:space="preserve">SQA60</w:t>
+      </w:r>
+      <w:r>
+        <w:t xml:space="preserve">, </w:t>
       </w:r>
       <w:r>
         <w:rPr>
           <w:i/>
           <w:iCs/>
         </w:rPr>
-        <w:t xml:space="preserve">EQMOD</w:t>
-      </w:r>
-      <w:r>
-        <w:t xml:space="preserve"> or </w:t>
+        <w:t xml:space="preserve">RASA8</w:t>
+      </w:r>
+      <w:r>
+        <w:t xml:space="preserve"> …), the focal length it writes in your FITS headers, and the camera only if two rigs have about the same focal length. Files are matched to a rig by focal length within ±5 % (adjustable), because the header value drifts a few % from night to night. A scope used with and without a reducer is one rig with two focal lengths (</w:t>
       </w:r>
       <w:r>
         <w:rPr>
           <w:i/>
           <w:iCs/>
         </w:rPr>
-        <w:t xml:space="preserve">AvalonStarGo.NET</w:t>
-      </w:r>
-      <w:r>
-        <w:t xml:space="preserve"> doesn't count); otherwise </w:t>
-      </w:r>
-      <w:r>
-        <w:rPr>
-          <w:b/>
-          <w:bCs/>
-        </w:rPr>
-        <w:t xml:space="preserve">your own folder name</w:t>
-      </w:r>
-      <w:r>
-        <w:t xml:space="preserve"> - the folder a rig's files share that the other rigs' files don't (</w:t>
-      </w:r>
-      <w:r>
-        <w:rPr>
-          <w:i/>
-          <w:iCs/>
-        </w:rPr>
-        <w:t xml:space="preserve">SQA60Pro</w:t>
-      </w:r>
-      <w:r>
-        <w:t xml:space="preserve"> in </w:t>
-      </w:r>
-      <w:r>
-        <w:rPr>
-          <w:i/>
-          <w:iCs/>
-        </w:rPr>
-        <w:t xml:space="preserve">SQA60Pro/Veil/2026-09-01/…</w:t>
-      </w:r>
-      <w:r>
-        <w:t xml:space="preserve">, or the folder above </w:t>
-      </w:r>
-      <w:r>
-        <w:rPr>
-          <w:i/>
-          <w:iCs/>
-        </w:rPr>
-        <w:t xml:space="preserve">Darks</w:t>
-      </w:r>
-      <w:r>
-        <w:t xml:space="preserve">, </w:t>
-      </w:r>
-      <w:r>
-        <w:rPr>
-          <w:i/>
-          <w:iCs/>
-        </w:rPr>
-        <w:t xml:space="preserve">Flats</w:t>
-      </w:r>
-      <w:r>
-        <w:t xml:space="preserve"> or </w:t>
-      </w:r>
-      <w:r>
-        <w:rPr>
-          <w:i/>
-          <w:iCs/>
-        </w:rPr>
-        <w:t xml:space="preserve">Bias</w:t>
-      </w:r>
-      <w:r>
-        <w:t xml:space="preserve">); only then the focal length. After Step 1, </w:t>
-      </w:r>
-      <w:r>
-        <w:rPr>
-          <w:b/>
-          <w:bCs/>
-        </w:rPr>
-        <w:t xml:space="preserve">Name Your Rigs…</w:t>
-      </w:r>
-      <w:r>
-        <w:t xml:space="preserve"> lists every rig found (camera, focal length, what the header says, an example folder) with the name it will get - change any of them and the plan updates at once, without reading the files again. Names are remembered, and Calibrate and Stack uses them too. So sixteen ASI2600s on sixteen rigs keep sixteen separate sets of darks, bias and flats.</w:t>
+        <w:t xml:space="preserve">360, 290</w:t>
+      </w:r>
+      <w:r>
+        <w:t xml:space="preserve">). </w:t>
+      </w:r>
+      <w:r>
+        <w:rPr>
+          <w:b/>
+          <w:bCs/>
+        </w:rPr>
+        <w:t xml:space="preserve">Find My Rigs in My Files</w:t>
+      </w:r>
+      <w:r>
+        <w:t xml:space="preserve"> reads a sample of headers and adds a row for each focal length none of your rigs matches, with a name taken from your folders; </w:t>
+      </w:r>
+      <w:r>
+        <w:rPr>
+          <w:b/>
+          <w:bCs/>
+        </w:rPr>
+        <w:t xml:space="preserve">Add New Rig</w:t>
+      </w:r>
+      <w:r>
+        <w:t xml:space="preserve"> when you get another one. Remembered, and Calibrate and Stack uses the same names.</w:t>
+      </w:r>
+    </w:p>
+    <w:p>
+      <w:pPr>
+        <w:pStyle w:val="ListParagraph"/>
+        <w:numPr>
+          <w:ilvl w:val="0"/>
+          <w:numId w:val="2"/>
+        </w:numPr>
+        <w:spacing w:after="60"/>
+      </w:pPr>
+      <w:r>
+        <w:rPr>
+          <w:b/>
+          <w:bCs/>
+        </w:rPr>
+        <w:t xml:space="preserve">Nothing is filed under a guess.</w:t>
+      </w:r>
+      <w:r>
+        <w:t xml:space="preserve"> A file whose focal length matches none of your rigs stays where it is and the plan says so (add the rig in Your Rigs… and the plan updates at once). When a focal length fits two rigs - or the header has none - </w:t>
+      </w:r>
+      <w:r>
+        <w:rPr>
+          <w:b/>
+          <w:bCs/>
+        </w:rPr>
+        <w:t xml:space="preserve">Which Rig?…</w:t>
+      </w:r>
+      <w:r>
+        <w:t xml:space="preserve"> asks you, folder by folder, and remembers your answer for that folder.</w:t>
       </w:r>
     </w:p>
     <w:p>

</xml_diff>

<commit_message>
Organize: everything goes into one 'Organized Astro Files' folder (with the undo logs and set-aside duplicates); runs on part of a drive and later the whole drive land in the same place
Co-Authored-By: Claude Opus 5.5 <noreply@anthropic.com>
Claude-Session: https://claude.ai/code/session_01FKvd69QsnCvM2zbzYnPwmF
</commit_message>
<xml_diff>
--- a/docs/SubZeroAstro_User_Manual.docx
+++ b/docs/SubZeroAstro_User_Manual.docx
@@ -121,7 +121,7 @@
           <w:sz w:val="22"/>
           <w:szCs w:val="22"/>
         </w:rPr>
-        <w:t xml:space="preserve">Version 0.9.137 beta  ·  Windows and Mac (Apple silicon)</w:t>
+        <w:t xml:space="preserve">Version 0.9.138 beta  ·  Windows and Mac (Apple silicon)</w:t>
       </w:r>
     </w:p>
     <w:p>
@@ -26039,6 +26039,44 @@
         <w:spacing w:after="120"/>
       </w:pPr>
       <w:r>
+        <w:t xml:space="preserve">Everything the organizer makes goes into one folder, </w:t>
+      </w:r>
+      <w:r>
+        <w:rPr>
+          <w:b/>
+          <w:bCs/>
+        </w:rPr>
+        <w:t xml:space="preserve">Organized Astro Files</w:t>
+      </w:r>
+      <w:r>
+        <w:t xml:space="preserve">, inside the folder you choose under </w:t>
+      </w:r>
+      <w:r>
+        <w:rPr>
+          <w:i/>
+          <w:iCs/>
+        </w:rPr>
+        <w:t xml:space="preserve">Put the organized files in</w:t>
+      </w:r>
+      <w:r>
+        <w:t xml:space="preserve"> - so you can always see where your sorted files are. Use the same one every time: organize one rig folder now and the whole drive later, and the files already sorted show as </w:t>
+      </w:r>
+      <w:r>
+        <w:rPr>
+          <w:i/>
+          <w:iCs/>
+        </w:rPr>
+        <w:t xml:space="preserve">already in the right place</w:t>
+      </w:r>
+      <w:r>
+        <w:t xml:space="preserve">. The undo logs are kept in it too.</w:t>
+      </w:r>
+    </w:p>
+    <w:p>
+      <w:pPr>
+        <w:spacing w:after="120"/>
+      </w:pPr>
+      <w:r>
         <w:t xml:space="preserve">Pick the </w:t>
       </w:r>
       <w:r>
@@ -26655,7 +26693,7 @@
       <w:r>
         <w:drawing>
           <wp:inline distT="0" distB="0" distL="0" distR="0">
-            <wp:extent cx="4572000" cy="3648075"/>
+            <wp:extent cx="4572000" cy="3790950"/>
             <wp:effectExtent t="0" r="0" b="0" l="0"/>
             <wp:docPr id="1" name="organize_tree.png" descr="An organized library, By rig (example: two telescopes with the same camera model)" title="An organized library, By rig (example: two telescopes with the same camera model)"/>
             <wp:cNvGraphicFramePr>
@@ -26680,7 +26718,7 @@
                   <pic:spPr bwMode="auto">
                     <a:xfrm>
                       <a:off x="0" y="0"/>
-                      <a:ext cx="4572000" cy="3648075"/>
+                      <a:ext cx="4572000" cy="3790950"/>
                     </a:xfrm>
                     <a:prstGeom prst="rect">
                       <a:avLst/>

</xml_diff>

<commit_message>
Organize: pick several folders (Shift/Ctrl-click) or single files; rig match ±3 % by default, the clearly nearer rig wins when two are in reach; steps show ✓ done / ▶ next and the last run is remembered
Co-Authored-By: Claude Opus 5.5 <noreply@anthropic.com>
Claude-Session: https://claude.ai/code/session_01FKvd69QsnCvM2zbzYnPwmF
</commit_message>
<xml_diff>
--- a/docs/SubZeroAstro_User_Manual.docx
+++ b/docs/SubZeroAstro_User_Manual.docx
@@ -121,7 +121,7 @@
           <w:sz w:val="22"/>
           <w:szCs w:val="22"/>
         </w:rPr>
-        <w:t xml:space="preserve">Version 0.9.139 beta  ·  Windows and Mac (Apple silicon)</w:t>
+        <w:t xml:space="preserve">Version 0.9.140 beta  ·  Windows and Mac (Apple silicon)</w:t>
       </w:r>
     </w:p>
     <w:p>
@@ -26077,7 +26077,14 @@
         <w:spacing w:after="120"/>
       </w:pPr>
       <w:r>
-        <w:t xml:space="preserve">Pick the </w:t>
+        <w:rPr>
+          <w:b/>
+          <w:bCs/>
+        </w:rPr>
+        <w:t xml:space="preserve">Folders / files to organize</w:t>
+      </w:r>
+      <w:r>
+        <w:t xml:space="preserve">: Browse… picks one or several folders at once (Shift-click a run, Ctrl/⌘-click separate ones), Add Files… picks single files. The buttons show where you are: a step you have done gets a ✓ and turns grey, the next one is highlighted ▶, and the window says what you did last time. Pick the </w:t>
       </w:r>
       <w:r>
         <w:rPr>
@@ -26865,7 +26872,7 @@
         <w:t xml:space="preserve">RASA8</w:t>
       </w:r>
       <w:r>
-        <w:t xml:space="preserve"> …), the focal length it writes in your FITS headers, and the camera only if two rigs have about the same focal length. Files are matched to a rig by focal length within ±5 % (adjustable), because the header value drifts a few % from night to night. A scope used with and without a reducer is one rig with two focal lengths (</w:t>
+        <w:t xml:space="preserve"> …), the focal length it writes in your FITS headers, and the camera only if two rigs have about the same focal length. Files are matched to a rig by focal length within ±3 % (adjustable in Your Rigs), because the header value drifts a little from night to night; when a reading is within reach of two rigs (a 506 mm and a 530 mm scope), the clearly nearer one wins and a reading right between them is asked about. A scope used with and without a reducer is one rig with two focal lengths (</w:t>
       </w:r>
       <w:r>
         <w:rPr>

</xml_diff>

<commit_message>
Organize: after a run, list every file left where it was with the reason (needs a rig, duplicate, unreadable, name taken) and the folders skipped on purpose; a name already taken is reported instead of silently skipped
Co-Authored-By: Claude Opus 5.5 <noreply@anthropic.com>
Claude-Session: https://claude.ai/code/session_01FKvd69QsnCvM2zbzYnPwmF
</commit_message>
<xml_diff>
--- a/docs/SubZeroAstro_User_Manual.docx
+++ b/docs/SubZeroAstro_User_Manual.docx
@@ -121,7 +121,7 @@
           <w:sz w:val="22"/>
           <w:szCs w:val="22"/>
         </w:rPr>
-        <w:t xml:space="preserve">Version 0.9.140 beta  ·  Windows and Mac (Apple silicon)</w:t>
+        <w:t xml:space="preserve">Version 0.9.141 beta  ·  Windows and Mac (Apple silicon)</w:t>
       </w:r>
     </w:p>
     <w:p>
@@ -26903,6 +26903,46 @@
       </w:r>
       <w:r>
         <w:t xml:space="preserve"> when you get another one. Remembered, and Calibrate and Stack uses the same names.</w:t>
+      </w:r>
+    </w:p>
+    <w:p>
+      <w:pPr>
+        <w:pStyle w:val="ListParagraph"/>
+        <w:numPr>
+          <w:ilvl w:val="0"/>
+          <w:numId w:val="2"/>
+        </w:numPr>
+        <w:spacing w:after="60"/>
+      </w:pPr>
+      <w:r>
+        <w:rPr>
+          <w:b/>
+          <w:bCs/>
+        </w:rPr>
+        <w:t xml:space="preserve">What stays behind, and why</w:t>
+      </w:r>
+      <w:r>
+        <w:t xml:space="preserve">: after Step 3 the list shows every file left where it was, with the reason - it needs a rig (Your Rigs… / Which Rig?…), it is a duplicate of a file that was organized (Step 2 deletes it), it could not be read, or a file of that name with different contents is already in the organized folder. Folders not looked into on purpose (saved projects, PixInsight / Siril work folders such as </w:t>
+      </w:r>
+      <w:r>
+        <w:rPr>
+          <w:i/>
+          <w:iCs/>
+        </w:rPr>
+        <w:t xml:space="preserve">calibrated</w:t>
+      </w:r>
+      <w:r>
+        <w:t xml:space="preserve"> or </w:t>
+      </w:r>
+      <w:r>
+        <w:rPr>
+          <w:i/>
+          <w:iCs/>
+        </w:rPr>
+        <w:t xml:space="preserve">registered</w:t>
+      </w:r>
+      <w:r>
+        <w:t xml:space="preserve">, hidden folders) are named too. Run Step 1 again after fixing the reason and those files go too.</w:t>
       </w:r>
     </w:p>
     <w:p>

</xml_diff>

<commit_message>
Organize: Safe to Delete? - checks every file left in the organized folders against Organized Astro Files (byte for byte) and gives a verdict; reads only
Co-Authored-By: Claude Opus 5.5 <noreply@anthropic.com>
Claude-Session: https://claude.ai/code/session_01FKvd69QsnCvM2zbzYnPwmF
</commit_message>
<xml_diff>
--- a/docs/SubZeroAstro_User_Manual.docx
+++ b/docs/SubZeroAstro_User_Manual.docx
@@ -121,7 +121,7 @@
           <w:sz w:val="22"/>
           <w:szCs w:val="22"/>
         </w:rPr>
-        <w:t xml:space="preserve">Version 0.9.141 beta  ·  Windows and Mac (Apple silicon)</w:t>
+        <w:t xml:space="preserve">Version 0.9.142 beta  ·  Windows and Mac (Apple silicon)</w:t>
       </w:r>
     </w:p>
     <w:p>
@@ -26903,6 +26903,46 @@
       </w:r>
       <w:r>
         <w:t xml:space="preserve"> when you get another one. Remembered, and Calibrate and Stack uses the same names.</w:t>
+      </w:r>
+    </w:p>
+    <w:p>
+      <w:pPr>
+        <w:pStyle w:val="ListParagraph"/>
+        <w:numPr>
+          <w:ilvl w:val="0"/>
+          <w:numId w:val="2"/>
+        </w:numPr>
+        <w:spacing w:after="60"/>
+      </w:pPr>
+      <w:r>
+        <w:rPr>
+          <w:b/>
+          <w:bCs/>
+        </w:rPr>
+        <w:t xml:space="preserve">Safe to Delete?…</w:t>
+      </w:r>
+      <w:r>
+        <w:t xml:space="preserve"> answers the question before you clear out the old folders: it checks every file still in the folders you organized - is there a byte-for-byte identical copy in Organized Astro Files? The verdict is </w:t>
+      </w:r>
+      <w:r>
+        <w:rPr>
+          <w:b/>
+          <w:bCs/>
+        </w:rPr>
+        <w:t xml:space="preserve">✓ Safe to delete</w:t>
+      </w:r>
+      <w:r>
+        <w:t xml:space="preserve"> or </w:t>
+      </w:r>
+      <w:r>
+        <w:rPr>
+          <w:b/>
+          <w:bCs/>
+        </w:rPr>
+        <w:t xml:space="preserve">✗ Not yet</w:t>
+      </w:r>
+      <w:r>
+        <w:t xml:space="preserve"> (with the files that exist only there), plus PixInsight / Siril work copies, files in saved projects and non-astro files (JPG, notes, logs) listed for you to look at. It only reads; it never deletes anything.</w:t>
       </w:r>
     </w:p>
     <w:p>

</xml_diff>

<commit_message>
Organize My Astro Files back in the File menu, with a first-time click-through note (try a little with Copy, check, Undo, then Move) and one more question before the first Move
Co-Authored-By: Claude Opus 5.5 <noreply@anthropic.com>
Claude-Session: https://claude.ai/code/session_01FKvd69QsnCvM2zbzYnPwmF
</commit_message>
<xml_diff>
--- a/docs/SubZeroAstro_User_Manual.docx
+++ b/docs/SubZeroAstro_User_Manual.docx
@@ -121,7 +121,7 @@
           <w:sz w:val="22"/>
           <w:szCs w:val="22"/>
         </w:rPr>
-        <w:t xml:space="preserve">Version 0.9.143 beta  ·  Windows and Mac (Apple silicon)</w:t>
+        <w:t xml:space="preserve">Version 0.9.144 beta  ·  Windows and Mac (Apple silicon)</w:t>
       </w:r>
     </w:p>
     <w:p>
@@ -25982,10 +25982,50 @@
           <w:b/>
           <w:bCs/>
         </w:rPr>
-        <w:t xml:space="preserve">Switched off in this version.</w:t>
-      </w:r>
-      <w:r>
-        <w:t xml:space="preserve"> Organize My Astro Files is being reworked and is not in the File menu for now - nothing in your folders is changed. The description below is for the coming version.</w:t>
+        <w:t xml:space="preserve">The first time</w:t>
+      </w:r>
+      <w:r>
+        <w:t xml:space="preserve"> you open it, a note asks you to try it on one or two folders with </w:t>
+      </w:r>
+      <w:r>
+        <w:rPr>
+          <w:b/>
+          <w:bCs/>
+        </w:rPr>
+        <w:t xml:space="preserve">Copy</w:t>
+      </w:r>
+      <w:r>
+        <w:t xml:space="preserve"> first, look at the result, then </w:t>
+      </w:r>
+      <w:r>
+        <w:rPr>
+          <w:b/>
+          <w:bCs/>
+        </w:rPr>
+        <w:t xml:space="preserve">Undo Last Run</w:t>
+      </w:r>
+      <w:r>
+        <w:t xml:space="preserve">, switch to </w:t>
+      </w:r>
+      <w:r>
+        <w:rPr>
+          <w:b/>
+          <w:bCs/>
+        </w:rPr>
+        <w:t xml:space="preserve">Move</w:t>
+      </w:r>
+      <w:r>
+        <w:t xml:space="preserve"> and run it again - click it through (tick </w:t>
+      </w:r>
+      <w:r>
+        <w:rPr>
+          <w:i/>
+          <w:iCs/>
+        </w:rPr>
+        <w:t xml:space="preserve">Don't show this again</w:t>
+      </w:r>
+      <w:r>
+        <w:t xml:space="preserve"> once you know the routine). The first Move asks once more.</w:t>
       </w:r>
     </w:p>
     <w:p>

</xml_diff>

<commit_message>
Gradient removal: Correction 'Automatic' (new default) - Subtraction when the lights were flat-calibrated (own flats, SkyFlat, ready-made data such as Telescope Live), Division only for a master stacked without flats
Masters now carry PRECAL when the lights were already calibrated; older masters are recognised from their stack log. The log says which correction each master got. Everyone is moved to Automatic once. 0.9.150 beta

Co-Authored-By: Claude Opus 5.5 <noreply@anthropic.com>
Claude-Session: https://claude.ai/code/session_01FKvd69QsnCvM2zbzYnPwmF
</commit_message>
<xml_diff>
--- a/docs/SubZeroAstro_User_Manual.docx
+++ b/docs/SubZeroAstro_User_Manual.docx
@@ -166,7 +166,7 @@
           <w:sz w:val="22"/>
           <w:szCs w:val="22"/>
         </w:rPr>
-        <w:t xml:space="preserve">Version 0.9.149 beta  ·  Windows and Mac (Apple silicon)</w:t>
+        <w:t xml:space="preserve">Version 0.9.150 beta  ·  Windows and Mac (Apple silicon)</w:t>
       </w:r>
     </w:p>
     <w:p>
@@ -14186,17 +14186,37 @@
         <w:t xml:space="preserve">Smoothing</w:t>
       </w:r>
       <w:r>
-        <w:t xml:space="preserve"> 0.1 and </w:t>
-      </w:r>
-      <w:r>
-        <w:rPr>
-          <w:b/>
-          <w:bCs/>
-        </w:rPr>
-        <w:t xml:space="preserve">Correction: Subtraction</w:t>
-      </w:r>
-      <w:r>
-        <w:t xml:space="preserve"> are good defaults. Without GraXpert a built-in model is used.</w:t>
+        <w:t xml:space="preserve"> 0.1 is a good default. </w:t>
+      </w:r>
+      <w:r>
+        <w:rPr>
+          <w:b/>
+          <w:bCs/>
+        </w:rPr>
+        <w:t xml:space="preserve">Correction: Automatic</w:t>
+      </w:r>
+      <w:r>
+        <w:t xml:space="preserve"> picks for each master: </w:t>
+      </w:r>
+      <w:r>
+        <w:rPr>
+          <w:i/>
+          <w:iCs/>
+        </w:rPr>
+        <w:t xml:space="preserve">Subtraction</w:t>
+      </w:r>
+      <w:r>
+        <w:t xml:space="preserve"> when the lights were flat-calibrated (your flats, a SkyFlat, or ready-made data such as Telescope Live) - light pollution and moon glow add to the picture - and </w:t>
+      </w:r>
+      <w:r>
+        <w:rPr>
+          <w:i/>
+          <w:iCs/>
+        </w:rPr>
+        <w:t xml:space="preserve">Division</w:t>
+      </w:r>
+      <w:r>
+        <w:t xml:space="preserve"> only for a master stacked without any flats, where vignetting is still in it. The log says which was used. Without GraXpert a built-in model is used.</w:t>
       </w:r>
     </w:p>
     <w:p>

</xml_diff>

<commit_message>
Ready-made data (Telescope Live …): BlurXTerminator Sharpen Stars 0.55 / Adjust Star Halos 0.50 when the usual settings are on (your own values are kept); the drizzle tip only for stars under 2.2 px. 0.9.152 beta
Co-Authored-By: Claude Opus 5.5 <noreply@anthropic.com>
Claude-Session: https://claude.ai/code/session_01FKvd69QsnCvM2zbzYnPwmF
</commit_message>
<xml_diff>
--- a/docs/SubZeroAstro_User_Manual.docx
+++ b/docs/SubZeroAstro_User_Manual.docx
@@ -166,7 +166,7 @@
           <w:sz w:val="22"/>
           <w:szCs w:val="22"/>
         </w:rPr>
-        <w:t xml:space="preserve">Version 0.9.151 beta  ·  Windows and Mac (Apple silicon)</w:t>
+        <w:t xml:space="preserve">Version 0.9.152 beta  ·  Windows and Mac (Apple silicon)</w:t>
       </w:r>
     </w:p>
     <w:p>
@@ -10249,7 +10249,7 @@
         <w:t xml:space="preserve">Double the resolution (drizzle 2x)</w:t>
       </w:r>
       <w:r>
-        <w:t xml:space="preserve"> (off by default; PixInsight: DrizzleIntegration): if you dither (the scope moves a few pixels between frames) and your stars are small and blocky, the frames' slightly different positions are combined on a grid twice as fine - a master twice the size with finer stars. It uses the regular stack to leave out satellites and planes. Slower, the masters are 4x larger, and without dithering it adds nothing. After stacking, SubZeroAstro tells you when your frames are dithered and the stars small enough for drizzle to help (and when it was on but the frames were hardly dithered).</w:t>
+        <w:t xml:space="preserve"> (off by default; PixInsight: DrizzleIntegration): if you dither (the scope moves a few pixels between frames) and your stars are small and blocky, the frames' slightly different positions are combined on a grid twice as fine - a master twice the size with finer stars. It uses the regular stack to leave out satellites and planes. Slower, the masters are 4x larger, and without dithering it adds nothing. After stacking, SubZeroAstro tells you when your frames are dithered and the stars small enough (under about 2.2 px) for drizzle to help (and when it was on but the frames were hardly dithered).</w:t>
       </w:r>
     </w:p>
     <w:p>
@@ -14398,7 +14398,7 @@
           </w:tcPr>
           <w:p>
             <w:r>
-              <w:t xml:space="preserve">Sharpen Stars 0.50, Adjust Star Halos 0.40, Sharpen Nonstellar 0.50, Automatic PSF on</w:t>
+              <w:t xml:space="preserve">Sharpen Stars 0.50, Adjust Star Halos 0.40, Sharpen Nonstellar 0.50, Automatic PSF on (ready-made data such as Telescope Live: Sharpen Stars 0.55, Adjust Star Halos 0.50 - its clean signal takes firmer sharpening; the log says so)</w:t>
             </w:r>
           </w:p>
         </w:tc>

</xml_diff>

<commit_message>
Session log on disk: every page's log lines, a memory note every 30 s, errors and hard crashes go to a file as they happen; Zip My Logs includes this and the last sessions (one that ended badly is marked), and the memory in its computer note. 0.9.153 beta
After a crash that froze a Mac, Zip My Logs only had the new session's (empty) logs.

Co-Authored-By: Claude Opus 5.5 <noreply@anthropic.com>
Claude-Session: https://claude.ai/code/session_01FKvd69QsnCvM2zbzYnPwmF
</commit_message>
<xml_diff>
--- a/docs/SubZeroAstro_User_Manual.docx
+++ b/docs/SubZeroAstro_User_Manual.docx
@@ -166,7 +166,7 @@
           <w:sz w:val="22"/>
           <w:szCs w:val="22"/>
         </w:rPr>
-        <w:t xml:space="preserve">Version 0.9.152 beta  ·  Windows and Mac (Apple silicon)</w:t>
+        <w:t xml:space="preserve">Version 0.9.153 beta  ·  Windows and Mac (Apple silicon)</w:t>
       </w:r>
     </w:p>
     <w:p>
@@ -5456,7 +5456,7 @@
           <w:b/>
           <w:bCs/>
         </w:rPr>
-        <w:t xml:space="preserve">48</w:t>
+        <w:t xml:space="preserve">49</w:t>
       </w:r>
     </w:p>
     <w:p>
@@ -5521,7 +5521,7 @@
           <w:b/>
           <w:bCs/>
         </w:rPr>
-        <w:t xml:space="preserve">49</w:t>
+        <w:t xml:space="preserve">50</w:t>
       </w:r>
     </w:p>
     <w:p>
@@ -5604,7 +5604,7 @@
           <w:b/>
           <w:bCs/>
         </w:rPr>
-        <w:t xml:space="preserve">53</w:t>
+        <w:t xml:space="preserve">54</w:t>
       </w:r>
     </w:p>
     <w:p>
@@ -5669,7 +5669,7 @@
           <w:b/>
           <w:bCs/>
         </w:rPr>
-        <w:t xml:space="preserve">54</w:t>
+        <w:t xml:space="preserve">55</w:t>
       </w:r>
     </w:p>
     <w:p>
@@ -5860,7 +5860,7 @@
           <w:b/>
           <w:bCs/>
         </w:rPr>
-        <w:t xml:space="preserve">59</w:t>
+        <w:t xml:space="preserve">60</w:t>
       </w:r>
     </w:p>
     <w:p>
@@ -23916,6 +23916,61 @@
       </w:r>
       <w:r>
         <w:t xml:space="preserve">) puts the log of every open page, the stack logs of your masters, page 3's processing report and a short note about your computer (SubZeroAstro version, system, screen, which helper programs were found) into one zip on your Desktop and shows it - text only, no pictures. Attach that zip to your message: it is the quickest way to get help.</w:t>
+      </w:r>
+    </w:p>
+    <w:p>
+      <w:pPr>
+        <w:spacing w:after="120"/>
+      </w:pPr>
+      <w:r>
+        <w:rPr>
+          <w:b/>
+          <w:bCs/>
+        </w:rPr>
+        <w:t xml:space="preserve">After a crash or a frozen computer</w:t>
+      </w:r>
+      <w:r>
+        <w:t xml:space="preserve">: every session also writes its log to disk as it goes (Windows: </w:t>
+      </w:r>
+      <w:r>
+        <w:rPr>
+          <w:i/>
+          <w:iCs/>
+        </w:rPr>
+        <w:t xml:space="preserve">%LOCALAPPDATA%\SubZeroAstro\Logs</w:t>
+      </w:r>
+      <w:r>
+        <w:t xml:space="preserve">, Mac: </w:t>
+      </w:r>
+      <w:r>
+        <w:rPr>
+          <w:i/>
+          <w:iCs/>
+        </w:rPr>
+        <w:t xml:space="preserve">~/Library/Logs/SubZeroAstro</w:t>
+      </w:r>
+      <w:r>
+        <w:t xml:space="preserve">), with a note every 30 seconds of how much memory the app uses and how much the computer has left. Start SubZeroAstro again and press </w:t>
+      </w:r>
+      <w:r>
+        <w:rPr>
+          <w:b/>
+          <w:bCs/>
+        </w:rPr>
+        <w:t xml:space="preserve">Zip My Logs</w:t>
+      </w:r>
+      <w:r>
+        <w:t xml:space="preserve">: the zip includes the last sessions, and one that ended badly is marked </w:t>
+      </w:r>
+      <w:r>
+        <w:rPr>
+          <w:i/>
+          <w:iCs/>
+        </w:rPr>
+        <w:t xml:space="preserve">ENDED_BADLY</w:t>
+      </w:r>
+      <w:r>
+        <w:t xml:space="preserve">.</w:t>
       </w:r>
     </w:p>
     <w:p>

</xml_diff>

<commit_message>
StarXTerminator: big pictures (over ~40 MP, e.g. drizzled masters) also go through the half-size copy, with the most tile overlap (0.50), so the glow of a bright star is not left as a square; star size measured from five patches and logged. Saved StarXTerminator steps are redone once. 0.9.157 beta
The 0.9.156 rule (stars >= 5 px) never triggered on the Shark: its stars are ~2 px natively, only the bright stars' glows are large.

Co-Authored-By: Claude Opus 5.5 <noreply@anthropic.com>
Claude-Session: https://claude.ai/code/session_01FKvd69QsnCvM2zbzYnPwmF
</commit_message>
<xml_diff>
--- a/docs/SubZeroAstro_User_Manual.docx
+++ b/docs/SubZeroAstro_User_Manual.docx
@@ -166,7 +166,7 @@
           <w:sz w:val="22"/>
           <w:szCs w:val="22"/>
         </w:rPr>
-        <w:t xml:space="preserve">Version 0.9.156 beta  ·  Windows and Mac (Apple silicon)</w:t>
+        <w:t xml:space="preserve">Version 0.9.157 beta  ·  Windows and Mac (Apple silicon)</w:t>
       </w:r>
     </w:p>
     <w:p>
@@ -14570,7 +14570,7 @@
               <w:t xml:space="preserve">Unscreen Stars off</w:t>
             </w:r>
             <w:r>
-              <w:t xml:space="preserve">. When the stars are large (about 5 px or more, e.g. after drizzle) it works on a half-size copy, so the glow of a bright star fits its tiles and leaves no squares; the starless picture keeps its full detail (the log says so)</w:t>
+              <w:t xml:space="preserve">. When the picture is big (over about 40 megapixels, e.g. after drizzle) or the stars are large (about 5 px or more) it works on a half-size copy with the most tile overlap, so the glow of a bright star fits its tiles and leaves no squares; the starless picture keeps its full detail (the log says so)</w:t>
             </w:r>
           </w:p>
         </w:tc>

</xml_diff>

<commit_message>
Finishing Touches: new step 'Clean Bright-Star Leftovers' after Take Stars Out - square glows (microlens diffraction / tile edges) and leftover dots (close doubles) around the brightest stars are found and patched; round reflection nebulae are kept. Darken the Sky Background 'Much darker' by default. 0.9.158 beta
The Shark's squares come out of StarXTerminator unchanged by tile size or overlap.

Co-Authored-By: Claude Opus 5.5 <noreply@anthropic.com>
Claude-Session: https://claude.ai/code/session_01FKvd69QsnCvM2zbzYnPwmF
</commit_message>
<xml_diff>
--- a/docs/SubZeroAstro_User_Manual.docx
+++ b/docs/SubZeroAstro_User_Manual.docx
@@ -166,7 +166,7 @@
           <w:sz w:val="22"/>
           <w:szCs w:val="22"/>
         </w:rPr>
-        <w:t xml:space="preserve">Version 0.9.157 beta  ·  Windows and Mac (Apple silicon)</w:t>
+        <w:t xml:space="preserve">Version 0.9.158 beta  ·  Windows and Mac (Apple silicon)</w:t>
       </w:r>
     </w:p>
     <w:p>
@@ -16310,6 +16310,77 @@
           <w:p>
             <w:r>
               <w:t xml:space="preserve">StarXTerminator</w:t>
+            </w:r>
+          </w:p>
+        </w:tc>
+      </w:tr>
+      <w:tr>
+        <w:trPr>
+          <w:cantSplit/>
+        </w:trPr>
+        <w:tc>
+          <w:tcPr>
+            <w:tcW w:type="dxa" w:w="2500"/>
+            <w:tcBorders>
+              <w:top w:val="single" w:color="BFBFBF" w:sz="4"/>
+              <w:left w:val="single" w:color="BFBFBF" w:sz="4"/>
+              <w:bottom w:val="single" w:color="BFBFBF" w:sz="4"/>
+              <w:right w:val="single" w:color="BFBFBF" w:sz="4"/>
+            </w:tcBorders>
+            <w:tcMar>
+              <w:top w:type="dxa" w:w="60"/>
+              <w:left w:type="dxa" w:w="100"/>
+              <w:bottom w:type="dxa" w:w="60"/>
+              <w:right w:type="dxa" w:w="100"/>
+            </w:tcMar>
+          </w:tcPr>
+          <w:p>
+            <w:r>
+              <w:t xml:space="preserve">Clean Bright-Star Leftovers</w:t>
+            </w:r>
+          </w:p>
+        </w:tc>
+        <w:tc>
+          <w:tcPr>
+            <w:tcW w:type="dxa" w:w="4460"/>
+            <w:tcBorders>
+              <w:top w:val="single" w:color="BFBFBF" w:sz="4"/>
+              <w:left w:val="single" w:color="BFBFBF" w:sz="4"/>
+              <w:bottom w:val="single" w:color="BFBFBF" w:sz="4"/>
+              <w:right w:val="single" w:color="BFBFBF" w:sz="4"/>
+            </w:tcBorders>
+            <w:tcMar>
+              <w:top w:type="dxa" w:w="60"/>
+              <w:left w:type="dxa" w:w="100"/>
+              <w:bottom w:type="dxa" w:w="60"/>
+              <w:right w:type="dxa" w:w="100"/>
+            </w:tcMar>
+          </w:tcPr>
+          <w:p>
+            <w:r>
+              <w:t xml:space="preserve">Recommended only when something is found: what star removal left around the brightest stars - a square glow (microlens diffraction of many Sony camera sensors, or a star removal tile edge) or a leftover dot where a close double star was - is patched from its surroundings. Round, real nebulae around stars (reflection nebulae) are left alone; anything it misses can be clicked away with Spot Fix</w:t>
+            </w:r>
+          </w:p>
+        </w:tc>
+        <w:tc>
+          <w:tcPr>
+            <w:tcW w:type="dxa" w:w="2400"/>
+            <w:tcBorders>
+              <w:top w:val="single" w:color="BFBFBF" w:sz="4"/>
+              <w:left w:val="single" w:color="BFBFBF" w:sz="4"/>
+              <w:bottom w:val="single" w:color="BFBFBF" w:sz="4"/>
+              <w:right w:val="single" w:color="BFBFBF" w:sz="4"/>
+            </w:tcBorders>
+            <w:tcMar>
+              <w:top w:type="dxa" w:w="60"/>
+              <w:left w:type="dxa" w:w="100"/>
+              <w:bottom w:type="dxa" w:w="60"/>
+              <w:right w:type="dxa" w:w="100"/>
+            </w:tcMar>
+          </w:tcPr>
+          <w:p>
+            <w:r>
+              <w:t xml:space="preserve">CloneStamp</w:t>
             </w:r>
           </w:p>
         </w:tc>

</xml_diff>

<commit_message>
Clean Bright-Star Leftovers, rebuilt on the real Shark data: StarXTerminator's painted boxes are found by their missing grain around the bright stars and patched with the surroundings' own texture (CloneStamp-like); boxes inside bright structured nebula are left alone; clearer choices ('Clean the squares (N)' / 'Don't clean', or 'Nothing to clean - next step'). 0.9.160 beta
Co-Authored-By: Claude Opus 5.5 <noreply@anthropic.com>
Claude-Session: https://claude.ai/code/session_01FKvd69QsnCvM2zbzYnPwmF
</commit_message>
<xml_diff>
--- a/docs/SubZeroAstro_User_Manual.docx
+++ b/docs/SubZeroAstro_User_Manual.docx
@@ -166,7 +166,7 @@
           <w:sz w:val="22"/>
           <w:szCs w:val="22"/>
         </w:rPr>
-        <w:t xml:space="preserve">Version 0.9.159 beta  ·  Windows and Mac (Apple silicon)</w:t>
+        <w:t xml:space="preserve">Version 0.9.160 beta  ·  Windows and Mac (Apple silicon)</w:t>
       </w:r>
     </w:p>
     <w:p>
@@ -16358,7 +16358,7 @@
           </w:tcPr>
           <w:p>
             <w:r>
-              <w:t xml:space="preserve">Recommended only when something is found: what star removal left around the brightest stars - a square glow (microlens diffraction of many Sony camera sensors, or a star removal tile edge) or a leftover dot where a close double star was - is patched from its surroundings. Round, real nebulae around stars (reflection nebulae) are left alone; anything it misses can be clicked away with Spot Fix</w:t>
+              <w:t xml:space="preserve">Recommended only when something is found. StarXTerminator paints a smooth, grain-free square over each big star; once the nebula and the stars are brightened differently those squares show, often with bright bars along their edges and a leftover dot where a close double star was. This finds the painted squares by their missing grain and patches each from its surroundings, with the surroundings' own texture. Squares inside bright, structured nebula (a reflection nebula hugging the star) are left alone - use Spot Fix on those if they show</w:t>
             </w:r>
           </w:p>
         </w:tc>

</xml_diff>

<commit_message>
Clean Bright-Star Leftovers: the square glow around each painted box (a plate with straight edges and bright bars, which still showed after the box itself was patched) is rebuilt as background plus a soft round glow from the glow's own fall-off (70%); the grain-free box gets donor texture. Self-test: a square glow is made round. 0.9.162 beta
Co-Authored-By: Claude Opus 5.5 <noreply@anthropic.com>
Claude-Session: https://claude.ai/code/session_01FKvd69QsnCvM2zbzYnPwmF
</commit_message>
<xml_diff>
--- a/docs/SubZeroAstro_User_Manual.docx
+++ b/docs/SubZeroAstro_User_Manual.docx
@@ -166,7 +166,7 @@
           <w:sz w:val="22"/>
           <w:szCs w:val="22"/>
         </w:rPr>
-        <w:t xml:space="preserve">Version 0.9.161 beta  ·  Windows and Mac (Apple silicon)</w:t>
+        <w:t xml:space="preserve">Version 0.9.162 beta  ·  Windows and Mac (Apple silicon)</w:t>
       </w:r>
     </w:p>
     <w:p>
@@ -5661,16 +5661,6 @@
           <w:t xml:space="preserve">15   Processing Techniques and Tips</w:t>
         </w:r>
       </w:hyperlink>
-      <w:r>
-        <w:tab/>
-      </w:r>
-      <w:r>
-        <w:rPr>
-          <w:b/>
-          <w:bCs/>
-        </w:rPr>
-        <w:t xml:space="preserve">55</w:t>
-      </w:r>
     </w:p>
     <w:p>
       <w:pPr>
@@ -5852,16 +5842,6 @@
           <w:t xml:space="preserve">16   Index</w:t>
         </w:r>
       </w:hyperlink>
-      <w:r>
-        <w:tab/>
-      </w:r>
-      <w:r>
-        <w:rPr>
-          <w:b/>
-          <w:bCs/>
-        </w:rPr>
-        <w:t xml:space="preserve">60</w:t>
-      </w:r>
     </w:p>
     <w:p>
       <w:pPr>
@@ -16358,7 +16338,7 @@
           </w:tcPr>
           <w:p>
             <w:r>
-              <w:t xml:space="preserve">Recommended only when something is found. StarXTerminator paints a smooth, grain-free square over each big star; once the nebula and the stars are brightened differently those squares show, often with bright bars along their edges and a leftover dot where a close double star was. This finds the painted squares by their missing grain and patches each from its surroundings, with the surroundings' own texture. Squares inside bright, structured nebula (a reflection nebula hugging the star) are left alone - use Spot Fix on those if they show</w:t>
+              <w:t xml:space="preserve">Recommended only when something is found. StarXTerminator paints a smooth, grain-free square over each big star; once the nebula and the stars are brightened differently those squares show, often with bright bars along their edges and a leftover dot where a close double star was. This finds the painted squares by their missing grain, patches each with the surroundings' own texture, and turns the square glow around it (the plate with straight edges you see once the picture is brightened) into a soft, round glow, as a real bright star's glow is. Squares inside bright, structured nebula (a reflection nebula hugging the star) are left alone - use Spot Fix on those if they show</w:t>
             </w:r>
           </w:p>
         </w:tc>

</xml_diff>

<commit_message>
Clean Bright-Star Leftovers rebuilt: what star removal left around a box is split into a round glow and a square-cut part (one profile per side, fitted with ring medians so the nebula's structure stays out); the square part is taken away, the glow down to the chosen amount, never darker than the surroundings; the box is filled from the corrected surroundings. No more painted round discs. Four choices: Clean, no glow (suggested) / faint glow / soft glow / Don't clean. Self-test: nebula detail around the box is kept. 0.9.166 beta
Co-Authored-By: Claude Opus 5.5 <noreply@anthropic.com>
Claude-Session: https://claude.ai/code/session_01FKvd69QsnCvM2zbzYnPwmF
</commit_message>
<xml_diff>
--- a/docs/SubZeroAstro_User_Manual.docx
+++ b/docs/SubZeroAstro_User_Manual.docx
@@ -166,7 +166,7 @@
           <w:sz w:val="22"/>
           <w:szCs w:val="22"/>
         </w:rPr>
-        <w:t xml:space="preserve">Version 0.9.164 beta  ·  Windows and Mac (Apple silicon)</w:t>
+        <w:t xml:space="preserve">Version 0.9.166 beta  ·  Windows and Mac (Apple silicon)</w:t>
       </w:r>
     </w:p>
     <w:p>
@@ -16338,7 +16338,7 @@
           </w:tcPr>
           <w:p>
             <w:r>
-              <w:t xml:space="preserve">Recommended only when something is found. StarXTerminator paints a smooth, grain-free square over each big star; once the nebula and the stars are brightened differently those squares show, often with bright bars along their edges and a leftover dot where a close double star was. This finds the painted squares by their missing grain, patches each with the surroundings' own texture, and turns the square glow around it (the plate with straight edges you see once the picture is brightened) into a soft, round glow, as a real bright star's glow is. Squares inside bright, structured nebula (a reflection nebula hugging the star) are left alone - use Spot Fix on those if they show</w:t>
+              <w:t xml:space="preserve">Recommended only when something is found. StarXTerminator paints a smooth, grain-free square over each big star; once the nebula and the stars are brightened differently those squares show, often with bright bars along their edges and a leftover dot where a close double star was. This finds the painted squares by their missing grain and patches each with the surroundings' own texture. The square glow and the bars around it (what you see once the picture is brightened) are taken away while the nebula's own detail is kept. Four versions are offered: Clean, no glow (suggested - the star's own glow comes back with the stars), Clean, faint glow, Clean, soft glow, and Don't clean. Squares inside bright, structured nebula (a reflection nebula hugging the star) are left alone - use Spot Fix on those if they show</w:t>
             </w:r>
           </w:p>
         </w:tc>

</xml_diff>

<commit_message>
Box border around a bright target (M27): 'Even out the sky' left the target in its sky estimate, and with drizzle each frame's sky was measured in its own (turned) camera grid, so the sky blocks of frames turned 72 degrees between seasons left box-shaped borders around the nebula. The target and its glow are now masked out of the sky (the same mask for every frame), and drizzle takes each frame's sky off in reference coordinates. Clean Bright-Star Leftovers also removes small leftover star cores (the red dot on M27), inside nebula too. Self-tests added. 0.9.167 beta
Co-Authored-By: Claude Opus 5.5 <noreply@anthropic.com>
Claude-Session: https://claude.ai/code/session_01FKvd69QsnCvM2zbzYnPwmF
</commit_message>
<xml_diff>
--- a/docs/SubZeroAstro_User_Manual.docx
+++ b/docs/SubZeroAstro_User_Manual.docx
@@ -166,7 +166,7 @@
           <w:sz w:val="22"/>
           <w:szCs w:val="22"/>
         </w:rPr>
-        <w:t xml:space="preserve">Version 0.9.166 beta  ·  Windows and Mac (Apple silicon)</w:t>
+        <w:t xml:space="preserve">Version 0.9.167 beta  ·  Windows and Mac (Apple silicon)</w:t>
       </w:r>
     </w:p>
     <w:p>
@@ -10209,7 +10209,7 @@
         <w:t xml:space="preserve">Even out the sky between frames</w:t>
       </w:r>
       <w:r>
-        <w:t xml:space="preserve"> (on by default; PixInsight calls it LocalNormalization): light pollution, haze and moonlight change through the night, so each frame's sky is brighter in a different corner. Before combining, every frame's sky is matched to the best frame's, so satellites, planes and noise are rejected properly and the background comes out even.</w:t>
+        <w:t xml:space="preserve"> (on by default; PixInsight calls it LocalNormalization): light pollution, haze and moonlight change through the night, so each frame's sky is brighter in a different corner. Before combining, every frame's sky is matched to the best frame's, so satellites, planes and noise are rejected properly and the background comes out even. The target and its glow are left out of that sky estimate, so a bright target (a planetary nebula, a galaxy) gets no box-shaped border around it - also with drizzle and with the camera turned between nights.</w:t>
       </w:r>
     </w:p>
     <w:p>
@@ -16338,7 +16338,7 @@
           </w:tcPr>
           <w:p>
             <w:r>
-              <w:t xml:space="preserve">Recommended only when something is found. StarXTerminator paints a smooth, grain-free square over each big star; once the nebula and the stars are brightened differently those squares show, often with bright bars along their edges and a leftover dot where a close double star was. This finds the painted squares by their missing grain and patches each with the surroundings' own texture. The square glow and the bars around it (what you see once the picture is brightened) are taken away while the nebula's own detail is kept. Four versions are offered: Clean, no glow (suggested - the star's own glow comes back with the stars), Clean, faint glow, Clean, soft glow, and Don't clean. Squares inside bright, structured nebula (a reflection nebula hugging the star) are left alone - use Spot Fix on those if they show</w:t>
+              <w:t xml:space="preserve">Recommended only when something is found. StarXTerminator paints a smooth, grain-free square over each big star; once the nebula and the stars are brightened differently those squares show, often with bright bars along their edges and a leftover dot where a close double star was. This finds the painted squares by their missing grain and patches each with the surroundings' own texture. The square glow and the bars around it (what you see once the picture is brightened) are taken away while the nebula's own detail is kept. Four versions are offered: Clean, no glow (suggested - the star's own glow comes back with the stars), Clean, faint glow, Clean, soft glow, and Don't clean. Squares inside bright, structured nebula (a reflection nebula hugging the star) are left alone - use Spot Fix on those if they show. Small leftover star cores (a dot, sometimes in one colour only) are removed too, also inside nebula</w:t>
             </w:r>
           </w:p>
         </w:tc>

</xml_diff>

<commit_message>
Colour Intensity: 'Slight' is suggested for narrowband or already strongly coloured data (mapped filter colours plus 'Rich' looked neon on M27); ordinary colour data keeps 'Rich'. Self-test added. 0.9.168 beta
Co-Authored-By: Claude Opus 5.5 <noreply@anthropic.com>
Claude-Session: https://claude.ai/code/session_01FKvd69QsnCvM2zbzYnPwmF
</commit_message>
<xml_diff>
--- a/docs/SubZeroAstro_User_Manual.docx
+++ b/docs/SubZeroAstro_User_Manual.docx
@@ -166,7 +166,7 @@
           <w:sz w:val="22"/>
           <w:szCs w:val="22"/>
         </w:rPr>
-        <w:t xml:space="preserve">Version 0.9.167 beta  ·  Windows and Mac (Apple silicon)</w:t>
+        <w:t xml:space="preserve">Version 0.9.168 beta  ·  Windows and Mac (Apple silicon)</w:t>
       </w:r>
     </w:p>
     <w:p>
@@ -16845,7 +16845,7 @@
           </w:tcPr>
           <w:p>
             <w:r>
-              <w:t xml:space="preserve">Richer or calmer colour; dark sky protected</w:t>
+              <w:t xml:space="preserve">Richer or calmer colour; dark sky protected. Suggests Rich for ordinary colour data, Slight for narrowband or already strong colours (more looks neon)</w:t>
             </w:r>
           </w:p>
         </w:tc>

</xml_diff>

<commit_message>
Sign Your Picture changes only its own area (it clipped the whole picture to 0..1, so star cores a step had left a little above 1 changed too - the failing self-test). Manual: green cast check, cluster core, Darkest sky. 0.9.168 beta
Co-Authored-By: Claude Opus 5.5 <noreply@anthropic.com>
Claude-Session: https://claude.ai/code/session_01FKvd69QsnCvM2zbzYnPwmF
</commit_message>
<xml_diff>
--- a/docs/SubZeroAstro_User_Manual.docx
+++ b/docs/SubZeroAstro_User_Manual.docx
@@ -5092,7 +5092,7 @@
           <w:b/>
           <w:bCs/>
         </w:rPr>
-        <w:t xml:space="preserve">40</w:t>
+        <w:t xml:space="preserve">41</w:t>
       </w:r>
     </w:p>
     <w:p>
@@ -5391,7 +5391,7 @@
           <w:b/>
           <w:bCs/>
         </w:rPr>
-        <w:t xml:space="preserve">46</w:t>
+        <w:t xml:space="preserve">47</w:t>
       </w:r>
     </w:p>
     <w:p>
@@ -5456,7 +5456,7 @@
           <w:b/>
           <w:bCs/>
         </w:rPr>
-        <w:t xml:space="preserve">49</w:t>
+        <w:t xml:space="preserve">50</w:t>
       </w:r>
     </w:p>
     <w:p>
@@ -5521,7 +5521,7 @@
           <w:b/>
           <w:bCs/>
         </w:rPr>
-        <w:t xml:space="preserve">50</w:t>
+        <w:t xml:space="preserve">51</w:t>
       </w:r>
     </w:p>
     <w:p>
@@ -5604,7 +5604,7 @@
           <w:b/>
           <w:bCs/>
         </w:rPr>
-        <w:t xml:space="preserve">54</w:t>
+        <w:t xml:space="preserve">55</w:t>
       </w:r>
     </w:p>
     <w:p>
@@ -16125,7 +16125,7 @@
           </w:tcPr>
           <w:p>
             <w:r>
-              <w:t xml:space="preserve">Removes the green tint (or turns Hubble colours gold and blue)</w:t>
+              <w:t xml:space="preserve">Removes the green tint (or turns Hubble colours gold and blue). On colour data it measures the green first: with no green cast it suggests None needed (removing green anyway turns the picture pink)</w:t>
             </w:r>
           </w:p>
         </w:tc>
@@ -16703,7 +16703,7 @@
           </w:tcPr>
           <w:p>
             <w:r>
-              <w:t xml:space="preserve">Recovers detail in a burnt-out galaxy core or bright nebula: lowers the core's glow towards its surroundings and brings its structure back from the linear data; a nucleus burnt out even in the masters is rounded off so no hard white dot is left, and the stronger versions take in more of the area around the core (works best right after Brighten the Image (Stretch))</w:t>
+              <w:t xml:space="preserve">Recovers detail in a burnt-out galaxy core or bright nebula: lowers the core's glow towards its surroundings and brings its structure back from the linear data; a nucleus burnt out even in the masters is rounded off so no hard white dot is left, and the stronger versions take in more of the area around the core (works best right after Brighten the Image (Stretch)). Only offered for star clusters: a globular's centre is overlapping stars, and taming it leaves dark holes</w:t>
             </w:r>
           </w:p>
         </w:tc>
@@ -17291,7 +17291,7 @@
           </w:tcPr>
           <w:p>
             <w:r>
-              <w:t xml:space="preserve">Darker (or lighter) sky without dimming the nebula, faint dust or stars; also evens out a brighter corner or side</w:t>
+              <w:t xml:space="preserve">Darker (or lighter) sky without dimming the nebula, faint dust or stars; also evens out a brighter corner or side. Much darker is suggested; Darkest for star clusters, which have no faint nebulosity to keep</w:t>
             </w:r>
           </w:p>
         </w:tc>

</xml_diff>

<commit_message>
Planetary nebulae keep their faint outer halo: Curves suggests 'Lift faint detail' (an S-curve pushed the halo into the black) and Darken the Sky 'Darker' (M27). Self-test updated. 0.9.170 beta
Co-Authored-By: Claude Opus 5.5 <noreply@anthropic.com>
Claude-Session: https://claude.ai/code/session_01FKvd69QsnCvM2zbzYnPwmF
</commit_message>
<xml_diff>
--- a/docs/SubZeroAstro_User_Manual.docx
+++ b/docs/SubZeroAstro_User_Manual.docx
@@ -166,7 +166,7 @@
           <w:sz w:val="22"/>
           <w:szCs w:val="22"/>
         </w:rPr>
-        <w:t xml:space="preserve">Version 0.9.169 beta  ·  Windows and Mac (Apple silicon)</w:t>
+        <w:t xml:space="preserve">Version 0.9.170 beta  ·  Windows and Mac (Apple silicon)</w:t>
       </w:r>
     </w:p>
     <w:p>
@@ -17291,7 +17291,7 @@
           </w:tcPr>
           <w:p>
             <w:r>
-              <w:t xml:space="preserve">Darker (or lighter) sky without dimming the nebula, faint dust or stars; also evens out a brighter corner or side. Much darker is suggested; Darkest for star clusters, which have no faint nebulosity to keep</w:t>
+              <w:t xml:space="preserve">Darker (or lighter) sky without dimming the nebula, faint dust or stars; also evens out a brighter corner or side. Much darker is suggested; Darker for planetary nebulae (keeps the faint outer halo); Darkest for star clusters, which have no faint nebulosity to keep</w:t>
             </w:r>
           </w:p>
         </w:tc>

</xml_diff>

<commit_message>
Narrowband palettes: planetary nebulae suggest 'HOO + SII' (red and teal); Remove Green Cast leaves HSO's green (SII signal - removing it turned M27 purple) and suggests a light 25% for HOO (keeps the OIII teal). Self-test added. 0.9.173 beta
Co-Authored-By: Claude Opus 5.5 <noreply@anthropic.com>
Claude-Session: https://claude.ai/code/session_01FKvd69QsnCvM2zbzYnPwmF
</commit_message>
<xml_diff>
--- a/docs/SubZeroAstro_User_Manual.docx
+++ b/docs/SubZeroAstro_User_Manual.docx
@@ -166,7 +166,7 @@
           <w:sz w:val="22"/>
           <w:szCs w:val="22"/>
         </w:rPr>
-        <w:t xml:space="preserve">Version 0.9.172 beta  ·  Windows and Mac (Apple silicon)</w:t>
+        <w:t xml:space="preserve">Version 0.9.173 beta  ·  Windows and Mac (Apple silicon)</w:t>
       </w:r>
     </w:p>
     <w:p>
@@ -16125,7 +16125,7 @@
           </w:tcPr>
           <w:p>
             <w:r>
-              <w:t xml:space="preserve">Removes the green tint (or turns Hubble colours gold and blue). On colour data it measures the green first: with no green cast it suggests None needed (removing green anyway turns the picture pink)</w:t>
+              <w:t xml:space="preserve">Removes the green tint (or turns Hubble colours gold and blue). On colour data it measures the green first: with no green cast it suggests None needed (removing green anyway turns the picture pink). With HSO the green is your SII (None needed); with HOO it is the OIII teal (a light 25%)</w:t>
             </w:r>
           </w:p>
         </w:tc>

</xml_diff>

<commit_message>
Star clusters: Balance Colours suggests 'Cluster glow warm white' (M28's centre came out blue-violet); with the gentler stretch and 'Darker background' curves. Self-test added. 0.9.178 beta
Co-Authored-By: Claude Opus 5.5 <noreply@anthropic.com>
Claude-Session: https://claude.ai/code/session_01FKvd69QsnCvM2zbzYnPwmF
</commit_message>
<xml_diff>
--- a/docs/SubZeroAstro_User_Manual.docx
+++ b/docs/SubZeroAstro_User_Manual.docx
@@ -166,7 +166,7 @@
           <w:sz w:val="22"/>
           <w:szCs w:val="22"/>
         </w:rPr>
-        <w:t xml:space="preserve">Version 0.9.177 beta  ·  Windows and Mac (Apple silicon)</w:t>
+        <w:t xml:space="preserve">Version 0.9.178 beta  ·  Windows and Mac (Apple silicon)</w:t>
       </w:r>
     </w:p>
     <w:p>
@@ -16797,6 +16797,77 @@
           <w:p>
             <w:r>
               <w:t xml:space="preserve">CurvesTransformation</w:t>
+            </w:r>
+          </w:p>
+        </w:tc>
+      </w:tr>
+      <w:tr>
+        <w:trPr>
+          <w:cantSplit/>
+        </w:trPr>
+        <w:tc>
+          <w:tcPr>
+            <w:tcW w:type="dxa" w:w="2500"/>
+            <w:tcBorders>
+              <w:top w:val="single" w:color="BFBFBF" w:sz="4"/>
+              <w:left w:val="single" w:color="BFBFBF" w:sz="4"/>
+              <w:bottom w:val="single" w:color="BFBFBF" w:sz="4"/>
+              <w:right w:val="single" w:color="BFBFBF" w:sz="4"/>
+            </w:tcBorders>
+            <w:tcMar>
+              <w:top w:type="dxa" w:w="60"/>
+              <w:left w:type="dxa" w:w="100"/>
+              <w:bottom w:type="dxa" w:w="60"/>
+              <w:right w:type="dxa" w:w="100"/>
+            </w:tcMar>
+          </w:tcPr>
+          <w:p>
+            <w:r>
+              <w:t xml:space="preserve">Balance Colours (star clusters)</w:t>
+            </w:r>
+          </w:p>
+        </w:tc>
+        <w:tc>
+          <w:tcPr>
+            <w:tcW w:type="dxa" w:w="4460"/>
+            <w:tcBorders>
+              <w:top w:val="single" w:color="BFBFBF" w:sz="4"/>
+              <w:left w:val="single" w:color="BFBFBF" w:sz="4"/>
+              <w:bottom w:val="single" w:color="BFBFBF" w:sz="4"/>
+              <w:right w:val="single" w:color="BFBFBF" w:sz="4"/>
+            </w:tcBorders>
+            <w:tcMar>
+              <w:top w:type="dxa" w:w="60"/>
+              <w:left w:type="dxa" w:w="100"/>
+              <w:bottom w:type="dxa" w:w="60"/>
+              <w:right w:type="dxa" w:w="100"/>
+            </w:tcMar>
+          </w:tcPr>
+          <w:p>
+            <w:r>
+              <w:t xml:space="preserve">For a star cluster the suggestion is Cluster glow warm white: the cluster's own light is made the warm white of its old stars (balanced on its stars alone a globular can come out blue-violet)</w:t>
+            </w:r>
+          </w:p>
+        </w:tc>
+        <w:tc>
+          <w:tcPr>
+            <w:tcW w:type="dxa" w:w="2400"/>
+            <w:tcBorders>
+              <w:top w:val="single" w:color="BFBFBF" w:sz="4"/>
+              <w:left w:val="single" w:color="BFBFBF" w:sz="4"/>
+              <w:bottom w:val="single" w:color="BFBFBF" w:sz="4"/>
+              <w:right w:val="single" w:color="BFBFBF" w:sz="4"/>
+            </w:tcBorders>
+            <w:tcMar>
+              <w:top w:type="dxa" w:w="60"/>
+              <w:left w:type="dxa" w:w="100"/>
+              <w:bottom w:type="dxa" w:w="60"/>
+              <w:right w:type="dxa" w:w="100"/>
+            </w:tcMar>
+          </w:tcPr>
+          <w:p>
+            <w:r>
+              <w:t xml:space="preserve">ColorCalibration</w:t>
             </w:r>
           </w:p>
         </w:tc>

</xml_diff>

<commit_message>
New step for star clusters: Resolve the Cluster Core - lowers the top of a globular's blended glow (measured between the stars) and keeps every star; recommended after Curves for clusters (M28's core was a bright haze; Tame Bright Core smudged it). Self-test added. 0.9.180 beta
Co-Authored-By: Claude Opus 5.5 <noreply@anthropic.com>
Claude-Session: https://claude.ai/code/session_01FKvd69QsnCvM2zbzYnPwmF
</commit_message>
<xml_diff>
--- a/docs/SubZeroAstro_User_Manual.docx
+++ b/docs/SubZeroAstro_User_Manual.docx
@@ -166,7 +166,7 @@
           <w:sz w:val="22"/>
           <w:szCs w:val="22"/>
         </w:rPr>
-        <w:t xml:space="preserve">Version 0.9.178 beta  ·  Windows and Mac (Apple silicon)</w:t>
+        <w:t xml:space="preserve">Version 0.9.180 beta  ·  Windows and Mac (Apple silicon)</w:t>
       </w:r>
     </w:p>
     <w:p>
@@ -16655,6 +16655,77 @@
           <w:p>
             <w:r>
               <w:t xml:space="preserve">ColorSaturation</w:t>
+            </w:r>
+          </w:p>
+        </w:tc>
+      </w:tr>
+      <w:tr>
+        <w:trPr>
+          <w:cantSplit/>
+        </w:trPr>
+        <w:tc>
+          <w:tcPr>
+            <w:tcW w:type="dxa" w:w="2500"/>
+            <w:tcBorders>
+              <w:top w:val="single" w:color="BFBFBF" w:sz="4"/>
+              <w:left w:val="single" w:color="BFBFBF" w:sz="4"/>
+              <w:bottom w:val="single" w:color="BFBFBF" w:sz="4"/>
+              <w:right w:val="single" w:color="BFBFBF" w:sz="4"/>
+            </w:tcBorders>
+            <w:tcMar>
+              <w:top w:type="dxa" w:w="60"/>
+              <w:left w:type="dxa" w:w="100"/>
+              <w:bottom w:type="dxa" w:w="60"/>
+              <w:right w:type="dxa" w:w="100"/>
+            </w:tcMar>
+          </w:tcPr>
+          <w:p>
+            <w:r>
+              <w:t xml:space="preserve">Resolve the Cluster Core</w:t>
+            </w:r>
+          </w:p>
+        </w:tc>
+        <w:tc>
+          <w:tcPr>
+            <w:tcW w:type="dxa" w:w="4460"/>
+            <w:tcBorders>
+              <w:top w:val="single" w:color="BFBFBF" w:sz="4"/>
+              <w:left w:val="single" w:color="BFBFBF" w:sz="4"/>
+              <w:bottom w:val="single" w:color="BFBFBF" w:sz="4"/>
+              <w:right w:val="single" w:color="BFBFBF" w:sz="4"/>
+            </w:tcBorders>
+            <w:tcMar>
+              <w:top w:type="dxa" w:w="60"/>
+              <w:left w:type="dxa" w:w="100"/>
+              <w:bottom w:type="dxa" w:w="60"/>
+              <w:right w:type="dxa" w:w="100"/>
+            </w:tcMar>
+          </w:tcPr>
+          <w:p>
+            <w:r>
+              <w:t xml:space="preserve">Star clusters only: lowers the blended glow of a globular's centre (measured between the stars) and keeps every star, so the core shows as stars instead of a bright haze. Nothing is smoothed (unlike Tame Bright Core)</w:t>
+            </w:r>
+          </w:p>
+        </w:tc>
+        <w:tc>
+          <w:tcPr>
+            <w:tcW w:type="dxa" w:w="2400"/>
+            <w:tcBorders>
+              <w:top w:val="single" w:color="BFBFBF" w:sz="4"/>
+              <w:left w:val="single" w:color="BFBFBF" w:sz="4"/>
+              <w:bottom w:val="single" w:color="BFBFBF" w:sz="4"/>
+              <w:right w:val="single" w:color="BFBFBF" w:sz="4"/>
+            </w:tcBorders>
+            <w:tcMar>
+              <w:top w:type="dxa" w:w="60"/>
+              <w:left w:type="dxa" w:w="100"/>
+              <w:bottom w:type="dxa" w:w="60"/>
+              <w:right w:type="dxa" w:w="100"/>
+            </w:tcMar>
+          </w:tcPr>
+          <w:p>
+            <w:r>
+              <w:t xml:space="preserve">star mask + HDRMultiscaleTransform</w:t>
             </w:r>
           </w:p>
         </w:tc>

</xml_diff>

<commit_message>
Star clusters in colour: Colour Intensity suggests 'Rich' (their star colours are the picture). Self-test updated. 0.9.182 beta
Co-Authored-By: Claude Opus 5.5 <noreply@anthropic.com>
Claude-Session: https://claude.ai/code/session_01FKvd69QsnCvM2zbzYnPwmF
</commit_message>
<xml_diff>
--- a/docs/SubZeroAstro_User_Manual.docx
+++ b/docs/SubZeroAstro_User_Manual.docx
@@ -166,7 +166,7 @@
           <w:sz w:val="22"/>
           <w:szCs w:val="22"/>
         </w:rPr>
-        <w:t xml:space="preserve">Version 0.9.180 beta  ·  Windows and Mac (Apple silicon)</w:t>
+        <w:t xml:space="preserve">Version 0.9.182 beta  ·  Windows and Mac (Apple silicon)</w:t>
       </w:r>
     </w:p>
     <w:p>
@@ -16987,7 +16987,7 @@
           </w:tcPr>
           <w:p>
             <w:r>
-              <w:t xml:space="preserve">Richer or calmer colour; dark sky protected. The suggested strength follows the target and the data: Rich for galaxies and nebulae in colour (broadband), Slight for narrowband, planetary nebulae, star clusters, comets and any picture whose colours are already strong (more looks neon)</w:t>
+              <w:t xml:space="preserve">Richer or calmer colour; dark sky protected. The suggested strength follows the target and the data: Rich for galaxies, nebulae and star clusters in colour (broadband), Slight for narrowband, planetary nebulae, comets and any picture whose colours are already strong (more looks neon)</w:t>
             </w:r>
           </w:p>
         </w:tc>

</xml_diff>

<commit_message>
Colour Intensity: star clusters default to Calmer
Rich looked too strong on M28 once the cluster's star colours came through.

Co-Authored-By: Claude Opus 5.5 <noreply@anthropic.com>
Claude-Session: https://claude.ai/code/session_01FKvd69QsnCvM2zbzYnPwmF
</commit_message>
<xml_diff>
--- a/docs/SubZeroAstro_User_Manual.docx
+++ b/docs/SubZeroAstro_User_Manual.docx
@@ -166,7 +166,7 @@
           <w:sz w:val="22"/>
           <w:szCs w:val="22"/>
         </w:rPr>
-        <w:t xml:space="preserve">Version 0.9.182 beta  ·  Windows and Mac (Apple silicon)</w:t>
+        <w:t xml:space="preserve">Version 0.9.184 beta  ·  Windows and Mac (Apple silicon)</w:t>
       </w:r>
     </w:p>
     <w:p>
@@ -16987,7 +16987,7 @@
           </w:tcPr>
           <w:p>
             <w:r>
-              <w:t xml:space="preserve">Richer or calmer colour; dark sky protected. The suggested strength follows the target and the data: Rich for galaxies, nebulae and star clusters in colour (broadband), Slight for narrowband, planetary nebulae, comets and any picture whose colours are already strong (more looks neon)</w:t>
+              <w:t xml:space="preserve">Richer or calmer colour; dark sky protected. The suggested strength follows the target and the data: Rich for galaxies and nebulae in colour (broadband), Calmer for star clusters (their star colours are already strong), Slight for narrowband, planetary nebulae, comets and any picture whose colours are already strong (more looks neon)</w:t>
             </w:r>
           </w:p>
         </w:tc>

</xml_diff>

<commit_message>
Planetaries: small background galaxies go with the stars
Star removal left the Helix's background galaxies in the starless picture, where the
nebula's colour steps turned them teal or pink. Compact objects on the sky around the
nebula now move to the stars image and are coloured as stars. Lower-memory min filter.

Co-Authored-By: Claude Opus 5.5 <noreply@anthropic.com>
Claude-Session: https://claude.ai/code/session_01FKvd69QsnCvM2zbzYnPwmF
</commit_message>
<xml_diff>
--- a/docs/SubZeroAstro_User_Manual.docx
+++ b/docs/SubZeroAstro_User_Manual.docx
@@ -166,7 +166,7 @@
           <w:sz w:val="22"/>
           <w:szCs w:val="22"/>
         </w:rPr>
-        <w:t xml:space="preserve">Version 0.9.184 beta  ·  Windows and Mac (Apple silicon)</w:t>
+        <w:t xml:space="preserve">Version 0.9.185 beta  ·  Windows and Mac (Apple silicon)</w:t>
       </w:r>
     </w:p>
     <w:p>
@@ -16267,7 +16267,7 @@
           </w:tcPr>
           <w:p>
             <w:r>
-              <w:t xml:space="preserve">Hides the stars so the nebula can be brightened strongly (instant if page 3 already separated them)</w:t>
+              <w:t xml:space="preserve">Hides the stars so the nebula can be brightened strongly (instant if page 3 already separated them). For a planetary nebula, small background galaxies on the sky around it go with the stars, so they keep star colours instead of the nebula's</w:t>
             </w:r>
           </w:p>
         </w:tc>

</xml_diff>

<commit_message>
Every page shows the target being worked on beside its title
Co-Authored-By: Claude Opus 5.5 <noreply@anthropic.com>
Claude-Session: https://claude.ai/code/session_01FKvd69QsnCvM2zbzYnPwmF
</commit_message>
<xml_diff>
--- a/docs/SubZeroAstro_User_Manual.docx
+++ b/docs/SubZeroAstro_User_Manual.docx
@@ -166,7 +166,7 @@
           <w:sz w:val="22"/>
           <w:szCs w:val="22"/>
         </w:rPr>
-        <w:t xml:space="preserve">Version 0.9.185 beta  ·  Windows and Mac (Apple silicon)</w:t>
+        <w:t xml:space="preserve">Version 0.9.186 beta  ·  Windows and Mac (Apple silicon)</w:t>
       </w:r>
     </w:p>
     <w:p>
@@ -10491,7 +10491,7 @@
         <w:t xml:space="preserve">v0.9.10 beta</w:t>
       </w:r>
       <w:r>
-        <w:t xml:space="preserve">), and the </w:t>
+        <w:t xml:space="preserve">), the </w:t>
       </w:r>
       <w:r>
         <w:rPr>
@@ -10501,7 +10501,37 @@
         <w:t xml:space="preserve">page title</w:t>
       </w:r>
       <w:r>
-        <w:t xml:space="preserve">. On the right is a blue </w:t>
+        <w:t xml:space="preserve">, and beside it the </w:t>
+      </w:r>
+      <w:r>
+        <w:rPr>
+          <w:b/>
+          <w:bCs/>
+        </w:rPr>
+        <w:t xml:space="preserve">target</w:t>
+      </w:r>
+      <w:r>
+        <w:t xml:space="preserve"> you are working on (e.g. </w:t>
+      </w:r>
+      <w:r>
+        <w:rPr>
+          <w:i/>
+          <w:iCs/>
+        </w:rPr>
+        <w:t xml:space="preserve">Target: M28</w:t>
+      </w:r>
+      <w:r>
+        <w:t xml:space="preserve">; with several targets loaded, </w:t>
+      </w:r>
+      <w:r>
+        <w:rPr>
+          <w:i/>
+          <w:iCs/>
+        </w:rPr>
+        <w:t xml:space="preserve">Targets: M27, M28</w:t>
+      </w:r>
+      <w:r>
+        <w:t xml:space="preserve">). On the right is a blue </w:t>
       </w:r>
       <w:r>
         <w:rPr>

</xml_diff>

<commit_message>
Fast Track also darkens the sky and runs the final NoiseXTerminator pass
Co-Authored-By: Claude Opus 5.5 <noreply@anthropic.com>
Claude-Session: https://claude.ai/code/session_01FKvd69QsnCvM2zbzYnPwmF
</commit_message>
<xml_diff>
--- a/docs/SubZeroAstro_User_Manual.docx
+++ b/docs/SubZeroAstro_User_Manual.docx
@@ -166,7 +166,7 @@
           <w:sz w:val="22"/>
           <w:szCs w:val="22"/>
         </w:rPr>
-        <w:t xml:space="preserve">Version 0.9.187 beta  ·  Windows and Mac (Apple silicon)</w:t>
+        <w:t xml:space="preserve">Version 0.9.189 beta  ·  Windows and Mac (Apple silicon)</w:t>
       </w:r>
     </w:p>
     <w:p>
@@ -11118,7 +11118,27 @@
         <w:spacing w:after="120"/>
       </w:pPr>
       <w:r>
-        <w:t xml:space="preserve">Fast Track leaves the steps that need your eye or your name for you: </w:t>
+        <w:t xml:space="preserve">Fast Track also does two steps that are only optional when you go step by step, because they finish the picture: </w:t>
+      </w:r>
+      <w:r>
+        <w:rPr>
+          <w:b/>
+          <w:bCs/>
+        </w:rPr>
+        <w:t xml:space="preserve">Darken the Sky Background</w:t>
+      </w:r>
+      <w:r>
+        <w:t xml:space="preserve"> and </w:t>
+      </w:r>
+      <w:r>
+        <w:rPr>
+          <w:b/>
+          <w:bCs/>
+        </w:rPr>
+        <w:t xml:space="preserve">Final Noise Reduction</w:t>
+      </w:r>
+      <w:r>
+        <w:t xml:space="preserve"> (a last NoiseXTerminator pass, when the RC-Astro tools are installed). It leaves the steps that need your eye or your name for you: </w:t>
       </w:r>
       <w:r>
         <w:rPr>

</xml_diff>

<commit_message>
Fast Track: Fly Into It - a slow flight into the finished picture
Co-Authored-By: Claude Opus 5.5 <noreply@anthropic.com>
Claude-Session: https://claude.ai/code/session_01FKvd69QsnCvM2zbzYnPwmF
</commit_message>
<xml_diff>
--- a/docs/SubZeroAstro_User_Manual.docx
+++ b/docs/SubZeroAstro_User_Manual.docx
@@ -166,7 +166,7 @@
           <w:sz w:val="22"/>
           <w:szCs w:val="22"/>
         </w:rPr>
-        <w:t xml:space="preserve">Version 0.9.189 beta  ·  Windows and Mac (Apple silicon)</w:t>
+        <w:t xml:space="preserve">Version 0.9.191 beta  ·  Windows and Mac (Apple silicon)</w:t>
       </w:r>
     </w:p>
     <w:p>
@@ -11050,7 +11050,17 @@
         <w:spacing w:after="60"/>
       </w:pPr>
       <w:r>
-        <w:t xml:space="preserve">At the end: </w:t>
+        <w:t xml:space="preserve">At the end the picture starts a slow flight: </w:t>
+      </w:r>
+      <w:r>
+        <w:rPr>
+          <w:b/>
+          <w:bCs/>
+        </w:rPr>
+        <w:t xml:space="preserve">✈ Fly Into It</w:t>
+      </w:r>
+      <w:r>
+        <w:t xml:space="preserve"> glides in towards your target while turning gently, then back out, over and over (press it again to stop). Then: </w:t>
       </w:r>
       <w:r>
         <w:rPr>

</xml_diff>

<commit_message>
0.9.194: galaxy defaults and colour balance fix; manual
Co-Authored-By: Claude Opus 5.5 <noreply@anthropic.com>
Claude-Session: https://claude.ai/code/session_01FKvd69QsnCvM2zbzYnPwmF
</commit_message>
<xml_diff>
--- a/docs/SubZeroAstro_User_Manual.docx
+++ b/docs/SubZeroAstro_User_Manual.docx
@@ -166,7 +166,7 @@
           <w:sz w:val="22"/>
           <w:szCs w:val="22"/>
         </w:rPr>
-        <w:t xml:space="preserve">Version 0.9.191 beta  ·  Windows and Mac (Apple silicon)</w:t>
+        <w:t xml:space="preserve">Version 0.9.194 beta  ·  Windows and Mac (Apple silicon)</w:t>
       </w:r>
     </w:p>
     <w:p>
@@ -17341,7 +17341,7 @@
           </w:tcPr>
           <w:p>
             <w:r>
-              <w:t xml:space="preserve">Richer or calmer colour; dark sky protected. The suggested strength follows the target and the data: Rich for galaxies and nebulae in colour (broadband), Calmer for star clusters (their star colours are already strong), Slight for narrowband, planetary nebulae, comets and any picture whose colours are already strong (more looks neon)</w:t>
+              <w:t xml:space="preserve">Richer or calmer colour; dark sky protected. The suggested strength follows the target and the data: Vivid for galaxies and Rich for nebulae in colour (broadband), Calmer for star clusters (their star colours are already strong), Slight for narrowband, planetary nebulae, comets and any picture whose colours are already strong (more looks neon)</w:t>
             </w:r>
           </w:p>
         </w:tc>
@@ -21677,17 +21677,27 @@
         <w:t xml:space="preserve">Brighten the Image (Stretch) › Medium</w:t>
       </w:r>
       <w:r>
-        <w:t xml:space="preserve"> (</w:t>
+        <w:t xml:space="preserve"> - for a galaxy </w:t>
       </w:r>
       <w:r>
         <w:rPr>
           <w:i/>
           <w:iCs/>
         </w:rPr>
+        <w:t xml:space="preserve">Gentle</w:t>
+      </w:r>
+      <w:r>
+        <w:t xml:space="preserve"> (</w:t>
+      </w:r>
+      <w:r>
+        <w:rPr>
+          <w:i/>
+          <w:iCs/>
+        </w:rPr>
         <w:t xml:space="preserve">Colour-preserving</w:t>
       </w:r>
       <w:r>
-        <w:t xml:space="preserve"> keeps a galaxy's core colour).</w:t>
+        <w:t xml:space="preserve"> keeps a galaxy's core colour; a stronger stretch turns its faint outer disk into fog).</w:t>
       </w:r>
     </w:p>
     <w:p>
@@ -21747,6 +21757,16 @@
         <w:t xml:space="preserve">More contrast</w:t>
       </w:r>
       <w:r>
+        <w:t xml:space="preserve"> - for a galaxy </w:t>
+      </w:r>
+      <w:r>
+        <w:rPr>
+          <w:i/>
+          <w:iCs/>
+        </w:rPr>
+        <w:t xml:space="preserve">Punchy (S-curve + lift)</w:t>
+      </w:r>
+      <w:r>
         <w:t xml:space="preserve">.</w:t>
       </w:r>
     </w:p>
@@ -21775,6 +21795,16 @@
           <w:bCs/>
         </w:rPr>
         <w:t xml:space="preserve">Rich</w:t>
+      </w:r>
+      <w:r>
+        <w:t xml:space="preserve"> - for a galaxy </w:t>
+      </w:r>
+      <w:r>
+        <w:rPr>
+          <w:i/>
+          <w:iCs/>
+        </w:rPr>
+        <w:t xml:space="preserve">Vivid</w:t>
       </w:r>
       <w:r>
         <w:t xml:space="preserve">.</w:t>

</xml_diff>

<commit_message>
Galaxies: stronger colour levels (Vivid 3.8, tuned on M83); Fast Track: Share to AstroBin at the end
Co-Authored-By: Claude Opus 5.5 <noreply@anthropic.com>
Claude-Session: https://claude.ai/code/session_01FKvd69QsnCvM2zbzYnPwmF
</commit_message>
<xml_diff>
--- a/docs/SubZeroAstro_User_Manual.docx
+++ b/docs/SubZeroAstro_User_Manual.docx
@@ -166,7 +166,7 @@
           <w:sz w:val="22"/>
           <w:szCs w:val="22"/>
         </w:rPr>
-        <w:t xml:space="preserve">Version 0.9.194 beta  ·  Windows and Mac (Apple silicon)</w:t>
+        <w:t xml:space="preserve">Version 0.9.197 beta  ·  Windows and Mac (Apple silicon)</w:t>
       </w:r>
     </w:p>
     <w:p>
@@ -11078,6 +11078,16 @@
           <w:bCs/>
         </w:rPr>
         <w:t xml:space="preserve">Save Project…</w:t>
+      </w:r>
+      <w:r>
+        <w:t xml:space="preserve">, </w:t>
+      </w:r>
+      <w:r>
+        <w:rPr>
+          <w:b/>
+          <w:bCs/>
+        </w:rPr>
+        <w:t xml:space="preserve">Share to AstroBin…</w:t>
       </w:r>
       <w:r>
         <w:t xml:space="preserve">, </w:t>

</xml_diff>

<commit_message>
SII typed 'S11' is recognised; Fast Track asks for the palette, suggesting the popular one for well-known targets
Co-Authored-By: Claude Opus 5.5 <noreply@anthropic.com>
Claude-Session: https://claude.ai/code/session_01FKvd69QsnCvM2zbzYnPwmF
</commit_message>
<xml_diff>
--- a/docs/SubZeroAstro_User_Manual.docx
+++ b/docs/SubZeroAstro_User_Manual.docx
@@ -166,7 +166,7 @@
           <w:sz w:val="22"/>
           <w:szCs w:val="22"/>
         </w:rPr>
-        <w:t xml:space="preserve">Version 0.9.197 beta  ·  Windows and Mac (Apple silicon)</w:t>
+        <w:t xml:space="preserve">Version 0.9.199 beta  ·  Windows and Mac (Apple silicon)</w:t>
       </w:r>
     </w:p>
     <w:p>
@@ -11004,7 +11004,17 @@
         <w:t xml:space="preserve">what the target is</w:t>
       </w:r>
       <w:r>
-        <w:t xml:space="preserve"> (galaxy, nebula, planetary nebula, star cluster, comet). It recognises most catalogue names; change it if it is wrong - the steps and their settings follow the kind of object.</w:t>
+        <w:t xml:space="preserve"> (galaxy, nebula, planetary nebula, star cluster, comet). It recognises most catalogue names; change it if it is wrong - the steps and their settings follow the kind of object. With narrowband data it also asks for the </w:t>
+      </w:r>
+      <w:r>
+        <w:rPr>
+          <w:b/>
+          <w:bCs/>
+        </w:rPr>
+        <w:t xml:space="preserve">colour palette</w:t>
+      </w:r>
+      <w:r>
+        <w:t xml:space="preserve"> (Hubble SHO, HSO, HOO + SII, HOO, Foraxx): the suggestion is the palette most people show that target in when it is a well-known one (the Pacman Nebula in SHO, the Crescent in HOO), else SHO for nebulae and HOO + SII for planetary nebulae.</w:t>
       </w:r>
     </w:p>
     <w:p>

</xml_diff>

<commit_message>
0.9.201: IC 1396 fixes - star glows and rings, neutral sky, gentle shrink for tiny stars, faster Star Colours
- Clean Bright-Star Leftovers (nebulae): also removes round glows star removal left with no
  painted square (the Garnet Star's halo with its green ring; teal filter halos across the sky)
  and small coloured rings around stars in front of bright nebula (the Trunk's tip)
- Balance Colours (nebulae): sky level from the darkest part of the starless picture, so the dark
  sky between the clouds is neutral instead of cyan
- Shrink Stars: strength scaled by star size; stars 1-2 px wide were wiped out
- Star Colours: connected-areas labelling without the slow per-pixel spreading (62 s -> 21 s)
- self-test and manual updated

Co-Authored-By: Claude Opus 5.5 <noreply@anthropic.com>
Claude-Session: https://claude.ai/code/session_01FKvd69QsnCvM2zbzYnPwmF
</commit_message>
<xml_diff>
--- a/docs/SubZeroAstro_User_Manual.docx
+++ b/docs/SubZeroAstro_User_Manual.docx
@@ -166,7 +166,7 @@
           <w:sz w:val="22"/>
           <w:szCs w:val="22"/>
         </w:rPr>
-        <w:t xml:space="preserve">Version 0.9.200 beta  ·  Windows and Mac (Apple silicon)</w:t>
+        <w:t xml:space="preserve">Version 0.9.201 beta  ·  Windows and Mac (Apple silicon)</w:t>
       </w:r>
     </w:p>
     <w:p>
@@ -16488,7 +16488,7 @@
           </w:tcPr>
           <w:p>
             <w:r>
-              <w:t xml:space="preserve">Neutral sky and natural star colour</w:t>
+              <w:t xml:space="preserve">Neutral sky and natural star colour. For a nebula that fills the frame, the sky level is taken from the darkest part of the picture (not the whole picture, which is mostly nebula), so the dark sky between the clouds comes out neutral instead of cyan</w:t>
             </w:r>
           </w:p>
         </w:tc>
@@ -16772,7 +16772,7 @@
           </w:tcPr>
           <w:p>
             <w:r>
-              <w:t xml:space="preserve">Recommended only when something is found. StarXTerminator paints a smooth, grain-free square over each big star; once the nebula and the stars are brightened differently those squares show, often with bright bars along their edges and a leftover dot where a close double star was. This finds the painted squares by their missing grain and patches each with the surroundings' own texture. The square glow and the bars around it (what you see once the picture is brightened) are taken away while the nebula's own detail is kept. Four versions are offered: Clean, no glow (suggested - the star's own glow comes back with the stars), Clean, faint glow, Clean, soft glow, and Don't clean. Squares inside bright, structured nebula (a reflection nebula hugging the star) are left alone - use Spot Fix on those if they show. Small leftover star cores (a dot, sometimes in one colour only) are removed too, also inside nebula</w:t>
+              <w:t xml:space="preserve">Recommended only when something is found. StarXTerminator paints a smooth, grain-free square over each big star; once the nebula and the stars are brightened differently those squares show, often with bright bars along their edges and a leftover dot where a close double star was. This finds the painted squares by their missing grain and patches each with the surroundings' own texture. The square glow and the bars around it (what you see once the picture is brightened) are taken away while the nebula's own detail is kept. Four versions are offered: Clean, no glow (suggested - the star's own glow comes back with the stars), Clean, faint glow, Clean, soft glow, and Don't clean. Squares inside bright, structured nebula (a reflection nebula hugging the star) are left alone - use Spot Fix on those if they show. Small leftover star cores (a dot, sometimes in one colour only) are removed too, also inside nebula. For a nebula it also takes away the round glows star removal left with no square to find them by (a very bright star's halo, with a coloured ring where the filters' halos differ - IC 1396's Garnet Star - and the teal or blue blobs some filters leave around bright stars across the sky), and small coloured rings left around a star in front of bright nebula (the tip of IC 1396's Elephant's Trunk). Glows around a star in the middle of the picture, where the target is, are kept</w:t>
             </w:r>
           </w:p>
         </w:tc>
@@ -17654,7 +17654,7 @@
           </w:tcPr>
           <w:p>
             <w:r>
-              <w:t xml:space="preserve">Makes stars smaller</w:t>
+              <w:t xml:space="preserve">Makes stars smaller. Stars only a pixel or two wide (a wide-field scope) are shrunk gently, by as much as their size allows - shrinking them fully would wipe out most of a crowded star field</w:t>
             </w:r>
           </w:p>
         </w:tc>

</xml_diff>

<commit_message>
0.9.202: Hubble (SHO) suggests Remove Green Cast > Remove only (the typical gold and blue, as on NGC 281); Gold stays for Gold & blue
Co-Authored-By: Claude Opus 5.5 <noreply@anthropic.com>
Claude-Session: https://claude.ai/code/session_01FKvd69QsnCvM2zbzYnPwmF
</commit_message>
<xml_diff>
--- a/docs/SubZeroAstro_User_Manual.docx
+++ b/docs/SubZeroAstro_User_Manual.docx
@@ -166,7 +166,7 @@
           <w:sz w:val="22"/>
           <w:szCs w:val="22"/>
         </w:rPr>
-        <w:t xml:space="preserve">Version 0.9.201 beta  ·  Windows and Mac (Apple silicon)</w:t>
+        <w:t xml:space="preserve">Version 0.9.202 beta  ·  Windows and Mac (Apple silicon)</w:t>
       </w:r>
     </w:p>
     <w:p>
@@ -19905,7 +19905,17 @@
         <w:t xml:space="preserve">Combine Colour Channels</w:t>
       </w:r>
       <w:r>
-        <w:t xml:space="preserve"> › Hubble (SHO), Foraxx or HOO; then Remove Green Cast - for Hubble (SHO) and Gold &amp; blue it offers </w:t>
+        <w:t xml:space="preserve"> › Hubble (SHO), Foraxx or HOO; then Remove Green Cast - for Hubble (SHO) and Gold &amp; blue it suggests </w:t>
+      </w:r>
+      <w:r>
+        <w:rPr>
+          <w:b/>
+          <w:bCs/>
+        </w:rPr>
+        <w:t xml:space="preserve">Remove only</w:t>
+      </w:r>
+      <w:r>
+        <w:t xml:space="preserve"> for Hubble (SHO) - plain SCNR, the typical gold and blue - and also offers </w:t>
       </w:r>
       <w:r>
         <w:rPr>
@@ -19915,17 +19925,7 @@
         <w:t xml:space="preserve">Gold 50 / 75 / 100%</w:t>
       </w:r>
       <w:r>
-        <w:t xml:space="preserve">, which turn the green (your Ha, the strongest signal) gold instead of deleting it, so the bright structure keeps its brightness; </w:t>
-      </w:r>
-      <w:r>
-        <w:rPr>
-          <w:i/>
-          <w:iCs/>
-        </w:rPr>
-        <w:t xml:space="preserve">Remove only</w:t>
-      </w:r>
-      <w:r>
-        <w:t xml:space="preserve"> is plain SCNR (darker, bluer, more magenta) - and </w:t>
+        <w:t xml:space="preserve">, which turn the green (your Ha, the strongest signal) gold instead of deleting it, so the bright structure keeps its brightness (suggested for Gold &amp; blue) - and </w:t>
       </w:r>
       <w:r>
         <w:rPr>
@@ -21486,20 +21486,20 @@
           <w:b/>
           <w:bCs/>
         </w:rPr>
-        <w:t xml:space="preserve">Remove Green Cast › Gold 100 %</w:t>
-      </w:r>
-      <w:r>
-        <w:t xml:space="preserve"> - the green is your Ha; </w:t>
+        <w:t xml:space="preserve">Remove Green Cast › Remove only</w:t>
+      </w:r>
+      <w:r>
+        <w:t xml:space="preserve"> - plain SCNR, the typical Hubble-palette gold and blue; </w:t>
       </w:r>
       <w:r>
         <w:rPr>
           <w:i/>
           <w:iCs/>
         </w:rPr>
-        <w:t xml:space="preserve">Gold</w:t>
-      </w:r>
-      <w:r>
-        <w:t xml:space="preserve"> turns it gold instead of deleting it, which gives the classic gold and blue.</w:t>
+        <w:t xml:space="preserve">Gold 100 %</w:t>
+      </w:r>
+      <w:r>
+        <w:t xml:space="preserve"> turns the green (your Ha) gold instead of deleting it, for a brighter, warmer look.</w:t>
       </w:r>
     </w:p>
     <w:p>
@@ -22567,10 +22567,20 @@
           <w:b/>
           <w:bCs/>
         </w:rPr>
-        <w:t xml:space="preserve">Remove Green Cast › Gold 100 %</w:t>
-      </w:r>
-      <w:r>
-        <w:t xml:space="preserve"> for SHO (the classic gold and blue); plain removal for HOO.</w:t>
+        <w:t xml:space="preserve">Remove Green Cast › Remove only</w:t>
+      </w:r>
+      <w:r>
+        <w:t xml:space="preserve"> for SHO (the typical gold and blue; </w:t>
+      </w:r>
+      <w:r>
+        <w:rPr>
+          <w:i/>
+          <w:iCs/>
+        </w:rPr>
+        <w:t xml:space="preserve">Gold</w:t>
+      </w:r>
+      <w:r>
+        <w:t xml:space="preserve"> for a warmer look); plain removal for HOO.</w:t>
       </w:r>
     </w:p>
     <w:p>

</xml_diff>

<commit_message>
0.9.205: galaxies - Balance Colours suggests 'Galaxy centre warm white' when the stars would leave the centre blue (NGC 1097); fine-tuned slider values written to the log
Co-Authored-By: Claude Opus 5.5 <noreply@anthropic.com>
Claude-Session: https://claude.ai/code/session_01FKvd69QsnCvM2zbzYnPwmF
</commit_message>
<xml_diff>
--- a/docs/SubZeroAstro_User_Manual.docx
+++ b/docs/SubZeroAstro_User_Manual.docx
@@ -166,7 +166,7 @@
           <w:sz w:val="22"/>
           <w:szCs w:val="22"/>
         </w:rPr>
-        <w:t xml:space="preserve">Version 0.9.202 beta  ·  Windows and Mac (Apple silicon)</w:t>
+        <w:t xml:space="preserve">Version 0.9.205 beta  ·  Windows and Mac (Apple silicon)</w:t>
       </w:r>
     </w:p>
     <w:p>
@@ -22118,7 +22118,17 @@
         <w:t xml:space="preserve">Remove Green Cast › 25-50 %</w:t>
       </w:r>
       <w:r>
-        <w:t xml:space="preserve">.</w:t>
+        <w:t xml:space="preserve">. When the field's stars would leave the galaxy's centre blue (few, faint stars - a field far from the Milky Way), </w:t>
+      </w:r>
+      <w:r>
+        <w:rPr>
+          <w:b/>
+          <w:bCs/>
+        </w:rPr>
+        <w:t xml:space="preserve">Galaxy centre warm white</w:t>
+      </w:r>
+      <w:r>
+        <w:t xml:space="preserve"> is suggested instead: the centre's old stars are a warm white and the arms stay blue.</w:t>
       </w:r>
     </w:p>
     <w:p>

</xml_diff>

<commit_message>
0.9.207: comets - colour frames from page 1 keep their 3 planes (were stacked as one Bayer plane, grey); Darken the Sky keeps the tail (one sky level, no glow map); Curves suggests Lift faint detail; no unknown-filter warning for a single master
Co-Authored-By: Claude Opus 5.5 <noreply@anthropic.com>
Claude-Session: https://claude.ai/code/session_01FKvd69QsnCvM2zbzYnPwmF
</commit_message>
<xml_diff>
--- a/docs/SubZeroAstro_User_Manual.docx
+++ b/docs/SubZeroAstro_User_Manual.docx
@@ -166,7 +166,7 @@
           <w:sz w:val="22"/>
           <w:szCs w:val="22"/>
         </w:rPr>
-        <w:t xml:space="preserve">Version 0.9.205 beta  ·  Windows and Mac (Apple silicon)</w:t>
+        <w:t xml:space="preserve">Version 0.9.207 beta  ·  Windows and Mac (Apple silicon)</w:t>
       </w:r>
     </w:p>
     <w:p>
@@ -20076,10 +20076,20 @@
           <w:b/>
           <w:bCs/>
         </w:rPr>
+        <w:t xml:space="preserve">Curves › Lift faint detail</w:t>
+      </w:r>
+      <w:r>
+        <w:t xml:space="preserve"> and </w:t>
+      </w:r>
+      <w:r>
+        <w:rPr>
+          <w:b/>
+          <w:bCs/>
+        </w:rPr>
         <w:t xml:space="preserve">Darken the Sky</w:t>
       </w:r>
       <w:r>
-        <w:t xml:space="preserve"> is recommended, while star steps (</w:t>
+        <w:t xml:space="preserve"> are recommended (for a comet it takes one even sky level away, so the faint tail across the picture keeps its brightness), while star steps (</w:t>
       </w:r>
       <w:r>
         <w:rPr>

</xml_diff>

<commit_message>
0.9.208: red nebulae calmer - Add Hydrogen Glow suggests Subtle, broadband nebula with strong colour gets Saturation Calmer; smooth round glows of stars in the middle are cleaned too (IC 1396's white and teal smudges)
Co-Authored-By: Claude Opus 5.5 <noreply@anthropic.com>
Claude-Session: https://claude.ai/code/session_01FKvd69QsnCvM2zbzYnPwmF
</commit_message>
<xml_diff>
--- a/docs/SubZeroAstro_User_Manual.docx
+++ b/docs/SubZeroAstro_User_Manual.docx
@@ -166,7 +166,7 @@
           <w:sz w:val="22"/>
           <w:szCs w:val="22"/>
         </w:rPr>
-        <w:t xml:space="preserve">Version 0.9.207 beta  ·  Windows and Mac (Apple silicon)</w:t>
+        <w:t xml:space="preserve">Version 0.9.208 beta  ·  Windows and Mac (Apple silicon)</w:t>
       </w:r>
     </w:p>
     <w:p>
@@ -16265,7 +16265,37 @@
           </w:tcPr>
           <w:p>
             <w:r>
-              <w:t xml:space="preserve">Adds Ha to the red of an RGB set, without its stars. For a galaxy (M31, M33, M101, NGC 891…) it adds only the compact HII regions - the red knots along the arms</w:t>
+              <w:t xml:space="preserve">Adds Ha to the red of an RGB set, without its stars. For a nebula </w:t>
+            </w:r>
+            <w:r>
+              <w:rPr>
+                <w:i/>
+                <w:iCs/>
+              </w:rPr>
+              <w:t xml:space="preserve">Subtle</w:t>
+            </w:r>
+            <w:r>
+              <w:t xml:space="preserve"> (half the Ha) is suggested - the full Ha on top of the red made a red emission nebula like IC 1396 over-red; </w:t>
+            </w:r>
+            <w:r>
+              <w:rPr>
+                <w:i/>
+                <w:iCs/>
+              </w:rPr>
+              <w:t xml:space="preserve">Natural</w:t>
+            </w:r>
+            <w:r>
+              <w:t xml:space="preserve"> or </w:t>
+            </w:r>
+            <w:r>
+              <w:rPr>
+                <w:i/>
+                <w:iCs/>
+              </w:rPr>
+              <w:t xml:space="preserve">Strong</w:t>
+            </w:r>
+            <w:r>
+              <w:t xml:space="preserve"> for more. For a galaxy (M31, M33, M101, NGC 891…) it adds only the compact HII regions - the red knots along the arms</w:t>
             </w:r>
           </w:p>
         </w:tc>

</xml_diff>

<commit_message>
0.9.210: comet stack masks the stars out of every frame before following the comet (faint stars left dotted trails across the tail); stars put back from the star stack inside the comet's area
Co-Authored-By: Claude Opus 5.5 <noreply@anthropic.com>
Claude-Session: https://claude.ai/code/session_01FKvd69QsnCvM2zbzYnPwmF
</commit_message>
<xml_diff>
--- a/docs/SubZeroAstro_User_Manual.docx
+++ b/docs/SubZeroAstro_User_Manual.docx
@@ -166,7 +166,7 @@
           <w:sz w:val="22"/>
           <w:szCs w:val="22"/>
         </w:rPr>
-        <w:t xml:space="preserve">Version 0.9.209 beta  ·  Windows and Mac (Apple silicon)</w:t>
+        <w:t xml:space="preserve">Version 0.9.210 beta  ·  Windows and Mac (Apple silicon)</w:t>
       </w:r>
     </w:p>
     <w:p>
@@ -20121,24 +20121,34 @@
         <w:spacing w:after="120"/>
       </w:pPr>
       <w:r>
-        <w:t xml:space="preserve">A comet moves against the stars while you image it, so a normal stack (lined up on the stars) smears it, and a stack lined up on the comet trails the stars. SubZeroAstro does both and joins them. It recognises a comet by its name (</w:t>
+        <w:t xml:space="preserve">A comet moves against the stars while you image it, so a normal stack (lined up on the stars) smears it, and a stack lined up on the comet trails the stars. SubZeroAstro does both and joins them. It recognises a comet by its name - or when you pick </w:t>
+      </w:r>
+      <w:r>
+        <w:rPr>
+          <w:b/>
+          <w:bCs/>
+        </w:rPr>
+        <w:t xml:space="preserve">Comet</w:t>
+      </w:r>
+      <w:r>
+        <w:t xml:space="preserve"> as the type in Fast Track, e.g. for frames named </w:t>
       </w:r>
       <w:r>
         <w:rPr>
           <w:i/>
           <w:iCs/>
         </w:rPr>
-        <w:t xml:space="preserve">C/2023 A3</w:t>
-      </w:r>
-      <w:r>
-        <w:t xml:space="preserve">, </w:t>
+        <w:t xml:space="preserve">Snapshot</w:t>
+      </w:r>
+      <w:r>
+        <w:t xml:space="preserve"> - (</w:t>
       </w:r>
       <w:r>
         <w:rPr>
           <w:i/>
           <w:iCs/>
         </w:rPr>
-        <w:t xml:space="preserve">12P/Pons-Brooks</w:t>
+        <w:t xml:space="preserve">C/2023 A3</w:t>
       </w:r>
       <w:r>
         <w:t xml:space="preserve">, </w:t>
@@ -20148,16 +20158,26 @@
           <w:i/>
           <w:iCs/>
         </w:rPr>
-        <w:t xml:space="preserve">161P Hartley-IRAS</w:t>
-      </w:r>
-      <w:r>
-        <w:t xml:space="preserve">, or any name containing </w:t>
+        <w:t xml:space="preserve">12P/Pons-Brooks</w:t>
+      </w:r>
+      <w:r>
+        <w:t xml:space="preserve">, </w:t>
       </w:r>
       <w:r>
         <w:rPr>
           <w:i/>
           <w:iCs/>
         </w:rPr>
+        <w:t xml:space="preserve">161P Hartley-IRAS</w:t>
+      </w:r>
+      <w:r>
+        <w:t xml:space="preserve">, or any name containing </w:t>
+      </w:r>
+      <w:r>
+        <w:rPr>
+          <w:i/>
+          <w:iCs/>
+        </w:rPr>
         <w:t xml:space="preserve">comet</w:t>
       </w:r>
       <w:r>
@@ -20171,7 +20191,7 @@
         <w:t xml:space="preserve">second stack that follows the comet</w:t>
       </w:r>
       <w:r>
-        <w:t xml:space="preserve"> (the stars, which move through it, are rejected), and saves three masters: the main one with </w:t>
+        <w:t xml:space="preserve"> (the stars are masked out of every frame first, so they leave no dotted trails across the tail; inside the comet's area they are put back from the star stack), and saves three masters: the main one with </w:t>
       </w:r>
       <w:r>
         <w:rPr>

</xml_diff>

<commit_message>
0.9.211: comets - no BlurX star sharpening and no StarX on page 3 (hard round head with a ring and a dot); comet stack kept off the edge strip and the crop leaves it out (blue bands at the edges)
Co-Authored-By: Claude Opus 5.5 <noreply@anthropic.com>
Claude-Session: https://claude.ai/code/session_01FKvd69QsnCvM2zbzYnPwmF
</commit_message>
<xml_diff>
--- a/docs/SubZeroAstro_User_Manual.docx
+++ b/docs/SubZeroAstro_User_Manual.docx
@@ -166,7 +166,7 @@
           <w:sz w:val="22"/>
           <w:szCs w:val="22"/>
         </w:rPr>
-        <w:t xml:space="preserve">Version 0.9.210 beta  ·  Windows and Mac (Apple silicon)</w:t>
+        <w:t xml:space="preserve">Version 0.9.211 beta  ·  Windows and Mac (Apple silicon)</w:t>
       </w:r>
     </w:p>
     <w:p>
@@ -30132,6 +30132,36 @@
       </w:r>
       <w:r>
         <w:t xml:space="preserve"> masters are saved next to it.</w:t>
+      </w:r>
+    </w:p>
+    <w:p>
+      <w:pPr>
+        <w:pStyle w:val="ListParagraph"/>
+        <w:numPr>
+          <w:ilvl w:val="0"/>
+          <w:numId w:val="2"/>
+        </w:numPr>
+        <w:spacing w:after="60"/>
+      </w:pPr>
+      <w:r>
+        <w:rPr>
+          <w:b/>
+          <w:bCs/>
+        </w:rPr>
+        <w:t xml:space="preserve">Page 3:</w:t>
+      </w:r>
+      <w:r>
+        <w:t xml:space="preserve"> for a comet BlurXTerminator sharpens the coma and tail but not the stars (</w:t>
+      </w:r>
+      <w:r>
+        <w:rPr>
+          <w:i/>
+          <w:iCs/>
+        </w:rPr>
+        <w:t xml:space="preserve">Sharpen Stars</w:t>
+      </w:r>
+      <w:r>
+        <w:t xml:space="preserve"> 0 - it would turn the star-like nucleus into a hard disc with a ring), and StarXTerminator is left out (it takes the inner coma for a star). The suggested crop leaves out the edge strip the comet stack could not fill.</w:t>
       </w:r>
     </w:p>
     <w:p>

</xml_diff>

<commit_message>
0.9.212: comet nucleus clipped in one colour (purple dot in the cyan coma) gets the coma's colour on load
Co-Authored-By: Claude Opus 5.5 <noreply@anthropic.com>
Claude-Session: https://claude.ai/code/session_01FKvd69QsnCvM2zbzYnPwmF
</commit_message>
<xml_diff>
--- a/docs/SubZeroAstro_User_Manual.docx
+++ b/docs/SubZeroAstro_User_Manual.docx
@@ -166,7 +166,7 @@
           <w:sz w:val="22"/>
           <w:szCs w:val="22"/>
         </w:rPr>
-        <w:t xml:space="preserve">Version 0.9.211 beta  ·  Windows and Mac (Apple silicon)</w:t>
+        <w:t xml:space="preserve">Version 0.9.212 beta  ·  Windows and Mac (Apple silicon)</w:t>
       </w:r>
     </w:p>
     <w:p>
@@ -30161,7 +30161,17 @@
         <w:t xml:space="preserve">Sharpen Stars</w:t>
       </w:r>
       <w:r>
-        <w:t xml:space="preserve"> 0 - it would turn the star-like nucleus into a hard disc with a ring), and StarXTerminator is left out (it takes the inner coma for a star). The suggested crop leaves out the edge strip the comet stack could not fill.</w:t>
+        <w:t xml:space="preserve"> 0 - it would turn the star-like nucleus into a hard disc with a ring), and StarXTerminator is left out (it takes the inner coma for a star). The suggested crop leaves out the edge strip the comet stack could not fill. </w:t>
+      </w:r>
+      <w:r>
+        <w:rPr>
+          <w:b/>
+          <w:bCs/>
+        </w:rPr>
+        <w:t xml:space="preserve">Page 4:</w:t>
+      </w:r>
+      <w:r>
+        <w:t xml:space="preserve"> an overexposed nucleus (one colour clipped, so the centre turns another colour - a purple dot in a cyan coma) gets the coma's own colour when the comet is loaded.</w:t>
       </w:r>
     </w:p>
     <w:p>

</xml_diff>

<commit_message>
0.9.213: comets brightened with GHS and the white point at the head (the colour stretch made the inner coma a flat, too-perfect disc); Colour Intensity Rich for comets
Co-Authored-By: Claude Opus 5.5 <noreply@anthropic.com>
Claude-Session: https://claude.ai/code/session_01FKvd69QsnCvM2zbzYnPwmF
</commit_message>
<xml_diff>
--- a/docs/SubZeroAstro_User_Manual.docx
+++ b/docs/SubZeroAstro_User_Manual.docx
@@ -166,7 +166,7 @@
           <w:sz w:val="22"/>
           <w:szCs w:val="22"/>
         </w:rPr>
-        <w:t xml:space="preserve">Version 0.9.212 beta  ·  Windows and Mac (Apple silicon)</w:t>
+        <w:t xml:space="preserve">Version 0.9.213 beta  ·  Windows and Mac (Apple silicon)</w:t>
       </w:r>
     </w:p>
     <w:p>
@@ -30171,7 +30171,37 @@
         <w:t xml:space="preserve">Page 4:</w:t>
       </w:r>
       <w:r>
-        <w:t xml:space="preserve"> an overexposed nucleus (one colour clipped, so the centre turns another colour - a purple dot in a cyan coma) gets the coma's own colour when the comet is loaded.</w:t>
+        <w:t xml:space="preserve"> an overexposed nucleus (one colour clipped, so the centre turns another colour - a purple dot in a cyan coma) gets the coma's own colour when the comet is loaded. </w:t>
+      </w:r>
+      <w:r>
+        <w:rPr>
+          <w:i/>
+          <w:iCs/>
+        </w:rPr>
+        <w:t xml:space="preserve">Brighten the Image</w:t>
+      </w:r>
+      <w:r>
+        <w:t xml:space="preserve"> uses GHS for a comet (the colour-preserving stretch pushed the whole inner coma to the top - a flat disc; GHS keeps a bright nucleus fading into the coma) and </w:t>
+      </w:r>
+      <w:r>
+        <w:rPr>
+          <w:i/>
+          <w:iCs/>
+        </w:rPr>
+        <w:t xml:space="preserve">Colour Intensity</w:t>
+      </w:r>
+      <w:r>
+        <w:t xml:space="preserve"> suggests </w:t>
+      </w:r>
+      <w:r>
+        <w:rPr>
+          <w:i/>
+          <w:iCs/>
+        </w:rPr>
+        <w:t xml:space="preserve">Rich</w:t>
+      </w:r>
+      <w:r>
+        <w:t xml:space="preserve">.</w:t>
       </w:r>
     </w:p>
     <w:p>

</xml_diff>

<commit_message>
0.9.217: DWARF calibration frames recognised - bias/flats (tele_0001.fits, no IMAGETYP) from their CALI_FRAME folders or their headers, master darks' settings from their names; the DWARF's no-filter flats used for its lights; no 'old flat' note for its unset clock
Co-Authored-By: Claude Opus 5.5 <noreply@anthropic.com>
Claude-Session: https://claude.ai/code/session_01FKvd69QsnCvM2zbzYnPwmF
</commit_message>
<xml_diff>
--- a/docs/SubZeroAstro_User_Manual.docx
+++ b/docs/SubZeroAstro_User_Manual.docx
@@ -166,7 +166,7 @@
           <w:sz w:val="22"/>
           <w:szCs w:val="22"/>
         </w:rPr>
-        <w:t xml:space="preserve">Version 0.9.213 beta  ·  Windows and Mac (Apple silicon)</w:t>
+        <w:t xml:space="preserve">Version 0.9.217 beta  ·  Windows and Mac (Apple silicon)</w:t>
       </w:r>
     </w:p>
     <w:p>
@@ -20104,6 +20104,81 @@
       </w:r>
       <w:r>
         <w:t xml:space="preserve"> files from several nights can be combined on page 2, or a single stack can go straight to page 3.</w:t>
+      </w:r>
+    </w:p>
+    <w:p>
+      <w:pPr>
+        <w:spacing w:after="120"/>
+      </w:pPr>
+      <w:r>
+        <w:rPr>
+          <w:b/>
+          <w:bCs/>
+        </w:rPr>
+        <w:t xml:space="preserve">DWARF calibration frames:</w:t>
+      </w:r>
+      <w:r>
+        <w:t xml:space="preserve"> the DWARF keeps its own in a </w:t>
+      </w:r>
+      <w:r>
+        <w:rPr>
+          <w:i/>
+          <w:iCs/>
+        </w:rPr>
+        <w:t xml:space="preserve">CALI_FRAME</w:t>
+      </w:r>
+      <w:r>
+        <w:t xml:space="preserve"> folder - bias and flats as </w:t>
+      </w:r>
+      <w:r>
+        <w:rPr>
+          <w:i/>
+          <w:iCs/>
+        </w:rPr>
+        <w:t xml:space="preserve">tele_0001.fits</w:t>
+      </w:r>
+      <w:r>
+        <w:t xml:space="preserve"> with nothing in the header to say what they are, darks as masters named like </w:t>
+      </w:r>
+      <w:r>
+        <w:rPr>
+          <w:i/>
+          <w:iCs/>
+        </w:rPr>
+        <w:t xml:space="preserve">dark_exp_15.000000_gain_60_bin_1_37C_stack_20.fits</w:t>
+      </w:r>
+      <w:r>
+        <w:t xml:space="preserve">. Add that folder on page 2 (</w:t>
+      </w:r>
+      <w:r>
+        <w:rPr>
+          <w:b/>
+          <w:bCs/>
+        </w:rPr>
+        <w:t xml:space="preserve">Add Calibration Folder…</w:t>
+      </w:r>
+      <w:r>
+        <w:t xml:space="preserve">): the bias and flats are recognised from their folders (or, copied out, from their headers - not pointed at the sky, a near-zero exposure is a bias), the dark's exposure, gain, temperature and frame count from its name. The DWARF's flats record no filter; they are used for its lights. Page 2 also leaves out the DWARF's rejected frames (</w:t>
+      </w:r>
+      <w:r>
+        <w:rPr>
+          <w:i/>
+          <w:iCs/>
+        </w:rPr>
+        <w:t xml:space="preserve">failed_…</w:t>
+      </w:r>
+      <w:r>
+        <w:t xml:space="preserve">) and its own stacks (</w:t>
+      </w:r>
+      <w:r>
+        <w:rPr>
+          <w:i/>
+          <w:iCs/>
+        </w:rPr>
+        <w:t xml:space="preserve">stacked…</w:t>
+      </w:r>
+      <w:r>
+        <w:t xml:space="preserve">) when they sit among the subs.</w:t>
       </w:r>
     </w:p>
     <w:p>

</xml_diff>